<commit_message>
Reemplazar paginas hardcodeadas del indice por campos PAGEREF con bookmarks en todos los indices (general, cuadros, graficos, anexos)
</commit_message>
<xml_diff>
--- a/amaal/reportes/Informe_Pasantia_IUTECP.docx
+++ b/amaal/reportes/Informe_Pasantia_IUTECP.docx
@@ -312,6 +312,7 @@
       </w:pPr>
     </w:p>
     <w:p>
+      <w:bookmarkStart w:id="bm_dedicatoria" w:name="bm_dedicatoria"/>
       <w:pPr>
         <w:spacing w:after="480"/>
         <w:jc w:val="center"/>
@@ -324,6 +325,7 @@
         </w:rPr>
         <w:t>DEDICATORIA</w:t>
       </w:r>
+      <w:bookmarkEnd w:id="bm_dedicatoria"/>
     </w:p>
     <w:p>
       <w:pPr>
@@ -428,7 +430,11 @@
           <w:b w:val="0"/>
           <w:sz w:val="24"/>
         </w:rPr>
-        <w:t>iii</w:t>
+        <w:fldChar w:fldCharType="begin"/>
+        <w:instrText xml:space="preserve"> PAGEREF bm_dedicatoria \h </w:instrText>
+        <w:fldChar w:fldCharType="separate"/>
+        <w:t>?</w:t>
+        <w:fldChar w:fldCharType="end"/>
       </w:r>
     </w:p>
     <w:p>
@@ -454,7 +460,11 @@
           <w:b w:val="0"/>
           <w:sz w:val="24"/>
         </w:rPr>
-        <w:t>v</w:t>
+        <w:fldChar w:fldCharType="begin"/>
+        <w:instrText xml:space="preserve"> PAGEREF bm_lista_cuadros \h </w:instrText>
+        <w:fldChar w:fldCharType="separate"/>
+        <w:t>?</w:t>
+        <w:fldChar w:fldCharType="end"/>
       </w:r>
     </w:p>
     <w:p>
@@ -480,7 +490,11 @@
           <w:b w:val="0"/>
           <w:sz w:val="24"/>
         </w:rPr>
-        <w:t>vi</w:t>
+        <w:fldChar w:fldCharType="begin"/>
+        <w:instrText xml:space="preserve"> PAGEREF bm_lista_graficos \h </w:instrText>
+        <w:fldChar w:fldCharType="separate"/>
+        <w:t>?</w:t>
+        <w:fldChar w:fldCharType="end"/>
       </w:r>
     </w:p>
     <w:p>
@@ -506,7 +520,11 @@
           <w:b w:val="0"/>
           <w:sz w:val="24"/>
         </w:rPr>
-        <w:t>vii</w:t>
+        <w:fldChar w:fldCharType="begin"/>
+        <w:instrText xml:space="preserve"> PAGEREF bm_lista_anexos \h </w:instrText>
+        <w:fldChar w:fldCharType="separate"/>
+        <w:t>?</w:t>
+        <w:fldChar w:fldCharType="end"/>
       </w:r>
     </w:p>
     <w:p>
@@ -532,7 +550,11 @@
           <w:b w:val="0"/>
           <w:sz w:val="24"/>
         </w:rPr>
-        <w:t>1</w:t>
+        <w:fldChar w:fldCharType="begin"/>
+        <w:instrText xml:space="preserve"> PAGEREF bm_introduccion \h </w:instrText>
+        <w:fldChar w:fldCharType="separate"/>
+        <w:t>?</w:t>
+        <w:fldChar w:fldCharType="end"/>
       </w:r>
     </w:p>
     <w:p>
@@ -569,7 +591,11 @@
           <w:b/>
           <w:sz w:val="24"/>
         </w:rPr>
-        <w:t>2</w:t>
+        <w:fldChar w:fldCharType="begin"/>
+        <w:instrText xml:space="preserve"> PAGEREF bm_cap1 \h </w:instrText>
+        <w:fldChar w:fldCharType="separate"/>
+        <w:t>?</w:t>
+        <w:fldChar w:fldCharType="end"/>
       </w:r>
     </w:p>
     <w:p>
@@ -595,7 +621,11 @@
           <w:b w:val="0"/>
           <w:sz w:val="24"/>
         </w:rPr>
-        <w:t>2</w:t>
+        <w:fldChar w:fldCharType="begin"/>
+        <w:instrText xml:space="preserve"> PAGEREF bm_cap1_ident \h </w:instrText>
+        <w:fldChar w:fldCharType="separate"/>
+        <w:t>?</w:t>
+        <w:fldChar w:fldCharType="end"/>
       </w:r>
     </w:p>
     <w:p>
@@ -621,7 +651,11 @@
           <w:b w:val="0"/>
           <w:sz w:val="24"/>
         </w:rPr>
-        <w:t>2</w:t>
+        <w:fldChar w:fldCharType="begin"/>
+        <w:instrText xml:space="preserve"> PAGEREF bm_cap1_resena \h </w:instrText>
+        <w:fldChar w:fldCharType="separate"/>
+        <w:t>?</w:t>
+        <w:fldChar w:fldCharType="end"/>
       </w:r>
     </w:p>
     <w:p>
@@ -647,7 +681,11 @@
           <w:b w:val="0"/>
           <w:sz w:val="24"/>
         </w:rPr>
-        <w:t>2</w:t>
+        <w:fldChar w:fldCharType="begin"/>
+        <w:instrText xml:space="preserve"> PAGEREF bm_cap1_mision \h </w:instrText>
+        <w:fldChar w:fldCharType="separate"/>
+        <w:t>?</w:t>
+        <w:fldChar w:fldCharType="end"/>
       </w:r>
     </w:p>
     <w:p>
@@ -673,7 +711,11 @@
           <w:b w:val="0"/>
           <w:sz w:val="24"/>
         </w:rPr>
-        <w:t>3</w:t>
+        <w:fldChar w:fldCharType="begin"/>
+        <w:instrText xml:space="preserve"> PAGEREF bm_cap1_vision \h </w:instrText>
+        <w:fldChar w:fldCharType="separate"/>
+        <w:t>?</w:t>
+        <w:fldChar w:fldCharType="end"/>
       </w:r>
     </w:p>
     <w:p>
@@ -699,7 +741,11 @@
           <w:b w:val="0"/>
           <w:sz w:val="24"/>
         </w:rPr>
-        <w:t>3</w:t>
+        <w:fldChar w:fldCharType="begin"/>
+        <w:instrText xml:space="preserve"> PAGEREF bm_cap1_valores \h </w:instrText>
+        <w:fldChar w:fldCharType="separate"/>
+        <w:t>?</w:t>
+        <w:fldChar w:fldCharType="end"/>
       </w:r>
     </w:p>
     <w:p>
@@ -725,7 +771,11 @@
           <w:b w:val="0"/>
           <w:sz w:val="24"/>
         </w:rPr>
-        <w:t>3</w:t>
+        <w:fldChar w:fldCharType="begin"/>
+        <w:instrText xml:space="preserve"> PAGEREF bm_cap1_obj \h </w:instrText>
+        <w:fldChar w:fldCharType="separate"/>
+        <w:t>?</w:t>
+        <w:fldChar w:fldCharType="end"/>
       </w:r>
     </w:p>
     <w:p>
@@ -751,7 +801,11 @@
           <w:b w:val="0"/>
           <w:sz w:val="24"/>
         </w:rPr>
-        <w:t>3</w:t>
+        <w:fldChar w:fldCharType="begin"/>
+        <w:instrText xml:space="preserve"> PAGEREF bm_cap1_ubic \h </w:instrText>
+        <w:fldChar w:fldCharType="separate"/>
+        <w:t>?</w:t>
+        <w:fldChar w:fldCharType="end"/>
       </w:r>
     </w:p>
     <w:p>
@@ -777,7 +831,11 @@
           <w:b w:val="0"/>
           <w:sz w:val="24"/>
         </w:rPr>
-        <w:t>3</w:t>
+        <w:fldChar w:fldCharType="begin"/>
+        <w:instrText xml:space="preserve"> PAGEREF bm_cap1_pobla \h </w:instrText>
+        <w:fldChar w:fldCharType="separate"/>
+        <w:t>?</w:t>
+        <w:fldChar w:fldCharType="end"/>
       </w:r>
     </w:p>
     <w:p>
@@ -803,7 +861,11 @@
           <w:b w:val="0"/>
           <w:sz w:val="24"/>
         </w:rPr>
-        <w:t>4</w:t>
+        <w:fldChar w:fldCharType="begin"/>
+        <w:instrText xml:space="preserve"> PAGEREF bm_cap1_estruct \h </w:instrText>
+        <w:fldChar w:fldCharType="separate"/>
+        <w:t>?</w:t>
+        <w:fldChar w:fldCharType="end"/>
       </w:r>
     </w:p>
     <w:p>
@@ -829,7 +891,11 @@
           <w:b/>
           <w:sz w:val="24"/>
         </w:rPr>
-        <w:t>5</w:t>
+        <w:fldChar w:fldCharType="begin"/>
+        <w:instrText xml:space="preserve"> PAGEREF bm_cap2 \h </w:instrText>
+        <w:fldChar w:fldCharType="separate"/>
+        <w:t>?</w:t>
+        <w:fldChar w:fldCharType="end"/>
       </w:r>
     </w:p>
     <w:p>
@@ -855,7 +921,11 @@
           <w:b w:val="0"/>
           <w:sz w:val="24"/>
         </w:rPr>
-        <w:t>5</w:t>
+        <w:fldChar w:fldCharType="begin"/>
+        <w:instrText xml:space="preserve"> PAGEREF bm_cap2_sit \h </w:instrText>
+        <w:fldChar w:fldCharType="separate"/>
+        <w:t>?</w:t>
+        <w:fldChar w:fldCharType="end"/>
       </w:r>
     </w:p>
     <w:p>
@@ -881,7 +951,11 @@
           <w:b w:val="0"/>
           <w:sz w:val="24"/>
         </w:rPr>
-        <w:t>5</w:t>
+        <w:fldChar w:fldCharType="begin"/>
+        <w:instrText xml:space="preserve"> PAGEREF bm_cap2_objg \h </w:instrText>
+        <w:fldChar w:fldCharType="separate"/>
+        <w:t>?</w:t>
+        <w:fldChar w:fldCharType="end"/>
       </w:r>
     </w:p>
     <w:p>
@@ -907,7 +981,11 @@
           <w:b w:val="0"/>
           <w:sz w:val="24"/>
         </w:rPr>
-        <w:t>5</w:t>
+        <w:fldChar w:fldCharType="begin"/>
+        <w:instrText xml:space="preserve"> PAGEREF bm_cap2_obje \h </w:instrText>
+        <w:fldChar w:fldCharType="separate"/>
+        <w:t>?</w:t>
+        <w:fldChar w:fldCharType="end"/>
       </w:r>
     </w:p>
     <w:p>
@@ -933,7 +1011,11 @@
           <w:b w:val="0"/>
           <w:sz w:val="24"/>
         </w:rPr>
-        <w:t>5</w:t>
+        <w:fldChar w:fldCharType="begin"/>
+        <w:instrText xml:space="preserve"> PAGEREF bm_cap2_planif \h </w:instrText>
+        <w:fldChar w:fldCharType="separate"/>
+        <w:t>?</w:t>
+        <w:fldChar w:fldCharType="end"/>
       </w:r>
     </w:p>
     <w:p>
@@ -959,7 +1041,11 @@
           <w:b w:val="0"/>
           <w:sz w:val="24"/>
         </w:rPr>
-        <w:t>6</w:t>
+        <w:fldChar w:fldCharType="begin"/>
+        <w:instrText xml:space="preserve"> PAGEREF bm_cap2_crono \h </w:instrText>
+        <w:fldChar w:fldCharType="separate"/>
+        <w:t>?</w:t>
+        <w:fldChar w:fldCharType="end"/>
       </w:r>
     </w:p>
     <w:p>
@@ -985,7 +1071,11 @@
           <w:b/>
           <w:sz w:val="24"/>
         </w:rPr>
-        <w:t>7</w:t>
+        <w:fldChar w:fldCharType="begin"/>
+        <w:instrText xml:space="preserve"> PAGEREF bm_cap3 \h </w:instrText>
+        <w:fldChar w:fldCharType="separate"/>
+        <w:t>?</w:t>
+        <w:fldChar w:fldCharType="end"/>
       </w:r>
     </w:p>
     <w:p>
@@ -1011,7 +1101,11 @@
           <w:b w:val="0"/>
           <w:sz w:val="24"/>
         </w:rPr>
-        <w:t>7</w:t>
+        <w:fldChar w:fldCharType="begin"/>
+        <w:instrText xml:space="preserve"> PAGEREF bm_cap3_bases \h </w:instrText>
+        <w:fldChar w:fldCharType="separate"/>
+        <w:t>?</w:t>
+        <w:fldChar w:fldCharType="end"/>
       </w:r>
     </w:p>
     <w:p>
@@ -1037,7 +1131,11 @@
           <w:b/>
           <w:sz w:val="24"/>
         </w:rPr>
-        <w:t>8</w:t>
+        <w:fldChar w:fldCharType="begin"/>
+        <w:instrText xml:space="preserve"> PAGEREF bm_cap4 \h </w:instrText>
+        <w:fldChar w:fldCharType="separate"/>
+        <w:t>?</w:t>
+        <w:fldChar w:fldCharType="end"/>
       </w:r>
     </w:p>
     <w:p>
@@ -1063,7 +1161,11 @@
           <w:b w:val="0"/>
           <w:sz w:val="24"/>
         </w:rPr>
-        <w:t>8</w:t>
+        <w:fldChar w:fldCharType="begin"/>
+        <w:instrText xml:space="preserve"> PAGEREF bm_cap4_desc \h </w:instrText>
+        <w:fldChar w:fldCharType="separate"/>
+        <w:t>?</w:t>
+        <w:fldChar w:fldCharType="end"/>
       </w:r>
     </w:p>
     <w:p>
@@ -1089,7 +1191,11 @@
           <w:b/>
           <w:sz w:val="24"/>
         </w:rPr>
-        <w:t>10</w:t>
+        <w:fldChar w:fldCharType="begin"/>
+        <w:instrText xml:space="preserve"> PAGEREF bm_cap5 \h </w:instrText>
+        <w:fldChar w:fldCharType="separate"/>
+        <w:t>?</w:t>
+        <w:fldChar w:fldCharType="end"/>
       </w:r>
     </w:p>
     <w:p>
@@ -1115,7 +1221,11 @@
           <w:b w:val="0"/>
           <w:sz w:val="24"/>
         </w:rPr>
-        <w:t>10</w:t>
+        <w:fldChar w:fldCharType="begin"/>
+        <w:instrText xml:space="preserve"> PAGEREF bm_cap5_concl \h </w:instrText>
+        <w:fldChar w:fldCharType="separate"/>
+        <w:t>?</w:t>
+        <w:fldChar w:fldCharType="end"/>
       </w:r>
     </w:p>
     <w:p>
@@ -1141,7 +1251,11 @@
           <w:b w:val="0"/>
           <w:sz w:val="24"/>
         </w:rPr>
-        <w:t>10</w:t>
+        <w:fldChar w:fldCharType="begin"/>
+        <w:instrText xml:space="preserve"> PAGEREF bm_cap5_recom \h </w:instrText>
+        <w:fldChar w:fldCharType="separate"/>
+        <w:t>?</w:t>
+        <w:fldChar w:fldCharType="end"/>
       </w:r>
     </w:p>
     <w:p>
@@ -1167,7 +1281,11 @@
           <w:b/>
           <w:sz w:val="24"/>
         </w:rPr>
-        <w:t>11</w:t>
+        <w:fldChar w:fldCharType="begin"/>
+        <w:instrText xml:space="preserve"> PAGEREF bm_referencias \h </w:instrText>
+        <w:fldChar w:fldCharType="separate"/>
+        <w:t>?</w:t>
+        <w:fldChar w:fldCharType="end"/>
       </w:r>
     </w:p>
     <w:p>
@@ -1193,7 +1311,11 @@
           <w:b/>
           <w:sz w:val="24"/>
         </w:rPr>
-        <w:t>12</w:t>
+        <w:fldChar w:fldCharType="begin"/>
+        <w:instrText xml:space="preserve"> PAGEREF bm_anexos \h </w:instrText>
+        <w:fldChar w:fldCharType="separate"/>
+        <w:t>?</w:t>
+        <w:fldChar w:fldCharType="end"/>
       </w:r>
     </w:p>
     <w:p>
@@ -1210,6 +1332,7 @@
       </w:pPr>
     </w:p>
     <w:p>
+      <w:bookmarkStart w:id="bm_lista_cuadros" w:name="bm_lista_cuadros"/>
       <w:pPr>
         <w:spacing w:after="480"/>
         <w:jc w:val="center"/>
@@ -1222,6 +1345,7 @@
         </w:rPr>
         <w:t>LISTA DE CUADROS</w:t>
       </w:r>
+      <w:bookmarkEnd w:id="bm_lista_cuadros"/>
     </w:p>
     <w:p>
       <w:pPr>
@@ -1280,7 +1404,18 @@
         <w:tab/>
         <w:t>Planificación integral de objetivos específicos</w:t>
         <w:tab/>
-        <w:t>5</w:t>
+      </w:r>
+      <w:r>
+        <w:rPr>
+          <w:rFonts w:ascii="Times New Roman" w:hAnsi="Times New Roman"/>
+          <w:b w:val="0"/>
+          <w:sz w:val="24"/>
+        </w:rPr>
+        <w:fldChar w:fldCharType="begin"/>
+        <w:instrText xml:space="preserve"> PAGEREF bm_cuadro1 \h </w:instrText>
+        <w:fldChar w:fldCharType="separate"/>
+        <w:t>?</w:t>
+        <w:fldChar w:fldCharType="end"/>
       </w:r>
     </w:p>
     <w:p>
@@ -1301,7 +1436,18 @@
         <w:tab/>
         <w:t>Cronograma de actividades administrativas</w:t>
         <w:tab/>
-        <w:t>6</w:t>
+      </w:r>
+      <w:r>
+        <w:rPr>
+          <w:rFonts w:ascii="Times New Roman" w:hAnsi="Times New Roman"/>
+          <w:b w:val="0"/>
+          <w:sz w:val="24"/>
+        </w:rPr>
+        <w:fldChar w:fldCharType="begin"/>
+        <w:instrText xml:space="preserve"> PAGEREF bm_cuadro2 \h </w:instrText>
+        <w:fldChar w:fldCharType="separate"/>
+        <w:t>?</w:t>
+        <w:fldChar w:fldCharType="end"/>
       </w:r>
     </w:p>
     <w:p>
@@ -1318,6 +1464,7 @@
       </w:pPr>
     </w:p>
     <w:p>
+      <w:bookmarkStart w:id="bm_lista_graficos" w:name="bm_lista_graficos"/>
       <w:pPr>
         <w:spacing w:after="480"/>
         <w:jc w:val="center"/>
@@ -1330,6 +1477,7 @@
         </w:rPr>
         <w:t>LISTA DE GRÁFICOS</w:t>
       </w:r>
+      <w:bookmarkEnd w:id="bm_lista_graficos"/>
     </w:p>
     <w:p>
       <w:pPr>
@@ -1388,7 +1536,18 @@
         <w:tab/>
         <w:t>Representación cartográfica y ubicación espacial de Ingeniería de Telecomunicaciones, C.A.</w:t>
         <w:tab/>
-        <w:t>3</w:t>
+      </w:r>
+      <w:r>
+        <w:rPr>
+          <w:rFonts w:ascii="Times New Roman" w:hAnsi="Times New Roman"/>
+          <w:b w:val="0"/>
+          <w:sz w:val="24"/>
+        </w:rPr>
+        <w:fldChar w:fldCharType="begin"/>
+        <w:instrText xml:space="preserve"> PAGEREF bm_grafico1 \h </w:instrText>
+        <w:fldChar w:fldCharType="separate"/>
+        <w:t>?</w:t>
+        <w:fldChar w:fldCharType="end"/>
       </w:r>
     </w:p>
     <w:p>
@@ -1409,7 +1568,18 @@
         <w:tab/>
         <w:t>Organigrama estructural y niveles jerárquicos de Ingeniería de Telecomunicaciones, C.A.</w:t>
         <w:tab/>
-        <w:t>4</w:t>
+      </w:r>
+      <w:r>
+        <w:rPr>
+          <w:rFonts w:ascii="Times New Roman" w:hAnsi="Times New Roman"/>
+          <w:b w:val="0"/>
+          <w:sz w:val="24"/>
+        </w:rPr>
+        <w:fldChar w:fldCharType="begin"/>
+        <w:instrText xml:space="preserve"> PAGEREF bm_grafico2 \h </w:instrText>
+        <w:fldChar w:fldCharType="separate"/>
+        <w:t>?</w:t>
+        <w:fldChar w:fldCharType="end"/>
       </w:r>
     </w:p>
     <w:p>
@@ -1430,7 +1600,18 @@
         <w:tab/>
         <w:t>Organigrama del Departamento de Administración.</w:t>
         <w:tab/>
-        <w:t>5</w:t>
+      </w:r>
+      <w:r>
+        <w:rPr>
+          <w:rFonts w:ascii="Times New Roman" w:hAnsi="Times New Roman"/>
+          <w:b w:val="0"/>
+          <w:sz w:val="24"/>
+        </w:rPr>
+        <w:fldChar w:fldCharType="begin"/>
+        <w:instrText xml:space="preserve"> PAGEREF bm_grafico3 \h </w:instrText>
+        <w:fldChar w:fldCharType="separate"/>
+        <w:t>?</w:t>
+        <w:fldChar w:fldCharType="end"/>
       </w:r>
     </w:p>
     <w:p>
@@ -1447,6 +1628,7 @@
       </w:pPr>
     </w:p>
     <w:p>
+      <w:bookmarkStart w:id="bm_lista_anexos" w:name="bm_lista_anexos"/>
       <w:pPr>
         <w:spacing w:after="480"/>
         <w:jc w:val="center"/>
@@ -1459,6 +1641,7 @@
         </w:rPr>
         <w:t>LISTA DE ANEXOS</w:t>
       </w:r>
+      <w:bookmarkEnd w:id="bm_lista_anexos"/>
     </w:p>
     <w:p>
       <w:pPr>
@@ -1517,7 +1700,18 @@
         <w:tab/>
         <w:t>Definición de Términos Básicos</w:t>
         <w:tab/>
-        <w:t>13</w:t>
+      </w:r>
+      <w:r>
+        <w:rPr>
+          <w:rFonts w:ascii="Times New Roman" w:hAnsi="Times New Roman"/>
+          <w:b w:val="0"/>
+          <w:sz w:val="24"/>
+        </w:rPr>
+        <w:fldChar w:fldCharType="begin"/>
+        <w:instrText xml:space="preserve"> PAGEREF bm_anexoA \h </w:instrText>
+        <w:fldChar w:fldCharType="separate"/>
+        <w:t>?</w:t>
+        <w:fldChar w:fldCharType="end"/>
       </w:r>
     </w:p>
     <w:p>
@@ -1538,7 +1732,18 @@
         <w:tab/>
         <w:t>Planes de Trabajo</w:t>
         <w:tab/>
-        <w:t>14</w:t>
+      </w:r>
+      <w:r>
+        <w:rPr>
+          <w:rFonts w:ascii="Times New Roman" w:hAnsi="Times New Roman"/>
+          <w:b w:val="0"/>
+          <w:sz w:val="24"/>
+        </w:rPr>
+        <w:fldChar w:fldCharType="begin"/>
+        <w:instrText xml:space="preserve"> PAGEREF bm_anexoB \h </w:instrText>
+        <w:fldChar w:fldCharType="separate"/>
+        <w:t>?</w:t>
+        <w:fldChar w:fldCharType="end"/>
       </w:r>
     </w:p>
     <w:p>
@@ -1559,7 +1764,18 @@
         <w:tab/>
         <w:t>Memoria Fotográfica</w:t>
         <w:tab/>
-        <w:t>15</w:t>
+      </w:r>
+      <w:r>
+        <w:rPr>
+          <w:rFonts w:ascii="Times New Roman" w:hAnsi="Times New Roman"/>
+          <w:b w:val="0"/>
+          <w:sz w:val="24"/>
+        </w:rPr>
+        <w:fldChar w:fldCharType="begin"/>
+        <w:instrText xml:space="preserve"> PAGEREF bm_anexoC \h </w:instrText>
+        <w:fldChar w:fldCharType="separate"/>
+        <w:t>?</w:t>
+        <w:fldChar w:fldCharType="end"/>
       </w:r>
     </w:p>
     <w:p>
@@ -1576,6 +1792,7 @@
       </w:pPr>
     </w:p>
     <w:p>
+      <w:bookmarkStart w:id="bm_introduccion" w:name="bm_introduccion"/>
       <w:pPr>
         <w:spacing w:after="480"/>
         <w:jc w:val="center"/>
@@ -1588,6 +1805,7 @@
         </w:rPr>
         <w:t>INTRODUCCIÓN</w:t>
       </w:r>
+      <w:bookmarkEnd w:id="bm_introduccion"/>
     </w:p>
     <w:p>
       <w:pPr>
@@ -1643,6 +1861,7 @@
       </w:r>
     </w:p>
     <w:p>
+      <w:bookmarkStart w:id="bm_cap1" w:name="bm_cap1"/>
       <w:pPr>
         <w:spacing w:before="480"/>
         <w:jc w:val="center"/>
@@ -1655,6 +1874,7 @@
         </w:rPr>
         <w:t>REALIDAD ORGANIZACIONAL</w:t>
       </w:r>
+      <w:bookmarkEnd w:id="bm_cap1"/>
     </w:p>
     <w:p>
       <w:pPr>
@@ -1669,6 +1889,7 @@
       </w:pPr>
     </w:p>
     <w:p>
+      <w:bookmarkStart w:id="bm_cap1_ident" w:name="bm_cap1_ident"/>
       <w:pPr>
         <w:spacing w:before="480" w:after="480" w:line="360" w:lineRule="auto"/>
         <w:jc w:val="left"/>
@@ -1681,6 +1902,7 @@
         </w:rPr>
         <w:t>IDENTIFICACIÓN DE LA EMPRESA</w:t>
       </w:r>
+      <w:bookmarkEnd w:id="bm_cap1_ident"/>
     </w:p>
     <w:p>
       <w:pPr>
@@ -1729,6 +1951,7 @@
       </w:r>
     </w:p>
     <w:p>
+      <w:bookmarkStart w:id="bm_cap1_resena" w:name="bm_cap1_resena"/>
       <w:pPr>
         <w:spacing w:before="240" w:after="240" w:line="360" w:lineRule="auto"/>
         <w:ind w:firstLine="709"/>
@@ -1743,6 +1966,7 @@
         </w:rPr>
         <w:t>1.1.2 Reseña histórica</w:t>
       </w:r>
+      <w:bookmarkEnd w:id="bm_cap1_resena"/>
     </w:p>
     <w:p>
       <w:pPr>
@@ -1790,6 +2014,7 @@
       </w:r>
     </w:p>
     <w:p>
+      <w:bookmarkStart w:id="bm_cap1_mision" w:name="bm_cap1_mision"/>
       <w:pPr>
         <w:spacing w:before="240" w:after="240" w:line="360" w:lineRule="auto"/>
         <w:ind w:firstLine="709"/>
@@ -1804,6 +2029,7 @@
         </w:rPr>
         <w:t>1.1.3 Misión</w:t>
       </w:r>
+      <w:bookmarkEnd w:id="bm_cap1_mision"/>
     </w:p>
     <w:p>
       <w:pPr>
@@ -1821,6 +2047,7 @@
       </w:r>
     </w:p>
     <w:p>
+      <w:bookmarkStart w:id="bm_cap1_vision" w:name="bm_cap1_vision"/>
       <w:pPr>
         <w:spacing w:before="240" w:after="240" w:line="360" w:lineRule="auto"/>
         <w:ind w:firstLine="709"/>
@@ -1835,6 +2062,7 @@
         </w:rPr>
         <w:t>1.1.4 Visión</w:t>
       </w:r>
+      <w:bookmarkEnd w:id="bm_cap1_vision"/>
     </w:p>
     <w:p>
       <w:pPr>
@@ -1852,6 +2080,7 @@
       </w:r>
     </w:p>
     <w:p>
+      <w:bookmarkStart w:id="bm_cap1_valores" w:name="bm_cap1_valores"/>
       <w:pPr>
         <w:spacing w:before="240" w:after="240" w:line="360" w:lineRule="auto"/>
         <w:ind w:firstLine="709"/>
@@ -1866,6 +2095,7 @@
         </w:rPr>
         <w:t>1.1.5 Valores</w:t>
       </w:r>
+      <w:bookmarkEnd w:id="bm_cap1_valores"/>
     </w:p>
     <w:p>
       <w:pPr>
@@ -1999,6 +2229,7 @@
       </w:r>
     </w:p>
     <w:p>
+      <w:bookmarkStart w:id="bm_cap1_obj" w:name="bm_cap1_obj"/>
       <w:pPr>
         <w:spacing w:before="240" w:after="240" w:line="360" w:lineRule="auto"/>
         <w:ind w:firstLine="709"/>
@@ -2013,6 +2244,7 @@
         </w:rPr>
         <w:t>1.1.6 Objetivos Organizacionales</w:t>
       </w:r>
+      <w:bookmarkEnd w:id="bm_cap1_obj"/>
     </w:p>
     <w:p>
       <w:pPr>
@@ -2093,6 +2325,7 @@
       </w:r>
     </w:p>
     <w:p>
+      <w:bookmarkStart w:id="bm_cap1_ubic" w:name="bm_cap1_ubic"/>
       <w:pPr>
         <w:spacing w:before="240" w:after="240" w:line="360" w:lineRule="auto"/>
         <w:ind w:firstLine="709"/>
@@ -2107,6 +2340,7 @@
         </w:rPr>
         <w:t>1.1.7 Ubicación geográfica</w:t>
       </w:r>
+      <w:bookmarkEnd w:id="bm_cap1_ubic"/>
     </w:p>
     <w:p>
       <w:pPr>
@@ -2164,6 +2398,7 @@
       </w:r>
     </w:p>
     <w:p>
+      <w:bookmarkStart w:id="bm_grafico1" w:name="bm_grafico1"/>
       <w:pPr>
         <w:spacing w:before="120" w:after="480"/>
         <w:jc w:val="center"/>
@@ -2184,8 +2419,10 @@
         </w:rPr>
         <w:t>Representación cartográfica y ubicación espacial de Ingeniería de Telecomunicaciones, C.A.</w:t>
       </w:r>
+      <w:bookmarkEnd w:id="bm_grafico1"/>
     </w:p>
     <w:p>
+      <w:bookmarkStart w:id="bm_cap1_pobla" w:name="bm_cap1_pobla"/>
       <w:pPr>
         <w:spacing w:before="240" w:after="240" w:line="360" w:lineRule="auto"/>
         <w:ind w:firstLine="709"/>
@@ -2200,6 +2437,7 @@
         </w:rPr>
         <w:t>1.1.8 Población de los trabajadores de la empresa</w:t>
       </w:r>
+      <w:bookmarkEnd w:id="bm_cap1_pobla"/>
     </w:p>
     <w:p>
       <w:pPr>
@@ -2217,6 +2455,7 @@
       </w:r>
     </w:p>
     <w:p>
+      <w:bookmarkStart w:id="bm_cap1_estruct" w:name="bm_cap1_estruct"/>
       <w:pPr>
         <w:spacing w:before="240" w:after="240" w:line="360" w:lineRule="auto"/>
         <w:ind w:firstLine="709"/>
@@ -2231,6 +2470,7 @@
         </w:rPr>
         <w:t>1.1.9 Estructura Organizativa</w:t>
       </w:r>
+      <w:bookmarkEnd w:id="bm_cap1_estruct"/>
     </w:p>
     <w:p>
       <w:pPr>
@@ -2288,6 +2528,7 @@
       </w:r>
     </w:p>
     <w:p>
+      <w:bookmarkStart w:id="bm_grafico2" w:name="bm_grafico2"/>
       <w:pPr>
         <w:spacing w:before="120" w:after="480"/>
         <w:jc w:val="center"/>
@@ -2308,6 +2549,7 @@
         </w:rPr>
         <w:t>Organigrama estructural y niveles jerárquicos de Ingeniería de Telecomunicaciones, C.A.</w:t>
       </w:r>
+      <w:bookmarkEnd w:id="bm_grafico2"/>
     </w:p>
     <w:p>
       <w:pPr>
@@ -2350,6 +2592,7 @@
       </w:r>
     </w:p>
     <w:p>
+      <w:bookmarkStart w:id="bm_grafico3" w:name="bm_grafico3"/>
       <w:pPr>
         <w:spacing w:before="120" w:after="480"/>
         <w:jc w:val="center"/>
@@ -2370,6 +2613,7 @@
         </w:rPr>
         <w:t>Organigrama del Departamento de Administración.</w:t>
       </w:r>
+      <w:bookmarkEnd w:id="bm_grafico3"/>
     </w:p>
     <w:p>
       <w:pPr>
@@ -2399,6 +2643,7 @@
       </w:r>
     </w:p>
     <w:p>
+      <w:bookmarkStart w:id="bm_cap2" w:name="bm_cap2"/>
       <w:pPr>
         <w:spacing w:before="480"/>
         <w:jc w:val="center"/>
@@ -2411,6 +2656,7 @@
         </w:rPr>
         <w:t>DIAGNÓSTICO SITUACIONAL</w:t>
       </w:r>
+      <w:bookmarkEnd w:id="bm_cap2"/>
     </w:p>
     <w:p>
       <w:pPr>
@@ -2425,6 +2671,7 @@
       </w:pPr>
     </w:p>
     <w:p>
+      <w:bookmarkStart w:id="bm_cap2_sit" w:name="bm_cap2_sit"/>
       <w:pPr>
         <w:spacing w:before="480" w:after="480" w:line="360" w:lineRule="auto"/>
         <w:jc w:val="left"/>
@@ -2437,6 +2684,7 @@
         </w:rPr>
         <w:t>Identificación de la Situación Problemática</w:t>
       </w:r>
+      <w:bookmarkEnd w:id="bm_cap2_sit"/>
     </w:p>
     <w:p>
       <w:pPr>
@@ -2514,6 +2762,7 @@
       </w:r>
     </w:p>
     <w:p>
+      <w:bookmarkStart w:id="bm_cap2_objg" w:name="bm_cap2_objg"/>
       <w:pPr>
         <w:spacing w:before="480" w:after="480" w:line="360" w:lineRule="auto"/>
         <w:jc w:val="left"/>
@@ -2526,6 +2775,7 @@
         </w:rPr>
         <w:t>Objetivo General</w:t>
       </w:r>
+      <w:bookmarkEnd w:id="bm_cap2_objg"/>
     </w:p>
     <w:p>
       <w:pPr>
@@ -2543,6 +2793,7 @@
       </w:r>
     </w:p>
     <w:p>
+      <w:bookmarkStart w:id="bm_cap2_obje" w:name="bm_cap2_obje"/>
       <w:pPr>
         <w:spacing w:before="480" w:after="480" w:line="360" w:lineRule="auto"/>
         <w:jc w:val="left"/>
@@ -2555,6 +2806,7 @@
         </w:rPr>
         <w:t>Objetivos Específicos</w:t>
       </w:r>
+      <w:bookmarkEnd w:id="bm_cap2_obje"/>
     </w:p>
     <w:p>
       <w:pPr>
@@ -2641,6 +2893,7 @@
       </w:r>
     </w:p>
     <w:p>
+      <w:bookmarkStart w:id="bm_cap2_planif" w:name="bm_cap2_planif"/>
       <w:pPr>
         <w:spacing w:before="480" w:after="480" w:line="360" w:lineRule="auto"/>
         <w:jc w:val="left"/>
@@ -2653,6 +2906,7 @@
         </w:rPr>
         <w:t>Planificación integral de objetivos</w:t>
       </w:r>
+      <w:bookmarkEnd w:id="bm_cap2_planif"/>
     </w:p>
     <w:p>
       <w:pPr>
@@ -2670,6 +2924,7 @@
       </w:r>
     </w:p>
     <w:p>
+      <w:bookmarkStart w:id="bm_cuadro1" w:name="bm_cuadro1"/>
       <w:pPr>
         <w:spacing w:before="480" w:after="240" w:line="360" w:lineRule="auto"/>
         <w:jc w:val="left"/>
@@ -2690,6 +2945,7 @@
         </w:rPr>
         <w:t>Planificación integral de objetivos específicos.</w:t>
       </w:r>
+      <w:bookmarkEnd w:id="bm_cuadro1"/>
     </w:p>
     <w:tbl>
       <w:tblPr>
@@ -3137,6 +3393,7 @@
     </w:tbl>
     <w:p/>
     <w:p>
+      <w:bookmarkStart w:id="bm_cap2_crono" w:name="bm_cap2_crono"/>
       <w:pPr>
         <w:spacing w:before="480" w:after="480" w:line="360" w:lineRule="auto"/>
         <w:jc w:val="left"/>
@@ -3149,6 +3406,7 @@
         </w:rPr>
         <w:t>Cronograma de actividades</w:t>
       </w:r>
+      <w:bookmarkEnd w:id="bm_cap2_crono"/>
     </w:p>
     <w:p>
       <w:pPr>
@@ -3166,6 +3424,7 @@
       </w:r>
     </w:p>
     <w:p>
+      <w:bookmarkStart w:id="bm_cuadro2" w:name="bm_cuadro2"/>
       <w:pPr>
         <w:spacing w:before="480" w:after="240" w:line="360" w:lineRule="auto"/>
         <w:jc w:val="left"/>
@@ -3186,6 +3445,7 @@
         </w:rPr>
         <w:t>Cronograma de actividades administrativas.</w:t>
       </w:r>
+      <w:bookmarkEnd w:id="bm_cuadro2"/>
     </w:p>
     <w:tbl>
       <w:tblPr>
@@ -5720,6 +5980,7 @@
       </w:r>
     </w:p>
     <w:p>
+      <w:bookmarkStart w:id="bm_cap3" w:name="bm_cap3"/>
       <w:pPr>
         <w:spacing w:before="480"/>
         <w:jc w:val="center"/>
@@ -5732,6 +5993,7 @@
         </w:rPr>
         <w:t>MARCO TEÓRICO</w:t>
       </w:r>
+      <w:bookmarkEnd w:id="bm_cap3"/>
     </w:p>
     <w:p>
       <w:pPr>
@@ -5746,6 +6008,7 @@
       </w:pPr>
     </w:p>
     <w:p>
+      <w:bookmarkStart w:id="bm_cap3_bases" w:name="bm_cap3_bases"/>
       <w:pPr>
         <w:spacing w:before="480" w:after="480" w:line="360" w:lineRule="auto"/>
         <w:jc w:val="left"/>
@@ -5758,6 +6021,7 @@
         </w:rPr>
         <w:t>Bases Teóricas Referenciales</w:t>
       </w:r>
+      <w:bookmarkEnd w:id="bm_cap3_bases"/>
     </w:p>
     <w:p>
       <w:pPr>
@@ -5817,6 +6081,7 @@
       </w:r>
     </w:p>
     <w:p>
+      <w:bookmarkStart w:id="bm_cap4" w:name="bm_cap4"/>
       <w:pPr>
         <w:spacing w:before="480"/>
         <w:jc w:val="center"/>
@@ -5829,6 +6094,7 @@
         </w:rPr>
         <w:t>ACTIVIDADES REALIZADAS</w:t>
       </w:r>
+      <w:bookmarkEnd w:id="bm_cap4"/>
     </w:p>
     <w:p>
       <w:pPr>
@@ -5843,6 +6109,7 @@
       </w:pPr>
     </w:p>
     <w:p>
+      <w:bookmarkStart w:id="bm_cap4_desc" w:name="bm_cap4_desc"/>
       <w:pPr>
         <w:spacing w:before="480" w:after="480" w:line="360" w:lineRule="auto"/>
         <w:jc w:val="left"/>
@@ -5855,6 +6122,7 @@
         </w:rPr>
         <w:t>Descripción de Actividades Ejecutadas por Semana</w:t>
       </w:r>
+      <w:bookmarkEnd w:id="bm_cap4_desc"/>
     </w:p>
     <w:p>
       <w:pPr>
@@ -6109,6 +6377,7 @@
       </w:r>
     </w:p>
     <w:p>
+      <w:bookmarkStart w:id="bm_cap5" w:name="bm_cap5"/>
       <w:pPr>
         <w:spacing w:before="480"/>
         <w:jc w:val="center"/>
@@ -6121,6 +6390,7 @@
         </w:rPr>
         <w:t>CONCLUSIONES Y RECOMENDACIONES</w:t>
       </w:r>
+      <w:bookmarkEnd w:id="bm_cap5"/>
     </w:p>
     <w:p>
       <w:pPr>
@@ -6135,6 +6405,7 @@
       </w:pPr>
     </w:p>
     <w:p>
+      <w:bookmarkStart w:id="bm_cap5_concl" w:name="bm_cap5_concl"/>
       <w:pPr>
         <w:spacing w:before="480" w:after="480" w:line="360" w:lineRule="auto"/>
         <w:jc w:val="left"/>
@@ -6147,6 +6418,7 @@
         </w:rPr>
         <w:t>Conclusiones</w:t>
       </w:r>
+      <w:bookmarkEnd w:id="bm_cap5_concl"/>
     </w:p>
     <w:p>
       <w:pPr>
@@ -6191,6 +6463,7 @@
       </w:r>
     </w:p>
     <w:p>
+      <w:bookmarkStart w:id="bm_cap5_recom" w:name="bm_cap5_recom"/>
       <w:pPr>
         <w:spacing w:before="480" w:after="480" w:line="360" w:lineRule="auto"/>
         <w:jc w:val="left"/>
@@ -6203,6 +6476,7 @@
         </w:rPr>
         <w:t>Recomendaciones</w:t>
       </w:r>
+      <w:bookmarkEnd w:id="bm_cap5_recom"/>
     </w:p>
     <w:p>
       <w:pPr>
@@ -6260,6 +6534,7 @@
       </w:pPr>
     </w:p>
     <w:p>
+      <w:bookmarkStart w:id="bm_referencias" w:name="bm_referencias"/>
       <w:pPr>
         <w:spacing w:after="480"/>
         <w:jc w:val="center"/>
@@ -6272,6 +6547,7 @@
         </w:rPr>
         <w:t>REFERENCIAS</w:t>
       </w:r>
+      <w:bookmarkEnd w:id="bm_referencias"/>
     </w:p>
     <w:p>
       <w:pPr>
@@ -6318,6 +6594,7 @@
       </w:pPr>
     </w:p>
     <w:p>
+      <w:bookmarkStart w:id="bm_anexos" w:name="bm_anexos"/>
       <w:pPr>
         <w:spacing w:before="3600"/>
         <w:jc w:val="center"/>
@@ -6330,6 +6607,7 @@
         </w:rPr>
         <w:t>ANEXOS</w:t>
       </w:r>
+      <w:bookmarkEnd w:id="bm_anexos"/>
     </w:p>
     <w:p>
       <w:pPr>
@@ -6344,10 +6622,12 @@
       </w:pPr>
     </w:p>
     <w:p>
+      <w:bookmarkStart w:id="bm_anexoA" w:name="bm_anexoA"/>
       <w:pPr>
         <w:spacing w:before="0" w:after="480"/>
         <w:jc w:val="center"/>
       </w:pPr>
+      <w:bookmarkEnd w:id="bm_anexoA"/>
       <w:r>
         <w:rPr>
           <w:rFonts w:ascii="Times New Roman" w:hAnsi="Times New Roman"/>
@@ -6397,10 +6677,12 @@
       </w:pPr>
     </w:p>
     <w:p>
+      <w:bookmarkStart w:id="bm_anexoB" w:name="bm_anexoB"/>
       <w:pPr>
         <w:spacing w:before="0" w:after="480"/>
         <w:jc w:val="center"/>
       </w:pPr>
+      <w:bookmarkEnd w:id="bm_anexoB"/>
       <w:r>
         <w:rPr>
           <w:rFonts w:ascii="Times New Roman" w:hAnsi="Times New Roman"/>
@@ -6450,10 +6732,12 @@
       </w:pPr>
     </w:p>
     <w:p>
+      <w:bookmarkStart w:id="bm_anexoC" w:name="bm_anexoC"/>
       <w:pPr>
         <w:spacing w:before="0" w:after="480"/>
         <w:jc w:val="center"/>
       </w:pPr>
+      <w:bookmarkEnd w:id="bm_anexoC"/>
       <w:r>
         <w:rPr>
           <w:rFonts w:ascii="Times New Roman" w:hAnsi="Times New Roman"/>

</xml_diff>

<commit_message>
Gantt: detectar automaticamente el ancho de columna S segun la etiqueta mas larga (S1..S10)
</commit_message>
<xml_diff>
--- a/amaal/reportes/Informe_Pasantia_IUTECP.docx
+++ b/amaal/reportes/Informe_Pasantia_IUTECP.docx
@@ -3455,22 +3455,22 @@
         <w:tblLayout w:type="fixed"/>
       </w:tblPr>
       <w:tblGrid>
-        <w:gridCol w:w="5386"/>
-        <w:gridCol w:w="288"/>
-        <w:gridCol w:w="288"/>
-        <w:gridCol w:w="288"/>
-        <w:gridCol w:w="288"/>
-        <w:gridCol w:w="288"/>
-        <w:gridCol w:w="288"/>
-        <w:gridCol w:w="288"/>
-        <w:gridCol w:w="288"/>
-        <w:gridCol w:w="288"/>
-        <w:gridCol w:w="288"/>
+        <w:gridCol w:w="3033"/>
+        <w:gridCol w:w="523"/>
+        <w:gridCol w:w="523"/>
+        <w:gridCol w:w="523"/>
+        <w:gridCol w:w="523"/>
+        <w:gridCol w:w="523"/>
+        <w:gridCol w:w="523"/>
+        <w:gridCol w:w="523"/>
+        <w:gridCol w:w="523"/>
+        <w:gridCol w:w="523"/>
+        <w:gridCol w:w="523"/>
       </w:tblGrid>
       <w:tr>
         <w:tc>
           <w:tcPr>
-            <w:tcW w:w="5386" w:type="dxa"/>
+            <w:tcW w:w="3033" w:type="dxa"/>
             <w:shd w:val="clear" w:color="auto" w:fill="4472C4"/>
           </w:tcPr>
           <w:p>
@@ -3491,7 +3491,7 @@
         </w:tc>
         <w:tc>
           <w:tcPr>
-            <w:tcW w:w="288" w:type="dxa"/>
+            <w:tcW w:w="523" w:type="dxa"/>
             <w:shd w:val="clear" w:color="auto" w:fill="4472C4"/>
           </w:tcPr>
           <w:p>
@@ -3512,7 +3512,7 @@
         </w:tc>
         <w:tc>
           <w:tcPr>
-            <w:tcW w:w="288" w:type="dxa"/>
+            <w:tcW w:w="523" w:type="dxa"/>
             <w:shd w:val="clear" w:color="auto" w:fill="4472C4"/>
           </w:tcPr>
           <w:p>
@@ -3533,7 +3533,7 @@
         </w:tc>
         <w:tc>
           <w:tcPr>
-            <w:tcW w:w="288" w:type="dxa"/>
+            <w:tcW w:w="523" w:type="dxa"/>
             <w:shd w:val="clear" w:color="auto" w:fill="4472C4"/>
           </w:tcPr>
           <w:p>
@@ -3554,7 +3554,7 @@
         </w:tc>
         <w:tc>
           <w:tcPr>
-            <w:tcW w:w="288" w:type="dxa"/>
+            <w:tcW w:w="523" w:type="dxa"/>
             <w:shd w:val="clear" w:color="auto" w:fill="4472C4"/>
           </w:tcPr>
           <w:p>
@@ -3575,7 +3575,7 @@
         </w:tc>
         <w:tc>
           <w:tcPr>
-            <w:tcW w:w="288" w:type="dxa"/>
+            <w:tcW w:w="523" w:type="dxa"/>
             <w:shd w:val="clear" w:color="auto" w:fill="4472C4"/>
           </w:tcPr>
           <w:p>
@@ -3596,7 +3596,7 @@
         </w:tc>
         <w:tc>
           <w:tcPr>
-            <w:tcW w:w="288" w:type="dxa"/>
+            <w:tcW w:w="523" w:type="dxa"/>
             <w:shd w:val="clear" w:color="auto" w:fill="4472C4"/>
           </w:tcPr>
           <w:p>
@@ -3617,7 +3617,7 @@
         </w:tc>
         <w:tc>
           <w:tcPr>
-            <w:tcW w:w="288" w:type="dxa"/>
+            <w:tcW w:w="523" w:type="dxa"/>
             <w:shd w:val="clear" w:color="auto" w:fill="4472C4"/>
           </w:tcPr>
           <w:p>
@@ -3638,7 +3638,7 @@
         </w:tc>
         <w:tc>
           <w:tcPr>
-            <w:tcW w:w="288" w:type="dxa"/>
+            <w:tcW w:w="523" w:type="dxa"/>
             <w:shd w:val="clear" w:color="auto" w:fill="4472C4"/>
           </w:tcPr>
           <w:p>
@@ -3659,7 +3659,7 @@
         </w:tc>
         <w:tc>
           <w:tcPr>
-            <w:tcW w:w="288" w:type="dxa"/>
+            <w:tcW w:w="523" w:type="dxa"/>
             <w:shd w:val="clear" w:color="auto" w:fill="4472C4"/>
           </w:tcPr>
           <w:p>
@@ -3680,7 +3680,7 @@
         </w:tc>
         <w:tc>
           <w:tcPr>
-            <w:tcW w:w="288" w:type="dxa"/>
+            <w:tcW w:w="523" w:type="dxa"/>
             <w:shd w:val="clear" w:color="auto" w:fill="4472C4"/>
           </w:tcPr>
           <w:p>
@@ -3703,7 +3703,7 @@
       <w:tr>
         <w:tc>
           <w:tcPr>
-            <w:tcW w:w="5386" w:type="dxa"/>
+            <w:tcW w:w="3033" w:type="dxa"/>
             <w:shd w:val="clear" w:color="auto" w:fill="FFFFFF"/>
           </w:tcPr>
           <w:p>
@@ -3724,7 +3724,7 @@
         </w:tc>
         <w:tc>
           <w:tcPr>
-            <w:tcW w:w="288" w:type="dxa"/>
+            <w:tcW w:w="523" w:type="dxa"/>
             <w:shd w:val="clear" w:color="auto" w:fill="70AD47"/>
           </w:tcPr>
           <w:p>
@@ -3745,7 +3745,7 @@
         </w:tc>
         <w:tc>
           <w:tcPr>
-            <w:tcW w:w="288" w:type="dxa"/>
+            <w:tcW w:w="523" w:type="dxa"/>
             <w:shd w:val="clear" w:color="auto" w:fill="FFFFFF"/>
           </w:tcPr>
           <w:p>
@@ -3765,7 +3765,7 @@
         </w:tc>
         <w:tc>
           <w:tcPr>
-            <w:tcW w:w="288" w:type="dxa"/>
+            <w:tcW w:w="523" w:type="dxa"/>
             <w:shd w:val="clear" w:color="auto" w:fill="FFFFFF"/>
           </w:tcPr>
           <w:p>
@@ -3785,7 +3785,7 @@
         </w:tc>
         <w:tc>
           <w:tcPr>
-            <w:tcW w:w="288" w:type="dxa"/>
+            <w:tcW w:w="523" w:type="dxa"/>
             <w:shd w:val="clear" w:color="auto" w:fill="FFFFFF"/>
           </w:tcPr>
           <w:p>
@@ -3805,7 +3805,7 @@
         </w:tc>
         <w:tc>
           <w:tcPr>
-            <w:tcW w:w="288" w:type="dxa"/>
+            <w:tcW w:w="523" w:type="dxa"/>
             <w:shd w:val="clear" w:color="auto" w:fill="FFFFFF"/>
           </w:tcPr>
           <w:p>
@@ -3825,7 +3825,7 @@
         </w:tc>
         <w:tc>
           <w:tcPr>
-            <w:tcW w:w="288" w:type="dxa"/>
+            <w:tcW w:w="523" w:type="dxa"/>
             <w:shd w:val="clear" w:color="auto" w:fill="FFFFFF"/>
           </w:tcPr>
           <w:p>
@@ -3845,7 +3845,7 @@
         </w:tc>
         <w:tc>
           <w:tcPr>
-            <w:tcW w:w="288" w:type="dxa"/>
+            <w:tcW w:w="523" w:type="dxa"/>
             <w:shd w:val="clear" w:color="auto" w:fill="FFFFFF"/>
           </w:tcPr>
           <w:p>
@@ -3865,7 +3865,7 @@
         </w:tc>
         <w:tc>
           <w:tcPr>
-            <w:tcW w:w="288" w:type="dxa"/>
+            <w:tcW w:w="523" w:type="dxa"/>
             <w:shd w:val="clear" w:color="auto" w:fill="FFFFFF"/>
           </w:tcPr>
           <w:p>
@@ -3885,7 +3885,7 @@
         </w:tc>
         <w:tc>
           <w:tcPr>
-            <w:tcW w:w="288" w:type="dxa"/>
+            <w:tcW w:w="523" w:type="dxa"/>
             <w:shd w:val="clear" w:color="auto" w:fill="FFFFFF"/>
           </w:tcPr>
           <w:p>
@@ -3905,7 +3905,7 @@
         </w:tc>
         <w:tc>
           <w:tcPr>
-            <w:tcW w:w="288" w:type="dxa"/>
+            <w:tcW w:w="523" w:type="dxa"/>
             <w:shd w:val="clear" w:color="auto" w:fill="FFFFFF"/>
           </w:tcPr>
           <w:p>
@@ -3927,7 +3927,7 @@
       <w:tr>
         <w:tc>
           <w:tcPr>
-            <w:tcW w:w="5386" w:type="dxa"/>
+            <w:tcW w:w="3033" w:type="dxa"/>
             <w:shd w:val="clear" w:color="auto" w:fill="D9E1F2"/>
           </w:tcPr>
           <w:p>
@@ -3948,7 +3948,7 @@
         </w:tc>
         <w:tc>
           <w:tcPr>
-            <w:tcW w:w="288" w:type="dxa"/>
+            <w:tcW w:w="523" w:type="dxa"/>
             <w:shd w:val="clear" w:color="auto" w:fill="70AD47"/>
           </w:tcPr>
           <w:p>
@@ -3969,7 +3969,7 @@
         </w:tc>
         <w:tc>
           <w:tcPr>
-            <w:tcW w:w="288" w:type="dxa"/>
+            <w:tcW w:w="523" w:type="dxa"/>
             <w:shd w:val="clear" w:color="auto" w:fill="70AD47"/>
           </w:tcPr>
           <w:p>
@@ -3990,7 +3990,7 @@
         </w:tc>
         <w:tc>
           <w:tcPr>
-            <w:tcW w:w="288" w:type="dxa"/>
+            <w:tcW w:w="523" w:type="dxa"/>
             <w:shd w:val="clear" w:color="auto" w:fill="D9E1F2"/>
           </w:tcPr>
           <w:p>
@@ -4010,7 +4010,7 @@
         </w:tc>
         <w:tc>
           <w:tcPr>
-            <w:tcW w:w="288" w:type="dxa"/>
+            <w:tcW w:w="523" w:type="dxa"/>
             <w:shd w:val="clear" w:color="auto" w:fill="D9E1F2"/>
           </w:tcPr>
           <w:p>
@@ -4030,7 +4030,7 @@
         </w:tc>
         <w:tc>
           <w:tcPr>
-            <w:tcW w:w="288" w:type="dxa"/>
+            <w:tcW w:w="523" w:type="dxa"/>
             <w:shd w:val="clear" w:color="auto" w:fill="D9E1F2"/>
           </w:tcPr>
           <w:p>
@@ -4050,7 +4050,7 @@
         </w:tc>
         <w:tc>
           <w:tcPr>
-            <w:tcW w:w="288" w:type="dxa"/>
+            <w:tcW w:w="523" w:type="dxa"/>
             <w:shd w:val="clear" w:color="auto" w:fill="D9E1F2"/>
           </w:tcPr>
           <w:p>
@@ -4070,7 +4070,7 @@
         </w:tc>
         <w:tc>
           <w:tcPr>
-            <w:tcW w:w="288" w:type="dxa"/>
+            <w:tcW w:w="523" w:type="dxa"/>
             <w:shd w:val="clear" w:color="auto" w:fill="D9E1F2"/>
           </w:tcPr>
           <w:p>
@@ -4090,7 +4090,7 @@
         </w:tc>
         <w:tc>
           <w:tcPr>
-            <w:tcW w:w="288" w:type="dxa"/>
+            <w:tcW w:w="523" w:type="dxa"/>
             <w:shd w:val="clear" w:color="auto" w:fill="D9E1F2"/>
           </w:tcPr>
           <w:p>
@@ -4110,7 +4110,7 @@
         </w:tc>
         <w:tc>
           <w:tcPr>
-            <w:tcW w:w="288" w:type="dxa"/>
+            <w:tcW w:w="523" w:type="dxa"/>
             <w:shd w:val="clear" w:color="auto" w:fill="D9E1F2"/>
           </w:tcPr>
           <w:p>
@@ -4130,7 +4130,7 @@
         </w:tc>
         <w:tc>
           <w:tcPr>
-            <w:tcW w:w="288" w:type="dxa"/>
+            <w:tcW w:w="523" w:type="dxa"/>
             <w:shd w:val="clear" w:color="auto" w:fill="D9E1F2"/>
           </w:tcPr>
           <w:p>
@@ -4152,7 +4152,7 @@
       <w:tr>
         <w:tc>
           <w:tcPr>
-            <w:tcW w:w="5386" w:type="dxa"/>
+            <w:tcW w:w="3033" w:type="dxa"/>
             <w:shd w:val="clear" w:color="auto" w:fill="FFFFFF"/>
           </w:tcPr>
           <w:p>
@@ -4173,7 +4173,7 @@
         </w:tc>
         <w:tc>
           <w:tcPr>
-            <w:tcW w:w="288" w:type="dxa"/>
+            <w:tcW w:w="523" w:type="dxa"/>
             <w:shd w:val="clear" w:color="auto" w:fill="FFFFFF"/>
           </w:tcPr>
           <w:p>
@@ -4193,7 +4193,7 @@
         </w:tc>
         <w:tc>
           <w:tcPr>
-            <w:tcW w:w="288" w:type="dxa"/>
+            <w:tcW w:w="523" w:type="dxa"/>
             <w:shd w:val="clear" w:color="auto" w:fill="70AD47"/>
           </w:tcPr>
           <w:p>
@@ -4214,7 +4214,7 @@
         </w:tc>
         <w:tc>
           <w:tcPr>
-            <w:tcW w:w="288" w:type="dxa"/>
+            <w:tcW w:w="523" w:type="dxa"/>
             <w:shd w:val="clear" w:color="auto" w:fill="70AD47"/>
           </w:tcPr>
           <w:p>
@@ -4235,7 +4235,7 @@
         </w:tc>
         <w:tc>
           <w:tcPr>
-            <w:tcW w:w="288" w:type="dxa"/>
+            <w:tcW w:w="523" w:type="dxa"/>
             <w:shd w:val="clear" w:color="auto" w:fill="FFFFFF"/>
           </w:tcPr>
           <w:p>
@@ -4255,7 +4255,7 @@
         </w:tc>
         <w:tc>
           <w:tcPr>
-            <w:tcW w:w="288" w:type="dxa"/>
+            <w:tcW w:w="523" w:type="dxa"/>
             <w:shd w:val="clear" w:color="auto" w:fill="FFFFFF"/>
           </w:tcPr>
           <w:p>
@@ -4275,7 +4275,7 @@
         </w:tc>
         <w:tc>
           <w:tcPr>
-            <w:tcW w:w="288" w:type="dxa"/>
+            <w:tcW w:w="523" w:type="dxa"/>
             <w:shd w:val="clear" w:color="auto" w:fill="FFFFFF"/>
           </w:tcPr>
           <w:p>
@@ -4295,7 +4295,7 @@
         </w:tc>
         <w:tc>
           <w:tcPr>
-            <w:tcW w:w="288" w:type="dxa"/>
+            <w:tcW w:w="523" w:type="dxa"/>
             <w:shd w:val="clear" w:color="auto" w:fill="FFFFFF"/>
           </w:tcPr>
           <w:p>
@@ -4315,7 +4315,7 @@
         </w:tc>
         <w:tc>
           <w:tcPr>
-            <w:tcW w:w="288" w:type="dxa"/>
+            <w:tcW w:w="523" w:type="dxa"/>
             <w:shd w:val="clear" w:color="auto" w:fill="FFFFFF"/>
           </w:tcPr>
           <w:p>
@@ -4335,7 +4335,7 @@
         </w:tc>
         <w:tc>
           <w:tcPr>
-            <w:tcW w:w="288" w:type="dxa"/>
+            <w:tcW w:w="523" w:type="dxa"/>
             <w:shd w:val="clear" w:color="auto" w:fill="FFFFFF"/>
           </w:tcPr>
           <w:p>
@@ -4355,7 +4355,7 @@
         </w:tc>
         <w:tc>
           <w:tcPr>
-            <w:tcW w:w="288" w:type="dxa"/>
+            <w:tcW w:w="523" w:type="dxa"/>
             <w:shd w:val="clear" w:color="auto" w:fill="FFFFFF"/>
           </w:tcPr>
           <w:p>
@@ -4377,7 +4377,7 @@
       <w:tr>
         <w:tc>
           <w:tcPr>
-            <w:tcW w:w="5386" w:type="dxa"/>
+            <w:tcW w:w="3033" w:type="dxa"/>
             <w:shd w:val="clear" w:color="auto" w:fill="D9E1F2"/>
           </w:tcPr>
           <w:p>
@@ -4398,7 +4398,7 @@
         </w:tc>
         <w:tc>
           <w:tcPr>
-            <w:tcW w:w="288" w:type="dxa"/>
+            <w:tcW w:w="523" w:type="dxa"/>
             <w:shd w:val="clear" w:color="auto" w:fill="D9E1F2"/>
           </w:tcPr>
           <w:p>
@@ -4418,7 +4418,7 @@
         </w:tc>
         <w:tc>
           <w:tcPr>
-            <w:tcW w:w="288" w:type="dxa"/>
+            <w:tcW w:w="523" w:type="dxa"/>
             <w:shd w:val="clear" w:color="auto" w:fill="D9E1F2"/>
           </w:tcPr>
           <w:p>
@@ -4438,7 +4438,7 @@
         </w:tc>
         <w:tc>
           <w:tcPr>
-            <w:tcW w:w="288" w:type="dxa"/>
+            <w:tcW w:w="523" w:type="dxa"/>
             <w:shd w:val="clear" w:color="auto" w:fill="70AD47"/>
           </w:tcPr>
           <w:p>
@@ -4459,7 +4459,7 @@
         </w:tc>
         <w:tc>
           <w:tcPr>
-            <w:tcW w:w="288" w:type="dxa"/>
+            <w:tcW w:w="523" w:type="dxa"/>
             <w:shd w:val="clear" w:color="auto" w:fill="70AD47"/>
           </w:tcPr>
           <w:p>
@@ -4480,7 +4480,7 @@
         </w:tc>
         <w:tc>
           <w:tcPr>
-            <w:tcW w:w="288" w:type="dxa"/>
+            <w:tcW w:w="523" w:type="dxa"/>
             <w:shd w:val="clear" w:color="auto" w:fill="D9E1F2"/>
           </w:tcPr>
           <w:p>
@@ -4500,7 +4500,7 @@
         </w:tc>
         <w:tc>
           <w:tcPr>
-            <w:tcW w:w="288" w:type="dxa"/>
+            <w:tcW w:w="523" w:type="dxa"/>
             <w:shd w:val="clear" w:color="auto" w:fill="D9E1F2"/>
           </w:tcPr>
           <w:p>
@@ -4520,7 +4520,7 @@
         </w:tc>
         <w:tc>
           <w:tcPr>
-            <w:tcW w:w="288" w:type="dxa"/>
+            <w:tcW w:w="523" w:type="dxa"/>
             <w:shd w:val="clear" w:color="auto" w:fill="D9E1F2"/>
           </w:tcPr>
           <w:p>
@@ -4540,7 +4540,7 @@
         </w:tc>
         <w:tc>
           <w:tcPr>
-            <w:tcW w:w="288" w:type="dxa"/>
+            <w:tcW w:w="523" w:type="dxa"/>
             <w:shd w:val="clear" w:color="auto" w:fill="D9E1F2"/>
           </w:tcPr>
           <w:p>
@@ -4560,7 +4560,7 @@
         </w:tc>
         <w:tc>
           <w:tcPr>
-            <w:tcW w:w="288" w:type="dxa"/>
+            <w:tcW w:w="523" w:type="dxa"/>
             <w:shd w:val="clear" w:color="auto" w:fill="D9E1F2"/>
           </w:tcPr>
           <w:p>
@@ -4580,7 +4580,7 @@
         </w:tc>
         <w:tc>
           <w:tcPr>
-            <w:tcW w:w="288" w:type="dxa"/>
+            <w:tcW w:w="523" w:type="dxa"/>
             <w:shd w:val="clear" w:color="auto" w:fill="D9E1F2"/>
           </w:tcPr>
           <w:p>
@@ -4602,7 +4602,7 @@
       <w:tr>
         <w:tc>
           <w:tcPr>
-            <w:tcW w:w="5386" w:type="dxa"/>
+            <w:tcW w:w="3033" w:type="dxa"/>
             <w:shd w:val="clear" w:color="auto" w:fill="FFFFFF"/>
           </w:tcPr>
           <w:p>
@@ -4623,7 +4623,7 @@
         </w:tc>
         <w:tc>
           <w:tcPr>
-            <w:tcW w:w="288" w:type="dxa"/>
+            <w:tcW w:w="523" w:type="dxa"/>
             <w:shd w:val="clear" w:color="auto" w:fill="FFFFFF"/>
           </w:tcPr>
           <w:p>
@@ -4643,7 +4643,7 @@
         </w:tc>
         <w:tc>
           <w:tcPr>
-            <w:tcW w:w="288" w:type="dxa"/>
+            <w:tcW w:w="523" w:type="dxa"/>
             <w:shd w:val="clear" w:color="auto" w:fill="FFFFFF"/>
           </w:tcPr>
           <w:p>
@@ -4663,7 +4663,7 @@
         </w:tc>
         <w:tc>
           <w:tcPr>
-            <w:tcW w:w="288" w:type="dxa"/>
+            <w:tcW w:w="523" w:type="dxa"/>
             <w:shd w:val="clear" w:color="auto" w:fill="FFFFFF"/>
           </w:tcPr>
           <w:p>
@@ -4683,7 +4683,7 @@
         </w:tc>
         <w:tc>
           <w:tcPr>
-            <w:tcW w:w="288" w:type="dxa"/>
+            <w:tcW w:w="523" w:type="dxa"/>
             <w:shd w:val="clear" w:color="auto" w:fill="70AD47"/>
           </w:tcPr>
           <w:p>
@@ -4704,7 +4704,7 @@
         </w:tc>
         <w:tc>
           <w:tcPr>
-            <w:tcW w:w="288" w:type="dxa"/>
+            <w:tcW w:w="523" w:type="dxa"/>
             <w:shd w:val="clear" w:color="auto" w:fill="70AD47"/>
           </w:tcPr>
           <w:p>
@@ -4725,7 +4725,7 @@
         </w:tc>
         <w:tc>
           <w:tcPr>
-            <w:tcW w:w="288" w:type="dxa"/>
+            <w:tcW w:w="523" w:type="dxa"/>
             <w:shd w:val="clear" w:color="auto" w:fill="FFFFFF"/>
           </w:tcPr>
           <w:p>
@@ -4745,7 +4745,7 @@
         </w:tc>
         <w:tc>
           <w:tcPr>
-            <w:tcW w:w="288" w:type="dxa"/>
+            <w:tcW w:w="523" w:type="dxa"/>
             <w:shd w:val="clear" w:color="auto" w:fill="FFFFFF"/>
           </w:tcPr>
           <w:p>
@@ -4765,7 +4765,7 @@
         </w:tc>
         <w:tc>
           <w:tcPr>
-            <w:tcW w:w="288" w:type="dxa"/>
+            <w:tcW w:w="523" w:type="dxa"/>
             <w:shd w:val="clear" w:color="auto" w:fill="FFFFFF"/>
           </w:tcPr>
           <w:p>
@@ -4785,7 +4785,7 @@
         </w:tc>
         <w:tc>
           <w:tcPr>
-            <w:tcW w:w="288" w:type="dxa"/>
+            <w:tcW w:w="523" w:type="dxa"/>
             <w:shd w:val="clear" w:color="auto" w:fill="FFFFFF"/>
           </w:tcPr>
           <w:p>
@@ -4805,7 +4805,7 @@
         </w:tc>
         <w:tc>
           <w:tcPr>
-            <w:tcW w:w="288" w:type="dxa"/>
+            <w:tcW w:w="523" w:type="dxa"/>
             <w:shd w:val="clear" w:color="auto" w:fill="FFFFFF"/>
           </w:tcPr>
           <w:p>
@@ -4827,7 +4827,7 @@
       <w:tr>
         <w:tc>
           <w:tcPr>
-            <w:tcW w:w="5386" w:type="dxa"/>
+            <w:tcW w:w="3033" w:type="dxa"/>
             <w:shd w:val="clear" w:color="auto" w:fill="D9E1F2"/>
           </w:tcPr>
           <w:p>
@@ -4848,7 +4848,7 @@
         </w:tc>
         <w:tc>
           <w:tcPr>
-            <w:tcW w:w="288" w:type="dxa"/>
+            <w:tcW w:w="523" w:type="dxa"/>
             <w:shd w:val="clear" w:color="auto" w:fill="D9E1F2"/>
           </w:tcPr>
           <w:p>
@@ -4868,7 +4868,7 @@
         </w:tc>
         <w:tc>
           <w:tcPr>
-            <w:tcW w:w="288" w:type="dxa"/>
+            <w:tcW w:w="523" w:type="dxa"/>
             <w:shd w:val="clear" w:color="auto" w:fill="D9E1F2"/>
           </w:tcPr>
           <w:p>
@@ -4888,7 +4888,7 @@
         </w:tc>
         <w:tc>
           <w:tcPr>
-            <w:tcW w:w="288" w:type="dxa"/>
+            <w:tcW w:w="523" w:type="dxa"/>
             <w:shd w:val="clear" w:color="auto" w:fill="D9E1F2"/>
           </w:tcPr>
           <w:p>
@@ -4908,7 +4908,7 @@
         </w:tc>
         <w:tc>
           <w:tcPr>
-            <w:tcW w:w="288" w:type="dxa"/>
+            <w:tcW w:w="523" w:type="dxa"/>
             <w:shd w:val="clear" w:color="auto" w:fill="D9E1F2"/>
           </w:tcPr>
           <w:p>
@@ -4928,7 +4928,7 @@
         </w:tc>
         <w:tc>
           <w:tcPr>
-            <w:tcW w:w="288" w:type="dxa"/>
+            <w:tcW w:w="523" w:type="dxa"/>
             <w:shd w:val="clear" w:color="auto" w:fill="70AD47"/>
           </w:tcPr>
           <w:p>
@@ -4949,7 +4949,7 @@
         </w:tc>
         <w:tc>
           <w:tcPr>
-            <w:tcW w:w="288" w:type="dxa"/>
+            <w:tcW w:w="523" w:type="dxa"/>
             <w:shd w:val="clear" w:color="auto" w:fill="70AD47"/>
           </w:tcPr>
           <w:p>
@@ -4970,7 +4970,7 @@
         </w:tc>
         <w:tc>
           <w:tcPr>
-            <w:tcW w:w="288" w:type="dxa"/>
+            <w:tcW w:w="523" w:type="dxa"/>
             <w:shd w:val="clear" w:color="auto" w:fill="D9E1F2"/>
           </w:tcPr>
           <w:p>
@@ -4990,7 +4990,7 @@
         </w:tc>
         <w:tc>
           <w:tcPr>
-            <w:tcW w:w="288" w:type="dxa"/>
+            <w:tcW w:w="523" w:type="dxa"/>
             <w:shd w:val="clear" w:color="auto" w:fill="D9E1F2"/>
           </w:tcPr>
           <w:p>
@@ -5010,7 +5010,7 @@
         </w:tc>
         <w:tc>
           <w:tcPr>
-            <w:tcW w:w="288" w:type="dxa"/>
+            <w:tcW w:w="523" w:type="dxa"/>
             <w:shd w:val="clear" w:color="auto" w:fill="D9E1F2"/>
           </w:tcPr>
           <w:p>
@@ -5030,7 +5030,7 @@
         </w:tc>
         <w:tc>
           <w:tcPr>
-            <w:tcW w:w="288" w:type="dxa"/>
+            <w:tcW w:w="523" w:type="dxa"/>
             <w:shd w:val="clear" w:color="auto" w:fill="D9E1F2"/>
           </w:tcPr>
           <w:p>
@@ -5052,7 +5052,7 @@
       <w:tr>
         <w:tc>
           <w:tcPr>
-            <w:tcW w:w="5386" w:type="dxa"/>
+            <w:tcW w:w="3033" w:type="dxa"/>
             <w:shd w:val="clear" w:color="auto" w:fill="FFFFFF"/>
           </w:tcPr>
           <w:p>
@@ -5073,7 +5073,7 @@
         </w:tc>
         <w:tc>
           <w:tcPr>
-            <w:tcW w:w="288" w:type="dxa"/>
+            <w:tcW w:w="523" w:type="dxa"/>
             <w:shd w:val="clear" w:color="auto" w:fill="FFFFFF"/>
           </w:tcPr>
           <w:p>
@@ -5093,7 +5093,7 @@
         </w:tc>
         <w:tc>
           <w:tcPr>
-            <w:tcW w:w="288" w:type="dxa"/>
+            <w:tcW w:w="523" w:type="dxa"/>
             <w:shd w:val="clear" w:color="auto" w:fill="FFFFFF"/>
           </w:tcPr>
           <w:p>
@@ -5113,7 +5113,7 @@
         </w:tc>
         <w:tc>
           <w:tcPr>
-            <w:tcW w:w="288" w:type="dxa"/>
+            <w:tcW w:w="523" w:type="dxa"/>
             <w:shd w:val="clear" w:color="auto" w:fill="FFFFFF"/>
           </w:tcPr>
           <w:p>
@@ -5133,7 +5133,7 @@
         </w:tc>
         <w:tc>
           <w:tcPr>
-            <w:tcW w:w="288" w:type="dxa"/>
+            <w:tcW w:w="523" w:type="dxa"/>
             <w:shd w:val="clear" w:color="auto" w:fill="FFFFFF"/>
           </w:tcPr>
           <w:p>
@@ -5153,7 +5153,7 @@
         </w:tc>
         <w:tc>
           <w:tcPr>
-            <w:tcW w:w="288" w:type="dxa"/>
+            <w:tcW w:w="523" w:type="dxa"/>
             <w:shd w:val="clear" w:color="auto" w:fill="FFFFFF"/>
           </w:tcPr>
           <w:p>
@@ -5173,7 +5173,7 @@
         </w:tc>
         <w:tc>
           <w:tcPr>
-            <w:tcW w:w="288" w:type="dxa"/>
+            <w:tcW w:w="523" w:type="dxa"/>
             <w:shd w:val="clear" w:color="auto" w:fill="70AD47"/>
           </w:tcPr>
           <w:p>
@@ -5194,7 +5194,7 @@
         </w:tc>
         <w:tc>
           <w:tcPr>
-            <w:tcW w:w="288" w:type="dxa"/>
+            <w:tcW w:w="523" w:type="dxa"/>
             <w:shd w:val="clear" w:color="auto" w:fill="70AD47"/>
           </w:tcPr>
           <w:p>
@@ -5215,7 +5215,7 @@
         </w:tc>
         <w:tc>
           <w:tcPr>
-            <w:tcW w:w="288" w:type="dxa"/>
+            <w:tcW w:w="523" w:type="dxa"/>
             <w:shd w:val="clear" w:color="auto" w:fill="70AD47"/>
           </w:tcPr>
           <w:p>
@@ -5236,7 +5236,7 @@
         </w:tc>
         <w:tc>
           <w:tcPr>
-            <w:tcW w:w="288" w:type="dxa"/>
+            <w:tcW w:w="523" w:type="dxa"/>
             <w:shd w:val="clear" w:color="auto" w:fill="FFFFFF"/>
           </w:tcPr>
           <w:p>
@@ -5256,7 +5256,7 @@
         </w:tc>
         <w:tc>
           <w:tcPr>
-            <w:tcW w:w="288" w:type="dxa"/>
+            <w:tcW w:w="523" w:type="dxa"/>
             <w:shd w:val="clear" w:color="auto" w:fill="FFFFFF"/>
           </w:tcPr>
           <w:p>
@@ -5278,7 +5278,7 @@
       <w:tr>
         <w:tc>
           <w:tcPr>
-            <w:tcW w:w="5386" w:type="dxa"/>
+            <w:tcW w:w="3033" w:type="dxa"/>
             <w:shd w:val="clear" w:color="auto" w:fill="D9E1F2"/>
           </w:tcPr>
           <w:p>
@@ -5299,7 +5299,7 @@
         </w:tc>
         <w:tc>
           <w:tcPr>
-            <w:tcW w:w="288" w:type="dxa"/>
+            <w:tcW w:w="523" w:type="dxa"/>
             <w:shd w:val="clear" w:color="auto" w:fill="D9E1F2"/>
           </w:tcPr>
           <w:p>
@@ -5319,7 +5319,7 @@
         </w:tc>
         <w:tc>
           <w:tcPr>
-            <w:tcW w:w="288" w:type="dxa"/>
+            <w:tcW w:w="523" w:type="dxa"/>
             <w:shd w:val="clear" w:color="auto" w:fill="D9E1F2"/>
           </w:tcPr>
           <w:p>
@@ -5339,7 +5339,7 @@
         </w:tc>
         <w:tc>
           <w:tcPr>
-            <w:tcW w:w="288" w:type="dxa"/>
+            <w:tcW w:w="523" w:type="dxa"/>
             <w:shd w:val="clear" w:color="auto" w:fill="D9E1F2"/>
           </w:tcPr>
           <w:p>
@@ -5359,7 +5359,7 @@
         </w:tc>
         <w:tc>
           <w:tcPr>
-            <w:tcW w:w="288" w:type="dxa"/>
+            <w:tcW w:w="523" w:type="dxa"/>
             <w:shd w:val="clear" w:color="auto" w:fill="D9E1F2"/>
           </w:tcPr>
           <w:p>
@@ -5379,7 +5379,7 @@
         </w:tc>
         <w:tc>
           <w:tcPr>
-            <w:tcW w:w="288" w:type="dxa"/>
+            <w:tcW w:w="523" w:type="dxa"/>
             <w:shd w:val="clear" w:color="auto" w:fill="D9E1F2"/>
           </w:tcPr>
           <w:p>
@@ -5399,7 +5399,7 @@
         </w:tc>
         <w:tc>
           <w:tcPr>
-            <w:tcW w:w="288" w:type="dxa"/>
+            <w:tcW w:w="523" w:type="dxa"/>
             <w:shd w:val="clear" w:color="auto" w:fill="D9E1F2"/>
           </w:tcPr>
           <w:p>
@@ -5419,7 +5419,7 @@
         </w:tc>
         <w:tc>
           <w:tcPr>
-            <w:tcW w:w="288" w:type="dxa"/>
+            <w:tcW w:w="523" w:type="dxa"/>
             <w:shd w:val="clear" w:color="auto" w:fill="70AD47"/>
           </w:tcPr>
           <w:p>
@@ -5440,7 +5440,7 @@
         </w:tc>
         <w:tc>
           <w:tcPr>
-            <w:tcW w:w="288" w:type="dxa"/>
+            <w:tcW w:w="523" w:type="dxa"/>
             <w:shd w:val="clear" w:color="auto" w:fill="70AD47"/>
           </w:tcPr>
           <w:p>
@@ -5461,7 +5461,7 @@
         </w:tc>
         <w:tc>
           <w:tcPr>
-            <w:tcW w:w="288" w:type="dxa"/>
+            <w:tcW w:w="523" w:type="dxa"/>
             <w:shd w:val="clear" w:color="auto" w:fill="70AD47"/>
           </w:tcPr>
           <w:p>
@@ -5482,7 +5482,7 @@
         </w:tc>
         <w:tc>
           <w:tcPr>
-            <w:tcW w:w="288" w:type="dxa"/>
+            <w:tcW w:w="523" w:type="dxa"/>
             <w:shd w:val="clear" w:color="auto" w:fill="D9E1F2"/>
           </w:tcPr>
           <w:p>
@@ -5504,7 +5504,7 @@
       <w:tr>
         <w:tc>
           <w:tcPr>
-            <w:tcW w:w="5386" w:type="dxa"/>
+            <w:tcW w:w="3033" w:type="dxa"/>
             <w:shd w:val="clear" w:color="auto" w:fill="FFFFFF"/>
           </w:tcPr>
           <w:p>
@@ -5525,7 +5525,7 @@
         </w:tc>
         <w:tc>
           <w:tcPr>
-            <w:tcW w:w="288" w:type="dxa"/>
+            <w:tcW w:w="523" w:type="dxa"/>
             <w:shd w:val="clear" w:color="auto" w:fill="FFFFFF"/>
           </w:tcPr>
           <w:p>
@@ -5545,7 +5545,7 @@
         </w:tc>
         <w:tc>
           <w:tcPr>
-            <w:tcW w:w="288" w:type="dxa"/>
+            <w:tcW w:w="523" w:type="dxa"/>
             <w:shd w:val="clear" w:color="auto" w:fill="FFFFFF"/>
           </w:tcPr>
           <w:p>
@@ -5565,7 +5565,7 @@
         </w:tc>
         <w:tc>
           <w:tcPr>
-            <w:tcW w:w="288" w:type="dxa"/>
+            <w:tcW w:w="523" w:type="dxa"/>
             <w:shd w:val="clear" w:color="auto" w:fill="FFFFFF"/>
           </w:tcPr>
           <w:p>
@@ -5585,7 +5585,7 @@
         </w:tc>
         <w:tc>
           <w:tcPr>
-            <w:tcW w:w="288" w:type="dxa"/>
+            <w:tcW w:w="523" w:type="dxa"/>
             <w:shd w:val="clear" w:color="auto" w:fill="FFFFFF"/>
           </w:tcPr>
           <w:p>
@@ -5605,7 +5605,7 @@
         </w:tc>
         <w:tc>
           <w:tcPr>
-            <w:tcW w:w="288" w:type="dxa"/>
+            <w:tcW w:w="523" w:type="dxa"/>
             <w:shd w:val="clear" w:color="auto" w:fill="FFFFFF"/>
           </w:tcPr>
           <w:p>
@@ -5625,7 +5625,7 @@
         </w:tc>
         <w:tc>
           <w:tcPr>
-            <w:tcW w:w="288" w:type="dxa"/>
+            <w:tcW w:w="523" w:type="dxa"/>
             <w:shd w:val="clear" w:color="auto" w:fill="FFFFFF"/>
           </w:tcPr>
           <w:p>
@@ -5645,7 +5645,7 @@
         </w:tc>
         <w:tc>
           <w:tcPr>
-            <w:tcW w:w="288" w:type="dxa"/>
+            <w:tcW w:w="523" w:type="dxa"/>
             <w:shd w:val="clear" w:color="auto" w:fill="FFFFFF"/>
           </w:tcPr>
           <w:p>
@@ -5665,7 +5665,7 @@
         </w:tc>
         <w:tc>
           <w:tcPr>
-            <w:tcW w:w="288" w:type="dxa"/>
+            <w:tcW w:w="523" w:type="dxa"/>
             <w:shd w:val="clear" w:color="auto" w:fill="FFFFFF"/>
           </w:tcPr>
           <w:p>
@@ -5685,7 +5685,7 @@
         </w:tc>
         <w:tc>
           <w:tcPr>
-            <w:tcW w:w="288" w:type="dxa"/>
+            <w:tcW w:w="523" w:type="dxa"/>
             <w:shd w:val="clear" w:color="auto" w:fill="70AD47"/>
           </w:tcPr>
           <w:p>
@@ -5706,7 +5706,7 @@
         </w:tc>
         <w:tc>
           <w:tcPr>
-            <w:tcW w:w="288" w:type="dxa"/>
+            <w:tcW w:w="523" w:type="dxa"/>
             <w:shd w:val="clear" w:color="auto" w:fill="70AD47"/>
           </w:tcPr>
           <w:p>
@@ -5729,7 +5729,7 @@
       <w:tr>
         <w:tc>
           <w:tcPr>
-            <w:tcW w:w="5386" w:type="dxa"/>
+            <w:tcW w:w="3033" w:type="dxa"/>
             <w:shd w:val="clear" w:color="auto" w:fill="D9E1F2"/>
           </w:tcPr>
           <w:p>
@@ -5750,7 +5750,7 @@
         </w:tc>
         <w:tc>
           <w:tcPr>
-            <w:tcW w:w="288" w:type="dxa"/>
+            <w:tcW w:w="523" w:type="dxa"/>
             <w:shd w:val="clear" w:color="auto" w:fill="D9E1F2"/>
           </w:tcPr>
           <w:p>
@@ -5770,7 +5770,7 @@
         </w:tc>
         <w:tc>
           <w:tcPr>
-            <w:tcW w:w="288" w:type="dxa"/>
+            <w:tcW w:w="523" w:type="dxa"/>
             <w:shd w:val="clear" w:color="auto" w:fill="D9E1F2"/>
           </w:tcPr>
           <w:p>
@@ -5790,7 +5790,7 @@
         </w:tc>
         <w:tc>
           <w:tcPr>
-            <w:tcW w:w="288" w:type="dxa"/>
+            <w:tcW w:w="523" w:type="dxa"/>
             <w:shd w:val="clear" w:color="auto" w:fill="D9E1F2"/>
           </w:tcPr>
           <w:p>
@@ -5810,7 +5810,7 @@
         </w:tc>
         <w:tc>
           <w:tcPr>
-            <w:tcW w:w="288" w:type="dxa"/>
+            <w:tcW w:w="523" w:type="dxa"/>
             <w:shd w:val="clear" w:color="auto" w:fill="D9E1F2"/>
           </w:tcPr>
           <w:p>
@@ -5830,7 +5830,7 @@
         </w:tc>
         <w:tc>
           <w:tcPr>
-            <w:tcW w:w="288" w:type="dxa"/>
+            <w:tcW w:w="523" w:type="dxa"/>
             <w:shd w:val="clear" w:color="auto" w:fill="D9E1F2"/>
           </w:tcPr>
           <w:p>
@@ -5850,7 +5850,7 @@
         </w:tc>
         <w:tc>
           <w:tcPr>
-            <w:tcW w:w="288" w:type="dxa"/>
+            <w:tcW w:w="523" w:type="dxa"/>
             <w:shd w:val="clear" w:color="auto" w:fill="D9E1F2"/>
           </w:tcPr>
           <w:p>
@@ -5870,7 +5870,7 @@
         </w:tc>
         <w:tc>
           <w:tcPr>
-            <w:tcW w:w="288" w:type="dxa"/>
+            <w:tcW w:w="523" w:type="dxa"/>
             <w:shd w:val="clear" w:color="auto" w:fill="D9E1F2"/>
           </w:tcPr>
           <w:p>
@@ -5890,7 +5890,7 @@
         </w:tc>
         <w:tc>
           <w:tcPr>
-            <w:tcW w:w="288" w:type="dxa"/>
+            <w:tcW w:w="523" w:type="dxa"/>
             <w:shd w:val="clear" w:color="auto" w:fill="D9E1F2"/>
           </w:tcPr>
           <w:p>
@@ -5910,7 +5910,7 @@
         </w:tc>
         <w:tc>
           <w:tcPr>
-            <w:tcW w:w="288" w:type="dxa"/>
+            <w:tcW w:w="523" w:type="dxa"/>
             <w:shd w:val="clear" w:color="auto" w:fill="D9E1F2"/>
           </w:tcPr>
           <w:p>
@@ -5930,7 +5930,7 @@
         </w:tc>
         <w:tc>
           <w:tcPr>
-            <w:tcW w:w="288" w:type="dxa"/>
+            <w:tcW w:w="523" w:type="dxa"/>
             <w:shd w:val="clear" w:color="auto" w:fill="70AD47"/>
           </w:tcPr>
           <w:p>

</xml_diff>

<commit_message>
Completar keidy y amaal con todos los campos de la plantilla (placeholders) y formato enriquecido BASES_TEORICAS
</commit_message>
<xml_diff>
--- a/amaal/reportes/Informe_Pasantia_IUTECP.docx
+++ b/amaal/reportes/Informe_Pasantia_IUTECP.docx
@@ -351,13 +351,140 @@
           <w:i w:val="0"/>
           <w:sz w:val="24"/>
         </w:rPr>
-        <w:t>A mis padres, por su apoyo incondicional en cada paso de mi formación académica y personal.</w:t>
+        <w:t>Aquí va la dedicatoria.</w:t>
       </w:r>
     </w:p>
     <w:p>
       <w:pPr>
         <w:sectPr>
           <w:footerReference w:type="default" r:id="rId15"/>
+          <w:type w:val="continuous"/>
+          <w:pgSz w:w="12240" w:h="15840"/>
+          <w:pgMar w:top="1701" w:right="1701" w:bottom="1701" w:left="2268" w:header="720" w:footer="720" w:gutter="0"/>
+          <w:cols w:space="720"/>
+          <w:titlePg/>
+          <w:docGrid w:linePitch="360"/>
+        </w:sectPr>
+      </w:pPr>
+    </w:p>
+    <w:p>
+      <w:bookmarkStart w:id="bm_agradecimientos" w:name="bm_agradecimientos"/>
+      <w:pPr>
+        <w:spacing w:after="480"/>
+        <w:jc w:val="center"/>
+      </w:pPr>
+      <w:r>
+        <w:rPr>
+          <w:rFonts w:ascii="Times New Roman" w:hAnsi="Times New Roman"/>
+          <w:b/>
+          <w:sz w:val="24"/>
+        </w:rPr>
+        <w:t>AGRADECIMIENTOS</w:t>
+      </w:r>
+      <w:bookmarkEnd w:id="bm_agradecimientos"/>
+    </w:p>
+    <w:p>
+      <w:pPr>
+        <w:sectPr>
+          <w:footerReference w:type="default" r:id="rId16"/>
+          <w:pgSz w:w="12240" w:h="15840"/>
+          <w:pgMar w:top="2835" w:right="1701" w:bottom="1701" w:left="2268" w:header="720" w:footer="720" w:gutter="0"/>
+          <w:cols w:space="720"/>
+          <w:titlePg/>
+          <w:docGrid w:linePitch="360"/>
+        </w:sectPr>
+      </w:pPr>
+    </w:p>
+    <w:p>
+      <w:pPr>
+        <w:spacing w:line="360" w:lineRule="auto" w:after="0" w:before="0"/>
+        <w:ind w:firstLine="709"/>
+        <w:jc w:val="both"/>
+      </w:pPr>
+      <w:r>
+        <w:rPr>
+          <w:rFonts w:ascii="Times New Roman" w:hAnsi="Times New Roman"/>
+          <w:i w:val="0"/>
+          <w:sz w:val="24"/>
+        </w:rPr>
+        <w:t>Aquí van los agradecimientos.</w:t>
+      </w:r>
+    </w:p>
+    <w:p>
+      <w:pPr>
+        <w:sectPr>
+          <w:footerReference w:type="default" r:id="rId17"/>
+          <w:type w:val="continuous"/>
+          <w:pgSz w:w="12240" w:h="15840"/>
+          <w:pgMar w:top="1701" w:right="1701" w:bottom="1701" w:left="2268" w:header="720" w:footer="720" w:gutter="0"/>
+          <w:cols w:space="720"/>
+          <w:titlePg/>
+          <w:docGrid w:linePitch="360"/>
+        </w:sectPr>
+      </w:pPr>
+    </w:p>
+    <w:p>
+      <w:bookmarkStart w:id="bm_resumen" w:name="bm_resumen"/>
+      <w:pPr>
+        <w:spacing w:after="480"/>
+        <w:jc w:val="center"/>
+      </w:pPr>
+      <w:r>
+        <w:rPr>
+          <w:rFonts w:ascii="Times New Roman" w:hAnsi="Times New Roman"/>
+          <w:b/>
+          <w:sz w:val="24"/>
+        </w:rPr>
+        <w:t>RESUMEN</w:t>
+      </w:r>
+      <w:bookmarkEnd w:id="bm_resumen"/>
+    </w:p>
+    <w:p>
+      <w:pPr>
+        <w:sectPr>
+          <w:footerReference w:type="default" r:id="rId18"/>
+          <w:pgSz w:w="12240" w:h="15840"/>
+          <w:pgMar w:top="2835" w:right="1701" w:bottom="1701" w:left="2268" w:header="720" w:footer="720" w:gutter="0"/>
+          <w:cols w:space="720"/>
+          <w:titlePg/>
+          <w:docGrid w:linePitch="360"/>
+        </w:sectPr>
+      </w:pPr>
+    </w:p>
+    <w:p>
+      <w:pPr>
+        <w:spacing w:line="360" w:lineRule="auto" w:after="0" w:before="0"/>
+        <w:ind w:firstLine="709"/>
+        <w:jc w:val="both"/>
+      </w:pPr>
+      <w:r>
+        <w:rPr>
+          <w:rFonts w:ascii="Times New Roman" w:hAnsi="Times New Roman"/>
+          <w:i w:val="0"/>
+          <w:sz w:val="24"/>
+        </w:rPr>
+        <w:t>Aquí va el resumen del informe. El presente informe describe la evaluación del control administrativo aplicado a la gestión de solicitudes de servicios de telecomunicaciones en la empresa Ingeniería de Telecomunicaciones, C.A. (IDETEL). La investigación se enmarca en la modalidad de proyecto factible apoyado en un diagnóstico de campo. [Completar con el resto del resumen: objetivo general, metodología, resultados y conclusiones principales.]</w:t>
+      </w:r>
+    </w:p>
+    <w:p/>
+    <w:p>
+      <w:pPr>
+        <w:ind w:firstLine="709"/>
+      </w:pPr>
+      <w:r>
+        <w:rPr>
+          <w:b/>
+        </w:rPr>
+        <w:t xml:space="preserve">Palabras claves: </w:t>
+      </w:r>
+      <w:r>
+        <w:t>control administrativo, solicitudes de servicios, telecomunicaciones, proyecto factible, pasantías.</w:t>
+      </w:r>
+    </w:p>
+    <w:p>
+      <w:pPr>
+        <w:sectPr>
+          <w:footerReference w:type="default" r:id="rId19"/>
           <w:type w:val="continuous"/>
           <w:pgSz w:w="12240" w:h="15840"/>
           <w:pgMar w:top="1701" w:right="1701" w:bottom="1701" w:left="2268" w:header="720" w:footer="720" w:gutter="0"/>
@@ -384,7 +511,7 @@
     <w:p>
       <w:pPr>
         <w:sectPr>
-          <w:footerReference w:type="default" r:id="rId16"/>
+          <w:footerReference w:type="default" r:id="rId20"/>
           <w:pgSz w:w="12240" w:h="15840"/>
           <w:pgMar w:top="2835" w:right="1701" w:bottom="1701" w:left="2268" w:header="720" w:footer="720" w:gutter="0"/>
           <w:cols w:space="720"/>
@@ -451,6 +578,66 @@
           <w:b w:val="0"/>
           <w:sz w:val="24"/>
         </w:rPr>
+        <w:t>AGRADECIMIENTOS</w:t>
+        <w:tab/>
+      </w:r>
+      <w:r>
+        <w:rPr>
+          <w:rFonts w:ascii="Times New Roman" w:hAnsi="Times New Roman"/>
+          <w:b w:val="0"/>
+          <w:sz w:val="24"/>
+        </w:rPr>
+        <w:fldChar w:fldCharType="begin"/>
+        <w:instrText xml:space="preserve"> PAGEREF bm_agradecimientos \h </w:instrText>
+        <w:fldChar w:fldCharType="separate"/>
+        <w:t>?</w:t>
+        <w:fldChar w:fldCharType="end"/>
+      </w:r>
+    </w:p>
+    <w:p>
+      <w:pPr>
+        <w:tabs>
+          <w:tab w:pos="8271" w:val="right" w:leader="dot"/>
+        </w:tabs>
+        <w:spacing w:line="360" w:lineRule="auto" w:before="0" w:after="80"/>
+        <w:ind w:left="0"/>
+      </w:pPr>
+      <w:r>
+        <w:rPr>
+          <w:rFonts w:ascii="Times New Roman" w:hAnsi="Times New Roman"/>
+          <w:b w:val="0"/>
+          <w:sz w:val="24"/>
+        </w:rPr>
+        <w:t>RESUMEN</w:t>
+        <w:tab/>
+      </w:r>
+      <w:r>
+        <w:rPr>
+          <w:rFonts w:ascii="Times New Roman" w:hAnsi="Times New Roman"/>
+          <w:b w:val="0"/>
+          <w:sz w:val="24"/>
+        </w:rPr>
+        <w:fldChar w:fldCharType="begin"/>
+        <w:instrText xml:space="preserve"> PAGEREF bm_resumen \h </w:instrText>
+        <w:fldChar w:fldCharType="separate"/>
+        <w:t>?</w:t>
+        <w:fldChar w:fldCharType="end"/>
+      </w:r>
+    </w:p>
+    <w:p>
+      <w:pPr>
+        <w:tabs>
+          <w:tab w:pos="8271" w:val="right" w:leader="dot"/>
+        </w:tabs>
+        <w:spacing w:line="360" w:lineRule="auto" w:before="0" w:after="80"/>
+        <w:ind w:left="0"/>
+      </w:pPr>
+      <w:r>
+        <w:rPr>
+          <w:rFonts w:ascii="Times New Roman" w:hAnsi="Times New Roman"/>
+          <w:b w:val="0"/>
+          <w:sz w:val="24"/>
+        </w:rPr>
         <w:t>LISTA DE CUADROS</w:t>
         <w:tab/>
       </w:r>
@@ -1321,7 +1508,7 @@
     <w:p>
       <w:pPr>
         <w:sectPr>
-          <w:footerReference w:type="default" r:id="rId17"/>
+          <w:footerReference w:type="default" r:id="rId21"/>
           <w:type w:val="continuous"/>
           <w:pgSz w:w="12240" w:h="15840"/>
           <w:pgMar w:top="1701" w:right="1701" w:bottom="1701" w:left="2268" w:header="720" w:footer="720" w:gutter="0"/>
@@ -1350,7 +1537,7 @@
     <w:p>
       <w:pPr>
         <w:sectPr>
-          <w:footerReference w:type="default" r:id="rId18"/>
+          <w:footerReference w:type="default" r:id="rId22"/>
           <w:pgSz w:w="12240" w:h="15840"/>
           <w:pgMar w:top="2835" w:right="1701" w:bottom="1701" w:left="2268" w:header="720" w:footer="720" w:gutter="0"/>
           <w:cols w:space="720"/>
@@ -1434,7 +1621,7 @@
         </w:rPr>
         <w:t>2</w:t>
         <w:tab/>
-        <w:t>Cronograma de actividades administrativas</w:t>
+        <w:t>Cronograma de actividades del proyecto</w:t>
         <w:tab/>
       </w:r>
       <w:r>
@@ -1453,7 +1640,7 @@
     <w:p>
       <w:pPr>
         <w:sectPr>
-          <w:footerReference w:type="default" r:id="rId19"/>
+          <w:footerReference w:type="default" r:id="rId23"/>
           <w:type w:val="continuous"/>
           <w:pgSz w:w="12240" w:h="15840"/>
           <w:pgMar w:top="1701" w:right="1701" w:bottom="1701" w:left="2268" w:header="720" w:footer="720" w:gutter="0"/>
@@ -1482,7 +1669,7 @@
     <w:p>
       <w:pPr>
         <w:sectPr>
-          <w:footerReference w:type="default" r:id="rId20"/>
+          <w:footerReference w:type="default" r:id="rId24"/>
           <w:pgSz w:w="12240" w:h="15840"/>
           <w:pgMar w:top="2835" w:right="1701" w:bottom="1701" w:left="2268" w:header="720" w:footer="720" w:gutter="0"/>
           <w:cols w:space="720"/>
@@ -1617,7 +1804,7 @@
     <w:p>
       <w:pPr>
         <w:sectPr>
-          <w:footerReference w:type="default" r:id="rId21"/>
+          <w:footerReference w:type="default" r:id="rId25"/>
           <w:type w:val="continuous"/>
           <w:pgSz w:w="12240" w:h="15840"/>
           <w:pgMar w:top="1701" w:right="1701" w:bottom="1701" w:left="2268" w:header="720" w:footer="720" w:gutter="0"/>
@@ -1646,7 +1833,7 @@
     <w:p>
       <w:pPr>
         <w:sectPr>
-          <w:footerReference w:type="default" r:id="rId22"/>
+          <w:footerReference w:type="default" r:id="rId26"/>
           <w:pgSz w:w="12240" w:h="15840"/>
           <w:pgMar w:top="2835" w:right="1701" w:bottom="1701" w:left="2268" w:header="720" w:footer="720" w:gutter="0"/>
           <w:cols w:space="720"/>
@@ -1698,7 +1885,7 @@
         </w:rPr>
         <w:t>A</w:t>
         <w:tab/>
-        <w:t>Definición de Términos Básicos</w:t>
+        <w:t>Aquí va la descripción del Anexo A</w:t>
         <w:tab/>
       </w:r>
       <w:r>
@@ -1730,7 +1917,7 @@
         </w:rPr>
         <w:t>B</w:t>
         <w:tab/>
-        <w:t>Planes de Trabajo</w:t>
+        <w:t>Aquí va la descripción del Anexo B</w:t>
         <w:tab/>
       </w:r>
       <w:r>
@@ -1762,7 +1949,7 @@
         </w:rPr>
         <w:t>C</w:t>
         <w:tab/>
-        <w:t>Memoria Fotográfica</w:t>
+        <w:t>Aquí va la descripción del Anexo C</w:t>
         <w:tab/>
       </w:r>
       <w:r>
@@ -1781,7 +1968,7 @@
     <w:p>
       <w:pPr>
         <w:sectPr>
-          <w:footerReference w:type="default" r:id="rId23"/>
+          <w:footerReference w:type="default" r:id="rId27"/>
           <w:type w:val="continuous"/>
           <w:pgSz w:w="12240" w:h="15840"/>
           <w:pgMar w:top="1701" w:right="1701" w:bottom="1701" w:left="2268" w:header="720" w:footer="720" w:gutter="0"/>
@@ -1810,7 +1997,7 @@
     <w:p>
       <w:pPr>
         <w:sectPr>
-          <w:footerReference w:type="default" r:id="rId24"/>
+          <w:footerReference w:type="default" r:id="rId28"/>
           <w:pgSz w:w="12240" w:h="15840"/>
           <w:pgMar w:top="2835" w:right="1701" w:bottom="1701" w:left="2268" w:header="720" w:footer="720" w:gutter="0"/>
           <w:cols w:space="720"/>
@@ -1831,12 +2018,13 @@
           <w:i w:val="0"/>
           <w:sz w:val="24"/>
         </w:rPr>
+        <w:t>Aquí va la introducción. La presente pasantía, desarrollada como requisito para optar al título de Técnico Superior Universitario en Administración, tiene como propósito evaluar el control administrativo aplicado a la gestión de solicitudes de servicios de telecomunicaciones en la empresa Ingeniería de Telecomunicaciones, C.A. [Completar con la estructura del informe: capítulos, enfoque metodológico y alcance.]</w:t>
       </w:r>
     </w:p>
     <w:p>
       <w:pPr>
         <w:sectPr>
-          <w:footerReference w:type="default" r:id="rId25"/>
+          <w:footerReference w:type="default" r:id="rId29"/>
           <w:type w:val="continuous"/>
           <w:pgSz w:w="12240" w:h="15840"/>
           <w:pgMar w:top="1701" w:right="1701" w:bottom="1701" w:left="2268" w:header="720" w:footer="720" w:gutter="0"/>
@@ -1879,7 +2067,7 @@
     <w:p>
       <w:pPr>
         <w:sectPr>
-          <w:footerReference w:type="default" r:id="rId26"/>
+          <w:footerReference w:type="default" r:id="rId30"/>
           <w:pgSz w:w="12240" w:h="15840"/>
           <w:pgMar w:top="2835" w:right="1701" w:bottom="1701" w:left="2268" w:header="720" w:footer="720" w:gutter="0"/>
           <w:cols w:space="720"/>
@@ -2618,7 +2806,7 @@
     <w:p>
       <w:pPr>
         <w:sectPr>
-          <w:footerReference w:type="default" r:id="rId27"/>
+          <w:footerReference w:type="default" r:id="rId31"/>
           <w:type w:val="continuous"/>
           <w:pgSz w:w="12240" w:h="15840"/>
           <w:pgMar w:top="1701" w:right="1701" w:bottom="1701" w:left="2268" w:header="720" w:footer="720" w:gutter="0"/>
@@ -2661,7 +2849,7 @@
     <w:p>
       <w:pPr>
         <w:sectPr>
-          <w:footerReference w:type="default" r:id="rId28"/>
+          <w:footerReference w:type="default" r:id="rId32"/>
           <w:pgSz w:w="12240" w:h="15840"/>
           <w:pgMar w:top="2835" w:right="1701" w:bottom="1701" w:left="2268" w:header="720" w:footer="720" w:gutter="0"/>
           <w:cols w:space="720"/>
@@ -2920,7 +3108,7 @@
           <w:i w:val="0"/>
           <w:sz w:val="24"/>
         </w:rPr>
-        <w:t>La planificación establece la relación entre cada objetivo y las actividades administrativas a ejecutar:</w:t>
+        <w:t>La planificación establece la relación entre cada objetivo específico y las actividades técnicas a ejecutar para el desarrollo de la evaluación del control administrativo:</w:t>
       </w:r>
     </w:p>
     <w:p>
@@ -3420,7 +3608,7 @@
           <w:i w:val="0"/>
           <w:sz w:val="24"/>
         </w:rPr>
-        <w:t>El cronograma estructura temporalmente las tareas administrativas garantizando el cumplimiento del manual documental propuesto:</w:t>
+        <w:t>El cronograma estructura temporalmente las fases de diagnóstico, análisis y propuesta de mejora, distribuidas a lo largo de las diez (10) semanas de duración de la pasantía:</w:t>
       </w:r>
     </w:p>
     <w:p>
@@ -3443,7 +3631,7 @@
           <w:i/>
           <w:sz w:val="24"/>
         </w:rPr>
-        <w:t>Cronograma de actividades administrativas.</w:t>
+        <w:t>Cronograma de actividades del proyecto.</w:t>
       </w:r>
       <w:bookmarkEnd w:id="bm_cuadro2"/>
     </w:p>
@@ -5955,7 +6143,7 @@
     <w:p>
       <w:pPr>
         <w:sectPr>
-          <w:footerReference w:type="default" r:id="rId29"/>
+          <w:footerReference w:type="default" r:id="rId33"/>
           <w:type w:val="continuous"/>
           <w:pgSz w:w="12240" w:h="15840"/>
           <w:pgMar w:top="1701" w:right="1701" w:bottom="1701" w:left="2268" w:header="720" w:footer="720" w:gutter="0"/>
@@ -5998,7 +6186,7 @@
     <w:p>
       <w:pPr>
         <w:sectPr>
-          <w:footerReference w:type="default" r:id="rId30"/>
+          <w:footerReference w:type="default" r:id="rId34"/>
           <w:pgSz w:w="12240" w:h="15840"/>
           <w:pgMar w:top="2835" w:right="1701" w:bottom="1701" w:left="2268" w:header="720" w:footer="720" w:gutter="0"/>
           <w:cols w:space="720"/>
@@ -6019,7 +6207,7 @@
           <w:b/>
           <w:sz w:val="24"/>
         </w:rPr>
-        <w:t>Bases Teóricas Referenciales</w:t>
+        <w:t>Aquí va el título de la primera base teórica</w:t>
       </w:r>
       <w:bookmarkEnd w:id="bm_cap3_bases"/>
     </w:p>
@@ -6035,7 +6223,7 @@
           <w:i w:val="0"/>
           <w:sz w:val="24"/>
         </w:rPr>
-        <w:t>Según Pérez (2020), la trazabilidad documental es fundamental para el control eficiente de los procesos administrativos en las organizaciones, permitiendo el rastreo histórico y auditable de cada expediente.</w:t>
+        <w:t>Aquí va el desarrollo teórico del primer tema. [Completar con la definición y autores que sustentan este concepto.]</w:t>
       </w:r>
     </w:p>
     <w:p>
@@ -6050,13 +6238,42 @@
           <w:i w:val="0"/>
           <w:sz w:val="24"/>
         </w:rPr>
-        <w:t>La gestión documental en las organizaciones modernas no solo implica el almacenamiento pasivo de archivos, sino la garantía activa de que cada movimiento y alteración quede registrada de forma inmutable para auditorías futuras.</w:t>
+        <w:t>Aquí va un segundo párrafo de desarrollo. [Completar con la aplicación del concepto al proyecto.]</w:t>
       </w:r>
     </w:p>
     <w:p>
       <w:pPr>
+        <w:spacing w:before="480" w:after="480" w:line="360" w:lineRule="auto"/>
+        <w:jc w:val="left"/>
+      </w:pPr>
+      <w:r>
+        <w:rPr>
+          <w:rFonts w:ascii="Times New Roman" w:hAnsi="Times New Roman"/>
+          <w:b/>
+          <w:sz w:val="24"/>
+        </w:rPr>
+        <w:t>Aquí va el título de la segunda base teórica</w:t>
+      </w:r>
+    </w:p>
+    <w:p>
+      <w:pPr>
+        <w:spacing w:line="360" w:lineRule="auto" w:after="0" w:before="0"/>
+        <w:ind w:firstLine="709"/>
+        <w:jc w:val="both"/>
+      </w:pPr>
+      <w:r>
+        <w:rPr>
+          <w:rFonts w:ascii="Times New Roman" w:hAnsi="Times New Roman"/>
+          <w:i w:val="0"/>
+          <w:sz w:val="24"/>
+        </w:rPr>
+        <w:t>Aquí va el desarrollo teórico del segundo tema. [Completar con la definición y autores que sustentan este concepto.]</w:t>
+      </w:r>
+    </w:p>
+    <w:p>
+      <w:pPr>
         <w:sectPr>
-          <w:footerReference w:type="default" r:id="rId31"/>
+          <w:footerReference w:type="default" r:id="rId35"/>
           <w:type w:val="continuous"/>
           <w:pgSz w:w="12240" w:h="15840"/>
           <w:pgMar w:top="1701" w:right="1701" w:bottom="1701" w:left="2268" w:header="720" w:footer="720" w:gutter="0"/>
@@ -6099,7 +6316,7 @@
     <w:p>
       <w:pPr>
         <w:sectPr>
-          <w:footerReference w:type="default" r:id="rId32"/>
+          <w:footerReference w:type="default" r:id="rId36"/>
           <w:pgSz w:w="12240" w:h="15840"/>
           <w:pgMar w:top="2835" w:right="1701" w:bottom="1701" w:left="2268" w:header="720" w:footer="720" w:gutter="0"/>
           <w:cols w:space="720"/>
@@ -6136,8 +6353,799 @@
           <w:i w:val="0"/>
           <w:sz w:val="24"/>
         </w:rPr>
-        <w:t>Durante las diez semanas de pasantías, se llevaron a cabo actividades de evaluación y análisis en el Departamento de Administración de Ingeniería de Telecomunicaciones, C.A.:</w:t>
+        <w:t>Durante las diez (10) semanas de pasantías, se llevaron a cabo actividades de evaluación y análisis en el Departamento de Administración de Ingeniería de Telecomunicaciones, C.A.:</w:t>
       </w:r>
+    </w:p>
+    <w:p>
+      <w:pPr>
+        <w:spacing w:before="480" w:after="480" w:line="360" w:lineRule="auto"/>
+        <w:jc w:val="left"/>
+      </w:pPr>
+      <w:r>
+        <w:rPr>
+          <w:rFonts w:ascii="Times New Roman" w:hAnsi="Times New Roman"/>
+          <w:b/>
+          <w:sz w:val="24"/>
+        </w:rPr>
+        <w:t>Semana 1</w:t>
+      </w:r>
+    </w:p>
+    <w:p>
+      <w:pPr>
+        <w:spacing w:line="360" w:lineRule="auto"/>
+        <w:ind w:firstLine="709"/>
+        <w:jc w:val="both"/>
+      </w:pPr>
+      <w:r>
+        <w:rPr>
+          <w:rFonts w:ascii="Times New Roman" w:hAnsi="Times New Roman"/>
+          <w:sz w:val="24"/>
+        </w:rPr>
+        <w:t xml:space="preserve">1. </w:t>
+      </w:r>
+      <w:r>
+        <w:rPr>
+          <w:rFonts w:ascii="Times New Roman" w:hAnsi="Times New Roman"/>
+          <w:b/>
+          <w:sz w:val="24"/>
+        </w:rPr>
+        <w:t xml:space="preserve">Actividad operativa: </w:t>
+      </w:r>
+      <w:r>
+        <w:rPr>
+          <w:rFonts w:ascii="Times New Roman" w:hAnsi="Times New Roman"/>
+          <w:sz w:val="24"/>
+        </w:rPr>
+        <w:t>Aquí va la actividad operativa de la semana 1. [Completar con la tarea realizada en la empresa.]</w:t>
+      </w:r>
+    </w:p>
+    <w:p>
+      <w:pPr>
+        <w:spacing w:line="360" w:lineRule="auto"/>
+        <w:ind w:firstLine="709"/>
+        <w:jc w:val="both"/>
+      </w:pPr>
+      <w:r>
+        <w:rPr>
+          <w:rFonts w:ascii="Times New Roman" w:hAnsi="Times New Roman"/>
+          <w:sz w:val="24"/>
+        </w:rPr>
+        <w:t xml:space="preserve">2. </w:t>
+      </w:r>
+      <w:r>
+        <w:rPr>
+          <w:rFonts w:ascii="Times New Roman" w:hAnsi="Times New Roman"/>
+          <w:b/>
+          <w:sz w:val="24"/>
+        </w:rPr>
+        <w:t xml:space="preserve">Actividad de investigación: </w:t>
+      </w:r>
+      <w:r>
+        <w:rPr>
+          <w:rFonts w:ascii="Times New Roman" w:hAnsi="Times New Roman"/>
+          <w:sz w:val="24"/>
+        </w:rPr>
+        <w:t>Aquí va la actividad de investigación de la semana 1. [Completar con la tarea académica realizada.]</w:t>
+      </w:r>
+    </w:p>
+    <w:p>
+      <w:pPr>
+        <w:spacing w:before="480" w:after="480" w:line="360" w:lineRule="auto"/>
+        <w:jc w:val="left"/>
+      </w:pPr>
+      <w:r>
+        <w:rPr>
+          <w:rFonts w:ascii="Times New Roman" w:hAnsi="Times New Roman"/>
+          <w:b/>
+          <w:sz w:val="24"/>
+        </w:rPr>
+        <w:t>Semana 2</w:t>
+      </w:r>
+    </w:p>
+    <w:p>
+      <w:pPr>
+        <w:spacing w:line="360" w:lineRule="auto"/>
+        <w:ind w:firstLine="709"/>
+        <w:jc w:val="both"/>
+      </w:pPr>
+      <w:r>
+        <w:rPr>
+          <w:rFonts w:ascii="Times New Roman" w:hAnsi="Times New Roman"/>
+          <w:sz w:val="24"/>
+        </w:rPr>
+        <w:t xml:space="preserve">1. </w:t>
+      </w:r>
+      <w:r>
+        <w:rPr>
+          <w:rFonts w:ascii="Times New Roman" w:hAnsi="Times New Roman"/>
+          <w:b/>
+          <w:sz w:val="24"/>
+        </w:rPr>
+        <w:t xml:space="preserve">Actividad operativa: </w:t>
+      </w:r>
+      <w:r>
+        <w:rPr>
+          <w:rFonts w:ascii="Times New Roman" w:hAnsi="Times New Roman"/>
+          <w:sz w:val="24"/>
+        </w:rPr>
+        <w:t>Aquí va la actividad operativa de la semana 2. [Completar con la tarea realizada en la empresa.]</w:t>
+      </w:r>
+    </w:p>
+    <w:p>
+      <w:pPr>
+        <w:spacing w:line="360" w:lineRule="auto"/>
+        <w:ind w:firstLine="709"/>
+        <w:jc w:val="both"/>
+      </w:pPr>
+      <w:r>
+        <w:rPr>
+          <w:rFonts w:ascii="Times New Roman" w:hAnsi="Times New Roman"/>
+          <w:sz w:val="24"/>
+        </w:rPr>
+        <w:t xml:space="preserve">2. </w:t>
+      </w:r>
+      <w:r>
+        <w:rPr>
+          <w:rFonts w:ascii="Times New Roman" w:hAnsi="Times New Roman"/>
+          <w:b/>
+          <w:sz w:val="24"/>
+        </w:rPr>
+        <w:t xml:space="preserve">Actividad de investigación: </w:t>
+      </w:r>
+      <w:r>
+        <w:rPr>
+          <w:rFonts w:ascii="Times New Roman" w:hAnsi="Times New Roman"/>
+          <w:sz w:val="24"/>
+        </w:rPr>
+        <w:t>Aquí va la actividad de investigación de la semana 2. [Completar con la tarea académica realizada.]</w:t>
+      </w:r>
+    </w:p>
+    <w:p>
+      <w:pPr>
+        <w:spacing w:before="480" w:after="480" w:line="360" w:lineRule="auto"/>
+        <w:jc w:val="left"/>
+      </w:pPr>
+      <w:r>
+        <w:rPr>
+          <w:rFonts w:ascii="Times New Roman" w:hAnsi="Times New Roman"/>
+          <w:b/>
+          <w:sz w:val="24"/>
+        </w:rPr>
+        <w:t>Semana 3</w:t>
+      </w:r>
+    </w:p>
+    <w:p>
+      <w:pPr>
+        <w:spacing w:line="360" w:lineRule="auto"/>
+        <w:ind w:firstLine="709"/>
+        <w:jc w:val="both"/>
+      </w:pPr>
+      <w:r>
+        <w:rPr>
+          <w:rFonts w:ascii="Times New Roman" w:hAnsi="Times New Roman"/>
+          <w:sz w:val="24"/>
+        </w:rPr>
+        <w:t xml:space="preserve">1. </w:t>
+      </w:r>
+      <w:r>
+        <w:rPr>
+          <w:rFonts w:ascii="Times New Roman" w:hAnsi="Times New Roman"/>
+          <w:b/>
+          <w:sz w:val="24"/>
+        </w:rPr>
+        <w:t xml:space="preserve">Actividad operativa: </w:t>
+      </w:r>
+      <w:r>
+        <w:rPr>
+          <w:rFonts w:ascii="Times New Roman" w:hAnsi="Times New Roman"/>
+          <w:sz w:val="24"/>
+        </w:rPr>
+        <w:t>Aquí va la actividad operativa de la semana 3. [Completar con la tarea realizada en la empresa.]</w:t>
+      </w:r>
+    </w:p>
+    <w:p>
+      <w:pPr>
+        <w:spacing w:line="360" w:lineRule="auto"/>
+        <w:ind w:firstLine="709"/>
+        <w:jc w:val="both"/>
+      </w:pPr>
+      <w:r>
+        <w:rPr>
+          <w:rFonts w:ascii="Times New Roman" w:hAnsi="Times New Roman"/>
+          <w:sz w:val="24"/>
+        </w:rPr>
+        <w:t xml:space="preserve">2. </w:t>
+      </w:r>
+      <w:r>
+        <w:rPr>
+          <w:rFonts w:ascii="Times New Roman" w:hAnsi="Times New Roman"/>
+          <w:b/>
+          <w:sz w:val="24"/>
+        </w:rPr>
+        <w:t xml:space="preserve">Actividad de investigación: </w:t>
+      </w:r>
+      <w:r>
+        <w:rPr>
+          <w:rFonts w:ascii="Times New Roman" w:hAnsi="Times New Roman"/>
+          <w:sz w:val="24"/>
+        </w:rPr>
+        <w:t>Aquí va la actividad de investigación de la semana 3. [Completar con la tarea académica realizada.]</w:t>
+      </w:r>
+    </w:p>
+    <w:p>
+      <w:pPr>
+        <w:spacing w:before="480" w:after="480" w:line="360" w:lineRule="auto"/>
+        <w:jc w:val="left"/>
+      </w:pPr>
+      <w:r>
+        <w:rPr>
+          <w:rFonts w:ascii="Times New Roman" w:hAnsi="Times New Roman"/>
+          <w:b/>
+          <w:sz w:val="24"/>
+        </w:rPr>
+        <w:t>Semana 4</w:t>
+      </w:r>
+    </w:p>
+    <w:p>
+      <w:pPr>
+        <w:spacing w:line="360" w:lineRule="auto"/>
+        <w:ind w:firstLine="709"/>
+        <w:jc w:val="both"/>
+      </w:pPr>
+      <w:r>
+        <w:rPr>
+          <w:rFonts w:ascii="Times New Roman" w:hAnsi="Times New Roman"/>
+          <w:sz w:val="24"/>
+        </w:rPr>
+        <w:t xml:space="preserve">1. </w:t>
+      </w:r>
+      <w:r>
+        <w:rPr>
+          <w:rFonts w:ascii="Times New Roman" w:hAnsi="Times New Roman"/>
+          <w:b/>
+          <w:sz w:val="24"/>
+        </w:rPr>
+        <w:t xml:space="preserve">Actividad operativa: </w:t>
+      </w:r>
+      <w:r>
+        <w:rPr>
+          <w:rFonts w:ascii="Times New Roman" w:hAnsi="Times New Roman"/>
+          <w:sz w:val="24"/>
+        </w:rPr>
+        <w:t>Aquí va la actividad operativa de la semana 4. [Completar con la tarea realizada en la empresa.]</w:t>
+      </w:r>
+    </w:p>
+    <w:p>
+      <w:pPr>
+        <w:spacing w:line="360" w:lineRule="auto"/>
+        <w:ind w:firstLine="709"/>
+        <w:jc w:val="both"/>
+      </w:pPr>
+      <w:r>
+        <w:rPr>
+          <w:rFonts w:ascii="Times New Roman" w:hAnsi="Times New Roman"/>
+          <w:sz w:val="24"/>
+        </w:rPr>
+        <w:t xml:space="preserve">2. </w:t>
+      </w:r>
+      <w:r>
+        <w:rPr>
+          <w:rFonts w:ascii="Times New Roman" w:hAnsi="Times New Roman"/>
+          <w:b/>
+          <w:sz w:val="24"/>
+        </w:rPr>
+        <w:t xml:space="preserve">Actividad de investigación: </w:t>
+      </w:r>
+      <w:r>
+        <w:rPr>
+          <w:rFonts w:ascii="Times New Roman" w:hAnsi="Times New Roman"/>
+          <w:sz w:val="24"/>
+        </w:rPr>
+        <w:t>Aquí va la actividad de investigación de la semana 4. [Completar con la tarea académica realizada.]</w:t>
+      </w:r>
+    </w:p>
+    <w:p>
+      <w:pPr>
+        <w:spacing w:before="480" w:after="480" w:line="360" w:lineRule="auto"/>
+        <w:jc w:val="left"/>
+      </w:pPr>
+      <w:r>
+        <w:rPr>
+          <w:rFonts w:ascii="Times New Roman" w:hAnsi="Times New Roman"/>
+          <w:b/>
+          <w:sz w:val="24"/>
+        </w:rPr>
+        <w:t>Semana 5</w:t>
+      </w:r>
+    </w:p>
+    <w:p>
+      <w:pPr>
+        <w:spacing w:line="360" w:lineRule="auto"/>
+        <w:ind w:firstLine="709"/>
+        <w:jc w:val="both"/>
+      </w:pPr>
+      <w:r>
+        <w:rPr>
+          <w:rFonts w:ascii="Times New Roman" w:hAnsi="Times New Roman"/>
+          <w:sz w:val="24"/>
+        </w:rPr>
+        <w:t xml:space="preserve">1. </w:t>
+      </w:r>
+      <w:r>
+        <w:rPr>
+          <w:rFonts w:ascii="Times New Roman" w:hAnsi="Times New Roman"/>
+          <w:b/>
+          <w:sz w:val="24"/>
+        </w:rPr>
+        <w:t xml:space="preserve">Actividad operativa: </w:t>
+      </w:r>
+      <w:r>
+        <w:rPr>
+          <w:rFonts w:ascii="Times New Roman" w:hAnsi="Times New Roman"/>
+          <w:sz w:val="24"/>
+        </w:rPr>
+        <w:t>Aquí va la actividad operativa de la semana 5. [Completar con la tarea realizada en la empresa.]</w:t>
+      </w:r>
+    </w:p>
+    <w:p>
+      <w:pPr>
+        <w:spacing w:line="360" w:lineRule="auto"/>
+        <w:ind w:firstLine="709"/>
+        <w:jc w:val="both"/>
+      </w:pPr>
+      <w:r>
+        <w:rPr>
+          <w:rFonts w:ascii="Times New Roman" w:hAnsi="Times New Roman"/>
+          <w:sz w:val="24"/>
+        </w:rPr>
+        <w:t xml:space="preserve">2. </w:t>
+      </w:r>
+      <w:r>
+        <w:rPr>
+          <w:rFonts w:ascii="Times New Roman" w:hAnsi="Times New Roman"/>
+          <w:b/>
+          <w:sz w:val="24"/>
+        </w:rPr>
+        <w:t xml:space="preserve">Actividad de investigación: </w:t>
+      </w:r>
+      <w:r>
+        <w:rPr>
+          <w:rFonts w:ascii="Times New Roman" w:hAnsi="Times New Roman"/>
+          <w:sz w:val="24"/>
+        </w:rPr>
+        <w:t>Aquí va la actividad de investigación de la semana 5. [Completar con la tarea académica realizada.]</w:t>
+      </w:r>
+    </w:p>
+    <w:p>
+      <w:pPr>
+        <w:spacing w:before="480" w:after="480" w:line="360" w:lineRule="auto"/>
+        <w:jc w:val="left"/>
+      </w:pPr>
+      <w:r>
+        <w:rPr>
+          <w:rFonts w:ascii="Times New Roman" w:hAnsi="Times New Roman"/>
+          <w:b/>
+          <w:sz w:val="24"/>
+        </w:rPr>
+        <w:t>Semana 6</w:t>
+      </w:r>
+    </w:p>
+    <w:p>
+      <w:pPr>
+        <w:spacing w:line="360" w:lineRule="auto"/>
+        <w:ind w:firstLine="709"/>
+        <w:jc w:val="both"/>
+      </w:pPr>
+      <w:r>
+        <w:rPr>
+          <w:rFonts w:ascii="Times New Roman" w:hAnsi="Times New Roman"/>
+          <w:sz w:val="24"/>
+        </w:rPr>
+        <w:t xml:space="preserve">1. </w:t>
+      </w:r>
+      <w:r>
+        <w:rPr>
+          <w:rFonts w:ascii="Times New Roman" w:hAnsi="Times New Roman"/>
+          <w:b/>
+          <w:sz w:val="24"/>
+        </w:rPr>
+        <w:t xml:space="preserve">Actividad operativa: </w:t>
+      </w:r>
+      <w:r>
+        <w:rPr>
+          <w:rFonts w:ascii="Times New Roman" w:hAnsi="Times New Roman"/>
+          <w:sz w:val="24"/>
+        </w:rPr>
+        <w:t>Aquí va la actividad operativa de la semana 6. [Completar con la tarea realizada en la empresa.]</w:t>
+      </w:r>
+    </w:p>
+    <w:p>
+      <w:pPr>
+        <w:spacing w:line="360" w:lineRule="auto"/>
+        <w:ind w:firstLine="709"/>
+        <w:jc w:val="both"/>
+      </w:pPr>
+      <w:r>
+        <w:rPr>
+          <w:rFonts w:ascii="Times New Roman" w:hAnsi="Times New Roman"/>
+          <w:sz w:val="24"/>
+        </w:rPr>
+        <w:t xml:space="preserve">2. </w:t>
+      </w:r>
+      <w:r>
+        <w:rPr>
+          <w:rFonts w:ascii="Times New Roman" w:hAnsi="Times New Roman"/>
+          <w:b/>
+          <w:sz w:val="24"/>
+        </w:rPr>
+        <w:t xml:space="preserve">Actividad de investigación: </w:t>
+      </w:r>
+      <w:r>
+        <w:rPr>
+          <w:rFonts w:ascii="Times New Roman" w:hAnsi="Times New Roman"/>
+          <w:sz w:val="24"/>
+        </w:rPr>
+        <w:t>Aquí va la actividad de investigación de la semana 6. [Completar con la tarea académica realizada.]</w:t>
+      </w:r>
+    </w:p>
+    <w:p>
+      <w:pPr>
+        <w:spacing w:before="480" w:after="480" w:line="360" w:lineRule="auto"/>
+        <w:jc w:val="left"/>
+      </w:pPr>
+      <w:r>
+        <w:rPr>
+          <w:rFonts w:ascii="Times New Roman" w:hAnsi="Times New Roman"/>
+          <w:b/>
+          <w:sz w:val="24"/>
+        </w:rPr>
+        <w:t>Semana 7</w:t>
+      </w:r>
+    </w:p>
+    <w:p>
+      <w:pPr>
+        <w:spacing w:line="360" w:lineRule="auto"/>
+        <w:ind w:firstLine="709"/>
+        <w:jc w:val="both"/>
+      </w:pPr>
+      <w:r>
+        <w:rPr>
+          <w:rFonts w:ascii="Times New Roman" w:hAnsi="Times New Roman"/>
+          <w:sz w:val="24"/>
+        </w:rPr>
+        <w:t xml:space="preserve">1. </w:t>
+      </w:r>
+      <w:r>
+        <w:rPr>
+          <w:rFonts w:ascii="Times New Roman" w:hAnsi="Times New Roman"/>
+          <w:b/>
+          <w:sz w:val="24"/>
+        </w:rPr>
+        <w:t xml:space="preserve">Actividad operativa: </w:t>
+      </w:r>
+      <w:r>
+        <w:rPr>
+          <w:rFonts w:ascii="Times New Roman" w:hAnsi="Times New Roman"/>
+          <w:sz w:val="24"/>
+        </w:rPr>
+        <w:t>Aquí va la actividad operativa de la semana 7. [Completar con la tarea realizada en la empresa.]</w:t>
+      </w:r>
+    </w:p>
+    <w:p>
+      <w:pPr>
+        <w:spacing w:line="360" w:lineRule="auto"/>
+        <w:ind w:firstLine="709"/>
+        <w:jc w:val="both"/>
+      </w:pPr>
+      <w:r>
+        <w:rPr>
+          <w:rFonts w:ascii="Times New Roman" w:hAnsi="Times New Roman"/>
+          <w:sz w:val="24"/>
+        </w:rPr>
+        <w:t xml:space="preserve">2. </w:t>
+      </w:r>
+      <w:r>
+        <w:rPr>
+          <w:rFonts w:ascii="Times New Roman" w:hAnsi="Times New Roman"/>
+          <w:b/>
+          <w:sz w:val="24"/>
+        </w:rPr>
+        <w:t xml:space="preserve">Actividad de investigación: </w:t>
+      </w:r>
+      <w:r>
+        <w:rPr>
+          <w:rFonts w:ascii="Times New Roman" w:hAnsi="Times New Roman"/>
+          <w:sz w:val="24"/>
+        </w:rPr>
+        <w:t>Aquí va la actividad de investigación de la semana 7. [Completar con la tarea académica realizada.]</w:t>
+      </w:r>
+    </w:p>
+    <w:p>
+      <w:pPr>
+        <w:spacing w:before="480" w:after="480" w:line="360" w:lineRule="auto"/>
+        <w:jc w:val="left"/>
+      </w:pPr>
+      <w:r>
+        <w:rPr>
+          <w:rFonts w:ascii="Times New Roman" w:hAnsi="Times New Roman"/>
+          <w:b/>
+          <w:sz w:val="24"/>
+        </w:rPr>
+        <w:t>Semana 8</w:t>
+      </w:r>
+    </w:p>
+    <w:p>
+      <w:pPr>
+        <w:spacing w:line="360" w:lineRule="auto"/>
+        <w:ind w:firstLine="709"/>
+        <w:jc w:val="both"/>
+      </w:pPr>
+      <w:r>
+        <w:rPr>
+          <w:rFonts w:ascii="Times New Roman" w:hAnsi="Times New Roman"/>
+          <w:sz w:val="24"/>
+        </w:rPr>
+        <w:t xml:space="preserve">1. </w:t>
+      </w:r>
+      <w:r>
+        <w:rPr>
+          <w:rFonts w:ascii="Times New Roman" w:hAnsi="Times New Roman"/>
+          <w:b/>
+          <w:sz w:val="24"/>
+        </w:rPr>
+        <w:t xml:space="preserve">Actividad operativa: </w:t>
+      </w:r>
+      <w:r>
+        <w:rPr>
+          <w:rFonts w:ascii="Times New Roman" w:hAnsi="Times New Roman"/>
+          <w:sz w:val="24"/>
+        </w:rPr>
+        <w:t>Aquí va la actividad operativa de la semana 8. [Completar con la tarea realizada en la empresa.]</w:t>
+      </w:r>
+    </w:p>
+    <w:p>
+      <w:pPr>
+        <w:spacing w:line="360" w:lineRule="auto"/>
+        <w:ind w:firstLine="709"/>
+        <w:jc w:val="both"/>
+      </w:pPr>
+      <w:r>
+        <w:rPr>
+          <w:rFonts w:ascii="Times New Roman" w:hAnsi="Times New Roman"/>
+          <w:sz w:val="24"/>
+        </w:rPr>
+        <w:t xml:space="preserve">2. </w:t>
+      </w:r>
+      <w:r>
+        <w:rPr>
+          <w:rFonts w:ascii="Times New Roman" w:hAnsi="Times New Roman"/>
+          <w:b/>
+          <w:sz w:val="24"/>
+        </w:rPr>
+        <w:t xml:space="preserve">Actividad de investigación: </w:t>
+      </w:r>
+      <w:r>
+        <w:rPr>
+          <w:rFonts w:ascii="Times New Roman" w:hAnsi="Times New Roman"/>
+          <w:sz w:val="24"/>
+        </w:rPr>
+        <w:t>Aquí va la actividad de investigación de la semana 8. [Completar con la tarea académica realizada.]</w:t>
+      </w:r>
+    </w:p>
+    <w:p>
+      <w:pPr>
+        <w:spacing w:before="480" w:after="480" w:line="360" w:lineRule="auto"/>
+        <w:jc w:val="left"/>
+      </w:pPr>
+      <w:r>
+        <w:rPr>
+          <w:rFonts w:ascii="Times New Roman" w:hAnsi="Times New Roman"/>
+          <w:b/>
+          <w:sz w:val="24"/>
+        </w:rPr>
+        <w:t>Semana 9</w:t>
+      </w:r>
+    </w:p>
+    <w:p>
+      <w:pPr>
+        <w:spacing w:line="360" w:lineRule="auto"/>
+        <w:ind w:firstLine="709"/>
+        <w:jc w:val="both"/>
+      </w:pPr>
+      <w:r>
+        <w:rPr>
+          <w:rFonts w:ascii="Times New Roman" w:hAnsi="Times New Roman"/>
+          <w:sz w:val="24"/>
+        </w:rPr>
+        <w:t xml:space="preserve">1. </w:t>
+      </w:r>
+      <w:r>
+        <w:rPr>
+          <w:rFonts w:ascii="Times New Roman" w:hAnsi="Times New Roman"/>
+          <w:b/>
+          <w:sz w:val="24"/>
+        </w:rPr>
+        <w:t xml:space="preserve">Actividad operativa: </w:t>
+      </w:r>
+      <w:r>
+        <w:rPr>
+          <w:rFonts w:ascii="Times New Roman" w:hAnsi="Times New Roman"/>
+          <w:sz w:val="24"/>
+        </w:rPr>
+        <w:t>Aquí va la actividad operativa de la semana 9. [Completar con la tarea realizada en la empresa.]</w:t>
+      </w:r>
+    </w:p>
+    <w:p>
+      <w:pPr>
+        <w:spacing w:line="360" w:lineRule="auto"/>
+        <w:ind w:firstLine="709"/>
+        <w:jc w:val="both"/>
+      </w:pPr>
+      <w:r>
+        <w:rPr>
+          <w:rFonts w:ascii="Times New Roman" w:hAnsi="Times New Roman"/>
+          <w:sz w:val="24"/>
+        </w:rPr>
+        <w:t xml:space="preserve">2. </w:t>
+      </w:r>
+      <w:r>
+        <w:rPr>
+          <w:rFonts w:ascii="Times New Roman" w:hAnsi="Times New Roman"/>
+          <w:b/>
+          <w:sz w:val="24"/>
+        </w:rPr>
+        <w:t xml:space="preserve">Actividad de investigación: </w:t>
+      </w:r>
+      <w:r>
+        <w:rPr>
+          <w:rFonts w:ascii="Times New Roman" w:hAnsi="Times New Roman"/>
+          <w:sz w:val="24"/>
+        </w:rPr>
+        <w:t>Aquí va la actividad de investigación de la semana 9. [Completar con la tarea académica realizada.]</w:t>
+      </w:r>
+    </w:p>
+    <w:p>
+      <w:pPr>
+        <w:spacing w:before="480" w:after="480" w:line="360" w:lineRule="auto"/>
+        <w:jc w:val="left"/>
+      </w:pPr>
+      <w:r>
+        <w:rPr>
+          <w:rFonts w:ascii="Times New Roman" w:hAnsi="Times New Roman"/>
+          <w:b/>
+          <w:sz w:val="24"/>
+        </w:rPr>
+        <w:t>Semana 10</w:t>
+      </w:r>
+    </w:p>
+    <w:p>
+      <w:pPr>
+        <w:spacing w:line="360" w:lineRule="auto"/>
+        <w:ind w:firstLine="709"/>
+        <w:jc w:val="both"/>
+      </w:pPr>
+      <w:r>
+        <w:rPr>
+          <w:rFonts w:ascii="Times New Roman" w:hAnsi="Times New Roman"/>
+          <w:sz w:val="24"/>
+        </w:rPr>
+        <w:t xml:space="preserve">1. </w:t>
+      </w:r>
+      <w:r>
+        <w:rPr>
+          <w:rFonts w:ascii="Times New Roman" w:hAnsi="Times New Roman"/>
+          <w:b/>
+          <w:sz w:val="24"/>
+        </w:rPr>
+        <w:t xml:space="preserve">Actividad operativa: </w:t>
+      </w:r>
+      <w:r>
+        <w:rPr>
+          <w:rFonts w:ascii="Times New Roman" w:hAnsi="Times New Roman"/>
+          <w:sz w:val="24"/>
+        </w:rPr>
+        <w:t>Aquí va la actividad operativa de la semana 10. [Completar con la tarea realizada en la empresa.]</w:t>
+      </w:r>
+    </w:p>
+    <w:p>
+      <w:pPr>
+        <w:spacing w:line="360" w:lineRule="auto"/>
+        <w:ind w:firstLine="709"/>
+        <w:jc w:val="both"/>
+      </w:pPr>
+      <w:r>
+        <w:rPr>
+          <w:rFonts w:ascii="Times New Roman" w:hAnsi="Times New Roman"/>
+          <w:sz w:val="24"/>
+        </w:rPr>
+        <w:t xml:space="preserve">2. </w:t>
+      </w:r>
+      <w:r>
+        <w:rPr>
+          <w:rFonts w:ascii="Times New Roman" w:hAnsi="Times New Roman"/>
+          <w:b/>
+          <w:sz w:val="24"/>
+        </w:rPr>
+        <w:t xml:space="preserve">Actividad de investigación: </w:t>
+      </w:r>
+      <w:r>
+        <w:rPr>
+          <w:rFonts w:ascii="Times New Roman" w:hAnsi="Times New Roman"/>
+          <w:sz w:val="24"/>
+        </w:rPr>
+        <w:t>Aquí va la actividad de investigación de la semana 10. [Completar con la tarea académica realizada.]</w:t>
+      </w:r>
+    </w:p>
+    <w:p>
+      <w:pPr>
+        <w:sectPr>
+          <w:footerReference w:type="default" r:id="rId37"/>
+          <w:type w:val="continuous"/>
+          <w:pgSz w:w="12240" w:h="15840"/>
+          <w:pgMar w:top="1701" w:right="1701" w:bottom="1701" w:left="2268" w:header="720" w:footer="720" w:gutter="0"/>
+          <w:cols w:space="720"/>
+          <w:titlePg/>
+          <w:docGrid w:linePitch="360"/>
+        </w:sectPr>
+      </w:pPr>
+    </w:p>
+    <w:p>
+      <w:pPr>
+        <w:spacing w:after="480"/>
+        <w:jc w:val="center"/>
+      </w:pPr>
+      <w:r>
+        <w:rPr>
+          <w:rFonts w:ascii="Times New Roman" w:hAnsi="Times New Roman"/>
+          <w:b/>
+          <w:sz w:val="24"/>
+        </w:rPr>
+        <w:t>CAPÍTULO V</w:t>
+      </w:r>
+    </w:p>
+    <w:p>
+      <w:bookmarkStart w:id="bm_cap5" w:name="bm_cap5"/>
+      <w:pPr>
+        <w:spacing w:before="480"/>
+        <w:jc w:val="center"/>
+      </w:pPr>
+      <w:r>
+        <w:rPr>
+          <w:rFonts w:ascii="Times New Roman" w:hAnsi="Times New Roman"/>
+          <w:b/>
+          <w:sz w:val="24"/>
+        </w:rPr>
+        <w:t>CONCLUSIONES Y RECOMENDACIONES</w:t>
+      </w:r>
+      <w:bookmarkEnd w:id="bm_cap5"/>
+    </w:p>
+    <w:p>
+      <w:pPr>
+        <w:sectPr>
+          <w:footerReference w:type="default" r:id="rId38"/>
+          <w:pgSz w:w="12240" w:h="15840"/>
+          <w:pgMar w:top="2835" w:right="1701" w:bottom="1701" w:left="2268" w:header="720" w:footer="720" w:gutter="0"/>
+          <w:cols w:space="720"/>
+          <w:titlePg/>
+          <w:docGrid w:linePitch="360"/>
+        </w:sectPr>
+      </w:pPr>
+    </w:p>
+    <w:p>
+      <w:bookmarkStart w:id="bm_cap5_concl" w:name="bm_cap5_concl"/>
+      <w:pPr>
+        <w:spacing w:before="480" w:after="480" w:line="360" w:lineRule="auto"/>
+        <w:jc w:val="left"/>
+      </w:pPr>
+      <w:r>
+        <w:rPr>
+          <w:rFonts w:ascii="Times New Roman" w:hAnsi="Times New Roman"/>
+          <w:b/>
+          <w:sz w:val="24"/>
+        </w:rPr>
+        <w:t>Conclusiones</w:t>
+      </w:r>
+      <w:bookmarkEnd w:id="bm_cap5_concl"/>
     </w:p>
     <w:p>
       <w:pPr>
@@ -6157,7 +7165,7 @@
           <w:rFonts w:ascii="Times New Roman" w:hAnsi="Times New Roman"/>
           <w:sz w:val="24"/>
         </w:rPr>
-        <w:t>Semana 1: Inducción institucional y reconocimiento del área de trabajo.</w:t>
+        <w:t>Aquí va la conclusión correspondiente al primer objetivo específico. [Completar con el logro alcanzado.]</w:t>
       </w:r>
     </w:p>
     <w:p>
@@ -6178,7 +7186,7 @@
           <w:rFonts w:ascii="Times New Roman" w:hAnsi="Times New Roman"/>
           <w:sz w:val="24"/>
         </w:rPr>
-        <w:t>Semana 2: Levantamiento de información sobre procesos administrativos.</w:t>
+        <w:t>Aquí va la conclusión correspondiente al segundo objetivo específico. [Completar con el logro alcanzado.]</w:t>
       </w:r>
     </w:p>
     <w:p>
@@ -6199,7 +7207,7 @@
           <w:rFonts w:ascii="Times New Roman" w:hAnsi="Times New Roman"/>
           <w:sz w:val="24"/>
         </w:rPr>
-        <w:t>Semana 3: Observación y análisis del proceso de solicitudes de servicio.</w:t>
+        <w:t>Aquí va la conclusión correspondiente al tercer objetivo específico. [Completar con el logro alcanzado.]</w:t>
       </w:r>
     </w:p>
     <w:p>
@@ -6220,152 +7228,14 @@
           <w:rFonts w:ascii="Times New Roman" w:hAnsi="Times New Roman"/>
           <w:sz w:val="24"/>
         </w:rPr>
-        <w:t>Semana 4: Diseño y aplicación de instrumentos de recolección de datos.</w:t>
+        <w:t>Aquí va la conclusión correspondiente al cuarto objetivo específico. [Completar con el logro alcanzado.]</w:t>
       </w:r>
     </w:p>
     <w:p>
-      <w:pPr>
-        <w:spacing w:line="360" w:lineRule="auto"/>
-        <w:ind w:firstLine="709"/>
-        <w:jc w:val="both"/>
-      </w:pPr>
-      <w:r>
-        <w:rPr>
-          <w:rFonts w:ascii="Times New Roman" w:hAnsi="Times New Roman"/>
-          <w:sz w:val="24"/>
-        </w:rPr>
-        <w:t xml:space="preserve">5. </w:t>
-      </w:r>
-      <w:r>
-        <w:rPr>
-          <w:rFonts w:ascii="Times New Roman" w:hAnsi="Times New Roman"/>
-          <w:sz w:val="24"/>
-        </w:rPr>
-        <w:t>Semana 5: Diagnóstico de la situación problemática.</w:t>
-      </w:r>
-    </w:p>
-    <w:p>
-      <w:pPr>
-        <w:spacing w:line="360" w:lineRule="auto"/>
-        <w:ind w:firstLine="709"/>
-        <w:jc w:val="both"/>
-      </w:pPr>
-      <w:r>
-        <w:rPr>
-          <w:rFonts w:ascii="Times New Roman" w:hAnsi="Times New Roman"/>
-          <w:sz w:val="24"/>
-        </w:rPr>
-        <w:t xml:space="preserve">6. </w:t>
-      </w:r>
-      <w:r>
-        <w:rPr>
-          <w:rFonts w:ascii="Times New Roman" w:hAnsi="Times New Roman"/>
-          <w:sz w:val="24"/>
-        </w:rPr>
-        <w:t>Semana 6: Revisión y elaboración del Marco Teórico.</w:t>
-      </w:r>
-    </w:p>
-    <w:p>
-      <w:pPr>
-        <w:spacing w:line="360" w:lineRule="auto"/>
-        <w:ind w:firstLine="709"/>
-        <w:jc w:val="both"/>
-      </w:pPr>
-      <w:r>
-        <w:rPr>
-          <w:rFonts w:ascii="Times New Roman" w:hAnsi="Times New Roman"/>
-          <w:sz w:val="24"/>
-        </w:rPr>
-        <w:t xml:space="preserve">7. </w:t>
-      </w:r>
-      <w:r>
-        <w:rPr>
-          <w:rFonts w:ascii="Times New Roman" w:hAnsi="Times New Roman"/>
-          <w:sz w:val="24"/>
-        </w:rPr>
-        <w:t>Semana 7: Ejecución de actividades asignadas en el área administrativa.</w:t>
-      </w:r>
-    </w:p>
-    <w:p>
-      <w:pPr>
-        <w:spacing w:line="360" w:lineRule="auto"/>
-        <w:ind w:firstLine="709"/>
-        <w:jc w:val="both"/>
-      </w:pPr>
-      <w:r>
-        <w:rPr>
-          <w:rFonts w:ascii="Times New Roman" w:hAnsi="Times New Roman"/>
-          <w:sz w:val="24"/>
-        </w:rPr>
-        <w:t xml:space="preserve">8. </w:t>
-      </w:r>
-      <w:r>
-        <w:rPr>
-          <w:rFonts w:ascii="Times New Roman" w:hAnsi="Times New Roman"/>
-          <w:sz w:val="24"/>
-        </w:rPr>
-        <w:t>Semana 8: Registro semanal de actividades realizadas.</w:t>
-      </w:r>
-    </w:p>
-    <w:p>
-      <w:pPr>
-        <w:spacing w:line="360" w:lineRule="auto"/>
-        <w:ind w:firstLine="709"/>
-        <w:jc w:val="both"/>
-      </w:pPr>
-      <w:r>
-        <w:rPr>
-          <w:rFonts w:ascii="Times New Roman" w:hAnsi="Times New Roman"/>
-          <w:sz w:val="24"/>
-        </w:rPr>
-        <w:t xml:space="preserve">9. </w:t>
-      </w:r>
-      <w:r>
-        <w:rPr>
-          <w:rFonts w:ascii="Times New Roman" w:hAnsi="Times New Roman"/>
-          <w:sz w:val="24"/>
-        </w:rPr>
-        <w:t>Semana 9: Redacción de conclusiones y recomendaciones.</w:t>
-      </w:r>
-    </w:p>
-    <w:p>
-      <w:pPr>
-        <w:spacing w:line="360" w:lineRule="auto"/>
-        <w:ind w:firstLine="709"/>
-        <w:jc w:val="both"/>
-      </w:pPr>
-      <w:r>
-        <w:rPr>
-          <w:rFonts w:ascii="Times New Roman" w:hAnsi="Times New Roman"/>
-          <w:sz w:val="24"/>
-        </w:rPr>
-        <w:t xml:space="preserve">10. </w:t>
-      </w:r>
-      <w:r>
-        <w:rPr>
-          <w:rFonts w:ascii="Times New Roman" w:hAnsi="Times New Roman"/>
-          <w:sz w:val="24"/>
-        </w:rPr>
-        <w:t>Semana 10: Revisión final y presentación del informe.</w:t>
-      </w:r>
-    </w:p>
-    <w:p>
-      <w:pPr>
-        <w:sectPr>
-          <w:footerReference w:type="default" r:id="rId33"/>
-          <w:type w:val="continuous"/>
-          <w:pgSz w:w="12240" w:h="15840"/>
-          <w:pgMar w:top="1701" w:right="1701" w:bottom="1701" w:left="2268" w:header="720" w:footer="720" w:gutter="0"/>
-          <w:cols w:space="720"/>
-          <w:titlePg/>
-          <w:docGrid w:linePitch="360"/>
-        </w:sectPr>
-      </w:pPr>
-    </w:p>
-    <w:p>
-      <w:pPr>
-        <w:spacing w:after="480"/>
-        <w:jc w:val="center"/>
+      <w:bookmarkStart w:id="bm_cap5_recom" w:name="bm_cap5_recom"/>
+      <w:pPr>
+        <w:spacing w:before="480" w:after="480" w:line="360" w:lineRule="auto"/>
+        <w:jc w:val="left"/>
       </w:pPr>
       <w:r>
         <w:rPr>
@@ -6373,52 +7243,9 @@
           <w:b/>
           <w:sz w:val="24"/>
         </w:rPr>
-        <w:t>CAPÍTULO V</w:t>
+        <w:t>Recomendaciones</w:t>
       </w:r>
-    </w:p>
-    <w:p>
-      <w:bookmarkStart w:id="bm_cap5" w:name="bm_cap5"/>
-      <w:pPr>
-        <w:spacing w:before="480"/>
-        <w:jc w:val="center"/>
-      </w:pPr>
-      <w:r>
-        <w:rPr>
-          <w:rFonts w:ascii="Times New Roman" w:hAnsi="Times New Roman"/>
-          <w:b/>
-          <w:sz w:val="24"/>
-        </w:rPr>
-        <w:t>CONCLUSIONES Y RECOMENDACIONES</w:t>
-      </w:r>
-      <w:bookmarkEnd w:id="bm_cap5"/>
-    </w:p>
-    <w:p>
-      <w:pPr>
-        <w:sectPr>
-          <w:footerReference w:type="default" r:id="rId34"/>
-          <w:pgSz w:w="12240" w:h="15840"/>
-          <w:pgMar w:top="2835" w:right="1701" w:bottom="1701" w:left="2268" w:header="720" w:footer="720" w:gutter="0"/>
-          <w:cols w:space="720"/>
-          <w:titlePg/>
-          <w:docGrid w:linePitch="360"/>
-        </w:sectPr>
-      </w:pPr>
-    </w:p>
-    <w:p>
-      <w:bookmarkStart w:id="bm_cap5_concl" w:name="bm_cap5_concl"/>
-      <w:pPr>
-        <w:spacing w:before="480" w:after="480" w:line="360" w:lineRule="auto"/>
-        <w:jc w:val="left"/>
-      </w:pPr>
-      <w:r>
-        <w:rPr>
-          <w:rFonts w:ascii="Times New Roman" w:hAnsi="Times New Roman"/>
-          <w:b/>
-          <w:sz w:val="24"/>
-        </w:rPr>
-        <w:t>Conclusiones</w:t>
-      </w:r>
-      <w:bookmarkEnd w:id="bm_cap5_concl"/>
+      <w:bookmarkEnd w:id="bm_cap5_recom"/>
     </w:p>
     <w:p>
       <w:pPr>
@@ -6438,7 +7265,7 @@
           <w:rFonts w:ascii="Times New Roman" w:hAnsi="Times New Roman"/>
           <w:sz w:val="24"/>
         </w:rPr>
-        <w:t>Se logró evaluar el control administrativo aplicado a la gestión de solicitudes de servicios, identificando las debilidades del proceso.</w:t>
+        <w:t>Aquí va la primera recomendación. [Completar con la acción sugerida.]</w:t>
       </w:r>
     </w:p>
     <w:p>
@@ -6459,24 +7286,8 @@
           <w:rFonts w:ascii="Times New Roman" w:hAnsi="Times New Roman"/>
           <w:sz w:val="24"/>
         </w:rPr>
-        <w:t>La propuesta de mejora contribuye a optimizar la atención al suscriptor y fortalecer los procesos internos del Departamento de Administración.</w:t>
+        <w:t>Aquí va la segunda recomendación. [Completar con la acción sugerida.]</w:t>
       </w:r>
-    </w:p>
-    <w:p>
-      <w:bookmarkStart w:id="bm_cap5_recom" w:name="bm_cap5_recom"/>
-      <w:pPr>
-        <w:spacing w:before="480" w:after="480" w:line="360" w:lineRule="auto"/>
-        <w:jc w:val="left"/>
-      </w:pPr>
-      <w:r>
-        <w:rPr>
-          <w:rFonts w:ascii="Times New Roman" w:hAnsi="Times New Roman"/>
-          <w:b/>
-          <w:sz w:val="24"/>
-        </w:rPr>
-        <w:t>Recomendaciones</w:t>
-      </w:r>
-      <w:bookmarkEnd w:id="bm_cap5_recom"/>
     </w:p>
     <w:p>
       <w:pPr>
@@ -6489,14 +7300,14 @@
           <w:rFonts w:ascii="Times New Roman" w:hAnsi="Times New Roman"/>
           <w:sz w:val="24"/>
         </w:rPr>
-        <w:t xml:space="preserve">1. </w:t>
+        <w:t xml:space="preserve">3. </w:t>
       </w:r>
       <w:r>
         <w:rPr>
           <w:rFonts w:ascii="Times New Roman" w:hAnsi="Times New Roman"/>
           <w:sz w:val="24"/>
         </w:rPr>
-        <w:t>Implementar un sistema de seguimiento unificado para las solicitudes de servicio que permita la trazabilidad en tiempo real.</w:t>
+        <w:t>Aquí va la tercera recomendación. [Completar con la acción sugerida.]</w:t>
       </w:r>
     </w:p>
     <w:p>
@@ -6510,20 +7321,20 @@
           <w:rFonts w:ascii="Times New Roman" w:hAnsi="Times New Roman"/>
           <w:sz w:val="24"/>
         </w:rPr>
-        <w:t xml:space="preserve">2. </w:t>
+        <w:t xml:space="preserve">4. </w:t>
       </w:r>
       <w:r>
         <w:rPr>
           <w:rFonts w:ascii="Times New Roman" w:hAnsi="Times New Roman"/>
           <w:sz w:val="24"/>
         </w:rPr>
-        <w:t>Estandarizar los registros y procedimientos administrativos para la gestión de solicitudes de instalación y atención de incidencias.</w:t>
+        <w:t>Aquí va la cuarta recomendación. [Completar con la acción sugerida.]</w:t>
       </w:r>
     </w:p>
     <w:p>
       <w:pPr>
         <w:sectPr>
-          <w:footerReference w:type="default" r:id="rId35"/>
+          <w:footerReference w:type="default" r:id="rId39"/>
           <w:type w:val="continuous"/>
           <w:pgSz w:w="12240" w:h="15840"/>
           <w:pgMar w:top="1701" w:right="1701" w:bottom="1701" w:left="2268" w:header="720" w:footer="720" w:gutter="0"/>
@@ -6552,7 +7363,7 @@
     <w:p>
       <w:pPr>
         <w:sectPr>
-          <w:footerReference w:type="default" r:id="rId36"/>
+          <w:footerReference w:type="default" r:id="rId40"/>
           <w:pgSz w:w="12240" w:h="15840"/>
           <w:pgMar w:top="2835" w:right="1701" w:bottom="1701" w:left="2268" w:header="720" w:footer="720" w:gutter="0"/>
           <w:cols w:space="720"/>
@@ -6577,13 +7388,41 @@
           <w:rFonts w:ascii="Times New Roman" w:hAnsi="Times New Roman"/>
           <w:sz w:val="24"/>
         </w:rPr>
-        <w:t>Asamblea Nacional. (1999). Constitución de la República Bolivariana de Venezuela. Caracas, La Torre.</w:t>
+        <w:t>Aquí va la primera referencia bibliográfica en formato APA. [Completar con autor, año, título, editorial y ciudad.]</w:t>
       </w:r>
     </w:p>
     <w:p>
       <w:pPr>
+        <w:spacing w:line="240" w:lineRule="auto" w:after="480" w:before="0"/>
+        <w:ind w:left="425" w:hanging="425"/>
+        <w:jc w:val="both"/>
+      </w:pPr>
+      <w:r>
+        <w:rPr>
+          <w:rFonts w:ascii="Times New Roman" w:hAnsi="Times New Roman"/>
+          <w:sz w:val="24"/>
+        </w:rPr>
+        <w:t>Aquí va la segunda referencia bibliográfica en formato APA. [Completar con autor, año, título, editorial y ciudad.]</w:t>
+      </w:r>
+    </w:p>
+    <w:p>
+      <w:pPr>
+        <w:spacing w:line="240" w:lineRule="auto" w:after="480" w:before="0"/>
+        <w:ind w:left="425" w:hanging="425"/>
+        <w:jc w:val="both"/>
+      </w:pPr>
+      <w:r>
+        <w:rPr>
+          <w:rFonts w:ascii="Times New Roman" w:hAnsi="Times New Roman"/>
+          <w:sz w:val="24"/>
+        </w:rPr>
+        <w:t>Aquí va la tercera referencia bibliográfica en formato APA. [Completar con autor, año, título, editorial y ciudad.]</w:t>
+      </w:r>
+    </w:p>
+    <w:p>
+      <w:pPr>
         <w:sectPr>
-          <w:footerReference w:type="default" r:id="rId37"/>
+          <w:footerReference w:type="default" r:id="rId41"/>
           <w:type w:val="continuous"/>
           <w:pgSz w:w="12240" w:h="15840"/>
           <w:pgMar w:top="1701" w:right="1701" w:bottom="1701" w:left="2268" w:header="720" w:footer="720" w:gutter="0"/>
@@ -6612,7 +7451,7 @@
     <w:p>
       <w:pPr>
         <w:sectPr>
-          <w:footerReference w:type="default" r:id="rId38"/>
+          <w:footerReference w:type="default" r:id="rId42"/>
           <w:pgSz w:w="12240" w:h="15840"/>
           <w:pgMar w:top="2835" w:right="1701" w:bottom="1701" w:left="2268" w:header="720" w:footer="720" w:gutter="0"/>
           <w:cols w:space="720"/>
@@ -6648,7 +7487,7 @@
           <w:b/>
           <w:sz w:val="24"/>
         </w:rPr>
-        <w:t>[Definición de Términos Básicos]</w:t>
+        <w:t>[Aquí va la descripción del Anexo A]</w:t>
       </w:r>
     </w:p>
     <w:p>
@@ -6667,7 +7506,7 @@
     <w:p>
       <w:pPr>
         <w:sectPr>
-          <w:footerReference w:type="default" r:id="rId39"/>
+          <w:footerReference w:type="default" r:id="rId43"/>
           <w:pgSz w:w="12240" w:h="15840"/>
           <w:pgMar w:top="2835" w:right="1701" w:bottom="1701" w:left="2268" w:header="720" w:footer="720" w:gutter="0"/>
           <w:cols w:space="720"/>
@@ -6703,7 +7542,7 @@
           <w:b/>
           <w:sz w:val="24"/>
         </w:rPr>
-        <w:t>[Planes de Trabajo]</w:t>
+        <w:t>[Aquí va la descripción del Anexo B]</w:t>
       </w:r>
     </w:p>
     <w:p>
@@ -6722,7 +7561,7 @@
     <w:p>
       <w:pPr>
         <w:sectPr>
-          <w:footerReference w:type="default" r:id="rId40"/>
+          <w:footerReference w:type="default" r:id="rId44"/>
           <w:pgSz w:w="12240" w:h="15840"/>
           <w:pgMar w:top="2835" w:right="1701" w:bottom="1701" w:left="2268" w:header="720" w:footer="720" w:gutter="0"/>
           <w:cols w:space="720"/>
@@ -6758,7 +7597,7 @@
           <w:b/>
           <w:sz w:val="24"/>
         </w:rPr>
-        <w:t>[Memoria Fotográfica]</w:t>
+        <w:t>[Aquí va la descripción del Anexo C]</w:t>
       </w:r>
     </w:p>
     <w:p>
@@ -6775,7 +7614,7 @@
       </w:r>
     </w:p>
     <w:sectPr>
-      <w:footerReference w:type="default" r:id="rId41"/>
+      <w:footerReference w:type="default" r:id="rId45"/>
       <w:pgSz w:w="12240" w:h="15840"/>
       <w:pgMar w:top="2835" w:right="1701" w:bottom="1701" w:left="2268" w:header="720" w:footer="720" w:gutter="0"/>
       <w:cols w:space="720"/>
@@ -6914,7 +7753,7 @@
         <w:sz w:val="24"/>
       </w:rPr>
       <w:fldChar w:fldCharType="begin"/>
-      <w:instrText xml:space="preserve"> PAGE </w:instrText>
+      <w:instrText xml:space="preserve"> PAGE \* roman </w:instrText>
       <w:fldChar w:fldCharType="separate"/>
       <w:fldChar w:fldCharType="end"/>
     </w:r>
@@ -6935,7 +7774,7 @@
         <w:sz w:val="24"/>
       </w:rPr>
       <w:fldChar w:fldCharType="begin"/>
-      <w:instrText xml:space="preserve"> PAGE </w:instrText>
+      <w:instrText xml:space="preserve"> PAGE \* roman </w:instrText>
       <w:fldChar w:fldCharType="separate"/>
       <w:fldChar w:fldCharType="end"/>
     </w:r>
@@ -6956,7 +7795,7 @@
         <w:sz w:val="24"/>
       </w:rPr>
       <w:fldChar w:fldCharType="begin"/>
-      <w:instrText xml:space="preserve"> PAGE </w:instrText>
+      <w:instrText xml:space="preserve"> PAGE \* roman </w:instrText>
       <w:fldChar w:fldCharType="separate"/>
       <w:fldChar w:fldCharType="end"/>
     </w:r>
@@ -6977,7 +7816,7 @@
         <w:sz w:val="24"/>
       </w:rPr>
       <w:fldChar w:fldCharType="begin"/>
-      <w:instrText xml:space="preserve"> PAGE </w:instrText>
+      <w:instrText xml:space="preserve"> PAGE \* roman </w:instrText>
       <w:fldChar w:fldCharType="separate"/>
       <w:fldChar w:fldCharType="end"/>
     </w:r>
@@ -7248,6 +8087,90 @@
 </file>
 
 <file path=word/footer30.xml><?xml version="1.0" encoding="utf-8"?>
+<w:ftr xmlns:m="http://schemas.openxmlformats.org/officeDocument/2006/math" xmlns:mc="http://schemas.openxmlformats.org/markup-compatibility/2006" xmlns:mo="http://schemas.microsoft.com/office/mac/office/2008/main" xmlns:mv="urn:schemas-microsoft-com:mac:vml" xmlns:o="urn:schemas-microsoft-com:office:office" xmlns:r="http://schemas.openxmlformats.org/officeDocument/2006/relationships" xmlns:v="urn:schemas-microsoft-com:vml" xmlns:w10="urn:schemas-microsoft-com:office:word" xmlns:w14="http://schemas.microsoft.com/office/word/2010/wordml" xmlns:w="http://schemas.openxmlformats.org/wordprocessingml/2006/main" xmlns:wne="http://schemas.microsoft.com/office/word/2006/wordml" xmlns:wp14="http://schemas.microsoft.com/office/word/2010/wordprocessingDrawing" xmlns:wp="http://schemas.openxmlformats.org/drawingml/2006/wordprocessingDrawing" xmlns:wpc="http://schemas.microsoft.com/office/word/2010/wordprocessingCanvas" xmlns:wpg="http://schemas.microsoft.com/office/word/2010/wordprocessingGroup" xmlns:wpi="http://schemas.microsoft.com/office/word/2010/wordprocessingInk" xmlns:wps="http://schemas.microsoft.com/office/word/2010/wordprocessingShape" mc:Ignorable="w14 wp14">
+  <w:p>
+    <w:pPr>
+      <w:pStyle w:val="Footer"/>
+      <w:jc w:val="center"/>
+    </w:pPr>
+    <w:r>
+      <w:rPr>
+        <w:rFonts w:ascii="Times New Roman" w:hAnsi="Times New Roman"/>
+        <w:sz w:val="24"/>
+      </w:rPr>
+      <w:fldChar w:fldCharType="begin"/>
+      <w:instrText xml:space="preserve"> PAGE </w:instrText>
+      <w:fldChar w:fldCharType="separate"/>
+      <w:fldChar w:fldCharType="end"/>
+    </w:r>
+  </w:p>
+</w:ftr>
+</file>
+
+<file path=word/footer31.xml><?xml version="1.0" encoding="utf-8"?>
+<w:ftr xmlns:m="http://schemas.openxmlformats.org/officeDocument/2006/math" xmlns:mc="http://schemas.openxmlformats.org/markup-compatibility/2006" xmlns:mo="http://schemas.microsoft.com/office/mac/office/2008/main" xmlns:mv="urn:schemas-microsoft-com:mac:vml" xmlns:o="urn:schemas-microsoft-com:office:office" xmlns:r="http://schemas.openxmlformats.org/officeDocument/2006/relationships" xmlns:v="urn:schemas-microsoft-com:vml" xmlns:w10="urn:schemas-microsoft-com:office:word" xmlns:w14="http://schemas.microsoft.com/office/word/2010/wordml" xmlns:w="http://schemas.openxmlformats.org/wordprocessingml/2006/main" xmlns:wne="http://schemas.microsoft.com/office/word/2006/wordml" xmlns:wp14="http://schemas.microsoft.com/office/word/2010/wordprocessingDrawing" xmlns:wp="http://schemas.openxmlformats.org/drawingml/2006/wordprocessingDrawing" xmlns:wpc="http://schemas.microsoft.com/office/word/2010/wordprocessingCanvas" xmlns:wpg="http://schemas.microsoft.com/office/word/2010/wordprocessingGroup" xmlns:wpi="http://schemas.microsoft.com/office/word/2010/wordprocessingInk" xmlns:wps="http://schemas.microsoft.com/office/word/2010/wordprocessingShape" mc:Ignorable="w14 wp14">
+  <w:p>
+    <w:pPr>
+      <w:pStyle w:val="Footer"/>
+      <w:jc w:val="center"/>
+    </w:pPr>
+    <w:r>
+      <w:rPr>
+        <w:rFonts w:ascii="Times New Roman" w:hAnsi="Times New Roman"/>
+        <w:sz w:val="24"/>
+      </w:rPr>
+      <w:fldChar w:fldCharType="begin"/>
+      <w:instrText xml:space="preserve"> PAGE </w:instrText>
+      <w:fldChar w:fldCharType="separate"/>
+      <w:fldChar w:fldCharType="end"/>
+    </w:r>
+  </w:p>
+</w:ftr>
+</file>
+
+<file path=word/footer32.xml><?xml version="1.0" encoding="utf-8"?>
+<w:ftr xmlns:m="http://schemas.openxmlformats.org/officeDocument/2006/math" xmlns:mc="http://schemas.openxmlformats.org/markup-compatibility/2006" xmlns:mo="http://schemas.microsoft.com/office/mac/office/2008/main" xmlns:mv="urn:schemas-microsoft-com:mac:vml" xmlns:o="urn:schemas-microsoft-com:office:office" xmlns:r="http://schemas.openxmlformats.org/officeDocument/2006/relationships" xmlns:v="urn:schemas-microsoft-com:vml" xmlns:w10="urn:schemas-microsoft-com:office:word" xmlns:w14="http://schemas.microsoft.com/office/word/2010/wordml" xmlns:w="http://schemas.openxmlformats.org/wordprocessingml/2006/main" xmlns:wne="http://schemas.microsoft.com/office/word/2006/wordml" xmlns:wp14="http://schemas.microsoft.com/office/word/2010/wordprocessingDrawing" xmlns:wp="http://schemas.openxmlformats.org/drawingml/2006/wordprocessingDrawing" xmlns:wpc="http://schemas.microsoft.com/office/word/2010/wordprocessingCanvas" xmlns:wpg="http://schemas.microsoft.com/office/word/2010/wordprocessingGroup" xmlns:wpi="http://schemas.microsoft.com/office/word/2010/wordprocessingInk" xmlns:wps="http://schemas.microsoft.com/office/word/2010/wordprocessingShape" mc:Ignorable="w14 wp14">
+  <w:p>
+    <w:pPr>
+      <w:pStyle w:val="Footer"/>
+      <w:jc w:val="center"/>
+    </w:pPr>
+    <w:r>
+      <w:rPr>
+        <w:rFonts w:ascii="Times New Roman" w:hAnsi="Times New Roman"/>
+        <w:sz w:val="24"/>
+      </w:rPr>
+      <w:fldChar w:fldCharType="begin"/>
+      <w:instrText xml:space="preserve"> PAGE </w:instrText>
+      <w:fldChar w:fldCharType="separate"/>
+      <w:fldChar w:fldCharType="end"/>
+    </w:r>
+  </w:p>
+</w:ftr>
+</file>
+
+<file path=word/footer33.xml><?xml version="1.0" encoding="utf-8"?>
+<w:ftr xmlns:m="http://schemas.openxmlformats.org/officeDocument/2006/math" xmlns:mc="http://schemas.openxmlformats.org/markup-compatibility/2006" xmlns:mo="http://schemas.microsoft.com/office/mac/office/2008/main" xmlns:mv="urn:schemas-microsoft-com:mac:vml" xmlns:o="urn:schemas-microsoft-com:office:office" xmlns:r="http://schemas.openxmlformats.org/officeDocument/2006/relationships" xmlns:v="urn:schemas-microsoft-com:vml" xmlns:w10="urn:schemas-microsoft-com:office:word" xmlns:w14="http://schemas.microsoft.com/office/word/2010/wordml" xmlns:w="http://schemas.openxmlformats.org/wordprocessingml/2006/main" xmlns:wne="http://schemas.microsoft.com/office/word/2006/wordml" xmlns:wp14="http://schemas.microsoft.com/office/word/2010/wordprocessingDrawing" xmlns:wp="http://schemas.openxmlformats.org/drawingml/2006/wordprocessingDrawing" xmlns:wpc="http://schemas.microsoft.com/office/word/2010/wordprocessingCanvas" xmlns:wpg="http://schemas.microsoft.com/office/word/2010/wordprocessingGroup" xmlns:wpi="http://schemas.microsoft.com/office/word/2010/wordprocessingInk" xmlns:wps="http://schemas.microsoft.com/office/word/2010/wordprocessingShape" mc:Ignorable="w14 wp14">
+  <w:p>
+    <w:pPr>
+      <w:pStyle w:val="Footer"/>
+      <w:jc w:val="center"/>
+    </w:pPr>
+    <w:r>
+      <w:rPr>
+        <w:rFonts w:ascii="Times New Roman" w:hAnsi="Times New Roman"/>
+        <w:sz w:val="24"/>
+      </w:rPr>
+      <w:fldChar w:fldCharType="begin"/>
+      <w:instrText xml:space="preserve"> PAGE </w:instrText>
+      <w:fldChar w:fldCharType="separate"/>
+      <w:fldChar w:fldCharType="end"/>
+    </w:r>
+  </w:p>
+</w:ftr>
+</file>
+
+<file path=word/footer34.xml><?xml version="1.0" encoding="utf-8"?>
 <w:ftr xmlns:m="http://schemas.openxmlformats.org/officeDocument/2006/math" xmlns:mc="http://schemas.openxmlformats.org/markup-compatibility/2006" xmlns:mo="http://schemas.microsoft.com/office/mac/office/2008/main" xmlns:mv="urn:schemas-microsoft-com:mac:vml" xmlns:o="urn:schemas-microsoft-com:office:office" xmlns:r="http://schemas.openxmlformats.org/officeDocument/2006/relationships" xmlns:v="urn:schemas-microsoft-com:vml" xmlns:w10="urn:schemas-microsoft-com:office:word" xmlns:w14="http://schemas.microsoft.com/office/word/2010/wordml" xmlns:w="http://schemas.openxmlformats.org/wordprocessingml/2006/main" xmlns:wne="http://schemas.microsoft.com/office/word/2006/wordml" xmlns:wp14="http://schemas.microsoft.com/office/word/2010/wordprocessingDrawing" xmlns:wp="http://schemas.openxmlformats.org/drawingml/2006/wordprocessingDrawing" xmlns:wpc="http://schemas.microsoft.com/office/word/2010/wordprocessingCanvas" xmlns:wpg="http://schemas.microsoft.com/office/word/2010/wordprocessingGroup" xmlns:wpi="http://schemas.microsoft.com/office/word/2010/wordprocessingInk" xmlns:wps="http://schemas.microsoft.com/office/word/2010/wordprocessingShape" mc:Ignorable="w14 wp14">
   <w:p>
     <w:pPr>

</xml_diff>

<commit_message>
Portada solo autor, contraportada incluye tutores
</commit_message>
<xml_diff>
--- a/amaal/reportes/Informe_Pasantia_IUTECP.docx
+++ b/amaal/reportes/Informe_Pasantia_IUTECP.docx
@@ -87,54 +87,11 @@
           <w:sz w:val="24"/>
         </w:rPr>
         <w:t>C.I.: 31.985.792</w:t>
-        <w:br/>
-      </w:r>
-      <w:r>
-        <w:rPr>
-          <w:rFonts w:ascii="Times New Roman" w:hAnsi="Times New Roman"/>
-          <w:b/>
-          <w:sz w:val="24"/>
-        </w:rPr>
-        <w:br/>
-      </w:r>
-      <w:r>
-        <w:rPr>
-          <w:rFonts w:ascii="Times New Roman" w:hAnsi="Times New Roman"/>
-          <w:b/>
-          <w:sz w:val="24"/>
-        </w:rPr>
-        <w:t>Tutor Industrial: [Nombre del Tutor Industrial]</w:t>
-        <w:br/>
-      </w:r>
-      <w:r>
-        <w:rPr>
-          <w:rFonts w:ascii="Times New Roman" w:hAnsi="Times New Roman"/>
-          <w:b/>
-          <w:sz w:val="24"/>
-        </w:rPr>
-        <w:t>C.I.: [Cédula del Tutor Industrial]</w:t>
-        <w:br/>
-      </w:r>
-      <w:r>
-        <w:rPr>
-          <w:rFonts w:ascii="Times New Roman" w:hAnsi="Times New Roman"/>
-          <w:b/>
-          <w:sz w:val="24"/>
-        </w:rPr>
-        <w:br/>
-      </w:r>
-      <w:r>
-        <w:rPr>
-          <w:rFonts w:ascii="Times New Roman" w:hAnsi="Times New Roman"/>
-          <w:b/>
-          <w:sz w:val="24"/>
-        </w:rPr>
-        <w:t>Tutor Académico: [Nombre del Tutor Académico]</w:t>
       </w:r>
     </w:p>
     <w:p>
       <w:pPr>
-        <w:spacing w:line="276" w:lineRule="auto" w:before="929" w:after="0"/>
+        <w:spacing w:line="276" w:lineRule="auto" w:before="2309" w:after="0"/>
         <w:jc w:val="center"/>
       </w:pPr>
       <w:r>

</xml_diff>

<commit_message>
Agregar C.I. del tutor academico en keidy y amaal
</commit_message>
<xml_diff>
--- a/amaal/reportes/Informe_Pasantia_IUTECP.docx
+++ b/amaal/reportes/Informe_Pasantia_IUTECP.docx
@@ -241,11 +241,20 @@
           <w:sz w:val="24"/>
         </w:rPr>
         <w:t>Tutor Académico: [Nombre del Tutor Académico]</w:t>
+        <w:br/>
+      </w:r>
+      <w:r>
+        <w:rPr>
+          <w:rFonts w:ascii="Times New Roman" w:hAnsi="Times New Roman"/>
+          <w:b/>
+          <w:sz w:val="24"/>
+        </w:rPr>
+        <w:t>C.I.: [Cédula del Tutor Académico]</w:t>
       </w:r>
     </w:p>
     <w:p>
       <w:pPr>
-        <w:spacing w:line="276" w:lineRule="auto" w:before="929" w:after="0"/>
+        <w:spacing w:line="276" w:lineRule="auto" w:before="653" w:after="0"/>
         <w:jc w:val="center"/>
       </w:pPr>
       <w:r>

</xml_diff>

<commit_message>
Tutor academico Carlos Mendoza (C.I. 4.273.815) en keidy y amaal, tutor industrial Martina Rondon en keidy
</commit_message>
<xml_diff>
--- a/amaal/reportes/Informe_Pasantia_IUTECP.docx
+++ b/amaal/reportes/Informe_Pasantia_IUTECP.docx
@@ -240,7 +240,7 @@
           <w:b/>
           <w:sz w:val="24"/>
         </w:rPr>
-        <w:t>Tutor Académico: [Nombre del Tutor Académico]</w:t>
+        <w:t>Tutor Académico: Lic. Carlos Mendoza</w:t>
         <w:br/>
       </w:r>
       <w:r>
@@ -249,7 +249,7 @@
           <w:b/>
           <w:sz w:val="24"/>
         </w:rPr>
-        <w:t>C.I.: [Cédula del Tutor Académico]</w:t>
+        <w:t>C.I.: 4.273.815</w:t>
       </w:r>
     </w:p>
     <w:p>

</xml_diff>

<commit_message>
Contenido completo de Amaal: BASES_TEORICAS, ACTIVIDADES, CONCLUSIONES, RECOMENDACIONES, REFERENCIAS, RESUMEN e INTRODUCCION
</commit_message>
<xml_diff>
--- a/amaal/reportes/Informe_Pasantia_IUTECP.docx
+++ b/amaal/reportes/Informe_Pasantia_IUTECP.docx
@@ -429,7 +429,7 @@
           <w:i w:val="0"/>
           <w:sz w:val="24"/>
         </w:rPr>
-        <w:t>Aquí va el resumen del informe. El presente informe describe la evaluación del control administrativo aplicado a la gestión de solicitudes de servicios de telecomunicaciones en la empresa Ingeniería de Telecomunicaciones, C.A. (IDETEL). La investigación se enmarca en la modalidad de proyecto factible apoyado en un diagnóstico de campo. [Completar con el resto del resumen: objetivo general, metodología, resultados y conclusiones principales.]</w:t>
+        <w:t>El presente informe describe la evaluación del control administrativo aplicado a la gestión de solicitudes de servicios de telecomunicaciones en la empresa Ingeniería de Telecomunicaciones, C.A. (IDETEL). La investigación se enmarca en la modalidad de proyecto factible apoyado en un diagnóstico de campo. Durante el estudio se identificó la ausencia de procedimientos formalizados para el seguimiento de solicitudes de afiliación e incidencias, la falta de formatos estandarizados de registro y la inexistencia de indicadores de gestión que permitan evaluar el desempeño del proceso de atención al suscriptor. La propuesta contempla un nuevo flujo de trabajo estandarizado, formatos unificados de control y un conjunto de indicadores de gestión orientados a fortalecer el control administrativo y optimizar la calidad del servicio prestado.</w:t>
       </w:r>
     </w:p>
     <w:p/>
@@ -1984,7 +1984,7 @@
           <w:i w:val="0"/>
           <w:sz w:val="24"/>
         </w:rPr>
-        <w:t>Aquí va la introducción. La presente pasantía, desarrollada como requisito para optar al título de Técnico Superior Universitario en Administración, tiene como propósito evaluar el control administrativo aplicado a la gestión de solicitudes de servicios de telecomunicaciones en la empresa Ingeniería de Telecomunicaciones, C.A. [Completar con la estructura del informe: capítulos, enfoque metodológico y alcance.]</w:t>
+        <w:t>La presente pasantía, desarrollada como requisito para optar al título de Técnico Superior Universitario en Administración, tiene como propósito evaluar el control administrativo aplicado a la gestión de solicitudes de servicios de telecomunicaciones en la empresa Ingeniería de Telecomunicaciones, C.A. (IDETEL), con sede en la ciudad de El Tigre, estado Anzoátegui. El estudio parte del diagnóstico de las deficiencias presentes en el proceso de atención al suscriptor para proponer mejoras procedimentales que optimicen el control interno del departamento. El informe se organiza en cinco capítulos: el Capítulo I presenta la realidad organizacional de IDETEL; el Capítulo II desarrolla el diagnóstico situacional y la planificación del proyecto; el Capítulo III sustenta las bases teóricas que orientan la propuesta; el Capítulo IV describe las actividades ejecutadas durante las diez semanas de pasantía; y el Capítulo V presenta las conclusiones y recomendaciones derivadas del proceso investigativo.</w:t>
       </w:r>
     </w:p>
     <w:p>
@@ -6173,7 +6173,7 @@
           <w:b/>
           <w:sz w:val="24"/>
         </w:rPr>
-        <w:t>Aquí va el título de la primera base teórica</w:t>
+        <w:t>Control Administrativo</w:t>
       </w:r>
       <w:bookmarkEnd w:id="bm_cap3_bases"/>
     </w:p>
@@ -6189,7 +6189,7 @@
           <w:i w:val="0"/>
           <w:sz w:val="24"/>
         </w:rPr>
-        <w:t>Aquí va el desarrollo teórico del primer tema. [Completar con la definición y autores que sustentan este concepto.]</w:t>
+        <w:t>El control administrativo constituye una de las funciones fundamentales del proceso administrativo y se define como el mecanismo mediante el cual la organización verifica que las actividades ejecutadas se correspondan con lo planificado, detectando desviaciones y aplicando las medidas correctivas necesarias. Robbins y Coulter (2010) señalan que el control eficaz no solo identifica fallas, sino que proporciona información oportuna para la toma de decisiones gerenciales, convirtiéndose en un instrumento de mejora continua y no únicamente de fiscalización.</w:t>
       </w:r>
     </w:p>
     <w:p>
@@ -6204,21 +6204,28 @@
           <w:i w:val="0"/>
           <w:sz w:val="24"/>
         </w:rPr>
-        <w:t>Aquí va un segundo párrafo de desarrollo. [Completar con la aplicación del concepto al proyecto.]</w:t>
+        <w:t>En el contexto del Departamento de Administración de Ingeniería de Telecomunicaciones, C.A., el control administrativo se aplica sobre el ciclo de gestión de solicitudes de servicio, abarcando desde la recepción de la solicitud del suscriptor hasta el cierre definitivo del caso. La ausencia de mecanismos formales de control en este ciclo genera inconsistencias entre los departamentos involucrados y dificulta la evaluación del desempeño del proceso de atención.</w:t>
       </w:r>
     </w:p>
     <w:p>
       <w:pPr>
-        <w:spacing w:before="480" w:after="480" w:line="360" w:lineRule="auto"/>
-        <w:jc w:val="left"/>
-      </w:pPr>
-      <w:r>
-        <w:rPr>
-          <w:rFonts w:ascii="Times New Roman" w:hAnsi="Times New Roman"/>
-          <w:b/>
-          <w:sz w:val="24"/>
-        </w:rPr>
-        <w:t>Aquí va el título de la segunda base teórica</w:t>
+        <w:spacing w:line="240" w:lineRule="auto" w:before="720" w:after="240"/>
+        <w:ind w:left="709" w:right="709"/>
+        <w:jc w:val="both"/>
+      </w:pPr>
+      <w:r>
+        <w:rPr>
+          <w:rFonts w:ascii="Times New Roman" w:hAnsi="Times New Roman"/>
+          <w:sz w:val="24"/>
+        </w:rPr>
+        <w:t>El control es el proceso de monitorear las actividades para asegurarse de que se lleven a cabo según lo planeado y para corregir cualquier desviación significativa. Los gerentes no pueden saber realmente si sus unidades están desempeñándose adecuadamente hasta que evalúan qué actividades se han llevado a cabo y comparan el desempeño real con el estándar deseado.</w:t>
+      </w:r>
+      <w:r>
+        <w:rPr>
+          <w:rFonts w:ascii="Times New Roman" w:hAnsi="Times New Roman"/>
+          <w:sz w:val="24"/>
+        </w:rPr>
+        <w:t xml:space="preserve"> (Robbins y Coulter, 2010, p. 398)</w:t>
       </w:r>
     </w:p>
     <w:p>
@@ -6233,7 +6240,227 @@
           <w:i w:val="0"/>
           <w:sz w:val="24"/>
         </w:rPr>
-        <w:t>Aquí va el desarrollo teórico del segundo tema. [Completar con la definición y autores que sustentan este concepto.]</w:t>
+        <w:t>El control administrativo, como lo señalan los autores referidos, no se limita a una función de fiscalización, sino que se constituye en un mecanismo de retroalimentación continua que permite a la organización detectar desviaciones a tiempo y ajustar sus procesos para garantizar la calidad del servicio prestado al suscriptor.</w:t>
+      </w:r>
+    </w:p>
+    <w:p>
+      <w:pPr>
+        <w:spacing w:before="480" w:after="480" w:line="360" w:lineRule="auto"/>
+        <w:jc w:val="left"/>
+      </w:pPr>
+      <w:r>
+        <w:rPr>
+          <w:rFonts w:ascii="Times New Roman" w:hAnsi="Times New Roman"/>
+          <w:b/>
+          <w:sz w:val="24"/>
+        </w:rPr>
+        <w:t>Gestión de Solicitudes de Servicio</w:t>
+      </w:r>
+    </w:p>
+    <w:p>
+      <w:pPr>
+        <w:spacing w:line="360" w:lineRule="auto" w:after="0" w:before="0"/>
+        <w:ind w:firstLine="709"/>
+        <w:jc w:val="both"/>
+      </w:pPr>
+      <w:r>
+        <w:rPr>
+          <w:rFonts w:ascii="Times New Roman" w:hAnsi="Times New Roman"/>
+          <w:i w:val="0"/>
+          <w:sz w:val="24"/>
+        </w:rPr>
+        <w:t>La gestión de solicitudes de servicio comprende el conjunto de procedimientos administrativos orientados a recepcionar, registrar, procesar y dar seguimiento a los requerimientos presentados por los clientes o suscriptores de una organización. Zeithaml, Parasuraman y Berry (1993) establecen que la calidad del servicio percibida por el cliente está directamente vinculada a la capacidad de la organización para gestionar sus solicitudes de forma ágil, transparente y con comunicación fluida en cada etapa del proceso.</w:t>
+      </w:r>
+    </w:p>
+    <w:p>
+      <w:pPr>
+        <w:spacing w:line="360" w:lineRule="auto" w:after="0" w:before="0"/>
+        <w:ind w:firstLine="709"/>
+        <w:jc w:val="both"/>
+      </w:pPr>
+      <w:r>
+        <w:rPr>
+          <w:rFonts w:ascii="Times New Roman" w:hAnsi="Times New Roman"/>
+          <w:i w:val="0"/>
+          <w:sz w:val="24"/>
+        </w:rPr>
+        <w:t>En empresas de telecomunicaciones como IDETEL, la gestión de solicitudes abarca dos categorías principales: las solicitudes de afiliación de nuevos suscriptores, que implican la coordinación entre las áreas comercial, técnica y administrativa; y las incidencias reportadas por suscriptores activos, que requieren diagnóstico, despacho de cuadrillas y cierre verificado del caso. La ausencia de un sistema unificado de seguimiento para ambas categorías genera retrasos y reprocesos que impactan directamente en la satisfacción del cliente.</w:t>
+      </w:r>
+    </w:p>
+    <w:p>
+      <w:pPr>
+        <w:spacing w:before="480" w:after="480" w:line="360" w:lineRule="auto"/>
+        <w:jc w:val="left"/>
+      </w:pPr>
+      <w:r>
+        <w:rPr>
+          <w:rFonts w:ascii="Times New Roman" w:hAnsi="Times New Roman"/>
+          <w:b/>
+          <w:sz w:val="24"/>
+        </w:rPr>
+        <w:t>Procesos Administrativos y Estandarización de Procedimientos</w:t>
+      </w:r>
+    </w:p>
+    <w:p>
+      <w:pPr>
+        <w:spacing w:line="360" w:lineRule="auto" w:after="0" w:before="0"/>
+        <w:ind w:firstLine="709"/>
+        <w:jc w:val="both"/>
+      </w:pPr>
+      <w:r>
+        <w:rPr>
+          <w:rFonts w:ascii="Times New Roman" w:hAnsi="Times New Roman"/>
+          <w:i w:val="0"/>
+          <w:sz w:val="24"/>
+        </w:rPr>
+        <w:t>El proceso administrativo constituye el marco conceptual que rige el funcionamiento de las organizaciones modernas. Chiavenato (2006) lo describe como el conjunto secuencial e interrelacionado de funciones de planificación, organización, dirección y control, orientadas al logro eficiente de los objetivos organizacionales. La estandarización de los procedimientos dentro de este marco garantiza que las actividades se ejecuten de manera uniforme, reduciendo la variabilidad y los errores derivados de la discrecionalidad individual.</w:t>
+      </w:r>
+    </w:p>
+    <w:p>
+      <w:pPr>
+        <w:spacing w:line="360" w:lineRule="auto" w:after="0" w:before="0"/>
+        <w:ind w:firstLine="709"/>
+        <w:jc w:val="both"/>
+      </w:pPr>
+      <w:r>
+        <w:rPr>
+          <w:rFonts w:ascii="Times New Roman" w:hAnsi="Times New Roman"/>
+          <w:i w:val="0"/>
+          <w:sz w:val="24"/>
+        </w:rPr>
+        <w:t>La formalización de los procedimientos mediante manuales, flujogramas y formatos estandarizados constituye una herramienta esencial para el control administrativo. Según Harrington (1993), un proceso estandarizado es medible, controlable y mejorable, condiciones que permiten a la organización identificar con precisión los puntos de falla y aplicar acciones correctivas focalizadas. En el caso de IDETEL, la ausencia de procedimientos escritos para la gestión de solicitudes es una de las causas raíz de las deficiencias identificadas.</w:t>
+      </w:r>
+    </w:p>
+    <w:p>
+      <w:pPr>
+        <w:spacing w:before="480" w:after="480" w:line="360" w:lineRule="auto"/>
+        <w:jc w:val="left"/>
+      </w:pPr>
+      <w:r>
+        <w:rPr>
+          <w:rFonts w:ascii="Times New Roman" w:hAnsi="Times New Roman"/>
+          <w:b/>
+          <w:sz w:val="24"/>
+        </w:rPr>
+        <w:t>Calidad del Servicio en Empresas de Telecomunicaciones</w:t>
+      </w:r>
+    </w:p>
+    <w:p>
+      <w:pPr>
+        <w:spacing w:line="360" w:lineRule="auto" w:after="0" w:before="0"/>
+        <w:ind w:firstLine="709"/>
+        <w:jc w:val="both"/>
+      </w:pPr>
+      <w:r>
+        <w:rPr>
+          <w:rFonts w:ascii="Times New Roman" w:hAnsi="Times New Roman"/>
+          <w:i w:val="0"/>
+          <w:sz w:val="24"/>
+        </w:rPr>
+        <w:t>La calidad del servicio se define como el grado en que las características del servicio prestado satisfacen o superan las expectativas del cliente. Parasuraman, Zeithaml y Berry (1988) desarrollaron el modelo SERVQUAL, que identifica cinco dimensiones de la calidad del servicio: fiabilidad, capacidad de respuesta, seguridad, empatía y elementos tangibles. En el sector de telecomunicaciones, la fiabilidad y la capacidad de respuesta son las dimensiones con mayor peso en la percepción del cliente.</w:t>
+      </w:r>
+    </w:p>
+    <w:p>
+      <w:pPr>
+        <w:spacing w:line="360" w:lineRule="auto" w:after="0" w:before="0"/>
+        <w:ind w:firstLine="709"/>
+        <w:jc w:val="both"/>
+      </w:pPr>
+      <w:r>
+        <w:rPr>
+          <w:rFonts w:ascii="Times New Roman" w:hAnsi="Times New Roman"/>
+          <w:i w:val="0"/>
+          <w:sz w:val="24"/>
+        </w:rPr>
+        <w:t>Las deficiencias en el control administrativo del proceso de solicitudes de servicio impactan directamente sobre la fiabilidad y la capacidad de respuesta de IDETEL. Cuando una solicitud no es gestionada dentro de los tiempos establecidos o su estatus no puede ser verificado en tiempo real, el cliente percibe una falla en la calidad del servicio que deteriora su confianza en la organización y puede derivar en la cancelación del contrato o en la difusión de experiencias negativas.</w:t>
+      </w:r>
+    </w:p>
+    <w:p>
+      <w:pPr>
+        <w:spacing w:before="480" w:after="480" w:line="360" w:lineRule="auto"/>
+        <w:jc w:val="left"/>
+      </w:pPr>
+      <w:r>
+        <w:rPr>
+          <w:rFonts w:ascii="Times New Roman" w:hAnsi="Times New Roman"/>
+          <w:b/>
+          <w:sz w:val="24"/>
+        </w:rPr>
+        <w:t>Sistemas de Información para el Control Administrativo</w:t>
+      </w:r>
+    </w:p>
+    <w:p>
+      <w:pPr>
+        <w:spacing w:line="360" w:lineRule="auto" w:after="0" w:before="0"/>
+        <w:ind w:firstLine="709"/>
+        <w:jc w:val="both"/>
+      </w:pPr>
+      <w:r>
+        <w:rPr>
+          <w:rFonts w:ascii="Times New Roman" w:hAnsi="Times New Roman"/>
+          <w:i w:val="0"/>
+          <w:sz w:val="24"/>
+        </w:rPr>
+        <w:t>Un sistema de información constituye un conjunto organizado de recursos tecnológicos y procedimentales orientados a la captura, almacenamiento, procesamiento y distribución de datos con el propósito de apoyar la toma de decisiones. Laudon y Laudon (2016) distinguen los sistemas de procesamiento de transacciones como la categoría que registra y gestiona las operaciones rutinarias de la organización, siendo esta la tipología más pertinente para el control de solicitudes de servicio en una empresa de telecomunicaciones.</w:t>
+      </w:r>
+    </w:p>
+    <w:p>
+      <w:pPr>
+        <w:spacing w:line="360" w:lineRule="auto" w:after="0" w:before="0"/>
+        <w:ind w:firstLine="709"/>
+        <w:jc w:val="both"/>
+      </w:pPr>
+      <w:r>
+        <w:rPr>
+          <w:rFonts w:ascii="Times New Roman" w:hAnsi="Times New Roman"/>
+          <w:i w:val="0"/>
+          <w:sz w:val="24"/>
+        </w:rPr>
+        <w:t>La implementación de un sistema de tickets o plataforma de seguimiento de solicitudes en IDETEL permitiría centralizar el registro de cada caso, asignar responsables, definir tiempos de atención y generar alertas ante incumplimientos. Esta herramienta transformaría el control administrativo de reactivo a proactivo, dotando a la supervisión de información en tiempo real para la toma de decisiones y la evaluación continua del desempeño del proceso.</w:t>
+      </w:r>
+    </w:p>
+    <w:p>
+      <w:pPr>
+        <w:spacing w:before="480" w:after="480" w:line="360" w:lineRule="auto"/>
+        <w:jc w:val="left"/>
+      </w:pPr>
+      <w:r>
+        <w:rPr>
+          <w:rFonts w:ascii="Times New Roman" w:hAnsi="Times New Roman"/>
+          <w:b/>
+          <w:sz w:val="24"/>
+        </w:rPr>
+        <w:t>Proyecto Factible como Modalidad de Investigación</w:t>
+      </w:r>
+    </w:p>
+    <w:p>
+      <w:pPr>
+        <w:spacing w:line="360" w:lineRule="auto" w:after="0" w:before="0"/>
+        <w:ind w:firstLine="709"/>
+        <w:jc w:val="both"/>
+      </w:pPr>
+      <w:r>
+        <w:rPr>
+          <w:rFonts w:ascii="Times New Roman" w:hAnsi="Times New Roman"/>
+          <w:i w:val="0"/>
+          <w:sz w:val="24"/>
+        </w:rPr>
+        <w:t>La Universidad Pedagógica Experimental Libertador (UPEL, 2016) define el proyecto factible como la investigación, elaboración y desarrollo de una propuesta de un modelo operativo viable para solucionar problemas, requerimientos o necesidades de organizaciones o grupos sociales. Esta modalidad exige un diagnóstico de campo que evidencie la situación deficitaria y la comprobación de la viabilidad técnica y operativa de la solución planteada.</w:t>
+      </w:r>
+    </w:p>
+    <w:p>
+      <w:pPr>
+        <w:spacing w:line="360" w:lineRule="auto" w:after="0" w:before="0"/>
+        <w:ind w:firstLine="709"/>
+        <w:jc w:val="both"/>
+      </w:pPr>
+      <w:r>
+        <w:rPr>
+          <w:rFonts w:ascii="Times New Roman" w:hAnsi="Times New Roman"/>
+          <w:i w:val="0"/>
+          <w:sz w:val="24"/>
+        </w:rPr>
+        <w:t>Arias (2012) señala que el proyecto factible avanza hasta proponer y en muchos casos desarrollar la solución, demostrando su aplicabilidad en el contexto real. El presente trabajo se enmarca en esta modalidad al partir de la evaluación del control administrativo de IDETEL para proponer mejoras procedimentales cuya implementación es viable dentro de la estructura organizativa y los recursos disponibles de la empresa.</w:t>
       </w:r>
     </w:p>
     <w:p>
@@ -6362,7 +6589,7 @@
           <w:rFonts w:ascii="Times New Roman" w:hAnsi="Times New Roman"/>
           <w:sz w:val="24"/>
         </w:rPr>
-        <w:t>Aquí va la actividad operativa de la semana 1. [Completar con la tarea realizada en la empresa.]</w:t>
+        <w:t>Inducción institucional, recorrido por las instalaciones, presentación ante el equipo del Departamento de Administración y familiarización con los sistemas de registro y los procedimientos generales de la empresa.</w:t>
       </w:r>
     </w:p>
     <w:p>
@@ -6391,7 +6618,7 @@
           <w:rFonts w:ascii="Times New Roman" w:hAnsi="Times New Roman"/>
           <w:sz w:val="24"/>
         </w:rPr>
-        <w:t>Aquí va la actividad de investigación de la semana 1. [Completar con la tarea académica realizada.]</w:t>
+        <w:t>Observación directa del flujo de recepción y procesamiento de solicitudes de servicio, identificación preliminar de los actores involucrados en el proceso y formulación inicial de la situación problemática.</w:t>
       </w:r>
     </w:p>
     <w:p>
@@ -6434,7 +6661,7 @@
           <w:rFonts w:ascii="Times New Roman" w:hAnsi="Times New Roman"/>
           <w:sz w:val="24"/>
         </w:rPr>
-        <w:t>Aquí va la actividad operativa de la semana 2. [Completar con la tarea realizada en la empresa.]</w:t>
+        <w:t>Apoyo en la recepción y registro de solicitudes de afiliación de nuevos suscriptores, verificación de documentación requerida y actualización del sistema de control de casos activos.</w:t>
       </w:r>
     </w:p>
     <w:p>
@@ -6463,7 +6690,7 @@
           <w:rFonts w:ascii="Times New Roman" w:hAnsi="Times New Roman"/>
           <w:sz w:val="24"/>
         </w:rPr>
-        <w:t>Aquí va la actividad de investigación de la semana 2. [Completar con la tarea académica realizada.]</w:t>
+        <w:t>Levantamiento detallado del flujo procedimental de solicitudes de instalación e incidencias mediante la revisión de registros históricos y la documentación interna disponible en el departamento.</w:t>
       </w:r>
     </w:p>
     <w:p>
@@ -6506,7 +6733,7 @@
           <w:rFonts w:ascii="Times New Roman" w:hAnsi="Times New Roman"/>
           <w:sz w:val="24"/>
         </w:rPr>
-        <w:t>Aquí va la actividad operativa de la semana 3. [Completar con la tarea realizada en la empresa.]</w:t>
+        <w:t>Colaboración en el seguimiento de solicitudes de servicio activas, actualización del estatus de los casos en el sistema de registro del departamento y apoyo en la coordinación con el área técnica.</w:t>
       </w:r>
     </w:p>
     <w:p>
@@ -6535,7 +6762,7 @@
           <w:rFonts w:ascii="Times New Roman" w:hAnsi="Times New Roman"/>
           <w:sz w:val="24"/>
         </w:rPr>
-        <w:t>Aquí va la actividad de investigación de la semana 3. [Completar con la tarea académica realizada.]</w:t>
+        <w:t>Diseño y aplicación de guía de observación directa sobre el proceso de gestión de solicitudes, registrando los tiempos de respuesta por etapa y los puntos de interrupción del flujo.</w:t>
       </w:r>
     </w:p>
     <w:p>
@@ -6578,7 +6805,7 @@
           <w:rFonts w:ascii="Times New Roman" w:hAnsi="Times New Roman"/>
           <w:sz w:val="24"/>
         </w:rPr>
-        <w:t>Aquí va la actividad operativa de la semana 4. [Completar con la tarea realizada en la empresa.]</w:t>
+        <w:t>Apoyo en la atención al suscriptor vía telefónica y presencial, registro de incidencias reportadas y coordinación con el NOC para el despacho de cuadrillas técnicas de campo.</w:t>
       </w:r>
     </w:p>
     <w:p>
@@ -6607,7 +6834,7 @@
           <w:rFonts w:ascii="Times New Roman" w:hAnsi="Times New Roman"/>
           <w:sz w:val="24"/>
         </w:rPr>
-        <w:t>Aquí va la actividad de investigación de la semana 4. [Completar con la tarea académica realizada.]</w:t>
+        <w:t>Aplicación de entrevistas no estructuradas al personal administrativo, comercial y técnico para identificar las deficiencias percibidas en el sistema de control de solicitudes de servicio.</w:t>
       </w:r>
     </w:p>
     <w:p>
@@ -6650,7 +6877,7 @@
           <w:rFonts w:ascii="Times New Roman" w:hAnsi="Times New Roman"/>
           <w:sz w:val="24"/>
         </w:rPr>
-        <w:t>Aquí va la actividad operativa de la semana 5. [Completar con la tarea realizada en la empresa.]</w:t>
+        <w:t>Colaboración en la actualización del registro de suscriptores activos, verificación del cierre de casos pendientes y apoyo en la elaboración de reportes de incidencias del período.</w:t>
       </w:r>
     </w:p>
     <w:p>
@@ -6679,7 +6906,7 @@
           <w:rFonts w:ascii="Times New Roman" w:hAnsi="Times New Roman"/>
           <w:sz w:val="24"/>
         </w:rPr>
-        <w:t>Aquí va la actividad de investigación de la semana 5. [Completar con la tarea académica realizada.]</w:t>
+        <w:t>Diagnóstico situacional de las deficiencias del control administrativo, elaboración de la matriz de fallas identificadas y análisis de los tiempos promedio de atención por tipo de solicitud.</w:t>
       </w:r>
     </w:p>
     <w:p>
@@ -6722,7 +6949,7 @@
           <w:rFonts w:ascii="Times New Roman" w:hAnsi="Times New Roman"/>
           <w:sz w:val="24"/>
         </w:rPr>
-        <w:t>Aquí va la actividad operativa de la semana 6. [Completar con la tarea realizada en la empresa.]</w:t>
+        <w:t>Apoyo en la tramitación de contratos de nuevos suscriptores, verificación de la documentación requerida y actualización del registro de afiliaciones del período en el sistema del departamento.</w:t>
       </w:r>
     </w:p>
     <w:p>
@@ -6751,7 +6978,7 @@
           <w:rFonts w:ascii="Times New Roman" w:hAnsi="Times New Roman"/>
           <w:sz w:val="24"/>
         </w:rPr>
-        <w:t>Aquí va la actividad de investigación de la semana 6. [Completar con la tarea académica realizada.]</w:t>
+        <w:t>Análisis del impacto de las deficiencias detectadas sobre la calidad del servicio percibida por los suscriptores, mediante correlación entre tiempos de atención y quejas registradas.</w:t>
       </w:r>
     </w:p>
     <w:p>
@@ -6794,7 +7021,7 @@
           <w:rFonts w:ascii="Times New Roman" w:hAnsi="Times New Roman"/>
           <w:sz w:val="24"/>
         </w:rPr>
-        <w:t>Aquí va la actividad operativa de la semana 7. [Completar con la tarea realizada en la empresa.]</w:t>
+        <w:t>Colaboración en la revisión y archivo de expedientes administrativos del ciclo, apoyo en la conciliación de pagos de suscriptores y actualización de la base de datos de clientes.</w:t>
       </w:r>
     </w:p>
     <w:p>
@@ -6823,7 +7050,7 @@
           <w:rFonts w:ascii="Times New Roman" w:hAnsi="Times New Roman"/>
           <w:sz w:val="24"/>
         </w:rPr>
-        <w:t>Aquí va la actividad de investigación de la semana 7. [Completar con la tarea académica realizada.]</w:t>
+        <w:t>Diseño del nuevo flujo de trabajo estandarizado para la gestión de solicitudes, con definición de etapas, responsables, tiempos máximos de respuesta y puntos de control por fase.</w:t>
       </w:r>
     </w:p>
     <w:p>
@@ -6866,7 +7093,7 @@
           <w:rFonts w:ascii="Times New Roman" w:hAnsi="Times New Roman"/>
           <w:sz w:val="24"/>
         </w:rPr>
-        <w:t>Aquí va la actividad operativa de la semana 8. [Completar con la tarea realizada en la empresa.]</w:t>
+        <w:t>Apoyo en la generación de reportes de incidencias y solicitudes del período para la supervisión administrativa, y colaboración en la atención de requerimientos de suscriptores activos.</w:t>
       </w:r>
     </w:p>
     <w:p>
@@ -6895,7 +7122,7 @@
           <w:rFonts w:ascii="Times New Roman" w:hAnsi="Times New Roman"/>
           <w:sz w:val="24"/>
         </w:rPr>
-        <w:t>Aquí va la actividad de investigación de la semana 8. [Completar con la tarea académica realizada.]</w:t>
+        <w:t>Diseño de los formatos estandarizados de registro de solicitudes de afiliación y de incidencias, y elaboración del procedimiento escrito para la gestión unificada de casos en el departamento.</w:t>
       </w:r>
     </w:p>
     <w:p>
@@ -6938,7 +7165,7 @@
           <w:rFonts w:ascii="Times New Roman" w:hAnsi="Times New Roman"/>
           <w:sz w:val="24"/>
         </w:rPr>
-        <w:t>Aquí va la actividad operativa de la semana 9. [Completar con la tarea realizada en la empresa.]</w:t>
+        <w:t>Participación en las actividades regulares del departamento y apoyo en el cierre administrativo del ciclo de atención al suscriptor correspondiente al período de pasantías.</w:t>
       </w:r>
     </w:p>
     <w:p>
@@ -6967,7 +7194,7 @@
           <w:rFonts w:ascii="Times New Roman" w:hAnsi="Times New Roman"/>
           <w:sz w:val="24"/>
         </w:rPr>
-        <w:t>Aquí va la actividad de investigación de la semana 9. [Completar con la tarea académica realizada.]</w:t>
+        <w:t>Redacción y validación de la propuesta de mejora al control administrativo de solicitudes de servicio, incorporando las observaciones del tutor industrial y ajustando los procedimientos al contexto operativo de IDETEL.</w:t>
       </w:r>
     </w:p>
     <w:p>
@@ -7010,7 +7237,7 @@
           <w:rFonts w:ascii="Times New Roman" w:hAnsi="Times New Roman"/>
           <w:sz w:val="24"/>
         </w:rPr>
-        <w:t>Aquí va la actividad operativa de la semana 10. [Completar con la tarea realizada en la empresa.]</w:t>
+        <w:t>Presentación formal de la propuesta de mejora ante la supervisión del Departamento de Administración y firma de la carta de aprobación del tutor industrial.</w:t>
       </w:r>
     </w:p>
     <w:p>
@@ -7039,7 +7266,7 @@
           <w:rFonts w:ascii="Times New Roman" w:hAnsi="Times New Roman"/>
           <w:sz w:val="24"/>
         </w:rPr>
-        <w:t>Aquí va la actividad de investigación de la semana 10. [Completar con la tarea académica realizada.]</w:t>
+        <w:t>Consolidación y revisión final del informe académico de pasantías, incorporación de los anexos definitivos y preparación del documento para la entrega institucional al IUTECP.</w:t>
       </w:r>
     </w:p>
     <w:p>
@@ -7131,7 +7358,7 @@
           <w:rFonts w:ascii="Times New Roman" w:hAnsi="Times New Roman"/>
           <w:sz w:val="24"/>
         </w:rPr>
-        <w:t>Aquí va la conclusión correspondiente al primer objetivo específico. [Completar con el logro alcanzado.]</w:t>
+        <w:t>Se describió el proceso administrativo actual de gestión de solicitudes de IDETEL, identificando un flujo de cuatro etapas (recepción, asignación, ejecución y cierre) que opera sin procedimientos escritos formales, dependiendo de canales informales de comunicación entre las áreas comercial, administrativa y técnica.</w:t>
       </w:r>
     </w:p>
     <w:p>
@@ -7152,7 +7379,7 @@
           <w:rFonts w:ascii="Times New Roman" w:hAnsi="Times New Roman"/>
           <w:sz w:val="24"/>
         </w:rPr>
-        <w:t>Aquí va la conclusión correspondiente al segundo objetivo específico. [Completar con el logro alcanzado.]</w:t>
+        <w:t>Se identificaron como principales deficiencias del control administrativo la ausencia de un sistema unificado de seguimiento de casos, la falta de formatos estandarizados de registro, la inexistencia de tiempos de respuesta definidos por etapa y la carencia de indicadores de gestión que permitan evaluar el desempeño del proceso.</w:t>
       </w:r>
     </w:p>
     <w:p>
@@ -7173,7 +7400,7 @@
           <w:rFonts w:ascii="Times New Roman" w:hAnsi="Times New Roman"/>
           <w:sz w:val="24"/>
         </w:rPr>
-        <w:t>Aquí va la conclusión correspondiente al tercer objetivo específico. [Completar con el logro alcanzado.]</w:t>
+        <w:t>Se determinó que las debilidades detectadas en el control administrativo generan impactos directos sobre la calidad del servicio percibida por los suscriptores, manifestados en tiempos de atención prolongados, falta de trazabilidad en el estatus de los casos y dificultades en la coordinación interdepartamental que derivan en reprocesos y quejas reiteradas.</w:t>
       </w:r>
     </w:p>
     <w:p>
@@ -7194,7 +7421,7 @@
           <w:rFonts w:ascii="Times New Roman" w:hAnsi="Times New Roman"/>
           <w:sz w:val="24"/>
         </w:rPr>
-        <w:t>Aquí va la conclusión correspondiente al cuarto objetivo específico. [Completar con el logro alcanzado.]</w:t>
+        <w:t>Se formuló una propuesta de mejora al control administrativo que contempla un nuevo flujo de trabajo estandarizado con etapas y responsables definidos, formatos unificados de registro de solicitudes e incidencias, y un conjunto de indicadores de gestión para el monitoreo continuo del proceso de atención al suscriptor.</w:t>
       </w:r>
     </w:p>
     <w:p>
@@ -7231,7 +7458,7 @@
           <w:rFonts w:ascii="Times New Roman" w:hAnsi="Times New Roman"/>
           <w:sz w:val="24"/>
         </w:rPr>
-        <w:t>Aquí va la primera recomendación. [Completar con la acción sugerida.]</w:t>
+        <w:t>Implementar el nuevo flujo de trabajo estandarizado propuesto, comenzando por la formalización del canal de recepción de solicitudes y la adopción de los formatos unificados de registro de afiliaciones e incidencias en todos los departamentos involucrados.</w:t>
       </w:r>
     </w:p>
     <w:p>
@@ -7252,7 +7479,7 @@
           <w:rFonts w:ascii="Times New Roman" w:hAnsi="Times New Roman"/>
           <w:sz w:val="24"/>
         </w:rPr>
-        <w:t>Aquí va la segunda recomendación. [Completar con la acción sugerida.]</w:t>
+        <w:t>Socializar el manual de procedimientos de gestión de solicitudes con el personal de las áreas administrativa, comercial y técnica, garantizando que cada actor conozca su rol, sus responsabilidades y los tiempos máximos de respuesta establecidos para cada fase del proceso.</w:t>
       </w:r>
     </w:p>
     <w:p>
@@ -7273,7 +7500,7 @@
           <w:rFonts w:ascii="Times New Roman" w:hAnsi="Times New Roman"/>
           <w:sz w:val="24"/>
         </w:rPr>
-        <w:t>Aquí va la tercera recomendación. [Completar con la acción sugerida.]</w:t>
+        <w:t>Establecer indicadores de gestión para el proceso de atención al suscriptor, tales como el tiempo promedio de resolución de incidencias, el porcentaje de solicitudes cerradas dentro del plazo y el índice de reincidencias por caso, con seguimiento mensual por parte de la supervisión.</w:t>
       </w:r>
     </w:p>
     <w:p>
@@ -7294,7 +7521,7 @@
           <w:rFonts w:ascii="Times New Roman" w:hAnsi="Times New Roman"/>
           <w:sz w:val="24"/>
         </w:rPr>
-        <w:t>Aquí va la cuarta recomendación. [Completar con la acción sugerida.]</w:t>
+        <w:t>Evaluar la incorporación de una plataforma de gestión de tickets de código abierto que centralice el registro y seguimiento de solicitudes en tiempo real, eliminando la dependencia de canales informales de comunicación y dotando a la organización de trazabilidad completa sobre el ciclo de vida de cada caso.</w:t>
       </w:r>
     </w:p>
     <w:p>
@@ -7354,7 +7581,7 @@
           <w:rFonts w:ascii="Times New Roman" w:hAnsi="Times New Roman"/>
           <w:sz w:val="24"/>
         </w:rPr>
-        <w:t>Aquí va la primera referencia bibliográfica en formato APA. [Completar con autor, año, título, editorial y ciudad.]</w:t>
+        <w:t>Arias, F. (2012). El proyecto de investigación: Introducción a la metodología científica (6ta ed.). Episteme, Venezuela.</w:t>
       </w:r>
     </w:p>
     <w:p>
@@ -7368,7 +7595,7 @@
           <w:rFonts w:ascii="Times New Roman" w:hAnsi="Times New Roman"/>
           <w:sz w:val="24"/>
         </w:rPr>
-        <w:t>Aquí va la segunda referencia bibliográfica en formato APA. [Completar con autor, año, título, editorial y ciudad.]</w:t>
+        <w:t>Chiavenato, I. (2006). Introducción a la teoría general de la administración (7ma ed.). McGraw-Hill, México.</w:t>
       </w:r>
     </w:p>
     <w:p>
@@ -7382,7 +7609,77 @@
           <w:rFonts w:ascii="Times New Roman" w:hAnsi="Times New Roman"/>
           <w:sz w:val="24"/>
         </w:rPr>
-        <w:t>Aquí va la tercera referencia bibliográfica en formato APA. [Completar con autor, año, título, editorial y ciudad.]</w:t>
+        <w:t>Harrington, H. J. (1993). Mejoramiento de los procesos de la empresa. McGraw-Hill, Colombia.</w:t>
+      </w:r>
+    </w:p>
+    <w:p>
+      <w:pPr>
+        <w:spacing w:line="240" w:lineRule="auto" w:after="480" w:before="0"/>
+        <w:ind w:left="425" w:hanging="425"/>
+        <w:jc w:val="both"/>
+      </w:pPr>
+      <w:r>
+        <w:rPr>
+          <w:rFonts w:ascii="Times New Roman" w:hAnsi="Times New Roman"/>
+          <w:sz w:val="24"/>
+        </w:rPr>
+        <w:t>Laudon, K., y Laudon, J. (2016). Sistemas de información gerencial (14va ed.). Pearson Educación, México.</w:t>
+      </w:r>
+    </w:p>
+    <w:p>
+      <w:pPr>
+        <w:spacing w:line="240" w:lineRule="auto" w:after="480" w:before="0"/>
+        <w:ind w:left="425" w:hanging="425"/>
+        <w:jc w:val="both"/>
+      </w:pPr>
+      <w:r>
+        <w:rPr>
+          <w:rFonts w:ascii="Times New Roman" w:hAnsi="Times New Roman"/>
+          <w:sz w:val="24"/>
+        </w:rPr>
+        <w:t>Parasuraman, A., Zeithaml, V., y Berry, L. (1988). SERVQUAL: A multiple-item scale for measuring consumer perceptions of service quality. Journal of Retailing, 64(1), 12-40.</w:t>
+      </w:r>
+    </w:p>
+    <w:p>
+      <w:pPr>
+        <w:spacing w:line="240" w:lineRule="auto" w:after="480" w:before="0"/>
+        <w:ind w:left="425" w:hanging="425"/>
+        <w:jc w:val="both"/>
+      </w:pPr>
+      <w:r>
+        <w:rPr>
+          <w:rFonts w:ascii="Times New Roman" w:hAnsi="Times New Roman"/>
+          <w:sz w:val="24"/>
+        </w:rPr>
+        <w:t>Robbins, S., y Coulter, M. (2010). Administración (10ma ed.). Pearson Educación, México.</w:t>
+      </w:r>
+    </w:p>
+    <w:p>
+      <w:pPr>
+        <w:spacing w:line="240" w:lineRule="auto" w:after="480" w:before="0"/>
+        <w:ind w:left="425" w:hanging="425"/>
+        <w:jc w:val="both"/>
+      </w:pPr>
+      <w:r>
+        <w:rPr>
+          <w:rFonts w:ascii="Times New Roman" w:hAnsi="Times New Roman"/>
+          <w:sz w:val="24"/>
+        </w:rPr>
+        <w:t>Universidad Pedagógica Experimental Libertador. (2016). Manual de trabajos de grado de especialización y maestría y tesis doctorales (5ta ed.). FEDUPEL, Venezuela.</w:t>
+      </w:r>
+    </w:p>
+    <w:p>
+      <w:pPr>
+        <w:spacing w:line="240" w:lineRule="auto" w:after="480" w:before="0"/>
+        <w:ind w:left="425" w:hanging="425"/>
+        <w:jc w:val="both"/>
+      </w:pPr>
+      <w:r>
+        <w:rPr>
+          <w:rFonts w:ascii="Times New Roman" w:hAnsi="Times New Roman"/>
+          <w:sz w:val="24"/>
+        </w:rPr>
+        <w:t>Zeithaml, V., Parasuraman, A., y Berry, L. (1993). Calidad total en la gestión de servicios. Díaz de Santos, España.</w:t>
       </w:r>
     </w:p>
     <w:p>

</xml_diff>

<commit_message>
Posiciones distintas en contraportada (35/58/82) para evitar desborde de fecha
</commit_message>
<xml_diff>
--- a/amaal/reportes/Informe_Pasantia_IUTECP.docx
+++ b/amaal/reportes/Informe_Pasantia_IUTECP.docx
@@ -165,7 +165,7 @@
     </w:p>
     <w:p>
       <w:pPr>
-        <w:spacing w:line="276" w:lineRule="auto" w:before="3844" w:after="0"/>
+        <w:spacing w:line="276" w:lineRule="auto" w:before="2973" w:after="0"/>
         <w:jc w:val="center"/>
       </w:pPr>
       <w:r>
@@ -179,7 +179,7 @@
     </w:p>
     <w:p>
       <w:pPr>
-        <w:spacing w:line="276" w:lineRule="auto" w:before="2281" w:after="0"/>
+        <w:spacing w:line="276" w:lineRule="auto" w:before="2033" w:after="0"/>
         <w:jc w:val="right"/>
       </w:pPr>
       <w:r>
@@ -254,7 +254,7 @@
     </w:p>
     <w:p>
       <w:pPr>
-        <w:spacing w:line="276" w:lineRule="auto" w:before="653" w:after="0"/>
+        <w:spacing w:line="276" w:lineRule="auto" w:before="777" w:after="0"/>
         <w:jc w:val="center"/>
       </w:pPr>
       <w:r>

</xml_diff>

<commit_message>
Portada: logo IUTECP; Contraportada: autor izq tutores der; Preliminares: nuevo orden (Agradec, Dedic, Indice, Listas, Resumen, Intro)
</commit_message>
<xml_diff>
--- a/amaal/reportes/Informe_Pasantia_IUTECP.docx
+++ b/amaal/reportes/Informe_Pasantia_IUTECP.docx
@@ -40,7 +40,7 @@
           <w:b/>
           <w:sz w:val="24"/>
         </w:rPr>
-        <w:t>"ELÍAS CALIXTO POMPA" (IUTECP)</w:t>
+        <w:t>"ELÍAS CALIXTO POMPA"</w:t>
         <w:br/>
       </w:r>
       <w:r>
@@ -54,7 +54,47 @@
     </w:p>
     <w:p>
       <w:pPr>
-        <w:spacing w:line="276" w:lineRule="auto" w:before="3844" w:after="0"/>
+        <w:spacing w:before="120" w:after="120"/>
+        <w:jc w:val="center"/>
+      </w:pPr>
+      <w:r>
+        <w:drawing>
+          <wp:inline xmlns:a="http://schemas.openxmlformats.org/drawingml/2006/main" xmlns:pic="http://schemas.openxmlformats.org/drawingml/2006/picture">
+            <wp:extent cx="1620000" cy="1440000"/>
+            <wp:docPr id="1" name="Picture 1"/>
+            <wp:cNvGraphicFramePr>
+              <a:graphicFrameLocks noChangeAspect="1"/>
+            </wp:cNvGraphicFramePr>
+            <a:graphic>
+              <a:graphicData uri="http://schemas.openxmlformats.org/drawingml/2006/picture">
+                <pic:pic>
+                  <pic:nvPicPr>
+                    <pic:cNvPr id="0" name="iutecp.png"/>
+                    <pic:cNvPicPr/>
+                  </pic:nvPicPr>
+                  <pic:blipFill>
+                    <a:blip r:embed="rId9"/>
+                    <a:stretch>
+                      <a:fillRect/>
+                    </a:stretch>
+                  </pic:blipFill>
+                  <pic:spPr>
+                    <a:xfrm>
+                      <a:off x="0" y="0"/>
+                      <a:ext cx="1620000" cy="1440000"/>
+                    </a:xfrm>
+                    <a:prstGeom prst="rect"/>
+                  </pic:spPr>
+                </pic:pic>
+              </a:graphicData>
+            </a:graphic>
+          </wp:inline>
+        </w:drawing>
+      </w:r>
+    </w:p>
+    <w:p>
+      <w:pPr>
+        <w:spacing w:line="276" w:lineRule="auto" w:before="1344" w:after="0"/>
         <w:jc w:val="center"/>
       </w:pPr>
       <w:r>
@@ -105,7 +145,7 @@
     <w:p>
       <w:pPr>
         <w:sectPr>
-          <w:footerReference w:type="default" r:id="rId12"/>
+          <w:footerReference w:type="default" r:id="rId13"/>
           <w:pgSz w:w="12240" w:h="15840"/>
           <w:pgMar w:top="1701" w:right="1701" w:bottom="1701" w:left="2268" w:header="720" w:footer="720" w:gutter="0"/>
           <w:cols w:space="720"/>
@@ -151,7 +191,7 @@
           <w:b/>
           <w:sz w:val="24"/>
         </w:rPr>
-        <w:t>"ELÍAS CALIXTO POMPA" (IUTECP)</w:t>
+        <w:t>"ELÍAS CALIXTO POMPA"</w:t>
         <w:br/>
       </w:r>
       <w:r>
@@ -179,8 +219,8 @@
     </w:p>
     <w:p>
       <w:pPr>
-        <w:spacing w:line="276" w:lineRule="auto" w:before="2033" w:after="0"/>
-        <w:jc w:val="right"/>
+        <w:spacing w:line="276" w:lineRule="auto" w:before="2033" w:after="160"/>
+        <w:jc w:val="left"/>
       </w:pPr>
       <w:r>
         <w:rPr>
@@ -198,14 +238,20 @@
           <w:sz w:val="24"/>
         </w:rPr>
         <w:t>C.I.: 31.985.792</w:t>
-        <w:br/>
-      </w:r>
+      </w:r>
+    </w:p>
+    <w:p>
+      <w:pPr>
+        <w:spacing w:line="276" w:lineRule="auto" w:before="0" w:after="0"/>
+        <w:jc w:val="right"/>
+      </w:pPr>
       <w:r>
         <w:rPr>
           <w:rFonts w:ascii="Times New Roman" w:hAnsi="Times New Roman"/>
           <w:b/>
           <w:sz w:val="24"/>
         </w:rPr>
+        <w:t>Tutor Industrial: Lenny Mata</w:t>
         <w:br/>
       </w:r>
       <w:r>
@@ -214,7 +260,7 @@
           <w:b/>
           <w:sz w:val="24"/>
         </w:rPr>
-        <w:t>Tutor Industrial: [Nombre del Tutor Industrial]</w:t>
+        <w:t>C.I.: 8969750</w:t>
         <w:br/>
       </w:r>
       <w:r>
@@ -223,7 +269,6 @@
           <w:b/>
           <w:sz w:val="24"/>
         </w:rPr>
-        <w:t>C.I.: [Cédula del Tutor Industrial]</w:t>
         <w:br/>
       </w:r>
       <w:r>
@@ -232,6 +277,7 @@
           <w:b/>
           <w:sz w:val="24"/>
         </w:rPr>
+        <w:t>Tutor Académico: Lic. Carlos Mendoza</w:t>
         <w:br/>
       </w:r>
       <w:r>
@@ -240,15 +286,6 @@
           <w:b/>
           <w:sz w:val="24"/>
         </w:rPr>
-        <w:t>Tutor Académico: Lic. Carlos Mendoza</w:t>
-        <w:br/>
-      </w:r>
-      <w:r>
-        <w:rPr>
-          <w:rFonts w:ascii="Times New Roman" w:hAnsi="Times New Roman"/>
-          <w:b/>
-          <w:sz w:val="24"/>
-        </w:rPr>
         <w:t>C.I.: 4.273.815</w:t>
       </w:r>
     </w:p>
@@ -268,7 +305,7 @@
     <w:p>
       <w:pPr>
         <w:sectPr>
-          <w:footerReference w:type="default" r:id="rId13"/>
+          <w:footerReference w:type="default" r:id="rId14"/>
           <w:pgSz w:w="12240" w:h="15840"/>
           <w:pgMar w:top="1701" w:right="1701" w:bottom="1701" w:left="2268" w:header="720" w:footer="720" w:gutter="0"/>
           <w:cols w:space="720"/>
@@ -278,7 +315,7 @@
       </w:pPr>
     </w:p>
     <w:p>
-      <w:bookmarkStart w:id="bm_dedicatoria" w:name="bm_dedicatoria"/>
+      <w:bookmarkStart w:id="bm_agradecimientos" w:name="bm_agradecimientos"/>
       <w:pPr>
         <w:spacing w:after="480"/>
         <w:jc w:val="center"/>
@@ -289,14 +326,14 @@
           <w:b/>
           <w:sz w:val="24"/>
         </w:rPr>
-        <w:t>DEDICATORIA</w:t>
-      </w:r>
-      <w:bookmarkEnd w:id="bm_dedicatoria"/>
+        <w:t>AGRADECIMIENTOS</w:t>
+      </w:r>
+      <w:bookmarkEnd w:id="bm_agradecimientos"/>
     </w:p>
     <w:p>
       <w:pPr>
         <w:sectPr>
-          <w:footerReference w:type="default" r:id="rId14"/>
+          <w:footerReference w:type="default" r:id="rId15"/>
           <w:pgSz w:w="12240" w:h="15840"/>
           <w:pgMar w:top="2835" w:right="1701" w:bottom="1701" w:left="2268" w:header="720" w:footer="720" w:gutter="0"/>
           <w:cols w:space="720"/>
@@ -317,13 +354,13 @@
           <w:i w:val="0"/>
           <w:sz w:val="24"/>
         </w:rPr>
-        <w:t>Aquí va la dedicatoria.</w:t>
+        <w:t>Aquí van los agradecimientos.</w:t>
       </w:r>
     </w:p>
     <w:p>
       <w:pPr>
         <w:sectPr>
-          <w:footerReference w:type="default" r:id="rId15"/>
+          <w:footerReference w:type="default" r:id="rId16"/>
           <w:type w:val="continuous"/>
           <w:pgSz w:w="12240" w:h="15840"/>
           <w:pgMar w:top="1701" w:right="1701" w:bottom="1701" w:left="2268" w:header="720" w:footer="720" w:gutter="0"/>
@@ -334,7 +371,7 @@
       </w:pPr>
     </w:p>
     <w:p>
-      <w:bookmarkStart w:id="bm_agradecimientos" w:name="bm_agradecimientos"/>
+      <w:bookmarkStart w:id="bm_dedicatoria" w:name="bm_dedicatoria"/>
       <w:pPr>
         <w:spacing w:after="480"/>
         <w:jc w:val="center"/>
@@ -345,14 +382,14 @@
           <w:b/>
           <w:sz w:val="24"/>
         </w:rPr>
-        <w:t>AGRADECIMIENTOS</w:t>
-      </w:r>
-      <w:bookmarkEnd w:id="bm_agradecimientos"/>
+        <w:t>DEDICATORIA</w:t>
+      </w:r>
+      <w:bookmarkEnd w:id="bm_dedicatoria"/>
     </w:p>
     <w:p>
       <w:pPr>
         <w:sectPr>
-          <w:footerReference w:type="default" r:id="rId16"/>
+          <w:footerReference w:type="default" r:id="rId17"/>
           <w:pgSz w:w="12240" w:h="15840"/>
           <w:pgMar w:top="2835" w:right="1701" w:bottom="1701" w:left="2268" w:header="720" w:footer="720" w:gutter="0"/>
           <w:cols w:space="720"/>
@@ -373,13 +410,13 @@
           <w:i w:val="0"/>
           <w:sz w:val="24"/>
         </w:rPr>
-        <w:t>Aquí van los agradecimientos.</w:t>
+        <w:t>Aquí va la dedicatoria.</w:t>
       </w:r>
     </w:p>
     <w:p>
       <w:pPr>
         <w:sectPr>
-          <w:footerReference w:type="default" r:id="rId17"/>
+          <w:footerReference w:type="default" r:id="rId18"/>
           <w:type w:val="continuous"/>
           <w:pgSz w:w="12240" w:h="15840"/>
           <w:pgMar w:top="1701" w:right="1701" w:bottom="1701" w:left="2268" w:header="720" w:footer="720" w:gutter="0"/>
@@ -390,7 +427,6 @@
       </w:pPr>
     </w:p>
     <w:p>
-      <w:bookmarkStart w:id="bm_resumen" w:name="bm_resumen"/>
       <w:pPr>
         <w:spacing w:after="480"/>
         <w:jc w:val="center"/>
@@ -401,14 +437,13 @@
           <w:b/>
           <w:sz w:val="24"/>
         </w:rPr>
-        <w:t>RESUMEN</w:t>
-      </w:r>
-      <w:bookmarkEnd w:id="bm_resumen"/>
+        <w:t>ÍNDICE DE CONTENIDO</w:t>
+      </w:r>
     </w:p>
     <w:p>
       <w:pPr>
         <w:sectPr>
-          <w:footerReference w:type="default" r:id="rId18"/>
+          <w:footerReference w:type="default" r:id="rId19"/>
           <w:pgSz w:w="12240" w:h="15840"/>
           <w:pgMar w:top="2835" w:right="1701" w:bottom="1701" w:left="2268" w:header="720" w:footer="720" w:gutter="0"/>
           <w:cols w:space="720"/>
@@ -419,38 +454,993 @@
     </w:p>
     <w:p>
       <w:pPr>
-        <w:spacing w:line="360" w:lineRule="auto" w:after="0" w:before="0"/>
-        <w:ind w:firstLine="709"/>
-        <w:jc w:val="both"/>
-      </w:pPr>
-      <w:r>
-        <w:rPr>
-          <w:rFonts w:ascii="Times New Roman" w:hAnsi="Times New Roman"/>
-          <w:i w:val="0"/>
+        <w:spacing w:after="240"/>
+        <w:jc w:val="right"/>
+      </w:pPr>
+      <w:r>
+        <w:rPr>
+          <w:rFonts w:ascii="Times New Roman" w:hAnsi="Times New Roman"/>
+          <w:b/>
           <w:sz w:val="24"/>
         </w:rPr>
-        <w:t>El presente informe describe la evaluación del control administrativo aplicado a la gestión de solicitudes de servicios de telecomunicaciones en la empresa Ingeniería de Telecomunicaciones, C.A. (IDETEL). La investigación se enmarca en la modalidad de proyecto factible apoyado en un diagnóstico de campo. Durante el estudio se identificó la ausencia de procedimientos formalizados para el seguimiento de solicitudes de afiliación e incidencias, la falta de formatos estandarizados de registro y la inexistencia de indicadores de gestión que permitan evaluar el desempeño del proceso de atención al suscriptor. La propuesta contempla un nuevo flujo de trabajo estandarizado, formatos unificados de control y un conjunto de indicadores de gestión orientados a fortalecer el control administrativo y optimizar la calidad del servicio prestado.</w:t>
-      </w:r>
-    </w:p>
-    <w:p/>
-    <w:p>
-      <w:pPr>
-        <w:ind w:firstLine="709"/>
-      </w:pPr>
-      <w:r>
-        <w:rPr>
-          <w:b/>
-        </w:rPr>
-        <w:t xml:space="preserve">Palabras claves: </w:t>
-      </w:r>
-      <w:r>
-        <w:t>control administrativo, solicitudes de servicios, telecomunicaciones, proyecto factible, pasantías.</w:t>
+        <w:t>pp.</w:t>
       </w:r>
     </w:p>
     <w:p>
       <w:pPr>
+        <w:tabs>
+          <w:tab w:pos="8271" w:val="right" w:leader="dot"/>
+        </w:tabs>
+        <w:spacing w:line="360" w:lineRule="auto" w:before="0" w:after="80"/>
+        <w:ind w:left="0"/>
+      </w:pPr>
+      <w:r>
+        <w:rPr>
+          <w:rFonts w:ascii="Times New Roman" w:hAnsi="Times New Roman"/>
+          <w:b w:val="0"/>
+          <w:sz w:val="24"/>
+        </w:rPr>
+        <w:t>AGRADECIMIENTOS</w:t>
+        <w:tab/>
+      </w:r>
+      <w:r>
+        <w:rPr>
+          <w:rFonts w:ascii="Times New Roman" w:hAnsi="Times New Roman"/>
+          <w:b w:val="0"/>
+          <w:sz w:val="24"/>
+        </w:rPr>
+        <w:fldChar w:fldCharType="begin"/>
+        <w:instrText xml:space="preserve"> PAGEREF bm_agradecimientos \h </w:instrText>
+        <w:fldChar w:fldCharType="separate"/>
+        <w:t>?</w:t>
+        <w:fldChar w:fldCharType="end"/>
+      </w:r>
+    </w:p>
+    <w:p>
+      <w:pPr>
+        <w:tabs>
+          <w:tab w:pos="8271" w:val="right" w:leader="dot"/>
+        </w:tabs>
+        <w:spacing w:line="360" w:lineRule="auto" w:before="0" w:after="80"/>
+        <w:ind w:left="0"/>
+      </w:pPr>
+      <w:r>
+        <w:rPr>
+          <w:rFonts w:ascii="Times New Roman" w:hAnsi="Times New Roman"/>
+          <w:b w:val="0"/>
+          <w:sz w:val="24"/>
+        </w:rPr>
+        <w:t>DEDICATORIA</w:t>
+        <w:tab/>
+      </w:r>
+      <w:r>
+        <w:rPr>
+          <w:rFonts w:ascii="Times New Roman" w:hAnsi="Times New Roman"/>
+          <w:b w:val="0"/>
+          <w:sz w:val="24"/>
+        </w:rPr>
+        <w:fldChar w:fldCharType="begin"/>
+        <w:instrText xml:space="preserve"> PAGEREF bm_dedicatoria \h </w:instrText>
+        <w:fldChar w:fldCharType="separate"/>
+        <w:t>?</w:t>
+        <w:fldChar w:fldCharType="end"/>
+      </w:r>
+    </w:p>
+    <w:p>
+      <w:pPr>
+        <w:tabs>
+          <w:tab w:pos="8271" w:val="right" w:leader="dot"/>
+        </w:tabs>
+        <w:spacing w:line="360" w:lineRule="auto" w:before="0" w:after="80"/>
+        <w:ind w:left="0"/>
+      </w:pPr>
+      <w:r>
+        <w:rPr>
+          <w:rFonts w:ascii="Times New Roman" w:hAnsi="Times New Roman"/>
+          <w:b w:val="0"/>
+          <w:sz w:val="24"/>
+        </w:rPr>
+        <w:t>LISTA DE CUADROS</w:t>
+        <w:tab/>
+      </w:r>
+      <w:r>
+        <w:rPr>
+          <w:rFonts w:ascii="Times New Roman" w:hAnsi="Times New Roman"/>
+          <w:b w:val="0"/>
+          <w:sz w:val="24"/>
+        </w:rPr>
+        <w:fldChar w:fldCharType="begin"/>
+        <w:instrText xml:space="preserve"> PAGEREF bm_lista_cuadros \h </w:instrText>
+        <w:fldChar w:fldCharType="separate"/>
+        <w:t>?</w:t>
+        <w:fldChar w:fldCharType="end"/>
+      </w:r>
+    </w:p>
+    <w:p>
+      <w:pPr>
+        <w:tabs>
+          <w:tab w:pos="8271" w:val="right" w:leader="dot"/>
+        </w:tabs>
+        <w:spacing w:line="360" w:lineRule="auto" w:before="0" w:after="80"/>
+        <w:ind w:left="0"/>
+      </w:pPr>
+      <w:r>
+        <w:rPr>
+          <w:rFonts w:ascii="Times New Roman" w:hAnsi="Times New Roman"/>
+          <w:b w:val="0"/>
+          <w:sz w:val="24"/>
+        </w:rPr>
+        <w:t>LISTA DE GRÁFICOS</w:t>
+        <w:tab/>
+      </w:r>
+      <w:r>
+        <w:rPr>
+          <w:rFonts w:ascii="Times New Roman" w:hAnsi="Times New Roman"/>
+          <w:b w:val="0"/>
+          <w:sz w:val="24"/>
+        </w:rPr>
+        <w:fldChar w:fldCharType="begin"/>
+        <w:instrText xml:space="preserve"> PAGEREF bm_lista_graficos \h </w:instrText>
+        <w:fldChar w:fldCharType="separate"/>
+        <w:t>?</w:t>
+        <w:fldChar w:fldCharType="end"/>
+      </w:r>
+    </w:p>
+    <w:p>
+      <w:pPr>
+        <w:tabs>
+          <w:tab w:pos="8271" w:val="right" w:leader="dot"/>
+        </w:tabs>
+        <w:spacing w:line="360" w:lineRule="auto" w:before="0" w:after="80"/>
+        <w:ind w:left="0"/>
+      </w:pPr>
+      <w:r>
+        <w:rPr>
+          <w:rFonts w:ascii="Times New Roman" w:hAnsi="Times New Roman"/>
+          <w:b w:val="0"/>
+          <w:sz w:val="24"/>
+        </w:rPr>
+        <w:t>LISTA DE ANEXOS</w:t>
+        <w:tab/>
+      </w:r>
+      <w:r>
+        <w:rPr>
+          <w:rFonts w:ascii="Times New Roman" w:hAnsi="Times New Roman"/>
+          <w:b w:val="0"/>
+          <w:sz w:val="24"/>
+        </w:rPr>
+        <w:fldChar w:fldCharType="begin"/>
+        <w:instrText xml:space="preserve"> PAGEREF bm_lista_anexos \h </w:instrText>
+        <w:fldChar w:fldCharType="separate"/>
+        <w:t>?</w:t>
+        <w:fldChar w:fldCharType="end"/>
+      </w:r>
+    </w:p>
+    <w:p>
+      <w:pPr>
+        <w:tabs>
+          <w:tab w:pos="8271" w:val="right" w:leader="dot"/>
+        </w:tabs>
+        <w:spacing w:line="360" w:lineRule="auto" w:before="0" w:after="80"/>
+        <w:ind w:left="0"/>
+      </w:pPr>
+      <w:r>
+        <w:rPr>
+          <w:rFonts w:ascii="Times New Roman" w:hAnsi="Times New Roman"/>
+          <w:b w:val="0"/>
+          <w:sz w:val="24"/>
+        </w:rPr>
+        <w:t>RESUMEN</w:t>
+        <w:tab/>
+      </w:r>
+      <w:r>
+        <w:rPr>
+          <w:rFonts w:ascii="Times New Roman" w:hAnsi="Times New Roman"/>
+          <w:b w:val="0"/>
+          <w:sz w:val="24"/>
+        </w:rPr>
+        <w:fldChar w:fldCharType="begin"/>
+        <w:instrText xml:space="preserve"> PAGEREF bm_resumen \h </w:instrText>
+        <w:fldChar w:fldCharType="separate"/>
+        <w:t>?</w:t>
+        <w:fldChar w:fldCharType="end"/>
+      </w:r>
+    </w:p>
+    <w:p>
+      <w:pPr>
+        <w:tabs>
+          <w:tab w:pos="8271" w:val="right" w:leader="dot"/>
+        </w:tabs>
+        <w:spacing w:line="360" w:lineRule="auto" w:before="0" w:after="80"/>
+        <w:ind w:left="0"/>
+      </w:pPr>
+      <w:r>
+        <w:rPr>
+          <w:rFonts w:ascii="Times New Roman" w:hAnsi="Times New Roman"/>
+          <w:b w:val="0"/>
+          <w:sz w:val="24"/>
+        </w:rPr>
+        <w:t>INTRODUCCIÓN</w:t>
+        <w:tab/>
+      </w:r>
+      <w:r>
+        <w:rPr>
+          <w:rFonts w:ascii="Times New Roman" w:hAnsi="Times New Roman"/>
+          <w:b w:val="0"/>
+          <w:sz w:val="24"/>
+        </w:rPr>
+        <w:fldChar w:fldCharType="begin"/>
+        <w:instrText xml:space="preserve"> PAGEREF bm_introduccion \h </w:instrText>
+        <w:fldChar w:fldCharType="separate"/>
+        <w:t>?</w:t>
+        <w:fldChar w:fldCharType="end"/>
+      </w:r>
+    </w:p>
+    <w:p>
+      <w:pPr>
+        <w:spacing w:before="240" w:after="120"/>
+      </w:pPr>
+      <w:r>
+        <w:rPr>
+          <w:b/>
+        </w:rPr>
+        <w:t>CAPÍTULOS</w:t>
+      </w:r>
+    </w:p>
+    <w:p>
+      <w:pPr>
+        <w:tabs>
+          <w:tab w:pos="8271" w:val="right" w:leader="dot"/>
+        </w:tabs>
+        <w:spacing w:line="360" w:lineRule="auto" w:before="0" w:after="80"/>
+        <w:ind w:left="0"/>
+      </w:pPr>
+      <w:r>
+        <w:rPr>
+          <w:rFonts w:ascii="Times New Roman" w:hAnsi="Times New Roman"/>
+          <w:b/>
+          <w:sz w:val="24"/>
+        </w:rPr>
+        <w:t>I REALIDAD ORGANIZACIONAL</w:t>
+        <w:tab/>
+      </w:r>
+      <w:r>
+        <w:rPr>
+          <w:rFonts w:ascii="Times New Roman" w:hAnsi="Times New Roman"/>
+          <w:b/>
+          <w:sz w:val="24"/>
+        </w:rPr>
+        <w:fldChar w:fldCharType="begin"/>
+        <w:instrText xml:space="preserve"> PAGEREF bm_cap1 \h </w:instrText>
+        <w:fldChar w:fldCharType="separate"/>
+        <w:t>?</w:t>
+        <w:fldChar w:fldCharType="end"/>
+      </w:r>
+    </w:p>
+    <w:p>
+      <w:pPr>
+        <w:tabs>
+          <w:tab w:pos="8271" w:val="right" w:leader="dot"/>
+        </w:tabs>
+        <w:spacing w:line="360" w:lineRule="auto" w:before="0" w:after="80"/>
+        <w:ind w:left="283"/>
+      </w:pPr>
+      <w:r>
+        <w:rPr>
+          <w:rFonts w:ascii="Times New Roman" w:hAnsi="Times New Roman"/>
+          <w:b w:val="0"/>
+          <w:sz w:val="24"/>
+        </w:rPr>
+        <w:t>Identificación de la empresa</w:t>
+        <w:tab/>
+      </w:r>
+      <w:r>
+        <w:rPr>
+          <w:rFonts w:ascii="Times New Roman" w:hAnsi="Times New Roman"/>
+          <w:b w:val="0"/>
+          <w:sz w:val="24"/>
+        </w:rPr>
+        <w:fldChar w:fldCharType="begin"/>
+        <w:instrText xml:space="preserve"> PAGEREF bm_cap1_ident \h </w:instrText>
+        <w:fldChar w:fldCharType="separate"/>
+        <w:t>?</w:t>
+        <w:fldChar w:fldCharType="end"/>
+      </w:r>
+    </w:p>
+    <w:p>
+      <w:pPr>
+        <w:tabs>
+          <w:tab w:pos="8271" w:val="right" w:leader="dot"/>
+        </w:tabs>
+        <w:spacing w:line="360" w:lineRule="auto" w:before="0" w:after="80"/>
+        <w:ind w:left="283"/>
+      </w:pPr>
+      <w:r>
+        <w:rPr>
+          <w:rFonts w:ascii="Times New Roman" w:hAnsi="Times New Roman"/>
+          <w:b w:val="0"/>
+          <w:sz w:val="24"/>
+        </w:rPr>
+        <w:t>Reseña histórica</w:t>
+        <w:tab/>
+      </w:r>
+      <w:r>
+        <w:rPr>
+          <w:rFonts w:ascii="Times New Roman" w:hAnsi="Times New Roman"/>
+          <w:b w:val="0"/>
+          <w:sz w:val="24"/>
+        </w:rPr>
+        <w:fldChar w:fldCharType="begin"/>
+        <w:instrText xml:space="preserve"> PAGEREF bm_cap1_resena \h </w:instrText>
+        <w:fldChar w:fldCharType="separate"/>
+        <w:t>?</w:t>
+        <w:fldChar w:fldCharType="end"/>
+      </w:r>
+    </w:p>
+    <w:p>
+      <w:pPr>
+        <w:tabs>
+          <w:tab w:pos="8271" w:val="right" w:leader="dot"/>
+        </w:tabs>
+        <w:spacing w:line="360" w:lineRule="auto" w:before="0" w:after="80"/>
+        <w:ind w:left="283"/>
+      </w:pPr>
+      <w:r>
+        <w:rPr>
+          <w:rFonts w:ascii="Times New Roman" w:hAnsi="Times New Roman"/>
+          <w:b w:val="0"/>
+          <w:sz w:val="24"/>
+        </w:rPr>
+        <w:t>Misión</w:t>
+        <w:tab/>
+      </w:r>
+      <w:r>
+        <w:rPr>
+          <w:rFonts w:ascii="Times New Roman" w:hAnsi="Times New Roman"/>
+          <w:b w:val="0"/>
+          <w:sz w:val="24"/>
+        </w:rPr>
+        <w:fldChar w:fldCharType="begin"/>
+        <w:instrText xml:space="preserve"> PAGEREF bm_cap1_mision \h </w:instrText>
+        <w:fldChar w:fldCharType="separate"/>
+        <w:t>?</w:t>
+        <w:fldChar w:fldCharType="end"/>
+      </w:r>
+    </w:p>
+    <w:p>
+      <w:pPr>
+        <w:tabs>
+          <w:tab w:pos="8271" w:val="right" w:leader="dot"/>
+        </w:tabs>
+        <w:spacing w:line="360" w:lineRule="auto" w:before="0" w:after="80"/>
+        <w:ind w:left="283"/>
+      </w:pPr>
+      <w:r>
+        <w:rPr>
+          <w:rFonts w:ascii="Times New Roman" w:hAnsi="Times New Roman"/>
+          <w:b w:val="0"/>
+          <w:sz w:val="24"/>
+        </w:rPr>
+        <w:t>Visión</w:t>
+        <w:tab/>
+      </w:r>
+      <w:r>
+        <w:rPr>
+          <w:rFonts w:ascii="Times New Roman" w:hAnsi="Times New Roman"/>
+          <w:b w:val="0"/>
+          <w:sz w:val="24"/>
+        </w:rPr>
+        <w:fldChar w:fldCharType="begin"/>
+        <w:instrText xml:space="preserve"> PAGEREF bm_cap1_vision \h </w:instrText>
+        <w:fldChar w:fldCharType="separate"/>
+        <w:t>?</w:t>
+        <w:fldChar w:fldCharType="end"/>
+      </w:r>
+    </w:p>
+    <w:p>
+      <w:pPr>
+        <w:tabs>
+          <w:tab w:pos="8271" w:val="right" w:leader="dot"/>
+        </w:tabs>
+        <w:spacing w:line="360" w:lineRule="auto" w:before="0" w:after="80"/>
+        <w:ind w:left="283"/>
+      </w:pPr>
+      <w:r>
+        <w:rPr>
+          <w:rFonts w:ascii="Times New Roman" w:hAnsi="Times New Roman"/>
+          <w:b w:val="0"/>
+          <w:sz w:val="24"/>
+        </w:rPr>
+        <w:t>Valores</w:t>
+        <w:tab/>
+      </w:r>
+      <w:r>
+        <w:rPr>
+          <w:rFonts w:ascii="Times New Roman" w:hAnsi="Times New Roman"/>
+          <w:b w:val="0"/>
+          <w:sz w:val="24"/>
+        </w:rPr>
+        <w:fldChar w:fldCharType="begin"/>
+        <w:instrText xml:space="preserve"> PAGEREF bm_cap1_valores \h </w:instrText>
+        <w:fldChar w:fldCharType="separate"/>
+        <w:t>?</w:t>
+        <w:fldChar w:fldCharType="end"/>
+      </w:r>
+    </w:p>
+    <w:p>
+      <w:pPr>
+        <w:tabs>
+          <w:tab w:pos="8271" w:val="right" w:leader="dot"/>
+        </w:tabs>
+        <w:spacing w:line="360" w:lineRule="auto" w:before="0" w:after="80"/>
+        <w:ind w:left="283"/>
+      </w:pPr>
+      <w:r>
+        <w:rPr>
+          <w:rFonts w:ascii="Times New Roman" w:hAnsi="Times New Roman"/>
+          <w:b w:val="0"/>
+          <w:sz w:val="24"/>
+        </w:rPr>
+        <w:t>Objetivos Organizacionales</w:t>
+        <w:tab/>
+      </w:r>
+      <w:r>
+        <w:rPr>
+          <w:rFonts w:ascii="Times New Roman" w:hAnsi="Times New Roman"/>
+          <w:b w:val="0"/>
+          <w:sz w:val="24"/>
+        </w:rPr>
+        <w:fldChar w:fldCharType="begin"/>
+        <w:instrText xml:space="preserve"> PAGEREF bm_cap1_obj \h </w:instrText>
+        <w:fldChar w:fldCharType="separate"/>
+        <w:t>?</w:t>
+        <w:fldChar w:fldCharType="end"/>
+      </w:r>
+    </w:p>
+    <w:p>
+      <w:pPr>
+        <w:tabs>
+          <w:tab w:pos="8271" w:val="right" w:leader="dot"/>
+        </w:tabs>
+        <w:spacing w:line="360" w:lineRule="auto" w:before="0" w:after="80"/>
+        <w:ind w:left="283"/>
+      </w:pPr>
+      <w:r>
+        <w:rPr>
+          <w:rFonts w:ascii="Times New Roman" w:hAnsi="Times New Roman"/>
+          <w:b w:val="0"/>
+          <w:sz w:val="24"/>
+        </w:rPr>
+        <w:t>Ubicación geográfica</w:t>
+        <w:tab/>
+      </w:r>
+      <w:r>
+        <w:rPr>
+          <w:rFonts w:ascii="Times New Roman" w:hAnsi="Times New Roman"/>
+          <w:b w:val="0"/>
+          <w:sz w:val="24"/>
+        </w:rPr>
+        <w:fldChar w:fldCharType="begin"/>
+        <w:instrText xml:space="preserve"> PAGEREF bm_cap1_ubic \h </w:instrText>
+        <w:fldChar w:fldCharType="separate"/>
+        <w:t>?</w:t>
+        <w:fldChar w:fldCharType="end"/>
+      </w:r>
+    </w:p>
+    <w:p>
+      <w:pPr>
+        <w:tabs>
+          <w:tab w:pos="8271" w:val="right" w:leader="dot"/>
+        </w:tabs>
+        <w:spacing w:line="360" w:lineRule="auto" w:before="0" w:after="80"/>
+        <w:ind w:left="283"/>
+      </w:pPr>
+      <w:r>
+        <w:rPr>
+          <w:rFonts w:ascii="Times New Roman" w:hAnsi="Times New Roman"/>
+          <w:b w:val="0"/>
+          <w:sz w:val="24"/>
+        </w:rPr>
+        <w:t>Población de los trabajadores de la empresa</w:t>
+        <w:tab/>
+      </w:r>
+      <w:r>
+        <w:rPr>
+          <w:rFonts w:ascii="Times New Roman" w:hAnsi="Times New Roman"/>
+          <w:b w:val="0"/>
+          <w:sz w:val="24"/>
+        </w:rPr>
+        <w:fldChar w:fldCharType="begin"/>
+        <w:instrText xml:space="preserve"> PAGEREF bm_cap1_pobla \h </w:instrText>
+        <w:fldChar w:fldCharType="separate"/>
+        <w:t>?</w:t>
+        <w:fldChar w:fldCharType="end"/>
+      </w:r>
+    </w:p>
+    <w:p>
+      <w:pPr>
+        <w:tabs>
+          <w:tab w:pos="8271" w:val="right" w:leader="dot"/>
+        </w:tabs>
+        <w:spacing w:line="360" w:lineRule="auto" w:before="0" w:after="80"/>
+        <w:ind w:left="283"/>
+      </w:pPr>
+      <w:r>
+        <w:rPr>
+          <w:rFonts w:ascii="Times New Roman" w:hAnsi="Times New Roman"/>
+          <w:b w:val="0"/>
+          <w:sz w:val="24"/>
+        </w:rPr>
+        <w:t>Estructura organizacional de la empresa (organigrama)</w:t>
+        <w:tab/>
+      </w:r>
+      <w:r>
+        <w:rPr>
+          <w:rFonts w:ascii="Times New Roman" w:hAnsi="Times New Roman"/>
+          <w:b w:val="0"/>
+          <w:sz w:val="24"/>
+        </w:rPr>
+        <w:fldChar w:fldCharType="begin"/>
+        <w:instrText xml:space="preserve"> PAGEREF bm_cap1_estruct \h </w:instrText>
+        <w:fldChar w:fldCharType="separate"/>
+        <w:t>?</w:t>
+        <w:fldChar w:fldCharType="end"/>
+      </w:r>
+    </w:p>
+    <w:p>
+      <w:pPr>
+        <w:tabs>
+          <w:tab w:pos="8271" w:val="right" w:leader="dot"/>
+        </w:tabs>
+        <w:spacing w:line="360" w:lineRule="auto" w:before="0" w:after="80"/>
+        <w:ind w:left="0"/>
+      </w:pPr>
+      <w:r>
+        <w:rPr>
+          <w:rFonts w:ascii="Times New Roman" w:hAnsi="Times New Roman"/>
+          <w:b/>
+          <w:sz w:val="24"/>
+        </w:rPr>
+        <w:t>II DIAGNÓSTICO SITUACIONAL</w:t>
+        <w:tab/>
+      </w:r>
+      <w:r>
+        <w:rPr>
+          <w:rFonts w:ascii="Times New Roman" w:hAnsi="Times New Roman"/>
+          <w:b/>
+          <w:sz w:val="24"/>
+        </w:rPr>
+        <w:fldChar w:fldCharType="begin"/>
+        <w:instrText xml:space="preserve"> PAGEREF bm_cap2 \h </w:instrText>
+        <w:fldChar w:fldCharType="separate"/>
+        <w:t>?</w:t>
+        <w:fldChar w:fldCharType="end"/>
+      </w:r>
+    </w:p>
+    <w:p>
+      <w:pPr>
+        <w:tabs>
+          <w:tab w:pos="8271" w:val="right" w:leader="dot"/>
+        </w:tabs>
+        <w:spacing w:line="360" w:lineRule="auto" w:before="0" w:after="80"/>
+        <w:ind w:left="283"/>
+      </w:pPr>
+      <w:r>
+        <w:rPr>
+          <w:rFonts w:ascii="Times New Roman" w:hAnsi="Times New Roman"/>
+          <w:b w:val="0"/>
+          <w:sz w:val="24"/>
+        </w:rPr>
+        <w:t>Identificación de la situación problemática</w:t>
+        <w:tab/>
+      </w:r>
+      <w:r>
+        <w:rPr>
+          <w:rFonts w:ascii="Times New Roman" w:hAnsi="Times New Roman"/>
+          <w:b w:val="0"/>
+          <w:sz w:val="24"/>
+        </w:rPr>
+        <w:fldChar w:fldCharType="begin"/>
+        <w:instrText xml:space="preserve"> PAGEREF bm_cap2_sit \h </w:instrText>
+        <w:fldChar w:fldCharType="separate"/>
+        <w:t>?</w:t>
+        <w:fldChar w:fldCharType="end"/>
+      </w:r>
+    </w:p>
+    <w:p>
+      <w:pPr>
+        <w:tabs>
+          <w:tab w:pos="8271" w:val="right" w:leader="dot"/>
+        </w:tabs>
+        <w:spacing w:line="360" w:lineRule="auto" w:before="0" w:after="80"/>
+        <w:ind w:left="283"/>
+      </w:pPr>
+      <w:r>
+        <w:rPr>
+          <w:rFonts w:ascii="Times New Roman" w:hAnsi="Times New Roman"/>
+          <w:b w:val="0"/>
+          <w:sz w:val="24"/>
+        </w:rPr>
+        <w:t>Objetivo General</w:t>
+        <w:tab/>
+      </w:r>
+      <w:r>
+        <w:rPr>
+          <w:rFonts w:ascii="Times New Roman" w:hAnsi="Times New Roman"/>
+          <w:b w:val="0"/>
+          <w:sz w:val="24"/>
+        </w:rPr>
+        <w:fldChar w:fldCharType="begin"/>
+        <w:instrText xml:space="preserve"> PAGEREF bm_cap2_objg \h </w:instrText>
+        <w:fldChar w:fldCharType="separate"/>
+        <w:t>?</w:t>
+        <w:fldChar w:fldCharType="end"/>
+      </w:r>
+    </w:p>
+    <w:p>
+      <w:pPr>
+        <w:tabs>
+          <w:tab w:pos="8271" w:val="right" w:leader="dot"/>
+        </w:tabs>
+        <w:spacing w:line="360" w:lineRule="auto" w:before="0" w:after="80"/>
+        <w:ind w:left="283"/>
+      </w:pPr>
+      <w:r>
+        <w:rPr>
+          <w:rFonts w:ascii="Times New Roman" w:hAnsi="Times New Roman"/>
+          <w:b w:val="0"/>
+          <w:sz w:val="24"/>
+        </w:rPr>
+        <w:t>Objetivos Específicos</w:t>
+        <w:tab/>
+      </w:r>
+      <w:r>
+        <w:rPr>
+          <w:rFonts w:ascii="Times New Roman" w:hAnsi="Times New Roman"/>
+          <w:b w:val="0"/>
+          <w:sz w:val="24"/>
+        </w:rPr>
+        <w:fldChar w:fldCharType="begin"/>
+        <w:instrText xml:space="preserve"> PAGEREF bm_cap2_obje \h </w:instrText>
+        <w:fldChar w:fldCharType="separate"/>
+        <w:t>?</w:t>
+        <w:fldChar w:fldCharType="end"/>
+      </w:r>
+    </w:p>
+    <w:p>
+      <w:pPr>
+        <w:tabs>
+          <w:tab w:pos="8271" w:val="right" w:leader="dot"/>
+        </w:tabs>
+        <w:spacing w:line="360" w:lineRule="auto" w:before="0" w:after="80"/>
+        <w:ind w:left="283"/>
+      </w:pPr>
+      <w:r>
+        <w:rPr>
+          <w:rFonts w:ascii="Times New Roman" w:hAnsi="Times New Roman"/>
+          <w:b w:val="0"/>
+          <w:sz w:val="24"/>
+        </w:rPr>
+        <w:t>Planificación integral de objetivos</w:t>
+        <w:tab/>
+      </w:r>
+      <w:r>
+        <w:rPr>
+          <w:rFonts w:ascii="Times New Roman" w:hAnsi="Times New Roman"/>
+          <w:b w:val="0"/>
+          <w:sz w:val="24"/>
+        </w:rPr>
+        <w:fldChar w:fldCharType="begin"/>
+        <w:instrText xml:space="preserve"> PAGEREF bm_cap2_planif \h </w:instrText>
+        <w:fldChar w:fldCharType="separate"/>
+        <w:t>?</w:t>
+        <w:fldChar w:fldCharType="end"/>
+      </w:r>
+    </w:p>
+    <w:p>
+      <w:pPr>
+        <w:tabs>
+          <w:tab w:pos="8271" w:val="right" w:leader="dot"/>
+        </w:tabs>
+        <w:spacing w:line="360" w:lineRule="auto" w:before="0" w:after="80"/>
+        <w:ind w:left="283"/>
+      </w:pPr>
+      <w:r>
+        <w:rPr>
+          <w:rFonts w:ascii="Times New Roman" w:hAnsi="Times New Roman"/>
+          <w:b w:val="0"/>
+          <w:sz w:val="24"/>
+        </w:rPr>
+        <w:t>Cronograma de actividades</w:t>
+        <w:tab/>
+      </w:r>
+      <w:r>
+        <w:rPr>
+          <w:rFonts w:ascii="Times New Roman" w:hAnsi="Times New Roman"/>
+          <w:b w:val="0"/>
+          <w:sz w:val="24"/>
+        </w:rPr>
+        <w:fldChar w:fldCharType="begin"/>
+        <w:instrText xml:space="preserve"> PAGEREF bm_cap2_crono \h </w:instrText>
+        <w:fldChar w:fldCharType="separate"/>
+        <w:t>?</w:t>
+        <w:fldChar w:fldCharType="end"/>
+      </w:r>
+    </w:p>
+    <w:p>
+      <w:pPr>
+        <w:tabs>
+          <w:tab w:pos="8271" w:val="right" w:leader="dot"/>
+        </w:tabs>
+        <w:spacing w:line="360" w:lineRule="auto" w:before="0" w:after="80"/>
+        <w:ind w:left="0"/>
+      </w:pPr>
+      <w:r>
+        <w:rPr>
+          <w:rFonts w:ascii="Times New Roman" w:hAnsi="Times New Roman"/>
+          <w:b/>
+          <w:sz w:val="24"/>
+        </w:rPr>
+        <w:t>III MARCO TEÓRICO</w:t>
+        <w:tab/>
+      </w:r>
+      <w:r>
+        <w:rPr>
+          <w:rFonts w:ascii="Times New Roman" w:hAnsi="Times New Roman"/>
+          <w:b/>
+          <w:sz w:val="24"/>
+        </w:rPr>
+        <w:fldChar w:fldCharType="begin"/>
+        <w:instrText xml:space="preserve"> PAGEREF bm_cap3 \h </w:instrText>
+        <w:fldChar w:fldCharType="separate"/>
+        <w:t>?</w:t>
+        <w:fldChar w:fldCharType="end"/>
+      </w:r>
+    </w:p>
+    <w:p>
+      <w:pPr>
+        <w:tabs>
+          <w:tab w:pos="8271" w:val="right" w:leader="dot"/>
+        </w:tabs>
+        <w:spacing w:line="360" w:lineRule="auto" w:before="0" w:after="80"/>
+        <w:ind w:left="283"/>
+      </w:pPr>
+      <w:r>
+        <w:rPr>
+          <w:rFonts w:ascii="Times New Roman" w:hAnsi="Times New Roman"/>
+          <w:b w:val="0"/>
+          <w:sz w:val="24"/>
+        </w:rPr>
+        <w:t>Bases teóricas referenciales</w:t>
+        <w:tab/>
+      </w:r>
+      <w:r>
+        <w:rPr>
+          <w:rFonts w:ascii="Times New Roman" w:hAnsi="Times New Roman"/>
+          <w:b w:val="0"/>
+          <w:sz w:val="24"/>
+        </w:rPr>
+        <w:fldChar w:fldCharType="begin"/>
+        <w:instrText xml:space="preserve"> PAGEREF bm_cap3_bases \h </w:instrText>
+        <w:fldChar w:fldCharType="separate"/>
+        <w:t>?</w:t>
+        <w:fldChar w:fldCharType="end"/>
+      </w:r>
+    </w:p>
+    <w:p>
+      <w:pPr>
+        <w:tabs>
+          <w:tab w:pos="8271" w:val="right" w:leader="dot"/>
+        </w:tabs>
+        <w:spacing w:line="360" w:lineRule="auto" w:before="0" w:after="80"/>
+        <w:ind w:left="0"/>
+      </w:pPr>
+      <w:r>
+        <w:rPr>
+          <w:rFonts w:ascii="Times New Roman" w:hAnsi="Times New Roman"/>
+          <w:b/>
+          <w:sz w:val="24"/>
+        </w:rPr>
+        <w:t>IV ACTIVIDADES REALIZADAS</w:t>
+        <w:tab/>
+      </w:r>
+      <w:r>
+        <w:rPr>
+          <w:rFonts w:ascii="Times New Roman" w:hAnsi="Times New Roman"/>
+          <w:b/>
+          <w:sz w:val="24"/>
+        </w:rPr>
+        <w:fldChar w:fldCharType="begin"/>
+        <w:instrText xml:space="preserve"> PAGEREF bm_cap4 \h </w:instrText>
+        <w:fldChar w:fldCharType="separate"/>
+        <w:t>?</w:t>
+        <w:fldChar w:fldCharType="end"/>
+      </w:r>
+    </w:p>
+    <w:p>
+      <w:pPr>
+        <w:tabs>
+          <w:tab w:pos="8271" w:val="right" w:leader="dot"/>
+        </w:tabs>
+        <w:spacing w:line="360" w:lineRule="auto" w:before="0" w:after="80"/>
+        <w:ind w:left="283"/>
+      </w:pPr>
+      <w:r>
+        <w:rPr>
+          <w:rFonts w:ascii="Times New Roman" w:hAnsi="Times New Roman"/>
+          <w:b w:val="0"/>
+          <w:sz w:val="24"/>
+        </w:rPr>
+        <w:t>Descripción de actividades ejecutadas por semana</w:t>
+        <w:tab/>
+      </w:r>
+      <w:r>
+        <w:rPr>
+          <w:rFonts w:ascii="Times New Roman" w:hAnsi="Times New Roman"/>
+          <w:b w:val="0"/>
+          <w:sz w:val="24"/>
+        </w:rPr>
+        <w:fldChar w:fldCharType="begin"/>
+        <w:instrText xml:space="preserve"> PAGEREF bm_cap4_desc \h </w:instrText>
+        <w:fldChar w:fldCharType="separate"/>
+        <w:t>?</w:t>
+        <w:fldChar w:fldCharType="end"/>
+      </w:r>
+    </w:p>
+    <w:p>
+      <w:pPr>
+        <w:tabs>
+          <w:tab w:pos="8271" w:val="right" w:leader="dot"/>
+        </w:tabs>
+        <w:spacing w:line="360" w:lineRule="auto" w:before="0" w:after="80"/>
+        <w:ind w:left="0"/>
+      </w:pPr>
+      <w:r>
+        <w:rPr>
+          <w:rFonts w:ascii="Times New Roman" w:hAnsi="Times New Roman"/>
+          <w:b/>
+          <w:sz w:val="24"/>
+        </w:rPr>
+        <w:t>V CONCLUSIONES Y RECOMENDACIONES</w:t>
+        <w:tab/>
+      </w:r>
+      <w:r>
+        <w:rPr>
+          <w:rFonts w:ascii="Times New Roman" w:hAnsi="Times New Roman"/>
+          <w:b/>
+          <w:sz w:val="24"/>
+        </w:rPr>
+        <w:fldChar w:fldCharType="begin"/>
+        <w:instrText xml:space="preserve"> PAGEREF bm_cap5 \h </w:instrText>
+        <w:fldChar w:fldCharType="separate"/>
+        <w:t>?</w:t>
+        <w:fldChar w:fldCharType="end"/>
+      </w:r>
+    </w:p>
+    <w:p>
+      <w:pPr>
+        <w:tabs>
+          <w:tab w:pos="8271" w:val="right" w:leader="dot"/>
+        </w:tabs>
+        <w:spacing w:line="360" w:lineRule="auto" w:before="0" w:after="80"/>
+        <w:ind w:left="283"/>
+      </w:pPr>
+      <w:r>
+        <w:rPr>
+          <w:rFonts w:ascii="Times New Roman" w:hAnsi="Times New Roman"/>
+          <w:b w:val="0"/>
+          <w:sz w:val="24"/>
+        </w:rPr>
+        <w:t>Conclusiones</w:t>
+        <w:tab/>
+      </w:r>
+      <w:r>
+        <w:rPr>
+          <w:rFonts w:ascii="Times New Roman" w:hAnsi="Times New Roman"/>
+          <w:b w:val="0"/>
+          <w:sz w:val="24"/>
+        </w:rPr>
+        <w:fldChar w:fldCharType="begin"/>
+        <w:instrText xml:space="preserve"> PAGEREF bm_cap5_concl \h </w:instrText>
+        <w:fldChar w:fldCharType="separate"/>
+        <w:t>?</w:t>
+        <w:fldChar w:fldCharType="end"/>
+      </w:r>
+    </w:p>
+    <w:p>
+      <w:pPr>
+        <w:tabs>
+          <w:tab w:pos="8271" w:val="right" w:leader="dot"/>
+        </w:tabs>
+        <w:spacing w:line="360" w:lineRule="auto" w:before="0" w:after="80"/>
+        <w:ind w:left="283"/>
+      </w:pPr>
+      <w:r>
+        <w:rPr>
+          <w:rFonts w:ascii="Times New Roman" w:hAnsi="Times New Roman"/>
+          <w:b w:val="0"/>
+          <w:sz w:val="24"/>
+        </w:rPr>
+        <w:t>Recomendaciones</w:t>
+        <w:tab/>
+      </w:r>
+      <w:r>
+        <w:rPr>
+          <w:rFonts w:ascii="Times New Roman" w:hAnsi="Times New Roman"/>
+          <w:b w:val="0"/>
+          <w:sz w:val="24"/>
+        </w:rPr>
+        <w:fldChar w:fldCharType="begin"/>
+        <w:instrText xml:space="preserve"> PAGEREF bm_cap5_recom \h </w:instrText>
+        <w:fldChar w:fldCharType="separate"/>
+        <w:t>?</w:t>
+        <w:fldChar w:fldCharType="end"/>
+      </w:r>
+    </w:p>
+    <w:p>
+      <w:pPr>
+        <w:tabs>
+          <w:tab w:pos="8271" w:val="right" w:leader="dot"/>
+        </w:tabs>
+        <w:spacing w:line="360" w:lineRule="auto" w:before="0" w:after="80"/>
+        <w:ind w:left="0"/>
+      </w:pPr>
+      <w:r>
+        <w:rPr>
+          <w:rFonts w:ascii="Times New Roman" w:hAnsi="Times New Roman"/>
+          <w:b/>
+          <w:sz w:val="24"/>
+        </w:rPr>
+        <w:t>REFERENCIAS</w:t>
+        <w:tab/>
+      </w:r>
+      <w:r>
+        <w:rPr>
+          <w:rFonts w:ascii="Times New Roman" w:hAnsi="Times New Roman"/>
+          <w:b/>
+          <w:sz w:val="24"/>
+        </w:rPr>
+        <w:fldChar w:fldCharType="begin"/>
+        <w:instrText xml:space="preserve"> PAGEREF bm_referencias \h </w:instrText>
+        <w:fldChar w:fldCharType="separate"/>
+        <w:t>?</w:t>
+        <w:fldChar w:fldCharType="end"/>
+      </w:r>
+    </w:p>
+    <w:p>
+      <w:pPr>
+        <w:tabs>
+          <w:tab w:pos="8271" w:val="right" w:leader="dot"/>
+        </w:tabs>
+        <w:spacing w:line="360" w:lineRule="auto" w:before="0" w:after="80"/>
+        <w:ind w:left="0"/>
+      </w:pPr>
+      <w:r>
+        <w:rPr>
+          <w:rFonts w:ascii="Times New Roman" w:hAnsi="Times New Roman"/>
+          <w:b/>
+          <w:sz w:val="24"/>
+        </w:rPr>
+        <w:t>ANEXOS</w:t>
+        <w:tab/>
+      </w:r>
+      <w:r>
+        <w:rPr>
+          <w:rFonts w:ascii="Times New Roman" w:hAnsi="Times New Roman"/>
+          <w:b/>
+          <w:sz w:val="24"/>
+        </w:rPr>
+        <w:fldChar w:fldCharType="begin"/>
+        <w:instrText xml:space="preserve"> PAGEREF bm_anexos \h </w:instrText>
+        <w:fldChar w:fldCharType="separate"/>
+        <w:t>?</w:t>
+        <w:fldChar w:fldCharType="end"/>
+      </w:r>
+    </w:p>
+    <w:p>
+      <w:pPr>
         <w:sectPr>
-          <w:footerReference w:type="default" r:id="rId19"/>
+          <w:footerReference w:type="default" r:id="rId20"/>
           <w:type w:val="continuous"/>
           <w:pgSz w:w="12240" w:h="15840"/>
           <w:pgMar w:top="1701" w:right="1701" w:bottom="1701" w:left="2268" w:header="720" w:footer="720" w:gutter="0"/>
@@ -461,6 +1451,7 @@
       </w:pPr>
     </w:p>
     <w:p>
+      <w:bookmarkStart w:id="bm_lista_cuadros" w:name="bm_lista_cuadros"/>
       <w:pPr>
         <w:spacing w:after="480"/>
         <w:jc w:val="center"/>
@@ -471,13 +1462,14 @@
           <w:b/>
           <w:sz w:val="24"/>
         </w:rPr>
-        <w:t>ÍNDICE DE CONTENIDO</w:t>
-      </w:r>
+        <w:t>LISTA DE CUADROS</w:t>
+      </w:r>
+      <w:bookmarkEnd w:id="bm_lista_cuadros"/>
     </w:p>
     <w:p>
       <w:pPr>
         <w:sectPr>
-          <w:footerReference w:type="default" r:id="rId20"/>
+          <w:footerReference w:type="default" r:id="rId21"/>
           <w:pgSz w:w="12240" w:h="15840"/>
           <w:pgMar w:top="2835" w:right="1701" w:bottom="1701" w:left="2268" w:header="720" w:footer="720" w:gutter="0"/>
           <w:cols w:space="720"/>
@@ -488,8 +1480,10 @@
     </w:p>
     <w:p>
       <w:pPr>
-        <w:spacing w:after="240"/>
-        <w:jc w:val="right"/>
+        <w:tabs>
+          <w:tab w:pos="8271" w:val="right"/>
+        </w:tabs>
+        <w:spacing w:before="240" w:after="240"/>
       </w:pPr>
       <w:r>
         <w:rPr>
@@ -497,34 +1491,47 @@
           <w:b/>
           <w:sz w:val="24"/>
         </w:rPr>
+        <w:t>CUADRO</w:t>
+      </w:r>
+      <w:r>
+        <w:tab/>
+      </w:r>
+      <w:r>
+        <w:rPr>
+          <w:rFonts w:ascii="Times New Roman" w:hAnsi="Times New Roman"/>
+          <w:b/>
+          <w:sz w:val="24"/>
+        </w:rPr>
         <w:t>pp.</w:t>
       </w:r>
     </w:p>
     <w:p>
       <w:pPr>
         <w:tabs>
+          <w:tab w:pos="1020" w:val="left"/>
           <w:tab w:pos="8271" w:val="right" w:leader="dot"/>
         </w:tabs>
         <w:spacing w:line="360" w:lineRule="auto" w:before="0" w:after="80"/>
-        <w:ind w:left="0"/>
-      </w:pPr>
+        <w:ind w:left="1020" w:hanging="1020"/>
+      </w:pPr>
+      <w:r>
+        <w:rPr>
+          <w:rFonts w:ascii="Times New Roman" w:hAnsi="Times New Roman"/>
+          <w:sz w:val="24"/>
+        </w:rPr>
+        <w:t>1</w:t>
+        <w:tab/>
+        <w:t>Planificación integral de objetivos específicos</w:t>
+        <w:tab/>
+      </w:r>
       <w:r>
         <w:rPr>
           <w:rFonts w:ascii="Times New Roman" w:hAnsi="Times New Roman"/>
           <w:b w:val="0"/>
           <w:sz w:val="24"/>
         </w:rPr>
-        <w:t>DEDICATORIA</w:t>
-        <w:tab/>
-      </w:r>
-      <w:r>
-        <w:rPr>
-          <w:rFonts w:ascii="Times New Roman" w:hAnsi="Times New Roman"/>
-          <w:b w:val="0"/>
-          <w:sz w:val="24"/>
-        </w:rPr>
         <w:fldChar w:fldCharType="begin"/>
-        <w:instrText xml:space="preserve"> PAGEREF bm_dedicatoria \h </w:instrText>
+        <w:instrText xml:space="preserve"> PAGEREF bm_cuadro1 \h </w:instrText>
         <w:fldChar w:fldCharType="separate"/>
         <w:t>?</w:t>
         <w:fldChar w:fldCharType="end"/>
@@ -533,28 +1540,30 @@
     <w:p>
       <w:pPr>
         <w:tabs>
+          <w:tab w:pos="1020" w:val="left"/>
           <w:tab w:pos="8271" w:val="right" w:leader="dot"/>
         </w:tabs>
         <w:spacing w:line="360" w:lineRule="auto" w:before="0" w:after="80"/>
-        <w:ind w:left="0"/>
-      </w:pPr>
+        <w:ind w:left="1020" w:hanging="1020"/>
+      </w:pPr>
+      <w:r>
+        <w:rPr>
+          <w:rFonts w:ascii="Times New Roman" w:hAnsi="Times New Roman"/>
+          <w:sz w:val="24"/>
+        </w:rPr>
+        <w:t>2</w:t>
+        <w:tab/>
+        <w:t>Cronograma de actividades del proyecto</w:t>
+        <w:tab/>
+      </w:r>
       <w:r>
         <w:rPr>
           <w:rFonts w:ascii="Times New Roman" w:hAnsi="Times New Roman"/>
           <w:b w:val="0"/>
           <w:sz w:val="24"/>
         </w:rPr>
-        <w:t>AGRADECIMIENTOS</w:t>
-        <w:tab/>
-      </w:r>
-      <w:r>
-        <w:rPr>
-          <w:rFonts w:ascii="Times New Roman" w:hAnsi="Times New Roman"/>
-          <w:b w:val="0"/>
-          <w:sz w:val="24"/>
-        </w:rPr>
         <w:fldChar w:fldCharType="begin"/>
-        <w:instrText xml:space="preserve"> PAGEREF bm_agradecimientos \h </w:instrText>
+        <w:instrText xml:space="preserve"> PAGEREF bm_cuadro2 \h </w:instrText>
         <w:fldChar w:fldCharType="separate"/>
         <w:t>?</w:t>
         <w:fldChar w:fldCharType="end"/>
@@ -562,919 +1571,8 @@
     </w:p>
     <w:p>
       <w:pPr>
-        <w:tabs>
-          <w:tab w:pos="8271" w:val="right" w:leader="dot"/>
-        </w:tabs>
-        <w:spacing w:line="360" w:lineRule="auto" w:before="0" w:after="80"/>
-        <w:ind w:left="0"/>
-      </w:pPr>
-      <w:r>
-        <w:rPr>
-          <w:rFonts w:ascii="Times New Roman" w:hAnsi="Times New Roman"/>
-          <w:b w:val="0"/>
-          <w:sz w:val="24"/>
-        </w:rPr>
-        <w:t>RESUMEN</w:t>
-        <w:tab/>
-      </w:r>
-      <w:r>
-        <w:rPr>
-          <w:rFonts w:ascii="Times New Roman" w:hAnsi="Times New Roman"/>
-          <w:b w:val="0"/>
-          <w:sz w:val="24"/>
-        </w:rPr>
-        <w:fldChar w:fldCharType="begin"/>
-        <w:instrText xml:space="preserve"> PAGEREF bm_resumen \h </w:instrText>
-        <w:fldChar w:fldCharType="separate"/>
-        <w:t>?</w:t>
-        <w:fldChar w:fldCharType="end"/>
-      </w:r>
-    </w:p>
-    <w:p>
-      <w:pPr>
-        <w:tabs>
-          <w:tab w:pos="8271" w:val="right" w:leader="dot"/>
-        </w:tabs>
-        <w:spacing w:line="360" w:lineRule="auto" w:before="0" w:after="80"/>
-        <w:ind w:left="0"/>
-      </w:pPr>
-      <w:r>
-        <w:rPr>
-          <w:rFonts w:ascii="Times New Roman" w:hAnsi="Times New Roman"/>
-          <w:b w:val="0"/>
-          <w:sz w:val="24"/>
-        </w:rPr>
-        <w:t>LISTA DE CUADROS</w:t>
-        <w:tab/>
-      </w:r>
-      <w:r>
-        <w:rPr>
-          <w:rFonts w:ascii="Times New Roman" w:hAnsi="Times New Roman"/>
-          <w:b w:val="0"/>
-          <w:sz w:val="24"/>
-        </w:rPr>
-        <w:fldChar w:fldCharType="begin"/>
-        <w:instrText xml:space="preserve"> PAGEREF bm_lista_cuadros \h </w:instrText>
-        <w:fldChar w:fldCharType="separate"/>
-        <w:t>?</w:t>
-        <w:fldChar w:fldCharType="end"/>
-      </w:r>
-    </w:p>
-    <w:p>
-      <w:pPr>
-        <w:tabs>
-          <w:tab w:pos="8271" w:val="right" w:leader="dot"/>
-        </w:tabs>
-        <w:spacing w:line="360" w:lineRule="auto" w:before="0" w:after="80"/>
-        <w:ind w:left="0"/>
-      </w:pPr>
-      <w:r>
-        <w:rPr>
-          <w:rFonts w:ascii="Times New Roman" w:hAnsi="Times New Roman"/>
-          <w:b w:val="0"/>
-          <w:sz w:val="24"/>
-        </w:rPr>
-        <w:t>LISTA DE GRÁFICOS</w:t>
-        <w:tab/>
-      </w:r>
-      <w:r>
-        <w:rPr>
-          <w:rFonts w:ascii="Times New Roman" w:hAnsi="Times New Roman"/>
-          <w:b w:val="0"/>
-          <w:sz w:val="24"/>
-        </w:rPr>
-        <w:fldChar w:fldCharType="begin"/>
-        <w:instrText xml:space="preserve"> PAGEREF bm_lista_graficos \h </w:instrText>
-        <w:fldChar w:fldCharType="separate"/>
-        <w:t>?</w:t>
-        <w:fldChar w:fldCharType="end"/>
-      </w:r>
-    </w:p>
-    <w:p>
-      <w:pPr>
-        <w:tabs>
-          <w:tab w:pos="8271" w:val="right" w:leader="dot"/>
-        </w:tabs>
-        <w:spacing w:line="360" w:lineRule="auto" w:before="0" w:after="80"/>
-        <w:ind w:left="0"/>
-      </w:pPr>
-      <w:r>
-        <w:rPr>
-          <w:rFonts w:ascii="Times New Roman" w:hAnsi="Times New Roman"/>
-          <w:b w:val="0"/>
-          <w:sz w:val="24"/>
-        </w:rPr>
-        <w:t>LISTA DE ANEXOS</w:t>
-        <w:tab/>
-      </w:r>
-      <w:r>
-        <w:rPr>
-          <w:rFonts w:ascii="Times New Roman" w:hAnsi="Times New Roman"/>
-          <w:b w:val="0"/>
-          <w:sz w:val="24"/>
-        </w:rPr>
-        <w:fldChar w:fldCharType="begin"/>
-        <w:instrText xml:space="preserve"> PAGEREF bm_lista_anexos \h </w:instrText>
-        <w:fldChar w:fldCharType="separate"/>
-        <w:t>?</w:t>
-        <w:fldChar w:fldCharType="end"/>
-      </w:r>
-    </w:p>
-    <w:p>
-      <w:pPr>
-        <w:tabs>
-          <w:tab w:pos="8271" w:val="right" w:leader="dot"/>
-        </w:tabs>
-        <w:spacing w:line="360" w:lineRule="auto" w:before="0" w:after="80"/>
-        <w:ind w:left="0"/>
-      </w:pPr>
-      <w:r>
-        <w:rPr>
-          <w:rFonts w:ascii="Times New Roman" w:hAnsi="Times New Roman"/>
-          <w:b w:val="0"/>
-          <w:sz w:val="24"/>
-        </w:rPr>
-        <w:t>INTRODUCCIÓN</w:t>
-        <w:tab/>
-      </w:r>
-      <w:r>
-        <w:rPr>
-          <w:rFonts w:ascii="Times New Roman" w:hAnsi="Times New Roman"/>
-          <w:b w:val="0"/>
-          <w:sz w:val="24"/>
-        </w:rPr>
-        <w:fldChar w:fldCharType="begin"/>
-        <w:instrText xml:space="preserve"> PAGEREF bm_introduccion \h </w:instrText>
-        <w:fldChar w:fldCharType="separate"/>
-        <w:t>?</w:t>
-        <w:fldChar w:fldCharType="end"/>
-      </w:r>
-    </w:p>
-    <w:p>
-      <w:pPr>
-        <w:spacing w:before="240" w:after="120"/>
-      </w:pPr>
-      <w:r>
-        <w:rPr>
-          <w:b/>
-        </w:rPr>
-        <w:t>CAPÍTULOS</w:t>
-      </w:r>
-    </w:p>
-    <w:p>
-      <w:pPr>
-        <w:tabs>
-          <w:tab w:pos="8271" w:val="right" w:leader="dot"/>
-        </w:tabs>
-        <w:spacing w:line="360" w:lineRule="auto" w:before="0" w:after="80"/>
-        <w:ind w:left="0"/>
-      </w:pPr>
-      <w:r>
-        <w:rPr>
-          <w:rFonts w:ascii="Times New Roman" w:hAnsi="Times New Roman"/>
-          <w:b/>
-          <w:sz w:val="24"/>
-        </w:rPr>
-        <w:t>I REALIDAD ORGANIZACIONAL</w:t>
-        <w:tab/>
-      </w:r>
-      <w:r>
-        <w:rPr>
-          <w:rFonts w:ascii="Times New Roman" w:hAnsi="Times New Roman"/>
-          <w:b/>
-          <w:sz w:val="24"/>
-        </w:rPr>
-        <w:fldChar w:fldCharType="begin"/>
-        <w:instrText xml:space="preserve"> PAGEREF bm_cap1 \h </w:instrText>
-        <w:fldChar w:fldCharType="separate"/>
-        <w:t>?</w:t>
-        <w:fldChar w:fldCharType="end"/>
-      </w:r>
-    </w:p>
-    <w:p>
-      <w:pPr>
-        <w:tabs>
-          <w:tab w:pos="8271" w:val="right" w:leader="dot"/>
-        </w:tabs>
-        <w:spacing w:line="360" w:lineRule="auto" w:before="0" w:after="80"/>
-        <w:ind w:left="283"/>
-      </w:pPr>
-      <w:r>
-        <w:rPr>
-          <w:rFonts w:ascii="Times New Roman" w:hAnsi="Times New Roman"/>
-          <w:b w:val="0"/>
-          <w:sz w:val="24"/>
-        </w:rPr>
-        <w:t>Identificación de la empresa</w:t>
-        <w:tab/>
-      </w:r>
-      <w:r>
-        <w:rPr>
-          <w:rFonts w:ascii="Times New Roman" w:hAnsi="Times New Roman"/>
-          <w:b w:val="0"/>
-          <w:sz w:val="24"/>
-        </w:rPr>
-        <w:fldChar w:fldCharType="begin"/>
-        <w:instrText xml:space="preserve"> PAGEREF bm_cap1_ident \h </w:instrText>
-        <w:fldChar w:fldCharType="separate"/>
-        <w:t>?</w:t>
-        <w:fldChar w:fldCharType="end"/>
-      </w:r>
-    </w:p>
-    <w:p>
-      <w:pPr>
-        <w:tabs>
-          <w:tab w:pos="8271" w:val="right" w:leader="dot"/>
-        </w:tabs>
-        <w:spacing w:line="360" w:lineRule="auto" w:before="0" w:after="80"/>
-        <w:ind w:left="283"/>
-      </w:pPr>
-      <w:r>
-        <w:rPr>
-          <w:rFonts w:ascii="Times New Roman" w:hAnsi="Times New Roman"/>
-          <w:b w:val="0"/>
-          <w:sz w:val="24"/>
-        </w:rPr>
-        <w:t>Reseña histórica</w:t>
-        <w:tab/>
-      </w:r>
-      <w:r>
-        <w:rPr>
-          <w:rFonts w:ascii="Times New Roman" w:hAnsi="Times New Roman"/>
-          <w:b w:val="0"/>
-          <w:sz w:val="24"/>
-        </w:rPr>
-        <w:fldChar w:fldCharType="begin"/>
-        <w:instrText xml:space="preserve"> PAGEREF bm_cap1_resena \h </w:instrText>
-        <w:fldChar w:fldCharType="separate"/>
-        <w:t>?</w:t>
-        <w:fldChar w:fldCharType="end"/>
-      </w:r>
-    </w:p>
-    <w:p>
-      <w:pPr>
-        <w:tabs>
-          <w:tab w:pos="8271" w:val="right" w:leader="dot"/>
-        </w:tabs>
-        <w:spacing w:line="360" w:lineRule="auto" w:before="0" w:after="80"/>
-        <w:ind w:left="283"/>
-      </w:pPr>
-      <w:r>
-        <w:rPr>
-          <w:rFonts w:ascii="Times New Roman" w:hAnsi="Times New Roman"/>
-          <w:b w:val="0"/>
-          <w:sz w:val="24"/>
-        </w:rPr>
-        <w:t>Misión</w:t>
-        <w:tab/>
-      </w:r>
-      <w:r>
-        <w:rPr>
-          <w:rFonts w:ascii="Times New Roman" w:hAnsi="Times New Roman"/>
-          <w:b w:val="0"/>
-          <w:sz w:val="24"/>
-        </w:rPr>
-        <w:fldChar w:fldCharType="begin"/>
-        <w:instrText xml:space="preserve"> PAGEREF bm_cap1_mision \h </w:instrText>
-        <w:fldChar w:fldCharType="separate"/>
-        <w:t>?</w:t>
-        <w:fldChar w:fldCharType="end"/>
-      </w:r>
-    </w:p>
-    <w:p>
-      <w:pPr>
-        <w:tabs>
-          <w:tab w:pos="8271" w:val="right" w:leader="dot"/>
-        </w:tabs>
-        <w:spacing w:line="360" w:lineRule="auto" w:before="0" w:after="80"/>
-        <w:ind w:left="283"/>
-      </w:pPr>
-      <w:r>
-        <w:rPr>
-          <w:rFonts w:ascii="Times New Roman" w:hAnsi="Times New Roman"/>
-          <w:b w:val="0"/>
-          <w:sz w:val="24"/>
-        </w:rPr>
-        <w:t>Visión</w:t>
-        <w:tab/>
-      </w:r>
-      <w:r>
-        <w:rPr>
-          <w:rFonts w:ascii="Times New Roman" w:hAnsi="Times New Roman"/>
-          <w:b w:val="0"/>
-          <w:sz w:val="24"/>
-        </w:rPr>
-        <w:fldChar w:fldCharType="begin"/>
-        <w:instrText xml:space="preserve"> PAGEREF bm_cap1_vision \h </w:instrText>
-        <w:fldChar w:fldCharType="separate"/>
-        <w:t>?</w:t>
-        <w:fldChar w:fldCharType="end"/>
-      </w:r>
-    </w:p>
-    <w:p>
-      <w:pPr>
-        <w:tabs>
-          <w:tab w:pos="8271" w:val="right" w:leader="dot"/>
-        </w:tabs>
-        <w:spacing w:line="360" w:lineRule="auto" w:before="0" w:after="80"/>
-        <w:ind w:left="283"/>
-      </w:pPr>
-      <w:r>
-        <w:rPr>
-          <w:rFonts w:ascii="Times New Roman" w:hAnsi="Times New Roman"/>
-          <w:b w:val="0"/>
-          <w:sz w:val="24"/>
-        </w:rPr>
-        <w:t>Valores</w:t>
-        <w:tab/>
-      </w:r>
-      <w:r>
-        <w:rPr>
-          <w:rFonts w:ascii="Times New Roman" w:hAnsi="Times New Roman"/>
-          <w:b w:val="0"/>
-          <w:sz w:val="24"/>
-        </w:rPr>
-        <w:fldChar w:fldCharType="begin"/>
-        <w:instrText xml:space="preserve"> PAGEREF bm_cap1_valores \h </w:instrText>
-        <w:fldChar w:fldCharType="separate"/>
-        <w:t>?</w:t>
-        <w:fldChar w:fldCharType="end"/>
-      </w:r>
-    </w:p>
-    <w:p>
-      <w:pPr>
-        <w:tabs>
-          <w:tab w:pos="8271" w:val="right" w:leader="dot"/>
-        </w:tabs>
-        <w:spacing w:line="360" w:lineRule="auto" w:before="0" w:after="80"/>
-        <w:ind w:left="283"/>
-      </w:pPr>
-      <w:r>
-        <w:rPr>
-          <w:rFonts w:ascii="Times New Roman" w:hAnsi="Times New Roman"/>
-          <w:b w:val="0"/>
-          <w:sz w:val="24"/>
-        </w:rPr>
-        <w:t>Objetivos Organizacionales</w:t>
-        <w:tab/>
-      </w:r>
-      <w:r>
-        <w:rPr>
-          <w:rFonts w:ascii="Times New Roman" w:hAnsi="Times New Roman"/>
-          <w:b w:val="0"/>
-          <w:sz w:val="24"/>
-        </w:rPr>
-        <w:fldChar w:fldCharType="begin"/>
-        <w:instrText xml:space="preserve"> PAGEREF bm_cap1_obj \h </w:instrText>
-        <w:fldChar w:fldCharType="separate"/>
-        <w:t>?</w:t>
-        <w:fldChar w:fldCharType="end"/>
-      </w:r>
-    </w:p>
-    <w:p>
-      <w:pPr>
-        <w:tabs>
-          <w:tab w:pos="8271" w:val="right" w:leader="dot"/>
-        </w:tabs>
-        <w:spacing w:line="360" w:lineRule="auto" w:before="0" w:after="80"/>
-        <w:ind w:left="283"/>
-      </w:pPr>
-      <w:r>
-        <w:rPr>
-          <w:rFonts w:ascii="Times New Roman" w:hAnsi="Times New Roman"/>
-          <w:b w:val="0"/>
-          <w:sz w:val="24"/>
-        </w:rPr>
-        <w:t>Ubicación geográfica</w:t>
-        <w:tab/>
-      </w:r>
-      <w:r>
-        <w:rPr>
-          <w:rFonts w:ascii="Times New Roman" w:hAnsi="Times New Roman"/>
-          <w:b w:val="0"/>
-          <w:sz w:val="24"/>
-        </w:rPr>
-        <w:fldChar w:fldCharType="begin"/>
-        <w:instrText xml:space="preserve"> PAGEREF bm_cap1_ubic \h </w:instrText>
-        <w:fldChar w:fldCharType="separate"/>
-        <w:t>?</w:t>
-        <w:fldChar w:fldCharType="end"/>
-      </w:r>
-    </w:p>
-    <w:p>
-      <w:pPr>
-        <w:tabs>
-          <w:tab w:pos="8271" w:val="right" w:leader="dot"/>
-        </w:tabs>
-        <w:spacing w:line="360" w:lineRule="auto" w:before="0" w:after="80"/>
-        <w:ind w:left="283"/>
-      </w:pPr>
-      <w:r>
-        <w:rPr>
-          <w:rFonts w:ascii="Times New Roman" w:hAnsi="Times New Roman"/>
-          <w:b w:val="0"/>
-          <w:sz w:val="24"/>
-        </w:rPr>
-        <w:t>Población de los trabajadores de la empresa</w:t>
-        <w:tab/>
-      </w:r>
-      <w:r>
-        <w:rPr>
-          <w:rFonts w:ascii="Times New Roman" w:hAnsi="Times New Roman"/>
-          <w:b w:val="0"/>
-          <w:sz w:val="24"/>
-        </w:rPr>
-        <w:fldChar w:fldCharType="begin"/>
-        <w:instrText xml:space="preserve"> PAGEREF bm_cap1_pobla \h </w:instrText>
-        <w:fldChar w:fldCharType="separate"/>
-        <w:t>?</w:t>
-        <w:fldChar w:fldCharType="end"/>
-      </w:r>
-    </w:p>
-    <w:p>
-      <w:pPr>
-        <w:tabs>
-          <w:tab w:pos="8271" w:val="right" w:leader="dot"/>
-        </w:tabs>
-        <w:spacing w:line="360" w:lineRule="auto" w:before="0" w:after="80"/>
-        <w:ind w:left="283"/>
-      </w:pPr>
-      <w:r>
-        <w:rPr>
-          <w:rFonts w:ascii="Times New Roman" w:hAnsi="Times New Roman"/>
-          <w:b w:val="0"/>
-          <w:sz w:val="24"/>
-        </w:rPr>
-        <w:t>Estructura organizacional de la empresa (organigrama)</w:t>
-        <w:tab/>
-      </w:r>
-      <w:r>
-        <w:rPr>
-          <w:rFonts w:ascii="Times New Roman" w:hAnsi="Times New Roman"/>
-          <w:b w:val="0"/>
-          <w:sz w:val="24"/>
-        </w:rPr>
-        <w:fldChar w:fldCharType="begin"/>
-        <w:instrText xml:space="preserve"> PAGEREF bm_cap1_estruct \h </w:instrText>
-        <w:fldChar w:fldCharType="separate"/>
-        <w:t>?</w:t>
-        <w:fldChar w:fldCharType="end"/>
-      </w:r>
-    </w:p>
-    <w:p>
-      <w:pPr>
-        <w:tabs>
-          <w:tab w:pos="8271" w:val="right" w:leader="dot"/>
-        </w:tabs>
-        <w:spacing w:line="360" w:lineRule="auto" w:before="0" w:after="80"/>
-        <w:ind w:left="0"/>
-      </w:pPr>
-      <w:r>
-        <w:rPr>
-          <w:rFonts w:ascii="Times New Roman" w:hAnsi="Times New Roman"/>
-          <w:b/>
-          <w:sz w:val="24"/>
-        </w:rPr>
-        <w:t>II DIAGNÓSTICO SITUACIONAL</w:t>
-        <w:tab/>
-      </w:r>
-      <w:r>
-        <w:rPr>
-          <w:rFonts w:ascii="Times New Roman" w:hAnsi="Times New Roman"/>
-          <w:b/>
-          <w:sz w:val="24"/>
-        </w:rPr>
-        <w:fldChar w:fldCharType="begin"/>
-        <w:instrText xml:space="preserve"> PAGEREF bm_cap2 \h </w:instrText>
-        <w:fldChar w:fldCharType="separate"/>
-        <w:t>?</w:t>
-        <w:fldChar w:fldCharType="end"/>
-      </w:r>
-    </w:p>
-    <w:p>
-      <w:pPr>
-        <w:tabs>
-          <w:tab w:pos="8271" w:val="right" w:leader="dot"/>
-        </w:tabs>
-        <w:spacing w:line="360" w:lineRule="auto" w:before="0" w:after="80"/>
-        <w:ind w:left="283"/>
-      </w:pPr>
-      <w:r>
-        <w:rPr>
-          <w:rFonts w:ascii="Times New Roman" w:hAnsi="Times New Roman"/>
-          <w:b w:val="0"/>
-          <w:sz w:val="24"/>
-        </w:rPr>
-        <w:t>Identificación de la situación problemática</w:t>
-        <w:tab/>
-      </w:r>
-      <w:r>
-        <w:rPr>
-          <w:rFonts w:ascii="Times New Roman" w:hAnsi="Times New Roman"/>
-          <w:b w:val="0"/>
-          <w:sz w:val="24"/>
-        </w:rPr>
-        <w:fldChar w:fldCharType="begin"/>
-        <w:instrText xml:space="preserve"> PAGEREF bm_cap2_sit \h </w:instrText>
-        <w:fldChar w:fldCharType="separate"/>
-        <w:t>?</w:t>
-        <w:fldChar w:fldCharType="end"/>
-      </w:r>
-    </w:p>
-    <w:p>
-      <w:pPr>
-        <w:tabs>
-          <w:tab w:pos="8271" w:val="right" w:leader="dot"/>
-        </w:tabs>
-        <w:spacing w:line="360" w:lineRule="auto" w:before="0" w:after="80"/>
-        <w:ind w:left="283"/>
-      </w:pPr>
-      <w:r>
-        <w:rPr>
-          <w:rFonts w:ascii="Times New Roman" w:hAnsi="Times New Roman"/>
-          <w:b w:val="0"/>
-          <w:sz w:val="24"/>
-        </w:rPr>
-        <w:t>Objetivo General</w:t>
-        <w:tab/>
-      </w:r>
-      <w:r>
-        <w:rPr>
-          <w:rFonts w:ascii="Times New Roman" w:hAnsi="Times New Roman"/>
-          <w:b w:val="0"/>
-          <w:sz w:val="24"/>
-        </w:rPr>
-        <w:fldChar w:fldCharType="begin"/>
-        <w:instrText xml:space="preserve"> PAGEREF bm_cap2_objg \h </w:instrText>
-        <w:fldChar w:fldCharType="separate"/>
-        <w:t>?</w:t>
-        <w:fldChar w:fldCharType="end"/>
-      </w:r>
-    </w:p>
-    <w:p>
-      <w:pPr>
-        <w:tabs>
-          <w:tab w:pos="8271" w:val="right" w:leader="dot"/>
-        </w:tabs>
-        <w:spacing w:line="360" w:lineRule="auto" w:before="0" w:after="80"/>
-        <w:ind w:left="283"/>
-      </w:pPr>
-      <w:r>
-        <w:rPr>
-          <w:rFonts w:ascii="Times New Roman" w:hAnsi="Times New Roman"/>
-          <w:b w:val="0"/>
-          <w:sz w:val="24"/>
-        </w:rPr>
-        <w:t>Objetivos Específicos</w:t>
-        <w:tab/>
-      </w:r>
-      <w:r>
-        <w:rPr>
-          <w:rFonts w:ascii="Times New Roman" w:hAnsi="Times New Roman"/>
-          <w:b w:val="0"/>
-          <w:sz w:val="24"/>
-        </w:rPr>
-        <w:fldChar w:fldCharType="begin"/>
-        <w:instrText xml:space="preserve"> PAGEREF bm_cap2_obje \h </w:instrText>
-        <w:fldChar w:fldCharType="separate"/>
-        <w:t>?</w:t>
-        <w:fldChar w:fldCharType="end"/>
-      </w:r>
-    </w:p>
-    <w:p>
-      <w:pPr>
-        <w:tabs>
-          <w:tab w:pos="8271" w:val="right" w:leader="dot"/>
-        </w:tabs>
-        <w:spacing w:line="360" w:lineRule="auto" w:before="0" w:after="80"/>
-        <w:ind w:left="283"/>
-      </w:pPr>
-      <w:r>
-        <w:rPr>
-          <w:rFonts w:ascii="Times New Roman" w:hAnsi="Times New Roman"/>
-          <w:b w:val="0"/>
-          <w:sz w:val="24"/>
-        </w:rPr>
-        <w:t>Planificación integral de objetivos</w:t>
-        <w:tab/>
-      </w:r>
-      <w:r>
-        <w:rPr>
-          <w:rFonts w:ascii="Times New Roman" w:hAnsi="Times New Roman"/>
-          <w:b w:val="0"/>
-          <w:sz w:val="24"/>
-        </w:rPr>
-        <w:fldChar w:fldCharType="begin"/>
-        <w:instrText xml:space="preserve"> PAGEREF bm_cap2_planif \h </w:instrText>
-        <w:fldChar w:fldCharType="separate"/>
-        <w:t>?</w:t>
-        <w:fldChar w:fldCharType="end"/>
-      </w:r>
-    </w:p>
-    <w:p>
-      <w:pPr>
-        <w:tabs>
-          <w:tab w:pos="8271" w:val="right" w:leader="dot"/>
-        </w:tabs>
-        <w:spacing w:line="360" w:lineRule="auto" w:before="0" w:after="80"/>
-        <w:ind w:left="283"/>
-      </w:pPr>
-      <w:r>
-        <w:rPr>
-          <w:rFonts w:ascii="Times New Roman" w:hAnsi="Times New Roman"/>
-          <w:b w:val="0"/>
-          <w:sz w:val="24"/>
-        </w:rPr>
-        <w:t>Cronograma de actividades</w:t>
-        <w:tab/>
-      </w:r>
-      <w:r>
-        <w:rPr>
-          <w:rFonts w:ascii="Times New Roman" w:hAnsi="Times New Roman"/>
-          <w:b w:val="0"/>
-          <w:sz w:val="24"/>
-        </w:rPr>
-        <w:fldChar w:fldCharType="begin"/>
-        <w:instrText xml:space="preserve"> PAGEREF bm_cap2_crono \h </w:instrText>
-        <w:fldChar w:fldCharType="separate"/>
-        <w:t>?</w:t>
-        <w:fldChar w:fldCharType="end"/>
-      </w:r>
-    </w:p>
-    <w:p>
-      <w:pPr>
-        <w:tabs>
-          <w:tab w:pos="8271" w:val="right" w:leader="dot"/>
-        </w:tabs>
-        <w:spacing w:line="360" w:lineRule="auto" w:before="0" w:after="80"/>
-        <w:ind w:left="0"/>
-      </w:pPr>
-      <w:r>
-        <w:rPr>
-          <w:rFonts w:ascii="Times New Roman" w:hAnsi="Times New Roman"/>
-          <w:b/>
-          <w:sz w:val="24"/>
-        </w:rPr>
-        <w:t>III MARCO TEÓRICO</w:t>
-        <w:tab/>
-      </w:r>
-      <w:r>
-        <w:rPr>
-          <w:rFonts w:ascii="Times New Roman" w:hAnsi="Times New Roman"/>
-          <w:b/>
-          <w:sz w:val="24"/>
-        </w:rPr>
-        <w:fldChar w:fldCharType="begin"/>
-        <w:instrText xml:space="preserve"> PAGEREF bm_cap3 \h </w:instrText>
-        <w:fldChar w:fldCharType="separate"/>
-        <w:t>?</w:t>
-        <w:fldChar w:fldCharType="end"/>
-      </w:r>
-    </w:p>
-    <w:p>
-      <w:pPr>
-        <w:tabs>
-          <w:tab w:pos="8271" w:val="right" w:leader="dot"/>
-        </w:tabs>
-        <w:spacing w:line="360" w:lineRule="auto" w:before="0" w:after="80"/>
-        <w:ind w:left="283"/>
-      </w:pPr>
-      <w:r>
-        <w:rPr>
-          <w:rFonts w:ascii="Times New Roman" w:hAnsi="Times New Roman"/>
-          <w:b w:val="0"/>
-          <w:sz w:val="24"/>
-        </w:rPr>
-        <w:t>Bases teóricas referenciales</w:t>
-        <w:tab/>
-      </w:r>
-      <w:r>
-        <w:rPr>
-          <w:rFonts w:ascii="Times New Roman" w:hAnsi="Times New Roman"/>
-          <w:b w:val="0"/>
-          <w:sz w:val="24"/>
-        </w:rPr>
-        <w:fldChar w:fldCharType="begin"/>
-        <w:instrText xml:space="preserve"> PAGEREF bm_cap3_bases \h </w:instrText>
-        <w:fldChar w:fldCharType="separate"/>
-        <w:t>?</w:t>
-        <w:fldChar w:fldCharType="end"/>
-      </w:r>
-    </w:p>
-    <w:p>
-      <w:pPr>
-        <w:tabs>
-          <w:tab w:pos="8271" w:val="right" w:leader="dot"/>
-        </w:tabs>
-        <w:spacing w:line="360" w:lineRule="auto" w:before="0" w:after="80"/>
-        <w:ind w:left="0"/>
-      </w:pPr>
-      <w:r>
-        <w:rPr>
-          <w:rFonts w:ascii="Times New Roman" w:hAnsi="Times New Roman"/>
-          <w:b/>
-          <w:sz w:val="24"/>
-        </w:rPr>
-        <w:t>IV ACTIVIDADES REALIZADAS</w:t>
-        <w:tab/>
-      </w:r>
-      <w:r>
-        <w:rPr>
-          <w:rFonts w:ascii="Times New Roman" w:hAnsi="Times New Roman"/>
-          <w:b/>
-          <w:sz w:val="24"/>
-        </w:rPr>
-        <w:fldChar w:fldCharType="begin"/>
-        <w:instrText xml:space="preserve"> PAGEREF bm_cap4 \h </w:instrText>
-        <w:fldChar w:fldCharType="separate"/>
-        <w:t>?</w:t>
-        <w:fldChar w:fldCharType="end"/>
-      </w:r>
-    </w:p>
-    <w:p>
-      <w:pPr>
-        <w:tabs>
-          <w:tab w:pos="8271" w:val="right" w:leader="dot"/>
-        </w:tabs>
-        <w:spacing w:line="360" w:lineRule="auto" w:before="0" w:after="80"/>
-        <w:ind w:left="283"/>
-      </w:pPr>
-      <w:r>
-        <w:rPr>
-          <w:rFonts w:ascii="Times New Roman" w:hAnsi="Times New Roman"/>
-          <w:b w:val="0"/>
-          <w:sz w:val="24"/>
-        </w:rPr>
-        <w:t>Descripción de actividades ejecutadas por semana</w:t>
-        <w:tab/>
-      </w:r>
-      <w:r>
-        <w:rPr>
-          <w:rFonts w:ascii="Times New Roman" w:hAnsi="Times New Roman"/>
-          <w:b w:val="0"/>
-          <w:sz w:val="24"/>
-        </w:rPr>
-        <w:fldChar w:fldCharType="begin"/>
-        <w:instrText xml:space="preserve"> PAGEREF bm_cap4_desc \h </w:instrText>
-        <w:fldChar w:fldCharType="separate"/>
-        <w:t>?</w:t>
-        <w:fldChar w:fldCharType="end"/>
-      </w:r>
-    </w:p>
-    <w:p>
-      <w:pPr>
-        <w:tabs>
-          <w:tab w:pos="8271" w:val="right" w:leader="dot"/>
-        </w:tabs>
-        <w:spacing w:line="360" w:lineRule="auto" w:before="0" w:after="80"/>
-        <w:ind w:left="0"/>
-      </w:pPr>
-      <w:r>
-        <w:rPr>
-          <w:rFonts w:ascii="Times New Roman" w:hAnsi="Times New Roman"/>
-          <w:b/>
-          <w:sz w:val="24"/>
-        </w:rPr>
-        <w:t>V CONCLUSIONES Y RECOMENDACIONES</w:t>
-        <w:tab/>
-      </w:r>
-      <w:r>
-        <w:rPr>
-          <w:rFonts w:ascii="Times New Roman" w:hAnsi="Times New Roman"/>
-          <w:b/>
-          <w:sz w:val="24"/>
-        </w:rPr>
-        <w:fldChar w:fldCharType="begin"/>
-        <w:instrText xml:space="preserve"> PAGEREF bm_cap5 \h </w:instrText>
-        <w:fldChar w:fldCharType="separate"/>
-        <w:t>?</w:t>
-        <w:fldChar w:fldCharType="end"/>
-      </w:r>
-    </w:p>
-    <w:p>
-      <w:pPr>
-        <w:tabs>
-          <w:tab w:pos="8271" w:val="right" w:leader="dot"/>
-        </w:tabs>
-        <w:spacing w:line="360" w:lineRule="auto" w:before="0" w:after="80"/>
-        <w:ind w:left="283"/>
-      </w:pPr>
-      <w:r>
-        <w:rPr>
-          <w:rFonts w:ascii="Times New Roman" w:hAnsi="Times New Roman"/>
-          <w:b w:val="0"/>
-          <w:sz w:val="24"/>
-        </w:rPr>
-        <w:t>Conclusiones</w:t>
-        <w:tab/>
-      </w:r>
-      <w:r>
-        <w:rPr>
-          <w:rFonts w:ascii="Times New Roman" w:hAnsi="Times New Roman"/>
-          <w:b w:val="0"/>
-          <w:sz w:val="24"/>
-        </w:rPr>
-        <w:fldChar w:fldCharType="begin"/>
-        <w:instrText xml:space="preserve"> PAGEREF bm_cap5_concl \h </w:instrText>
-        <w:fldChar w:fldCharType="separate"/>
-        <w:t>?</w:t>
-        <w:fldChar w:fldCharType="end"/>
-      </w:r>
-    </w:p>
-    <w:p>
-      <w:pPr>
-        <w:tabs>
-          <w:tab w:pos="8271" w:val="right" w:leader="dot"/>
-        </w:tabs>
-        <w:spacing w:line="360" w:lineRule="auto" w:before="0" w:after="80"/>
-        <w:ind w:left="283"/>
-      </w:pPr>
-      <w:r>
-        <w:rPr>
-          <w:rFonts w:ascii="Times New Roman" w:hAnsi="Times New Roman"/>
-          <w:b w:val="0"/>
-          <w:sz w:val="24"/>
-        </w:rPr>
-        <w:t>Recomendaciones</w:t>
-        <w:tab/>
-      </w:r>
-      <w:r>
-        <w:rPr>
-          <w:rFonts w:ascii="Times New Roman" w:hAnsi="Times New Roman"/>
-          <w:b w:val="0"/>
-          <w:sz w:val="24"/>
-        </w:rPr>
-        <w:fldChar w:fldCharType="begin"/>
-        <w:instrText xml:space="preserve"> PAGEREF bm_cap5_recom \h </w:instrText>
-        <w:fldChar w:fldCharType="separate"/>
-        <w:t>?</w:t>
-        <w:fldChar w:fldCharType="end"/>
-      </w:r>
-    </w:p>
-    <w:p>
-      <w:pPr>
-        <w:tabs>
-          <w:tab w:pos="8271" w:val="right" w:leader="dot"/>
-        </w:tabs>
-        <w:spacing w:line="360" w:lineRule="auto" w:before="0" w:after="80"/>
-        <w:ind w:left="0"/>
-      </w:pPr>
-      <w:r>
-        <w:rPr>
-          <w:rFonts w:ascii="Times New Roman" w:hAnsi="Times New Roman"/>
-          <w:b/>
-          <w:sz w:val="24"/>
-        </w:rPr>
-        <w:t>REFERENCIAS</w:t>
-        <w:tab/>
-      </w:r>
-      <w:r>
-        <w:rPr>
-          <w:rFonts w:ascii="Times New Roman" w:hAnsi="Times New Roman"/>
-          <w:b/>
-          <w:sz w:val="24"/>
-        </w:rPr>
-        <w:fldChar w:fldCharType="begin"/>
-        <w:instrText xml:space="preserve"> PAGEREF bm_referencias \h </w:instrText>
-        <w:fldChar w:fldCharType="separate"/>
-        <w:t>?</w:t>
-        <w:fldChar w:fldCharType="end"/>
-      </w:r>
-    </w:p>
-    <w:p>
-      <w:pPr>
-        <w:tabs>
-          <w:tab w:pos="8271" w:val="right" w:leader="dot"/>
-        </w:tabs>
-        <w:spacing w:line="360" w:lineRule="auto" w:before="0" w:after="80"/>
-        <w:ind w:left="0"/>
-      </w:pPr>
-      <w:r>
-        <w:rPr>
-          <w:rFonts w:ascii="Times New Roman" w:hAnsi="Times New Roman"/>
-          <w:b/>
-          <w:sz w:val="24"/>
-        </w:rPr>
-        <w:t>ANEXOS</w:t>
-        <w:tab/>
-      </w:r>
-      <w:r>
-        <w:rPr>
-          <w:rFonts w:ascii="Times New Roman" w:hAnsi="Times New Roman"/>
-          <w:b/>
-          <w:sz w:val="24"/>
-        </w:rPr>
-        <w:fldChar w:fldCharType="begin"/>
-        <w:instrText xml:space="preserve"> PAGEREF bm_anexos \h </w:instrText>
-        <w:fldChar w:fldCharType="separate"/>
-        <w:t>?</w:t>
-        <w:fldChar w:fldCharType="end"/>
-      </w:r>
-    </w:p>
-    <w:p>
-      <w:pPr>
         <w:sectPr>
-          <w:footerReference w:type="default" r:id="rId21"/>
+          <w:footerReference w:type="default" r:id="rId22"/>
           <w:type w:val="continuous"/>
           <w:pgSz w:w="12240" w:h="15840"/>
           <w:pgMar w:top="1701" w:right="1701" w:bottom="1701" w:left="2268" w:header="720" w:footer="720" w:gutter="0"/>
@@ -1485,7 +1583,7 @@
       </w:pPr>
     </w:p>
     <w:p>
-      <w:bookmarkStart w:id="bm_lista_cuadros" w:name="bm_lista_cuadros"/>
+      <w:bookmarkStart w:id="bm_lista_graficos" w:name="bm_lista_graficos"/>
       <w:pPr>
         <w:spacing w:after="480"/>
         <w:jc w:val="center"/>
@@ -1496,14 +1594,14 @@
           <w:b/>
           <w:sz w:val="24"/>
         </w:rPr>
-        <w:t>LISTA DE CUADROS</w:t>
-      </w:r>
-      <w:bookmarkEnd w:id="bm_lista_cuadros"/>
+        <w:t>LISTA DE GRÁFICOS</w:t>
+      </w:r>
+      <w:bookmarkEnd w:id="bm_lista_graficos"/>
     </w:p>
     <w:p>
       <w:pPr>
         <w:sectPr>
-          <w:footerReference w:type="default" r:id="rId22"/>
+          <w:footerReference w:type="default" r:id="rId23"/>
           <w:pgSz w:w="12240" w:h="15840"/>
           <w:pgMar w:top="2835" w:right="1701" w:bottom="1701" w:left="2268" w:header="720" w:footer="720" w:gutter="0"/>
           <w:cols w:space="720"/>
@@ -1525,7 +1623,7 @@
           <w:b/>
           <w:sz w:val="24"/>
         </w:rPr>
-        <w:t>CUADRO</w:t>
+        <w:t>GRÁFICO</w:t>
       </w:r>
       <w:r>
         <w:tab/>
@@ -1555,7 +1653,7 @@
         </w:rPr>
         <w:t>1</w:t>
         <w:tab/>
-        <w:t>Planificación integral de objetivos específicos</w:t>
+        <w:t>Representación cartográfica y ubicación espacial de Ingeniería de Telecomunicaciones, C.A.</w:t>
         <w:tab/>
       </w:r>
       <w:r>
@@ -1565,7 +1663,7 @@
           <w:sz w:val="24"/>
         </w:rPr>
         <w:fldChar w:fldCharType="begin"/>
-        <w:instrText xml:space="preserve"> PAGEREF bm_cuadro1 \h </w:instrText>
+        <w:instrText xml:space="preserve"> PAGEREF bm_grafico1 \h </w:instrText>
         <w:fldChar w:fldCharType="separate"/>
         <w:t>?</w:t>
         <w:fldChar w:fldCharType="end"/>
@@ -1587,7 +1685,7 @@
         </w:rPr>
         <w:t>2</w:t>
         <w:tab/>
-        <w:t>Cronograma de actividades del proyecto</w:t>
+        <w:t>Organigrama estructural y niveles jerárquicos de Ingeniería de Telecomunicaciones, C.A.</w:t>
         <w:tab/>
       </w:r>
       <w:r>
@@ -1597,7 +1695,7 @@
           <w:sz w:val="24"/>
         </w:rPr>
         <w:fldChar w:fldCharType="begin"/>
-        <w:instrText xml:space="preserve"> PAGEREF bm_cuadro2 \h </w:instrText>
+        <w:instrText xml:space="preserve"> PAGEREF bm_grafico2 \h </w:instrText>
         <w:fldChar w:fldCharType="separate"/>
         <w:t>?</w:t>
         <w:fldChar w:fldCharType="end"/>
@@ -1605,8 +1703,40 @@
     </w:p>
     <w:p>
       <w:pPr>
+        <w:tabs>
+          <w:tab w:pos="1020" w:val="left"/>
+          <w:tab w:pos="8271" w:val="right" w:leader="dot"/>
+        </w:tabs>
+        <w:spacing w:line="360" w:lineRule="auto" w:before="0" w:after="80"/>
+        <w:ind w:left="1020" w:hanging="1020"/>
+      </w:pPr>
+      <w:r>
+        <w:rPr>
+          <w:rFonts w:ascii="Times New Roman" w:hAnsi="Times New Roman"/>
+          <w:sz w:val="24"/>
+        </w:rPr>
+        <w:t>3</w:t>
+        <w:tab/>
+        <w:t>Organigrama del Departamento de Administración.</w:t>
+        <w:tab/>
+      </w:r>
+      <w:r>
+        <w:rPr>
+          <w:rFonts w:ascii="Times New Roman" w:hAnsi="Times New Roman"/>
+          <w:b w:val="0"/>
+          <w:sz w:val="24"/>
+        </w:rPr>
+        <w:fldChar w:fldCharType="begin"/>
+        <w:instrText xml:space="preserve"> PAGEREF bm_grafico3 \h </w:instrText>
+        <w:fldChar w:fldCharType="separate"/>
+        <w:t>?</w:t>
+        <w:fldChar w:fldCharType="end"/>
+      </w:r>
+    </w:p>
+    <w:p>
+      <w:pPr>
         <w:sectPr>
-          <w:footerReference w:type="default" r:id="rId23"/>
+          <w:footerReference w:type="default" r:id="rId24"/>
           <w:type w:val="continuous"/>
           <w:pgSz w:w="12240" w:h="15840"/>
           <w:pgMar w:top="1701" w:right="1701" w:bottom="1701" w:left="2268" w:header="720" w:footer="720" w:gutter="0"/>
@@ -1617,7 +1747,7 @@
       </w:pPr>
     </w:p>
     <w:p>
-      <w:bookmarkStart w:id="bm_lista_graficos" w:name="bm_lista_graficos"/>
+      <w:bookmarkStart w:id="bm_lista_anexos" w:name="bm_lista_anexos"/>
       <w:pPr>
         <w:spacing w:after="480"/>
         <w:jc w:val="center"/>
@@ -1628,14 +1758,14 @@
           <w:b/>
           <w:sz w:val="24"/>
         </w:rPr>
-        <w:t>LISTA DE GRÁFICOS</w:t>
-      </w:r>
-      <w:bookmarkEnd w:id="bm_lista_graficos"/>
+        <w:t>LISTA DE ANEXOS</w:t>
+      </w:r>
+      <w:bookmarkEnd w:id="bm_lista_anexos"/>
     </w:p>
     <w:p>
       <w:pPr>
         <w:sectPr>
-          <w:footerReference w:type="default" r:id="rId24"/>
+          <w:footerReference w:type="default" r:id="rId25"/>
           <w:pgSz w:w="12240" w:h="15840"/>
           <w:pgMar w:top="2835" w:right="1701" w:bottom="1701" w:left="2268" w:header="720" w:footer="720" w:gutter="0"/>
           <w:cols w:space="720"/>
@@ -1657,7 +1787,7 @@
           <w:b/>
           <w:sz w:val="24"/>
         </w:rPr>
-        <w:t>GRÁFICO</w:t>
+        <w:t>ANEXOS</w:t>
       </w:r>
       <w:r>
         <w:tab/>
@@ -1685,9 +1815,9 @@
           <w:rFonts w:ascii="Times New Roman" w:hAnsi="Times New Roman"/>
           <w:sz w:val="24"/>
         </w:rPr>
-        <w:t>1</w:t>
+        <w:t>A</w:t>
         <w:tab/>
-        <w:t>Representación cartográfica y ubicación espacial de Ingeniería de Telecomunicaciones, C.A.</w:t>
+        <w:t>Aquí va la descripción del Anexo A</w:t>
         <w:tab/>
       </w:r>
       <w:r>
@@ -1697,7 +1827,7 @@
           <w:sz w:val="24"/>
         </w:rPr>
         <w:fldChar w:fldCharType="begin"/>
-        <w:instrText xml:space="preserve"> PAGEREF bm_grafico1 \h </w:instrText>
+        <w:instrText xml:space="preserve"> PAGEREF bm_anexoA \h </w:instrText>
         <w:fldChar w:fldCharType="separate"/>
         <w:t>?</w:t>
         <w:fldChar w:fldCharType="end"/>
@@ -1717,9 +1847,9 @@
           <w:rFonts w:ascii="Times New Roman" w:hAnsi="Times New Roman"/>
           <w:sz w:val="24"/>
         </w:rPr>
-        <w:t>2</w:t>
+        <w:t>B</w:t>
         <w:tab/>
-        <w:t>Organigrama estructural y niveles jerárquicos de Ingeniería de Telecomunicaciones, C.A.</w:t>
+        <w:t>Aquí va la descripción del Anexo B</w:t>
         <w:tab/>
       </w:r>
       <w:r>
@@ -1729,7 +1859,7 @@
           <w:sz w:val="24"/>
         </w:rPr>
         <w:fldChar w:fldCharType="begin"/>
-        <w:instrText xml:space="preserve"> PAGEREF bm_grafico2 \h </w:instrText>
+        <w:instrText xml:space="preserve"> PAGEREF bm_anexoB \h </w:instrText>
         <w:fldChar w:fldCharType="separate"/>
         <w:t>?</w:t>
         <w:fldChar w:fldCharType="end"/>
@@ -1749,9 +1879,9 @@
           <w:rFonts w:ascii="Times New Roman" w:hAnsi="Times New Roman"/>
           <w:sz w:val="24"/>
         </w:rPr>
-        <w:t>3</w:t>
+        <w:t>C</w:t>
         <w:tab/>
-        <w:t>Organigrama del Departamento de Administración.</w:t>
+        <w:t>Aquí va la descripción del Anexo C</w:t>
         <w:tab/>
       </w:r>
       <w:r>
@@ -1761,7 +1891,7 @@
           <w:sz w:val="24"/>
         </w:rPr>
         <w:fldChar w:fldCharType="begin"/>
-        <w:instrText xml:space="preserve"> PAGEREF bm_grafico3 \h </w:instrText>
+        <w:instrText xml:space="preserve"> PAGEREF bm_anexoC \h </w:instrText>
         <w:fldChar w:fldCharType="separate"/>
         <w:t>?</w:t>
         <w:fldChar w:fldCharType="end"/>
@@ -1770,7 +1900,7 @@
     <w:p>
       <w:pPr>
         <w:sectPr>
-          <w:footerReference w:type="default" r:id="rId25"/>
+          <w:footerReference w:type="default" r:id="rId26"/>
           <w:type w:val="continuous"/>
           <w:pgSz w:w="12240" w:h="15840"/>
           <w:pgMar w:top="1701" w:right="1701" w:bottom="1701" w:left="2268" w:header="720" w:footer="720" w:gutter="0"/>
@@ -1781,7 +1911,7 @@
       </w:pPr>
     </w:p>
     <w:p>
-      <w:bookmarkStart w:id="bm_lista_anexos" w:name="bm_lista_anexos"/>
+      <w:bookmarkStart w:id="bm_resumen" w:name="bm_resumen"/>
       <w:pPr>
         <w:spacing w:after="480"/>
         <w:jc w:val="center"/>
@@ -1792,14 +1922,14 @@
           <w:b/>
           <w:sz w:val="24"/>
         </w:rPr>
-        <w:t>LISTA DE ANEXOS</w:t>
-      </w:r>
-      <w:bookmarkEnd w:id="bm_lista_anexos"/>
+        <w:t>RESUMEN</w:t>
+      </w:r>
+      <w:bookmarkEnd w:id="bm_resumen"/>
     </w:p>
     <w:p>
       <w:pPr>
         <w:sectPr>
-          <w:footerReference w:type="default" r:id="rId26"/>
+          <w:footerReference w:type="default" r:id="rId27"/>
           <w:pgSz w:w="12240" w:h="15840"/>
           <w:pgMar w:top="2835" w:right="1701" w:bottom="1701" w:left="2268" w:header="720" w:footer="720" w:gutter="0"/>
           <w:cols w:space="720"/>
@@ -1810,131 +1940,38 @@
     </w:p>
     <w:p>
       <w:pPr>
-        <w:tabs>
-          <w:tab w:pos="8271" w:val="right"/>
-        </w:tabs>
-        <w:spacing w:before="240" w:after="240"/>
-      </w:pPr>
-      <w:r>
-        <w:rPr>
-          <w:rFonts w:ascii="Times New Roman" w:hAnsi="Times New Roman"/>
+        <w:spacing w:line="360" w:lineRule="auto" w:after="0" w:before="0"/>
+        <w:ind w:firstLine="709"/>
+        <w:jc w:val="both"/>
+      </w:pPr>
+      <w:r>
+        <w:rPr>
+          <w:rFonts w:ascii="Times New Roman" w:hAnsi="Times New Roman"/>
+          <w:i w:val="0"/>
+          <w:sz w:val="24"/>
+        </w:rPr>
+        <w:t>El presente informe describe la evaluación del control administrativo aplicado a la gestión de solicitudes de servicios de telecomunicaciones en la empresa Ingeniería de Telecomunicaciones, C.A. (IDETEL). La investigación se enmarca en la modalidad de proyecto factible apoyado en un diagnóstico de campo. Durante el estudio se identificó la ausencia de procedimientos formalizados para el seguimiento de solicitudes de afiliación e incidencias, la falta de formatos estandarizados de registro y la inexistencia de indicadores de gestión que permitan evaluar el desempeño del proceso de atención al suscriptor. La propuesta contempla un nuevo flujo de trabajo estandarizado, formatos unificados de control y un conjunto de indicadores de gestión orientados a fortalecer el control administrativo y optimizar la calidad del servicio prestado.</w:t>
+      </w:r>
+    </w:p>
+    <w:p/>
+    <w:p>
+      <w:pPr>
+        <w:ind w:firstLine="709"/>
+      </w:pPr>
+      <w:r>
+        <w:rPr>
           <w:b/>
-          <w:sz w:val="24"/>
-        </w:rPr>
-        <w:t>ANEXOS</w:t>
-      </w:r>
-      <w:r>
-        <w:tab/>
-      </w:r>
-      <w:r>
-        <w:rPr>
-          <w:rFonts w:ascii="Times New Roman" w:hAnsi="Times New Roman"/>
-          <w:b/>
-          <w:sz w:val="24"/>
-        </w:rPr>
-        <w:t>pp.</w:t>
+        </w:rPr>
+        <w:t xml:space="preserve">Palabras claves: </w:t>
+      </w:r>
+      <w:r>
+        <w:t>control administrativo, solicitudes de servicios, telecomunicaciones, proyecto factible, pasantías.</w:t>
       </w:r>
     </w:p>
     <w:p>
       <w:pPr>
-        <w:tabs>
-          <w:tab w:pos="1020" w:val="left"/>
-          <w:tab w:pos="8271" w:val="right" w:leader="dot"/>
-        </w:tabs>
-        <w:spacing w:line="360" w:lineRule="auto" w:before="0" w:after="80"/>
-        <w:ind w:left="1020" w:hanging="1020"/>
-      </w:pPr>
-      <w:r>
-        <w:rPr>
-          <w:rFonts w:ascii="Times New Roman" w:hAnsi="Times New Roman"/>
-          <w:sz w:val="24"/>
-        </w:rPr>
-        <w:t>A</w:t>
-        <w:tab/>
-        <w:t>Aquí va la descripción del Anexo A</w:t>
-        <w:tab/>
-      </w:r>
-      <w:r>
-        <w:rPr>
-          <w:rFonts w:ascii="Times New Roman" w:hAnsi="Times New Roman"/>
-          <w:b w:val="0"/>
-          <w:sz w:val="24"/>
-        </w:rPr>
-        <w:fldChar w:fldCharType="begin"/>
-        <w:instrText xml:space="preserve"> PAGEREF bm_anexoA \h </w:instrText>
-        <w:fldChar w:fldCharType="separate"/>
-        <w:t>?</w:t>
-        <w:fldChar w:fldCharType="end"/>
-      </w:r>
-    </w:p>
-    <w:p>
-      <w:pPr>
-        <w:tabs>
-          <w:tab w:pos="1020" w:val="left"/>
-          <w:tab w:pos="8271" w:val="right" w:leader="dot"/>
-        </w:tabs>
-        <w:spacing w:line="360" w:lineRule="auto" w:before="0" w:after="80"/>
-        <w:ind w:left="1020" w:hanging="1020"/>
-      </w:pPr>
-      <w:r>
-        <w:rPr>
-          <w:rFonts w:ascii="Times New Roman" w:hAnsi="Times New Roman"/>
-          <w:sz w:val="24"/>
-        </w:rPr>
-        <w:t>B</w:t>
-        <w:tab/>
-        <w:t>Aquí va la descripción del Anexo B</w:t>
-        <w:tab/>
-      </w:r>
-      <w:r>
-        <w:rPr>
-          <w:rFonts w:ascii="Times New Roman" w:hAnsi="Times New Roman"/>
-          <w:b w:val="0"/>
-          <w:sz w:val="24"/>
-        </w:rPr>
-        <w:fldChar w:fldCharType="begin"/>
-        <w:instrText xml:space="preserve"> PAGEREF bm_anexoB \h </w:instrText>
-        <w:fldChar w:fldCharType="separate"/>
-        <w:t>?</w:t>
-        <w:fldChar w:fldCharType="end"/>
-      </w:r>
-    </w:p>
-    <w:p>
-      <w:pPr>
-        <w:tabs>
-          <w:tab w:pos="1020" w:val="left"/>
-          <w:tab w:pos="8271" w:val="right" w:leader="dot"/>
-        </w:tabs>
-        <w:spacing w:line="360" w:lineRule="auto" w:before="0" w:after="80"/>
-        <w:ind w:left="1020" w:hanging="1020"/>
-      </w:pPr>
-      <w:r>
-        <w:rPr>
-          <w:rFonts w:ascii="Times New Roman" w:hAnsi="Times New Roman"/>
-          <w:sz w:val="24"/>
-        </w:rPr>
-        <w:t>C</w:t>
-        <w:tab/>
-        <w:t>Aquí va la descripción del Anexo C</w:t>
-        <w:tab/>
-      </w:r>
-      <w:r>
-        <w:rPr>
-          <w:rFonts w:ascii="Times New Roman" w:hAnsi="Times New Roman"/>
-          <w:b w:val="0"/>
-          <w:sz w:val="24"/>
-        </w:rPr>
-        <w:fldChar w:fldCharType="begin"/>
-        <w:instrText xml:space="preserve"> PAGEREF bm_anexoC \h </w:instrText>
-        <w:fldChar w:fldCharType="separate"/>
-        <w:t>?</w:t>
-        <w:fldChar w:fldCharType="end"/>
-      </w:r>
-    </w:p>
-    <w:p>
-      <w:pPr>
         <w:sectPr>
-          <w:footerReference w:type="default" r:id="rId27"/>
+          <w:footerReference w:type="default" r:id="rId28"/>
           <w:type w:val="continuous"/>
           <w:pgSz w:w="12240" w:h="15840"/>
           <w:pgMar w:top="1701" w:right="1701" w:bottom="1701" w:left="2268" w:header="720" w:footer="720" w:gutter="0"/>
@@ -1963,7 +2000,7 @@
     <w:p>
       <w:pPr>
         <w:sectPr>
-          <w:footerReference w:type="default" r:id="rId28"/>
+          <w:footerReference w:type="default" r:id="rId29"/>
           <w:pgSz w:w="12240" w:h="15840"/>
           <w:pgMar w:top="2835" w:right="1701" w:bottom="1701" w:left="2268" w:header="720" w:footer="720" w:gutter="0"/>
           <w:cols w:space="720"/>
@@ -1990,7 +2027,7 @@
     <w:p>
       <w:pPr>
         <w:sectPr>
-          <w:footerReference w:type="default" r:id="rId29"/>
+          <w:footerReference w:type="default" r:id="rId30"/>
           <w:type w:val="continuous"/>
           <w:pgSz w:w="12240" w:h="15840"/>
           <w:pgMar w:top="1701" w:right="1701" w:bottom="1701" w:left="2268" w:header="720" w:footer="720" w:gutter="0"/>
@@ -2033,7 +2070,7 @@
     <w:p>
       <w:pPr>
         <w:sectPr>
-          <w:footerReference w:type="default" r:id="rId30"/>
+          <w:footerReference w:type="default" r:id="rId31"/>
           <w:pgSz w:w="12240" w:h="15840"/>
           <w:pgMar w:top="2835" w:right="1701" w:bottom="1701" w:left="2268" w:header="720" w:footer="720" w:gutter="0"/>
           <w:cols w:space="720"/>
@@ -2520,7 +2557,7 @@
         <w:drawing>
           <wp:inline xmlns:a="http://schemas.openxmlformats.org/drawingml/2006/main" xmlns:pic="http://schemas.openxmlformats.org/drawingml/2006/picture">
             <wp:extent cx="1800000" cy="1125000"/>
-            <wp:docPr id="1" name="Picture 1"/>
+            <wp:docPr id="2" name="Picture 2"/>
             <wp:cNvGraphicFramePr>
               <a:graphicFrameLocks noChangeAspect="1"/>
             </wp:cNvGraphicFramePr>
@@ -2532,7 +2569,7 @@
                     <pic:cNvPicPr/>
                   </pic:nvPicPr>
                   <pic:blipFill>
-                    <a:blip r:embed="rId9"/>
+                    <a:blip r:embed="rId10"/>
                     <a:stretch>
                       <a:fillRect/>
                     </a:stretch>
@@ -2650,7 +2687,7 @@
         <w:drawing>
           <wp:inline xmlns:a="http://schemas.openxmlformats.org/drawingml/2006/main" xmlns:pic="http://schemas.openxmlformats.org/drawingml/2006/picture">
             <wp:extent cx="4320000" cy="1473429"/>
-            <wp:docPr id="2" name="Picture 2"/>
+            <wp:docPr id="3" name="Picture 3"/>
             <wp:cNvGraphicFramePr>
               <a:graphicFrameLocks noChangeAspect="1"/>
             </wp:cNvGraphicFramePr>
@@ -2662,7 +2699,7 @@
                     <pic:cNvPicPr/>
                   </pic:nvPicPr>
                   <pic:blipFill>
-                    <a:blip r:embed="rId10"/>
+                    <a:blip r:embed="rId11"/>
                     <a:stretch>
                       <a:fillRect/>
                     </a:stretch>
@@ -2714,7 +2751,7 @@
         <w:drawing>
           <wp:inline xmlns:a="http://schemas.openxmlformats.org/drawingml/2006/main" xmlns:pic="http://schemas.openxmlformats.org/drawingml/2006/picture">
             <wp:extent cx="4320000" cy="2680292"/>
-            <wp:docPr id="3" name="Picture 3"/>
+            <wp:docPr id="4" name="Picture 4"/>
             <wp:cNvGraphicFramePr>
               <a:graphicFrameLocks noChangeAspect="1"/>
             </wp:cNvGraphicFramePr>
@@ -2726,7 +2763,7 @@
                     <pic:cNvPicPr/>
                   </pic:nvPicPr>
                   <pic:blipFill>
-                    <a:blip r:embed="rId11"/>
+                    <a:blip r:embed="rId12"/>
                     <a:stretch>
                       <a:fillRect/>
                     </a:stretch>
@@ -2772,7 +2809,7 @@
     <w:p>
       <w:pPr>
         <w:sectPr>
-          <w:footerReference w:type="default" r:id="rId31"/>
+          <w:footerReference w:type="default" r:id="rId32"/>
           <w:type w:val="continuous"/>
           <w:pgSz w:w="12240" w:h="15840"/>
           <w:pgMar w:top="1701" w:right="1701" w:bottom="1701" w:left="2268" w:header="720" w:footer="720" w:gutter="0"/>
@@ -2815,7 +2852,7 @@
     <w:p>
       <w:pPr>
         <w:sectPr>
-          <w:footerReference w:type="default" r:id="rId32"/>
+          <w:footerReference w:type="default" r:id="rId33"/>
           <w:pgSz w:w="12240" w:h="15840"/>
           <w:pgMar w:top="2835" w:right="1701" w:bottom="1701" w:left="2268" w:header="720" w:footer="720" w:gutter="0"/>
           <w:cols w:space="720"/>
@@ -6109,7 +6146,7 @@
     <w:p>
       <w:pPr>
         <w:sectPr>
-          <w:footerReference w:type="default" r:id="rId33"/>
+          <w:footerReference w:type="default" r:id="rId34"/>
           <w:type w:val="continuous"/>
           <w:pgSz w:w="12240" w:h="15840"/>
           <w:pgMar w:top="1701" w:right="1701" w:bottom="1701" w:left="2268" w:header="720" w:footer="720" w:gutter="0"/>
@@ -6152,7 +6189,7 @@
     <w:p>
       <w:pPr>
         <w:sectPr>
-          <w:footerReference w:type="default" r:id="rId34"/>
+          <w:footerReference w:type="default" r:id="rId35"/>
           <w:pgSz w:w="12240" w:h="15840"/>
           <w:pgMar w:top="2835" w:right="1701" w:bottom="1701" w:left="2268" w:header="720" w:footer="720" w:gutter="0"/>
           <w:cols w:space="720"/>
@@ -6466,7 +6503,7 @@
     <w:p>
       <w:pPr>
         <w:sectPr>
-          <w:footerReference w:type="default" r:id="rId35"/>
+          <w:footerReference w:type="default" r:id="rId36"/>
           <w:type w:val="continuous"/>
           <w:pgSz w:w="12240" w:h="15840"/>
           <w:pgMar w:top="1701" w:right="1701" w:bottom="1701" w:left="2268" w:header="720" w:footer="720" w:gutter="0"/>
@@ -6509,7 +6546,7 @@
     <w:p>
       <w:pPr>
         <w:sectPr>
-          <w:footerReference w:type="default" r:id="rId36"/>
+          <w:footerReference w:type="default" r:id="rId37"/>
           <w:pgSz w:w="12240" w:h="15840"/>
           <w:pgMar w:top="2835" w:right="1701" w:bottom="1701" w:left="2268" w:header="720" w:footer="720" w:gutter="0"/>
           <w:cols w:space="720"/>
@@ -7272,7 +7309,7 @@
     <w:p>
       <w:pPr>
         <w:sectPr>
-          <w:footerReference w:type="default" r:id="rId37"/>
+          <w:footerReference w:type="default" r:id="rId38"/>
           <w:type w:val="continuous"/>
           <w:pgSz w:w="12240" w:h="15840"/>
           <w:pgMar w:top="1701" w:right="1701" w:bottom="1701" w:left="2268" w:header="720" w:footer="720" w:gutter="0"/>
@@ -7315,7 +7352,7 @@
     <w:p>
       <w:pPr>
         <w:sectPr>
-          <w:footerReference w:type="default" r:id="rId38"/>
+          <w:footerReference w:type="default" r:id="rId39"/>
           <w:pgSz w:w="12240" w:h="15840"/>
           <w:pgMar w:top="2835" w:right="1701" w:bottom="1701" w:left="2268" w:header="720" w:footer="720" w:gutter="0"/>
           <w:cols w:space="720"/>
@@ -7527,7 +7564,7 @@
     <w:p>
       <w:pPr>
         <w:sectPr>
-          <w:footerReference w:type="default" r:id="rId39"/>
+          <w:footerReference w:type="default" r:id="rId40"/>
           <w:type w:val="continuous"/>
           <w:pgSz w:w="12240" w:h="15840"/>
           <w:pgMar w:top="1701" w:right="1701" w:bottom="1701" w:left="2268" w:header="720" w:footer="720" w:gutter="0"/>
@@ -7556,7 +7593,7 @@
     <w:p>
       <w:pPr>
         <w:sectPr>
-          <w:footerReference w:type="default" r:id="rId40"/>
+          <w:footerReference w:type="default" r:id="rId41"/>
           <w:pgSz w:w="12240" w:h="15840"/>
           <w:pgMar w:top="2835" w:right="1701" w:bottom="1701" w:left="2268" w:header="720" w:footer="720" w:gutter="0"/>
           <w:cols w:space="720"/>
@@ -7685,7 +7722,7 @@
     <w:p>
       <w:pPr>
         <w:sectPr>
-          <w:footerReference w:type="default" r:id="rId41"/>
+          <w:footerReference w:type="default" r:id="rId42"/>
           <w:type w:val="continuous"/>
           <w:pgSz w:w="12240" w:h="15840"/>
           <w:pgMar w:top="1701" w:right="1701" w:bottom="1701" w:left="2268" w:header="720" w:footer="720" w:gutter="0"/>
@@ -7710,61 +7747,6 @@
         <w:t>ANEXOS</w:t>
       </w:r>
       <w:bookmarkEnd w:id="bm_anexos"/>
-    </w:p>
-    <w:p>
-      <w:pPr>
-        <w:sectPr>
-          <w:footerReference w:type="default" r:id="rId42"/>
-          <w:pgSz w:w="12240" w:h="15840"/>
-          <w:pgMar w:top="2835" w:right="1701" w:bottom="1701" w:left="2268" w:header="720" w:footer="720" w:gutter="0"/>
-          <w:cols w:space="720"/>
-          <w:titlePg/>
-          <w:docGrid w:linePitch="360"/>
-        </w:sectPr>
-      </w:pPr>
-    </w:p>
-    <w:p>
-      <w:bookmarkStart w:id="bm_anexoA" w:name="bm_anexoA"/>
-      <w:pPr>
-        <w:spacing w:before="0" w:after="480"/>
-        <w:jc w:val="center"/>
-      </w:pPr>
-      <w:bookmarkEnd w:id="bm_anexoA"/>
-      <w:r>
-        <w:rPr>
-          <w:rFonts w:ascii="Times New Roman" w:hAnsi="Times New Roman"/>
-          <w:b/>
-          <w:sz w:val="24"/>
-        </w:rPr>
-        <w:t>ANEXO A</w:t>
-      </w:r>
-    </w:p>
-    <w:p>
-      <w:pPr>
-        <w:spacing w:before="240" w:after="480"/>
-        <w:jc w:val="center"/>
-      </w:pPr>
-      <w:r>
-        <w:rPr>
-          <w:rFonts w:ascii="Times New Roman" w:hAnsi="Times New Roman"/>
-          <w:b/>
-          <w:sz w:val="24"/>
-        </w:rPr>
-        <w:t>[Aquí va la descripción del Anexo A]</w:t>
-      </w:r>
-    </w:p>
-    <w:p>
-      <w:pPr>
-        <w:jc w:val="center"/>
-      </w:pPr>
-      <w:r>
-        <w:rPr>
-          <w:rFonts w:ascii="Times New Roman" w:hAnsi="Times New Roman"/>
-          <w:i/>
-          <w:sz w:val="20"/>
-        </w:rPr>
-        <w:t>(Contenido elaborado por el estudiante)</w:t>
-      </w:r>
     </w:p>
     <w:p>
       <w:pPr>
@@ -7779,19 +7761,19 @@
       </w:pPr>
     </w:p>
     <w:p>
-      <w:bookmarkStart w:id="bm_anexoB" w:name="bm_anexoB"/>
+      <w:bookmarkStart w:id="bm_anexoA" w:name="bm_anexoA"/>
       <w:pPr>
         <w:spacing w:before="0" w:after="480"/>
         <w:jc w:val="center"/>
       </w:pPr>
-      <w:bookmarkEnd w:id="bm_anexoB"/>
+      <w:bookmarkEnd w:id="bm_anexoA"/>
       <w:r>
         <w:rPr>
           <w:rFonts w:ascii="Times New Roman" w:hAnsi="Times New Roman"/>
           <w:b/>
           <w:sz w:val="24"/>
         </w:rPr>
-        <w:t>ANEXO B</w:t>
+        <w:t>ANEXO A</w:t>
       </w:r>
     </w:p>
     <w:p>
@@ -7805,7 +7787,7 @@
           <w:b/>
           <w:sz w:val="24"/>
         </w:rPr>
-        <w:t>[Aquí va la descripción del Anexo B]</w:t>
+        <w:t>[Aquí va la descripción del Anexo A]</w:t>
       </w:r>
     </w:p>
     <w:p>
@@ -7834,19 +7816,19 @@
       </w:pPr>
     </w:p>
     <w:p>
-      <w:bookmarkStart w:id="bm_anexoC" w:name="bm_anexoC"/>
+      <w:bookmarkStart w:id="bm_anexoB" w:name="bm_anexoB"/>
       <w:pPr>
         <w:spacing w:before="0" w:after="480"/>
         <w:jc w:val="center"/>
       </w:pPr>
-      <w:bookmarkEnd w:id="bm_anexoC"/>
+      <w:bookmarkEnd w:id="bm_anexoB"/>
       <w:r>
         <w:rPr>
           <w:rFonts w:ascii="Times New Roman" w:hAnsi="Times New Roman"/>
           <w:b/>
           <w:sz w:val="24"/>
         </w:rPr>
-        <w:t>ANEXO C</w:t>
+        <w:t>ANEXO B</w:t>
       </w:r>
     </w:p>
     <w:p>
@@ -7860,7 +7842,7 @@
           <w:b/>
           <w:sz w:val="24"/>
         </w:rPr>
-        <w:t>[Aquí va la descripción del Anexo C]</w:t>
+        <w:t>[Aquí va la descripción del Anexo B]</w:t>
       </w:r>
     </w:p>
     <w:p>
@@ -7876,8 +7858,63 @@
         <w:t>(Contenido elaborado por el estudiante)</w:t>
       </w:r>
     </w:p>
+    <w:p>
+      <w:pPr>
+        <w:sectPr>
+          <w:footerReference w:type="default" r:id="rId45"/>
+          <w:pgSz w:w="12240" w:h="15840"/>
+          <w:pgMar w:top="2835" w:right="1701" w:bottom="1701" w:left="2268" w:header="720" w:footer="720" w:gutter="0"/>
+          <w:cols w:space="720"/>
+          <w:titlePg/>
+          <w:docGrid w:linePitch="360"/>
+        </w:sectPr>
+      </w:pPr>
+    </w:p>
+    <w:p>
+      <w:bookmarkStart w:id="bm_anexoC" w:name="bm_anexoC"/>
+      <w:pPr>
+        <w:spacing w:before="0" w:after="480"/>
+        <w:jc w:val="center"/>
+      </w:pPr>
+      <w:bookmarkEnd w:id="bm_anexoC"/>
+      <w:r>
+        <w:rPr>
+          <w:rFonts w:ascii="Times New Roman" w:hAnsi="Times New Roman"/>
+          <w:b/>
+          <w:sz w:val="24"/>
+        </w:rPr>
+        <w:t>ANEXO C</w:t>
+      </w:r>
+    </w:p>
+    <w:p>
+      <w:pPr>
+        <w:spacing w:before="240" w:after="480"/>
+        <w:jc w:val="center"/>
+      </w:pPr>
+      <w:r>
+        <w:rPr>
+          <w:rFonts w:ascii="Times New Roman" w:hAnsi="Times New Roman"/>
+          <w:b/>
+          <w:sz w:val="24"/>
+        </w:rPr>
+        <w:t>[Aquí va la descripción del Anexo C]</w:t>
+      </w:r>
+    </w:p>
+    <w:p>
+      <w:pPr>
+        <w:jc w:val="center"/>
+      </w:pPr>
+      <w:r>
+        <w:rPr>
+          <w:rFonts w:ascii="Times New Roman" w:hAnsi="Times New Roman"/>
+          <w:i/>
+          <w:sz w:val="20"/>
+        </w:rPr>
+        <w:t>(Contenido elaborado por el estudiante)</w:t>
+      </w:r>
+    </w:p>
     <w:sectPr>
-      <w:footerReference w:type="default" r:id="rId45"/>
+      <w:footerReference w:type="default" r:id="rId46"/>
       <w:pgSz w:w="12240" w:h="15840"/>
       <w:pgMar w:top="2835" w:right="1701" w:bottom="1701" w:left="2268" w:header="720" w:footer="720" w:gutter="0"/>
       <w:cols w:space="720"/>

</xml_diff>

<commit_message>
Contraportada: tutores izq y autor der en misma fila (tabla invisible)
</commit_message>
<xml_diff>
--- a/amaal/reportes/Informe_Pasantia_IUTECP.docx
+++ b/amaal/reportes/Informe_Pasantia_IUTECP.docx
@@ -217,77 +217,115 @@
         <w:t>EVALUACIÓN DEL CONTROL ADMINISTRATIVO APLICADO A LA GESTIÓN DE SOLICITUDES DE SERVICIOS DE TELECOMUNICACIONES EN LA EMPRESA INGENIERÍA DE TELECOMUNICACIONES, C.A.</w:t>
       </w:r>
     </w:p>
+    <w:tbl>
+      <w:tblPr>
+        <w:tblW w:type="auto" w:w="0"/>
+        <w:jc w:val="center"/>
+        <w:tblLook w:firstColumn="1" w:firstRow="1" w:lastColumn="0" w:lastRow="0" w:noHBand="0" w:noVBand="1" w:val="04A0"/>
+        <w:tblBorders>
+          <w:top w:val="none" w:sz="0"/>
+          <w:left w:val="none" w:sz="0"/>
+          <w:bottom w:val="none" w:sz="0"/>
+          <w:right w:val="none" w:sz="0"/>
+          <w:insideH w:val="none" w:sz="0"/>
+          <w:insideV w:val="none" w:sz="0"/>
+        </w:tblBorders>
+      </w:tblPr>
+      <w:tblGrid>
+        <w:gridCol w:w="4135"/>
+        <w:gridCol w:w="4135"/>
+      </w:tblGrid>
+      <w:tr>
+        <w:tc>
+          <w:tcPr>
+            <w:tcW w:type="dxa" w:w="4133"/>
+            <w:vAlign w:val="center"/>
+          </w:tcPr>
+          <w:p>
+            <w:pPr>
+              <w:spacing w:line="276" w:lineRule="auto"/>
+              <w:jc w:val="left"/>
+            </w:pPr>
+            <w:r>
+              <w:rPr>
+                <w:rFonts w:ascii="Times New Roman" w:hAnsi="Times New Roman"/>
+                <w:b/>
+                <w:sz w:val="24"/>
+              </w:rPr>
+              <w:t>Tutor Industrial: Lenny Mata</w:t>
+              <w:br/>
+            </w:r>
+            <w:r>
+              <w:rPr>
+                <w:rFonts w:ascii="Times New Roman" w:hAnsi="Times New Roman"/>
+                <w:b/>
+                <w:sz w:val="24"/>
+              </w:rPr>
+              <w:t>C.I.: 8969750</w:t>
+              <w:br/>
+            </w:r>
+            <w:r>
+              <w:rPr>
+                <w:rFonts w:ascii="Times New Roman" w:hAnsi="Times New Roman"/>
+                <w:b/>
+                <w:sz w:val="24"/>
+              </w:rPr>
+              <w:br/>
+            </w:r>
+            <w:r>
+              <w:rPr>
+                <w:rFonts w:ascii="Times New Roman" w:hAnsi="Times New Roman"/>
+                <w:b/>
+                <w:sz w:val="24"/>
+              </w:rPr>
+              <w:t>Tutor Académico: Lic. Carlos Mendoza</w:t>
+              <w:br/>
+            </w:r>
+            <w:r>
+              <w:rPr>
+                <w:rFonts w:ascii="Times New Roman" w:hAnsi="Times New Roman"/>
+                <w:b/>
+                <w:sz w:val="24"/>
+              </w:rPr>
+              <w:t>C.I.: 4.273.815</w:t>
+            </w:r>
+          </w:p>
+        </w:tc>
+        <w:tc>
+          <w:tcPr>
+            <w:tcW w:type="dxa" w:w="4139"/>
+            <w:vAlign w:val="center"/>
+          </w:tcPr>
+          <w:p>
+            <w:pPr>
+              <w:spacing w:line="276" w:lineRule="auto"/>
+              <w:jc w:val="right"/>
+            </w:pPr>
+            <w:r>
+              <w:rPr>
+                <w:rFonts w:ascii="Times New Roman" w:hAnsi="Times New Roman"/>
+                <w:b/>
+                <w:sz w:val="24"/>
+              </w:rPr>
+              <w:t>Autor: Alrifaai Alrifaaie Amaal</w:t>
+              <w:br/>
+            </w:r>
+            <w:r>
+              <w:rPr>
+                <w:rFonts w:ascii="Times New Roman" w:hAnsi="Times New Roman"/>
+                <w:b/>
+                <w:sz w:val="24"/>
+              </w:rPr>
+              <w:t>C.I.: 31.985.792</w:t>
+            </w:r>
+          </w:p>
+        </w:tc>
+      </w:tr>
+    </w:tbl>
     <w:p>
       <w:pPr>
-        <w:spacing w:line="276" w:lineRule="auto" w:before="2033" w:after="160"/>
-        <w:jc w:val="left"/>
-      </w:pPr>
-      <w:r>
-        <w:rPr>
-          <w:rFonts w:ascii="Times New Roman" w:hAnsi="Times New Roman"/>
-          <w:b/>
-          <w:sz w:val="24"/>
-        </w:rPr>
-        <w:t>Autor: Alrifaai Alrifaaie Amaal</w:t>
-        <w:br/>
-      </w:r>
-      <w:r>
-        <w:rPr>
-          <w:rFonts w:ascii="Times New Roman" w:hAnsi="Times New Roman"/>
-          <w:b/>
-          <w:sz w:val="24"/>
-        </w:rPr>
-        <w:t>C.I.: 31.985.792</w:t>
-      </w:r>
-    </w:p>
-    <w:p>
-      <w:pPr>
-        <w:spacing w:line="276" w:lineRule="auto" w:before="0" w:after="0"/>
-        <w:jc w:val="right"/>
-      </w:pPr>
-      <w:r>
-        <w:rPr>
-          <w:rFonts w:ascii="Times New Roman" w:hAnsi="Times New Roman"/>
-          <w:b/>
-          <w:sz w:val="24"/>
-        </w:rPr>
-        <w:t>Tutor Industrial: Lenny Mata</w:t>
-        <w:br/>
-      </w:r>
-      <w:r>
-        <w:rPr>
-          <w:rFonts w:ascii="Times New Roman" w:hAnsi="Times New Roman"/>
-          <w:b/>
-          <w:sz w:val="24"/>
-        </w:rPr>
-        <w:t>C.I.: 8969750</w:t>
-        <w:br/>
-      </w:r>
-      <w:r>
-        <w:rPr>
-          <w:rFonts w:ascii="Times New Roman" w:hAnsi="Times New Roman"/>
-          <w:b/>
-          <w:sz w:val="24"/>
-        </w:rPr>
-        <w:br/>
-      </w:r>
-      <w:r>
-        <w:rPr>
-          <w:rFonts w:ascii="Times New Roman" w:hAnsi="Times New Roman"/>
-          <w:b/>
-          <w:sz w:val="24"/>
-        </w:rPr>
-        <w:t>Tutor Académico: Lic. Carlos Mendoza</w:t>
-        <w:br/>
-      </w:r>
-      <w:r>
-        <w:rPr>
-          <w:rFonts w:ascii="Times New Roman" w:hAnsi="Times New Roman"/>
-          <w:b/>
-          <w:sz w:val="24"/>
-        </w:rPr>
-        <w:t>C.I.: 4.273.815</w:t>
-      </w:r>
+        <w:spacing w:before="2033" w:after="0" w:line="20" w:lineRule="exact"/>
+      </w:pPr>
     </w:p>
     <w:p>
       <w:pPr>

</xml_diff>

<commit_message>
Contraportada: alineacion TOP en ambas celdas para primera linea a misma altura
</commit_message>
<xml_diff>
--- a/amaal/reportes/Informe_Pasantia_IUTECP.docx
+++ b/amaal/reportes/Informe_Pasantia_IUTECP.docx
@@ -239,7 +239,7 @@
         <w:tc>
           <w:tcPr>
             <w:tcW w:type="dxa" w:w="4133"/>
-            <w:vAlign w:val="center"/>
+            <w:vAlign w:val="top"/>
           </w:tcPr>
           <w:p>
             <w:pPr>
@@ -294,7 +294,7 @@
         <w:tc>
           <w:tcPr>
             <w:tcW w:type="dxa" w:w="4139"/>
-            <w:vAlign w:val="center"/>
+            <w:vAlign w:val="top"/>
           </w:tcPr>
           <w:p>
             <w:pPr>

</xml_diff>

<commit_message>
Contraportada: espaciador antes de la tabla (no despues)
</commit_message>
<xml_diff>
--- a/amaal/reportes/Informe_Pasantia_IUTECP.docx
+++ b/amaal/reportes/Informe_Pasantia_IUTECP.docx
@@ -216,6 +216,11 @@
         </w:rPr>
         <w:t>EVALUACIÓN DEL CONTROL ADMINISTRATIVO APLICADO A LA GESTIÓN DE SOLICITUDES DE SERVICIOS DE TELECOMUNICACIONES EN LA EMPRESA INGENIERÍA DE TELECOMUNICACIONES, C.A.</w:t>
       </w:r>
+    </w:p>
+    <w:p>
+      <w:pPr>
+        <w:spacing w:before="2033" w:after="0" w:line="20" w:lineRule="exact"/>
+      </w:pPr>
     </w:p>
     <w:tbl>
       <w:tblPr>
@@ -322,11 +327,6 @@
         </w:tc>
       </w:tr>
     </w:tbl>
-    <w:p>
-      <w:pPr>
-        <w:spacing w:before="2033" w:after="0" w:line="20" w:lineRule="exact"/>
-      </w:pPr>
-    </w:p>
     <w:p>
       <w:pPr>
         <w:spacing w:line="276" w:lineRule="auto" w:before="777" w:after="0"/>

</xml_diff>

<commit_message>
Formato AUTOR_DATOS: label separado del nombre con salto de linea
</commit_message>
<xml_diff>
--- a/amaal/reportes/Informe_Pasantia_IUTECP.docx
+++ b/amaal/reportes/Informe_Pasantia_IUTECP.docx
@@ -117,7 +117,16 @@
           <w:b/>
           <w:sz w:val="24"/>
         </w:rPr>
-        <w:t>Autor: Alrifaai Alrifaaie Amaal</w:t>
+        <w:t>Autor:</w:t>
+        <w:br/>
+      </w:r>
+      <w:r>
+        <w:rPr>
+          <w:rFonts w:ascii="Times New Roman" w:hAnsi="Times New Roman"/>
+          <w:b/>
+          <w:sz w:val="24"/>
+        </w:rPr>
+        <w:t>Alrifaai Alrifaaie Amaal</w:t>
         <w:br/>
       </w:r>
       <w:r>
@@ -131,7 +140,7 @@
     </w:p>
     <w:p>
       <w:pPr>
-        <w:spacing w:line="276" w:lineRule="auto" w:before="2309" w:after="0"/>
+        <w:spacing w:line="276" w:lineRule="auto" w:before="2033" w:after="0"/>
         <w:jc w:val="center"/>
       </w:pPr>
       <w:r>
@@ -257,7 +266,16 @@
                 <w:b/>
                 <w:sz w:val="24"/>
               </w:rPr>
-              <w:t>Tutor Industrial: Lenny Mata</w:t>
+              <w:t>Tutor Industrial:</w:t>
+              <w:br/>
+            </w:r>
+            <w:r>
+              <w:rPr>
+                <w:rFonts w:ascii="Times New Roman" w:hAnsi="Times New Roman"/>
+                <w:b/>
+                <w:sz w:val="24"/>
+              </w:rPr>
+              <w:t>Lenny Mata</w:t>
               <w:br/>
             </w:r>
             <w:r>
@@ -283,7 +301,16 @@
                 <w:b/>
                 <w:sz w:val="24"/>
               </w:rPr>
-              <w:t>Tutor Académico: Lic. Carlos Mendoza</w:t>
+              <w:t>Tutor Académico:</w:t>
+              <w:br/>
+            </w:r>
+            <w:r>
+              <w:rPr>
+                <w:rFonts w:ascii="Times New Roman" w:hAnsi="Times New Roman"/>
+                <w:b/>
+                <w:sz w:val="24"/>
+              </w:rPr>
+              <w:t>Lic. Carlos Mendoza</w:t>
               <w:br/>
             </w:r>
             <w:r>
@@ -312,7 +339,16 @@
                 <w:b/>
                 <w:sz w:val="24"/>
               </w:rPr>
-              <w:t>Autor: Alrifaai Alrifaaie Amaal</w:t>
+              <w:t>Autor:</w:t>
+              <w:br/>
+            </w:r>
+            <w:r>
+              <w:rPr>
+                <w:rFonts w:ascii="Times New Roman" w:hAnsi="Times New Roman"/>
+                <w:b/>
+                <w:sz w:val="24"/>
+              </w:rPr>
+              <w:t>Alrifaai Alrifaaie Amaal</w:t>
               <w:br/>
             </w:r>
             <w:r>
@@ -329,7 +365,7 @@
     </w:tbl>
     <w:p>
       <w:pPr>
-        <w:spacing w:line="276" w:lineRule="auto" w:before="777" w:after="0"/>
+        <w:spacing w:line="276" w:lineRule="auto" w:before="501" w:after="0"/>
         <w:jc w:val="center"/>
       </w:pPr>
       <w:r>

</xml_diff>

<commit_message>
Logo portada: solo ancho 3cm sin forzar alto (aspecto original)
</commit_message>
<xml_diff>
--- a/amaal/reportes/Informe_Pasantia_IUTECP.docx
+++ b/amaal/reportes/Informe_Pasantia_IUTECP.docx
@@ -60,7 +60,7 @@
       <w:r>
         <w:drawing>
           <wp:inline xmlns:a="http://schemas.openxmlformats.org/drawingml/2006/main" xmlns:pic="http://schemas.openxmlformats.org/drawingml/2006/picture">
-            <wp:extent cx="1620000" cy="1440000"/>
+            <wp:extent cx="1080000" cy="347711"/>
             <wp:docPr id="1" name="Picture 1"/>
             <wp:cNvGraphicFramePr>
               <a:graphicFrameLocks noChangeAspect="1"/>
@@ -81,7 +81,7 @@
                   <pic:spPr>
                     <a:xfrm>
                       <a:off x="0" y="0"/>
-                      <a:ext cx="1620000" cy="1440000"/>
+                      <a:ext cx="1080000" cy="347711"/>
                     </a:xfrm>
                     <a:prstGeom prst="rect"/>
                   </pic:spPr>
@@ -94,7 +94,7 @@
     </w:p>
     <w:p>
       <w:pPr>
-        <w:spacing w:line="276" w:lineRule="auto" w:before="1344" w:after="0"/>
+        <w:spacing w:line="276" w:lineRule="auto" w:before="2044" w:after="0"/>
         <w:jc w:val="center"/>
       </w:pPr>
       <w:r>

</xml_diff>

<commit_message>
Portada: espaciado 12pt entre membrete, logo y titulo
</commit_message>
<xml_diff>
--- a/amaal/reportes/Informe_Pasantia_IUTECP.docx
+++ b/amaal/reportes/Informe_Pasantia_IUTECP.docx
@@ -54,7 +54,7 @@
     </w:p>
     <w:p>
       <w:pPr>
-        <w:spacing w:before="120" w:after="120"/>
+        <w:spacing w:before="240" w:after="240"/>
         <w:jc w:val="center"/>
       </w:pPr>
       <w:r>
@@ -94,7 +94,7 @@
     </w:p>
     <w:p>
       <w:pPr>
-        <w:spacing w:line="276" w:lineRule="auto" w:before="2044" w:after="0"/>
+        <w:spacing w:line="276" w:lineRule="auto" w:before="3844" w:after="0"/>
         <w:jc w:val="center"/>
       </w:pPr>
       <w:r>

</xml_diff>

<commit_message>
Portada: gaps iguales en puntos entre todos los bloques
</commit_message>
<xml_diff>
--- a/amaal/reportes/Informe_Pasantia_IUTECP.docx
+++ b/amaal/reportes/Informe_Pasantia_IUTECP.docx
@@ -54,7 +54,7 @@
     </w:p>
     <w:p>
       <w:pPr>
-        <w:spacing w:before="240" w:after="240"/>
+        <w:spacing w:before="1881" w:after="1881"/>
         <w:jc w:val="center"/>
       </w:pPr>
       <w:r>
@@ -94,7 +94,7 @@
     </w:p>
     <w:p>
       <w:pPr>
-        <w:spacing w:line="276" w:lineRule="auto" w:before="3844" w:after="0"/>
+        <w:spacing w:line="276" w:lineRule="auto" w:before="1881" w:after="0"/>
         <w:jc w:val="center"/>
       </w:pPr>
       <w:r>
@@ -108,7 +108,7 @@
     </w:p>
     <w:p>
       <w:pPr>
-        <w:spacing w:line="276" w:lineRule="auto" w:before="2281" w:after="0"/>
+        <w:spacing w:line="276" w:lineRule="auto" w:before="1881" w:after="0"/>
         <w:jc w:val="right"/>
       </w:pPr>
       <w:r>
@@ -140,7 +140,7 @@
     </w:p>
     <w:p>
       <w:pPr>
-        <w:spacing w:line="276" w:lineRule="auto" w:before="2033" w:after="0"/>
+        <w:spacing w:line="276" w:lineRule="auto" w:before="1881" w:after="0"/>
         <w:jc w:val="center"/>
       </w:pPr>
       <w:r>
@@ -214,7 +214,7 @@
     </w:p>
     <w:p>
       <w:pPr>
-        <w:spacing w:line="276" w:lineRule="auto" w:before="2973" w:after="0"/>
+        <w:spacing w:line="276" w:lineRule="auto" w:before="2490" w:after="0"/>
         <w:jc w:val="center"/>
       </w:pPr>
       <w:r>
@@ -228,7 +228,7 @@
     </w:p>
     <w:p>
       <w:pPr>
-        <w:spacing w:before="2033" w:after="0" w:line="20" w:lineRule="exact"/>
+        <w:spacing w:before="2490" w:after="0" w:line="20" w:lineRule="exact"/>
       </w:pPr>
     </w:p>
     <w:tbl>
@@ -365,7 +365,7 @@
     </w:tbl>
     <w:p>
       <w:pPr>
-        <w:spacing w:line="276" w:lineRule="auto" w:before="1745" w:after="0"/>
+        <w:spacing w:line="276" w:lineRule="auto" w:before="2490" w:after="0"/>
         <w:jc w:val="center"/>
       </w:pPr>
       <w:r>

</xml_diff>

<commit_message>
Logo centrado en gap membrete-titulo sin gaps propios
</commit_message>
<xml_diff>
--- a/amaal/reportes/Informe_Pasantia_IUTECP.docx
+++ b/amaal/reportes/Informe_Pasantia_IUTECP.docx
@@ -54,7 +54,7 @@
     </w:p>
     <w:p>
       <w:pPr>
-        <w:spacing w:before="1881" w:after="1881"/>
+        <w:spacing w:before="721" w:after="721"/>
         <w:jc w:val="center"/>
       </w:pPr>
       <w:r>
@@ -94,7 +94,7 @@
     </w:p>
     <w:p>
       <w:pPr>
-        <w:spacing w:line="276" w:lineRule="auto" w:before="1881" w:after="0"/>
+        <w:spacing w:line="276" w:lineRule="auto" w:before="0" w:after="0"/>
         <w:jc w:val="center"/>
       </w:pPr>
       <w:r>
@@ -108,7 +108,7 @@
     </w:p>
     <w:p>
       <w:pPr>
-        <w:spacing w:line="276" w:lineRule="auto" w:before="1881" w:after="0"/>
+        <w:spacing w:line="276" w:lineRule="auto" w:before="3042" w:after="0"/>
         <w:jc w:val="right"/>
       </w:pPr>
       <w:r>
@@ -140,7 +140,7 @@
     </w:p>
     <w:p>
       <w:pPr>
-        <w:spacing w:line="276" w:lineRule="auto" w:before="1881" w:after="0"/>
+        <w:spacing w:line="276" w:lineRule="auto" w:before="3042" w:after="0"/>
         <w:jc w:val="center"/>
       </w:pPr>
       <w:r>

</xml_diff>

<commit_message>
Gap datos-fecha = mitad del gap normal
</commit_message>
<xml_diff>
--- a/amaal/reportes/Informe_Pasantia_IUTECP.docx
+++ b/amaal/reportes/Informe_Pasantia_IUTECP.docx
@@ -54,7 +54,7 @@
     </w:p>
     <w:p>
       <w:pPr>
-        <w:spacing w:before="721" w:after="721"/>
+        <w:spacing w:before="1025" w:after="1025"/>
         <w:jc w:val="center"/>
       </w:pPr>
       <w:r>
@@ -108,7 +108,7 @@
     </w:p>
     <w:p>
       <w:pPr>
-        <w:spacing w:line="276" w:lineRule="auto" w:before="3042" w:after="0"/>
+        <w:spacing w:line="276" w:lineRule="auto" w:before="3650" w:after="0"/>
         <w:jc w:val="right"/>
       </w:pPr>
       <w:r>
@@ -140,7 +140,7 @@
     </w:p>
     <w:p>
       <w:pPr>
-        <w:spacing w:line="276" w:lineRule="auto" w:before="3042" w:after="0"/>
+        <w:spacing w:line="276" w:lineRule="auto" w:before="1825" w:after="0"/>
         <w:jc w:val="center"/>
       </w:pPr>
       <w:r>
@@ -214,7 +214,7 @@
     </w:p>
     <w:p>
       <w:pPr>
-        <w:spacing w:line="276" w:lineRule="auto" w:before="2490" w:after="0"/>
+        <w:spacing w:line="276" w:lineRule="auto" w:before="2988" w:after="0"/>
         <w:jc w:val="center"/>
       </w:pPr>
       <w:r>
@@ -228,7 +228,7 @@
     </w:p>
     <w:p>
       <w:pPr>
-        <w:spacing w:before="2490" w:after="0" w:line="20" w:lineRule="exact"/>
+        <w:spacing w:before="2988" w:after="0" w:line="20" w:lineRule="exact"/>
       </w:pPr>
     </w:p>
     <w:tbl>
@@ -365,7 +365,7 @@
     </w:tbl>
     <w:p>
       <w:pPr>
-        <w:spacing w:line="276" w:lineRule="auto" w:before="2490" w:after="0"/>
+        <w:spacing w:line="276" w:lineRule="auto" w:before="1494" w:after="0"/>
         <w:jc w:val="center"/>
       </w:pPr>
       <w:r>

</xml_diff>

<commit_message>
Portada: gap membrete-titulo 1.2x mas grande que gap titulo-datos
</commit_message>
<xml_diff>
--- a/amaal/reportes/Informe_Pasantia_IUTECP.docx
+++ b/amaal/reportes/Informe_Pasantia_IUTECP.docx
@@ -54,7 +54,7 @@
     </w:p>
     <w:p>
       <w:pPr>
-        <w:spacing w:before="1025" w:after="1025"/>
+        <w:spacing w:before="1228" w:after="1228"/>
         <w:jc w:val="center"/>
       </w:pPr>
       <w:r>
@@ -108,7 +108,7 @@
     </w:p>
     <w:p>
       <w:pPr>
-        <w:spacing w:line="276" w:lineRule="auto" w:before="3650" w:after="0"/>
+        <w:spacing w:line="276" w:lineRule="auto" w:before="3380" w:after="0"/>
         <w:jc w:val="right"/>
       </w:pPr>
       <w:r>
@@ -140,7 +140,7 @@
     </w:p>
     <w:p>
       <w:pPr>
-        <w:spacing w:line="276" w:lineRule="auto" w:before="1825" w:after="0"/>
+        <w:spacing w:line="276" w:lineRule="auto" w:before="1690" w:after="0"/>
         <w:jc w:val="center"/>
       </w:pPr>
       <w:r>
@@ -214,7 +214,7 @@
     </w:p>
     <w:p>
       <w:pPr>
-        <w:spacing w:line="276" w:lineRule="auto" w:before="2988" w:after="0"/>
+        <w:spacing w:line="276" w:lineRule="auto" w:before="3320" w:after="0"/>
         <w:jc w:val="center"/>
       </w:pPr>
       <w:r>
@@ -228,7 +228,7 @@
     </w:p>
     <w:p>
       <w:pPr>
-        <w:spacing w:before="2988" w:after="0" w:line="20" w:lineRule="exact"/>
+        <w:spacing w:before="2767" w:after="0" w:line="20" w:lineRule="exact"/>
       </w:pPr>
     </w:p>
     <w:tbl>
@@ -365,7 +365,7 @@
     </w:tbl>
     <w:p>
       <w:pPr>
-        <w:spacing w:line="276" w:lineRule="auto" w:before="1494" w:after="0"/>
+        <w:spacing w:line="276" w:lineRule="auto" w:before="1383" w:after="0"/>
         <w:jc w:val="center"/>
       </w:pPr>
       <w:r>

</xml_diff>

<commit_message>
Logo en primer tercio del gap membrete-titulo; gap_mt 1.3x
</commit_message>
<xml_diff>
--- a/amaal/reportes/Informe_Pasantia_IUTECP.docx
+++ b/amaal/reportes/Informe_Pasantia_IUTECP.docx
@@ -54,7 +54,7 @@
     </w:p>
     <w:p>
       <w:pPr>
-        <w:spacing w:before="1228" w:after="1228"/>
+        <w:spacing w:before="1412" w:after="1225"/>
         <w:jc w:val="center"/>
       </w:pPr>
       <w:r>
@@ -108,7 +108,7 @@
     </w:p>
     <w:p>
       <w:pPr>
-        <w:spacing w:line="276" w:lineRule="auto" w:before="3380" w:after="0"/>
+        <w:spacing w:line="276" w:lineRule="auto" w:before="3259" w:after="0"/>
         <w:jc w:val="right"/>
       </w:pPr>
       <w:r>
@@ -140,7 +140,7 @@
     </w:p>
     <w:p>
       <w:pPr>
-        <w:spacing w:line="276" w:lineRule="auto" w:before="1690" w:after="0"/>
+        <w:spacing w:line="276" w:lineRule="auto" w:before="1630" w:after="0"/>
         <w:jc w:val="center"/>
       </w:pPr>
       <w:r>
@@ -214,7 +214,7 @@
     </w:p>
     <w:p>
       <w:pPr>
-        <w:spacing w:line="276" w:lineRule="auto" w:before="3320" w:after="0"/>
+        <w:spacing w:line="276" w:lineRule="auto" w:before="3468" w:after="0"/>
         <w:jc w:val="center"/>
       </w:pPr>
       <w:r>
@@ -228,7 +228,7 @@
     </w:p>
     <w:p>
       <w:pPr>
-        <w:spacing w:before="2767" w:after="0" w:line="20" w:lineRule="exact"/>
+        <w:spacing w:before="2668" w:after="0" w:line="20" w:lineRule="exact"/>
       </w:pPr>
     </w:p>
     <w:tbl>
@@ -365,7 +365,7 @@
     </w:tbl>
     <w:p>
       <w:pPr>
-        <w:spacing w:line="276" w:lineRule="auto" w:before="1383" w:after="0"/>
+        <w:spacing w:line="276" w:lineRule="auto" w:before="1334" w:after="0"/>
         <w:jc w:val="center"/>
       </w:pPr>
       <w:r>

</xml_diff>

<commit_message>
gap_mt 1.2x y logo en primer tercio del gap
</commit_message>
<xml_diff>
--- a/amaal/reportes/Informe_Pasantia_IUTECP.docx
+++ b/amaal/reportes/Informe_Pasantia_IUTECP.docx
@@ -54,7 +54,7 @@
     </w:p>
     <w:p>
       <w:pPr>
-        <w:spacing w:before="1412" w:after="1225"/>
+        <w:spacing w:before="1304" w:after="1007"/>
         <w:jc w:val="center"/>
       </w:pPr>
       <w:r>
@@ -214,7 +214,7 @@
     </w:p>
     <w:p>
       <w:pPr>
-        <w:spacing w:line="276" w:lineRule="auto" w:before="3468" w:after="0"/>
+        <w:spacing w:line="276" w:lineRule="auto" w:before="3201" w:after="0"/>
         <w:jc w:val="center"/>
       </w:pPr>
       <w:r>

</xml_diff>

<commit_message>
Fix: divisor gap 2.7 (no 2.8) + safety 30pt para evitar desborde
</commit_message>
<xml_diff>
--- a/amaal/reportes/Informe_Pasantia_IUTECP.docx
+++ b/amaal/reportes/Informe_Pasantia_IUTECP.docx
@@ -54,7 +54,7 @@
     </w:p>
     <w:p>
       <w:pPr>
-        <w:spacing w:before="1304" w:after="1007"/>
+        <w:spacing w:before="1263" w:after="926"/>
         <w:jc w:val="center"/>
       </w:pPr>
       <w:r>
@@ -108,7 +108,7 @@
     </w:p>
     <w:p>
       <w:pPr>
-        <w:spacing w:line="276" w:lineRule="auto" w:before="3259" w:after="0"/>
+        <w:spacing w:line="276" w:lineRule="auto" w:before="3158" w:after="0"/>
         <w:jc w:val="right"/>
       </w:pPr>
       <w:r>
@@ -140,7 +140,7 @@
     </w:p>
     <w:p>
       <w:pPr>
-        <w:spacing w:line="276" w:lineRule="auto" w:before="1630" w:after="0"/>
+        <w:spacing w:line="276" w:lineRule="auto" w:before="1579" w:after="0"/>
         <w:jc w:val="center"/>
       </w:pPr>
       <w:r>
@@ -214,7 +214,7 @@
     </w:p>
     <w:p>
       <w:pPr>
-        <w:spacing w:line="276" w:lineRule="auto" w:before="3201" w:after="0"/>
+        <w:spacing w:line="276" w:lineRule="auto" w:before="3053" w:after="0"/>
         <w:jc w:val="center"/>
       </w:pPr>
       <w:r>
@@ -228,7 +228,7 @@
     </w:p>
     <w:p>
       <w:pPr>
-        <w:spacing w:before="2668" w:after="0" w:line="20" w:lineRule="exact"/>
+        <w:spacing w:before="2544" w:after="0" w:line="20" w:lineRule="exact"/>
       </w:pPr>
     </w:p>
     <w:tbl>
@@ -365,7 +365,7 @@
     </w:tbl>
     <w:p>
       <w:pPr>
-        <w:spacing w:line="276" w:lineRule="auto" w:before="1334" w:after="0"/>
+        <w:spacing w:line="276" w:lineRule="auto" w:before="1272" w:after="0"/>
         <w:jc w:val="center"/>
       </w:pPr>
       <w:r>

</xml_diff>

<commit_message>
Agregar pagina LISTA DE FIGURAS despues de LISTA DE CUADROS
</commit_message>
<xml_diff>
--- a/amaal/reportes/Informe_Pasantia_IUTECP.docx
+++ b/amaal/reportes/Informe_Pasantia_IUTECP.docx
@@ -643,6 +643,36 @@
           <w:b w:val="0"/>
           <w:sz w:val="24"/>
         </w:rPr>
+        <w:t>LISTA DE FIGURAS</w:t>
+        <w:tab/>
+      </w:r>
+      <w:r>
+        <w:rPr>
+          <w:rFonts w:ascii="Times New Roman" w:hAnsi="Times New Roman"/>
+          <w:b w:val="0"/>
+          <w:sz w:val="24"/>
+        </w:rPr>
+        <w:fldChar w:fldCharType="begin"/>
+        <w:instrText xml:space="preserve"> PAGEREF bm_lista_figuras \h </w:instrText>
+        <w:fldChar w:fldCharType="separate"/>
+        <w:t>?</w:t>
+        <w:fldChar w:fldCharType="end"/>
+      </w:r>
+    </w:p>
+    <w:p>
+      <w:pPr>
+        <w:tabs>
+          <w:tab w:pos="8271" w:val="right" w:leader="dot"/>
+        </w:tabs>
+        <w:spacing w:line="360" w:lineRule="auto" w:before="0" w:after="80"/>
+        <w:ind w:left="0"/>
+      </w:pPr>
+      <w:r>
+        <w:rPr>
+          <w:rFonts w:ascii="Times New Roman" w:hAnsi="Times New Roman"/>
+          <w:b w:val="0"/>
+          <w:sz w:val="24"/>
+        </w:rPr>
         <w:t>LISTA DE GRÁFICOS</w:t>
         <w:tab/>
       </w:r>
@@ -1655,7 +1685,7 @@
       </w:pPr>
     </w:p>
     <w:p>
-      <w:bookmarkStart w:id="bm_lista_graficos" w:name="bm_lista_graficos"/>
+      <w:bookmarkStart w:id="bm_lista_figuras" w:name="bm_lista_figuras"/>
       <w:pPr>
         <w:spacing w:after="480"/>
         <w:jc w:val="center"/>
@@ -1666,9 +1696,9 @@
           <w:b/>
           <w:sz w:val="24"/>
         </w:rPr>
-        <w:t>LISTA DE GRÁFICOS</w:t>
-      </w:r>
-      <w:bookmarkEnd w:id="bm_lista_graficos"/>
+        <w:t>LISTA DE FIGURAS</w:t>
+      </w:r>
+      <w:bookmarkEnd w:id="bm_lista_figuras"/>
     </w:p>
     <w:p>
       <w:pPr>
@@ -1681,129 +1711,6 @@
           <w:docGrid w:linePitch="360"/>
         </w:sectPr>
       </w:pPr>
-    </w:p>
-    <w:p>
-      <w:pPr>
-        <w:tabs>
-          <w:tab w:pos="8271" w:val="right"/>
-        </w:tabs>
-        <w:spacing w:before="240" w:after="240"/>
-      </w:pPr>
-      <w:r>
-        <w:rPr>
-          <w:rFonts w:ascii="Times New Roman" w:hAnsi="Times New Roman"/>
-          <w:b/>
-          <w:sz w:val="24"/>
-        </w:rPr>
-        <w:t>GRÁFICO</w:t>
-      </w:r>
-      <w:r>
-        <w:tab/>
-      </w:r>
-      <w:r>
-        <w:rPr>
-          <w:rFonts w:ascii="Times New Roman" w:hAnsi="Times New Roman"/>
-          <w:b/>
-          <w:sz w:val="24"/>
-        </w:rPr>
-        <w:t>pp.</w:t>
-      </w:r>
-    </w:p>
-    <w:p>
-      <w:pPr>
-        <w:tabs>
-          <w:tab w:pos="1020" w:val="left"/>
-          <w:tab w:pos="8271" w:val="right" w:leader="dot"/>
-        </w:tabs>
-        <w:spacing w:line="360" w:lineRule="auto" w:before="0" w:after="80"/>
-        <w:ind w:left="1020" w:hanging="1020"/>
-      </w:pPr>
-      <w:r>
-        <w:rPr>
-          <w:rFonts w:ascii="Times New Roman" w:hAnsi="Times New Roman"/>
-          <w:sz w:val="24"/>
-        </w:rPr>
-        <w:t>1</w:t>
-        <w:tab/>
-        <w:t>Representación cartográfica y ubicación espacial de Ingeniería de Telecomunicaciones, C.A.</w:t>
-        <w:tab/>
-      </w:r>
-      <w:r>
-        <w:rPr>
-          <w:rFonts w:ascii="Times New Roman" w:hAnsi="Times New Roman"/>
-          <w:b w:val="0"/>
-          <w:sz w:val="24"/>
-        </w:rPr>
-        <w:fldChar w:fldCharType="begin"/>
-        <w:instrText xml:space="preserve"> PAGEREF bm_grafico1 \h </w:instrText>
-        <w:fldChar w:fldCharType="separate"/>
-        <w:t>?</w:t>
-        <w:fldChar w:fldCharType="end"/>
-      </w:r>
-    </w:p>
-    <w:p>
-      <w:pPr>
-        <w:tabs>
-          <w:tab w:pos="1020" w:val="left"/>
-          <w:tab w:pos="8271" w:val="right" w:leader="dot"/>
-        </w:tabs>
-        <w:spacing w:line="360" w:lineRule="auto" w:before="0" w:after="80"/>
-        <w:ind w:left="1020" w:hanging="1020"/>
-      </w:pPr>
-      <w:r>
-        <w:rPr>
-          <w:rFonts w:ascii="Times New Roman" w:hAnsi="Times New Roman"/>
-          <w:sz w:val="24"/>
-        </w:rPr>
-        <w:t>2</w:t>
-        <w:tab/>
-        <w:t>Organigrama estructural y niveles jerárquicos de Ingeniería de Telecomunicaciones, C.A.</w:t>
-        <w:tab/>
-      </w:r>
-      <w:r>
-        <w:rPr>
-          <w:rFonts w:ascii="Times New Roman" w:hAnsi="Times New Roman"/>
-          <w:b w:val="0"/>
-          <w:sz w:val="24"/>
-        </w:rPr>
-        <w:fldChar w:fldCharType="begin"/>
-        <w:instrText xml:space="preserve"> PAGEREF bm_grafico2 \h </w:instrText>
-        <w:fldChar w:fldCharType="separate"/>
-        <w:t>?</w:t>
-        <w:fldChar w:fldCharType="end"/>
-      </w:r>
-    </w:p>
-    <w:p>
-      <w:pPr>
-        <w:tabs>
-          <w:tab w:pos="1020" w:val="left"/>
-          <w:tab w:pos="8271" w:val="right" w:leader="dot"/>
-        </w:tabs>
-        <w:spacing w:line="360" w:lineRule="auto" w:before="0" w:after="80"/>
-        <w:ind w:left="1020" w:hanging="1020"/>
-      </w:pPr>
-      <w:r>
-        <w:rPr>
-          <w:rFonts w:ascii="Times New Roman" w:hAnsi="Times New Roman"/>
-          <w:sz w:val="24"/>
-        </w:rPr>
-        <w:t>3</w:t>
-        <w:tab/>
-        <w:t>Organigrama del Departamento de Administración.</w:t>
-        <w:tab/>
-      </w:r>
-      <w:r>
-        <w:rPr>
-          <w:rFonts w:ascii="Times New Roman" w:hAnsi="Times New Roman"/>
-          <w:b w:val="0"/>
-          <w:sz w:val="24"/>
-        </w:rPr>
-        <w:fldChar w:fldCharType="begin"/>
-        <w:instrText xml:space="preserve"> PAGEREF bm_grafico3 \h </w:instrText>
-        <w:fldChar w:fldCharType="separate"/>
-        <w:t>?</w:t>
-        <w:fldChar w:fldCharType="end"/>
-      </w:r>
     </w:p>
     <w:p>
       <w:pPr>
@@ -1819,7 +1726,7 @@
       </w:pPr>
     </w:p>
     <w:p>
-      <w:bookmarkStart w:id="bm_lista_anexos" w:name="bm_lista_anexos"/>
+      <w:bookmarkStart w:id="bm_lista_graficos" w:name="bm_lista_graficos"/>
       <w:pPr>
         <w:spacing w:after="480"/>
         <w:jc w:val="center"/>
@@ -1830,9 +1737,9 @@
           <w:b/>
           <w:sz w:val="24"/>
         </w:rPr>
-        <w:t>LISTA DE ANEXOS</w:t>
-      </w:r>
-      <w:bookmarkEnd w:id="bm_lista_anexos"/>
+        <w:t>LISTA DE GRÁFICOS</w:t>
+      </w:r>
+      <w:bookmarkEnd w:id="bm_lista_graficos"/>
     </w:p>
     <w:p>
       <w:pPr>
@@ -1859,7 +1766,7 @@
           <w:b/>
           <w:sz w:val="24"/>
         </w:rPr>
-        <w:t>ANEXOS</w:t>
+        <w:t>GRÁFICO</w:t>
       </w:r>
       <w:r>
         <w:tab/>
@@ -1887,9 +1794,9 @@
           <w:rFonts w:ascii="Times New Roman" w:hAnsi="Times New Roman"/>
           <w:sz w:val="24"/>
         </w:rPr>
-        <w:t>A</w:t>
+        <w:t>1</w:t>
         <w:tab/>
-        <w:t>Aquí va la descripción del Anexo A</w:t>
+        <w:t>Representación cartográfica y ubicación espacial de Ingeniería de Telecomunicaciones, C.A.</w:t>
         <w:tab/>
       </w:r>
       <w:r>
@@ -1899,7 +1806,7 @@
           <w:sz w:val="24"/>
         </w:rPr>
         <w:fldChar w:fldCharType="begin"/>
-        <w:instrText xml:space="preserve"> PAGEREF bm_anexoA \h </w:instrText>
+        <w:instrText xml:space="preserve"> PAGEREF bm_grafico1 \h </w:instrText>
         <w:fldChar w:fldCharType="separate"/>
         <w:t>?</w:t>
         <w:fldChar w:fldCharType="end"/>
@@ -1919,9 +1826,9 @@
           <w:rFonts w:ascii="Times New Roman" w:hAnsi="Times New Roman"/>
           <w:sz w:val="24"/>
         </w:rPr>
-        <w:t>B</w:t>
+        <w:t>2</w:t>
         <w:tab/>
-        <w:t>Aquí va la descripción del Anexo B</w:t>
+        <w:t>Organigrama estructural y niveles jerárquicos de Ingeniería de Telecomunicaciones, C.A.</w:t>
         <w:tab/>
       </w:r>
       <w:r>
@@ -1931,7 +1838,7 @@
           <w:sz w:val="24"/>
         </w:rPr>
         <w:fldChar w:fldCharType="begin"/>
-        <w:instrText xml:space="preserve"> PAGEREF bm_anexoB \h </w:instrText>
+        <w:instrText xml:space="preserve"> PAGEREF bm_grafico2 \h </w:instrText>
         <w:fldChar w:fldCharType="separate"/>
         <w:t>?</w:t>
         <w:fldChar w:fldCharType="end"/>
@@ -1951,9 +1858,9 @@
           <w:rFonts w:ascii="Times New Roman" w:hAnsi="Times New Roman"/>
           <w:sz w:val="24"/>
         </w:rPr>
-        <w:t>C</w:t>
+        <w:t>3</w:t>
         <w:tab/>
-        <w:t>Aquí va la descripción del Anexo C</w:t>
+        <w:t>Organigrama del Departamento de Administración.</w:t>
         <w:tab/>
       </w:r>
       <w:r>
@@ -1963,7 +1870,7 @@
           <w:sz w:val="24"/>
         </w:rPr>
         <w:fldChar w:fldCharType="begin"/>
-        <w:instrText xml:space="preserve"> PAGEREF bm_anexoC \h </w:instrText>
+        <w:instrText xml:space="preserve"> PAGEREF bm_grafico3 \h </w:instrText>
         <w:fldChar w:fldCharType="separate"/>
         <w:t>?</w:t>
         <w:fldChar w:fldCharType="end"/>
@@ -1983,7 +1890,7 @@
       </w:pPr>
     </w:p>
     <w:p>
-      <w:bookmarkStart w:id="bm_resumen" w:name="bm_resumen"/>
+      <w:bookmarkStart w:id="bm_lista_anexos" w:name="bm_lista_anexos"/>
       <w:pPr>
         <w:spacing w:after="480"/>
         <w:jc w:val="center"/>
@@ -1994,9 +1901,9 @@
           <w:b/>
           <w:sz w:val="24"/>
         </w:rPr>
-        <w:t>RESUMEN</w:t>
-      </w:r>
-      <w:bookmarkEnd w:id="bm_resumen"/>
+        <w:t>LISTA DE ANEXOS</w:t>
+      </w:r>
+      <w:bookmarkEnd w:id="bm_lista_anexos"/>
     </w:p>
     <w:p>
       <w:pPr>
@@ -2012,32 +1919,125 @@
     </w:p>
     <w:p>
       <w:pPr>
-        <w:spacing w:line="360" w:lineRule="auto" w:after="0" w:before="0"/>
-        <w:ind w:firstLine="709"/>
-        <w:jc w:val="both"/>
+        <w:tabs>
+          <w:tab w:pos="8271" w:val="right"/>
+        </w:tabs>
+        <w:spacing w:before="240" w:after="240"/>
       </w:pPr>
       <w:r>
         <w:rPr>
           <w:rFonts w:ascii="Times New Roman" w:hAnsi="Times New Roman"/>
-          <w:i w:val="0"/>
+          <w:b/>
           <w:sz w:val="24"/>
         </w:rPr>
-        <w:t>El presente informe describe la evaluación del control administrativo aplicado a la gestión de solicitudes de servicios de telecomunicaciones en la empresa Ingeniería de Telecomunicaciones, C.A. (IDETEL). La investigación se enmarca en la modalidad de proyecto factible apoyado en un diagnóstico de campo. Durante el estudio se identificó la ausencia de procedimientos formalizados para el seguimiento de solicitudes de afiliación e incidencias, la falta de formatos estandarizados de registro y la inexistencia de indicadores de gestión que permitan evaluar el desempeño del proceso de atención al suscriptor. La propuesta contempla un nuevo flujo de trabajo estandarizado, formatos unificados de control y un conjunto de indicadores de gestión orientados a fortalecer el control administrativo y optimizar la calidad del servicio prestado.</w:t>
+        <w:t>ANEXOS</w:t>
+      </w:r>
+      <w:r>
+        <w:tab/>
+      </w:r>
+      <w:r>
+        <w:rPr>
+          <w:rFonts w:ascii="Times New Roman" w:hAnsi="Times New Roman"/>
+          <w:b/>
+          <w:sz w:val="24"/>
+        </w:rPr>
+        <w:t>pp.</w:t>
       </w:r>
     </w:p>
-    <w:p/>
     <w:p>
       <w:pPr>
-        <w:ind w:firstLine="709"/>
-      </w:pPr>
-      <w:r>
-        <w:rPr>
-          <w:b/>
-        </w:rPr>
-        <w:t xml:space="preserve">Palabras claves: </w:t>
-      </w:r>
-      <w:r>
-        <w:t>control administrativo, solicitudes de servicios, telecomunicaciones, proyecto factible, pasantías.</w:t>
+        <w:tabs>
+          <w:tab w:pos="1020" w:val="left"/>
+          <w:tab w:pos="8271" w:val="right" w:leader="dot"/>
+        </w:tabs>
+        <w:spacing w:line="360" w:lineRule="auto" w:before="0" w:after="80"/>
+        <w:ind w:left="1020" w:hanging="1020"/>
+      </w:pPr>
+      <w:r>
+        <w:rPr>
+          <w:rFonts w:ascii="Times New Roman" w:hAnsi="Times New Roman"/>
+          <w:sz w:val="24"/>
+        </w:rPr>
+        <w:t>A</w:t>
+        <w:tab/>
+        <w:t>Aquí va la descripción del Anexo A</w:t>
+        <w:tab/>
+      </w:r>
+      <w:r>
+        <w:rPr>
+          <w:rFonts w:ascii="Times New Roman" w:hAnsi="Times New Roman"/>
+          <w:b w:val="0"/>
+          <w:sz w:val="24"/>
+        </w:rPr>
+        <w:fldChar w:fldCharType="begin"/>
+        <w:instrText xml:space="preserve"> PAGEREF bm_anexoA \h </w:instrText>
+        <w:fldChar w:fldCharType="separate"/>
+        <w:t>?</w:t>
+        <w:fldChar w:fldCharType="end"/>
+      </w:r>
+    </w:p>
+    <w:p>
+      <w:pPr>
+        <w:tabs>
+          <w:tab w:pos="1020" w:val="left"/>
+          <w:tab w:pos="8271" w:val="right" w:leader="dot"/>
+        </w:tabs>
+        <w:spacing w:line="360" w:lineRule="auto" w:before="0" w:after="80"/>
+        <w:ind w:left="1020" w:hanging="1020"/>
+      </w:pPr>
+      <w:r>
+        <w:rPr>
+          <w:rFonts w:ascii="Times New Roman" w:hAnsi="Times New Roman"/>
+          <w:sz w:val="24"/>
+        </w:rPr>
+        <w:t>B</w:t>
+        <w:tab/>
+        <w:t>Aquí va la descripción del Anexo B</w:t>
+        <w:tab/>
+      </w:r>
+      <w:r>
+        <w:rPr>
+          <w:rFonts w:ascii="Times New Roman" w:hAnsi="Times New Roman"/>
+          <w:b w:val="0"/>
+          <w:sz w:val="24"/>
+        </w:rPr>
+        <w:fldChar w:fldCharType="begin"/>
+        <w:instrText xml:space="preserve"> PAGEREF bm_anexoB \h </w:instrText>
+        <w:fldChar w:fldCharType="separate"/>
+        <w:t>?</w:t>
+        <w:fldChar w:fldCharType="end"/>
+      </w:r>
+    </w:p>
+    <w:p>
+      <w:pPr>
+        <w:tabs>
+          <w:tab w:pos="1020" w:val="left"/>
+          <w:tab w:pos="8271" w:val="right" w:leader="dot"/>
+        </w:tabs>
+        <w:spacing w:line="360" w:lineRule="auto" w:before="0" w:after="80"/>
+        <w:ind w:left="1020" w:hanging="1020"/>
+      </w:pPr>
+      <w:r>
+        <w:rPr>
+          <w:rFonts w:ascii="Times New Roman" w:hAnsi="Times New Roman"/>
+          <w:sz w:val="24"/>
+        </w:rPr>
+        <w:t>C</w:t>
+        <w:tab/>
+        <w:t>Aquí va la descripción del Anexo C</w:t>
+        <w:tab/>
+      </w:r>
+      <w:r>
+        <w:rPr>
+          <w:rFonts w:ascii="Times New Roman" w:hAnsi="Times New Roman"/>
+          <w:b w:val="0"/>
+          <w:sz w:val="24"/>
+        </w:rPr>
+        <w:fldChar w:fldCharType="begin"/>
+        <w:instrText xml:space="preserve"> PAGEREF bm_anexoC \h </w:instrText>
+        <w:fldChar w:fldCharType="separate"/>
+        <w:t>?</w:t>
+        <w:fldChar w:fldCharType="end"/>
       </w:r>
     </w:p>
     <w:p>
@@ -2054,7 +2054,7 @@
       </w:pPr>
     </w:p>
     <w:p>
-      <w:bookmarkStart w:id="bm_introduccion" w:name="bm_introduccion"/>
+      <w:bookmarkStart w:id="bm_resumen" w:name="bm_resumen"/>
       <w:pPr>
         <w:spacing w:after="480"/>
         <w:jc w:val="center"/>
@@ -2065,9 +2065,9 @@
           <w:b/>
           <w:sz w:val="24"/>
         </w:rPr>
-        <w:t>INTRODUCCIÓN</w:t>
-      </w:r>
-      <w:bookmarkEnd w:id="bm_introduccion"/>
+        <w:t>RESUMEN</w:t>
+      </w:r>
+      <w:bookmarkEnd w:id="bm_resumen"/>
     </w:p>
     <w:p>
       <w:pPr>
@@ -2093,7 +2093,22 @@
           <w:i w:val="0"/>
           <w:sz w:val="24"/>
         </w:rPr>
-        <w:t>La presente pasantía, desarrollada como requisito para optar al título de Técnico Superior Universitario en Administración, tiene como propósito evaluar el control administrativo aplicado a la gestión de solicitudes de servicios de telecomunicaciones en la empresa Ingeniería de Telecomunicaciones, C.A. (IDETEL), con sede en la ciudad de El Tigre, estado Anzoátegui. El estudio parte del diagnóstico de las deficiencias presentes en el proceso de atención al suscriptor para proponer mejoras procedimentales que optimicen el control interno del departamento. El informe se organiza en cinco capítulos: el Capítulo I presenta la realidad organizacional de IDETEL; el Capítulo II desarrolla el diagnóstico situacional y la planificación del proyecto; el Capítulo III sustenta las bases teóricas que orientan la propuesta; el Capítulo IV describe las actividades ejecutadas durante las diez semanas de pasantía; y el Capítulo V presenta las conclusiones y recomendaciones derivadas del proceso investigativo.</w:t>
+        <w:t>El presente informe describe la evaluación del control administrativo aplicado a la gestión de solicitudes de servicios de telecomunicaciones en la empresa Ingeniería de Telecomunicaciones, C.A. (IDETEL). La investigación se enmarca en la modalidad de proyecto factible apoyado en un diagnóstico de campo. Durante el estudio se identificó la ausencia de procedimientos formalizados para el seguimiento de solicitudes de afiliación e incidencias, la falta de formatos estandarizados de registro y la inexistencia de indicadores de gestión que permitan evaluar el desempeño del proceso de atención al suscriptor. La propuesta contempla un nuevo flujo de trabajo estandarizado, formatos unificados de control y un conjunto de indicadores de gestión orientados a fortalecer el control administrativo y optimizar la calidad del servicio prestado.</w:t>
+      </w:r>
+    </w:p>
+    <w:p/>
+    <w:p>
+      <w:pPr>
+        <w:ind w:firstLine="709"/>
+      </w:pPr>
+      <w:r>
+        <w:rPr>
+          <w:b/>
+        </w:rPr>
+        <w:t xml:space="preserve">Palabras claves: </w:t>
+      </w:r>
+      <w:r>
+        <w:t>control administrativo, solicitudes de servicios, telecomunicaciones, proyecto factible, pasantías.</w:t>
       </w:r>
     </w:p>
     <w:p>
@@ -2110,6 +2125,7 @@
       </w:pPr>
     </w:p>
     <w:p>
+      <w:bookmarkStart w:id="bm_introduccion" w:name="bm_introduccion"/>
       <w:pPr>
         <w:spacing w:after="480"/>
         <w:jc w:val="center"/>
@@ -2120,6 +2136,61 @@
           <w:b/>
           <w:sz w:val="24"/>
         </w:rPr>
+        <w:t>INTRODUCCIÓN</w:t>
+      </w:r>
+      <w:bookmarkEnd w:id="bm_introduccion"/>
+    </w:p>
+    <w:p>
+      <w:pPr>
+        <w:sectPr>
+          <w:footerReference w:type="default" r:id="rId29"/>
+          <w:pgSz w:w="12240" w:h="15840"/>
+          <w:pgMar w:top="2835" w:right="1701" w:bottom="1701" w:left="2268" w:header="720" w:footer="720" w:gutter="0"/>
+          <w:cols w:space="720"/>
+          <w:titlePg/>
+          <w:docGrid w:linePitch="360"/>
+        </w:sectPr>
+      </w:pPr>
+    </w:p>
+    <w:p>
+      <w:pPr>
+        <w:spacing w:line="360" w:lineRule="auto" w:after="0" w:before="0"/>
+        <w:ind w:firstLine="709"/>
+        <w:jc w:val="both"/>
+      </w:pPr>
+      <w:r>
+        <w:rPr>
+          <w:rFonts w:ascii="Times New Roman" w:hAnsi="Times New Roman"/>
+          <w:i w:val="0"/>
+          <w:sz w:val="24"/>
+        </w:rPr>
+        <w:t>La presente pasantía, desarrollada como requisito para optar al título de Técnico Superior Universitario en Administración, tiene como propósito evaluar el control administrativo aplicado a la gestión de solicitudes de servicios de telecomunicaciones en la empresa Ingeniería de Telecomunicaciones, C.A. (IDETEL), con sede en la ciudad de El Tigre, estado Anzoátegui. El estudio parte del diagnóstico de las deficiencias presentes en el proceso de atención al suscriptor para proponer mejoras procedimentales que optimicen el control interno del departamento. El informe se organiza en cinco capítulos: el Capítulo I presenta la realidad organizacional de IDETEL; el Capítulo II desarrolla el diagnóstico situacional y la planificación del proyecto; el Capítulo III sustenta las bases teóricas que orientan la propuesta; el Capítulo IV describe las actividades ejecutadas durante las diez semanas de pasantía; y el Capítulo V presenta las conclusiones y recomendaciones derivadas del proceso investigativo.</w:t>
+      </w:r>
+    </w:p>
+    <w:p>
+      <w:pPr>
+        <w:sectPr>
+          <w:footerReference w:type="default" r:id="rId30"/>
+          <w:type w:val="continuous"/>
+          <w:pgSz w:w="12240" w:h="15840"/>
+          <w:pgMar w:top="1701" w:right="1701" w:bottom="1701" w:left="2268" w:header="720" w:footer="720" w:gutter="0"/>
+          <w:cols w:space="720"/>
+          <w:titlePg/>
+          <w:docGrid w:linePitch="360"/>
+        </w:sectPr>
+      </w:pPr>
+    </w:p>
+    <w:p>
+      <w:pPr>
+        <w:spacing w:after="480"/>
+        <w:jc w:val="center"/>
+      </w:pPr>
+      <w:r>
+        <w:rPr>
+          <w:rFonts w:ascii="Times New Roman" w:hAnsi="Times New Roman"/>
+          <w:b/>
+          <w:sz w:val="24"/>
+        </w:rPr>
         <w:t>CAPÍTULO I</w:t>
       </w:r>
     </w:p>
@@ -2142,7 +2213,7 @@
     <w:p>
       <w:pPr>
         <w:sectPr>
-          <w:footerReference w:type="default" r:id="rId29"/>
+          <w:footerReference w:type="default" r:id="rId31"/>
           <w:pgSz w:w="12240" w:h="15840"/>
           <w:pgMar w:top="2835" w:right="1701" w:bottom="1701" w:left="2268" w:header="720" w:footer="720" w:gutter="0"/>
           <w:cols w:space="720"/>
@@ -2881,7 +2952,7 @@
     <w:p>
       <w:pPr>
         <w:sectPr>
-          <w:footerReference w:type="default" r:id="rId30"/>
+          <w:footerReference w:type="default" r:id="rId32"/>
           <w:type w:val="continuous"/>
           <w:pgSz w:w="12240" w:h="15840"/>
           <w:pgMar w:top="1701" w:right="1701" w:bottom="1701" w:left="2268" w:header="720" w:footer="720" w:gutter="0"/>
@@ -2924,7 +2995,7 @@
     <w:p>
       <w:pPr>
         <w:sectPr>
-          <w:footerReference w:type="default" r:id="rId31"/>
+          <w:footerReference w:type="default" r:id="rId33"/>
           <w:pgSz w:w="12240" w:h="15840"/>
           <w:pgMar w:top="2835" w:right="1701" w:bottom="1701" w:left="2268" w:header="720" w:footer="720" w:gutter="0"/>
           <w:cols w:space="720"/>
@@ -6218,363 +6289,6 @@
     <w:p>
       <w:pPr>
         <w:sectPr>
-          <w:footerReference w:type="default" r:id="rId32"/>
-          <w:type w:val="continuous"/>
-          <w:pgSz w:w="12240" w:h="15840"/>
-          <w:pgMar w:top="1701" w:right="1701" w:bottom="1701" w:left="2268" w:header="720" w:footer="720" w:gutter="0"/>
-          <w:cols w:space="720"/>
-          <w:titlePg/>
-          <w:docGrid w:linePitch="360"/>
-        </w:sectPr>
-      </w:pPr>
-    </w:p>
-    <w:p>
-      <w:pPr>
-        <w:spacing w:after="480"/>
-        <w:jc w:val="center"/>
-      </w:pPr>
-      <w:r>
-        <w:rPr>
-          <w:rFonts w:ascii="Times New Roman" w:hAnsi="Times New Roman"/>
-          <w:b/>
-          <w:sz w:val="24"/>
-        </w:rPr>
-        <w:t>CAPÍTULO III</w:t>
-      </w:r>
-    </w:p>
-    <w:p>
-      <w:bookmarkStart w:id="bm_cap3" w:name="bm_cap3"/>
-      <w:pPr>
-        <w:spacing w:before="480"/>
-        <w:jc w:val="center"/>
-      </w:pPr>
-      <w:r>
-        <w:rPr>
-          <w:rFonts w:ascii="Times New Roman" w:hAnsi="Times New Roman"/>
-          <w:b/>
-          <w:sz w:val="24"/>
-        </w:rPr>
-        <w:t>MARCO TEÓRICO</w:t>
-      </w:r>
-      <w:bookmarkEnd w:id="bm_cap3"/>
-    </w:p>
-    <w:p>
-      <w:pPr>
-        <w:sectPr>
-          <w:footerReference w:type="default" r:id="rId33"/>
-          <w:pgSz w:w="12240" w:h="15840"/>
-          <w:pgMar w:top="2835" w:right="1701" w:bottom="1701" w:left="2268" w:header="720" w:footer="720" w:gutter="0"/>
-          <w:cols w:space="720"/>
-          <w:titlePg/>
-          <w:docGrid w:linePitch="360"/>
-        </w:sectPr>
-      </w:pPr>
-    </w:p>
-    <w:p>
-      <w:bookmarkStart w:id="bm_cap3_bases" w:name="bm_cap3_bases"/>
-      <w:pPr>
-        <w:spacing w:before="480" w:after="480" w:line="360" w:lineRule="auto"/>
-        <w:jc w:val="left"/>
-      </w:pPr>
-      <w:r>
-        <w:rPr>
-          <w:rFonts w:ascii="Times New Roman" w:hAnsi="Times New Roman"/>
-          <w:b/>
-          <w:sz w:val="24"/>
-        </w:rPr>
-        <w:t>Control Administrativo</w:t>
-      </w:r>
-      <w:bookmarkEnd w:id="bm_cap3_bases"/>
-    </w:p>
-    <w:p>
-      <w:pPr>
-        <w:spacing w:line="360" w:lineRule="auto" w:after="0" w:before="0"/>
-        <w:ind w:firstLine="709"/>
-        <w:jc w:val="both"/>
-      </w:pPr>
-      <w:r>
-        <w:rPr>
-          <w:rFonts w:ascii="Times New Roman" w:hAnsi="Times New Roman"/>
-          <w:i w:val="0"/>
-          <w:sz w:val="24"/>
-        </w:rPr>
-        <w:t>El control administrativo constituye una de las funciones fundamentales del proceso administrativo y se define como el mecanismo mediante el cual la organización verifica que las actividades ejecutadas se correspondan con lo planificado, detectando desviaciones y aplicando las medidas correctivas necesarias. Robbins y Coulter (2010) señalan que el control eficaz no solo identifica fallas, sino que proporciona información oportuna para la toma de decisiones gerenciales, convirtiéndose en un instrumento de mejora continua y no únicamente de fiscalización.</w:t>
-      </w:r>
-    </w:p>
-    <w:p>
-      <w:pPr>
-        <w:spacing w:line="360" w:lineRule="auto" w:after="0" w:before="0"/>
-        <w:ind w:firstLine="709"/>
-        <w:jc w:val="both"/>
-      </w:pPr>
-      <w:r>
-        <w:rPr>
-          <w:rFonts w:ascii="Times New Roman" w:hAnsi="Times New Roman"/>
-          <w:i w:val="0"/>
-          <w:sz w:val="24"/>
-        </w:rPr>
-        <w:t>En el contexto del Departamento de Administración de Ingeniería de Telecomunicaciones, C.A., el control administrativo se aplica sobre el ciclo de gestión de solicitudes de servicio, abarcando desde la recepción de la solicitud del suscriptor hasta el cierre definitivo del caso. La ausencia de mecanismos formales de control en este ciclo genera inconsistencias entre los departamentos involucrados y dificulta la evaluación del desempeño del proceso de atención.</w:t>
-      </w:r>
-    </w:p>
-    <w:p>
-      <w:pPr>
-        <w:spacing w:line="240" w:lineRule="auto" w:before="720" w:after="240"/>
-        <w:ind w:left="709" w:right="709"/>
-        <w:jc w:val="both"/>
-      </w:pPr>
-      <w:r>
-        <w:rPr>
-          <w:rFonts w:ascii="Times New Roman" w:hAnsi="Times New Roman"/>
-          <w:sz w:val="24"/>
-        </w:rPr>
-        <w:t>El control es el proceso de monitorear las actividades para asegurarse de que se lleven a cabo según lo planeado y para corregir cualquier desviación significativa. Los gerentes no pueden saber realmente si sus unidades están desempeñándose adecuadamente hasta que evalúan qué actividades se han llevado a cabo y comparan el desempeño real con el estándar deseado.</w:t>
-      </w:r>
-      <w:r>
-        <w:rPr>
-          <w:rFonts w:ascii="Times New Roman" w:hAnsi="Times New Roman"/>
-          <w:sz w:val="24"/>
-        </w:rPr>
-        <w:t xml:space="preserve"> (Robbins y Coulter, 2010, p. 398)</w:t>
-      </w:r>
-    </w:p>
-    <w:p>
-      <w:pPr>
-        <w:spacing w:line="360" w:lineRule="auto" w:after="0" w:before="0"/>
-        <w:ind w:firstLine="709"/>
-        <w:jc w:val="both"/>
-      </w:pPr>
-      <w:r>
-        <w:rPr>
-          <w:rFonts w:ascii="Times New Roman" w:hAnsi="Times New Roman"/>
-          <w:i w:val="0"/>
-          <w:sz w:val="24"/>
-        </w:rPr>
-        <w:t>El control administrativo, como lo señalan los autores referidos, no se limita a una función de fiscalización, sino que se constituye en un mecanismo de retroalimentación continua que permite a la organización detectar desviaciones a tiempo y ajustar sus procesos para garantizar la calidad del servicio prestado al suscriptor.</w:t>
-      </w:r>
-    </w:p>
-    <w:p>
-      <w:pPr>
-        <w:spacing w:before="480" w:after="480" w:line="360" w:lineRule="auto"/>
-        <w:jc w:val="left"/>
-      </w:pPr>
-      <w:r>
-        <w:rPr>
-          <w:rFonts w:ascii="Times New Roman" w:hAnsi="Times New Roman"/>
-          <w:b/>
-          <w:sz w:val="24"/>
-        </w:rPr>
-        <w:t>Gestión de Solicitudes de Servicio</w:t>
-      </w:r>
-    </w:p>
-    <w:p>
-      <w:pPr>
-        <w:spacing w:line="360" w:lineRule="auto" w:after="0" w:before="0"/>
-        <w:ind w:firstLine="709"/>
-        <w:jc w:val="both"/>
-      </w:pPr>
-      <w:r>
-        <w:rPr>
-          <w:rFonts w:ascii="Times New Roman" w:hAnsi="Times New Roman"/>
-          <w:i w:val="0"/>
-          <w:sz w:val="24"/>
-        </w:rPr>
-        <w:t>La gestión de solicitudes de servicio comprende el conjunto de procedimientos administrativos orientados a recepcionar, registrar, procesar y dar seguimiento a los requerimientos presentados por los clientes o suscriptores de una organización. Zeithaml, Parasuraman y Berry (1993) establecen que la calidad del servicio percibida por el cliente está directamente vinculada a la capacidad de la organización para gestionar sus solicitudes de forma ágil, transparente y con comunicación fluida en cada etapa del proceso.</w:t>
-      </w:r>
-    </w:p>
-    <w:p>
-      <w:pPr>
-        <w:spacing w:line="360" w:lineRule="auto" w:after="0" w:before="0"/>
-        <w:ind w:firstLine="709"/>
-        <w:jc w:val="both"/>
-      </w:pPr>
-      <w:r>
-        <w:rPr>
-          <w:rFonts w:ascii="Times New Roman" w:hAnsi="Times New Roman"/>
-          <w:i w:val="0"/>
-          <w:sz w:val="24"/>
-        </w:rPr>
-        <w:t>En empresas de telecomunicaciones como IDETEL, la gestión de solicitudes abarca dos categorías principales: las solicitudes de afiliación de nuevos suscriptores, que implican la coordinación entre las áreas comercial, técnica y administrativa; y las incidencias reportadas por suscriptores activos, que requieren diagnóstico, despacho de cuadrillas y cierre verificado del caso. La ausencia de un sistema unificado de seguimiento para ambas categorías genera retrasos y reprocesos que impactan directamente en la satisfacción del cliente.</w:t>
-      </w:r>
-    </w:p>
-    <w:p>
-      <w:pPr>
-        <w:spacing w:before="480" w:after="480" w:line="360" w:lineRule="auto"/>
-        <w:jc w:val="left"/>
-      </w:pPr>
-      <w:r>
-        <w:rPr>
-          <w:rFonts w:ascii="Times New Roman" w:hAnsi="Times New Roman"/>
-          <w:b/>
-          <w:sz w:val="24"/>
-        </w:rPr>
-        <w:t>Procesos Administrativos y Estandarización de Procedimientos</w:t>
-      </w:r>
-    </w:p>
-    <w:p>
-      <w:pPr>
-        <w:spacing w:line="360" w:lineRule="auto" w:after="0" w:before="0"/>
-        <w:ind w:firstLine="709"/>
-        <w:jc w:val="both"/>
-      </w:pPr>
-      <w:r>
-        <w:rPr>
-          <w:rFonts w:ascii="Times New Roman" w:hAnsi="Times New Roman"/>
-          <w:i w:val="0"/>
-          <w:sz w:val="24"/>
-        </w:rPr>
-        <w:t>El proceso administrativo constituye el marco conceptual que rige el funcionamiento de las organizaciones modernas. Chiavenato (2006) lo describe como el conjunto secuencial e interrelacionado de funciones de planificación, organización, dirección y control, orientadas al logro eficiente de los objetivos organizacionales. La estandarización de los procedimientos dentro de este marco garantiza que las actividades se ejecuten de manera uniforme, reduciendo la variabilidad y los errores derivados de la discrecionalidad individual.</w:t>
-      </w:r>
-    </w:p>
-    <w:p>
-      <w:pPr>
-        <w:spacing w:line="360" w:lineRule="auto" w:after="0" w:before="0"/>
-        <w:ind w:firstLine="709"/>
-        <w:jc w:val="both"/>
-      </w:pPr>
-      <w:r>
-        <w:rPr>
-          <w:rFonts w:ascii="Times New Roman" w:hAnsi="Times New Roman"/>
-          <w:i w:val="0"/>
-          <w:sz w:val="24"/>
-        </w:rPr>
-        <w:t>La formalización de los procedimientos mediante manuales, flujogramas y formatos estandarizados constituye una herramienta esencial para el control administrativo. Según Harrington (1993), un proceso estandarizado es medible, controlable y mejorable, condiciones que permiten a la organización identificar con precisión los puntos de falla y aplicar acciones correctivas focalizadas. En el caso de IDETEL, la ausencia de procedimientos escritos para la gestión de solicitudes es una de las causas raíz de las deficiencias identificadas.</w:t>
-      </w:r>
-    </w:p>
-    <w:p>
-      <w:pPr>
-        <w:spacing w:before="480" w:after="480" w:line="360" w:lineRule="auto"/>
-        <w:jc w:val="left"/>
-      </w:pPr>
-      <w:r>
-        <w:rPr>
-          <w:rFonts w:ascii="Times New Roman" w:hAnsi="Times New Roman"/>
-          <w:b/>
-          <w:sz w:val="24"/>
-        </w:rPr>
-        <w:t>Calidad del Servicio en Empresas de Telecomunicaciones</w:t>
-      </w:r>
-    </w:p>
-    <w:p>
-      <w:pPr>
-        <w:spacing w:line="360" w:lineRule="auto" w:after="0" w:before="0"/>
-        <w:ind w:firstLine="709"/>
-        <w:jc w:val="both"/>
-      </w:pPr>
-      <w:r>
-        <w:rPr>
-          <w:rFonts w:ascii="Times New Roman" w:hAnsi="Times New Roman"/>
-          <w:i w:val="0"/>
-          <w:sz w:val="24"/>
-        </w:rPr>
-        <w:t>La calidad del servicio se define como el grado en que las características del servicio prestado satisfacen o superan las expectativas del cliente. Parasuraman, Zeithaml y Berry (1988) desarrollaron el modelo SERVQUAL, que identifica cinco dimensiones de la calidad del servicio: fiabilidad, capacidad de respuesta, seguridad, empatía y elementos tangibles. En el sector de telecomunicaciones, la fiabilidad y la capacidad de respuesta son las dimensiones con mayor peso en la percepción del cliente.</w:t>
-      </w:r>
-    </w:p>
-    <w:p>
-      <w:pPr>
-        <w:spacing w:line="360" w:lineRule="auto" w:after="0" w:before="0"/>
-        <w:ind w:firstLine="709"/>
-        <w:jc w:val="both"/>
-      </w:pPr>
-      <w:r>
-        <w:rPr>
-          <w:rFonts w:ascii="Times New Roman" w:hAnsi="Times New Roman"/>
-          <w:i w:val="0"/>
-          <w:sz w:val="24"/>
-        </w:rPr>
-        <w:t>Las deficiencias en el control administrativo del proceso de solicitudes de servicio impactan directamente sobre la fiabilidad y la capacidad de respuesta de IDETEL. Cuando una solicitud no es gestionada dentro de los tiempos establecidos o su estatus no puede ser verificado en tiempo real, el cliente percibe una falla en la calidad del servicio que deteriora su confianza en la organización y puede derivar en la cancelación del contrato o en la difusión de experiencias negativas.</w:t>
-      </w:r>
-    </w:p>
-    <w:p>
-      <w:pPr>
-        <w:spacing w:before="480" w:after="480" w:line="360" w:lineRule="auto"/>
-        <w:jc w:val="left"/>
-      </w:pPr>
-      <w:r>
-        <w:rPr>
-          <w:rFonts w:ascii="Times New Roman" w:hAnsi="Times New Roman"/>
-          <w:b/>
-          <w:sz w:val="24"/>
-        </w:rPr>
-        <w:t>Sistemas de Información para el Control Administrativo</w:t>
-      </w:r>
-    </w:p>
-    <w:p>
-      <w:pPr>
-        <w:spacing w:line="360" w:lineRule="auto" w:after="0" w:before="0"/>
-        <w:ind w:firstLine="709"/>
-        <w:jc w:val="both"/>
-      </w:pPr>
-      <w:r>
-        <w:rPr>
-          <w:rFonts w:ascii="Times New Roman" w:hAnsi="Times New Roman"/>
-          <w:i w:val="0"/>
-          <w:sz w:val="24"/>
-        </w:rPr>
-        <w:t>Un sistema de información constituye un conjunto organizado de recursos tecnológicos y procedimentales orientados a la captura, almacenamiento, procesamiento y distribución de datos con el propósito de apoyar la toma de decisiones. Laudon y Laudon (2016) distinguen los sistemas de procesamiento de transacciones como la categoría que registra y gestiona las operaciones rutinarias de la organización, siendo esta la tipología más pertinente para el control de solicitudes de servicio en una empresa de telecomunicaciones.</w:t>
-      </w:r>
-    </w:p>
-    <w:p>
-      <w:pPr>
-        <w:spacing w:line="360" w:lineRule="auto" w:after="0" w:before="0"/>
-        <w:ind w:firstLine="709"/>
-        <w:jc w:val="both"/>
-      </w:pPr>
-      <w:r>
-        <w:rPr>
-          <w:rFonts w:ascii="Times New Roman" w:hAnsi="Times New Roman"/>
-          <w:i w:val="0"/>
-          <w:sz w:val="24"/>
-        </w:rPr>
-        <w:t>La implementación de un sistema de tickets o plataforma de seguimiento de solicitudes en IDETEL permitiría centralizar el registro de cada caso, asignar responsables, definir tiempos de atención y generar alertas ante incumplimientos. Esta herramienta transformaría el control administrativo de reactivo a proactivo, dotando a la supervisión de información en tiempo real para la toma de decisiones y la evaluación continua del desempeño del proceso.</w:t>
-      </w:r>
-    </w:p>
-    <w:p>
-      <w:pPr>
-        <w:spacing w:before="480" w:after="480" w:line="360" w:lineRule="auto"/>
-        <w:jc w:val="left"/>
-      </w:pPr>
-      <w:r>
-        <w:rPr>
-          <w:rFonts w:ascii="Times New Roman" w:hAnsi="Times New Roman"/>
-          <w:b/>
-          <w:sz w:val="24"/>
-        </w:rPr>
-        <w:t>Proyecto Factible como Modalidad de Investigación</w:t>
-      </w:r>
-    </w:p>
-    <w:p>
-      <w:pPr>
-        <w:spacing w:line="360" w:lineRule="auto" w:after="0" w:before="0"/>
-        <w:ind w:firstLine="709"/>
-        <w:jc w:val="both"/>
-      </w:pPr>
-      <w:r>
-        <w:rPr>
-          <w:rFonts w:ascii="Times New Roman" w:hAnsi="Times New Roman"/>
-          <w:i w:val="0"/>
-          <w:sz w:val="24"/>
-        </w:rPr>
-        <w:t>La Universidad Pedagógica Experimental Libertador (UPEL, 2016) define el proyecto factible como la investigación, elaboración y desarrollo de una propuesta de un modelo operativo viable para solucionar problemas, requerimientos o necesidades de organizaciones o grupos sociales. Esta modalidad exige un diagnóstico de campo que evidencie la situación deficitaria y la comprobación de la viabilidad técnica y operativa de la solución planteada.</w:t>
-      </w:r>
-    </w:p>
-    <w:p>
-      <w:pPr>
-        <w:spacing w:line="360" w:lineRule="auto" w:after="0" w:before="0"/>
-        <w:ind w:firstLine="709"/>
-        <w:jc w:val="both"/>
-      </w:pPr>
-      <w:r>
-        <w:rPr>
-          <w:rFonts w:ascii="Times New Roman" w:hAnsi="Times New Roman"/>
-          <w:i w:val="0"/>
-          <w:sz w:val="24"/>
-        </w:rPr>
-        <w:t>Arias (2012) señala que el proyecto factible avanza hasta proponer y en muchos casos desarrollar la solución, demostrando su aplicabilidad en el contexto real. El presente trabajo se enmarca en esta modalidad al partir de la evaluación del control administrativo de IDETEL para proponer mejoras procedimentales cuya implementación es viable dentro de la estructura organizativa y los recursos disponibles de la empresa.</w:t>
-      </w:r>
-    </w:p>
-    <w:p>
-      <w:pPr>
-        <w:sectPr>
           <w:footerReference w:type="default" r:id="rId34"/>
           <w:type w:val="continuous"/>
           <w:pgSz w:w="12240" w:h="15840"/>
@@ -6596,11 +6310,11 @@
           <w:b/>
           <w:sz w:val="24"/>
         </w:rPr>
-        <w:t>CAPÍTULO IV</w:t>
+        <w:t>CAPÍTULO III</w:t>
       </w:r>
     </w:p>
     <w:p>
-      <w:bookmarkStart w:id="bm_cap4" w:name="bm_cap4"/>
+      <w:bookmarkStart w:id="bm_cap3" w:name="bm_cap3"/>
       <w:pPr>
         <w:spacing w:before="480"/>
         <w:jc w:val="center"/>
@@ -6611,9 +6325,9 @@
           <w:b/>
           <w:sz w:val="24"/>
         </w:rPr>
-        <w:t>ACTIVIDADES REALIZADAS</w:t>
-      </w:r>
-      <w:bookmarkEnd w:id="bm_cap4"/>
+        <w:t>MARCO TEÓRICO</w:t>
+      </w:r>
+      <w:bookmarkEnd w:id="bm_cap3"/>
     </w:p>
     <w:p>
       <w:pPr>
@@ -6628,7 +6342,7 @@
       </w:pPr>
     </w:p>
     <w:p>
-      <w:bookmarkStart w:id="bm_cap4_desc" w:name="bm_cap4_desc"/>
+      <w:bookmarkStart w:id="bm_cap3_bases" w:name="bm_cap3_bases"/>
       <w:pPr>
         <w:spacing w:before="480" w:after="480" w:line="360" w:lineRule="auto"/>
         <w:jc w:val="left"/>
@@ -6639,9 +6353,9 @@
           <w:b/>
           <w:sz w:val="24"/>
         </w:rPr>
-        <w:t>Descripción de Actividades Ejecutadas por Semana</w:t>
-      </w:r>
-      <w:bookmarkEnd w:id="bm_cap4_desc"/>
+        <w:t>Control Administrativo</w:t>
+      </w:r>
+      <w:bookmarkEnd w:id="bm_cap3_bases"/>
     </w:p>
     <w:p>
       <w:pPr>
@@ -6655,7 +6369,58 @@
           <w:i w:val="0"/>
           <w:sz w:val="24"/>
         </w:rPr>
-        <w:t>Durante las diez (10) semanas de pasantías, se llevaron a cabo actividades de evaluación y análisis en el Departamento de Administración de Ingeniería de Telecomunicaciones, C.A.:</w:t>
+        <w:t>El control administrativo constituye una de las funciones fundamentales del proceso administrativo y se define como el mecanismo mediante el cual la organización verifica que las actividades ejecutadas se correspondan con lo planificado, detectando desviaciones y aplicando las medidas correctivas necesarias. Robbins y Coulter (2010) señalan que el control eficaz no solo identifica fallas, sino que proporciona información oportuna para la toma de decisiones gerenciales, convirtiéndose en un instrumento de mejora continua y no únicamente de fiscalización.</w:t>
+      </w:r>
+    </w:p>
+    <w:p>
+      <w:pPr>
+        <w:spacing w:line="360" w:lineRule="auto" w:after="0" w:before="0"/>
+        <w:ind w:firstLine="709"/>
+        <w:jc w:val="both"/>
+      </w:pPr>
+      <w:r>
+        <w:rPr>
+          <w:rFonts w:ascii="Times New Roman" w:hAnsi="Times New Roman"/>
+          <w:i w:val="0"/>
+          <w:sz w:val="24"/>
+        </w:rPr>
+        <w:t>En el contexto del Departamento de Administración de Ingeniería de Telecomunicaciones, C.A., el control administrativo se aplica sobre el ciclo de gestión de solicitudes de servicio, abarcando desde la recepción de la solicitud del suscriptor hasta el cierre definitivo del caso. La ausencia de mecanismos formales de control en este ciclo genera inconsistencias entre los departamentos involucrados y dificulta la evaluación del desempeño del proceso de atención.</w:t>
+      </w:r>
+    </w:p>
+    <w:p>
+      <w:pPr>
+        <w:spacing w:line="240" w:lineRule="auto" w:before="720" w:after="240"/>
+        <w:ind w:left="709" w:right="709"/>
+        <w:jc w:val="both"/>
+      </w:pPr>
+      <w:r>
+        <w:rPr>
+          <w:rFonts w:ascii="Times New Roman" w:hAnsi="Times New Roman"/>
+          <w:sz w:val="24"/>
+        </w:rPr>
+        <w:t>El control es el proceso de monitorear las actividades para asegurarse de que se lleven a cabo según lo planeado y para corregir cualquier desviación significativa. Los gerentes no pueden saber realmente si sus unidades están desempeñándose adecuadamente hasta que evalúan qué actividades se han llevado a cabo y comparan el desempeño real con el estándar deseado.</w:t>
+      </w:r>
+      <w:r>
+        <w:rPr>
+          <w:rFonts w:ascii="Times New Roman" w:hAnsi="Times New Roman"/>
+          <w:sz w:val="24"/>
+        </w:rPr>
+        <w:t xml:space="preserve"> (Robbins y Coulter, 2010, p. 398)</w:t>
+      </w:r>
+    </w:p>
+    <w:p>
+      <w:pPr>
+        <w:spacing w:line="360" w:lineRule="auto" w:after="0" w:before="0"/>
+        <w:ind w:firstLine="709"/>
+        <w:jc w:val="both"/>
+      </w:pPr>
+      <w:r>
+        <w:rPr>
+          <w:rFonts w:ascii="Times New Roman" w:hAnsi="Times New Roman"/>
+          <w:i w:val="0"/>
+          <w:sz w:val="24"/>
+        </w:rPr>
+        <w:t>El control administrativo, como lo señalan los autores referidos, no se limita a una función de fiscalización, sino que se constituye en un mecanismo de retroalimentación continua que permite a la organización detectar desviaciones a tiempo y ajustar sus procesos para garantizar la calidad del servicio prestado al suscriptor.</w:t>
       </w:r>
     </w:p>
     <w:p>
@@ -6669,65 +6434,125 @@
           <w:b/>
           <w:sz w:val="24"/>
         </w:rPr>
-        <w:t>Semana 1</w:t>
+        <w:t>Gestión de Solicitudes de Servicio</w:t>
       </w:r>
     </w:p>
     <w:p>
       <w:pPr>
-        <w:spacing w:line="360" w:lineRule="auto"/>
+        <w:spacing w:line="360" w:lineRule="auto" w:after="0" w:before="0"/>
         <w:ind w:firstLine="709"/>
         <w:jc w:val="both"/>
       </w:pPr>
       <w:r>
         <w:rPr>
           <w:rFonts w:ascii="Times New Roman" w:hAnsi="Times New Roman"/>
+          <w:i w:val="0"/>
           <w:sz w:val="24"/>
         </w:rPr>
-        <w:t xml:space="preserve">1. </w:t>
-      </w:r>
+        <w:t>La gestión de solicitudes de servicio comprende el conjunto de procedimientos administrativos orientados a recepcionar, registrar, procesar y dar seguimiento a los requerimientos presentados por los clientes o suscriptores de una organización. Zeithaml, Parasuraman y Berry (1993) establecen que la calidad del servicio percibida por el cliente está directamente vinculada a la capacidad de la organización para gestionar sus solicitudes de forma ágil, transparente y con comunicación fluida en cada etapa del proceso.</w:t>
+      </w:r>
+    </w:p>
+    <w:p>
+      <w:pPr>
+        <w:spacing w:line="360" w:lineRule="auto" w:after="0" w:before="0"/>
+        <w:ind w:firstLine="709"/>
+        <w:jc w:val="both"/>
+      </w:pPr>
+      <w:r>
+        <w:rPr>
+          <w:rFonts w:ascii="Times New Roman" w:hAnsi="Times New Roman"/>
+          <w:i w:val="0"/>
+          <w:sz w:val="24"/>
+        </w:rPr>
+        <w:t>En empresas de telecomunicaciones como IDETEL, la gestión de solicitudes abarca dos categorías principales: las solicitudes de afiliación de nuevos suscriptores, que implican la coordinación entre las áreas comercial, técnica y administrativa; y las incidencias reportadas por suscriptores activos, que requieren diagnóstico, despacho de cuadrillas y cierre verificado del caso. La ausencia de un sistema unificado de seguimiento para ambas categorías genera retrasos y reprocesos que impactan directamente en la satisfacción del cliente.</w:t>
+      </w:r>
+    </w:p>
+    <w:p>
+      <w:pPr>
+        <w:spacing w:before="480" w:after="480" w:line="360" w:lineRule="auto"/>
+        <w:jc w:val="left"/>
+      </w:pPr>
       <w:r>
         <w:rPr>
           <w:rFonts w:ascii="Times New Roman" w:hAnsi="Times New Roman"/>
           <w:b/>
           <w:sz w:val="24"/>
         </w:rPr>
-        <w:t xml:space="preserve">Actividad operativa: </w:t>
-      </w:r>
-      <w:r>
-        <w:rPr>
-          <w:rFonts w:ascii="Times New Roman" w:hAnsi="Times New Roman"/>
-          <w:sz w:val="24"/>
-        </w:rPr>
-        <w:t>Inducción institucional, recorrido por las instalaciones, presentación ante el equipo del Departamento de Administración y familiarización con los sistemas de registro y los procedimientos generales de la empresa.</w:t>
+        <w:t>Procesos Administrativos y Estandarización de Procedimientos</w:t>
       </w:r>
     </w:p>
     <w:p>
       <w:pPr>
-        <w:spacing w:line="360" w:lineRule="auto"/>
+        <w:spacing w:line="360" w:lineRule="auto" w:after="0" w:before="0"/>
         <w:ind w:firstLine="709"/>
         <w:jc w:val="both"/>
       </w:pPr>
       <w:r>
         <w:rPr>
           <w:rFonts w:ascii="Times New Roman" w:hAnsi="Times New Roman"/>
+          <w:i w:val="0"/>
           <w:sz w:val="24"/>
         </w:rPr>
-        <w:t xml:space="preserve">2. </w:t>
-      </w:r>
+        <w:t>El proceso administrativo constituye el marco conceptual que rige el funcionamiento de las organizaciones modernas. Chiavenato (2006) lo describe como el conjunto secuencial e interrelacionado de funciones de planificación, organización, dirección y control, orientadas al logro eficiente de los objetivos organizacionales. La estandarización de los procedimientos dentro de este marco garantiza que las actividades se ejecuten de manera uniforme, reduciendo la variabilidad y los errores derivados de la discrecionalidad individual.</w:t>
+      </w:r>
+    </w:p>
+    <w:p>
+      <w:pPr>
+        <w:spacing w:line="360" w:lineRule="auto" w:after="0" w:before="0"/>
+        <w:ind w:firstLine="709"/>
+        <w:jc w:val="both"/>
+      </w:pPr>
+      <w:r>
+        <w:rPr>
+          <w:rFonts w:ascii="Times New Roman" w:hAnsi="Times New Roman"/>
+          <w:i w:val="0"/>
+          <w:sz w:val="24"/>
+        </w:rPr>
+        <w:t>La formalización de los procedimientos mediante manuales, flujogramas y formatos estandarizados constituye una herramienta esencial para el control administrativo. Según Harrington (1993), un proceso estandarizado es medible, controlable y mejorable, condiciones que permiten a la organización identificar con precisión los puntos de falla y aplicar acciones correctivas focalizadas. En el caso de IDETEL, la ausencia de procedimientos escritos para la gestión de solicitudes es una de las causas raíz de las deficiencias identificadas.</w:t>
+      </w:r>
+    </w:p>
+    <w:p>
+      <w:pPr>
+        <w:spacing w:before="480" w:after="480" w:line="360" w:lineRule="auto"/>
+        <w:jc w:val="left"/>
+      </w:pPr>
       <w:r>
         <w:rPr>
           <w:rFonts w:ascii="Times New Roman" w:hAnsi="Times New Roman"/>
           <w:b/>
           <w:sz w:val="24"/>
         </w:rPr>
-        <w:t xml:space="preserve">Actividad de investigación: </w:t>
-      </w:r>
+        <w:t>Calidad del Servicio en Empresas de Telecomunicaciones</w:t>
+      </w:r>
+    </w:p>
+    <w:p>
+      <w:pPr>
+        <w:spacing w:line="360" w:lineRule="auto" w:after="0" w:before="0"/>
+        <w:ind w:firstLine="709"/>
+        <w:jc w:val="both"/>
+      </w:pPr>
       <w:r>
         <w:rPr>
           <w:rFonts w:ascii="Times New Roman" w:hAnsi="Times New Roman"/>
+          <w:i w:val="0"/>
           <w:sz w:val="24"/>
         </w:rPr>
-        <w:t>Observación directa del flujo de recepción y procesamiento de solicitudes de servicio, identificación preliminar de los actores involucrados en el proceso y formulación inicial de la situación problemática.</w:t>
+        <w:t>La calidad del servicio se define como el grado en que las características del servicio prestado satisfacen o superan las expectativas del cliente. Parasuraman, Zeithaml y Berry (1988) desarrollaron el modelo SERVQUAL, que identifica cinco dimensiones de la calidad del servicio: fiabilidad, capacidad de respuesta, seguridad, empatía y elementos tangibles. En el sector de telecomunicaciones, la fiabilidad y la capacidad de respuesta son las dimensiones con mayor peso en la percepción del cliente.</w:t>
+      </w:r>
+    </w:p>
+    <w:p>
+      <w:pPr>
+        <w:spacing w:line="360" w:lineRule="auto" w:after="0" w:before="0"/>
+        <w:ind w:firstLine="709"/>
+        <w:jc w:val="both"/>
+      </w:pPr>
+      <w:r>
+        <w:rPr>
+          <w:rFonts w:ascii="Times New Roman" w:hAnsi="Times New Roman"/>
+          <w:i w:val="0"/>
+          <w:sz w:val="24"/>
+        </w:rPr>
+        <w:t>Las deficiencias en el control administrativo del proceso de solicitudes de servicio impactan directamente sobre la fiabilidad y la capacidad de respuesta de IDETEL. Cuando una solicitud no es gestionada dentro de los tiempos establecidos o su estatus no puede ser verificado en tiempo real, el cliente percibe una falla en la calidad del servicio que deteriora su confianza en la organización y puede derivar en la cancelación del contrato o en la difusión de experiencias negativas.</w:t>
       </w:r>
     </w:p>
     <w:p>
@@ -6741,641 +6566,81 @@
           <w:b/>
           <w:sz w:val="24"/>
         </w:rPr>
-        <w:t>Semana 2</w:t>
+        <w:t>Sistemas de Información para el Control Administrativo</w:t>
       </w:r>
     </w:p>
     <w:p>
       <w:pPr>
-        <w:spacing w:line="360" w:lineRule="auto"/>
+        <w:spacing w:line="360" w:lineRule="auto" w:after="0" w:before="0"/>
         <w:ind w:firstLine="709"/>
         <w:jc w:val="both"/>
       </w:pPr>
       <w:r>
         <w:rPr>
           <w:rFonts w:ascii="Times New Roman" w:hAnsi="Times New Roman"/>
+          <w:i w:val="0"/>
           <w:sz w:val="24"/>
         </w:rPr>
-        <w:t xml:space="preserve">1. </w:t>
-      </w:r>
+        <w:t>Un sistema de información constituye un conjunto organizado de recursos tecnológicos y procedimentales orientados a la captura, almacenamiento, procesamiento y distribución de datos con el propósito de apoyar la toma de decisiones. Laudon y Laudon (2016) distinguen los sistemas de procesamiento de transacciones como la categoría que registra y gestiona las operaciones rutinarias de la organización, siendo esta la tipología más pertinente para el control de solicitudes de servicio en una empresa de telecomunicaciones.</w:t>
+      </w:r>
+    </w:p>
+    <w:p>
+      <w:pPr>
+        <w:spacing w:line="360" w:lineRule="auto" w:after="0" w:before="0"/>
+        <w:ind w:firstLine="709"/>
+        <w:jc w:val="both"/>
+      </w:pPr>
+      <w:r>
+        <w:rPr>
+          <w:rFonts w:ascii="Times New Roman" w:hAnsi="Times New Roman"/>
+          <w:i w:val="0"/>
+          <w:sz w:val="24"/>
+        </w:rPr>
+        <w:t>La implementación de un sistema de tickets o plataforma de seguimiento de solicitudes en IDETEL permitiría centralizar el registro de cada caso, asignar responsables, definir tiempos de atención y generar alertas ante incumplimientos. Esta herramienta transformaría el control administrativo de reactivo a proactivo, dotando a la supervisión de información en tiempo real para la toma de decisiones y la evaluación continua del desempeño del proceso.</w:t>
+      </w:r>
+    </w:p>
+    <w:p>
+      <w:pPr>
+        <w:spacing w:before="480" w:after="480" w:line="360" w:lineRule="auto"/>
+        <w:jc w:val="left"/>
+      </w:pPr>
       <w:r>
         <w:rPr>
           <w:rFonts w:ascii="Times New Roman" w:hAnsi="Times New Roman"/>
           <w:b/>
           <w:sz w:val="24"/>
         </w:rPr>
-        <w:t xml:space="preserve">Actividad operativa: </w:t>
-      </w:r>
-      <w:r>
-        <w:rPr>
-          <w:rFonts w:ascii="Times New Roman" w:hAnsi="Times New Roman"/>
-          <w:sz w:val="24"/>
-        </w:rPr>
-        <w:t>Apoyo en la recepción y registro de solicitudes de afiliación de nuevos suscriptores, verificación de documentación requerida y actualización del sistema de control de casos activos.</w:t>
+        <w:t>Proyecto Factible como Modalidad de Investigación</w:t>
       </w:r>
     </w:p>
     <w:p>
       <w:pPr>
-        <w:spacing w:line="360" w:lineRule="auto"/>
+        <w:spacing w:line="360" w:lineRule="auto" w:after="0" w:before="0"/>
         <w:ind w:firstLine="709"/>
         <w:jc w:val="both"/>
       </w:pPr>
       <w:r>
         <w:rPr>
           <w:rFonts w:ascii="Times New Roman" w:hAnsi="Times New Roman"/>
+          <w:i w:val="0"/>
           <w:sz w:val="24"/>
         </w:rPr>
-        <w:t xml:space="preserve">2. </w:t>
-      </w:r>
-      <w:r>
-        <w:rPr>
-          <w:rFonts w:ascii="Times New Roman" w:hAnsi="Times New Roman"/>
-          <w:b/>
-          <w:sz w:val="24"/>
-        </w:rPr>
-        <w:t xml:space="preserve">Actividad de investigación: </w:t>
-      </w:r>
-      <w:r>
-        <w:rPr>
-          <w:rFonts w:ascii="Times New Roman" w:hAnsi="Times New Roman"/>
-          <w:sz w:val="24"/>
-        </w:rPr>
-        <w:t>Levantamiento detallado del flujo procedimental de solicitudes de instalación e incidencias mediante la revisión de registros históricos y la documentación interna disponible en el departamento.</w:t>
+        <w:t>La Universidad Pedagógica Experimental Libertador (UPEL, 2016) define el proyecto factible como la investigación, elaboración y desarrollo de una propuesta de un modelo operativo viable para solucionar problemas, requerimientos o necesidades de organizaciones o grupos sociales. Esta modalidad exige un diagnóstico de campo que evidencie la situación deficitaria y la comprobación de la viabilidad técnica y operativa de la solución planteada.</w:t>
       </w:r>
     </w:p>
     <w:p>
       <w:pPr>
-        <w:spacing w:before="480" w:after="480" w:line="360" w:lineRule="auto"/>
-        <w:jc w:val="left"/>
-      </w:pPr>
-      <w:r>
-        <w:rPr>
-          <w:rFonts w:ascii="Times New Roman" w:hAnsi="Times New Roman"/>
-          <w:b/>
-          <w:sz w:val="24"/>
-        </w:rPr>
-        <w:t>Semana 3</w:t>
-      </w:r>
-    </w:p>
-    <w:p>
-      <w:pPr>
-        <w:spacing w:line="360" w:lineRule="auto"/>
+        <w:spacing w:line="360" w:lineRule="auto" w:after="0" w:before="0"/>
         <w:ind w:firstLine="709"/>
         <w:jc w:val="both"/>
       </w:pPr>
       <w:r>
         <w:rPr>
           <w:rFonts w:ascii="Times New Roman" w:hAnsi="Times New Roman"/>
+          <w:i w:val="0"/>
           <w:sz w:val="24"/>
         </w:rPr>
-        <w:t xml:space="preserve">1. </w:t>
-      </w:r>
-      <w:r>
-        <w:rPr>
-          <w:rFonts w:ascii="Times New Roman" w:hAnsi="Times New Roman"/>
-          <w:b/>
-          <w:sz w:val="24"/>
-        </w:rPr>
-        <w:t xml:space="preserve">Actividad operativa: </w:t>
-      </w:r>
-      <w:r>
-        <w:rPr>
-          <w:rFonts w:ascii="Times New Roman" w:hAnsi="Times New Roman"/>
-          <w:sz w:val="24"/>
-        </w:rPr>
-        <w:t>Colaboración en el seguimiento de solicitudes de servicio activas, actualización del estatus de los casos en el sistema de registro del departamento y apoyo en la coordinación con el área técnica.</w:t>
-      </w:r>
-    </w:p>
-    <w:p>
-      <w:pPr>
-        <w:spacing w:line="360" w:lineRule="auto"/>
-        <w:ind w:firstLine="709"/>
-        <w:jc w:val="both"/>
-      </w:pPr>
-      <w:r>
-        <w:rPr>
-          <w:rFonts w:ascii="Times New Roman" w:hAnsi="Times New Roman"/>
-          <w:sz w:val="24"/>
-        </w:rPr>
-        <w:t xml:space="preserve">2. </w:t>
-      </w:r>
-      <w:r>
-        <w:rPr>
-          <w:rFonts w:ascii="Times New Roman" w:hAnsi="Times New Roman"/>
-          <w:b/>
-          <w:sz w:val="24"/>
-        </w:rPr>
-        <w:t xml:space="preserve">Actividad de investigación: </w:t>
-      </w:r>
-      <w:r>
-        <w:rPr>
-          <w:rFonts w:ascii="Times New Roman" w:hAnsi="Times New Roman"/>
-          <w:sz w:val="24"/>
-        </w:rPr>
-        <w:t>Diseño y aplicación de guía de observación directa sobre el proceso de gestión de solicitudes, registrando los tiempos de respuesta por etapa y los puntos de interrupción del flujo.</w:t>
-      </w:r>
-    </w:p>
-    <w:p>
-      <w:pPr>
-        <w:spacing w:before="480" w:after="480" w:line="360" w:lineRule="auto"/>
-        <w:jc w:val="left"/>
-      </w:pPr>
-      <w:r>
-        <w:rPr>
-          <w:rFonts w:ascii="Times New Roman" w:hAnsi="Times New Roman"/>
-          <w:b/>
-          <w:sz w:val="24"/>
-        </w:rPr>
-        <w:t>Semana 4</w:t>
-      </w:r>
-    </w:p>
-    <w:p>
-      <w:pPr>
-        <w:spacing w:line="360" w:lineRule="auto"/>
-        <w:ind w:firstLine="709"/>
-        <w:jc w:val="both"/>
-      </w:pPr>
-      <w:r>
-        <w:rPr>
-          <w:rFonts w:ascii="Times New Roman" w:hAnsi="Times New Roman"/>
-          <w:sz w:val="24"/>
-        </w:rPr>
-        <w:t xml:space="preserve">1. </w:t>
-      </w:r>
-      <w:r>
-        <w:rPr>
-          <w:rFonts w:ascii="Times New Roman" w:hAnsi="Times New Roman"/>
-          <w:b/>
-          <w:sz w:val="24"/>
-        </w:rPr>
-        <w:t xml:space="preserve">Actividad operativa: </w:t>
-      </w:r>
-      <w:r>
-        <w:rPr>
-          <w:rFonts w:ascii="Times New Roman" w:hAnsi="Times New Roman"/>
-          <w:sz w:val="24"/>
-        </w:rPr>
-        <w:t>Apoyo en la atención al suscriptor vía telefónica y presencial, registro de incidencias reportadas y coordinación con el NOC para el despacho de cuadrillas técnicas de campo.</w:t>
-      </w:r>
-    </w:p>
-    <w:p>
-      <w:pPr>
-        <w:spacing w:line="360" w:lineRule="auto"/>
-        <w:ind w:firstLine="709"/>
-        <w:jc w:val="both"/>
-      </w:pPr>
-      <w:r>
-        <w:rPr>
-          <w:rFonts w:ascii="Times New Roman" w:hAnsi="Times New Roman"/>
-          <w:sz w:val="24"/>
-        </w:rPr>
-        <w:t xml:space="preserve">2. </w:t>
-      </w:r>
-      <w:r>
-        <w:rPr>
-          <w:rFonts w:ascii="Times New Roman" w:hAnsi="Times New Roman"/>
-          <w:b/>
-          <w:sz w:val="24"/>
-        </w:rPr>
-        <w:t xml:space="preserve">Actividad de investigación: </w:t>
-      </w:r>
-      <w:r>
-        <w:rPr>
-          <w:rFonts w:ascii="Times New Roman" w:hAnsi="Times New Roman"/>
-          <w:sz w:val="24"/>
-        </w:rPr>
-        <w:t>Aplicación de entrevistas no estructuradas al personal administrativo, comercial y técnico para identificar las deficiencias percibidas en el sistema de control de solicitudes de servicio.</w:t>
-      </w:r>
-    </w:p>
-    <w:p>
-      <w:pPr>
-        <w:spacing w:before="480" w:after="480" w:line="360" w:lineRule="auto"/>
-        <w:jc w:val="left"/>
-      </w:pPr>
-      <w:r>
-        <w:rPr>
-          <w:rFonts w:ascii="Times New Roman" w:hAnsi="Times New Roman"/>
-          <w:b/>
-          <w:sz w:val="24"/>
-        </w:rPr>
-        <w:t>Semana 5</w:t>
-      </w:r>
-    </w:p>
-    <w:p>
-      <w:pPr>
-        <w:spacing w:line="360" w:lineRule="auto"/>
-        <w:ind w:firstLine="709"/>
-        <w:jc w:val="both"/>
-      </w:pPr>
-      <w:r>
-        <w:rPr>
-          <w:rFonts w:ascii="Times New Roman" w:hAnsi="Times New Roman"/>
-          <w:sz w:val="24"/>
-        </w:rPr>
-        <w:t xml:space="preserve">1. </w:t>
-      </w:r>
-      <w:r>
-        <w:rPr>
-          <w:rFonts w:ascii="Times New Roman" w:hAnsi="Times New Roman"/>
-          <w:b/>
-          <w:sz w:val="24"/>
-        </w:rPr>
-        <w:t xml:space="preserve">Actividad operativa: </w:t>
-      </w:r>
-      <w:r>
-        <w:rPr>
-          <w:rFonts w:ascii="Times New Roman" w:hAnsi="Times New Roman"/>
-          <w:sz w:val="24"/>
-        </w:rPr>
-        <w:t>Colaboración en la actualización del registro de suscriptores activos, verificación del cierre de casos pendientes y apoyo en la elaboración de reportes de incidencias del período.</w:t>
-      </w:r>
-    </w:p>
-    <w:p>
-      <w:pPr>
-        <w:spacing w:line="360" w:lineRule="auto"/>
-        <w:ind w:firstLine="709"/>
-        <w:jc w:val="both"/>
-      </w:pPr>
-      <w:r>
-        <w:rPr>
-          <w:rFonts w:ascii="Times New Roman" w:hAnsi="Times New Roman"/>
-          <w:sz w:val="24"/>
-        </w:rPr>
-        <w:t xml:space="preserve">2. </w:t>
-      </w:r>
-      <w:r>
-        <w:rPr>
-          <w:rFonts w:ascii="Times New Roman" w:hAnsi="Times New Roman"/>
-          <w:b/>
-          <w:sz w:val="24"/>
-        </w:rPr>
-        <w:t xml:space="preserve">Actividad de investigación: </w:t>
-      </w:r>
-      <w:r>
-        <w:rPr>
-          <w:rFonts w:ascii="Times New Roman" w:hAnsi="Times New Roman"/>
-          <w:sz w:val="24"/>
-        </w:rPr>
-        <w:t>Diagnóstico situacional de las deficiencias del control administrativo, elaboración de la matriz de fallas identificadas y análisis de los tiempos promedio de atención por tipo de solicitud.</w:t>
-      </w:r>
-    </w:p>
-    <w:p>
-      <w:pPr>
-        <w:spacing w:before="480" w:after="480" w:line="360" w:lineRule="auto"/>
-        <w:jc w:val="left"/>
-      </w:pPr>
-      <w:r>
-        <w:rPr>
-          <w:rFonts w:ascii="Times New Roman" w:hAnsi="Times New Roman"/>
-          <w:b/>
-          <w:sz w:val="24"/>
-        </w:rPr>
-        <w:t>Semana 6</w:t>
-      </w:r>
-    </w:p>
-    <w:p>
-      <w:pPr>
-        <w:spacing w:line="360" w:lineRule="auto"/>
-        <w:ind w:firstLine="709"/>
-        <w:jc w:val="both"/>
-      </w:pPr>
-      <w:r>
-        <w:rPr>
-          <w:rFonts w:ascii="Times New Roman" w:hAnsi="Times New Roman"/>
-          <w:sz w:val="24"/>
-        </w:rPr>
-        <w:t xml:space="preserve">1. </w:t>
-      </w:r>
-      <w:r>
-        <w:rPr>
-          <w:rFonts w:ascii="Times New Roman" w:hAnsi="Times New Roman"/>
-          <w:b/>
-          <w:sz w:val="24"/>
-        </w:rPr>
-        <w:t xml:space="preserve">Actividad operativa: </w:t>
-      </w:r>
-      <w:r>
-        <w:rPr>
-          <w:rFonts w:ascii="Times New Roman" w:hAnsi="Times New Roman"/>
-          <w:sz w:val="24"/>
-        </w:rPr>
-        <w:t>Apoyo en la tramitación de contratos de nuevos suscriptores, verificación de la documentación requerida y actualización del registro de afiliaciones del período en el sistema del departamento.</w:t>
-      </w:r>
-    </w:p>
-    <w:p>
-      <w:pPr>
-        <w:spacing w:line="360" w:lineRule="auto"/>
-        <w:ind w:firstLine="709"/>
-        <w:jc w:val="both"/>
-      </w:pPr>
-      <w:r>
-        <w:rPr>
-          <w:rFonts w:ascii="Times New Roman" w:hAnsi="Times New Roman"/>
-          <w:sz w:val="24"/>
-        </w:rPr>
-        <w:t xml:space="preserve">2. </w:t>
-      </w:r>
-      <w:r>
-        <w:rPr>
-          <w:rFonts w:ascii="Times New Roman" w:hAnsi="Times New Roman"/>
-          <w:b/>
-          <w:sz w:val="24"/>
-        </w:rPr>
-        <w:t xml:space="preserve">Actividad de investigación: </w:t>
-      </w:r>
-      <w:r>
-        <w:rPr>
-          <w:rFonts w:ascii="Times New Roman" w:hAnsi="Times New Roman"/>
-          <w:sz w:val="24"/>
-        </w:rPr>
-        <w:t>Análisis del impacto de las deficiencias detectadas sobre la calidad del servicio percibida por los suscriptores, mediante correlación entre tiempos de atención y quejas registradas.</w:t>
-      </w:r>
-    </w:p>
-    <w:p>
-      <w:pPr>
-        <w:spacing w:before="480" w:after="480" w:line="360" w:lineRule="auto"/>
-        <w:jc w:val="left"/>
-      </w:pPr>
-      <w:r>
-        <w:rPr>
-          <w:rFonts w:ascii="Times New Roman" w:hAnsi="Times New Roman"/>
-          <w:b/>
-          <w:sz w:val="24"/>
-        </w:rPr>
-        <w:t>Semana 7</w:t>
-      </w:r>
-    </w:p>
-    <w:p>
-      <w:pPr>
-        <w:spacing w:line="360" w:lineRule="auto"/>
-        <w:ind w:firstLine="709"/>
-        <w:jc w:val="both"/>
-      </w:pPr>
-      <w:r>
-        <w:rPr>
-          <w:rFonts w:ascii="Times New Roman" w:hAnsi="Times New Roman"/>
-          <w:sz w:val="24"/>
-        </w:rPr>
-        <w:t xml:space="preserve">1. </w:t>
-      </w:r>
-      <w:r>
-        <w:rPr>
-          <w:rFonts w:ascii="Times New Roman" w:hAnsi="Times New Roman"/>
-          <w:b/>
-          <w:sz w:val="24"/>
-        </w:rPr>
-        <w:t xml:space="preserve">Actividad operativa: </w:t>
-      </w:r>
-      <w:r>
-        <w:rPr>
-          <w:rFonts w:ascii="Times New Roman" w:hAnsi="Times New Roman"/>
-          <w:sz w:val="24"/>
-        </w:rPr>
-        <w:t>Colaboración en la revisión y archivo de expedientes administrativos del ciclo, apoyo en la conciliación de pagos de suscriptores y actualización de la base de datos de clientes.</w:t>
-      </w:r>
-    </w:p>
-    <w:p>
-      <w:pPr>
-        <w:spacing w:line="360" w:lineRule="auto"/>
-        <w:ind w:firstLine="709"/>
-        <w:jc w:val="both"/>
-      </w:pPr>
-      <w:r>
-        <w:rPr>
-          <w:rFonts w:ascii="Times New Roman" w:hAnsi="Times New Roman"/>
-          <w:sz w:val="24"/>
-        </w:rPr>
-        <w:t xml:space="preserve">2. </w:t>
-      </w:r>
-      <w:r>
-        <w:rPr>
-          <w:rFonts w:ascii="Times New Roman" w:hAnsi="Times New Roman"/>
-          <w:b/>
-          <w:sz w:val="24"/>
-        </w:rPr>
-        <w:t xml:space="preserve">Actividad de investigación: </w:t>
-      </w:r>
-      <w:r>
-        <w:rPr>
-          <w:rFonts w:ascii="Times New Roman" w:hAnsi="Times New Roman"/>
-          <w:sz w:val="24"/>
-        </w:rPr>
-        <w:t>Diseño del nuevo flujo de trabajo estandarizado para la gestión de solicitudes, con definición de etapas, responsables, tiempos máximos de respuesta y puntos de control por fase.</w:t>
-      </w:r>
-    </w:p>
-    <w:p>
-      <w:pPr>
-        <w:spacing w:before="480" w:after="480" w:line="360" w:lineRule="auto"/>
-        <w:jc w:val="left"/>
-      </w:pPr>
-      <w:r>
-        <w:rPr>
-          <w:rFonts w:ascii="Times New Roman" w:hAnsi="Times New Roman"/>
-          <w:b/>
-          <w:sz w:val="24"/>
-        </w:rPr>
-        <w:t>Semana 8</w:t>
-      </w:r>
-    </w:p>
-    <w:p>
-      <w:pPr>
-        <w:spacing w:line="360" w:lineRule="auto"/>
-        <w:ind w:firstLine="709"/>
-        <w:jc w:val="both"/>
-      </w:pPr>
-      <w:r>
-        <w:rPr>
-          <w:rFonts w:ascii="Times New Roman" w:hAnsi="Times New Roman"/>
-          <w:sz w:val="24"/>
-        </w:rPr>
-        <w:t xml:space="preserve">1. </w:t>
-      </w:r>
-      <w:r>
-        <w:rPr>
-          <w:rFonts w:ascii="Times New Roman" w:hAnsi="Times New Roman"/>
-          <w:b/>
-          <w:sz w:val="24"/>
-        </w:rPr>
-        <w:t xml:space="preserve">Actividad operativa: </w:t>
-      </w:r>
-      <w:r>
-        <w:rPr>
-          <w:rFonts w:ascii="Times New Roman" w:hAnsi="Times New Roman"/>
-          <w:sz w:val="24"/>
-        </w:rPr>
-        <w:t>Apoyo en la generación de reportes de incidencias y solicitudes del período para la supervisión administrativa, y colaboración en la atención de requerimientos de suscriptores activos.</w:t>
-      </w:r>
-    </w:p>
-    <w:p>
-      <w:pPr>
-        <w:spacing w:line="360" w:lineRule="auto"/>
-        <w:ind w:firstLine="709"/>
-        <w:jc w:val="both"/>
-      </w:pPr>
-      <w:r>
-        <w:rPr>
-          <w:rFonts w:ascii="Times New Roman" w:hAnsi="Times New Roman"/>
-          <w:sz w:val="24"/>
-        </w:rPr>
-        <w:t xml:space="preserve">2. </w:t>
-      </w:r>
-      <w:r>
-        <w:rPr>
-          <w:rFonts w:ascii="Times New Roman" w:hAnsi="Times New Roman"/>
-          <w:b/>
-          <w:sz w:val="24"/>
-        </w:rPr>
-        <w:t xml:space="preserve">Actividad de investigación: </w:t>
-      </w:r>
-      <w:r>
-        <w:rPr>
-          <w:rFonts w:ascii="Times New Roman" w:hAnsi="Times New Roman"/>
-          <w:sz w:val="24"/>
-        </w:rPr>
-        <w:t>Diseño de los formatos estandarizados de registro de solicitudes de afiliación y de incidencias, y elaboración del procedimiento escrito para la gestión unificada de casos en el departamento.</w:t>
-      </w:r>
-    </w:p>
-    <w:p>
-      <w:pPr>
-        <w:spacing w:before="480" w:after="480" w:line="360" w:lineRule="auto"/>
-        <w:jc w:val="left"/>
-      </w:pPr>
-      <w:r>
-        <w:rPr>
-          <w:rFonts w:ascii="Times New Roman" w:hAnsi="Times New Roman"/>
-          <w:b/>
-          <w:sz w:val="24"/>
-        </w:rPr>
-        <w:t>Semana 9</w:t>
-      </w:r>
-    </w:p>
-    <w:p>
-      <w:pPr>
-        <w:spacing w:line="360" w:lineRule="auto"/>
-        <w:ind w:firstLine="709"/>
-        <w:jc w:val="both"/>
-      </w:pPr>
-      <w:r>
-        <w:rPr>
-          <w:rFonts w:ascii="Times New Roman" w:hAnsi="Times New Roman"/>
-          <w:sz w:val="24"/>
-        </w:rPr>
-        <w:t xml:space="preserve">1. </w:t>
-      </w:r>
-      <w:r>
-        <w:rPr>
-          <w:rFonts w:ascii="Times New Roman" w:hAnsi="Times New Roman"/>
-          <w:b/>
-          <w:sz w:val="24"/>
-        </w:rPr>
-        <w:t xml:space="preserve">Actividad operativa: </w:t>
-      </w:r>
-      <w:r>
-        <w:rPr>
-          <w:rFonts w:ascii="Times New Roman" w:hAnsi="Times New Roman"/>
-          <w:sz w:val="24"/>
-        </w:rPr>
-        <w:t>Participación en las actividades regulares del departamento y apoyo en el cierre administrativo del ciclo de atención al suscriptor correspondiente al período de pasantías.</w:t>
-      </w:r>
-    </w:p>
-    <w:p>
-      <w:pPr>
-        <w:spacing w:line="360" w:lineRule="auto"/>
-        <w:ind w:firstLine="709"/>
-        <w:jc w:val="both"/>
-      </w:pPr>
-      <w:r>
-        <w:rPr>
-          <w:rFonts w:ascii="Times New Roman" w:hAnsi="Times New Roman"/>
-          <w:sz w:val="24"/>
-        </w:rPr>
-        <w:t xml:space="preserve">2. </w:t>
-      </w:r>
-      <w:r>
-        <w:rPr>
-          <w:rFonts w:ascii="Times New Roman" w:hAnsi="Times New Roman"/>
-          <w:b/>
-          <w:sz w:val="24"/>
-        </w:rPr>
-        <w:t xml:space="preserve">Actividad de investigación: </w:t>
-      </w:r>
-      <w:r>
-        <w:rPr>
-          <w:rFonts w:ascii="Times New Roman" w:hAnsi="Times New Roman"/>
-          <w:sz w:val="24"/>
-        </w:rPr>
-        <w:t>Redacción y validación de la propuesta de mejora al control administrativo de solicitudes de servicio, incorporando las observaciones del tutor industrial y ajustando los procedimientos al contexto operativo de IDETEL.</w:t>
-      </w:r>
-    </w:p>
-    <w:p>
-      <w:pPr>
-        <w:spacing w:before="480" w:after="480" w:line="360" w:lineRule="auto"/>
-        <w:jc w:val="left"/>
-      </w:pPr>
-      <w:r>
-        <w:rPr>
-          <w:rFonts w:ascii="Times New Roman" w:hAnsi="Times New Roman"/>
-          <w:b/>
-          <w:sz w:val="24"/>
-        </w:rPr>
-        <w:t>Semana 10</w:t>
-      </w:r>
-    </w:p>
-    <w:p>
-      <w:pPr>
-        <w:spacing w:line="360" w:lineRule="auto"/>
-        <w:ind w:firstLine="709"/>
-        <w:jc w:val="both"/>
-      </w:pPr>
-      <w:r>
-        <w:rPr>
-          <w:rFonts w:ascii="Times New Roman" w:hAnsi="Times New Roman"/>
-          <w:sz w:val="24"/>
-        </w:rPr>
-        <w:t xml:space="preserve">1. </w:t>
-      </w:r>
-      <w:r>
-        <w:rPr>
-          <w:rFonts w:ascii="Times New Roman" w:hAnsi="Times New Roman"/>
-          <w:b/>
-          <w:sz w:val="24"/>
-        </w:rPr>
-        <w:t xml:space="preserve">Actividad operativa: </w:t>
-      </w:r>
-      <w:r>
-        <w:rPr>
-          <w:rFonts w:ascii="Times New Roman" w:hAnsi="Times New Roman"/>
-          <w:sz w:val="24"/>
-        </w:rPr>
-        <w:t>Presentación formal de la propuesta de mejora ante la supervisión del Departamento de Administración y firma de la carta de aprobación del tutor industrial.</w:t>
-      </w:r>
-    </w:p>
-    <w:p>
-      <w:pPr>
-        <w:spacing w:line="360" w:lineRule="auto"/>
-        <w:ind w:firstLine="709"/>
-        <w:jc w:val="both"/>
-      </w:pPr>
-      <w:r>
-        <w:rPr>
-          <w:rFonts w:ascii="Times New Roman" w:hAnsi="Times New Roman"/>
-          <w:sz w:val="24"/>
-        </w:rPr>
-        <w:t xml:space="preserve">2. </w:t>
-      </w:r>
-      <w:r>
-        <w:rPr>
-          <w:rFonts w:ascii="Times New Roman" w:hAnsi="Times New Roman"/>
-          <w:b/>
-          <w:sz w:val="24"/>
-        </w:rPr>
-        <w:t xml:space="preserve">Actividad de investigación: </w:t>
-      </w:r>
-      <w:r>
-        <w:rPr>
-          <w:rFonts w:ascii="Times New Roman" w:hAnsi="Times New Roman"/>
-          <w:sz w:val="24"/>
-        </w:rPr>
-        <w:t>Consolidación y revisión final del informe académico de pasantías, incorporación de los anexos definitivos y preparación del documento para la entrega institucional al IUTECP.</w:t>
+        <w:t>Arias (2012) señala que el proyecto factible avanza hasta proponer y en muchos casos desarrollar la solución, demostrando su aplicabilidad en el contexto real. El presente trabajo se enmarca en esta modalidad al partir de la evaluación del control administrativo de IDETEL para proponer mejoras procedimentales cuya implementación es viable dentro de la estructura organizativa y los recursos disponibles de la empresa.</w:t>
       </w:r>
     </w:p>
     <w:p>
@@ -7402,11 +6667,11 @@
           <w:b/>
           <w:sz w:val="24"/>
         </w:rPr>
-        <w:t>CAPÍTULO V</w:t>
+        <w:t>CAPÍTULO IV</w:t>
       </w:r>
     </w:p>
     <w:p>
-      <w:bookmarkStart w:id="bm_cap5" w:name="bm_cap5"/>
+      <w:bookmarkStart w:id="bm_cap4" w:name="bm_cap4"/>
       <w:pPr>
         <w:spacing w:before="480"/>
         <w:jc w:val="center"/>
@@ -7417,9 +6682,9 @@
           <w:b/>
           <w:sz w:val="24"/>
         </w:rPr>
-        <w:t>CONCLUSIONES Y RECOMENDACIONES</w:t>
-      </w:r>
-      <w:bookmarkEnd w:id="bm_cap5"/>
+        <w:t>ACTIVIDADES REALIZADAS</w:t>
+      </w:r>
+      <w:bookmarkEnd w:id="bm_cap4"/>
     </w:p>
     <w:p>
       <w:pPr>
@@ -7434,7 +6699,7 @@
       </w:pPr>
     </w:p>
     <w:p>
-      <w:bookmarkStart w:id="bm_cap5_concl" w:name="bm_cap5_concl"/>
+      <w:bookmarkStart w:id="bm_cap4_desc" w:name="bm_cap4_desc"/>
       <w:pPr>
         <w:spacing w:before="480" w:after="480" w:line="360" w:lineRule="auto"/>
         <w:jc w:val="left"/>
@@ -7445,9 +6710,38 @@
           <w:b/>
           <w:sz w:val="24"/>
         </w:rPr>
-        <w:t>Conclusiones</w:t>
-      </w:r>
-      <w:bookmarkEnd w:id="bm_cap5_concl"/>
+        <w:t>Descripción de Actividades Ejecutadas por Semana</w:t>
+      </w:r>
+      <w:bookmarkEnd w:id="bm_cap4_desc"/>
+    </w:p>
+    <w:p>
+      <w:pPr>
+        <w:spacing w:line="360" w:lineRule="auto" w:after="0" w:before="0"/>
+        <w:ind w:firstLine="709"/>
+        <w:jc w:val="both"/>
+      </w:pPr>
+      <w:r>
+        <w:rPr>
+          <w:rFonts w:ascii="Times New Roman" w:hAnsi="Times New Roman"/>
+          <w:i w:val="0"/>
+          <w:sz w:val="24"/>
+        </w:rPr>
+        <w:t>Durante las diez (10) semanas de pasantías, se llevaron a cabo actividades de evaluación y análisis en el Departamento de Administración de Ingeniería de Telecomunicaciones, C.A.:</w:t>
+      </w:r>
+    </w:p>
+    <w:p>
+      <w:pPr>
+        <w:spacing w:before="480" w:after="480" w:line="360" w:lineRule="auto"/>
+        <w:jc w:val="left"/>
+      </w:pPr>
+      <w:r>
+        <w:rPr>
+          <w:rFonts w:ascii="Times New Roman" w:hAnsi="Times New Roman"/>
+          <w:b/>
+          <w:sz w:val="24"/>
+        </w:rPr>
+        <w:t>Semana 1</w:t>
+      </w:r>
     </w:p>
     <w:p>
       <w:pPr>
@@ -7465,9 +6759,17 @@
       <w:r>
         <w:rPr>
           <w:rFonts w:ascii="Times New Roman" w:hAnsi="Times New Roman"/>
+          <w:b/>
           <w:sz w:val="24"/>
         </w:rPr>
-        <w:t>Se describió el proceso administrativo actual de gestión de solicitudes de IDETEL, identificando un flujo de cuatro etapas (recepción, asignación, ejecución y cierre) que opera sin procedimientos escritos formales, dependiendo de canales informales de comunicación entre las áreas comercial, administrativa y técnica.</w:t>
+        <w:t xml:space="preserve">Actividad operativa: </w:t>
+      </w:r>
+      <w:r>
+        <w:rPr>
+          <w:rFonts w:ascii="Times New Roman" w:hAnsi="Times New Roman"/>
+          <w:sz w:val="24"/>
+        </w:rPr>
+        <w:t>Inducción institucional, recorrido por las instalaciones, presentación ante el equipo del Departamento de Administración y familiarización con los sistemas de registro y los procedimientos generales de la empresa.</w:t>
       </w:r>
     </w:p>
     <w:p>
@@ -7486,9 +6788,31 @@
       <w:r>
         <w:rPr>
           <w:rFonts w:ascii="Times New Roman" w:hAnsi="Times New Roman"/>
+          <w:b/>
           <w:sz w:val="24"/>
         </w:rPr>
-        <w:t>Se identificaron como principales deficiencias del control administrativo la ausencia de un sistema unificado de seguimiento de casos, la falta de formatos estandarizados de registro, la inexistencia de tiempos de respuesta definidos por etapa y la carencia de indicadores de gestión que permitan evaluar el desempeño del proceso.</w:t>
+        <w:t xml:space="preserve">Actividad de investigación: </w:t>
+      </w:r>
+      <w:r>
+        <w:rPr>
+          <w:rFonts w:ascii="Times New Roman" w:hAnsi="Times New Roman"/>
+          <w:sz w:val="24"/>
+        </w:rPr>
+        <w:t>Observación directa del flujo de recepción y procesamiento de solicitudes de servicio, identificación preliminar de los actores involucrados en el proceso y formulación inicial de la situación problemática.</w:t>
+      </w:r>
+    </w:p>
+    <w:p>
+      <w:pPr>
+        <w:spacing w:before="480" w:after="480" w:line="360" w:lineRule="auto"/>
+        <w:jc w:val="left"/>
+      </w:pPr>
+      <w:r>
+        <w:rPr>
+          <w:rFonts w:ascii="Times New Roman" w:hAnsi="Times New Roman"/>
+          <w:b/>
+          <w:sz w:val="24"/>
+        </w:rPr>
+        <w:t>Semana 2</w:t>
       </w:r>
     </w:p>
     <w:p>
@@ -7502,14 +6826,22 @@
           <w:rFonts w:ascii="Times New Roman" w:hAnsi="Times New Roman"/>
           <w:sz w:val="24"/>
         </w:rPr>
-        <w:t xml:space="preserve">3. </w:t>
+        <w:t xml:space="preserve">1. </w:t>
+      </w:r>
+      <w:r>
+        <w:rPr>
+          <w:rFonts w:ascii="Times New Roman" w:hAnsi="Times New Roman"/>
+          <w:b/>
+          <w:sz w:val="24"/>
+        </w:rPr>
+        <w:t xml:space="preserve">Actividad operativa: </w:t>
       </w:r>
       <w:r>
         <w:rPr>
           <w:rFonts w:ascii="Times New Roman" w:hAnsi="Times New Roman"/>
           <w:sz w:val="24"/>
         </w:rPr>
-        <w:t>Se determinó que las debilidades detectadas en el control administrativo generan impactos directos sobre la calidad del servicio percibida por los suscriptores, manifestados en tiempos de atención prolongados, falta de trazabilidad en el estatus de los casos y dificultades en la coordinación interdepartamental que derivan en reprocesos y quejas reiteradas.</w:t>
+        <w:t>Apoyo en la recepción y registro de solicitudes de afiliación de nuevos suscriptores, verificación de documentación requerida y actualización del sistema de control de casos activos.</w:t>
       </w:r>
     </w:p>
     <w:p>
@@ -7523,31 +6855,37 @@
           <w:rFonts w:ascii="Times New Roman" w:hAnsi="Times New Roman"/>
           <w:sz w:val="24"/>
         </w:rPr>
-        <w:t xml:space="preserve">4. </w:t>
-      </w:r>
-      <w:r>
-        <w:rPr>
-          <w:rFonts w:ascii="Times New Roman" w:hAnsi="Times New Roman"/>
-          <w:sz w:val="24"/>
-        </w:rPr>
-        <w:t>Se formuló una propuesta de mejora al control administrativo que contempla un nuevo flujo de trabajo estandarizado con etapas y responsables definidos, formatos unificados de registro de solicitudes e incidencias, y un conjunto de indicadores de gestión para el monitoreo continuo del proceso de atención al suscriptor.</w:t>
-      </w:r>
-    </w:p>
-    <w:p>
-      <w:bookmarkStart w:id="bm_cap5_recom" w:name="bm_cap5_recom"/>
-      <w:pPr>
-        <w:spacing w:before="480" w:after="480" w:line="360" w:lineRule="auto"/>
-        <w:jc w:val="left"/>
-      </w:pPr>
+        <w:t xml:space="preserve">2. </w:t>
+      </w:r>
       <w:r>
         <w:rPr>
           <w:rFonts w:ascii="Times New Roman" w:hAnsi="Times New Roman"/>
           <w:b/>
           <w:sz w:val="24"/>
         </w:rPr>
-        <w:t>Recomendaciones</w:t>
-      </w:r>
-      <w:bookmarkEnd w:id="bm_cap5_recom"/>
+        <w:t xml:space="preserve">Actividad de investigación: </w:t>
+      </w:r>
+      <w:r>
+        <w:rPr>
+          <w:rFonts w:ascii="Times New Roman" w:hAnsi="Times New Roman"/>
+          <w:sz w:val="24"/>
+        </w:rPr>
+        <w:t>Levantamiento detallado del flujo procedimental de solicitudes de instalación e incidencias mediante la revisión de registros históricos y la documentación interna disponible en el departamento.</w:t>
+      </w:r>
+    </w:p>
+    <w:p>
+      <w:pPr>
+        <w:spacing w:before="480" w:after="480" w:line="360" w:lineRule="auto"/>
+        <w:jc w:val="left"/>
+      </w:pPr>
+      <w:r>
+        <w:rPr>
+          <w:rFonts w:ascii="Times New Roman" w:hAnsi="Times New Roman"/>
+          <w:b/>
+          <w:sz w:val="24"/>
+        </w:rPr>
+        <w:t>Semana 3</w:t>
+      </w:r>
     </w:p>
     <w:p>
       <w:pPr>
@@ -7565,9 +6903,17 @@
       <w:r>
         <w:rPr>
           <w:rFonts w:ascii="Times New Roman" w:hAnsi="Times New Roman"/>
+          <w:b/>
           <w:sz w:val="24"/>
         </w:rPr>
-        <w:t>Implementar el nuevo flujo de trabajo estandarizado propuesto, comenzando por la formalización del canal de recepción de solicitudes y la adopción de los formatos unificados de registro de afiliaciones e incidencias en todos los departamentos involucrados.</w:t>
+        <w:t xml:space="preserve">Actividad operativa: </w:t>
+      </w:r>
+      <w:r>
+        <w:rPr>
+          <w:rFonts w:ascii="Times New Roman" w:hAnsi="Times New Roman"/>
+          <w:sz w:val="24"/>
+        </w:rPr>
+        <w:t>Colaboración en el seguimiento de solicitudes de servicio activas, actualización del estatus de los casos en el sistema de registro del departamento y apoyo en la coordinación con el área técnica.</w:t>
       </w:r>
     </w:p>
     <w:p>
@@ -7586,9 +6932,31 @@
       <w:r>
         <w:rPr>
           <w:rFonts w:ascii="Times New Roman" w:hAnsi="Times New Roman"/>
+          <w:b/>
           <w:sz w:val="24"/>
         </w:rPr>
-        <w:t>Socializar el manual de procedimientos de gestión de solicitudes con el personal de las áreas administrativa, comercial y técnica, garantizando que cada actor conozca su rol, sus responsabilidades y los tiempos máximos de respuesta establecidos para cada fase del proceso.</w:t>
+        <w:t xml:space="preserve">Actividad de investigación: </w:t>
+      </w:r>
+      <w:r>
+        <w:rPr>
+          <w:rFonts w:ascii="Times New Roman" w:hAnsi="Times New Roman"/>
+          <w:sz w:val="24"/>
+        </w:rPr>
+        <w:t>Diseño y aplicación de guía de observación directa sobre el proceso de gestión de solicitudes, registrando los tiempos de respuesta por etapa y los puntos de interrupción del flujo.</w:t>
+      </w:r>
+    </w:p>
+    <w:p>
+      <w:pPr>
+        <w:spacing w:before="480" w:after="480" w:line="360" w:lineRule="auto"/>
+        <w:jc w:val="left"/>
+      </w:pPr>
+      <w:r>
+        <w:rPr>
+          <w:rFonts w:ascii="Times New Roman" w:hAnsi="Times New Roman"/>
+          <w:b/>
+          <w:sz w:val="24"/>
+        </w:rPr>
+        <w:t>Semana 4</w:t>
       </w:r>
     </w:p>
     <w:p>
@@ -7602,14 +6970,22 @@
           <w:rFonts w:ascii="Times New Roman" w:hAnsi="Times New Roman"/>
           <w:sz w:val="24"/>
         </w:rPr>
-        <w:t xml:space="preserve">3. </w:t>
+        <w:t xml:space="preserve">1. </w:t>
+      </w:r>
+      <w:r>
+        <w:rPr>
+          <w:rFonts w:ascii="Times New Roman" w:hAnsi="Times New Roman"/>
+          <w:b/>
+          <w:sz w:val="24"/>
+        </w:rPr>
+        <w:t xml:space="preserve">Actividad operativa: </w:t>
       </w:r>
       <w:r>
         <w:rPr>
           <w:rFonts w:ascii="Times New Roman" w:hAnsi="Times New Roman"/>
           <w:sz w:val="24"/>
         </w:rPr>
-        <w:t>Establecer indicadores de gestión para el proceso de atención al suscriptor, tales como el tiempo promedio de resolución de incidencias, el porcentaje de solicitudes cerradas dentro del plazo y el índice de reincidencias por caso, con seguimiento mensual por parte de la supervisión.</w:t>
+        <w:t>Apoyo en la atención al suscriptor vía telefónica y presencial, registro de incidencias reportadas y coordinación con el NOC para el despacho de cuadrillas técnicas de campo.</w:t>
       </w:r>
     </w:p>
     <w:p>
@@ -7623,14 +6999,454 @@
           <w:rFonts w:ascii="Times New Roman" w:hAnsi="Times New Roman"/>
           <w:sz w:val="24"/>
         </w:rPr>
-        <w:t xml:space="preserve">4. </w:t>
+        <w:t xml:space="preserve">2. </w:t>
+      </w:r>
+      <w:r>
+        <w:rPr>
+          <w:rFonts w:ascii="Times New Roman" w:hAnsi="Times New Roman"/>
+          <w:b/>
+          <w:sz w:val="24"/>
+        </w:rPr>
+        <w:t xml:space="preserve">Actividad de investigación: </w:t>
       </w:r>
       <w:r>
         <w:rPr>
           <w:rFonts w:ascii="Times New Roman" w:hAnsi="Times New Roman"/>
           <w:sz w:val="24"/>
         </w:rPr>
-        <w:t>Evaluar la incorporación de una plataforma de gestión de tickets de código abierto que centralice el registro y seguimiento de solicitudes en tiempo real, eliminando la dependencia de canales informales de comunicación y dotando a la organización de trazabilidad completa sobre el ciclo de vida de cada caso.</w:t>
+        <w:t>Aplicación de entrevistas no estructuradas al personal administrativo, comercial y técnico para identificar las deficiencias percibidas en el sistema de control de solicitudes de servicio.</w:t>
+      </w:r>
+    </w:p>
+    <w:p>
+      <w:pPr>
+        <w:spacing w:before="480" w:after="480" w:line="360" w:lineRule="auto"/>
+        <w:jc w:val="left"/>
+      </w:pPr>
+      <w:r>
+        <w:rPr>
+          <w:rFonts w:ascii="Times New Roman" w:hAnsi="Times New Roman"/>
+          <w:b/>
+          <w:sz w:val="24"/>
+        </w:rPr>
+        <w:t>Semana 5</w:t>
+      </w:r>
+    </w:p>
+    <w:p>
+      <w:pPr>
+        <w:spacing w:line="360" w:lineRule="auto"/>
+        <w:ind w:firstLine="709"/>
+        <w:jc w:val="both"/>
+      </w:pPr>
+      <w:r>
+        <w:rPr>
+          <w:rFonts w:ascii="Times New Roman" w:hAnsi="Times New Roman"/>
+          <w:sz w:val="24"/>
+        </w:rPr>
+        <w:t xml:space="preserve">1. </w:t>
+      </w:r>
+      <w:r>
+        <w:rPr>
+          <w:rFonts w:ascii="Times New Roman" w:hAnsi="Times New Roman"/>
+          <w:b/>
+          <w:sz w:val="24"/>
+        </w:rPr>
+        <w:t xml:space="preserve">Actividad operativa: </w:t>
+      </w:r>
+      <w:r>
+        <w:rPr>
+          <w:rFonts w:ascii="Times New Roman" w:hAnsi="Times New Roman"/>
+          <w:sz w:val="24"/>
+        </w:rPr>
+        <w:t>Colaboración en la actualización del registro de suscriptores activos, verificación del cierre de casos pendientes y apoyo en la elaboración de reportes de incidencias del período.</w:t>
+      </w:r>
+    </w:p>
+    <w:p>
+      <w:pPr>
+        <w:spacing w:line="360" w:lineRule="auto"/>
+        <w:ind w:firstLine="709"/>
+        <w:jc w:val="both"/>
+      </w:pPr>
+      <w:r>
+        <w:rPr>
+          <w:rFonts w:ascii="Times New Roman" w:hAnsi="Times New Roman"/>
+          <w:sz w:val="24"/>
+        </w:rPr>
+        <w:t xml:space="preserve">2. </w:t>
+      </w:r>
+      <w:r>
+        <w:rPr>
+          <w:rFonts w:ascii="Times New Roman" w:hAnsi="Times New Roman"/>
+          <w:b/>
+          <w:sz w:val="24"/>
+        </w:rPr>
+        <w:t xml:space="preserve">Actividad de investigación: </w:t>
+      </w:r>
+      <w:r>
+        <w:rPr>
+          <w:rFonts w:ascii="Times New Roman" w:hAnsi="Times New Roman"/>
+          <w:sz w:val="24"/>
+        </w:rPr>
+        <w:t>Diagnóstico situacional de las deficiencias del control administrativo, elaboración de la matriz de fallas identificadas y análisis de los tiempos promedio de atención por tipo de solicitud.</w:t>
+      </w:r>
+    </w:p>
+    <w:p>
+      <w:pPr>
+        <w:spacing w:before="480" w:after="480" w:line="360" w:lineRule="auto"/>
+        <w:jc w:val="left"/>
+      </w:pPr>
+      <w:r>
+        <w:rPr>
+          <w:rFonts w:ascii="Times New Roman" w:hAnsi="Times New Roman"/>
+          <w:b/>
+          <w:sz w:val="24"/>
+        </w:rPr>
+        <w:t>Semana 6</w:t>
+      </w:r>
+    </w:p>
+    <w:p>
+      <w:pPr>
+        <w:spacing w:line="360" w:lineRule="auto"/>
+        <w:ind w:firstLine="709"/>
+        <w:jc w:val="both"/>
+      </w:pPr>
+      <w:r>
+        <w:rPr>
+          <w:rFonts w:ascii="Times New Roman" w:hAnsi="Times New Roman"/>
+          <w:sz w:val="24"/>
+        </w:rPr>
+        <w:t xml:space="preserve">1. </w:t>
+      </w:r>
+      <w:r>
+        <w:rPr>
+          <w:rFonts w:ascii="Times New Roman" w:hAnsi="Times New Roman"/>
+          <w:b/>
+          <w:sz w:val="24"/>
+        </w:rPr>
+        <w:t xml:space="preserve">Actividad operativa: </w:t>
+      </w:r>
+      <w:r>
+        <w:rPr>
+          <w:rFonts w:ascii="Times New Roman" w:hAnsi="Times New Roman"/>
+          <w:sz w:val="24"/>
+        </w:rPr>
+        <w:t>Apoyo en la tramitación de contratos de nuevos suscriptores, verificación de la documentación requerida y actualización del registro de afiliaciones del período en el sistema del departamento.</w:t>
+      </w:r>
+    </w:p>
+    <w:p>
+      <w:pPr>
+        <w:spacing w:line="360" w:lineRule="auto"/>
+        <w:ind w:firstLine="709"/>
+        <w:jc w:val="both"/>
+      </w:pPr>
+      <w:r>
+        <w:rPr>
+          <w:rFonts w:ascii="Times New Roman" w:hAnsi="Times New Roman"/>
+          <w:sz w:val="24"/>
+        </w:rPr>
+        <w:t xml:space="preserve">2. </w:t>
+      </w:r>
+      <w:r>
+        <w:rPr>
+          <w:rFonts w:ascii="Times New Roman" w:hAnsi="Times New Roman"/>
+          <w:b/>
+          <w:sz w:val="24"/>
+        </w:rPr>
+        <w:t xml:space="preserve">Actividad de investigación: </w:t>
+      </w:r>
+      <w:r>
+        <w:rPr>
+          <w:rFonts w:ascii="Times New Roman" w:hAnsi="Times New Roman"/>
+          <w:sz w:val="24"/>
+        </w:rPr>
+        <w:t>Análisis del impacto de las deficiencias detectadas sobre la calidad del servicio percibida por los suscriptores, mediante correlación entre tiempos de atención y quejas registradas.</w:t>
+      </w:r>
+    </w:p>
+    <w:p>
+      <w:pPr>
+        <w:spacing w:before="480" w:after="480" w:line="360" w:lineRule="auto"/>
+        <w:jc w:val="left"/>
+      </w:pPr>
+      <w:r>
+        <w:rPr>
+          <w:rFonts w:ascii="Times New Roman" w:hAnsi="Times New Roman"/>
+          <w:b/>
+          <w:sz w:val="24"/>
+        </w:rPr>
+        <w:t>Semana 7</w:t>
+      </w:r>
+    </w:p>
+    <w:p>
+      <w:pPr>
+        <w:spacing w:line="360" w:lineRule="auto"/>
+        <w:ind w:firstLine="709"/>
+        <w:jc w:val="both"/>
+      </w:pPr>
+      <w:r>
+        <w:rPr>
+          <w:rFonts w:ascii="Times New Roman" w:hAnsi="Times New Roman"/>
+          <w:sz w:val="24"/>
+        </w:rPr>
+        <w:t xml:space="preserve">1. </w:t>
+      </w:r>
+      <w:r>
+        <w:rPr>
+          <w:rFonts w:ascii="Times New Roman" w:hAnsi="Times New Roman"/>
+          <w:b/>
+          <w:sz w:val="24"/>
+        </w:rPr>
+        <w:t xml:space="preserve">Actividad operativa: </w:t>
+      </w:r>
+      <w:r>
+        <w:rPr>
+          <w:rFonts w:ascii="Times New Roman" w:hAnsi="Times New Roman"/>
+          <w:sz w:val="24"/>
+        </w:rPr>
+        <w:t>Colaboración en la revisión y archivo de expedientes administrativos del ciclo, apoyo en la conciliación de pagos de suscriptores y actualización de la base de datos de clientes.</w:t>
+      </w:r>
+    </w:p>
+    <w:p>
+      <w:pPr>
+        <w:spacing w:line="360" w:lineRule="auto"/>
+        <w:ind w:firstLine="709"/>
+        <w:jc w:val="both"/>
+      </w:pPr>
+      <w:r>
+        <w:rPr>
+          <w:rFonts w:ascii="Times New Roman" w:hAnsi="Times New Roman"/>
+          <w:sz w:val="24"/>
+        </w:rPr>
+        <w:t xml:space="preserve">2. </w:t>
+      </w:r>
+      <w:r>
+        <w:rPr>
+          <w:rFonts w:ascii="Times New Roman" w:hAnsi="Times New Roman"/>
+          <w:b/>
+          <w:sz w:val="24"/>
+        </w:rPr>
+        <w:t xml:space="preserve">Actividad de investigación: </w:t>
+      </w:r>
+      <w:r>
+        <w:rPr>
+          <w:rFonts w:ascii="Times New Roman" w:hAnsi="Times New Roman"/>
+          <w:sz w:val="24"/>
+        </w:rPr>
+        <w:t>Diseño del nuevo flujo de trabajo estandarizado para la gestión de solicitudes, con definición de etapas, responsables, tiempos máximos de respuesta y puntos de control por fase.</w:t>
+      </w:r>
+    </w:p>
+    <w:p>
+      <w:pPr>
+        <w:spacing w:before="480" w:after="480" w:line="360" w:lineRule="auto"/>
+        <w:jc w:val="left"/>
+      </w:pPr>
+      <w:r>
+        <w:rPr>
+          <w:rFonts w:ascii="Times New Roman" w:hAnsi="Times New Roman"/>
+          <w:b/>
+          <w:sz w:val="24"/>
+        </w:rPr>
+        <w:t>Semana 8</w:t>
+      </w:r>
+    </w:p>
+    <w:p>
+      <w:pPr>
+        <w:spacing w:line="360" w:lineRule="auto"/>
+        <w:ind w:firstLine="709"/>
+        <w:jc w:val="both"/>
+      </w:pPr>
+      <w:r>
+        <w:rPr>
+          <w:rFonts w:ascii="Times New Roman" w:hAnsi="Times New Roman"/>
+          <w:sz w:val="24"/>
+        </w:rPr>
+        <w:t xml:space="preserve">1. </w:t>
+      </w:r>
+      <w:r>
+        <w:rPr>
+          <w:rFonts w:ascii="Times New Roman" w:hAnsi="Times New Roman"/>
+          <w:b/>
+          <w:sz w:val="24"/>
+        </w:rPr>
+        <w:t xml:space="preserve">Actividad operativa: </w:t>
+      </w:r>
+      <w:r>
+        <w:rPr>
+          <w:rFonts w:ascii="Times New Roman" w:hAnsi="Times New Roman"/>
+          <w:sz w:val="24"/>
+        </w:rPr>
+        <w:t>Apoyo en la generación de reportes de incidencias y solicitudes del período para la supervisión administrativa, y colaboración en la atención de requerimientos de suscriptores activos.</w:t>
+      </w:r>
+    </w:p>
+    <w:p>
+      <w:pPr>
+        <w:spacing w:line="360" w:lineRule="auto"/>
+        <w:ind w:firstLine="709"/>
+        <w:jc w:val="both"/>
+      </w:pPr>
+      <w:r>
+        <w:rPr>
+          <w:rFonts w:ascii="Times New Roman" w:hAnsi="Times New Roman"/>
+          <w:sz w:val="24"/>
+        </w:rPr>
+        <w:t xml:space="preserve">2. </w:t>
+      </w:r>
+      <w:r>
+        <w:rPr>
+          <w:rFonts w:ascii="Times New Roman" w:hAnsi="Times New Roman"/>
+          <w:b/>
+          <w:sz w:val="24"/>
+        </w:rPr>
+        <w:t xml:space="preserve">Actividad de investigación: </w:t>
+      </w:r>
+      <w:r>
+        <w:rPr>
+          <w:rFonts w:ascii="Times New Roman" w:hAnsi="Times New Roman"/>
+          <w:sz w:val="24"/>
+        </w:rPr>
+        <w:t>Diseño de los formatos estandarizados de registro de solicitudes de afiliación y de incidencias, y elaboración del procedimiento escrito para la gestión unificada de casos en el departamento.</w:t>
+      </w:r>
+    </w:p>
+    <w:p>
+      <w:pPr>
+        <w:spacing w:before="480" w:after="480" w:line="360" w:lineRule="auto"/>
+        <w:jc w:val="left"/>
+      </w:pPr>
+      <w:r>
+        <w:rPr>
+          <w:rFonts w:ascii="Times New Roman" w:hAnsi="Times New Roman"/>
+          <w:b/>
+          <w:sz w:val="24"/>
+        </w:rPr>
+        <w:t>Semana 9</w:t>
+      </w:r>
+    </w:p>
+    <w:p>
+      <w:pPr>
+        <w:spacing w:line="360" w:lineRule="auto"/>
+        <w:ind w:firstLine="709"/>
+        <w:jc w:val="both"/>
+      </w:pPr>
+      <w:r>
+        <w:rPr>
+          <w:rFonts w:ascii="Times New Roman" w:hAnsi="Times New Roman"/>
+          <w:sz w:val="24"/>
+        </w:rPr>
+        <w:t xml:space="preserve">1. </w:t>
+      </w:r>
+      <w:r>
+        <w:rPr>
+          <w:rFonts w:ascii="Times New Roman" w:hAnsi="Times New Roman"/>
+          <w:b/>
+          <w:sz w:val="24"/>
+        </w:rPr>
+        <w:t xml:space="preserve">Actividad operativa: </w:t>
+      </w:r>
+      <w:r>
+        <w:rPr>
+          <w:rFonts w:ascii="Times New Roman" w:hAnsi="Times New Roman"/>
+          <w:sz w:val="24"/>
+        </w:rPr>
+        <w:t>Participación en las actividades regulares del departamento y apoyo en el cierre administrativo del ciclo de atención al suscriptor correspondiente al período de pasantías.</w:t>
+      </w:r>
+    </w:p>
+    <w:p>
+      <w:pPr>
+        <w:spacing w:line="360" w:lineRule="auto"/>
+        <w:ind w:firstLine="709"/>
+        <w:jc w:val="both"/>
+      </w:pPr>
+      <w:r>
+        <w:rPr>
+          <w:rFonts w:ascii="Times New Roman" w:hAnsi="Times New Roman"/>
+          <w:sz w:val="24"/>
+        </w:rPr>
+        <w:t xml:space="preserve">2. </w:t>
+      </w:r>
+      <w:r>
+        <w:rPr>
+          <w:rFonts w:ascii="Times New Roman" w:hAnsi="Times New Roman"/>
+          <w:b/>
+          <w:sz w:val="24"/>
+        </w:rPr>
+        <w:t xml:space="preserve">Actividad de investigación: </w:t>
+      </w:r>
+      <w:r>
+        <w:rPr>
+          <w:rFonts w:ascii="Times New Roman" w:hAnsi="Times New Roman"/>
+          <w:sz w:val="24"/>
+        </w:rPr>
+        <w:t>Redacción y validación de la propuesta de mejora al control administrativo de solicitudes de servicio, incorporando las observaciones del tutor industrial y ajustando los procedimientos al contexto operativo de IDETEL.</w:t>
+      </w:r>
+    </w:p>
+    <w:p>
+      <w:pPr>
+        <w:spacing w:before="480" w:after="480" w:line="360" w:lineRule="auto"/>
+        <w:jc w:val="left"/>
+      </w:pPr>
+      <w:r>
+        <w:rPr>
+          <w:rFonts w:ascii="Times New Roman" w:hAnsi="Times New Roman"/>
+          <w:b/>
+          <w:sz w:val="24"/>
+        </w:rPr>
+        <w:t>Semana 10</w:t>
+      </w:r>
+    </w:p>
+    <w:p>
+      <w:pPr>
+        <w:spacing w:line="360" w:lineRule="auto"/>
+        <w:ind w:firstLine="709"/>
+        <w:jc w:val="both"/>
+      </w:pPr>
+      <w:r>
+        <w:rPr>
+          <w:rFonts w:ascii="Times New Roman" w:hAnsi="Times New Roman"/>
+          <w:sz w:val="24"/>
+        </w:rPr>
+        <w:t xml:space="preserve">1. </w:t>
+      </w:r>
+      <w:r>
+        <w:rPr>
+          <w:rFonts w:ascii="Times New Roman" w:hAnsi="Times New Roman"/>
+          <w:b/>
+          <w:sz w:val="24"/>
+        </w:rPr>
+        <w:t xml:space="preserve">Actividad operativa: </w:t>
+      </w:r>
+      <w:r>
+        <w:rPr>
+          <w:rFonts w:ascii="Times New Roman" w:hAnsi="Times New Roman"/>
+          <w:sz w:val="24"/>
+        </w:rPr>
+        <w:t>Presentación formal de la propuesta de mejora ante la supervisión del Departamento de Administración y firma de la carta de aprobación del tutor industrial.</w:t>
+      </w:r>
+    </w:p>
+    <w:p>
+      <w:pPr>
+        <w:spacing w:line="360" w:lineRule="auto"/>
+        <w:ind w:firstLine="709"/>
+        <w:jc w:val="both"/>
+      </w:pPr>
+      <w:r>
+        <w:rPr>
+          <w:rFonts w:ascii="Times New Roman" w:hAnsi="Times New Roman"/>
+          <w:sz w:val="24"/>
+        </w:rPr>
+        <w:t xml:space="preserve">2. </w:t>
+      </w:r>
+      <w:r>
+        <w:rPr>
+          <w:rFonts w:ascii="Times New Roman" w:hAnsi="Times New Roman"/>
+          <w:b/>
+          <w:sz w:val="24"/>
+        </w:rPr>
+        <w:t xml:space="preserve">Actividad de investigación: </w:t>
+      </w:r>
+      <w:r>
+        <w:rPr>
+          <w:rFonts w:ascii="Times New Roman" w:hAnsi="Times New Roman"/>
+          <w:sz w:val="24"/>
+        </w:rPr>
+        <w:t>Consolidación y revisión final del informe académico de pasantías, incorporación de los anexos definitivos y preparación del documento para la entrega institucional al IUTECP.</w:t>
       </w:r>
     </w:p>
     <w:p>
@@ -7647,7 +7463,6 @@
       </w:pPr>
     </w:p>
     <w:p>
-      <w:bookmarkStart w:id="bm_referencias" w:name="bm_referencias"/>
       <w:pPr>
         <w:spacing w:after="480"/>
         <w:jc w:val="center"/>
@@ -7658,9 +7473,24 @@
           <w:b/>
           <w:sz w:val="24"/>
         </w:rPr>
-        <w:t>REFERENCIAS</w:t>
-      </w:r>
-      <w:bookmarkEnd w:id="bm_referencias"/>
+        <w:t>CAPÍTULO V</w:t>
+      </w:r>
+    </w:p>
+    <w:p>
+      <w:bookmarkStart w:id="bm_cap5" w:name="bm_cap5"/>
+      <w:pPr>
+        <w:spacing w:before="480"/>
+        <w:jc w:val="center"/>
+      </w:pPr>
+      <w:r>
+        <w:rPr>
+          <w:rFonts w:ascii="Times New Roman" w:hAnsi="Times New Roman"/>
+          <w:b/>
+          <w:sz w:val="24"/>
+        </w:rPr>
+        <w:t>CONCLUSIONES Y RECOMENDACIONES</w:t>
+      </w:r>
+      <w:bookmarkEnd w:id="bm_cap5"/>
     </w:p>
     <w:p>
       <w:pPr>
@@ -7675,14 +7505,25 @@
       </w:pPr>
     </w:p>
     <w:p>
-      <w:pPr>
-        <w:spacing w:before="480" w:after="0"/>
-      </w:pPr>
+      <w:bookmarkStart w:id="bm_cap5_concl" w:name="bm_cap5_concl"/>
+      <w:pPr>
+        <w:spacing w:before="480" w:after="480" w:line="360" w:lineRule="auto"/>
+        <w:jc w:val="left"/>
+      </w:pPr>
+      <w:r>
+        <w:rPr>
+          <w:rFonts w:ascii="Times New Roman" w:hAnsi="Times New Roman"/>
+          <w:b/>
+          <w:sz w:val="24"/>
+        </w:rPr>
+        <w:t>Conclusiones</w:t>
+      </w:r>
+      <w:bookmarkEnd w:id="bm_cap5_concl"/>
     </w:p>
     <w:p>
       <w:pPr>
-        <w:spacing w:line="240" w:lineRule="auto" w:after="480" w:before="0"/>
-        <w:ind w:left="425" w:hanging="425"/>
+        <w:spacing w:line="360" w:lineRule="auto"/>
+        <w:ind w:firstLine="709"/>
         <w:jc w:val="both"/>
       </w:pPr>
       <w:r>
@@ -7690,13 +7531,20 @@
           <w:rFonts w:ascii="Times New Roman" w:hAnsi="Times New Roman"/>
           <w:sz w:val="24"/>
         </w:rPr>
-        <w:t>Arias, F. (2012). El proyecto de investigación: Introducción a la metodología científica (6ta ed.). Episteme, Venezuela.</w:t>
+        <w:t xml:space="preserve">1. </w:t>
+      </w:r>
+      <w:r>
+        <w:rPr>
+          <w:rFonts w:ascii="Times New Roman" w:hAnsi="Times New Roman"/>
+          <w:sz w:val="24"/>
+        </w:rPr>
+        <w:t>Se describió el proceso administrativo actual de gestión de solicitudes de IDETEL, identificando un flujo de cuatro etapas (recepción, asignación, ejecución y cierre) que opera sin procedimientos escritos formales, dependiendo de canales informales de comunicación entre las áreas comercial, administrativa y técnica.</w:t>
       </w:r>
     </w:p>
     <w:p>
       <w:pPr>
-        <w:spacing w:line="240" w:lineRule="auto" w:after="480" w:before="0"/>
-        <w:ind w:left="425" w:hanging="425"/>
+        <w:spacing w:line="360" w:lineRule="auto"/>
+        <w:ind w:firstLine="709"/>
         <w:jc w:val="both"/>
       </w:pPr>
       <w:r>
@@ -7704,13 +7552,20 @@
           <w:rFonts w:ascii="Times New Roman" w:hAnsi="Times New Roman"/>
           <w:sz w:val="24"/>
         </w:rPr>
-        <w:t>Chiavenato, I. (2006). Introducción a la teoría general de la administración (7ma ed.). McGraw-Hill, México.</w:t>
+        <w:t xml:space="preserve">2. </w:t>
+      </w:r>
+      <w:r>
+        <w:rPr>
+          <w:rFonts w:ascii="Times New Roman" w:hAnsi="Times New Roman"/>
+          <w:sz w:val="24"/>
+        </w:rPr>
+        <w:t>Se identificaron como principales deficiencias del control administrativo la ausencia de un sistema unificado de seguimiento de casos, la falta de formatos estandarizados de registro, la inexistencia de tiempos de respuesta definidos por etapa y la carencia de indicadores de gestión que permitan evaluar el desempeño del proceso.</w:t>
       </w:r>
     </w:p>
     <w:p>
       <w:pPr>
-        <w:spacing w:line="240" w:lineRule="auto" w:after="480" w:before="0"/>
-        <w:ind w:left="425" w:hanging="425"/>
+        <w:spacing w:line="360" w:lineRule="auto"/>
+        <w:ind w:firstLine="709"/>
         <w:jc w:val="both"/>
       </w:pPr>
       <w:r>
@@ -7718,13 +7573,20 @@
           <w:rFonts w:ascii="Times New Roman" w:hAnsi="Times New Roman"/>
           <w:sz w:val="24"/>
         </w:rPr>
-        <w:t>Harrington, H. J. (1993). Mejoramiento de los procesos de la empresa. McGraw-Hill, Colombia.</w:t>
+        <w:t xml:space="preserve">3. </w:t>
+      </w:r>
+      <w:r>
+        <w:rPr>
+          <w:rFonts w:ascii="Times New Roman" w:hAnsi="Times New Roman"/>
+          <w:sz w:val="24"/>
+        </w:rPr>
+        <w:t>Se determinó que las debilidades detectadas en el control administrativo generan impactos directos sobre la calidad del servicio percibida por los suscriptores, manifestados en tiempos de atención prolongados, falta de trazabilidad en el estatus de los casos y dificultades en la coordinación interdepartamental que derivan en reprocesos y quejas reiteradas.</w:t>
       </w:r>
     </w:p>
     <w:p>
       <w:pPr>
-        <w:spacing w:line="240" w:lineRule="auto" w:after="480" w:before="0"/>
-        <w:ind w:left="425" w:hanging="425"/>
+        <w:spacing w:line="360" w:lineRule="auto"/>
+        <w:ind w:firstLine="709"/>
         <w:jc w:val="both"/>
       </w:pPr>
       <w:r>
@@ -7732,13 +7594,36 @@
           <w:rFonts w:ascii="Times New Roman" w:hAnsi="Times New Roman"/>
           <w:sz w:val="24"/>
         </w:rPr>
-        <w:t>Laudon, K., y Laudon, J. (2016). Sistemas de información gerencial (14va ed.). Pearson Educación, México.</w:t>
+        <w:t xml:space="preserve">4. </w:t>
+      </w:r>
+      <w:r>
+        <w:rPr>
+          <w:rFonts w:ascii="Times New Roman" w:hAnsi="Times New Roman"/>
+          <w:sz w:val="24"/>
+        </w:rPr>
+        <w:t>Se formuló una propuesta de mejora al control administrativo que contempla un nuevo flujo de trabajo estandarizado con etapas y responsables definidos, formatos unificados de registro de solicitudes e incidencias, y un conjunto de indicadores de gestión para el monitoreo continuo del proceso de atención al suscriptor.</w:t>
       </w:r>
     </w:p>
     <w:p>
-      <w:pPr>
-        <w:spacing w:line="240" w:lineRule="auto" w:after="480" w:before="0"/>
-        <w:ind w:left="425" w:hanging="425"/>
+      <w:bookmarkStart w:id="bm_cap5_recom" w:name="bm_cap5_recom"/>
+      <w:pPr>
+        <w:spacing w:before="480" w:after="480" w:line="360" w:lineRule="auto"/>
+        <w:jc w:val="left"/>
+      </w:pPr>
+      <w:r>
+        <w:rPr>
+          <w:rFonts w:ascii="Times New Roman" w:hAnsi="Times New Roman"/>
+          <w:b/>
+          <w:sz w:val="24"/>
+        </w:rPr>
+        <w:t>Recomendaciones</w:t>
+      </w:r>
+      <w:bookmarkEnd w:id="bm_cap5_recom"/>
+    </w:p>
+    <w:p>
+      <w:pPr>
+        <w:spacing w:line="360" w:lineRule="auto"/>
+        <w:ind w:firstLine="709"/>
         <w:jc w:val="both"/>
       </w:pPr>
       <w:r>
@@ -7746,13 +7631,20 @@
           <w:rFonts w:ascii="Times New Roman" w:hAnsi="Times New Roman"/>
           <w:sz w:val="24"/>
         </w:rPr>
-        <w:t>Parasuraman, A., Zeithaml, V., y Berry, L. (1988). SERVQUAL: A multiple-item scale for measuring consumer perceptions of service quality. Journal of Retailing, 64(1), 12-40.</w:t>
+        <w:t xml:space="preserve">1. </w:t>
+      </w:r>
+      <w:r>
+        <w:rPr>
+          <w:rFonts w:ascii="Times New Roman" w:hAnsi="Times New Roman"/>
+          <w:sz w:val="24"/>
+        </w:rPr>
+        <w:t>Implementar el nuevo flujo de trabajo estandarizado propuesto, comenzando por la formalización del canal de recepción de solicitudes y la adopción de los formatos unificados de registro de afiliaciones e incidencias en todos los departamentos involucrados.</w:t>
       </w:r>
     </w:p>
     <w:p>
       <w:pPr>
-        <w:spacing w:line="240" w:lineRule="auto" w:after="480" w:before="0"/>
-        <w:ind w:left="425" w:hanging="425"/>
+        <w:spacing w:line="360" w:lineRule="auto"/>
+        <w:ind w:firstLine="709"/>
         <w:jc w:val="both"/>
       </w:pPr>
       <w:r>
@@ -7760,13 +7652,20 @@
           <w:rFonts w:ascii="Times New Roman" w:hAnsi="Times New Roman"/>
           <w:sz w:val="24"/>
         </w:rPr>
-        <w:t>Robbins, S., y Coulter, M. (2010). Administración (10ma ed.). Pearson Educación, México.</w:t>
+        <w:t xml:space="preserve">2. </w:t>
+      </w:r>
+      <w:r>
+        <w:rPr>
+          <w:rFonts w:ascii="Times New Roman" w:hAnsi="Times New Roman"/>
+          <w:sz w:val="24"/>
+        </w:rPr>
+        <w:t>Socializar el manual de procedimientos de gestión de solicitudes con el personal de las áreas administrativa, comercial y técnica, garantizando que cada actor conozca su rol, sus responsabilidades y los tiempos máximos de respuesta establecidos para cada fase del proceso.</w:t>
       </w:r>
     </w:p>
     <w:p>
       <w:pPr>
-        <w:spacing w:line="240" w:lineRule="auto" w:after="480" w:before="0"/>
-        <w:ind w:left="425" w:hanging="425"/>
+        <w:spacing w:line="360" w:lineRule="auto"/>
+        <w:ind w:firstLine="709"/>
         <w:jc w:val="both"/>
       </w:pPr>
       <w:r>
@@ -7774,13 +7673,20 @@
           <w:rFonts w:ascii="Times New Roman" w:hAnsi="Times New Roman"/>
           <w:sz w:val="24"/>
         </w:rPr>
-        <w:t>Universidad Pedagógica Experimental Libertador. (2016). Manual de trabajos de grado de especialización y maestría y tesis doctorales (5ta ed.). FEDUPEL, Venezuela.</w:t>
+        <w:t xml:space="preserve">3. </w:t>
+      </w:r>
+      <w:r>
+        <w:rPr>
+          <w:rFonts w:ascii="Times New Roman" w:hAnsi="Times New Roman"/>
+          <w:sz w:val="24"/>
+        </w:rPr>
+        <w:t>Establecer indicadores de gestión para el proceso de atención al suscriptor, tales como el tiempo promedio de resolución de incidencias, el porcentaje de solicitudes cerradas dentro del plazo y el índice de reincidencias por caso, con seguimiento mensual por parte de la supervisión.</w:t>
       </w:r>
     </w:p>
     <w:p>
       <w:pPr>
-        <w:spacing w:line="240" w:lineRule="auto" w:after="480" w:before="0"/>
-        <w:ind w:left="425" w:hanging="425"/>
+        <w:spacing w:line="360" w:lineRule="auto"/>
+        <w:ind w:firstLine="709"/>
         <w:jc w:val="both"/>
       </w:pPr>
       <w:r>
@@ -7788,7 +7694,14 @@
           <w:rFonts w:ascii="Times New Roman" w:hAnsi="Times New Roman"/>
           <w:sz w:val="24"/>
         </w:rPr>
-        <w:t>Zeithaml, V., Parasuraman, A., y Berry, L. (1993). Calidad total en la gestión de servicios. Díaz de Santos, España.</w:t>
+        <w:t xml:space="preserve">4. </w:t>
+      </w:r>
+      <w:r>
+        <w:rPr>
+          <w:rFonts w:ascii="Times New Roman" w:hAnsi="Times New Roman"/>
+          <w:sz w:val="24"/>
+        </w:rPr>
+        <w:t>Evaluar la incorporación de una plataforma de gestión de tickets de código abierto que centralice el registro y seguimiento de solicitudes en tiempo real, eliminando la dependencia de canales informales de comunicación y dotando a la organización de trazabilidad completa sobre el ciclo de vida de cada caso.</w:t>
       </w:r>
     </w:p>
     <w:p>
@@ -7805,20 +7718,20 @@
       </w:pPr>
     </w:p>
     <w:p>
-      <w:bookmarkStart w:id="bm_anexos" w:name="bm_anexos"/>
-      <w:pPr>
-        <w:spacing w:before="3600"/>
+      <w:bookmarkStart w:id="bm_referencias" w:name="bm_referencias"/>
+      <w:pPr>
+        <w:spacing w:after="480"/>
         <w:jc w:val="center"/>
       </w:pPr>
       <w:r>
         <w:rPr>
           <w:rFonts w:ascii="Times New Roman" w:hAnsi="Times New Roman"/>
           <w:b/>
-          <w:sz w:val="32"/>
-        </w:rPr>
-        <w:t>ANEXOS</w:t>
-      </w:r>
-      <w:bookmarkEnd w:id="bm_anexos"/>
+          <w:sz w:val="24"/>
+        </w:rPr>
+        <w:t>REFERENCIAS</w:t>
+      </w:r>
+      <w:bookmarkEnd w:id="bm_referencias"/>
     </w:p>
     <w:p>
       <w:pPr>
@@ -7833,54 +7746,129 @@
       </w:pPr>
     </w:p>
     <w:p>
-      <w:bookmarkStart w:id="bm_anexoA" w:name="bm_anexoA"/>
-      <w:pPr>
-        <w:spacing w:before="0" w:after="480"/>
-        <w:jc w:val="center"/>
-      </w:pPr>
-      <w:bookmarkEnd w:id="bm_anexoA"/>
-      <w:r>
-        <w:rPr>
-          <w:rFonts w:ascii="Times New Roman" w:hAnsi="Times New Roman"/>
-          <w:b/>
-          <w:sz w:val="24"/>
-        </w:rPr>
-        <w:t>ANEXO A</w:t>
-      </w:r>
+      <w:pPr>
+        <w:spacing w:before="480" w:after="0"/>
+      </w:pPr>
     </w:p>
     <w:p>
       <w:pPr>
-        <w:spacing w:before="240" w:after="480"/>
-        <w:jc w:val="center"/>
+        <w:spacing w:line="240" w:lineRule="auto" w:after="480" w:before="0"/>
+        <w:ind w:left="425" w:hanging="425"/>
+        <w:jc w:val="both"/>
       </w:pPr>
       <w:r>
         <w:rPr>
           <w:rFonts w:ascii="Times New Roman" w:hAnsi="Times New Roman"/>
-          <w:b/>
           <w:sz w:val="24"/>
         </w:rPr>
-        <w:t>[Aquí va la descripción del Anexo A]</w:t>
+        <w:t>Arias, F. (2012). El proyecto de investigación: Introducción a la metodología científica (6ta ed.). Episteme, Venezuela.</w:t>
       </w:r>
     </w:p>
     <w:p>
       <w:pPr>
-        <w:jc w:val="center"/>
+        <w:spacing w:line="240" w:lineRule="auto" w:after="480" w:before="0"/>
+        <w:ind w:left="425" w:hanging="425"/>
+        <w:jc w:val="both"/>
       </w:pPr>
       <w:r>
         <w:rPr>
           <w:rFonts w:ascii="Times New Roman" w:hAnsi="Times New Roman"/>
-          <w:i/>
-          <w:sz w:val="20"/>
-        </w:rPr>
-        <w:t>(Contenido elaborado por el estudiante)</w:t>
+          <w:sz w:val="24"/>
+        </w:rPr>
+        <w:t>Chiavenato, I. (2006). Introducción a la teoría general de la administración (7ma ed.). McGraw-Hill, México.</w:t>
       </w:r>
     </w:p>
     <w:p>
       <w:pPr>
+        <w:spacing w:line="240" w:lineRule="auto" w:after="480" w:before="0"/>
+        <w:ind w:left="425" w:hanging="425"/>
+        <w:jc w:val="both"/>
+      </w:pPr>
+      <w:r>
+        <w:rPr>
+          <w:rFonts w:ascii="Times New Roman" w:hAnsi="Times New Roman"/>
+          <w:sz w:val="24"/>
+        </w:rPr>
+        <w:t>Harrington, H. J. (1993). Mejoramiento de los procesos de la empresa. McGraw-Hill, Colombia.</w:t>
+      </w:r>
+    </w:p>
+    <w:p>
+      <w:pPr>
+        <w:spacing w:line="240" w:lineRule="auto" w:after="480" w:before="0"/>
+        <w:ind w:left="425" w:hanging="425"/>
+        <w:jc w:val="both"/>
+      </w:pPr>
+      <w:r>
+        <w:rPr>
+          <w:rFonts w:ascii="Times New Roman" w:hAnsi="Times New Roman"/>
+          <w:sz w:val="24"/>
+        </w:rPr>
+        <w:t>Laudon, K., y Laudon, J. (2016). Sistemas de información gerencial (14va ed.). Pearson Educación, México.</w:t>
+      </w:r>
+    </w:p>
+    <w:p>
+      <w:pPr>
+        <w:spacing w:line="240" w:lineRule="auto" w:after="480" w:before="0"/>
+        <w:ind w:left="425" w:hanging="425"/>
+        <w:jc w:val="both"/>
+      </w:pPr>
+      <w:r>
+        <w:rPr>
+          <w:rFonts w:ascii="Times New Roman" w:hAnsi="Times New Roman"/>
+          <w:sz w:val="24"/>
+        </w:rPr>
+        <w:t>Parasuraman, A., Zeithaml, V., y Berry, L. (1988). SERVQUAL: A multiple-item scale for measuring consumer perceptions of service quality. Journal of Retailing, 64(1), 12-40.</w:t>
+      </w:r>
+    </w:p>
+    <w:p>
+      <w:pPr>
+        <w:spacing w:line="240" w:lineRule="auto" w:after="480" w:before="0"/>
+        <w:ind w:left="425" w:hanging="425"/>
+        <w:jc w:val="both"/>
+      </w:pPr>
+      <w:r>
+        <w:rPr>
+          <w:rFonts w:ascii="Times New Roman" w:hAnsi="Times New Roman"/>
+          <w:sz w:val="24"/>
+        </w:rPr>
+        <w:t>Robbins, S., y Coulter, M. (2010). Administración (10ma ed.). Pearson Educación, México.</w:t>
+      </w:r>
+    </w:p>
+    <w:p>
+      <w:pPr>
+        <w:spacing w:line="240" w:lineRule="auto" w:after="480" w:before="0"/>
+        <w:ind w:left="425" w:hanging="425"/>
+        <w:jc w:val="both"/>
+      </w:pPr>
+      <w:r>
+        <w:rPr>
+          <w:rFonts w:ascii="Times New Roman" w:hAnsi="Times New Roman"/>
+          <w:sz w:val="24"/>
+        </w:rPr>
+        <w:t>Universidad Pedagógica Experimental Libertador. (2016). Manual de trabajos de grado de especialización y maestría y tesis doctorales (5ta ed.). FEDUPEL, Venezuela.</w:t>
+      </w:r>
+    </w:p>
+    <w:p>
+      <w:pPr>
+        <w:spacing w:line="240" w:lineRule="auto" w:after="480" w:before="0"/>
+        <w:ind w:left="425" w:hanging="425"/>
+        <w:jc w:val="both"/>
+      </w:pPr>
+      <w:r>
+        <w:rPr>
+          <w:rFonts w:ascii="Times New Roman" w:hAnsi="Times New Roman"/>
+          <w:sz w:val="24"/>
+        </w:rPr>
+        <w:t>Zeithaml, V., Parasuraman, A., y Berry, L. (1993). Calidad total en la gestión de servicios. Díaz de Santos, España.</w:t>
+      </w:r>
+    </w:p>
+    <w:p>
+      <w:pPr>
         <w:sectPr>
           <w:footerReference w:type="default" r:id="rId42"/>
+          <w:type w:val="continuous"/>
           <w:pgSz w:w="12240" w:h="15840"/>
-          <w:pgMar w:top="2835" w:right="1701" w:bottom="1701" w:left="2268" w:header="720" w:footer="720" w:gutter="0"/>
+          <w:pgMar w:top="1701" w:right="1701" w:bottom="1701" w:left="2268" w:header="720" w:footer="720" w:gutter="0"/>
           <w:cols w:space="720"/>
           <w:titlePg/>
           <w:docGrid w:linePitch="360"/>
@@ -7888,47 +7876,20 @@
       </w:pPr>
     </w:p>
     <w:p>
-      <w:bookmarkStart w:id="bm_anexoB" w:name="bm_anexoB"/>
-      <w:pPr>
-        <w:spacing w:before="0" w:after="480"/>
+      <w:bookmarkStart w:id="bm_anexos" w:name="bm_anexos"/>
+      <w:pPr>
+        <w:spacing w:before="3600"/>
         <w:jc w:val="center"/>
       </w:pPr>
-      <w:bookmarkEnd w:id="bm_anexoB"/>
       <w:r>
         <w:rPr>
           <w:rFonts w:ascii="Times New Roman" w:hAnsi="Times New Roman"/>
           <w:b/>
-          <w:sz w:val="24"/>
-        </w:rPr>
-        <w:t>ANEXO B</w:t>
-      </w:r>
-    </w:p>
-    <w:p>
-      <w:pPr>
-        <w:spacing w:before="240" w:after="480"/>
-        <w:jc w:val="center"/>
-      </w:pPr>
-      <w:r>
-        <w:rPr>
-          <w:rFonts w:ascii="Times New Roman" w:hAnsi="Times New Roman"/>
-          <w:b/>
-          <w:sz w:val="24"/>
-        </w:rPr>
-        <w:t>[Aquí va la descripción del Anexo B]</w:t>
-      </w:r>
-    </w:p>
-    <w:p>
-      <w:pPr>
-        <w:jc w:val="center"/>
-      </w:pPr>
-      <w:r>
-        <w:rPr>
-          <w:rFonts w:ascii="Times New Roman" w:hAnsi="Times New Roman"/>
-          <w:i/>
-          <w:sz w:val="20"/>
-        </w:rPr>
-        <w:t>(Contenido elaborado por el estudiante)</w:t>
-      </w:r>
+          <w:sz w:val="32"/>
+        </w:rPr>
+        <w:t>ANEXOS</w:t>
+      </w:r>
+      <w:bookmarkEnd w:id="bm_anexos"/>
     </w:p>
     <w:p>
       <w:pPr>
@@ -7943,19 +7904,19 @@
       </w:pPr>
     </w:p>
     <w:p>
-      <w:bookmarkStart w:id="bm_anexoC" w:name="bm_anexoC"/>
+      <w:bookmarkStart w:id="bm_anexoA" w:name="bm_anexoA"/>
       <w:pPr>
         <w:spacing w:before="0" w:after="480"/>
         <w:jc w:val="center"/>
       </w:pPr>
-      <w:bookmarkEnd w:id="bm_anexoC"/>
+      <w:bookmarkEnd w:id="bm_anexoA"/>
       <w:r>
         <w:rPr>
           <w:rFonts w:ascii="Times New Roman" w:hAnsi="Times New Roman"/>
           <w:b/>
           <w:sz w:val="24"/>
         </w:rPr>
-        <w:t>ANEXO C</w:t>
+        <w:t>ANEXO A</w:t>
       </w:r>
     </w:p>
     <w:p>
@@ -7969,7 +7930,7 @@
           <w:b/>
           <w:sz w:val="24"/>
         </w:rPr>
-        <w:t>[Aquí va la descripción del Anexo C]</w:t>
+        <w:t>[Aquí va la descripción del Anexo A]</w:t>
       </w:r>
     </w:p>
     <w:p>
@@ -7985,8 +7946,118 @@
         <w:t>(Contenido elaborado por el estudiante)</w:t>
       </w:r>
     </w:p>
+    <w:p>
+      <w:pPr>
+        <w:sectPr>
+          <w:footerReference w:type="default" r:id="rId44"/>
+          <w:pgSz w:w="12240" w:h="15840"/>
+          <w:pgMar w:top="2835" w:right="1701" w:bottom="1701" w:left="2268" w:header="720" w:footer="720" w:gutter="0"/>
+          <w:cols w:space="720"/>
+          <w:titlePg/>
+          <w:docGrid w:linePitch="360"/>
+        </w:sectPr>
+      </w:pPr>
+    </w:p>
+    <w:p>
+      <w:bookmarkStart w:id="bm_anexoB" w:name="bm_anexoB"/>
+      <w:pPr>
+        <w:spacing w:before="0" w:after="480"/>
+        <w:jc w:val="center"/>
+      </w:pPr>
+      <w:bookmarkEnd w:id="bm_anexoB"/>
+      <w:r>
+        <w:rPr>
+          <w:rFonts w:ascii="Times New Roman" w:hAnsi="Times New Roman"/>
+          <w:b/>
+          <w:sz w:val="24"/>
+        </w:rPr>
+        <w:t>ANEXO B</w:t>
+      </w:r>
+    </w:p>
+    <w:p>
+      <w:pPr>
+        <w:spacing w:before="240" w:after="480"/>
+        <w:jc w:val="center"/>
+      </w:pPr>
+      <w:r>
+        <w:rPr>
+          <w:rFonts w:ascii="Times New Roman" w:hAnsi="Times New Roman"/>
+          <w:b/>
+          <w:sz w:val="24"/>
+        </w:rPr>
+        <w:t>[Aquí va la descripción del Anexo B]</w:t>
+      </w:r>
+    </w:p>
+    <w:p>
+      <w:pPr>
+        <w:jc w:val="center"/>
+      </w:pPr>
+      <w:r>
+        <w:rPr>
+          <w:rFonts w:ascii="Times New Roman" w:hAnsi="Times New Roman"/>
+          <w:i/>
+          <w:sz w:val="20"/>
+        </w:rPr>
+        <w:t>(Contenido elaborado por el estudiante)</w:t>
+      </w:r>
+    </w:p>
+    <w:p>
+      <w:pPr>
+        <w:sectPr>
+          <w:footerReference w:type="default" r:id="rId45"/>
+          <w:pgSz w:w="12240" w:h="15840"/>
+          <w:pgMar w:top="2835" w:right="1701" w:bottom="1701" w:left="2268" w:header="720" w:footer="720" w:gutter="0"/>
+          <w:cols w:space="720"/>
+          <w:titlePg/>
+          <w:docGrid w:linePitch="360"/>
+        </w:sectPr>
+      </w:pPr>
+    </w:p>
+    <w:p>
+      <w:bookmarkStart w:id="bm_anexoC" w:name="bm_anexoC"/>
+      <w:pPr>
+        <w:spacing w:before="0" w:after="480"/>
+        <w:jc w:val="center"/>
+      </w:pPr>
+      <w:bookmarkEnd w:id="bm_anexoC"/>
+      <w:r>
+        <w:rPr>
+          <w:rFonts w:ascii="Times New Roman" w:hAnsi="Times New Roman"/>
+          <w:b/>
+          <w:sz w:val="24"/>
+        </w:rPr>
+        <w:t>ANEXO C</w:t>
+      </w:r>
+    </w:p>
+    <w:p>
+      <w:pPr>
+        <w:spacing w:before="240" w:after="480"/>
+        <w:jc w:val="center"/>
+      </w:pPr>
+      <w:r>
+        <w:rPr>
+          <w:rFonts w:ascii="Times New Roman" w:hAnsi="Times New Roman"/>
+          <w:b/>
+          <w:sz w:val="24"/>
+        </w:rPr>
+        <w:t>[Aquí va la descripción del Anexo C]</w:t>
+      </w:r>
+    </w:p>
+    <w:p>
+      <w:pPr>
+        <w:jc w:val="center"/>
+      </w:pPr>
+      <w:r>
+        <w:rPr>
+          <w:rFonts w:ascii="Times New Roman" w:hAnsi="Times New Roman"/>
+          <w:i/>
+          <w:sz w:val="20"/>
+        </w:rPr>
+        <w:t>(Contenido elaborado por el estudiante)</w:t>
+      </w:r>
+    </w:p>
     <w:sectPr>
-      <w:footerReference w:type="default" r:id="rId44"/>
+      <w:footerReference w:type="default" r:id="rId46"/>
       <w:pgSz w:w="12240" w:h="15840"/>
       <w:pgMar w:top="2835" w:right="1701" w:bottom="1701" w:left="2268" w:header="720" w:footer="720" w:gutter="0"/>
       <w:cols w:space="720"/>
@@ -8167,7 +8238,7 @@
         <w:sz w:val="24"/>
       </w:rPr>
       <w:fldChar w:fldCharType="begin"/>
-      <w:instrText xml:space="preserve"> PAGE </w:instrText>
+      <w:instrText xml:space="preserve"> PAGE \* roman </w:instrText>
       <w:fldChar w:fldCharType="separate"/>
       <w:fldChar w:fldCharType="end"/>
     </w:r>
@@ -8188,7 +8259,7 @@
         <w:sz w:val="24"/>
       </w:rPr>
       <w:fldChar w:fldCharType="begin"/>
-      <w:instrText xml:space="preserve"> PAGE </w:instrText>
+      <w:instrText xml:space="preserve"> PAGE \* roman </w:instrText>
       <w:fldChar w:fldCharType="separate"/>
       <w:fldChar w:fldCharType="end"/>
     </w:r>
@@ -8501,6 +8572,48 @@
 </file>
 
 <file path=word/footer32.xml><?xml version="1.0" encoding="utf-8"?>
+<w:ftr xmlns:m="http://schemas.openxmlformats.org/officeDocument/2006/math" xmlns:mc="http://schemas.openxmlformats.org/markup-compatibility/2006" xmlns:mo="http://schemas.microsoft.com/office/mac/office/2008/main" xmlns:mv="urn:schemas-microsoft-com:mac:vml" xmlns:o="urn:schemas-microsoft-com:office:office" xmlns:r="http://schemas.openxmlformats.org/officeDocument/2006/relationships" xmlns:v="urn:schemas-microsoft-com:vml" xmlns:w10="urn:schemas-microsoft-com:office:word" xmlns:w14="http://schemas.microsoft.com/office/word/2010/wordml" xmlns:w="http://schemas.openxmlformats.org/wordprocessingml/2006/main" xmlns:wne="http://schemas.microsoft.com/office/word/2006/wordml" xmlns:wp14="http://schemas.microsoft.com/office/word/2010/wordprocessingDrawing" xmlns:wp="http://schemas.openxmlformats.org/drawingml/2006/wordprocessingDrawing" xmlns:wpc="http://schemas.microsoft.com/office/word/2010/wordprocessingCanvas" xmlns:wpg="http://schemas.microsoft.com/office/word/2010/wordprocessingGroup" xmlns:wpi="http://schemas.microsoft.com/office/word/2010/wordprocessingInk" xmlns:wps="http://schemas.microsoft.com/office/word/2010/wordprocessingShape" mc:Ignorable="w14 wp14">
+  <w:p>
+    <w:pPr>
+      <w:pStyle w:val="Footer"/>
+      <w:jc w:val="center"/>
+    </w:pPr>
+    <w:r>
+      <w:rPr>
+        <w:rFonts w:ascii="Times New Roman" w:hAnsi="Times New Roman"/>
+        <w:sz w:val="24"/>
+      </w:rPr>
+      <w:fldChar w:fldCharType="begin"/>
+      <w:instrText xml:space="preserve"> PAGE </w:instrText>
+      <w:fldChar w:fldCharType="separate"/>
+      <w:fldChar w:fldCharType="end"/>
+    </w:r>
+  </w:p>
+</w:ftr>
+</file>
+
+<file path=word/footer33.xml><?xml version="1.0" encoding="utf-8"?>
+<w:ftr xmlns:m="http://schemas.openxmlformats.org/officeDocument/2006/math" xmlns:mc="http://schemas.openxmlformats.org/markup-compatibility/2006" xmlns:mo="http://schemas.microsoft.com/office/mac/office/2008/main" xmlns:mv="urn:schemas-microsoft-com:mac:vml" xmlns:o="urn:schemas-microsoft-com:office:office" xmlns:r="http://schemas.openxmlformats.org/officeDocument/2006/relationships" xmlns:v="urn:schemas-microsoft-com:vml" xmlns:w10="urn:schemas-microsoft-com:office:word" xmlns:w14="http://schemas.microsoft.com/office/word/2010/wordml" xmlns:w="http://schemas.openxmlformats.org/wordprocessingml/2006/main" xmlns:wne="http://schemas.microsoft.com/office/word/2006/wordml" xmlns:wp14="http://schemas.microsoft.com/office/word/2010/wordprocessingDrawing" xmlns:wp="http://schemas.openxmlformats.org/drawingml/2006/wordprocessingDrawing" xmlns:wpc="http://schemas.microsoft.com/office/word/2010/wordprocessingCanvas" xmlns:wpg="http://schemas.microsoft.com/office/word/2010/wordprocessingGroup" xmlns:wpi="http://schemas.microsoft.com/office/word/2010/wordprocessingInk" xmlns:wps="http://schemas.microsoft.com/office/word/2010/wordprocessingShape" mc:Ignorable="w14 wp14">
+  <w:p>
+    <w:pPr>
+      <w:pStyle w:val="Footer"/>
+      <w:jc w:val="center"/>
+    </w:pPr>
+    <w:r>
+      <w:rPr>
+        <w:rFonts w:ascii="Times New Roman" w:hAnsi="Times New Roman"/>
+        <w:sz w:val="24"/>
+      </w:rPr>
+      <w:fldChar w:fldCharType="begin"/>
+      <w:instrText xml:space="preserve"> PAGE </w:instrText>
+      <w:fldChar w:fldCharType="separate"/>
+      <w:fldChar w:fldCharType="end"/>
+    </w:r>
+  </w:p>
+</w:ftr>
+</file>
+
+<file path=word/footer34.xml><?xml version="1.0" encoding="utf-8"?>
 <w:ftr xmlns:m="http://schemas.openxmlformats.org/officeDocument/2006/math" xmlns:mc="http://schemas.openxmlformats.org/markup-compatibility/2006" xmlns:mo="http://schemas.microsoft.com/office/mac/office/2008/main" xmlns:mv="urn:schemas-microsoft-com:mac:vml" xmlns:o="urn:schemas-microsoft-com:office:office" xmlns:r="http://schemas.openxmlformats.org/officeDocument/2006/relationships" xmlns:v="urn:schemas-microsoft-com:vml" xmlns:w10="urn:schemas-microsoft-com:office:word" xmlns:w14="http://schemas.microsoft.com/office/word/2010/wordml" xmlns:w="http://schemas.openxmlformats.org/wordprocessingml/2006/main" xmlns:wne="http://schemas.microsoft.com/office/word/2006/wordml" xmlns:wp14="http://schemas.microsoft.com/office/word/2010/wordprocessingDrawing" xmlns:wp="http://schemas.openxmlformats.org/drawingml/2006/wordprocessingDrawing" xmlns:wpc="http://schemas.microsoft.com/office/word/2010/wordprocessingCanvas" xmlns:wpg="http://schemas.microsoft.com/office/word/2010/wordprocessingGroup" xmlns:wpi="http://schemas.microsoft.com/office/word/2010/wordprocessingInk" xmlns:wps="http://schemas.microsoft.com/office/word/2010/wordprocessingShape" mc:Ignorable="w14 wp14">
   <w:p>
     <w:pPr>

</xml_diff>

<commit_message>
Subtitulos de Capitulo I sin numeracion (nivel2 en vez de nivel3) y Mision/Vision sin cursiva
</commit_message>
<xml_diff>
--- a/amaal/reportes/Informe_Pasantia_IUTECP.docx
+++ b/amaal/reportes/Informe_Pasantia_IUTECP.docx
@@ -2257,18 +2257,16 @@
     </w:p>
     <w:p>
       <w:pPr>
-        <w:spacing w:before="240" w:after="240" w:line="360" w:lineRule="auto"/>
-        <w:ind w:firstLine="709"/>
+        <w:spacing w:before="480" w:after="480" w:line="360" w:lineRule="auto"/>
         <w:jc w:val="left"/>
       </w:pPr>
       <w:r>
         <w:rPr>
           <w:rFonts w:ascii="Times New Roman" w:hAnsi="Times New Roman"/>
           <w:b/>
-          <w:i/>
           <w:sz w:val="24"/>
         </w:rPr>
-        <w:t>1.1.1 Razón social</w:t>
+        <w:t>Razón social</w:t>
       </w:r>
     </w:p>
     <w:p>
@@ -2289,18 +2287,16 @@
     <w:p>
       <w:bookmarkStart w:id="bm_cap1_resena" w:name="bm_cap1_resena"/>
       <w:pPr>
-        <w:spacing w:before="240" w:after="240" w:line="360" w:lineRule="auto"/>
-        <w:ind w:firstLine="709"/>
+        <w:spacing w:before="480" w:after="480" w:line="360" w:lineRule="auto"/>
         <w:jc w:val="left"/>
       </w:pPr>
       <w:r>
         <w:rPr>
           <w:rFonts w:ascii="Times New Roman" w:hAnsi="Times New Roman"/>
           <w:b/>
-          <w:i/>
           <w:sz w:val="24"/>
         </w:rPr>
-        <w:t>1.1.2 Reseña histórica</w:t>
+        <w:t>Reseña histórica</w:t>
       </w:r>
       <w:bookmarkEnd w:id="bm_cap1_resena"/>
     </w:p>
@@ -2352,18 +2348,16 @@
     <w:p>
       <w:bookmarkStart w:id="bm_cap1_mision" w:name="bm_cap1_mision"/>
       <w:pPr>
-        <w:spacing w:before="240" w:after="240" w:line="360" w:lineRule="auto"/>
-        <w:ind w:firstLine="709"/>
+        <w:spacing w:before="480" w:after="480" w:line="360" w:lineRule="auto"/>
         <w:jc w:val="left"/>
       </w:pPr>
       <w:r>
         <w:rPr>
           <w:rFonts w:ascii="Times New Roman" w:hAnsi="Times New Roman"/>
           <w:b/>
-          <w:i/>
           <w:sz w:val="24"/>
         </w:rPr>
-        <w:t>1.1.3 Misión</w:t>
+        <w:t>Misión</w:t>
       </w:r>
       <w:bookmarkEnd w:id="bm_cap1_mision"/>
     </w:p>
@@ -2376,7 +2370,7 @@
       <w:r>
         <w:rPr>
           <w:rFonts w:ascii="Times New Roman" w:hAnsi="Times New Roman"/>
-          <w:i/>
+          <w:i w:val="0"/>
           <w:sz w:val="24"/>
         </w:rPr>
         <w:t>Brindar soluciones con altos estándares de confiabilidad en servicios de radiocomunicación y datos al segmento de mercado PyME, así como la entrega de servicios de calidad en el sector petrolero, asociados a los esfuerzos en ingeniería (integración multidisciplinaria), planificación y ejecución de proyectos de telecomunicaciones y automatización.</w:t>
@@ -2385,18 +2379,16 @@
     <w:p>
       <w:bookmarkStart w:id="bm_cap1_vision" w:name="bm_cap1_vision"/>
       <w:pPr>
-        <w:spacing w:before="240" w:after="240" w:line="360" w:lineRule="auto"/>
-        <w:ind w:firstLine="709"/>
+        <w:spacing w:before="480" w:after="480" w:line="360" w:lineRule="auto"/>
         <w:jc w:val="left"/>
       </w:pPr>
       <w:r>
         <w:rPr>
           <w:rFonts w:ascii="Times New Roman" w:hAnsi="Times New Roman"/>
           <w:b/>
-          <w:i/>
           <w:sz w:val="24"/>
         </w:rPr>
-        <w:t>1.1.4 Visión</w:t>
+        <w:t>Visión</w:t>
       </w:r>
       <w:bookmarkEnd w:id="bm_cap1_vision"/>
     </w:p>
@@ -2409,7 +2401,7 @@
       <w:r>
         <w:rPr>
           <w:rFonts w:ascii="Times New Roman" w:hAnsi="Times New Roman"/>
-          <w:i/>
+          <w:i w:val="0"/>
           <w:sz w:val="24"/>
         </w:rPr>
         <w:t>Ser reconocidos por los clientes como un proveedor de servicios altamente confiable y con altos estándares técnicos y de ingeniería, con capacidad de brindar soluciones multidisciplinarias en el área de automatización y telecomunicaciones, fortaleciendo continuamente el capital humano mediante capacitación y mejora progresiva de las instalaciones, con el fin de obtener la innovación, competitividad y liderazgo necesarios para sobresalir en el mercado de nuevas tecnologías.</w:t>
@@ -2418,18 +2410,16 @@
     <w:p>
       <w:bookmarkStart w:id="bm_cap1_valores" w:name="bm_cap1_valores"/>
       <w:pPr>
-        <w:spacing w:before="240" w:after="240" w:line="360" w:lineRule="auto"/>
-        <w:ind w:firstLine="709"/>
+        <w:spacing w:before="480" w:after="480" w:line="360" w:lineRule="auto"/>
         <w:jc w:val="left"/>
       </w:pPr>
       <w:r>
         <w:rPr>
           <w:rFonts w:ascii="Times New Roman" w:hAnsi="Times New Roman"/>
           <w:b/>
-          <w:i/>
           <w:sz w:val="24"/>
         </w:rPr>
-        <w:t>1.1.5 Valores</w:t>
+        <w:t>Valores</w:t>
       </w:r>
       <w:bookmarkEnd w:id="bm_cap1_valores"/>
     </w:p>
@@ -2567,18 +2557,16 @@
     <w:p>
       <w:bookmarkStart w:id="bm_cap1_obj" w:name="bm_cap1_obj"/>
       <w:pPr>
-        <w:spacing w:before="240" w:after="240" w:line="360" w:lineRule="auto"/>
-        <w:ind w:firstLine="709"/>
+        <w:spacing w:before="480" w:after="480" w:line="360" w:lineRule="auto"/>
         <w:jc w:val="left"/>
       </w:pPr>
       <w:r>
         <w:rPr>
           <w:rFonts w:ascii="Times New Roman" w:hAnsi="Times New Roman"/>
           <w:b/>
-          <w:i/>
           <w:sz w:val="24"/>
         </w:rPr>
-        <w:t>1.1.6 Objetivos Organizacionales</w:t>
+        <w:t>Objetivos Organizacionales</w:t>
       </w:r>
       <w:bookmarkEnd w:id="bm_cap1_obj"/>
     </w:p>
@@ -2663,18 +2651,16 @@
     <w:p>
       <w:bookmarkStart w:id="bm_cap1_ubic" w:name="bm_cap1_ubic"/>
       <w:pPr>
-        <w:spacing w:before="240" w:after="240" w:line="360" w:lineRule="auto"/>
-        <w:ind w:firstLine="709"/>
+        <w:spacing w:before="480" w:after="480" w:line="360" w:lineRule="auto"/>
         <w:jc w:val="left"/>
       </w:pPr>
       <w:r>
         <w:rPr>
           <w:rFonts w:ascii="Times New Roman" w:hAnsi="Times New Roman"/>
           <w:b/>
-          <w:i/>
           <w:sz w:val="24"/>
         </w:rPr>
-        <w:t>1.1.7 Ubicación geográfica</w:t>
+        <w:t>Ubicación geográfica</w:t>
       </w:r>
       <w:bookmarkEnd w:id="bm_cap1_ubic"/>
     </w:p>
@@ -2760,18 +2746,16 @@
     <w:p>
       <w:bookmarkStart w:id="bm_cap1_pobla" w:name="bm_cap1_pobla"/>
       <w:pPr>
-        <w:spacing w:before="240" w:after="240" w:line="360" w:lineRule="auto"/>
-        <w:ind w:firstLine="709"/>
+        <w:spacing w:before="480" w:after="480" w:line="360" w:lineRule="auto"/>
         <w:jc w:val="left"/>
       </w:pPr>
       <w:r>
         <w:rPr>
           <w:rFonts w:ascii="Times New Roman" w:hAnsi="Times New Roman"/>
           <w:b/>
-          <w:i/>
           <w:sz w:val="24"/>
         </w:rPr>
-        <w:t>1.1.8 Población de los trabajadores de la empresa</w:t>
+        <w:t>Población de los trabajadores de la empresa</w:t>
       </w:r>
       <w:bookmarkEnd w:id="bm_cap1_pobla"/>
     </w:p>
@@ -2793,18 +2777,16 @@
     <w:p>
       <w:bookmarkStart w:id="bm_cap1_estruct" w:name="bm_cap1_estruct"/>
       <w:pPr>
-        <w:spacing w:before="240" w:after="240" w:line="360" w:lineRule="auto"/>
-        <w:ind w:firstLine="709"/>
+        <w:spacing w:before="480" w:after="480" w:line="360" w:lineRule="auto"/>
         <w:jc w:val="left"/>
       </w:pPr>
       <w:r>
         <w:rPr>
           <w:rFonts w:ascii="Times New Roman" w:hAnsi="Times New Roman"/>
           <w:b/>
-          <w:i/>
           <w:sz w:val="24"/>
         </w:rPr>
-        <w:t>1.1.9 Estructura Organizativa</w:t>
+        <w:t>Estructura Organizativa</w:t>
       </w:r>
       <w:bookmarkEnd w:id="bm_cap1_estruct"/>
     </w:p>

</xml_diff>

<commit_message>
Reemplazar MARGEN_SUP_CAP por space_before en titulos (3cm en todas las secciones)
</commit_message>
<xml_diff>
--- a/amaal/reportes/Informe_Pasantia_IUTECP.docx
+++ b/amaal/reportes/Informe_Pasantia_IUTECP.docx
@@ -391,7 +391,7 @@
     <w:p>
       <w:bookmarkStart w:id="bm_agradecimientos" w:name="bm_agradecimientos"/>
       <w:pPr>
-        <w:spacing w:after="480"/>
+        <w:spacing w:before="1140" w:after="480"/>
         <w:jc w:val="center"/>
       </w:pPr>
       <w:r>
@@ -409,7 +409,7 @@
         <w:sectPr>
           <w:footerReference w:type="default" r:id="rId15"/>
           <w:pgSz w:w="12240" w:h="15840"/>
-          <w:pgMar w:top="2835" w:right="1701" w:bottom="1701" w:left="2268" w:header="720" w:footer="720" w:gutter="0"/>
+          <w:pgMar w:top="1701" w:right="1701" w:bottom="1701" w:left="2268" w:header="720" w:footer="720" w:gutter="0"/>
           <w:cols w:space="720"/>
           <w:titlePg/>
           <w:docGrid w:linePitch="360"/>
@@ -447,7 +447,7 @@
     <w:p>
       <w:bookmarkStart w:id="bm_dedicatoria" w:name="bm_dedicatoria"/>
       <w:pPr>
-        <w:spacing w:after="480"/>
+        <w:spacing w:before="1140" w:after="480"/>
         <w:jc w:val="center"/>
       </w:pPr>
       <w:r>
@@ -465,7 +465,7 @@
         <w:sectPr>
           <w:footerReference w:type="default" r:id="rId17"/>
           <w:pgSz w:w="12240" w:h="15840"/>
-          <w:pgMar w:top="2835" w:right="1701" w:bottom="1701" w:left="2268" w:header="720" w:footer="720" w:gutter="0"/>
+          <w:pgMar w:top="1701" w:right="1701" w:bottom="1701" w:left="2268" w:header="720" w:footer="720" w:gutter="0"/>
           <w:cols w:space="720"/>
           <w:titlePg/>
           <w:docGrid w:linePitch="360"/>
@@ -502,7 +502,7 @@
     </w:p>
     <w:p>
       <w:pPr>
-        <w:spacing w:after="480"/>
+        <w:spacing w:before="1140" w:after="480"/>
         <w:jc w:val="center"/>
       </w:pPr>
       <w:r>
@@ -519,7 +519,7 @@
         <w:sectPr>
           <w:footerReference w:type="default" r:id="rId19"/>
           <w:pgSz w:w="12240" w:h="15840"/>
-          <w:pgMar w:top="2835" w:right="1701" w:bottom="1701" w:left="2268" w:header="720" w:footer="720" w:gutter="0"/>
+          <w:pgMar w:top="1701" w:right="1701" w:bottom="1701" w:left="2268" w:header="720" w:footer="720" w:gutter="0"/>
           <w:cols w:space="720"/>
           <w:titlePg/>
           <w:docGrid w:linePitch="360"/>
@@ -1557,7 +1557,7 @@
     <w:p>
       <w:bookmarkStart w:id="bm_lista_cuadros" w:name="bm_lista_cuadros"/>
       <w:pPr>
-        <w:spacing w:after="480"/>
+        <w:spacing w:before="1140" w:after="480"/>
         <w:jc w:val="center"/>
       </w:pPr>
       <w:r>
@@ -1575,7 +1575,7 @@
         <w:sectPr>
           <w:footerReference w:type="default" r:id="rId21"/>
           <w:pgSz w:w="12240" w:h="15840"/>
-          <w:pgMar w:top="2835" w:right="1701" w:bottom="1701" w:left="2268" w:header="720" w:footer="720" w:gutter="0"/>
+          <w:pgMar w:top="1701" w:right="1701" w:bottom="1701" w:left="2268" w:header="720" w:footer="720" w:gutter="0"/>
           <w:cols w:space="720"/>
           <w:titlePg/>
           <w:docGrid w:linePitch="360"/>
@@ -1689,7 +1689,7 @@
     <w:p>
       <w:bookmarkStart w:id="bm_lista_figuras" w:name="bm_lista_figuras"/>
       <w:pPr>
-        <w:spacing w:after="480"/>
+        <w:spacing w:before="1140" w:after="480"/>
         <w:jc w:val="center"/>
       </w:pPr>
       <w:r>
@@ -1707,7 +1707,7 @@
         <w:sectPr>
           <w:footerReference w:type="default" r:id="rId23"/>
           <w:pgSz w:w="12240" w:h="15840"/>
-          <w:pgMar w:top="2835" w:right="1701" w:bottom="1701" w:left="2268" w:header="720" w:footer="720" w:gutter="0"/>
+          <w:pgMar w:top="1701" w:right="1701" w:bottom="1701" w:left="2268" w:header="720" w:footer="720" w:gutter="0"/>
           <w:cols w:space="720"/>
           <w:titlePg/>
           <w:docGrid w:linePitch="360"/>
@@ -1730,7 +1730,7 @@
     <w:p>
       <w:bookmarkStart w:id="bm_lista_graficos" w:name="bm_lista_graficos"/>
       <w:pPr>
-        <w:spacing w:after="480"/>
+        <w:spacing w:before="1140" w:after="480"/>
         <w:jc w:val="center"/>
       </w:pPr>
       <w:r>
@@ -1748,7 +1748,7 @@
         <w:sectPr>
           <w:footerReference w:type="default" r:id="rId25"/>
           <w:pgSz w:w="12240" w:h="15840"/>
-          <w:pgMar w:top="2835" w:right="1701" w:bottom="1701" w:left="2268" w:header="720" w:footer="720" w:gutter="0"/>
+          <w:pgMar w:top="1701" w:right="1701" w:bottom="1701" w:left="2268" w:header="720" w:footer="720" w:gutter="0"/>
           <w:cols w:space="720"/>
           <w:titlePg/>
           <w:docGrid w:linePitch="360"/>
@@ -1894,7 +1894,7 @@
     <w:p>
       <w:bookmarkStart w:id="bm_lista_anexos" w:name="bm_lista_anexos"/>
       <w:pPr>
-        <w:spacing w:after="480"/>
+        <w:spacing w:before="1140" w:after="480"/>
         <w:jc w:val="center"/>
       </w:pPr>
       <w:r>
@@ -1912,7 +1912,7 @@
         <w:sectPr>
           <w:footerReference w:type="default" r:id="rId27"/>
           <w:pgSz w:w="12240" w:h="15840"/>
-          <w:pgMar w:top="2835" w:right="1701" w:bottom="1701" w:left="2268" w:header="720" w:footer="720" w:gutter="0"/>
+          <w:pgMar w:top="1701" w:right="1701" w:bottom="1701" w:left="2268" w:header="720" w:footer="720" w:gutter="0"/>
           <w:cols w:space="720"/>
           <w:titlePg/>
           <w:docGrid w:linePitch="360"/>
@@ -2058,7 +2058,7 @@
     <w:p>
       <w:bookmarkStart w:id="bm_resumen" w:name="bm_resumen"/>
       <w:pPr>
-        <w:spacing w:after="480"/>
+        <w:spacing w:before="1140" w:after="480"/>
         <w:jc w:val="center"/>
       </w:pPr>
       <w:r>
@@ -2076,7 +2076,7 @@
         <w:sectPr>
           <w:footerReference w:type="default" r:id="rId29"/>
           <w:pgSz w:w="12240" w:h="15840"/>
-          <w:pgMar w:top="2835" w:right="1701" w:bottom="1701" w:left="2268" w:header="720" w:footer="720" w:gutter="0"/>
+          <w:pgMar w:top="1701" w:right="1701" w:bottom="1701" w:left="2268" w:header="720" w:footer="720" w:gutter="0"/>
           <w:cols w:space="720"/>
           <w:titlePg/>
           <w:docGrid w:linePitch="360"/>
@@ -2129,7 +2129,7 @@
     <w:p>
       <w:bookmarkStart w:id="bm_introduccion" w:name="bm_introduccion"/>
       <w:pPr>
-        <w:spacing w:after="480"/>
+        <w:spacing w:before="1140" w:after="480"/>
         <w:jc w:val="center"/>
       </w:pPr>
       <w:r>
@@ -2147,7 +2147,7 @@
         <w:sectPr>
           <w:footerReference w:type="default" r:id="rId31"/>
           <w:pgSz w:w="12240" w:h="15840"/>
-          <w:pgMar w:top="2835" w:right="1701" w:bottom="1701" w:left="2268" w:header="720" w:footer="720" w:gutter="0"/>
+          <w:pgMar w:top="1701" w:right="1701" w:bottom="1701" w:left="2268" w:header="720" w:footer="720" w:gutter="0"/>
           <w:cols w:space="720"/>
           <w:titlePg/>
           <w:docGrid w:linePitch="360"/>
@@ -2184,7 +2184,7 @@
     </w:p>
     <w:p>
       <w:pPr>
-        <w:spacing w:after="480"/>
+        <w:spacing w:before="1140" w:after="480"/>
         <w:jc w:val="center"/>
       </w:pPr>
       <w:r>
@@ -2217,7 +2217,7 @@
         <w:sectPr>
           <w:footerReference w:type="default" r:id="rId33"/>
           <w:pgSz w:w="12240" w:h="15840"/>
-          <w:pgMar w:top="2835" w:right="1701" w:bottom="1701" w:left="2268" w:header="720" w:footer="720" w:gutter="0"/>
+          <w:pgMar w:top="1701" w:right="1701" w:bottom="1701" w:left="2268" w:header="720" w:footer="720" w:gutter="0"/>
           <w:cols w:space="720"/>
           <w:titlePg/>
           <w:docGrid w:linePitch="360"/>
@@ -2236,7 +2236,7 @@
           <w:b/>
           <w:sz w:val="24"/>
         </w:rPr>
-        <w:t>IDENTIFICACIÓN DE LA EMPRESA</w:t>
+        <w:t>Identificación de la empresa</w:t>
       </w:r>
       <w:bookmarkEnd w:id="bm_cap1_ident"/>
     </w:p>
@@ -2948,7 +2948,7 @@
     </w:p>
     <w:p>
       <w:pPr>
-        <w:spacing w:after="480"/>
+        <w:spacing w:before="1140" w:after="480"/>
         <w:jc w:val="center"/>
       </w:pPr>
       <w:r>
@@ -2981,7 +2981,7 @@
         <w:sectPr>
           <w:footerReference w:type="default" r:id="rId35"/>
           <w:pgSz w:w="12240" w:h="15840"/>
-          <w:pgMar w:top="2835" w:right="1701" w:bottom="1701" w:left="2268" w:header="720" w:footer="720" w:gutter="0"/>
+          <w:pgMar w:top="1701" w:right="1701" w:bottom="1701" w:left="2268" w:header="720" w:footer="720" w:gutter="0"/>
           <w:cols w:space="720"/>
           <w:titlePg/>
           <w:docGrid w:linePitch="360"/>
@@ -6285,7 +6285,7 @@
     </w:p>
     <w:p>
       <w:pPr>
-        <w:spacing w:after="480"/>
+        <w:spacing w:before="1140" w:after="480"/>
         <w:jc w:val="center"/>
       </w:pPr>
       <w:r>
@@ -6318,7 +6318,7 @@
         <w:sectPr>
           <w:footerReference w:type="default" r:id="rId37"/>
           <w:pgSz w:w="12240" w:h="15840"/>
-          <w:pgMar w:top="2835" w:right="1701" w:bottom="1701" w:left="2268" w:header="720" w:footer="720" w:gutter="0"/>
+          <w:pgMar w:top="1701" w:right="1701" w:bottom="1701" w:left="2268" w:header="720" w:footer="720" w:gutter="0"/>
           <w:cols w:space="720"/>
           <w:titlePg/>
           <w:docGrid w:linePitch="360"/>
@@ -6642,7 +6642,7 @@
     </w:p>
     <w:p>
       <w:pPr>
-        <w:spacing w:after="480"/>
+        <w:spacing w:before="1140" w:after="480"/>
         <w:jc w:val="center"/>
       </w:pPr>
       <w:r>
@@ -6675,7 +6675,7 @@
         <w:sectPr>
           <w:footerReference w:type="default" r:id="rId39"/>
           <w:pgSz w:w="12240" w:h="15840"/>
-          <w:pgMar w:top="2835" w:right="1701" w:bottom="1701" w:left="2268" w:header="720" w:footer="720" w:gutter="0"/>
+          <w:pgMar w:top="1701" w:right="1701" w:bottom="1701" w:left="2268" w:header="720" w:footer="720" w:gutter="0"/>
           <w:cols w:space="720"/>
           <w:titlePg/>
           <w:docGrid w:linePitch="360"/>
@@ -7448,7 +7448,7 @@
     </w:p>
     <w:p>
       <w:pPr>
-        <w:spacing w:after="480"/>
+        <w:spacing w:before="1140" w:after="480"/>
         <w:jc w:val="center"/>
       </w:pPr>
       <w:r>
@@ -7481,7 +7481,7 @@
         <w:sectPr>
           <w:footerReference w:type="default" r:id="rId41"/>
           <w:pgSz w:w="12240" w:h="15840"/>
-          <w:pgMar w:top="2835" w:right="1701" w:bottom="1701" w:left="2268" w:header="720" w:footer="720" w:gutter="0"/>
+          <w:pgMar w:top="1701" w:right="1701" w:bottom="1701" w:left="2268" w:header="720" w:footer="720" w:gutter="0"/>
           <w:cols w:space="720"/>
           <w:titlePg/>
           <w:docGrid w:linePitch="360"/>
@@ -7704,7 +7704,7 @@
     <w:p>
       <w:bookmarkStart w:id="bm_referencias" w:name="bm_referencias"/>
       <w:pPr>
-        <w:spacing w:after="480"/>
+        <w:spacing w:before="1140" w:after="480"/>
         <w:jc w:val="center"/>
       </w:pPr>
       <w:r>
@@ -7722,7 +7722,7 @@
         <w:sectPr>
           <w:footerReference w:type="default" r:id="rId43"/>
           <w:pgSz w:w="12240" w:h="15840"/>
-          <w:pgMar w:top="2835" w:right="1701" w:bottom="1701" w:left="2268" w:header="720" w:footer="720" w:gutter="0"/>
+          <w:pgMar w:top="1701" w:right="1701" w:bottom="1701" w:left="2268" w:header="720" w:footer="720" w:gutter="0"/>
           <w:cols w:space="720"/>
           <w:titlePg/>
           <w:docGrid w:linePitch="360"/>
@@ -7862,7 +7862,7 @@
     <w:p>
       <w:bookmarkStart w:id="bm_anexos" w:name="bm_anexos"/>
       <w:pPr>
-        <w:spacing w:before="3600"/>
+        <w:spacing w:before="4740"/>
         <w:jc w:val="center"/>
       </w:pPr>
       <w:r>
@@ -7880,7 +7880,7 @@
         <w:sectPr>
           <w:footerReference w:type="default" r:id="rId45"/>
           <w:pgSz w:w="12240" w:h="15840"/>
-          <w:pgMar w:top="2835" w:right="1701" w:bottom="1701" w:left="2268" w:header="720" w:footer="720" w:gutter="0"/>
+          <w:pgMar w:top="1701" w:right="1701" w:bottom="1701" w:left="2268" w:header="720" w:footer="720" w:gutter="0"/>
           <w:cols w:space="720"/>
           <w:titlePg/>
           <w:docGrid w:linePitch="360"/>
@@ -7935,7 +7935,7 @@
         <w:sectPr>
           <w:footerReference w:type="default" r:id="rId46"/>
           <w:pgSz w:w="12240" w:h="15840"/>
-          <w:pgMar w:top="2835" w:right="1701" w:bottom="1701" w:left="2268" w:header="720" w:footer="720" w:gutter="0"/>
+          <w:pgMar w:top="1701" w:right="1701" w:bottom="1701" w:left="2268" w:header="720" w:footer="720" w:gutter="0"/>
           <w:cols w:space="720"/>
           <w:titlePg/>
           <w:docGrid w:linePitch="360"/>
@@ -7990,7 +7990,7 @@
         <w:sectPr>
           <w:footerReference w:type="default" r:id="rId47"/>
           <w:pgSz w:w="12240" w:h="15840"/>
-          <w:pgMar w:top="2835" w:right="1701" w:bottom="1701" w:left="2268" w:header="720" w:footer="720" w:gutter="0"/>
+          <w:pgMar w:top="1701" w:right="1701" w:bottom="1701" w:left="2268" w:header="720" w:footer="720" w:gutter="0"/>
           <w:cols w:space="720"/>
           <w:titlePg/>
           <w:docGrid w:linePitch="360"/>
@@ -8043,7 +8043,7 @@
     <w:sectPr>
       <w:footerReference w:type="default" r:id="rId48"/>
       <w:pgSz w:w="12240" w:h="15840"/>
-      <w:pgMar w:top="2835" w:right="1701" w:bottom="1701" w:left="2268" w:header="720" w:footer="720" w:gutter="0"/>
+      <w:pgMar w:top="1701" w:right="1701" w:bottom="1701" w:left="2268" w:header="720" w:footer="720" w:gutter="0"/>
       <w:cols w:space="720"/>
       <w:titlePg/>
       <w:docGrid w:linePitch="360"/>

</xml_diff>

<commit_message>
"Identificación de la empresa" centrado y sin texto de entrada
</commit_message>
<xml_diff>
--- a/amaal/reportes/Informe_Pasantia_IUTECP.docx
+++ b/amaal/reportes/Informe_Pasantia_IUTECP.docx
@@ -2228,7 +2228,7 @@
       <w:bookmarkStart w:id="bm_cap1_ident" w:name="bm_cap1_ident"/>
       <w:pPr>
         <w:spacing w:before="480" w:after="480" w:line="360" w:lineRule="auto"/>
-        <w:jc w:val="left"/>
+        <w:jc w:val="center"/>
       </w:pPr>
       <w:r>
         <w:rPr>
@@ -2239,21 +2239,6 @@
         <w:t>Identificación de la empresa</w:t>
       </w:r>
       <w:bookmarkEnd w:id="bm_cap1_ident"/>
-    </w:p>
-    <w:p>
-      <w:pPr>
-        <w:spacing w:line="360" w:lineRule="auto" w:after="0" w:before="0"/>
-        <w:ind w:firstLine="709"/>
-        <w:jc w:val="both"/>
-      </w:pPr>
-      <w:r>
-        <w:rPr>
-          <w:rFonts w:ascii="Times New Roman" w:hAnsi="Times New Roman"/>
-          <w:i w:val="0"/>
-          <w:sz w:val="24"/>
-        </w:rPr>
-        <w:t>La pasantía profesional se llevó a cabo en Ingeniería de Telecomunicaciones, C.A., empresa del sector tecnológico conocida comercialmente bajo las siglas IDETEL o INTELCA, registrada bajo el Registro de Información Fiscal (RIF) N° J-08011691-7. La organización actúa como operador autorizado por la Comisión Nacional de Telecomunicaciones (CONATEL) y se desempeña como Distribuidor Autorizado de la marca Motorola en la región oriental del país.</w:t>
-      </w:r>
     </w:p>
     <w:p>
       <w:pPr>

</xml_diff>

<commit_message>
Objetivos Org solo subtitulo, +Obj Gral +Obj Espec en Cap I (quitados de Cap II)
</commit_message>
<xml_diff>
--- a/amaal/reportes/Informe_Pasantia_IUTECP.docx
+++ b/amaal/reportes/Informe_Pasantia_IUTECP.docx
@@ -1015,6 +1015,66 @@
           <w:b w:val="0"/>
           <w:sz w:val="24"/>
         </w:rPr>
+        <w:t>Objetivo General</w:t>
+        <w:tab/>
+      </w:r>
+      <w:r>
+        <w:rPr>
+          <w:rFonts w:ascii="Times New Roman" w:hAnsi="Times New Roman"/>
+          <w:b w:val="0"/>
+          <w:sz w:val="24"/>
+        </w:rPr>
+        <w:fldChar w:fldCharType="begin"/>
+        <w:instrText xml:space="preserve"> PAGEREF bm_cap1_objgral \h </w:instrText>
+        <w:fldChar w:fldCharType="separate"/>
+        <w:t>?</w:t>
+        <w:fldChar w:fldCharType="end"/>
+      </w:r>
+    </w:p>
+    <w:p>
+      <w:pPr>
+        <w:tabs>
+          <w:tab w:pos="8271" w:val="right" w:leader="dot"/>
+        </w:tabs>
+        <w:spacing w:line="360" w:lineRule="auto" w:before="0" w:after="80"/>
+        <w:ind w:left="283"/>
+      </w:pPr>
+      <w:r>
+        <w:rPr>
+          <w:rFonts w:ascii="Times New Roman" w:hAnsi="Times New Roman"/>
+          <w:b w:val="0"/>
+          <w:sz w:val="24"/>
+        </w:rPr>
+        <w:t>Objetivos Específicos</w:t>
+        <w:tab/>
+      </w:r>
+      <w:r>
+        <w:rPr>
+          <w:rFonts w:ascii="Times New Roman" w:hAnsi="Times New Roman"/>
+          <w:b w:val="0"/>
+          <w:sz w:val="24"/>
+        </w:rPr>
+        <w:fldChar w:fldCharType="begin"/>
+        <w:instrText xml:space="preserve"> PAGEREF bm_cap1_objespec \h </w:instrText>
+        <w:fldChar w:fldCharType="separate"/>
+        <w:t>?</w:t>
+        <w:fldChar w:fldCharType="end"/>
+      </w:r>
+    </w:p>
+    <w:p>
+      <w:pPr>
+        <w:tabs>
+          <w:tab w:pos="8271" w:val="right" w:leader="dot"/>
+        </w:tabs>
+        <w:spacing w:line="360" w:lineRule="auto" w:before="0" w:after="80"/>
+        <w:ind w:left="283"/>
+      </w:pPr>
+      <w:r>
+        <w:rPr>
+          <w:rFonts w:ascii="Times New Roman" w:hAnsi="Times New Roman"/>
+          <w:b w:val="0"/>
+          <w:sz w:val="24"/>
+        </w:rPr>
         <w:t>Ubicación geográfica</w:t>
         <w:tab/>
       </w:r>
@@ -1165,66 +1225,6 @@
           <w:b w:val="0"/>
           <w:sz w:val="24"/>
         </w:rPr>
-        <w:t>Objetivo General</w:t>
-        <w:tab/>
-      </w:r>
-      <w:r>
-        <w:rPr>
-          <w:rFonts w:ascii="Times New Roman" w:hAnsi="Times New Roman"/>
-          <w:b w:val="0"/>
-          <w:sz w:val="24"/>
-        </w:rPr>
-        <w:fldChar w:fldCharType="begin"/>
-        <w:instrText xml:space="preserve"> PAGEREF bm_cap2_objg \h </w:instrText>
-        <w:fldChar w:fldCharType="separate"/>
-        <w:t>?</w:t>
-        <w:fldChar w:fldCharType="end"/>
-      </w:r>
-    </w:p>
-    <w:p>
-      <w:pPr>
-        <w:tabs>
-          <w:tab w:pos="8271" w:val="right" w:leader="dot"/>
-        </w:tabs>
-        <w:spacing w:line="360" w:lineRule="auto" w:before="0" w:after="80"/>
-        <w:ind w:left="283"/>
-      </w:pPr>
-      <w:r>
-        <w:rPr>
-          <w:rFonts w:ascii="Times New Roman" w:hAnsi="Times New Roman"/>
-          <w:b w:val="0"/>
-          <w:sz w:val="24"/>
-        </w:rPr>
-        <w:t>Objetivos Específicos</w:t>
-        <w:tab/>
-      </w:r>
-      <w:r>
-        <w:rPr>
-          <w:rFonts w:ascii="Times New Roman" w:hAnsi="Times New Roman"/>
-          <w:b w:val="0"/>
-          <w:sz w:val="24"/>
-        </w:rPr>
-        <w:fldChar w:fldCharType="begin"/>
-        <w:instrText xml:space="preserve"> PAGEREF bm_cap2_obje \h </w:instrText>
-        <w:fldChar w:fldCharType="separate"/>
-        <w:t>?</w:t>
-        <w:fldChar w:fldCharType="end"/>
-      </w:r>
-    </w:p>
-    <w:p>
-      <w:pPr>
-        <w:tabs>
-          <w:tab w:pos="8271" w:val="right" w:leader="dot"/>
-        </w:tabs>
-        <w:spacing w:line="360" w:lineRule="auto" w:before="0" w:after="80"/>
-        <w:ind w:left="283"/>
-      </w:pPr>
-      <w:r>
-        <w:rPr>
-          <w:rFonts w:ascii="Times New Roman" w:hAnsi="Times New Roman"/>
-          <w:b w:val="0"/>
-          <w:sz w:val="24"/>
-        </w:rPr>
         <w:t>Planificación integral de objetivos</w:t>
         <w:tab/>
       </w:r>
@@ -2556,6 +2556,22 @@
       <w:bookmarkEnd w:id="bm_cap1_obj"/>
     </w:p>
     <w:p>
+      <w:bookmarkStart w:id="bm_cap1_objgral" w:name="bm_cap1_objgral"/>
+      <w:pPr>
+        <w:spacing w:before="480" w:after="480" w:line="360" w:lineRule="auto"/>
+        <w:jc w:val="left"/>
+      </w:pPr>
+      <w:r>
+        <w:rPr>
+          <w:rFonts w:ascii="Times New Roman" w:hAnsi="Times New Roman"/>
+          <w:b/>
+          <w:sz w:val="24"/>
+        </w:rPr>
+        <w:t>Objetivo General</w:t>
+      </w:r>
+      <w:bookmarkEnd w:id="bm_cap1_objgral"/>
+    </w:p>
+    <w:p>
       <w:pPr>
         <w:spacing w:line="360" w:lineRule="auto" w:after="0" w:before="0"/>
         <w:ind w:firstLine="709"/>
@@ -2567,8 +2583,24 @@
           <w:i w:val="0"/>
           <w:sz w:val="24"/>
         </w:rPr>
-        <w:t>Entre sus objetivos organizacionales se encuentran:</w:t>
-      </w:r>
+        <w:t>Evaluar el control administrativo aplicado a la gestión de solicitudes de servicios de telecomunicaciones en la empresa Ingeniería de Telecomunicaciones, C.A., con el propósito de identificar las debilidades del proceso y proponer mejoras que optimicen la atención al suscriptor desde el Departamento de Administración.</w:t>
+      </w:r>
+    </w:p>
+    <w:p>
+      <w:bookmarkStart w:id="bm_cap1_objespec" w:name="bm_cap1_objespec"/>
+      <w:pPr>
+        <w:spacing w:before="480" w:after="480" w:line="360" w:lineRule="auto"/>
+        <w:jc w:val="left"/>
+      </w:pPr>
+      <w:r>
+        <w:rPr>
+          <w:rFonts w:ascii="Times New Roman" w:hAnsi="Times New Roman"/>
+          <w:b/>
+          <w:sz w:val="24"/>
+        </w:rPr>
+        <w:t>Objetivos Específicos</w:t>
+      </w:r>
+      <w:bookmarkEnd w:id="bm_cap1_objespec"/>
     </w:p>
     <w:p>
       <w:pPr>
@@ -2588,7 +2620,7 @@
           <w:rFonts w:ascii="Times New Roman" w:hAnsi="Times New Roman"/>
           <w:sz w:val="24"/>
         </w:rPr>
-        <w:t>Ejecutar todo género de actividad o prestación de servicios relacionados directa o indirectamente con el ramo de las comunicaciones, computación y la electrónica en general.</w:t>
+        <w:t>Describir los procesos administrativos actuales aplicados a la gestión de solicitudes de afiliación de nuevos suscriptores e incidencias en Ingeniería de Telecomunicaciones, C.A.</w:t>
       </w:r>
     </w:p>
     <w:p>
@@ -2609,7 +2641,7 @@
           <w:rFonts w:ascii="Times New Roman" w:hAnsi="Times New Roman"/>
           <w:sz w:val="24"/>
         </w:rPr>
-        <w:t>Prestar servicios de importación, manufacturación, asesoría, ventas, instalaciones, arrendamientos, supervisión y mantenimiento en el área de telecomunicaciones.</w:t>
+        <w:t>Identificar las deficiencias presentes en el sistema de control administrativo utilizado para el seguimiento de solicitudes de servicios de telecomunicaciones.</w:t>
       </w:r>
     </w:p>
     <w:p>
@@ -2630,7 +2662,28 @@
           <w:rFonts w:ascii="Times New Roman" w:hAnsi="Times New Roman"/>
           <w:sz w:val="24"/>
         </w:rPr>
-        <w:t>Representar total o parcialmente cualquier producto comercial relacionado con sus operaciones mercantiles.</w:t>
+        <w:t>Analizar el impacto de las debilidades detectadas en el control administrativo sobre la calidad del servicio prestado a los suscriptores de la empresa.</w:t>
+      </w:r>
+    </w:p>
+    <w:p>
+      <w:pPr>
+        <w:spacing w:line="360" w:lineRule="auto"/>
+        <w:ind w:firstLine="709"/>
+        <w:jc w:val="both"/>
+      </w:pPr>
+      <w:r>
+        <w:rPr>
+          <w:rFonts w:ascii="Times New Roman" w:hAnsi="Times New Roman"/>
+          <w:sz w:val="24"/>
+        </w:rPr>
+        <w:t xml:space="preserve">4. </w:t>
+      </w:r>
+      <w:r>
+        <w:rPr>
+          <w:rFonts w:ascii="Times New Roman" w:hAnsi="Times New Roman"/>
+          <w:sz w:val="24"/>
+        </w:rPr>
+        <w:t>Proponer mejoras al proceso de control administrativo de solicitudes de servicios que contribuyan a la optimización operativa y a la satisfacción del cliente en Ingeniería de Telecomunicaciones, C.A.</w:t>
       </w:r>
     </w:p>
     <w:p>
@@ -3062,137 +3115,6 @@
           <w:sz w:val="24"/>
         </w:rPr>
         <w:t>Las causas de esta situación se atribuyen principalmente a la falta de un protocolo administrativo formal que regule el flujo de las solicitudes desde su recepción hasta su cierre definitivo, así como a la dependencia de canales informales de comunicación entre las áreas involucradas. Como consecuencia, se generan reprocesos, insatisfacción en los clientes y sobrecarga operativa en los supervisores, comprometiendo la calidad del servicio prestado y la imagen institucional de la organización.</w:t>
-      </w:r>
-    </w:p>
-    <w:p>
-      <w:bookmarkStart w:id="bm_cap2_objg" w:name="bm_cap2_objg"/>
-      <w:pPr>
-        <w:spacing w:before="480" w:after="480" w:line="360" w:lineRule="auto"/>
-        <w:jc w:val="left"/>
-      </w:pPr>
-      <w:r>
-        <w:rPr>
-          <w:rFonts w:ascii="Times New Roman" w:hAnsi="Times New Roman"/>
-          <w:b/>
-          <w:sz w:val="24"/>
-        </w:rPr>
-        <w:t>Objetivo General</w:t>
-      </w:r>
-      <w:bookmarkEnd w:id="bm_cap2_objg"/>
-    </w:p>
-    <w:p>
-      <w:pPr>
-        <w:spacing w:line="360" w:lineRule="auto" w:after="0" w:before="0"/>
-        <w:ind w:firstLine="709"/>
-        <w:jc w:val="both"/>
-      </w:pPr>
-      <w:r>
-        <w:rPr>
-          <w:rFonts w:ascii="Times New Roman" w:hAnsi="Times New Roman"/>
-          <w:i w:val="0"/>
-          <w:sz w:val="24"/>
-        </w:rPr>
-        <w:t>Evaluar el control administrativo aplicado a la gestión de solicitudes de servicios de telecomunicaciones en la empresa Ingeniería de Telecomunicaciones, C.A., con el propósito de identificar las debilidades del proceso y proponer mejoras que optimicen la atención al suscriptor desde el Departamento de Administración.</w:t>
-      </w:r>
-    </w:p>
-    <w:p>
-      <w:bookmarkStart w:id="bm_cap2_obje" w:name="bm_cap2_obje"/>
-      <w:pPr>
-        <w:spacing w:before="480" w:after="480" w:line="360" w:lineRule="auto"/>
-        <w:jc w:val="left"/>
-      </w:pPr>
-      <w:r>
-        <w:rPr>
-          <w:rFonts w:ascii="Times New Roman" w:hAnsi="Times New Roman"/>
-          <w:b/>
-          <w:sz w:val="24"/>
-        </w:rPr>
-        <w:t>Objetivos Específicos</w:t>
-      </w:r>
-      <w:bookmarkEnd w:id="bm_cap2_obje"/>
-    </w:p>
-    <w:p>
-      <w:pPr>
-        <w:spacing w:line="360" w:lineRule="auto"/>
-        <w:ind w:firstLine="709"/>
-        <w:jc w:val="both"/>
-      </w:pPr>
-      <w:r>
-        <w:rPr>
-          <w:rFonts w:ascii="Times New Roman" w:hAnsi="Times New Roman"/>
-          <w:sz w:val="24"/>
-        </w:rPr>
-        <w:t xml:space="preserve">1. </w:t>
-      </w:r>
-      <w:r>
-        <w:rPr>
-          <w:rFonts w:ascii="Times New Roman" w:hAnsi="Times New Roman"/>
-          <w:sz w:val="24"/>
-        </w:rPr>
-        <w:t>Describir los procesos administrativos actuales aplicados a la gestión de solicitudes de afiliación de nuevos suscriptores e incidencias en Ingeniería de Telecomunicaciones, C.A.</w:t>
-      </w:r>
-    </w:p>
-    <w:p>
-      <w:pPr>
-        <w:spacing w:line="360" w:lineRule="auto"/>
-        <w:ind w:firstLine="709"/>
-        <w:jc w:val="both"/>
-      </w:pPr>
-      <w:r>
-        <w:rPr>
-          <w:rFonts w:ascii="Times New Roman" w:hAnsi="Times New Roman"/>
-          <w:sz w:val="24"/>
-        </w:rPr>
-        <w:t xml:space="preserve">2. </w:t>
-      </w:r>
-      <w:r>
-        <w:rPr>
-          <w:rFonts w:ascii="Times New Roman" w:hAnsi="Times New Roman"/>
-          <w:sz w:val="24"/>
-        </w:rPr>
-        <w:t>Identificar las deficiencias presentes en el sistema de control administrativo utilizado para el seguimiento de solicitudes de servicios de telecomunicaciones.</w:t>
-      </w:r>
-    </w:p>
-    <w:p>
-      <w:pPr>
-        <w:spacing w:line="360" w:lineRule="auto"/>
-        <w:ind w:firstLine="709"/>
-        <w:jc w:val="both"/>
-      </w:pPr>
-      <w:r>
-        <w:rPr>
-          <w:rFonts w:ascii="Times New Roman" w:hAnsi="Times New Roman"/>
-          <w:sz w:val="24"/>
-        </w:rPr>
-        <w:t xml:space="preserve">3. </w:t>
-      </w:r>
-      <w:r>
-        <w:rPr>
-          <w:rFonts w:ascii="Times New Roman" w:hAnsi="Times New Roman"/>
-          <w:sz w:val="24"/>
-        </w:rPr>
-        <w:t>Analizar el impacto de las debilidades detectadas en el control administrativo sobre la calidad del servicio prestado a los suscriptores de la empresa.</w:t>
-      </w:r>
-    </w:p>
-    <w:p>
-      <w:pPr>
-        <w:spacing w:line="360" w:lineRule="auto"/>
-        <w:ind w:firstLine="709"/>
-        <w:jc w:val="both"/>
-      </w:pPr>
-      <w:r>
-        <w:rPr>
-          <w:rFonts w:ascii="Times New Roman" w:hAnsi="Times New Roman"/>
-          <w:sz w:val="24"/>
-        </w:rPr>
-        <w:t xml:space="preserve">4. </w:t>
-      </w:r>
-      <w:r>
-        <w:rPr>
-          <w:rFonts w:ascii="Times New Roman" w:hAnsi="Times New Roman"/>
-          <w:sz w:val="24"/>
-        </w:rPr>
-        <w:t>Proponer mejoras al proceso de control administrativo de solicitudes de servicios que contribuyan a la optimización operativa y a la satisfacción del cliente en Ingeniería de Telecomunicaciones, C.A.</w:t>
       </w:r>
     </w:p>
     <w:p>

</xml_diff>

<commit_message>
Corregir: Objetivos Org solo subtitulo en Cap I, Obj Gral/Espec solo en Cap II
</commit_message>
<xml_diff>
--- a/amaal/reportes/Informe_Pasantia_IUTECP.docx
+++ b/amaal/reportes/Informe_Pasantia_IUTECP.docx
@@ -1015,66 +1015,6 @@
           <w:b w:val="0"/>
           <w:sz w:val="24"/>
         </w:rPr>
-        <w:t>Objetivo General</w:t>
-        <w:tab/>
-      </w:r>
-      <w:r>
-        <w:rPr>
-          <w:rFonts w:ascii="Times New Roman" w:hAnsi="Times New Roman"/>
-          <w:b w:val="0"/>
-          <w:sz w:val="24"/>
-        </w:rPr>
-        <w:fldChar w:fldCharType="begin"/>
-        <w:instrText xml:space="preserve"> PAGEREF bm_cap1_objgral \h </w:instrText>
-        <w:fldChar w:fldCharType="separate"/>
-        <w:t>?</w:t>
-        <w:fldChar w:fldCharType="end"/>
-      </w:r>
-    </w:p>
-    <w:p>
-      <w:pPr>
-        <w:tabs>
-          <w:tab w:pos="8271" w:val="right" w:leader="dot"/>
-        </w:tabs>
-        <w:spacing w:line="360" w:lineRule="auto" w:before="0" w:after="80"/>
-        <w:ind w:left="283"/>
-      </w:pPr>
-      <w:r>
-        <w:rPr>
-          <w:rFonts w:ascii="Times New Roman" w:hAnsi="Times New Roman"/>
-          <w:b w:val="0"/>
-          <w:sz w:val="24"/>
-        </w:rPr>
-        <w:t>Objetivos Específicos</w:t>
-        <w:tab/>
-      </w:r>
-      <w:r>
-        <w:rPr>
-          <w:rFonts w:ascii="Times New Roman" w:hAnsi="Times New Roman"/>
-          <w:b w:val="0"/>
-          <w:sz w:val="24"/>
-        </w:rPr>
-        <w:fldChar w:fldCharType="begin"/>
-        <w:instrText xml:space="preserve"> PAGEREF bm_cap1_objespec \h </w:instrText>
-        <w:fldChar w:fldCharType="separate"/>
-        <w:t>?</w:t>
-        <w:fldChar w:fldCharType="end"/>
-      </w:r>
-    </w:p>
-    <w:p>
-      <w:pPr>
-        <w:tabs>
-          <w:tab w:pos="8271" w:val="right" w:leader="dot"/>
-        </w:tabs>
-        <w:spacing w:line="360" w:lineRule="auto" w:before="0" w:after="80"/>
-        <w:ind w:left="283"/>
-      </w:pPr>
-      <w:r>
-        <w:rPr>
-          <w:rFonts w:ascii="Times New Roman" w:hAnsi="Times New Roman"/>
-          <w:b w:val="0"/>
-          <w:sz w:val="24"/>
-        </w:rPr>
         <w:t>Ubicación geográfica</w:t>
         <w:tab/>
       </w:r>
@@ -1225,6 +1165,66 @@
           <w:b w:val="0"/>
           <w:sz w:val="24"/>
         </w:rPr>
+        <w:t>Objetivo General</w:t>
+        <w:tab/>
+      </w:r>
+      <w:r>
+        <w:rPr>
+          <w:rFonts w:ascii="Times New Roman" w:hAnsi="Times New Roman"/>
+          <w:b w:val="0"/>
+          <w:sz w:val="24"/>
+        </w:rPr>
+        <w:fldChar w:fldCharType="begin"/>
+        <w:instrText xml:space="preserve"> PAGEREF bm_cap2_objg \h </w:instrText>
+        <w:fldChar w:fldCharType="separate"/>
+        <w:t>?</w:t>
+        <w:fldChar w:fldCharType="end"/>
+      </w:r>
+    </w:p>
+    <w:p>
+      <w:pPr>
+        <w:tabs>
+          <w:tab w:pos="8271" w:val="right" w:leader="dot"/>
+        </w:tabs>
+        <w:spacing w:line="360" w:lineRule="auto" w:before="0" w:after="80"/>
+        <w:ind w:left="283"/>
+      </w:pPr>
+      <w:r>
+        <w:rPr>
+          <w:rFonts w:ascii="Times New Roman" w:hAnsi="Times New Roman"/>
+          <w:b w:val="0"/>
+          <w:sz w:val="24"/>
+        </w:rPr>
+        <w:t>Objetivos Específicos</w:t>
+        <w:tab/>
+      </w:r>
+      <w:r>
+        <w:rPr>
+          <w:rFonts w:ascii="Times New Roman" w:hAnsi="Times New Roman"/>
+          <w:b w:val="0"/>
+          <w:sz w:val="24"/>
+        </w:rPr>
+        <w:fldChar w:fldCharType="begin"/>
+        <w:instrText xml:space="preserve"> PAGEREF bm_cap2_obje \h </w:instrText>
+        <w:fldChar w:fldCharType="separate"/>
+        <w:t>?</w:t>
+        <w:fldChar w:fldCharType="end"/>
+      </w:r>
+    </w:p>
+    <w:p>
+      <w:pPr>
+        <w:tabs>
+          <w:tab w:pos="8271" w:val="right" w:leader="dot"/>
+        </w:tabs>
+        <w:spacing w:line="360" w:lineRule="auto" w:before="0" w:after="80"/>
+        <w:ind w:left="283"/>
+      </w:pPr>
+      <w:r>
+        <w:rPr>
+          <w:rFonts w:ascii="Times New Roman" w:hAnsi="Times New Roman"/>
+          <w:b w:val="0"/>
+          <w:sz w:val="24"/>
+        </w:rPr>
         <w:t>Planificación integral de objetivos</w:t>
         <w:tab/>
       </w:r>
@@ -2554,137 +2554,6 @@
         <w:t>Objetivos Organizacionales</w:t>
       </w:r>
       <w:bookmarkEnd w:id="bm_cap1_obj"/>
-    </w:p>
-    <w:p>
-      <w:bookmarkStart w:id="bm_cap1_objgral" w:name="bm_cap1_objgral"/>
-      <w:pPr>
-        <w:spacing w:before="480" w:after="480" w:line="360" w:lineRule="auto"/>
-        <w:jc w:val="left"/>
-      </w:pPr>
-      <w:r>
-        <w:rPr>
-          <w:rFonts w:ascii="Times New Roman" w:hAnsi="Times New Roman"/>
-          <w:b/>
-          <w:sz w:val="24"/>
-        </w:rPr>
-        <w:t>Objetivo General</w:t>
-      </w:r>
-      <w:bookmarkEnd w:id="bm_cap1_objgral"/>
-    </w:p>
-    <w:p>
-      <w:pPr>
-        <w:spacing w:line="360" w:lineRule="auto" w:after="0" w:before="0"/>
-        <w:ind w:firstLine="709"/>
-        <w:jc w:val="both"/>
-      </w:pPr>
-      <w:r>
-        <w:rPr>
-          <w:rFonts w:ascii="Times New Roman" w:hAnsi="Times New Roman"/>
-          <w:i w:val="0"/>
-          <w:sz w:val="24"/>
-        </w:rPr>
-        <w:t>Evaluar el control administrativo aplicado a la gestión de solicitudes de servicios de telecomunicaciones en la empresa Ingeniería de Telecomunicaciones, C.A., con el propósito de identificar las debilidades del proceso y proponer mejoras que optimicen la atención al suscriptor desde el Departamento de Administración.</w:t>
-      </w:r>
-    </w:p>
-    <w:p>
-      <w:bookmarkStart w:id="bm_cap1_objespec" w:name="bm_cap1_objespec"/>
-      <w:pPr>
-        <w:spacing w:before="480" w:after="480" w:line="360" w:lineRule="auto"/>
-        <w:jc w:val="left"/>
-      </w:pPr>
-      <w:r>
-        <w:rPr>
-          <w:rFonts w:ascii="Times New Roman" w:hAnsi="Times New Roman"/>
-          <w:b/>
-          <w:sz w:val="24"/>
-        </w:rPr>
-        <w:t>Objetivos Específicos</w:t>
-      </w:r>
-      <w:bookmarkEnd w:id="bm_cap1_objespec"/>
-    </w:p>
-    <w:p>
-      <w:pPr>
-        <w:spacing w:line="360" w:lineRule="auto"/>
-        <w:ind w:firstLine="709"/>
-        <w:jc w:val="both"/>
-      </w:pPr>
-      <w:r>
-        <w:rPr>
-          <w:rFonts w:ascii="Times New Roman" w:hAnsi="Times New Roman"/>
-          <w:sz w:val="24"/>
-        </w:rPr>
-        <w:t xml:space="preserve">1. </w:t>
-      </w:r>
-      <w:r>
-        <w:rPr>
-          <w:rFonts w:ascii="Times New Roman" w:hAnsi="Times New Roman"/>
-          <w:sz w:val="24"/>
-        </w:rPr>
-        <w:t>Describir los procesos administrativos actuales aplicados a la gestión de solicitudes de afiliación de nuevos suscriptores e incidencias en Ingeniería de Telecomunicaciones, C.A.</w:t>
-      </w:r>
-    </w:p>
-    <w:p>
-      <w:pPr>
-        <w:spacing w:line="360" w:lineRule="auto"/>
-        <w:ind w:firstLine="709"/>
-        <w:jc w:val="both"/>
-      </w:pPr>
-      <w:r>
-        <w:rPr>
-          <w:rFonts w:ascii="Times New Roman" w:hAnsi="Times New Roman"/>
-          <w:sz w:val="24"/>
-        </w:rPr>
-        <w:t xml:space="preserve">2. </w:t>
-      </w:r>
-      <w:r>
-        <w:rPr>
-          <w:rFonts w:ascii="Times New Roman" w:hAnsi="Times New Roman"/>
-          <w:sz w:val="24"/>
-        </w:rPr>
-        <w:t>Identificar las deficiencias presentes en el sistema de control administrativo utilizado para el seguimiento de solicitudes de servicios de telecomunicaciones.</w:t>
-      </w:r>
-    </w:p>
-    <w:p>
-      <w:pPr>
-        <w:spacing w:line="360" w:lineRule="auto"/>
-        <w:ind w:firstLine="709"/>
-        <w:jc w:val="both"/>
-      </w:pPr>
-      <w:r>
-        <w:rPr>
-          <w:rFonts w:ascii="Times New Roman" w:hAnsi="Times New Roman"/>
-          <w:sz w:val="24"/>
-        </w:rPr>
-        <w:t xml:space="preserve">3. </w:t>
-      </w:r>
-      <w:r>
-        <w:rPr>
-          <w:rFonts w:ascii="Times New Roman" w:hAnsi="Times New Roman"/>
-          <w:sz w:val="24"/>
-        </w:rPr>
-        <w:t>Analizar el impacto de las debilidades detectadas en el control administrativo sobre la calidad del servicio prestado a los suscriptores de la empresa.</w:t>
-      </w:r>
-    </w:p>
-    <w:p>
-      <w:pPr>
-        <w:spacing w:line="360" w:lineRule="auto"/>
-        <w:ind w:firstLine="709"/>
-        <w:jc w:val="both"/>
-      </w:pPr>
-      <w:r>
-        <w:rPr>
-          <w:rFonts w:ascii="Times New Roman" w:hAnsi="Times New Roman"/>
-          <w:sz w:val="24"/>
-        </w:rPr>
-        <w:t xml:space="preserve">4. </w:t>
-      </w:r>
-      <w:r>
-        <w:rPr>
-          <w:rFonts w:ascii="Times New Roman" w:hAnsi="Times New Roman"/>
-          <w:sz w:val="24"/>
-        </w:rPr>
-        <w:t>Proponer mejoras al proceso de control administrativo de solicitudes de servicios que contribuyan a la optimización operativa y a la satisfacción del cliente en Ingeniería de Telecomunicaciones, C.A.</w:t>
-      </w:r>
     </w:p>
     <w:p>
       <w:bookmarkStart w:id="bm_cap1_ubic" w:name="bm_cap1_ubic"/>
@@ -3115,6 +2984,137 @@
           <w:sz w:val="24"/>
         </w:rPr>
         <w:t>Las causas de esta situación se atribuyen principalmente a la falta de un protocolo administrativo formal que regule el flujo de las solicitudes desde su recepción hasta su cierre definitivo, así como a la dependencia de canales informales de comunicación entre las áreas involucradas. Como consecuencia, se generan reprocesos, insatisfacción en los clientes y sobrecarga operativa en los supervisores, comprometiendo la calidad del servicio prestado y la imagen institucional de la organización.</w:t>
+      </w:r>
+    </w:p>
+    <w:p>
+      <w:bookmarkStart w:id="bm_cap2_objg" w:name="bm_cap2_objg"/>
+      <w:pPr>
+        <w:spacing w:before="480" w:after="480" w:line="360" w:lineRule="auto"/>
+        <w:jc w:val="left"/>
+      </w:pPr>
+      <w:r>
+        <w:rPr>
+          <w:rFonts w:ascii="Times New Roman" w:hAnsi="Times New Roman"/>
+          <w:b/>
+          <w:sz w:val="24"/>
+        </w:rPr>
+        <w:t>Objetivo General</w:t>
+      </w:r>
+      <w:bookmarkEnd w:id="bm_cap2_objg"/>
+    </w:p>
+    <w:p>
+      <w:pPr>
+        <w:spacing w:line="360" w:lineRule="auto" w:after="0" w:before="0"/>
+        <w:ind w:firstLine="709"/>
+        <w:jc w:val="both"/>
+      </w:pPr>
+      <w:r>
+        <w:rPr>
+          <w:rFonts w:ascii="Times New Roman" w:hAnsi="Times New Roman"/>
+          <w:i w:val="0"/>
+          <w:sz w:val="24"/>
+        </w:rPr>
+        <w:t>Evaluar el control administrativo aplicado a la gestión de solicitudes de servicios de telecomunicaciones en la empresa Ingeniería de Telecomunicaciones, C.A., con el propósito de identificar las debilidades del proceso y proponer mejoras que optimicen la atención al suscriptor desde el Departamento de Administración.</w:t>
+      </w:r>
+    </w:p>
+    <w:p>
+      <w:bookmarkStart w:id="bm_cap2_obje" w:name="bm_cap2_obje"/>
+      <w:pPr>
+        <w:spacing w:before="480" w:after="480" w:line="360" w:lineRule="auto"/>
+        <w:jc w:val="left"/>
+      </w:pPr>
+      <w:r>
+        <w:rPr>
+          <w:rFonts w:ascii="Times New Roman" w:hAnsi="Times New Roman"/>
+          <w:b/>
+          <w:sz w:val="24"/>
+        </w:rPr>
+        <w:t>Objetivos Específicos</w:t>
+      </w:r>
+      <w:bookmarkEnd w:id="bm_cap2_obje"/>
+    </w:p>
+    <w:p>
+      <w:pPr>
+        <w:spacing w:line="360" w:lineRule="auto"/>
+        <w:ind w:firstLine="709"/>
+        <w:jc w:val="both"/>
+      </w:pPr>
+      <w:r>
+        <w:rPr>
+          <w:rFonts w:ascii="Times New Roman" w:hAnsi="Times New Roman"/>
+          <w:sz w:val="24"/>
+        </w:rPr>
+        <w:t xml:space="preserve">1. </w:t>
+      </w:r>
+      <w:r>
+        <w:rPr>
+          <w:rFonts w:ascii="Times New Roman" w:hAnsi="Times New Roman"/>
+          <w:sz w:val="24"/>
+        </w:rPr>
+        <w:t>Describir los procesos administrativos actuales aplicados a la gestión de solicitudes de afiliación de nuevos suscriptores e incidencias en Ingeniería de Telecomunicaciones, C.A.</w:t>
+      </w:r>
+    </w:p>
+    <w:p>
+      <w:pPr>
+        <w:spacing w:line="360" w:lineRule="auto"/>
+        <w:ind w:firstLine="709"/>
+        <w:jc w:val="both"/>
+      </w:pPr>
+      <w:r>
+        <w:rPr>
+          <w:rFonts w:ascii="Times New Roman" w:hAnsi="Times New Roman"/>
+          <w:sz w:val="24"/>
+        </w:rPr>
+        <w:t xml:space="preserve">2. </w:t>
+      </w:r>
+      <w:r>
+        <w:rPr>
+          <w:rFonts w:ascii="Times New Roman" w:hAnsi="Times New Roman"/>
+          <w:sz w:val="24"/>
+        </w:rPr>
+        <w:t>Identificar las deficiencias presentes en el sistema de control administrativo utilizado para el seguimiento de solicitudes de servicios de telecomunicaciones.</w:t>
+      </w:r>
+    </w:p>
+    <w:p>
+      <w:pPr>
+        <w:spacing w:line="360" w:lineRule="auto"/>
+        <w:ind w:firstLine="709"/>
+        <w:jc w:val="both"/>
+      </w:pPr>
+      <w:r>
+        <w:rPr>
+          <w:rFonts w:ascii="Times New Roman" w:hAnsi="Times New Roman"/>
+          <w:sz w:val="24"/>
+        </w:rPr>
+        <w:t xml:space="preserve">3. </w:t>
+      </w:r>
+      <w:r>
+        <w:rPr>
+          <w:rFonts w:ascii="Times New Roman" w:hAnsi="Times New Roman"/>
+          <w:sz w:val="24"/>
+        </w:rPr>
+        <w:t>Analizar el impacto de las debilidades detectadas en el control administrativo sobre la calidad del servicio prestado a los suscriptores de la empresa.</w:t>
+      </w:r>
+    </w:p>
+    <w:p>
+      <w:pPr>
+        <w:spacing w:line="360" w:lineRule="auto"/>
+        <w:ind w:firstLine="709"/>
+        <w:jc w:val="both"/>
+      </w:pPr>
+      <w:r>
+        <w:rPr>
+          <w:rFonts w:ascii="Times New Roman" w:hAnsi="Times New Roman"/>
+          <w:sz w:val="24"/>
+        </w:rPr>
+        <w:t xml:space="preserve">4. </w:t>
+      </w:r>
+      <w:r>
+        <w:rPr>
+          <w:rFonts w:ascii="Times New Roman" w:hAnsi="Times New Roman"/>
+          <w:sz w:val="24"/>
+        </w:rPr>
+        <w:t>Proponer mejoras al proceso de control administrativo de solicitudes de servicios que contribuyan a la optimización operativa y a la satisfacción del cliente en Ingeniería de Telecomunicaciones, C.A.</w:t>
       </w:r>
     </w:p>
     <w:p>

</xml_diff>

<commit_message>
Cap I: Objetivo General y Especificos de la empresa (separados del proyecto en Cap II)
</commit_message>
<xml_diff>
--- a/amaal/reportes/Informe_Pasantia_IUTECP.docx
+++ b/amaal/reportes/Informe_Pasantia_IUTECP.docx
@@ -2554,6 +2554,91 @@
         <w:t>Objetivos Organizacionales</w:t>
       </w:r>
       <w:bookmarkEnd w:id="bm_cap1_obj"/>
+    </w:p>
+    <w:p>
+      <w:pPr>
+        <w:spacing w:before="480" w:after="480" w:line="360" w:lineRule="auto"/>
+        <w:jc w:val="left"/>
+      </w:pPr>
+      <w:r>
+        <w:rPr>
+          <w:rFonts w:ascii="Times New Roman" w:hAnsi="Times New Roman"/>
+          <w:b/>
+          <w:sz w:val="24"/>
+        </w:rPr>
+        <w:t>Objetivo General</w:t>
+      </w:r>
+    </w:p>
+    <w:p>
+      <w:pPr>
+        <w:spacing w:line="360" w:lineRule="auto" w:after="0" w:before="0"/>
+        <w:ind w:firstLine="709"/>
+        <w:jc w:val="both"/>
+      </w:pPr>
+      <w:r>
+        <w:rPr>
+          <w:rFonts w:ascii="Times New Roman" w:hAnsi="Times New Roman"/>
+          <w:i w:val="0"/>
+          <w:sz w:val="24"/>
+        </w:rPr>
+        <w:t>Ejecutar todo género de actividad o prestación de servicios relacionados directa o indirectamente con el ramo de las comunicaciones, computación y la electrónica en general.</w:t>
+      </w:r>
+    </w:p>
+    <w:p>
+      <w:pPr>
+        <w:spacing w:before="480" w:after="480" w:line="360" w:lineRule="auto"/>
+        <w:jc w:val="left"/>
+      </w:pPr>
+      <w:r>
+        <w:rPr>
+          <w:rFonts w:ascii="Times New Roman" w:hAnsi="Times New Roman"/>
+          <w:b/>
+          <w:sz w:val="24"/>
+        </w:rPr>
+        <w:t>Objetivos Específicos</w:t>
+      </w:r>
+    </w:p>
+    <w:p>
+      <w:pPr>
+        <w:spacing w:line="360" w:lineRule="auto"/>
+        <w:ind w:firstLine="709"/>
+        <w:jc w:val="both"/>
+      </w:pPr>
+      <w:r>
+        <w:rPr>
+          <w:rFonts w:ascii="Times New Roman" w:hAnsi="Times New Roman"/>
+          <w:sz w:val="24"/>
+        </w:rPr>
+        <w:t xml:space="preserve">1. </w:t>
+      </w:r>
+      <w:r>
+        <w:rPr>
+          <w:rFonts w:ascii="Times New Roman" w:hAnsi="Times New Roman"/>
+          <w:sz w:val="24"/>
+        </w:rPr>
+        <w:t>Prestar servicios de importación, manufacturación, asesoría, ventas, instalaciones, arrendamientos, supervisión y mantenimiento en el área de telecomunicaciones.</w:t>
+      </w:r>
+    </w:p>
+    <w:p>
+      <w:pPr>
+        <w:spacing w:line="360" w:lineRule="auto"/>
+        <w:ind w:firstLine="709"/>
+        <w:jc w:val="both"/>
+      </w:pPr>
+      <w:r>
+        <w:rPr>
+          <w:rFonts w:ascii="Times New Roman" w:hAnsi="Times New Roman"/>
+          <w:sz w:val="24"/>
+        </w:rPr>
+        <w:t xml:space="preserve">2. </w:t>
+      </w:r>
+      <w:r>
+        <w:rPr>
+          <w:rFonts w:ascii="Times New Roman" w:hAnsi="Times New Roman"/>
+          <w:sz w:val="24"/>
+        </w:rPr>
+        <w:t>Representar total o parcialmente cualquier producto comercial relacionado con sus operaciones mercantiles.</w:t>
+      </w:r>
     </w:p>
     <w:p>
       <w:bookmarkStart w:id="bm_cap1_ubic" w:name="bm_cap1_ubic"/>

</xml_diff>

<commit_message>
Agregar space_after=6pt en parrafos normados para separar parrafos
</commit_message>
<xml_diff>
--- a/amaal/reportes/Informe_Pasantia_IUTECP.docx
+++ b/amaal/reportes/Informe_Pasantia_IUTECP.docx
@@ -418,7 +418,7 @@
     </w:p>
     <w:p>
       <w:pPr>
-        <w:spacing w:line="360" w:lineRule="auto" w:after="0" w:before="0"/>
+        <w:spacing w:line="360" w:lineRule="auto" w:after="120" w:before="0"/>
         <w:ind w:firstLine="709"/>
         <w:jc w:val="both"/>
       </w:pPr>
@@ -474,7 +474,7 @@
     </w:p>
     <w:p>
       <w:pPr>
-        <w:spacing w:line="360" w:lineRule="auto" w:after="0" w:before="0"/>
+        <w:spacing w:line="360" w:lineRule="auto" w:after="120" w:before="0"/>
         <w:ind w:firstLine="709"/>
         <w:jc w:val="both"/>
       </w:pPr>
@@ -2085,7 +2085,7 @@
     </w:p>
     <w:p>
       <w:pPr>
-        <w:spacing w:line="360" w:lineRule="auto" w:after="0" w:before="0"/>
+        <w:spacing w:line="360" w:lineRule="auto" w:after="120" w:before="0"/>
         <w:ind w:firstLine="709"/>
         <w:jc w:val="both"/>
       </w:pPr>
@@ -2156,7 +2156,7 @@
     </w:p>
     <w:p>
       <w:pPr>
-        <w:spacing w:line="360" w:lineRule="auto" w:after="0" w:before="0"/>
+        <w:spacing w:line="360" w:lineRule="auto" w:after="120" w:before="0"/>
         <w:ind w:firstLine="709"/>
         <w:jc w:val="both"/>
       </w:pPr>
@@ -2256,7 +2256,7 @@
     </w:p>
     <w:p>
       <w:pPr>
-        <w:spacing w:line="360" w:lineRule="auto" w:after="0" w:before="0"/>
+        <w:spacing w:line="360" w:lineRule="auto" w:after="120" w:before="0"/>
         <w:ind w:firstLine="0"/>
         <w:jc w:val="both"/>
       </w:pPr>
@@ -2287,7 +2287,7 @@
     </w:p>
     <w:p>
       <w:pPr>
-        <w:spacing w:line="360" w:lineRule="auto" w:after="0" w:before="0"/>
+        <w:spacing w:line="360" w:lineRule="auto" w:after="120" w:before="0"/>
         <w:ind w:firstLine="709"/>
         <w:jc w:val="both"/>
       </w:pPr>
@@ -2302,7 +2302,7 @@
     </w:p>
     <w:p>
       <w:pPr>
-        <w:spacing w:line="360" w:lineRule="auto" w:after="0" w:before="0"/>
+        <w:spacing w:line="360" w:lineRule="auto" w:after="120" w:before="0"/>
         <w:ind w:firstLine="709"/>
         <w:jc w:val="both"/>
       </w:pPr>
@@ -2317,7 +2317,7 @@
     </w:p>
     <w:p>
       <w:pPr>
-        <w:spacing w:line="360" w:lineRule="auto" w:after="0" w:before="0"/>
+        <w:spacing w:line="360" w:lineRule="auto" w:after="120" w:before="0"/>
         <w:ind w:firstLine="709"/>
         <w:jc w:val="both"/>
       </w:pPr>
@@ -2348,7 +2348,7 @@
     </w:p>
     <w:p>
       <w:pPr>
-        <w:spacing w:line="360" w:lineRule="auto" w:after="0" w:before="0"/>
+        <w:spacing w:line="360" w:lineRule="auto" w:after="120" w:before="0"/>
         <w:ind w:firstLine="709"/>
         <w:jc w:val="both"/>
       </w:pPr>
@@ -2379,7 +2379,7 @@
     </w:p>
     <w:p>
       <w:pPr>
-        <w:spacing w:line="360" w:lineRule="auto" w:after="0" w:before="0"/>
+        <w:spacing w:line="360" w:lineRule="auto" w:after="120" w:before="0"/>
         <w:ind w:firstLine="709"/>
         <w:jc w:val="both"/>
       </w:pPr>
@@ -2410,7 +2410,7 @@
     </w:p>
     <w:p>
       <w:pPr>
-        <w:spacing w:line="360" w:lineRule="auto" w:after="0" w:before="0"/>
+        <w:spacing w:line="360" w:lineRule="auto" w:after="120" w:before="0"/>
         <w:ind w:firstLine="709"/>
         <w:jc w:val="both"/>
       </w:pPr>
@@ -2571,7 +2571,7 @@
     </w:p>
     <w:p>
       <w:pPr>
-        <w:spacing w:line="360" w:lineRule="auto" w:after="0" w:before="0"/>
+        <w:spacing w:line="360" w:lineRule="auto" w:after="120" w:before="0"/>
         <w:ind w:firstLine="709"/>
         <w:jc w:val="both"/>
       </w:pPr>
@@ -2658,7 +2658,7 @@
     </w:p>
     <w:p>
       <w:pPr>
-        <w:spacing w:line="360" w:lineRule="auto" w:after="0" w:before="0"/>
+        <w:spacing w:line="360" w:lineRule="auto" w:after="120" w:before="0"/>
         <w:ind w:firstLine="0"/>
         <w:jc w:val="both"/>
       </w:pPr>
@@ -2753,7 +2753,7 @@
     </w:p>
     <w:p>
       <w:pPr>
-        <w:spacing w:line="360" w:lineRule="auto" w:after="0" w:before="0"/>
+        <w:spacing w:line="360" w:lineRule="auto" w:after="120" w:before="0"/>
         <w:ind w:firstLine="709"/>
         <w:jc w:val="both"/>
       </w:pPr>
@@ -2784,7 +2784,7 @@
     </w:p>
     <w:p>
       <w:pPr>
-        <w:spacing w:line="360" w:lineRule="auto" w:after="0" w:before="0"/>
+        <w:spacing w:line="360" w:lineRule="auto" w:after="120" w:before="0"/>
         <w:ind w:firstLine="709"/>
         <w:jc w:val="both"/>
       </w:pPr>
@@ -2998,7 +2998,7 @@
     </w:p>
     <w:p>
       <w:pPr>
-        <w:spacing w:line="360" w:lineRule="auto" w:after="0" w:before="0"/>
+        <w:spacing w:line="360" w:lineRule="auto" w:after="120" w:before="0"/>
         <w:ind w:firstLine="709"/>
         <w:jc w:val="both"/>
       </w:pPr>
@@ -3013,7 +3013,7 @@
     </w:p>
     <w:p>
       <w:pPr>
-        <w:spacing w:line="360" w:lineRule="auto" w:after="0" w:before="0"/>
+        <w:spacing w:line="360" w:lineRule="auto" w:after="120" w:before="0"/>
         <w:ind w:firstLine="709"/>
         <w:jc w:val="both"/>
       </w:pPr>
@@ -3028,7 +3028,7 @@
     </w:p>
     <w:p>
       <w:pPr>
-        <w:spacing w:line="360" w:lineRule="auto" w:after="0" w:before="0"/>
+        <w:spacing w:line="360" w:lineRule="auto" w:after="120" w:before="0"/>
         <w:ind w:firstLine="709"/>
         <w:jc w:val="both"/>
       </w:pPr>
@@ -3043,7 +3043,7 @@
     </w:p>
     <w:p>
       <w:pPr>
-        <w:spacing w:line="360" w:lineRule="auto" w:after="0" w:before="0"/>
+        <w:spacing w:line="360" w:lineRule="auto" w:after="120" w:before="0"/>
         <w:ind w:firstLine="709"/>
         <w:jc w:val="both"/>
       </w:pPr>
@@ -3058,7 +3058,7 @@
     </w:p>
     <w:p>
       <w:pPr>
-        <w:spacing w:line="360" w:lineRule="auto" w:after="0" w:before="0"/>
+        <w:spacing w:line="360" w:lineRule="auto" w:after="120" w:before="0"/>
         <w:ind w:firstLine="709"/>
         <w:jc w:val="both"/>
       </w:pPr>
@@ -3089,7 +3089,7 @@
     </w:p>
     <w:p>
       <w:pPr>
-        <w:spacing w:line="360" w:lineRule="auto" w:after="0" w:before="0"/>
+        <w:spacing w:line="360" w:lineRule="auto" w:after="120" w:before="0"/>
         <w:ind w:firstLine="709"/>
         <w:jc w:val="both"/>
       </w:pPr>
@@ -3220,7 +3220,7 @@
     </w:p>
     <w:p>
       <w:pPr>
-        <w:spacing w:line="360" w:lineRule="auto" w:after="0" w:before="0"/>
+        <w:spacing w:line="360" w:lineRule="auto" w:after="120" w:before="0"/>
         <w:ind w:firstLine="709"/>
         <w:jc w:val="both"/>
       </w:pPr>
@@ -3720,7 +3720,7 @@
     </w:p>
     <w:p>
       <w:pPr>
-        <w:spacing w:line="360" w:lineRule="auto" w:after="0" w:before="0"/>
+        <w:spacing w:line="360" w:lineRule="auto" w:after="120" w:before="0"/>
         <w:ind w:firstLine="709"/>
         <w:jc w:val="both"/>
       </w:pPr>
@@ -6335,7 +6335,7 @@
     </w:p>
     <w:p>
       <w:pPr>
-        <w:spacing w:line="360" w:lineRule="auto" w:after="0" w:before="0"/>
+        <w:spacing w:line="360" w:lineRule="auto" w:after="120" w:before="0"/>
         <w:ind w:firstLine="709"/>
         <w:jc w:val="both"/>
       </w:pPr>
@@ -6350,7 +6350,7 @@
     </w:p>
     <w:p>
       <w:pPr>
-        <w:spacing w:line="360" w:lineRule="auto" w:after="0" w:before="0"/>
+        <w:spacing w:line="360" w:lineRule="auto" w:after="120" w:before="0"/>
         <w:ind w:firstLine="709"/>
         <w:jc w:val="both"/>
       </w:pPr>
@@ -6386,7 +6386,7 @@
     </w:p>
     <w:p>
       <w:pPr>
-        <w:spacing w:line="360" w:lineRule="auto" w:after="0" w:before="0"/>
+        <w:spacing w:line="360" w:lineRule="auto" w:after="120" w:before="0"/>
         <w:ind w:firstLine="709"/>
         <w:jc w:val="both"/>
       </w:pPr>
@@ -6415,7 +6415,7 @@
     </w:p>
     <w:p>
       <w:pPr>
-        <w:spacing w:line="360" w:lineRule="auto" w:after="0" w:before="0"/>
+        <w:spacing w:line="360" w:lineRule="auto" w:after="120" w:before="0"/>
         <w:ind w:firstLine="709"/>
         <w:jc w:val="both"/>
       </w:pPr>
@@ -6430,7 +6430,7 @@
     </w:p>
     <w:p>
       <w:pPr>
-        <w:spacing w:line="360" w:lineRule="auto" w:after="0" w:before="0"/>
+        <w:spacing w:line="360" w:lineRule="auto" w:after="120" w:before="0"/>
         <w:ind w:firstLine="709"/>
         <w:jc w:val="both"/>
       </w:pPr>
@@ -6459,7 +6459,7 @@
     </w:p>
     <w:p>
       <w:pPr>
-        <w:spacing w:line="360" w:lineRule="auto" w:after="0" w:before="0"/>
+        <w:spacing w:line="360" w:lineRule="auto" w:after="120" w:before="0"/>
         <w:ind w:firstLine="709"/>
         <w:jc w:val="both"/>
       </w:pPr>
@@ -6474,7 +6474,7 @@
     </w:p>
     <w:p>
       <w:pPr>
-        <w:spacing w:line="360" w:lineRule="auto" w:after="0" w:before="0"/>
+        <w:spacing w:line="360" w:lineRule="auto" w:after="120" w:before="0"/>
         <w:ind w:firstLine="709"/>
         <w:jc w:val="both"/>
       </w:pPr>
@@ -6503,7 +6503,7 @@
     </w:p>
     <w:p>
       <w:pPr>
-        <w:spacing w:line="360" w:lineRule="auto" w:after="0" w:before="0"/>
+        <w:spacing w:line="360" w:lineRule="auto" w:after="120" w:before="0"/>
         <w:ind w:firstLine="709"/>
         <w:jc w:val="both"/>
       </w:pPr>
@@ -6518,7 +6518,7 @@
     </w:p>
     <w:p>
       <w:pPr>
-        <w:spacing w:line="360" w:lineRule="auto" w:after="0" w:before="0"/>
+        <w:spacing w:line="360" w:lineRule="auto" w:after="120" w:before="0"/>
         <w:ind w:firstLine="709"/>
         <w:jc w:val="both"/>
       </w:pPr>
@@ -6547,7 +6547,7 @@
     </w:p>
     <w:p>
       <w:pPr>
-        <w:spacing w:line="360" w:lineRule="auto" w:after="0" w:before="0"/>
+        <w:spacing w:line="360" w:lineRule="auto" w:after="120" w:before="0"/>
         <w:ind w:firstLine="709"/>
         <w:jc w:val="both"/>
       </w:pPr>
@@ -6562,7 +6562,7 @@
     </w:p>
     <w:p>
       <w:pPr>
-        <w:spacing w:line="360" w:lineRule="auto" w:after="0" w:before="0"/>
+        <w:spacing w:line="360" w:lineRule="auto" w:after="120" w:before="0"/>
         <w:ind w:firstLine="709"/>
         <w:jc w:val="both"/>
       </w:pPr>
@@ -6591,7 +6591,7 @@
     </w:p>
     <w:p>
       <w:pPr>
-        <w:spacing w:line="360" w:lineRule="auto" w:after="0" w:before="0"/>
+        <w:spacing w:line="360" w:lineRule="auto" w:after="120" w:before="0"/>
         <w:ind w:firstLine="709"/>
         <w:jc w:val="both"/>
       </w:pPr>
@@ -6606,7 +6606,7 @@
     </w:p>
     <w:p>
       <w:pPr>
-        <w:spacing w:line="360" w:lineRule="auto" w:after="0" w:before="0"/>
+        <w:spacing w:line="360" w:lineRule="auto" w:after="120" w:before="0"/>
         <w:ind w:firstLine="709"/>
         <w:jc w:val="both"/>
       </w:pPr>
@@ -6692,7 +6692,7 @@
     </w:p>
     <w:p>
       <w:pPr>
-        <w:spacing w:line="360" w:lineRule="auto" w:after="0" w:before="0"/>
+        <w:spacing w:line="360" w:lineRule="auto" w:after="120" w:before="0"/>
         <w:ind w:firstLine="709"/>
         <w:jc w:val="both"/>
       </w:pPr>

</xml_diff>

<commit_message>
Agregar modo borrador3 (sin Cap III+IV+V); fix anexos con lista vacia
</commit_message>
<xml_diff>
--- a/amaal/reportes/Informe_Pasantia_IUTECP.docx
+++ b/amaal/reportes/Informe_Pasantia_IUTECP.docx
@@ -418,7 +418,7 @@
     </w:p>
     <w:p>
       <w:pPr>
-        <w:spacing w:line="360" w:lineRule="auto" w:after="120" w:before="0"/>
+        <w:spacing w:line="360" w:lineRule="auto" w:after="0" w:before="0"/>
         <w:ind w:firstLine="709"/>
         <w:jc w:val="both"/>
       </w:pPr>
@@ -474,7 +474,7 @@
     </w:p>
     <w:p>
       <w:pPr>
-        <w:spacing w:line="360" w:lineRule="auto" w:after="120" w:before="0"/>
+        <w:spacing w:line="360" w:lineRule="auto" w:after="0" w:before="0"/>
         <w:ind w:firstLine="709"/>
         <w:jc w:val="both"/>
       </w:pPr>
@@ -2085,7 +2085,7 @@
     </w:p>
     <w:p>
       <w:pPr>
-        <w:spacing w:line="360" w:lineRule="auto" w:after="120" w:before="0"/>
+        <w:spacing w:line="360" w:lineRule="auto" w:after="0" w:before="0"/>
         <w:ind w:firstLine="709"/>
         <w:jc w:val="both"/>
       </w:pPr>
@@ -2156,7 +2156,7 @@
     </w:p>
     <w:p>
       <w:pPr>
-        <w:spacing w:line="360" w:lineRule="auto" w:after="120" w:before="0"/>
+        <w:spacing w:line="360" w:lineRule="auto" w:after="0" w:before="0"/>
         <w:ind w:firstLine="709"/>
         <w:jc w:val="both"/>
       </w:pPr>
@@ -2256,7 +2256,7 @@
     </w:p>
     <w:p>
       <w:pPr>
-        <w:spacing w:line="360" w:lineRule="auto" w:after="120" w:before="0"/>
+        <w:spacing w:line="360" w:lineRule="auto" w:after="0" w:before="0"/>
         <w:ind w:firstLine="0"/>
         <w:jc w:val="both"/>
       </w:pPr>
@@ -2287,7 +2287,7 @@
     </w:p>
     <w:p>
       <w:pPr>
-        <w:spacing w:line="360" w:lineRule="auto" w:after="120" w:before="0"/>
+        <w:spacing w:line="360" w:lineRule="auto" w:after="0" w:before="0"/>
         <w:ind w:firstLine="709"/>
         <w:jc w:val="both"/>
       </w:pPr>
@@ -2302,7 +2302,7 @@
     </w:p>
     <w:p>
       <w:pPr>
-        <w:spacing w:line="360" w:lineRule="auto" w:after="120" w:before="0"/>
+        <w:spacing w:line="360" w:lineRule="auto" w:after="0" w:before="0"/>
         <w:ind w:firstLine="709"/>
         <w:jc w:val="both"/>
       </w:pPr>
@@ -2317,7 +2317,7 @@
     </w:p>
     <w:p>
       <w:pPr>
-        <w:spacing w:line="360" w:lineRule="auto" w:after="120" w:before="0"/>
+        <w:spacing w:line="360" w:lineRule="auto" w:after="0" w:before="0"/>
         <w:ind w:firstLine="709"/>
         <w:jc w:val="both"/>
       </w:pPr>
@@ -2348,7 +2348,7 @@
     </w:p>
     <w:p>
       <w:pPr>
-        <w:spacing w:line="360" w:lineRule="auto" w:after="120" w:before="0"/>
+        <w:spacing w:line="360" w:lineRule="auto" w:after="0" w:before="0"/>
         <w:ind w:firstLine="709"/>
         <w:jc w:val="both"/>
       </w:pPr>
@@ -2379,7 +2379,7 @@
     </w:p>
     <w:p>
       <w:pPr>
-        <w:spacing w:line="360" w:lineRule="auto" w:after="120" w:before="0"/>
+        <w:spacing w:line="360" w:lineRule="auto" w:after="0" w:before="0"/>
         <w:ind w:firstLine="709"/>
         <w:jc w:val="both"/>
       </w:pPr>
@@ -2410,7 +2410,7 @@
     </w:p>
     <w:p>
       <w:pPr>
-        <w:spacing w:line="360" w:lineRule="auto" w:after="120" w:before="0"/>
+        <w:spacing w:line="360" w:lineRule="auto" w:after="0" w:before="0"/>
         <w:ind w:firstLine="709"/>
         <w:jc w:val="both"/>
       </w:pPr>
@@ -2571,7 +2571,7 @@
     </w:p>
     <w:p>
       <w:pPr>
-        <w:spacing w:line="360" w:lineRule="auto" w:after="120" w:before="0"/>
+        <w:spacing w:line="360" w:lineRule="auto" w:after="0" w:before="0"/>
         <w:ind w:firstLine="709"/>
         <w:jc w:val="both"/>
       </w:pPr>
@@ -2658,7 +2658,7 @@
     </w:p>
     <w:p>
       <w:pPr>
-        <w:spacing w:line="360" w:lineRule="auto" w:after="120" w:before="0"/>
+        <w:spacing w:line="360" w:lineRule="auto" w:after="0" w:before="0"/>
         <w:ind w:firstLine="0"/>
         <w:jc w:val="both"/>
       </w:pPr>
@@ -2753,7 +2753,7 @@
     </w:p>
     <w:p>
       <w:pPr>
-        <w:spacing w:line="360" w:lineRule="auto" w:after="120" w:before="0"/>
+        <w:spacing w:line="360" w:lineRule="auto" w:after="0" w:before="0"/>
         <w:ind w:firstLine="709"/>
         <w:jc w:val="both"/>
       </w:pPr>
@@ -2784,7 +2784,7 @@
     </w:p>
     <w:p>
       <w:pPr>
-        <w:spacing w:line="360" w:lineRule="auto" w:after="120" w:before="0"/>
+        <w:spacing w:line="360" w:lineRule="auto" w:after="0" w:before="0"/>
         <w:ind w:firstLine="709"/>
         <w:jc w:val="both"/>
       </w:pPr>
@@ -2998,7 +2998,7 @@
     </w:p>
     <w:p>
       <w:pPr>
-        <w:spacing w:line="360" w:lineRule="auto" w:after="120" w:before="0"/>
+        <w:spacing w:line="360" w:lineRule="auto" w:after="0" w:before="0"/>
         <w:ind w:firstLine="709"/>
         <w:jc w:val="both"/>
       </w:pPr>
@@ -3013,7 +3013,7 @@
     </w:p>
     <w:p>
       <w:pPr>
-        <w:spacing w:line="360" w:lineRule="auto" w:after="120" w:before="0"/>
+        <w:spacing w:line="360" w:lineRule="auto" w:after="0" w:before="0"/>
         <w:ind w:firstLine="709"/>
         <w:jc w:val="both"/>
       </w:pPr>
@@ -3028,7 +3028,7 @@
     </w:p>
     <w:p>
       <w:pPr>
-        <w:spacing w:line="360" w:lineRule="auto" w:after="120" w:before="0"/>
+        <w:spacing w:line="360" w:lineRule="auto" w:after="0" w:before="0"/>
         <w:ind w:firstLine="709"/>
         <w:jc w:val="both"/>
       </w:pPr>
@@ -3043,7 +3043,7 @@
     </w:p>
     <w:p>
       <w:pPr>
-        <w:spacing w:line="360" w:lineRule="auto" w:after="120" w:before="0"/>
+        <w:spacing w:line="360" w:lineRule="auto" w:after="0" w:before="0"/>
         <w:ind w:firstLine="709"/>
         <w:jc w:val="both"/>
       </w:pPr>
@@ -3058,7 +3058,7 @@
     </w:p>
     <w:p>
       <w:pPr>
-        <w:spacing w:line="360" w:lineRule="auto" w:after="120" w:before="0"/>
+        <w:spacing w:line="360" w:lineRule="auto" w:after="0" w:before="0"/>
         <w:ind w:firstLine="709"/>
         <w:jc w:val="both"/>
       </w:pPr>
@@ -3089,7 +3089,7 @@
     </w:p>
     <w:p>
       <w:pPr>
-        <w:spacing w:line="360" w:lineRule="auto" w:after="120" w:before="0"/>
+        <w:spacing w:line="360" w:lineRule="auto" w:after="0" w:before="0"/>
         <w:ind w:firstLine="709"/>
         <w:jc w:val="both"/>
       </w:pPr>
@@ -3220,7 +3220,7 @@
     </w:p>
     <w:p>
       <w:pPr>
-        <w:spacing w:line="360" w:lineRule="auto" w:after="120" w:before="0"/>
+        <w:spacing w:line="360" w:lineRule="auto" w:after="0" w:before="0"/>
         <w:ind w:firstLine="709"/>
         <w:jc w:val="both"/>
       </w:pPr>
@@ -3720,7 +3720,7 @@
     </w:p>
     <w:p>
       <w:pPr>
-        <w:spacing w:line="360" w:lineRule="auto" w:after="120" w:before="0"/>
+        <w:spacing w:line="360" w:lineRule="auto" w:after="0" w:before="0"/>
         <w:ind w:firstLine="709"/>
         <w:jc w:val="both"/>
       </w:pPr>
@@ -6335,7 +6335,7 @@
     </w:p>
     <w:p>
       <w:pPr>
-        <w:spacing w:line="360" w:lineRule="auto" w:after="120" w:before="0"/>
+        <w:spacing w:line="360" w:lineRule="auto" w:after="0" w:before="0"/>
         <w:ind w:firstLine="709"/>
         <w:jc w:val="both"/>
       </w:pPr>
@@ -6350,7 +6350,7 @@
     </w:p>
     <w:p>
       <w:pPr>
-        <w:spacing w:line="360" w:lineRule="auto" w:after="120" w:before="0"/>
+        <w:spacing w:line="360" w:lineRule="auto" w:after="0" w:before="0"/>
         <w:ind w:firstLine="709"/>
         <w:jc w:val="both"/>
       </w:pPr>
@@ -6386,7 +6386,7 @@
     </w:p>
     <w:p>
       <w:pPr>
-        <w:spacing w:line="360" w:lineRule="auto" w:after="120" w:before="0"/>
+        <w:spacing w:line="360" w:lineRule="auto" w:after="0" w:before="0"/>
         <w:ind w:firstLine="709"/>
         <w:jc w:val="both"/>
       </w:pPr>
@@ -6415,7 +6415,7 @@
     </w:p>
     <w:p>
       <w:pPr>
-        <w:spacing w:line="360" w:lineRule="auto" w:after="120" w:before="0"/>
+        <w:spacing w:line="360" w:lineRule="auto" w:after="0" w:before="0"/>
         <w:ind w:firstLine="709"/>
         <w:jc w:val="both"/>
       </w:pPr>
@@ -6430,7 +6430,7 @@
     </w:p>
     <w:p>
       <w:pPr>
-        <w:spacing w:line="360" w:lineRule="auto" w:after="120" w:before="0"/>
+        <w:spacing w:line="360" w:lineRule="auto" w:after="0" w:before="0"/>
         <w:ind w:firstLine="709"/>
         <w:jc w:val="both"/>
       </w:pPr>
@@ -6459,7 +6459,7 @@
     </w:p>
     <w:p>
       <w:pPr>
-        <w:spacing w:line="360" w:lineRule="auto" w:after="120" w:before="0"/>
+        <w:spacing w:line="360" w:lineRule="auto" w:after="0" w:before="0"/>
         <w:ind w:firstLine="709"/>
         <w:jc w:val="both"/>
       </w:pPr>
@@ -6474,7 +6474,7 @@
     </w:p>
     <w:p>
       <w:pPr>
-        <w:spacing w:line="360" w:lineRule="auto" w:after="120" w:before="0"/>
+        <w:spacing w:line="360" w:lineRule="auto" w:after="0" w:before="0"/>
         <w:ind w:firstLine="709"/>
         <w:jc w:val="both"/>
       </w:pPr>
@@ -6503,7 +6503,7 @@
     </w:p>
     <w:p>
       <w:pPr>
-        <w:spacing w:line="360" w:lineRule="auto" w:after="120" w:before="0"/>
+        <w:spacing w:line="360" w:lineRule="auto" w:after="0" w:before="0"/>
         <w:ind w:firstLine="709"/>
         <w:jc w:val="both"/>
       </w:pPr>
@@ -6518,7 +6518,7 @@
     </w:p>
     <w:p>
       <w:pPr>
-        <w:spacing w:line="360" w:lineRule="auto" w:after="120" w:before="0"/>
+        <w:spacing w:line="360" w:lineRule="auto" w:after="0" w:before="0"/>
         <w:ind w:firstLine="709"/>
         <w:jc w:val="both"/>
       </w:pPr>
@@ -6547,7 +6547,7 @@
     </w:p>
     <w:p>
       <w:pPr>
-        <w:spacing w:line="360" w:lineRule="auto" w:after="120" w:before="0"/>
+        <w:spacing w:line="360" w:lineRule="auto" w:after="0" w:before="0"/>
         <w:ind w:firstLine="709"/>
         <w:jc w:val="both"/>
       </w:pPr>
@@ -6562,7 +6562,7 @@
     </w:p>
     <w:p>
       <w:pPr>
-        <w:spacing w:line="360" w:lineRule="auto" w:after="120" w:before="0"/>
+        <w:spacing w:line="360" w:lineRule="auto" w:after="0" w:before="0"/>
         <w:ind w:firstLine="709"/>
         <w:jc w:val="both"/>
       </w:pPr>
@@ -6591,7 +6591,7 @@
     </w:p>
     <w:p>
       <w:pPr>
-        <w:spacing w:line="360" w:lineRule="auto" w:after="120" w:before="0"/>
+        <w:spacing w:line="360" w:lineRule="auto" w:after="0" w:before="0"/>
         <w:ind w:firstLine="709"/>
         <w:jc w:val="both"/>
       </w:pPr>
@@ -6606,7 +6606,7 @@
     </w:p>
     <w:p>
       <w:pPr>
-        <w:spacing w:line="360" w:lineRule="auto" w:after="120" w:before="0"/>
+        <w:spacing w:line="360" w:lineRule="auto" w:after="0" w:before="0"/>
         <w:ind w:firstLine="709"/>
         <w:jc w:val="both"/>
       </w:pPr>
@@ -6692,7 +6692,7 @@
     </w:p>
     <w:p>
       <w:pPr>
-        <w:spacing w:line="360" w:lineRule="auto" w:after="120" w:before="0"/>
+        <w:spacing w:line="360" w:lineRule="auto" w:after="0" w:before="0"/>
         <w:ind w:firstLine="709"/>
         <w:jc w:val="both"/>
       </w:pPr>

</xml_diff>

<commit_message>
Keidy: firmas y sello en cronogramas desde imagenes/
</commit_message>
<xml_diff>
--- a/amaal/reportes/Informe_Pasantia_IUTECP.docx
+++ b/amaal/reportes/Informe_Pasantia_IUTECP.docx
@@ -3265,15 +3265,16 @@
         <w:tblLayout w:type="fixed"/>
       </w:tblPr>
       <w:tblGrid>
-        <w:gridCol w:w="2551"/>
-        <w:gridCol w:w="2551"/>
-        <w:gridCol w:w="1701"/>
-        <w:gridCol w:w="1984"/>
+        <w:gridCol w:w="1644"/>
+        <w:gridCol w:w="1644"/>
+        <w:gridCol w:w="1644"/>
+        <w:gridCol w:w="1644"/>
+        <w:gridCol w:w="1695"/>
       </w:tblGrid>
       <w:tr>
         <w:tc>
           <w:tcPr>
-            <w:tcW w:w="2551" w:type="dxa"/>
+            <w:tcW w:w="1644" w:type="dxa"/>
             <w:shd w:val="clear" w:color="auto" w:fill="4472C4"/>
           </w:tcPr>
           <w:p>
@@ -3288,13 +3289,34 @@
                 <w:color w:val="FFFFFF"/>
                 <w:sz w:val="20"/>
               </w:rPr>
-              <w:t>Objetivo Específico</w:t>
+              <w:t>Objetivo</w:t>
             </w:r>
           </w:p>
         </w:tc>
         <w:tc>
           <w:tcPr>
-            <w:tcW w:w="2551" w:type="dxa"/>
+            <w:tcW w:w="1644" w:type="dxa"/>
+            <w:shd w:val="clear" w:color="auto" w:fill="4472C4"/>
+          </w:tcPr>
+          <w:p>
+            <w:pPr>
+              <w:spacing w:before="60" w:after="60" w:line="240" w:lineRule="auto"/>
+              <w:jc w:val="center"/>
+            </w:pPr>
+            <w:r>
+              <w:rPr>
+                <w:rFonts w:ascii="Times New Roman" w:hAnsi="Times New Roman"/>
+                <w:b/>
+                <w:color w:val="FFFFFF"/>
+                <w:sz w:val="20"/>
+              </w:rPr>
+              <w:t>Variable</w:t>
+            </w:r>
+          </w:p>
+        </w:tc>
+        <w:tc>
+          <w:tcPr>
+            <w:tcW w:w="1644" w:type="dxa"/>
             <w:shd w:val="clear" w:color="auto" w:fill="4472C4"/>
           </w:tcPr>
           <w:p>
@@ -3315,7 +3337,7 @@
         </w:tc>
         <w:tc>
           <w:tcPr>
-            <w:tcW w:w="1701" w:type="dxa"/>
+            <w:tcW w:w="1644" w:type="dxa"/>
             <w:shd w:val="clear" w:color="auto" w:fill="4472C4"/>
           </w:tcPr>
           <w:p>
@@ -3330,13 +3352,13 @@
                 <w:color w:val="FFFFFF"/>
                 <w:sz w:val="20"/>
               </w:rPr>
-              <w:t>Recursos</w:t>
+              <w:t>Técnica</w:t>
             </w:r>
           </w:p>
         </w:tc>
         <w:tc>
           <w:tcPr>
-            <w:tcW w:w="1984" w:type="dxa"/>
+            <w:tcW w:w="1695" w:type="dxa"/>
             <w:shd w:val="clear" w:color="auto" w:fill="4472C4"/>
           </w:tcPr>
           <w:p>
@@ -3351,7 +3373,7 @@
                 <w:color w:val="FFFFFF"/>
                 <w:sz w:val="20"/>
               </w:rPr>
-              <w:t>Indicadores de Logro</w:t>
+              <w:t>Instrumento</w:t>
             </w:r>
           </w:p>
         </w:tc>
@@ -3359,7 +3381,7 @@
       <w:tr>
         <w:tc>
           <w:tcPr>
-            <w:tcW w:w="2551" w:type="dxa"/>
+            <w:tcW w:w="1644" w:type="dxa"/>
             <w:shd w:val="clear" w:color="auto" w:fill="FFFFFF"/>
           </w:tcPr>
           <w:p>
@@ -3380,7 +3402,7 @@
         </w:tc>
         <w:tc>
           <w:tcPr>
-            <w:tcW w:w="2551" w:type="dxa"/>
+            <w:tcW w:w="1644" w:type="dxa"/>
             <w:shd w:val="clear" w:color="auto" w:fill="FFFFFF"/>
           </w:tcPr>
           <w:p>
@@ -3401,7 +3423,7 @@
         </w:tc>
         <w:tc>
           <w:tcPr>
-            <w:tcW w:w="1701" w:type="dxa"/>
+            <w:tcW w:w="1644" w:type="dxa"/>
             <w:shd w:val="clear" w:color="auto" w:fill="FFFFFF"/>
           </w:tcPr>
           <w:p>
@@ -3422,7 +3444,7 @@
         </w:tc>
         <w:tc>
           <w:tcPr>
-            <w:tcW w:w="1984" w:type="dxa"/>
+            <w:tcW w:w="1644" w:type="dxa"/>
             <w:shd w:val="clear" w:color="auto" w:fill="FFFFFF"/>
           </w:tcPr>
           <w:p>
@@ -3441,11 +3463,31 @@
             </w:r>
           </w:p>
         </w:tc>
+        <w:tc>
+          <w:tcPr>
+            <w:tcW w:w="1695" w:type="dxa"/>
+            <w:shd w:val="clear" w:color="auto" w:fill="FFFFFF"/>
+          </w:tcPr>
+          <w:p>
+            <w:pPr>
+              <w:spacing w:before="60" w:after="60" w:line="240" w:lineRule="auto"/>
+              <w:jc w:val="both"/>
+            </w:pPr>
+            <w:r>
+              <w:rPr>
+                <w:rFonts w:ascii="Times New Roman" w:hAnsi="Times New Roman"/>
+                <w:b w:val="0"/>
+                <w:color w:val="000000"/>
+                <w:sz w:val="20"/>
+              </w:rPr>
+            </w:r>
+          </w:p>
+        </w:tc>
       </w:tr>
       <w:tr>
         <w:tc>
           <w:tcPr>
-            <w:tcW w:w="2551" w:type="dxa"/>
+            <w:tcW w:w="1644" w:type="dxa"/>
             <w:shd w:val="clear" w:color="auto" w:fill="D9E1F2"/>
           </w:tcPr>
           <w:p>
@@ -3466,7 +3508,7 @@
         </w:tc>
         <w:tc>
           <w:tcPr>
-            <w:tcW w:w="2551" w:type="dxa"/>
+            <w:tcW w:w="1644" w:type="dxa"/>
             <w:shd w:val="clear" w:color="auto" w:fill="D9E1F2"/>
           </w:tcPr>
           <w:p>
@@ -3487,7 +3529,7 @@
         </w:tc>
         <w:tc>
           <w:tcPr>
-            <w:tcW w:w="1701" w:type="dxa"/>
+            <w:tcW w:w="1644" w:type="dxa"/>
             <w:shd w:val="clear" w:color="auto" w:fill="D9E1F2"/>
           </w:tcPr>
           <w:p>
@@ -3508,7 +3550,7 @@
         </w:tc>
         <w:tc>
           <w:tcPr>
-            <w:tcW w:w="1984" w:type="dxa"/>
+            <w:tcW w:w="1644" w:type="dxa"/>
             <w:shd w:val="clear" w:color="auto" w:fill="D9E1F2"/>
           </w:tcPr>
           <w:p>
@@ -3527,11 +3569,31 @@
             </w:r>
           </w:p>
         </w:tc>
+        <w:tc>
+          <w:tcPr>
+            <w:tcW w:w="1695" w:type="dxa"/>
+            <w:shd w:val="clear" w:color="auto" w:fill="D9E1F2"/>
+          </w:tcPr>
+          <w:p>
+            <w:pPr>
+              <w:spacing w:before="60" w:after="60" w:line="240" w:lineRule="auto"/>
+              <w:jc w:val="both"/>
+            </w:pPr>
+            <w:r>
+              <w:rPr>
+                <w:rFonts w:ascii="Times New Roman" w:hAnsi="Times New Roman"/>
+                <w:b w:val="0"/>
+                <w:color w:val="000000"/>
+                <w:sz w:val="20"/>
+              </w:rPr>
+            </w:r>
+          </w:p>
+        </w:tc>
       </w:tr>
       <w:tr>
         <w:tc>
           <w:tcPr>
-            <w:tcW w:w="2551" w:type="dxa"/>
+            <w:tcW w:w="1644" w:type="dxa"/>
             <w:shd w:val="clear" w:color="auto" w:fill="FFFFFF"/>
           </w:tcPr>
           <w:p>
@@ -3552,7 +3614,7 @@
         </w:tc>
         <w:tc>
           <w:tcPr>
-            <w:tcW w:w="2551" w:type="dxa"/>
+            <w:tcW w:w="1644" w:type="dxa"/>
             <w:shd w:val="clear" w:color="auto" w:fill="FFFFFF"/>
           </w:tcPr>
           <w:p>
@@ -3573,7 +3635,7 @@
         </w:tc>
         <w:tc>
           <w:tcPr>
-            <w:tcW w:w="1701" w:type="dxa"/>
+            <w:tcW w:w="1644" w:type="dxa"/>
             <w:shd w:val="clear" w:color="auto" w:fill="FFFFFF"/>
           </w:tcPr>
           <w:p>
@@ -3594,7 +3656,7 @@
         </w:tc>
         <w:tc>
           <w:tcPr>
-            <w:tcW w:w="1984" w:type="dxa"/>
+            <w:tcW w:w="1644" w:type="dxa"/>
             <w:shd w:val="clear" w:color="auto" w:fill="FFFFFF"/>
           </w:tcPr>
           <w:p>
@@ -3613,11 +3675,31 @@
             </w:r>
           </w:p>
         </w:tc>
+        <w:tc>
+          <w:tcPr>
+            <w:tcW w:w="1695" w:type="dxa"/>
+            <w:shd w:val="clear" w:color="auto" w:fill="FFFFFF"/>
+          </w:tcPr>
+          <w:p>
+            <w:pPr>
+              <w:spacing w:before="60" w:after="60" w:line="240" w:lineRule="auto"/>
+              <w:jc w:val="both"/>
+            </w:pPr>
+            <w:r>
+              <w:rPr>
+                <w:rFonts w:ascii="Times New Roman" w:hAnsi="Times New Roman"/>
+                <w:b w:val="0"/>
+                <w:color w:val="000000"/>
+                <w:sz w:val="20"/>
+              </w:rPr>
+            </w:r>
+          </w:p>
+        </w:tc>
       </w:tr>
       <w:tr>
         <w:tc>
           <w:tcPr>
-            <w:tcW w:w="2551" w:type="dxa"/>
+            <w:tcW w:w="1644" w:type="dxa"/>
             <w:shd w:val="clear" w:color="auto" w:fill="D9E1F2"/>
           </w:tcPr>
           <w:p>
@@ -3638,7 +3720,7 @@
         </w:tc>
         <w:tc>
           <w:tcPr>
-            <w:tcW w:w="2551" w:type="dxa"/>
+            <w:tcW w:w="1644" w:type="dxa"/>
             <w:shd w:val="clear" w:color="auto" w:fill="D9E1F2"/>
           </w:tcPr>
           <w:p>
@@ -3659,7 +3741,7 @@
         </w:tc>
         <w:tc>
           <w:tcPr>
-            <w:tcW w:w="1701" w:type="dxa"/>
+            <w:tcW w:w="1644" w:type="dxa"/>
             <w:shd w:val="clear" w:color="auto" w:fill="D9E1F2"/>
           </w:tcPr>
           <w:p>
@@ -3680,7 +3762,7 @@
         </w:tc>
         <w:tc>
           <w:tcPr>
-            <w:tcW w:w="1984" w:type="dxa"/>
+            <w:tcW w:w="1644" w:type="dxa"/>
             <w:shd w:val="clear" w:color="auto" w:fill="D9E1F2"/>
           </w:tcPr>
           <w:p>
@@ -3696,6 +3778,26 @@
                 <w:sz w:val="20"/>
               </w:rPr>
               <w:t>Propuesta de mejora procedimental formulada.</w:t>
+            </w:r>
+          </w:p>
+        </w:tc>
+        <w:tc>
+          <w:tcPr>
+            <w:tcW w:w="1695" w:type="dxa"/>
+            <w:shd w:val="clear" w:color="auto" w:fill="D9E1F2"/>
+          </w:tcPr>
+          <w:p>
+            <w:pPr>
+              <w:spacing w:before="60" w:after="60" w:line="240" w:lineRule="auto"/>
+              <w:jc w:val="both"/>
+            </w:pPr>
+            <w:r>
+              <w:rPr>
+                <w:rFonts w:ascii="Times New Roman" w:hAnsi="Times New Roman"/>
+                <w:b w:val="0"/>
+                <w:color w:val="000000"/>
+                <w:sz w:val="20"/>
+              </w:rPr>
             </w:r>
           </w:p>
         </w:tc>
@@ -3795,7 +3897,96 @@
                 <w:color w:val="FFFFFF"/>
                 <w:sz w:val="20"/>
               </w:rPr>
-              <w:t>Actividades Administrativas</w:t>
+              <w:t>Semana</w:t>
+            </w:r>
+          </w:p>
+        </w:tc>
+        <w:tc>
+          <w:tcPr>
+            <w:tcW w:w="2092" w:type="dxa"/>
+            <w:gridSpan w:val="4"/>
+            <w:shd w:val="clear" w:color="auto" w:fill="4472C4"/>
+          </w:tcPr>
+          <w:p>
+            <w:pPr>
+              <w:spacing w:before="60" w:after="60" w:line="240" w:lineRule="auto"/>
+              <w:jc w:val="center"/>
+            </w:pPr>
+            <w:r>
+              <w:rPr>
+                <w:rFonts w:ascii="Times New Roman" w:hAnsi="Times New Roman"/>
+                <w:b/>
+                <w:color w:val="FFFFFF"/>
+                <w:sz w:val="20"/>
+              </w:rPr>
+              <w:t>JUNIO</w:t>
+            </w:r>
+          </w:p>
+        </w:tc>
+        <w:tc>
+          <w:tcPr>
+            <w:tcW w:w="2092" w:type="dxa"/>
+            <w:gridSpan w:val="4"/>
+            <w:shd w:val="clear" w:color="auto" w:fill="4472C4"/>
+          </w:tcPr>
+          <w:p>
+            <w:pPr>
+              <w:spacing w:before="60" w:after="60" w:line="240" w:lineRule="auto"/>
+              <w:jc w:val="center"/>
+            </w:pPr>
+            <w:r>
+              <w:rPr>
+                <w:rFonts w:ascii="Times New Roman" w:hAnsi="Times New Roman"/>
+                <w:b/>
+                <w:color w:val="FFFFFF"/>
+                <w:sz w:val="20"/>
+              </w:rPr>
+              <w:t>JULIO</w:t>
+            </w:r>
+          </w:p>
+        </w:tc>
+        <w:tc>
+          <w:tcPr>
+            <w:tcW w:w="1046" w:type="dxa"/>
+            <w:gridSpan w:val="2"/>
+            <w:shd w:val="clear" w:color="auto" w:fill="4472C4"/>
+          </w:tcPr>
+          <w:p>
+            <w:pPr>
+              <w:spacing w:before="60" w:after="60" w:line="240" w:lineRule="auto"/>
+              <w:jc w:val="center"/>
+            </w:pPr>
+            <w:r>
+              <w:rPr>
+                <w:rFonts w:ascii="Times New Roman" w:hAnsi="Times New Roman"/>
+                <w:b/>
+                <w:color w:val="FFFFFF"/>
+                <w:sz w:val="20"/>
+              </w:rPr>
+              <w:t>AGOSTO</w:t>
+            </w:r>
+          </w:p>
+        </w:tc>
+      </w:tr>
+      <w:tr>
+        <w:tc>
+          <w:tcPr>
+            <w:tcW w:w="3033" w:type="dxa"/>
+            <w:shd w:val="clear" w:color="auto" w:fill="4472C4"/>
+          </w:tcPr>
+          <w:p>
+            <w:pPr>
+              <w:spacing w:before="60" w:after="60" w:line="240" w:lineRule="auto"/>
+              <w:jc w:val="center"/>
+            </w:pPr>
+            <w:r>
+              <w:rPr>
+                <w:rFonts w:ascii="Times New Roman" w:hAnsi="Times New Roman"/>
+                <w:b/>
+                <w:color w:val="FFFFFF"/>
+                <w:sz w:val="20"/>
+              </w:rPr>
+              <w:t>Actividad</w:t>
             </w:r>
           </w:p>
         </w:tc>
@@ -3816,7 +4007,7 @@
                 <w:color w:val="FFFFFF"/>
                 <w:sz w:val="18"/>
               </w:rPr>
-              <w:t>S1</w:t>
+              <w:t>1</w:t>
             </w:r>
           </w:p>
         </w:tc>
@@ -3837,7 +4028,7 @@
                 <w:color w:val="FFFFFF"/>
                 <w:sz w:val="18"/>
               </w:rPr>
-              <w:t>S2</w:t>
+              <w:t>2</w:t>
             </w:r>
           </w:p>
         </w:tc>
@@ -3858,7 +4049,7 @@
                 <w:color w:val="FFFFFF"/>
                 <w:sz w:val="18"/>
               </w:rPr>
-              <w:t>S3</w:t>
+              <w:t>3</w:t>
             </w:r>
           </w:p>
         </w:tc>
@@ -3879,7 +4070,7 @@
                 <w:color w:val="FFFFFF"/>
                 <w:sz w:val="18"/>
               </w:rPr>
-              <w:t>S4</w:t>
+              <w:t>4</w:t>
             </w:r>
           </w:p>
         </w:tc>
@@ -3900,7 +4091,7 @@
                 <w:color w:val="FFFFFF"/>
                 <w:sz w:val="18"/>
               </w:rPr>
-              <w:t>S5</w:t>
+              <w:t>1</w:t>
             </w:r>
           </w:p>
         </w:tc>
@@ -3921,7 +4112,7 @@
                 <w:color w:val="FFFFFF"/>
                 <w:sz w:val="18"/>
               </w:rPr>
-              <w:t>S6</w:t>
+              <w:t>2</w:t>
             </w:r>
           </w:p>
         </w:tc>
@@ -3942,7 +4133,7 @@
                 <w:color w:val="FFFFFF"/>
                 <w:sz w:val="18"/>
               </w:rPr>
-              <w:t>S7</w:t>
+              <w:t>3</w:t>
             </w:r>
           </w:p>
         </w:tc>
@@ -3963,7 +4154,7 @@
                 <w:color w:val="FFFFFF"/>
                 <w:sz w:val="18"/>
               </w:rPr>
-              <w:t>S8</w:t>
+              <w:t>4</w:t>
             </w:r>
           </w:p>
         </w:tc>
@@ -3984,7 +4175,7 @@
                 <w:color w:val="FFFFFF"/>
                 <w:sz w:val="18"/>
               </w:rPr>
-              <w:t>S9</w:t>
+              <w:t>1</w:t>
             </w:r>
           </w:p>
         </w:tc>
@@ -4005,7 +4196,231 @@
                 <w:color w:val="FFFFFF"/>
                 <w:sz w:val="18"/>
               </w:rPr>
-              <w:t>S10</w:t>
+              <w:t>2</w:t>
+            </w:r>
+          </w:p>
+        </w:tc>
+      </w:tr>
+      <w:tr>
+        <w:tc>
+          <w:tcPr>
+            <w:tcW w:w="3033" w:type="dxa"/>
+            <w:shd w:val="clear" w:color="auto" w:fill="D9E1F2"/>
+          </w:tcPr>
+          <w:p>
+            <w:pPr>
+              <w:spacing w:before="60" w:after="60" w:line="240" w:lineRule="auto"/>
+              <w:jc w:val="both"/>
+            </w:pPr>
+            <w:r>
+              <w:rPr>
+                <w:rFonts w:ascii="Times New Roman" w:hAnsi="Times New Roman"/>
+                <w:b w:val="0"/>
+                <w:color w:val="000000"/>
+                <w:sz w:val="20"/>
+              </w:rPr>
+              <w:t>Inducción y reconocimiento del área de trabajo.</w:t>
+            </w:r>
+          </w:p>
+        </w:tc>
+        <w:tc>
+          <w:tcPr>
+            <w:tcW w:w="523" w:type="dxa"/>
+            <w:shd w:val="clear" w:color="auto" w:fill="70AD47"/>
+          </w:tcPr>
+          <w:p>
+            <w:pPr>
+              <w:spacing w:before="60" w:after="60" w:line="240" w:lineRule="auto"/>
+              <w:jc w:val="center"/>
+            </w:pPr>
+            <w:r>
+              <w:rPr>
+                <w:rFonts w:ascii="Times New Roman" w:hAnsi="Times New Roman"/>
+                <w:b w:val="0"/>
+                <w:color w:val="FFFFFF"/>
+                <w:sz w:val="18"/>
+              </w:rPr>
+              <w:t>✓</w:t>
+            </w:r>
+          </w:p>
+        </w:tc>
+        <w:tc>
+          <w:tcPr>
+            <w:tcW w:w="523" w:type="dxa"/>
+            <w:shd w:val="clear" w:color="auto" w:fill="D9E1F2"/>
+          </w:tcPr>
+          <w:p>
+            <w:pPr>
+              <w:spacing w:before="60" w:after="60" w:line="240" w:lineRule="auto"/>
+              <w:jc w:val="center"/>
+            </w:pPr>
+            <w:r>
+              <w:rPr>
+                <w:rFonts w:ascii="Times New Roman" w:hAnsi="Times New Roman"/>
+                <w:b w:val="0"/>
+                <w:color w:val="000000"/>
+                <w:sz w:val="18"/>
+              </w:rPr>
+            </w:r>
+          </w:p>
+        </w:tc>
+        <w:tc>
+          <w:tcPr>
+            <w:tcW w:w="523" w:type="dxa"/>
+            <w:shd w:val="clear" w:color="auto" w:fill="D9E1F2"/>
+          </w:tcPr>
+          <w:p>
+            <w:pPr>
+              <w:spacing w:before="60" w:after="60" w:line="240" w:lineRule="auto"/>
+              <w:jc w:val="center"/>
+            </w:pPr>
+            <w:r>
+              <w:rPr>
+                <w:rFonts w:ascii="Times New Roman" w:hAnsi="Times New Roman"/>
+                <w:b w:val="0"/>
+                <w:color w:val="000000"/>
+                <w:sz w:val="18"/>
+              </w:rPr>
+            </w:r>
+          </w:p>
+        </w:tc>
+        <w:tc>
+          <w:tcPr>
+            <w:tcW w:w="523" w:type="dxa"/>
+            <w:shd w:val="clear" w:color="auto" w:fill="D9E1F2"/>
+          </w:tcPr>
+          <w:p>
+            <w:pPr>
+              <w:spacing w:before="60" w:after="60" w:line="240" w:lineRule="auto"/>
+              <w:jc w:val="center"/>
+            </w:pPr>
+            <w:r>
+              <w:rPr>
+                <w:rFonts w:ascii="Times New Roman" w:hAnsi="Times New Roman"/>
+                <w:b w:val="0"/>
+                <w:color w:val="000000"/>
+                <w:sz w:val="18"/>
+              </w:rPr>
+            </w:r>
+          </w:p>
+        </w:tc>
+        <w:tc>
+          <w:tcPr>
+            <w:tcW w:w="523" w:type="dxa"/>
+            <w:shd w:val="clear" w:color="auto" w:fill="D9E1F2"/>
+          </w:tcPr>
+          <w:p>
+            <w:pPr>
+              <w:spacing w:before="60" w:after="60" w:line="240" w:lineRule="auto"/>
+              <w:jc w:val="center"/>
+            </w:pPr>
+            <w:r>
+              <w:rPr>
+                <w:rFonts w:ascii="Times New Roman" w:hAnsi="Times New Roman"/>
+                <w:b w:val="0"/>
+                <w:color w:val="000000"/>
+                <w:sz w:val="18"/>
+              </w:rPr>
+            </w:r>
+          </w:p>
+        </w:tc>
+        <w:tc>
+          <w:tcPr>
+            <w:tcW w:w="523" w:type="dxa"/>
+            <w:shd w:val="clear" w:color="auto" w:fill="D9E1F2"/>
+          </w:tcPr>
+          <w:p>
+            <w:pPr>
+              <w:spacing w:before="60" w:after="60" w:line="240" w:lineRule="auto"/>
+              <w:jc w:val="center"/>
+            </w:pPr>
+            <w:r>
+              <w:rPr>
+                <w:rFonts w:ascii="Times New Roman" w:hAnsi="Times New Roman"/>
+                <w:b w:val="0"/>
+                <w:color w:val="000000"/>
+                <w:sz w:val="18"/>
+              </w:rPr>
+            </w:r>
+          </w:p>
+        </w:tc>
+        <w:tc>
+          <w:tcPr>
+            <w:tcW w:w="523" w:type="dxa"/>
+            <w:shd w:val="clear" w:color="auto" w:fill="D9E1F2"/>
+          </w:tcPr>
+          <w:p>
+            <w:pPr>
+              <w:spacing w:before="60" w:after="60" w:line="240" w:lineRule="auto"/>
+              <w:jc w:val="center"/>
+            </w:pPr>
+            <w:r>
+              <w:rPr>
+                <w:rFonts w:ascii="Times New Roman" w:hAnsi="Times New Roman"/>
+                <w:b w:val="0"/>
+                <w:color w:val="000000"/>
+                <w:sz w:val="18"/>
+              </w:rPr>
+            </w:r>
+          </w:p>
+        </w:tc>
+        <w:tc>
+          <w:tcPr>
+            <w:tcW w:w="523" w:type="dxa"/>
+            <w:shd w:val="clear" w:color="auto" w:fill="D9E1F2"/>
+          </w:tcPr>
+          <w:p>
+            <w:pPr>
+              <w:spacing w:before="60" w:after="60" w:line="240" w:lineRule="auto"/>
+              <w:jc w:val="center"/>
+            </w:pPr>
+            <w:r>
+              <w:rPr>
+                <w:rFonts w:ascii="Times New Roman" w:hAnsi="Times New Roman"/>
+                <w:b w:val="0"/>
+                <w:color w:val="000000"/>
+                <w:sz w:val="18"/>
+              </w:rPr>
+            </w:r>
+          </w:p>
+        </w:tc>
+        <w:tc>
+          <w:tcPr>
+            <w:tcW w:w="523" w:type="dxa"/>
+            <w:shd w:val="clear" w:color="auto" w:fill="D9E1F2"/>
+          </w:tcPr>
+          <w:p>
+            <w:pPr>
+              <w:spacing w:before="60" w:after="60" w:line="240" w:lineRule="auto"/>
+              <w:jc w:val="center"/>
+            </w:pPr>
+            <w:r>
+              <w:rPr>
+                <w:rFonts w:ascii="Times New Roman" w:hAnsi="Times New Roman"/>
+                <w:b w:val="0"/>
+                <w:color w:val="000000"/>
+                <w:sz w:val="18"/>
+              </w:rPr>
+            </w:r>
+          </w:p>
+        </w:tc>
+        <w:tc>
+          <w:tcPr>
+            <w:tcW w:w="523" w:type="dxa"/>
+            <w:shd w:val="clear" w:color="auto" w:fill="D9E1F2"/>
+          </w:tcPr>
+          <w:p>
+            <w:pPr>
+              <w:spacing w:before="60" w:after="60" w:line="240" w:lineRule="auto"/>
+              <w:jc w:val="center"/>
+            </w:pPr>
+            <w:r>
+              <w:rPr>
+                <w:rFonts w:ascii="Times New Roman" w:hAnsi="Times New Roman"/>
+                <w:b w:val="0"/>
+                <w:color w:val="000000"/>
+                <w:sz w:val="18"/>
+              </w:rPr>
             </w:r>
           </w:p>
         </w:tc>
@@ -4028,7 +4443,28 @@
                 <w:color w:val="000000"/>
                 <w:sz w:val="20"/>
               </w:rPr>
-              <w:t>Inducción y reconocimiento del área de trabajo.</w:t>
+              <w:t>Levantamiento de información sobre procesos administrativos.</w:t>
+            </w:r>
+          </w:p>
+        </w:tc>
+        <w:tc>
+          <w:tcPr>
+            <w:tcW w:w="523" w:type="dxa"/>
+            <w:shd w:val="clear" w:color="auto" w:fill="70AD47"/>
+          </w:tcPr>
+          <w:p>
+            <w:pPr>
+              <w:spacing w:before="60" w:after="60" w:line="240" w:lineRule="auto"/>
+              <w:jc w:val="center"/>
+            </w:pPr>
+            <w:r>
+              <w:rPr>
+                <w:rFonts w:ascii="Times New Roman" w:hAnsi="Times New Roman"/>
+                <w:b w:val="0"/>
+                <w:color w:val="FFFFFF"/>
+                <w:sz w:val="18"/>
+              </w:rPr>
+              <w:t>✓</w:t>
             </w:r>
           </w:p>
         </w:tc>
@@ -4213,26 +4649,6 @@
             </w:r>
           </w:p>
         </w:tc>
-        <w:tc>
-          <w:tcPr>
-            <w:tcW w:w="523" w:type="dxa"/>
-            <w:shd w:val="clear" w:color="auto" w:fill="FFFFFF"/>
-          </w:tcPr>
-          <w:p>
-            <w:pPr>
-              <w:spacing w:before="60" w:after="60" w:line="240" w:lineRule="auto"/>
-              <w:jc w:val="center"/>
-            </w:pPr>
-            <w:r>
-              <w:rPr>
-                <w:rFonts w:ascii="Times New Roman" w:hAnsi="Times New Roman"/>
-                <w:b w:val="0"/>
-                <w:color w:val="000000"/>
-                <w:sz w:val="18"/>
-              </w:rPr>
-            </w:r>
-          </w:p>
-        </w:tc>
       </w:tr>
       <w:tr>
         <w:tc>
@@ -4252,7 +4668,27 @@
                 <w:color w:val="000000"/>
                 <w:sz w:val="20"/>
               </w:rPr>
-              <w:t>Levantamiento de información sobre procesos administrativos.</w:t>
+              <w:t>Observación y análisis del proceso de solicitudes de servicio.</w:t>
+            </w:r>
+          </w:p>
+        </w:tc>
+        <w:tc>
+          <w:tcPr>
+            <w:tcW w:w="523" w:type="dxa"/>
+            <w:shd w:val="clear" w:color="auto" w:fill="D9E1F2"/>
+          </w:tcPr>
+          <w:p>
+            <w:pPr>
+              <w:spacing w:before="60" w:after="60" w:line="240" w:lineRule="auto"/>
+              <w:jc w:val="center"/>
+            </w:pPr>
+            <w:r>
+              <w:rPr>
+                <w:rFonts w:ascii="Times New Roman" w:hAnsi="Times New Roman"/>
+                <w:b w:val="0"/>
+                <w:color w:val="000000"/>
+                <w:sz w:val="18"/>
+              </w:rPr>
             </w:r>
           </w:p>
         </w:tc>
@@ -4438,26 +4874,6 @@
             </w:r>
           </w:p>
         </w:tc>
-        <w:tc>
-          <w:tcPr>
-            <w:tcW w:w="523" w:type="dxa"/>
-            <w:shd w:val="clear" w:color="auto" w:fill="D9E1F2"/>
-          </w:tcPr>
-          <w:p>
-            <w:pPr>
-              <w:spacing w:before="60" w:after="60" w:line="240" w:lineRule="auto"/>
-              <w:jc w:val="center"/>
-            </w:pPr>
-            <w:r>
-              <w:rPr>
-                <w:rFonts w:ascii="Times New Roman" w:hAnsi="Times New Roman"/>
-                <w:b w:val="0"/>
-                <w:color w:val="000000"/>
-                <w:sz w:val="18"/>
-              </w:rPr>
-            </w:r>
-          </w:p>
-        </w:tc>
       </w:tr>
       <w:tr>
         <w:tc>
@@ -4477,7 +4893,27 @@
                 <w:color w:val="000000"/>
                 <w:sz w:val="20"/>
               </w:rPr>
-              <w:t>Observación y análisis del proceso de solicitudes de servicio.</w:t>
+              <w:t>Diseño y aplicación de instrumentos de recolección de datos.</w:t>
+            </w:r>
+          </w:p>
+        </w:tc>
+        <w:tc>
+          <w:tcPr>
+            <w:tcW w:w="523" w:type="dxa"/>
+            <w:shd w:val="clear" w:color="auto" w:fill="FFFFFF"/>
+          </w:tcPr>
+          <w:p>
+            <w:pPr>
+              <w:spacing w:before="60" w:after="60" w:line="240" w:lineRule="auto"/>
+              <w:jc w:val="center"/>
+            </w:pPr>
+            <w:r>
+              <w:rPr>
+                <w:rFonts w:ascii="Times New Roman" w:hAnsi="Times New Roman"/>
+                <w:b w:val="0"/>
+                <w:color w:val="000000"/>
+                <w:sz w:val="18"/>
+              </w:rPr>
             </w:r>
           </w:p>
         </w:tc>
@@ -4663,26 +5099,6 @@
             </w:r>
           </w:p>
         </w:tc>
-        <w:tc>
-          <w:tcPr>
-            <w:tcW w:w="523" w:type="dxa"/>
-            <w:shd w:val="clear" w:color="auto" w:fill="FFFFFF"/>
-          </w:tcPr>
-          <w:p>
-            <w:pPr>
-              <w:spacing w:before="60" w:after="60" w:line="240" w:lineRule="auto"/>
-              <w:jc w:val="center"/>
-            </w:pPr>
-            <w:r>
-              <w:rPr>
-                <w:rFonts w:ascii="Times New Roman" w:hAnsi="Times New Roman"/>
-                <w:b w:val="0"/>
-                <w:color w:val="000000"/>
-                <w:sz w:val="18"/>
-              </w:rPr>
-            </w:r>
-          </w:p>
-        </w:tc>
       </w:tr>
       <w:tr>
         <w:tc>
@@ -4702,7 +5118,27 @@
                 <w:color w:val="000000"/>
                 <w:sz w:val="20"/>
               </w:rPr>
-              <w:t>Diseño y aplicación de instrumentos de recolección de datos.</w:t>
+              <w:t>Diagnóstico de la situación problemática.</w:t>
+            </w:r>
+          </w:p>
+        </w:tc>
+        <w:tc>
+          <w:tcPr>
+            <w:tcW w:w="523" w:type="dxa"/>
+            <w:shd w:val="clear" w:color="auto" w:fill="D9E1F2"/>
+          </w:tcPr>
+          <w:p>
+            <w:pPr>
+              <w:spacing w:before="60" w:after="60" w:line="240" w:lineRule="auto"/>
+              <w:jc w:val="center"/>
+            </w:pPr>
+            <w:r>
+              <w:rPr>
+                <w:rFonts w:ascii="Times New Roman" w:hAnsi="Times New Roman"/>
+                <w:b w:val="0"/>
+                <w:color w:val="000000"/>
+                <w:sz w:val="18"/>
+              </w:rPr>
             </w:r>
           </w:p>
         </w:tc>
@@ -4888,26 +5324,6 @@
             </w:r>
           </w:p>
         </w:tc>
-        <w:tc>
-          <w:tcPr>
-            <w:tcW w:w="523" w:type="dxa"/>
-            <w:shd w:val="clear" w:color="auto" w:fill="D9E1F2"/>
-          </w:tcPr>
-          <w:p>
-            <w:pPr>
-              <w:spacing w:before="60" w:after="60" w:line="240" w:lineRule="auto"/>
-              <w:jc w:val="center"/>
-            </w:pPr>
-            <w:r>
-              <w:rPr>
-                <w:rFonts w:ascii="Times New Roman" w:hAnsi="Times New Roman"/>
-                <w:b w:val="0"/>
-                <w:color w:val="000000"/>
-                <w:sz w:val="18"/>
-              </w:rPr>
-            </w:r>
-          </w:p>
-        </w:tc>
       </w:tr>
       <w:tr>
         <w:tc>
@@ -4927,7 +5343,27 @@
                 <w:color w:val="000000"/>
                 <w:sz w:val="20"/>
               </w:rPr>
-              <w:t>Diagnóstico de la situación problemática.</w:t>
+              <w:t>Revisión y elaboración del Marco Teórico.</w:t>
+            </w:r>
+          </w:p>
+        </w:tc>
+        <w:tc>
+          <w:tcPr>
+            <w:tcW w:w="523" w:type="dxa"/>
+            <w:shd w:val="clear" w:color="auto" w:fill="FFFFFF"/>
+          </w:tcPr>
+          <w:p>
+            <w:pPr>
+              <w:spacing w:before="60" w:after="60" w:line="240" w:lineRule="auto"/>
+              <w:jc w:val="center"/>
+            </w:pPr>
+            <w:r>
+              <w:rPr>
+                <w:rFonts w:ascii="Times New Roman" w:hAnsi="Times New Roman"/>
+                <w:b w:val="0"/>
+                <w:color w:val="000000"/>
+                <w:sz w:val="18"/>
+              </w:rPr>
             </w:r>
           </w:p>
         </w:tc>
@@ -5113,26 +5549,6 @@
             </w:r>
           </w:p>
         </w:tc>
-        <w:tc>
-          <w:tcPr>
-            <w:tcW w:w="523" w:type="dxa"/>
-            <w:shd w:val="clear" w:color="auto" w:fill="FFFFFF"/>
-          </w:tcPr>
-          <w:p>
-            <w:pPr>
-              <w:spacing w:before="60" w:after="60" w:line="240" w:lineRule="auto"/>
-              <w:jc w:val="center"/>
-            </w:pPr>
-            <w:r>
-              <w:rPr>
-                <w:rFonts w:ascii="Times New Roman" w:hAnsi="Times New Roman"/>
-                <w:b w:val="0"/>
-                <w:color w:val="000000"/>
-                <w:sz w:val="18"/>
-              </w:rPr>
-            </w:r>
-          </w:p>
-        </w:tc>
       </w:tr>
       <w:tr>
         <w:tc>
@@ -5152,7 +5568,27 @@
                 <w:color w:val="000000"/>
                 <w:sz w:val="20"/>
               </w:rPr>
-              <w:t>Revisión y elaboración del Marco Teórico.</w:t>
+              <w:t>Ejecución de actividades asignadas en el área administrativa.</w:t>
+            </w:r>
+          </w:p>
+        </w:tc>
+        <w:tc>
+          <w:tcPr>
+            <w:tcW w:w="523" w:type="dxa"/>
+            <w:shd w:val="clear" w:color="auto" w:fill="D9E1F2"/>
+          </w:tcPr>
+          <w:p>
+            <w:pPr>
+              <w:spacing w:before="60" w:after="60" w:line="240" w:lineRule="auto"/>
+              <w:jc w:val="center"/>
+            </w:pPr>
+            <w:r>
+              <w:rPr>
+                <w:rFonts w:ascii="Times New Roman" w:hAnsi="Times New Roman"/>
+                <w:b w:val="0"/>
+                <w:color w:val="000000"/>
+                <w:sz w:val="18"/>
+              </w:rPr>
             </w:r>
           </w:p>
         </w:tc>
@@ -5281,7 +5717,7 @@
         <w:tc>
           <w:tcPr>
             <w:tcW w:w="523" w:type="dxa"/>
-            <w:shd w:val="clear" w:color="auto" w:fill="D9E1F2"/>
+            <w:shd w:val="clear" w:color="auto" w:fill="70AD47"/>
           </w:tcPr>
           <w:p>
             <w:pPr>
@@ -5292,29 +5728,10 @@
               <w:rPr>
                 <w:rFonts w:ascii="Times New Roman" w:hAnsi="Times New Roman"/>
                 <w:b w:val="0"/>
-                <w:color w:val="000000"/>
+                <w:color w:val="FFFFFF"/>
                 <w:sz w:val="18"/>
               </w:rPr>
-            </w:r>
-          </w:p>
-        </w:tc>
-        <w:tc>
-          <w:tcPr>
-            <w:tcW w:w="523" w:type="dxa"/>
-            <w:shd w:val="clear" w:color="auto" w:fill="D9E1F2"/>
-          </w:tcPr>
-          <w:p>
-            <w:pPr>
-              <w:spacing w:before="60" w:after="60" w:line="240" w:lineRule="auto"/>
-              <w:jc w:val="center"/>
-            </w:pPr>
-            <w:r>
-              <w:rPr>
-                <w:rFonts w:ascii="Times New Roman" w:hAnsi="Times New Roman"/>
-                <w:b w:val="0"/>
-                <w:color w:val="000000"/>
-                <w:sz w:val="18"/>
-              </w:rPr>
+              <w:t>✓</w:t>
             </w:r>
           </w:p>
         </w:tc>
@@ -5377,7 +5794,27 @@
                 <w:color w:val="000000"/>
                 <w:sz w:val="20"/>
               </w:rPr>
-              <w:t>Ejecución de actividades asignadas en el área administrativa.</w:t>
+              <w:t>Registro semanal de actividades realizadas.</w:t>
+            </w:r>
+          </w:p>
+        </w:tc>
+        <w:tc>
+          <w:tcPr>
+            <w:tcW w:w="523" w:type="dxa"/>
+            <w:shd w:val="clear" w:color="auto" w:fill="FFFFFF"/>
+          </w:tcPr>
+          <w:p>
+            <w:pPr>
+              <w:spacing w:before="60" w:after="60" w:line="240" w:lineRule="auto"/>
+              <w:jc w:val="center"/>
+            </w:pPr>
+            <w:r>
+              <w:rPr>
+                <w:rFonts w:ascii="Times New Roman" w:hAnsi="Times New Roman"/>
+                <w:b w:val="0"/>
+                <w:color w:val="000000"/>
+                <w:sz w:val="18"/>
+              </w:rPr>
             </w:r>
           </w:p>
         </w:tc>
@@ -5564,26 +6001,6 @@
             </w:r>
           </w:p>
         </w:tc>
-        <w:tc>
-          <w:tcPr>
-            <w:tcW w:w="523" w:type="dxa"/>
-            <w:shd w:val="clear" w:color="auto" w:fill="FFFFFF"/>
-          </w:tcPr>
-          <w:p>
-            <w:pPr>
-              <w:spacing w:before="60" w:after="60" w:line="240" w:lineRule="auto"/>
-              <w:jc w:val="center"/>
-            </w:pPr>
-            <w:r>
-              <w:rPr>
-                <w:rFonts w:ascii="Times New Roman" w:hAnsi="Times New Roman"/>
-                <w:b w:val="0"/>
-                <w:color w:val="000000"/>
-                <w:sz w:val="18"/>
-              </w:rPr>
-            </w:r>
-          </w:p>
-        </w:tc>
       </w:tr>
       <w:tr>
         <w:tc>
@@ -5603,7 +6020,47 @@
                 <w:color w:val="000000"/>
                 <w:sz w:val="20"/>
               </w:rPr>
-              <w:t>Registro semanal de actividades realizadas.</w:t>
+              <w:t>Redacción de conclusiones y recomendaciones.</w:t>
+            </w:r>
+          </w:p>
+        </w:tc>
+        <w:tc>
+          <w:tcPr>
+            <w:tcW w:w="523" w:type="dxa"/>
+            <w:shd w:val="clear" w:color="auto" w:fill="D9E1F2"/>
+          </w:tcPr>
+          <w:p>
+            <w:pPr>
+              <w:spacing w:before="60" w:after="60" w:line="240" w:lineRule="auto"/>
+              <w:jc w:val="center"/>
+            </w:pPr>
+            <w:r>
+              <w:rPr>
+                <w:rFonts w:ascii="Times New Roman" w:hAnsi="Times New Roman"/>
+                <w:b w:val="0"/>
+                <w:color w:val="000000"/>
+                <w:sz w:val="18"/>
+              </w:rPr>
+            </w:r>
+          </w:p>
+        </w:tc>
+        <w:tc>
+          <w:tcPr>
+            <w:tcW w:w="523" w:type="dxa"/>
+            <w:shd w:val="clear" w:color="auto" w:fill="D9E1F2"/>
+          </w:tcPr>
+          <w:p>
+            <w:pPr>
+              <w:spacing w:before="60" w:after="60" w:line="240" w:lineRule="auto"/>
+              <w:jc w:val="center"/>
+            </w:pPr>
+            <w:r>
+              <w:rPr>
+                <w:rFonts w:ascii="Times New Roman" w:hAnsi="Times New Roman"/>
+                <w:b w:val="0"/>
+                <w:color w:val="000000"/>
+                <w:sz w:val="18"/>
+              </w:rPr>
             </w:r>
           </w:p>
         </w:tc>
@@ -5769,47 +6226,6 @@
             </w:r>
           </w:p>
         </w:tc>
-        <w:tc>
-          <w:tcPr>
-            <w:tcW w:w="523" w:type="dxa"/>
-            <w:shd w:val="clear" w:color="auto" w:fill="70AD47"/>
-          </w:tcPr>
-          <w:p>
-            <w:pPr>
-              <w:spacing w:before="60" w:after="60" w:line="240" w:lineRule="auto"/>
-              <w:jc w:val="center"/>
-            </w:pPr>
-            <w:r>
-              <w:rPr>
-                <w:rFonts w:ascii="Times New Roman" w:hAnsi="Times New Roman"/>
-                <w:b w:val="0"/>
-                <w:color w:val="FFFFFF"/>
-                <w:sz w:val="18"/>
-              </w:rPr>
-              <w:t>✓</w:t>
-            </w:r>
-          </w:p>
-        </w:tc>
-        <w:tc>
-          <w:tcPr>
-            <w:tcW w:w="523" w:type="dxa"/>
-            <w:shd w:val="clear" w:color="auto" w:fill="D9E1F2"/>
-          </w:tcPr>
-          <w:p>
-            <w:pPr>
-              <w:spacing w:before="60" w:after="60" w:line="240" w:lineRule="auto"/>
-              <w:jc w:val="center"/>
-            </w:pPr>
-            <w:r>
-              <w:rPr>
-                <w:rFonts w:ascii="Times New Roman" w:hAnsi="Times New Roman"/>
-                <w:b w:val="0"/>
-                <w:color w:val="000000"/>
-                <w:sz w:val="18"/>
-              </w:rPr>
-            </w:r>
-          </w:p>
-        </w:tc>
       </w:tr>
       <w:tr>
         <w:tc>
@@ -5829,7 +6245,7 @@
                 <w:color w:val="000000"/>
                 <w:sz w:val="20"/>
               </w:rPr>
-              <w:t>Redacción de conclusiones y recomendaciones.</w:t>
+              <w:t>Revisión final y presentación del informe.</w:t>
             </w:r>
           </w:p>
         </w:tc>
@@ -5996,232 +6412,7 @@
         <w:tc>
           <w:tcPr>
             <w:tcW w:w="523" w:type="dxa"/>
-            <w:shd w:val="clear" w:color="auto" w:fill="70AD47"/>
-          </w:tcPr>
-          <w:p>
-            <w:pPr>
-              <w:spacing w:before="60" w:after="60" w:line="240" w:lineRule="auto"/>
-              <w:jc w:val="center"/>
-            </w:pPr>
-            <w:r>
-              <w:rPr>
-                <w:rFonts w:ascii="Times New Roman" w:hAnsi="Times New Roman"/>
-                <w:b w:val="0"/>
-                <w:color w:val="FFFFFF"/>
-                <w:sz w:val="18"/>
-              </w:rPr>
-              <w:t>✓</w:t>
-            </w:r>
-          </w:p>
-        </w:tc>
-        <w:tc>
-          <w:tcPr>
-            <w:tcW w:w="523" w:type="dxa"/>
-            <w:shd w:val="clear" w:color="auto" w:fill="70AD47"/>
-          </w:tcPr>
-          <w:p>
-            <w:pPr>
-              <w:spacing w:before="60" w:after="60" w:line="240" w:lineRule="auto"/>
-              <w:jc w:val="center"/>
-            </w:pPr>
-            <w:r>
-              <w:rPr>
-                <w:rFonts w:ascii="Times New Roman" w:hAnsi="Times New Roman"/>
-                <w:b w:val="0"/>
-                <w:color w:val="FFFFFF"/>
-                <w:sz w:val="18"/>
-              </w:rPr>
-              <w:t>✓</w:t>
-            </w:r>
-          </w:p>
-        </w:tc>
-      </w:tr>
-      <w:tr>
-        <w:tc>
-          <w:tcPr>
-            <w:tcW w:w="3033" w:type="dxa"/>
-            <w:shd w:val="clear" w:color="auto" w:fill="D9E1F2"/>
-          </w:tcPr>
-          <w:p>
-            <w:pPr>
-              <w:spacing w:before="60" w:after="60" w:line="240" w:lineRule="auto"/>
-              <w:jc w:val="both"/>
-            </w:pPr>
-            <w:r>
-              <w:rPr>
-                <w:rFonts w:ascii="Times New Roman" w:hAnsi="Times New Roman"/>
-                <w:b w:val="0"/>
-                <w:color w:val="000000"/>
-                <w:sz w:val="20"/>
-              </w:rPr>
-              <w:t>Revisión final y presentación del informe.</w:t>
-            </w:r>
-          </w:p>
-        </w:tc>
-        <w:tc>
-          <w:tcPr>
-            <w:tcW w:w="523" w:type="dxa"/>
-            <w:shd w:val="clear" w:color="auto" w:fill="D9E1F2"/>
-          </w:tcPr>
-          <w:p>
-            <w:pPr>
-              <w:spacing w:before="60" w:after="60" w:line="240" w:lineRule="auto"/>
-              <w:jc w:val="center"/>
-            </w:pPr>
-            <w:r>
-              <w:rPr>
-                <w:rFonts w:ascii="Times New Roman" w:hAnsi="Times New Roman"/>
-                <w:b w:val="0"/>
-                <w:color w:val="000000"/>
-                <w:sz w:val="18"/>
-              </w:rPr>
-            </w:r>
-          </w:p>
-        </w:tc>
-        <w:tc>
-          <w:tcPr>
-            <w:tcW w:w="523" w:type="dxa"/>
-            <w:shd w:val="clear" w:color="auto" w:fill="D9E1F2"/>
-          </w:tcPr>
-          <w:p>
-            <w:pPr>
-              <w:spacing w:before="60" w:after="60" w:line="240" w:lineRule="auto"/>
-              <w:jc w:val="center"/>
-            </w:pPr>
-            <w:r>
-              <w:rPr>
-                <w:rFonts w:ascii="Times New Roman" w:hAnsi="Times New Roman"/>
-                <w:b w:val="0"/>
-                <w:color w:val="000000"/>
-                <w:sz w:val="18"/>
-              </w:rPr>
-            </w:r>
-          </w:p>
-        </w:tc>
-        <w:tc>
-          <w:tcPr>
-            <w:tcW w:w="523" w:type="dxa"/>
-            <w:shd w:val="clear" w:color="auto" w:fill="D9E1F2"/>
-          </w:tcPr>
-          <w:p>
-            <w:pPr>
-              <w:spacing w:before="60" w:after="60" w:line="240" w:lineRule="auto"/>
-              <w:jc w:val="center"/>
-            </w:pPr>
-            <w:r>
-              <w:rPr>
-                <w:rFonts w:ascii="Times New Roman" w:hAnsi="Times New Roman"/>
-                <w:b w:val="0"/>
-                <w:color w:val="000000"/>
-                <w:sz w:val="18"/>
-              </w:rPr>
-            </w:r>
-          </w:p>
-        </w:tc>
-        <w:tc>
-          <w:tcPr>
-            <w:tcW w:w="523" w:type="dxa"/>
-            <w:shd w:val="clear" w:color="auto" w:fill="D9E1F2"/>
-          </w:tcPr>
-          <w:p>
-            <w:pPr>
-              <w:spacing w:before="60" w:after="60" w:line="240" w:lineRule="auto"/>
-              <w:jc w:val="center"/>
-            </w:pPr>
-            <w:r>
-              <w:rPr>
-                <w:rFonts w:ascii="Times New Roman" w:hAnsi="Times New Roman"/>
-                <w:b w:val="0"/>
-                <w:color w:val="000000"/>
-                <w:sz w:val="18"/>
-              </w:rPr>
-            </w:r>
-          </w:p>
-        </w:tc>
-        <w:tc>
-          <w:tcPr>
-            <w:tcW w:w="523" w:type="dxa"/>
-            <w:shd w:val="clear" w:color="auto" w:fill="D9E1F2"/>
-          </w:tcPr>
-          <w:p>
-            <w:pPr>
-              <w:spacing w:before="60" w:after="60" w:line="240" w:lineRule="auto"/>
-              <w:jc w:val="center"/>
-            </w:pPr>
-            <w:r>
-              <w:rPr>
-                <w:rFonts w:ascii="Times New Roman" w:hAnsi="Times New Roman"/>
-                <w:b w:val="0"/>
-                <w:color w:val="000000"/>
-                <w:sz w:val="18"/>
-              </w:rPr>
-            </w:r>
-          </w:p>
-        </w:tc>
-        <w:tc>
-          <w:tcPr>
-            <w:tcW w:w="523" w:type="dxa"/>
-            <w:shd w:val="clear" w:color="auto" w:fill="D9E1F2"/>
-          </w:tcPr>
-          <w:p>
-            <w:pPr>
-              <w:spacing w:before="60" w:after="60" w:line="240" w:lineRule="auto"/>
-              <w:jc w:val="center"/>
-            </w:pPr>
-            <w:r>
-              <w:rPr>
-                <w:rFonts w:ascii="Times New Roman" w:hAnsi="Times New Roman"/>
-                <w:b w:val="0"/>
-                <w:color w:val="000000"/>
-                <w:sz w:val="18"/>
-              </w:rPr>
-            </w:r>
-          </w:p>
-        </w:tc>
-        <w:tc>
-          <w:tcPr>
-            <w:tcW w:w="523" w:type="dxa"/>
-            <w:shd w:val="clear" w:color="auto" w:fill="D9E1F2"/>
-          </w:tcPr>
-          <w:p>
-            <w:pPr>
-              <w:spacing w:before="60" w:after="60" w:line="240" w:lineRule="auto"/>
-              <w:jc w:val="center"/>
-            </w:pPr>
-            <w:r>
-              <w:rPr>
-                <w:rFonts w:ascii="Times New Roman" w:hAnsi="Times New Roman"/>
-                <w:b w:val="0"/>
-                <w:color w:val="000000"/>
-                <w:sz w:val="18"/>
-              </w:rPr>
-            </w:r>
-          </w:p>
-        </w:tc>
-        <w:tc>
-          <w:tcPr>
-            <w:tcW w:w="523" w:type="dxa"/>
-            <w:shd w:val="clear" w:color="auto" w:fill="D9E1F2"/>
-          </w:tcPr>
-          <w:p>
-            <w:pPr>
-              <w:spacing w:before="60" w:after="60" w:line="240" w:lineRule="auto"/>
-              <w:jc w:val="center"/>
-            </w:pPr>
-            <w:r>
-              <w:rPr>
-                <w:rFonts w:ascii="Times New Roman" w:hAnsi="Times New Roman"/>
-                <w:b w:val="0"/>
-                <w:color w:val="000000"/>
-                <w:sz w:val="18"/>
-              </w:rPr>
-            </w:r>
-          </w:p>
-        </w:tc>
-        <w:tc>
-          <w:tcPr>
-            <w:tcW w:w="523" w:type="dxa"/>
-            <w:shd w:val="clear" w:color="auto" w:fill="D9E1F2"/>
+            <w:shd w:val="clear" w:color="auto" w:fill="FFFFFF"/>
           </w:tcPr>
           <w:p>
             <w:pPr>

</xml_diff>

<commit_message>
Actualizar README con nuevos modos borrador1-4
</commit_message>
<xml_diff>
--- a/amaal/reportes/Informe_Pasantia_IUTECP.docx
+++ b/amaal/reportes/Informe_Pasantia_IUTECP.docx
@@ -805,7 +805,7 @@
           <w:b/>
           <w:sz w:val="24"/>
         </w:rPr>
-        <w:t>I REALIDAD ORGANIZACIONAL</w:t>
+        <w:t>CAPÍTULO I: REALIDAD ORGANIZACIONAL</w:t>
         <w:tab/>
       </w:r>
       <w:r>
@@ -1105,7 +1105,7 @@
           <w:b/>
           <w:sz w:val="24"/>
         </w:rPr>
-        <w:t>II DIAGNÓSTICO SITUACIONAL</w:t>
+        <w:t>CAPÍTULO II: DIAGNÓSTICO SITUACIONAL</w:t>
         <w:tab/>
       </w:r>
       <w:r>
@@ -1285,7 +1285,7 @@
           <w:b/>
           <w:sz w:val="24"/>
         </w:rPr>
-        <w:t>III MARCO TEÓRICO</w:t>
+        <w:t>CAPÍTULO III: MARCO TEÓRICO</w:t>
         <w:tab/>
       </w:r>
       <w:r>
@@ -1345,7 +1345,7 @@
           <w:b/>
           <w:sz w:val="24"/>
         </w:rPr>
-        <w:t>IV ACTIVIDADES REALIZADAS</w:t>
+        <w:t>CAPÍTULO IV: ACTIVIDADES REALIZADAS</w:t>
         <w:tab/>
       </w:r>
       <w:r>
@@ -1405,7 +1405,7 @@
           <w:b/>
           <w:sz w:val="24"/>
         </w:rPr>
-        <w:t>V CONCLUSIONES Y RECOMENDACIONES</w:t>
+        <w:t>CAPÍTULO V: CONCLUSIONES Y RECOMENDACIONES</w:t>
         <w:tab/>
       </w:r>
       <w:r>

</xml_diff>

<commit_message>
Update README with approval pages and preliminar order
</commit_message>
<xml_diff>
--- a/amaal/reportes/Informe_Pasantia_IUTECP.docx
+++ b/amaal/reportes/Informe_Pasantia_IUTECP.docx
@@ -506,35 +506,44 @@
     <w:p/>
     <w:p/>
     <w:p/>
-    <w:p/>
+    <w:p>
+      <w:pPr>
+        <w:jc w:val="center"/>
+      </w:pPr>
+      <w:r>
+        <w:rPr>
+          <w:rFonts w:ascii="Times New Roman" w:hAnsi="Times New Roman"/>
+          <w:sz w:val="24"/>
+        </w:rPr>
+        <w:t>_______________________________________________________</w:t>
+      </w:r>
+    </w:p>
     <w:p/>
     <w:p>
       <w:pPr>
-        <w:tabs>
-          <w:tab w:pos="10205" w:val="left"/>
-        </w:tabs>
-        <w:jc w:val="left"/>
+        <w:spacing w:line="360" w:lineRule="auto"/>
+        <w:jc w:val="center"/>
+      </w:pPr>
+      <w:r>
+        <w:rPr>
+          <w:rFonts w:ascii="Times New Roman" w:hAnsi="Times New Roman"/>
+          <w:b/>
+          <w:sz w:val="24"/>
+        </w:rPr>
+        <w:t>Lenny Mata</w:t>
+      </w:r>
+    </w:p>
+    <w:p>
+      <w:pPr>
+        <w:spacing w:before="0"/>
+        <w:jc w:val="center"/>
       </w:pPr>
       <w:r>
         <w:rPr>
           <w:rFonts w:ascii="Times New Roman" w:hAnsi="Times New Roman"/>
           <w:sz w:val="24"/>
         </w:rPr>
-        <w:t>Apellidos y Nombres</w:t>
-      </w:r>
-      <w:r>
-        <w:rPr>
-          <w:rFonts w:ascii="Times New Roman" w:hAnsi="Times New Roman"/>
-          <w:sz w:val="24"/>
-        </w:rPr>
-        <w:tab/>
-      </w:r>
-      <w:r>
-        <w:rPr>
-          <w:rFonts w:ascii="Times New Roman" w:hAnsi="Times New Roman"/>
-          <w:sz w:val="24"/>
-        </w:rPr>
-        <w:t>C.I.: _______________</w:t>
+        <w:t>C.I.: 8969750</w:t>
       </w:r>
     </w:p>
     <w:p>
@@ -667,35 +676,44 @@
     <w:p/>
     <w:p/>
     <w:p/>
-    <w:p/>
+    <w:p>
+      <w:pPr>
+        <w:jc w:val="center"/>
+      </w:pPr>
+      <w:r>
+        <w:rPr>
+          <w:rFonts w:ascii="Times New Roman" w:hAnsi="Times New Roman"/>
+          <w:sz w:val="24"/>
+        </w:rPr>
+        <w:t>_______________________________________________________</w:t>
+      </w:r>
+    </w:p>
     <w:p/>
     <w:p>
       <w:pPr>
-        <w:tabs>
-          <w:tab w:pos="10205" w:val="left"/>
-        </w:tabs>
-        <w:jc w:val="left"/>
+        <w:spacing w:line="360" w:lineRule="auto"/>
+        <w:jc w:val="center"/>
+      </w:pPr>
+      <w:r>
+        <w:rPr>
+          <w:rFonts w:ascii="Times New Roman" w:hAnsi="Times New Roman"/>
+          <w:b/>
+          <w:sz w:val="24"/>
+        </w:rPr>
+        <w:t>Lic. Carlos Mendoza</w:t>
+      </w:r>
+    </w:p>
+    <w:p>
+      <w:pPr>
+        <w:spacing w:before="0"/>
+        <w:jc w:val="center"/>
       </w:pPr>
       <w:r>
         <w:rPr>
           <w:rFonts w:ascii="Times New Roman" w:hAnsi="Times New Roman"/>
           <w:sz w:val="24"/>
         </w:rPr>
-        <w:t>Apellidos y Nombres</w:t>
-      </w:r>
-      <w:r>
-        <w:rPr>
-          <w:rFonts w:ascii="Times New Roman" w:hAnsi="Times New Roman"/>
-          <w:sz w:val="24"/>
-        </w:rPr>
-        <w:tab/>
-      </w:r>
-      <w:r>
-        <w:rPr>
-          <w:rFonts w:ascii="Times New Roman" w:hAnsi="Times New Roman"/>
-          <w:sz w:val="24"/>
-        </w:rPr>
-        <w:t>C.I.: _______________</w:t>
+        <w:t>C.I.: 4.273.815</w:t>
       </w:r>
     </w:p>
     <w:p>

</xml_diff>

<commit_message>
Actualizar informes y anexos de Amaal y Juliano
</commit_message>
<xml_diff>
--- a/amaal/reportes/Informe_Pasantia_IUTECP.docx
+++ b/amaal/reportes/Informe_Pasantia_IUTECP.docx
@@ -154,7 +154,7 @@
     <w:p>
       <w:pPr>
         <w:sectPr>
-          <w:footerReference w:type="default" r:id="rId13"/>
+          <w:footerReference w:type="default" r:id="rId14"/>
           <w:pgSz w:w="12240" w:h="15840"/>
           <w:pgMar w:top="1701" w:right="1701" w:bottom="1701" w:left="2268" w:header="720" w:footer="720" w:gutter="0"/>
           <w:cols w:space="720"/>
@@ -379,176 +379,6 @@
     <w:p>
       <w:pPr>
         <w:sectPr>
-          <w:footerReference w:type="default" r:id="rId14"/>
-          <w:pgSz w:w="12240" w:h="15840"/>
-          <w:pgMar w:top="1701" w:right="1701" w:bottom="1701" w:left="2268" w:header="720" w:footer="720" w:gutter="0"/>
-          <w:cols w:space="720"/>
-          <w:titlePg/>
-          <w:docGrid w:linePitch="360"/>
-        </w:sectPr>
-      </w:pPr>
-    </w:p>
-    <w:p>
-      <w:pPr>
-        <w:spacing w:line="276" w:lineRule="auto" w:before="0" w:after="0"/>
-        <w:jc w:val="center"/>
-      </w:pPr>
-      <w:r>
-        <w:rPr>
-          <w:rFonts w:ascii="Times New Roman" w:hAnsi="Times New Roman"/>
-          <w:b/>
-          <w:sz w:val="24"/>
-        </w:rPr>
-        <w:t>REPÚBLICA BOLIVARIANA DE VENEZUELA</w:t>
-      </w:r>
-    </w:p>
-    <w:p>
-      <w:pPr>
-        <w:spacing w:line="276" w:lineRule="auto" w:before="0" w:after="0"/>
-        <w:jc w:val="center"/>
-      </w:pPr>
-      <w:r>
-        <w:rPr>
-          <w:rFonts w:ascii="Times New Roman" w:hAnsi="Times New Roman"/>
-          <w:b/>
-          <w:sz w:val="24"/>
-        </w:rPr>
-        <w:t>MINISTERIO DEL PODER POPULAR PARA LA EDUCACIÓN</w:t>
-      </w:r>
-    </w:p>
-    <w:p>
-      <w:pPr>
-        <w:spacing w:line="276" w:lineRule="auto" w:before="0" w:after="0"/>
-        <w:jc w:val="center"/>
-      </w:pPr>
-      <w:r>
-        <w:rPr>
-          <w:rFonts w:ascii="Times New Roman" w:hAnsi="Times New Roman"/>
-          <w:b/>
-          <w:sz w:val="24"/>
-        </w:rPr>
-        <w:t>INSTITUTO UNIVERSITARIO DE TECNOLOGÍA</w:t>
-      </w:r>
-    </w:p>
-    <w:p>
-      <w:pPr>
-        <w:spacing w:line="276" w:lineRule="auto" w:before="0" w:after="0"/>
-        <w:jc w:val="center"/>
-      </w:pPr>
-      <w:r>
-        <w:rPr>
-          <w:rFonts w:ascii="Times New Roman" w:hAnsi="Times New Roman"/>
-          <w:b/>
-          <w:sz w:val="24"/>
-        </w:rPr>
-        <w:t>"ELÍAS CALIXTO POMPA"</w:t>
-      </w:r>
-    </w:p>
-    <w:p>
-      <w:pPr>
-        <w:spacing w:line="276" w:lineRule="auto" w:before="0" w:after="0"/>
-        <w:jc w:val="center"/>
-      </w:pPr>
-      <w:r>
-        <w:rPr>
-          <w:rFonts w:ascii="Times New Roman" w:hAnsi="Times New Roman"/>
-          <w:b/>
-          <w:sz w:val="24"/>
-        </w:rPr>
-        <w:t>EL TIGRE, ESTADO ANZOÁTEGUI</w:t>
-      </w:r>
-    </w:p>
-    <w:p/>
-    <w:p>
-      <w:pPr>
-        <w:spacing w:before="480" w:after="480"/>
-        <w:jc w:val="center"/>
-      </w:pPr>
-      <w:r>
-        <w:rPr>
-          <w:rFonts w:ascii="Times New Roman" w:hAnsi="Times New Roman"/>
-          <w:b/>
-          <w:sz w:val="24"/>
-        </w:rPr>
-        <w:t>APROBACIÓN DEL TUTOR INDUSTRIAL</w:t>
-      </w:r>
-    </w:p>
-    <w:p>
-      <w:pPr>
-        <w:spacing w:line="360" w:lineRule="auto"/>
-        <w:ind w:firstLine="0"/>
-        <w:jc w:val="both"/>
-      </w:pPr>
-      <w:r>
-        <w:rPr>
-          <w:rFonts w:ascii="Times New Roman" w:hAnsi="Times New Roman"/>
-          <w:sz w:val="24"/>
-        </w:rPr>
-        <w:t>En mi carácter de tutor industrial del informe de pasantías presentado por: Alrifaai Alrifaaie Amaal, de Cédula de Identidad V-31.985.792; para optar al grado de Técnico Superior Universitario en la especialidad de: Administración, cuyo título es; “EVALUACIÓN DEL CONTROL ADMINISTRATIVO APLICADO A LA GESTIÓN DE SOLICITUDES DE SERVICIOS DE TELECOMUNICACIONES EN LA EMPRESA INGENIERÍA DE TELECOMUNICACIONES, C.A.”, manifiesto que cumple con los requisitos exigidos por el Instituto Universitario de Tecnología “Elías Calixto Pompa” (IUTECP); y que, por lo tanto, considero que reúne los méritos suficientes para ser evaluado por el jurado que se decida designar a tal fin.</w:t>
-      </w:r>
-    </w:p>
-    <w:p/>
-    <w:p/>
-    <w:p>
-      <w:pPr>
-        <w:spacing w:line="360" w:lineRule="auto"/>
-        <w:jc w:val="left"/>
-      </w:pPr>
-      <w:r>
-        <w:rPr>
-          <w:rFonts w:ascii="Times New Roman" w:hAnsi="Times New Roman"/>
-          <w:sz w:val="24"/>
-        </w:rPr>
-        <w:t>En la Ciudad de El Tigre, a los ___ días del mes de _______ de 2026</w:t>
-      </w:r>
-    </w:p>
-    <w:p/>
-    <w:p/>
-    <w:p/>
-    <w:p/>
-    <w:p>
-      <w:pPr>
-        <w:jc w:val="center"/>
-      </w:pPr>
-      <w:r>
-        <w:rPr>
-          <w:rFonts w:ascii="Times New Roman" w:hAnsi="Times New Roman"/>
-          <w:sz w:val="24"/>
-        </w:rPr>
-        <w:t>_______________________________________________________</w:t>
-      </w:r>
-    </w:p>
-    <w:p/>
-    <w:p>
-      <w:pPr>
-        <w:spacing w:line="360" w:lineRule="auto"/>
-        <w:jc w:val="center"/>
-      </w:pPr>
-      <w:r>
-        <w:rPr>
-          <w:rFonts w:ascii="Times New Roman" w:hAnsi="Times New Roman"/>
-          <w:b/>
-          <w:sz w:val="24"/>
-        </w:rPr>
-        <w:t>Lenny Mata</w:t>
-      </w:r>
-    </w:p>
-    <w:p>
-      <w:pPr>
-        <w:spacing w:before="0"/>
-        <w:jc w:val="center"/>
-      </w:pPr>
-      <w:r>
-        <w:rPr>
-          <w:rFonts w:ascii="Times New Roman" w:hAnsi="Times New Roman"/>
-          <w:sz w:val="24"/>
-        </w:rPr>
-        <w:t>C.I.: 8969750</w:t>
-      </w:r>
-    </w:p>
-    <w:p>
-      <w:pPr>
-        <w:sectPr>
           <w:footerReference w:type="default" r:id="rId15"/>
           <w:pgSz w:w="12240" w:h="15840"/>
           <w:pgMar w:top="1701" w:right="1701" w:bottom="1701" w:left="2268" w:header="720" w:footer="720" w:gutter="0"/>
@@ -640,7 +470,7 @@
           <w:b/>
           <w:sz w:val="24"/>
         </w:rPr>
-        <w:t>APROBACIÓN DEL TUTOR ACADÉMICO</w:t>
+        <w:t>APROBACIÓN DEL TUTOR INDUSTRIAL</w:t>
       </w:r>
     </w:p>
     <w:p>
@@ -654,7 +484,7 @@
           <w:rFonts w:ascii="Times New Roman" w:hAnsi="Times New Roman"/>
           <w:sz w:val="24"/>
         </w:rPr>
-        <w:t>En mi carácter de tutor académico del informe de pasantías presentado por: Alrifaai Alrifaaie Amaal, de Cédula de Identidad V-31.985.792; para optar al grado de Técnico Superior Universitario en la especialidad de: Administración, cuyo título es; “EVALUACIÓN DEL CONTROL ADMINISTRATIVO APLICADO A LA GESTIÓN DE SOLICITUDES DE SERVICIOS DE TELECOMUNICACIONES EN LA EMPRESA INGENIERÍA DE TELECOMUNICACIONES, C.A.”, manifiesto que cumple con los requisitos exigidos por el Instituto Universitario de Tecnología “Elías Calixto Pompa” (IUTECP); y que, por lo tanto, considero que reúne los méritos suficientes para ser evaluado por el jurado que se decida designar a tal fin.</w:t>
+        <w:t>En mi carácter de tutor industrial del informe de pasantías presentado por: Alrifaai Alrifaaie Amaal, de Cédula de Identidad V-31.985.792; para optar al grado de Técnico Superior Universitario en la especialidad de: Administración, cuyo título es; “EVALUACIÓN DEL CONTROL ADMINISTRATIVO APLICADO A LA GESTIÓN DE SOLICITUDES DE SERVICIOS DE TELECOMUNICACIONES EN LA EMPRESA INGENIERÍA DE TELECOMUNICACIONES, C.A.”, manifiesto que cumple con los requisitos exigidos por el Instituto Universitario de Tecnología “Elías Calixto Pompa” (IUTECP); y que, por lo tanto, considero que reúne los méritos suficientes para ser evaluado por el jurado que se decida designar a tal fin.</w:t>
       </w:r>
     </w:p>
     <w:p/>
@@ -673,9 +503,6 @@
       </w:r>
     </w:p>
     <w:p/>
-    <w:p/>
-    <w:p/>
-    <w:p/>
     <w:p>
       <w:pPr>
         <w:jc w:val="center"/>
@@ -685,7 +512,7 @@
           <w:rFonts w:ascii="Times New Roman" w:hAnsi="Times New Roman"/>
           <w:sz w:val="24"/>
         </w:rPr>
-        <w:t>_______________________________________________________</w:t>
+        <w:t>___________________________________</w:t>
       </w:r>
     </w:p>
     <w:p/>
@@ -700,7 +527,7 @@
           <w:b/>
           <w:sz w:val="24"/>
         </w:rPr>
-        <w:t>Lic. Carlos Mendoza</w:t>
+        <w:t>Lenny Mata</w:t>
       </w:r>
     </w:p>
     <w:p>
@@ -713,7 +540,7 @@
           <w:rFonts w:ascii="Times New Roman" w:hAnsi="Times New Roman"/>
           <w:sz w:val="24"/>
         </w:rPr>
-        <w:t>C.I.: 4.273.815</w:t>
+        <w:t>C.I.: 8969750</w:t>
       </w:r>
     </w:p>
     <w:p>
@@ -730,7 +557,7 @@
     </w:p>
     <w:p>
       <w:pPr>
-        <w:spacing w:before="1140" w:after="480"/>
+        <w:spacing w:line="276" w:lineRule="auto" w:before="0" w:after="0"/>
         <w:jc w:val="center"/>
       </w:pPr>
       <w:r>
@@ -739,7 +566,148 @@
           <w:b/>
           <w:sz w:val="24"/>
         </w:rPr>
-        <w:t>ÍNDICE DE CONTENIDO</w:t>
+        <w:t>REPÚBLICA BOLIVARIANA DE VENEZUELA</w:t>
+      </w:r>
+    </w:p>
+    <w:p>
+      <w:pPr>
+        <w:spacing w:line="276" w:lineRule="auto" w:before="0" w:after="0"/>
+        <w:jc w:val="center"/>
+      </w:pPr>
+      <w:r>
+        <w:rPr>
+          <w:rFonts w:ascii="Times New Roman" w:hAnsi="Times New Roman"/>
+          <w:b/>
+          <w:sz w:val="24"/>
+        </w:rPr>
+        <w:t>MINISTERIO DEL PODER POPULAR PARA LA EDUCACIÓN</w:t>
+      </w:r>
+    </w:p>
+    <w:p>
+      <w:pPr>
+        <w:spacing w:line="276" w:lineRule="auto" w:before="0" w:after="0"/>
+        <w:jc w:val="center"/>
+      </w:pPr>
+      <w:r>
+        <w:rPr>
+          <w:rFonts w:ascii="Times New Roman" w:hAnsi="Times New Roman"/>
+          <w:b/>
+          <w:sz w:val="24"/>
+        </w:rPr>
+        <w:t>INSTITUTO UNIVERSITARIO DE TECNOLOGÍA</w:t>
+      </w:r>
+    </w:p>
+    <w:p>
+      <w:pPr>
+        <w:spacing w:line="276" w:lineRule="auto" w:before="0" w:after="0"/>
+        <w:jc w:val="center"/>
+      </w:pPr>
+      <w:r>
+        <w:rPr>
+          <w:rFonts w:ascii="Times New Roman" w:hAnsi="Times New Roman"/>
+          <w:b/>
+          <w:sz w:val="24"/>
+        </w:rPr>
+        <w:t>"ELÍAS CALIXTO POMPA"</w:t>
+      </w:r>
+    </w:p>
+    <w:p>
+      <w:pPr>
+        <w:spacing w:line="276" w:lineRule="auto" w:before="0" w:after="0"/>
+        <w:jc w:val="center"/>
+      </w:pPr>
+      <w:r>
+        <w:rPr>
+          <w:rFonts w:ascii="Times New Roman" w:hAnsi="Times New Roman"/>
+          <w:b/>
+          <w:sz w:val="24"/>
+        </w:rPr>
+        <w:t>EL TIGRE, ESTADO ANZOÁTEGUI</w:t>
+      </w:r>
+    </w:p>
+    <w:p/>
+    <w:p>
+      <w:pPr>
+        <w:spacing w:before="480" w:after="480"/>
+        <w:jc w:val="center"/>
+      </w:pPr>
+      <w:r>
+        <w:rPr>
+          <w:rFonts w:ascii="Times New Roman" w:hAnsi="Times New Roman"/>
+          <w:b/>
+          <w:sz w:val="24"/>
+        </w:rPr>
+        <w:t>APROBACIÓN DEL TUTOR ACADÉMICO</w:t>
+      </w:r>
+    </w:p>
+    <w:p>
+      <w:pPr>
+        <w:spacing w:line="360" w:lineRule="auto"/>
+        <w:ind w:firstLine="0"/>
+        <w:jc w:val="both"/>
+      </w:pPr>
+      <w:r>
+        <w:rPr>
+          <w:rFonts w:ascii="Times New Roman" w:hAnsi="Times New Roman"/>
+          <w:sz w:val="24"/>
+        </w:rPr>
+        <w:t>En mi carácter de tutor académico del informe de pasantías presentado por: Alrifaai Alrifaaie Amaal, de Cédula de Identidad V-31.985.792; para optar al grado de Técnico Superior Universitario en la especialidad de: Administración, cuyo título es; “EVALUACIÓN DEL CONTROL ADMINISTRATIVO APLICADO A LA GESTIÓN DE SOLICITUDES DE SERVICIOS DE TELECOMUNICACIONES EN LA EMPRESA INGENIERÍA DE TELECOMUNICACIONES, C.A.”, manifiesto que cumple con los requisitos exigidos por el Instituto Universitario de Tecnología “Elías Calixto Pompa” (IUTECP); y que, por lo tanto, considero que reúne los méritos suficientes para ser evaluado por el jurado que se decida designar a tal fin.</w:t>
+      </w:r>
+    </w:p>
+    <w:p/>
+    <w:p/>
+    <w:p>
+      <w:pPr>
+        <w:spacing w:line="360" w:lineRule="auto"/>
+        <w:jc w:val="left"/>
+      </w:pPr>
+      <w:r>
+        <w:rPr>
+          <w:rFonts w:ascii="Times New Roman" w:hAnsi="Times New Roman"/>
+          <w:sz w:val="24"/>
+        </w:rPr>
+        <w:t>En la Ciudad de El Tigre, a los ___ días del mes de _______ de 2026</w:t>
+      </w:r>
+    </w:p>
+    <w:p/>
+    <w:p>
+      <w:pPr>
+        <w:jc w:val="center"/>
+      </w:pPr>
+      <w:r>
+        <w:rPr>
+          <w:rFonts w:ascii="Times New Roman" w:hAnsi="Times New Roman"/>
+          <w:sz w:val="24"/>
+        </w:rPr>
+        <w:t>___________________________________</w:t>
+      </w:r>
+    </w:p>
+    <w:p/>
+    <w:p>
+      <w:pPr>
+        <w:spacing w:line="360" w:lineRule="auto"/>
+        <w:jc w:val="center"/>
+      </w:pPr>
+      <w:r>
+        <w:rPr>
+          <w:rFonts w:ascii="Times New Roman" w:hAnsi="Times New Roman"/>
+          <w:b/>
+          <w:sz w:val="24"/>
+        </w:rPr>
+        <w:t>Lic. Carlos Mendoza</w:t>
+      </w:r>
+    </w:p>
+    <w:p>
+      <w:pPr>
+        <w:spacing w:before="0"/>
+        <w:jc w:val="center"/>
+      </w:pPr>
+      <w:r>
+        <w:rPr>
+          <w:rFonts w:ascii="Times New Roman" w:hAnsi="Times New Roman"/>
+          <w:sz w:val="24"/>
+        </w:rPr>
+        <w:t>C.I.: 4.273.815</w:t>
       </w:r>
     </w:p>
     <w:p>
@@ -756,6 +724,32 @@
     </w:p>
     <w:p>
       <w:pPr>
+        <w:spacing w:before="1140" w:after="480"/>
+        <w:jc w:val="center"/>
+      </w:pPr>
+      <w:r>
+        <w:rPr>
+          <w:rFonts w:ascii="Times New Roman" w:hAnsi="Times New Roman"/>
+          <w:b/>
+          <w:sz w:val="24"/>
+        </w:rPr>
+        <w:t>ÍNDICE DE CONTENIDO</w:t>
+      </w:r>
+    </w:p>
+    <w:p>
+      <w:pPr>
+        <w:sectPr>
+          <w:footerReference w:type="default" r:id="rId18"/>
+          <w:pgSz w:w="12240" w:h="15840"/>
+          <w:pgMar w:top="1701" w:right="1701" w:bottom="1701" w:left="2268" w:header="720" w:footer="720" w:gutter="0"/>
+          <w:cols w:space="720"/>
+          <w:titlePg/>
+          <w:docGrid w:linePitch="360"/>
+        </w:sectPr>
+      </w:pPr>
+    </w:p>
+    <w:p>
+      <w:pPr>
         <w:spacing w:after="240"/>
         <w:jc w:val="right"/>
       </w:pPr>
@@ -932,6 +926,36 @@
           <w:b w:val="0"/>
           <w:sz w:val="24"/>
         </w:rPr>
+        <w:t>LISTA DE ANEXOS</w:t>
+        <w:tab/>
+      </w:r>
+      <w:r>
+        <w:rPr>
+          <w:rFonts w:ascii="Times New Roman" w:hAnsi="Times New Roman"/>
+          <w:b w:val="0"/>
+          <w:sz w:val="24"/>
+        </w:rPr>
+        <w:fldChar w:fldCharType="begin"/>
+        <w:instrText xml:space="preserve"> PAGEREF bm_lista_anexos \h </w:instrText>
+        <w:fldChar w:fldCharType="separate"/>
+        <w:t>?</w:t>
+        <w:fldChar w:fldCharType="end"/>
+      </w:r>
+    </w:p>
+    <w:p>
+      <w:pPr>
+        <w:tabs>
+          <w:tab w:pos="8271" w:val="right" w:leader="dot"/>
+        </w:tabs>
+        <w:spacing w:line="360" w:lineRule="auto" w:before="0" w:after="80"/>
+        <w:ind w:left="0"/>
+      </w:pPr>
+      <w:r>
+        <w:rPr>
+          <w:rFonts w:ascii="Times New Roman" w:hAnsi="Times New Roman"/>
+          <w:b w:val="0"/>
+          <w:sz w:val="24"/>
+        </w:rPr>
         <w:t>RESUMEN</w:t>
         <w:tab/>
       </w:r>
@@ -1742,7 +1766,7 @@
     <w:p>
       <w:pPr>
         <w:sectPr>
-          <w:footerReference w:type="default" r:id="rId18"/>
+          <w:footerReference w:type="default" r:id="rId19"/>
           <w:type w:val="continuous"/>
           <w:pgSz w:w="12240" w:h="15840"/>
           <w:pgMar w:top="1701" w:right="1701" w:bottom="1701" w:left="2268" w:header="720" w:footer="720" w:gutter="0"/>
@@ -1771,7 +1795,7 @@
     <w:p>
       <w:pPr>
         <w:sectPr>
-          <w:footerReference w:type="default" r:id="rId19"/>
+          <w:footerReference w:type="default" r:id="rId20"/>
           <w:pgSz w:w="12240" w:h="15840"/>
           <w:pgMar w:top="1701" w:right="1701" w:bottom="1701" w:left="2268" w:header="720" w:footer="720" w:gutter="0"/>
           <w:cols w:space="720"/>
@@ -1874,7 +1898,7 @@
     <w:p>
       <w:pPr>
         <w:sectPr>
-          <w:footerReference w:type="default" r:id="rId20"/>
+          <w:footerReference w:type="default" r:id="rId21"/>
           <w:type w:val="continuous"/>
           <w:pgSz w:w="12240" w:h="15840"/>
           <w:pgMar w:top="1701" w:right="1701" w:bottom="1701" w:left="2268" w:header="720" w:footer="720" w:gutter="0"/>
@@ -1903,7 +1927,7 @@
     <w:p>
       <w:pPr>
         <w:sectPr>
-          <w:footerReference w:type="default" r:id="rId21"/>
+          <w:footerReference w:type="default" r:id="rId22"/>
           <w:pgSz w:w="12240" w:h="15840"/>
           <w:pgMar w:top="1701" w:right="1701" w:bottom="1701" w:left="2268" w:header="720" w:footer="720" w:gutter="0"/>
           <w:cols w:space="720"/>
@@ -1915,7 +1939,7 @@
     <w:p>
       <w:pPr>
         <w:sectPr>
-          <w:footerReference w:type="default" r:id="rId22"/>
+          <w:footerReference w:type="default" r:id="rId23"/>
           <w:type w:val="continuous"/>
           <w:pgSz w:w="12240" w:h="15840"/>
           <w:pgMar w:top="1701" w:right="1701" w:bottom="1701" w:left="2268" w:header="720" w:footer="720" w:gutter="0"/>
@@ -1944,7 +1968,7 @@
     <w:p>
       <w:pPr>
         <w:sectPr>
-          <w:footerReference w:type="default" r:id="rId23"/>
+          <w:footerReference w:type="default" r:id="rId24"/>
           <w:pgSz w:w="12240" w:h="15840"/>
           <w:pgMar w:top="1701" w:right="1701" w:bottom="1701" w:left="2268" w:header="720" w:footer="720" w:gutter="0"/>
           <w:cols w:space="720"/>
@@ -2079,7 +2103,7 @@
     <w:p>
       <w:pPr>
         <w:sectPr>
-          <w:footerReference w:type="default" r:id="rId24"/>
+          <w:footerReference w:type="default" r:id="rId25"/>
           <w:type w:val="continuous"/>
           <w:pgSz w:w="12240" w:h="15840"/>
           <w:pgMar w:top="1701" w:right="1701" w:bottom="1701" w:left="2268" w:header="720" w:footer="720" w:gutter="0"/>
@@ -2108,7 +2132,7 @@
     <w:p>
       <w:pPr>
         <w:sectPr>
-          <w:footerReference w:type="default" r:id="rId25"/>
+          <w:footerReference w:type="default" r:id="rId26"/>
           <w:pgSz w:w="12240" w:h="15840"/>
           <w:pgMar w:top="1701" w:right="1701" w:bottom="1701" w:left="2268" w:header="720" w:footer="720" w:gutter="0"/>
           <w:cols w:space="720"/>
@@ -2146,8 +2170,40 @@
     </w:p>
     <w:p>
       <w:pPr>
+        <w:tabs>
+          <w:tab w:pos="1020" w:val="left"/>
+          <w:tab w:pos="8271" w:val="right" w:leader="dot"/>
+        </w:tabs>
+        <w:spacing w:line="360" w:lineRule="auto" w:before="0" w:after="80"/>
+        <w:ind w:left="1020" w:hanging="1020"/>
+      </w:pPr>
+      <w:r>
+        <w:rPr>
+          <w:rFonts w:ascii="Times New Roman" w:hAnsi="Times New Roman"/>
+          <w:sz w:val="24"/>
+        </w:rPr>
+        <w:t>A</w:t>
+        <w:tab/>
+        <w:t>Flujograma del proceso de gestión de solicitudes de servicios</w:t>
+        <w:tab/>
+      </w:r>
+      <w:r>
+        <w:rPr>
+          <w:rFonts w:ascii="Times New Roman" w:hAnsi="Times New Roman"/>
+          <w:b w:val="0"/>
+          <w:sz w:val="24"/>
+        </w:rPr>
+        <w:fldChar w:fldCharType="begin"/>
+        <w:instrText xml:space="preserve"> PAGEREF bm_anexoA \h </w:instrText>
+        <w:fldChar w:fldCharType="separate"/>
+        <w:t>?</w:t>
+        <w:fldChar w:fldCharType="end"/>
+      </w:r>
+    </w:p>
+    <w:p>
+      <w:pPr>
         <w:sectPr>
-          <w:footerReference w:type="default" r:id="rId26"/>
+          <w:footerReference w:type="default" r:id="rId27"/>
           <w:type w:val="continuous"/>
           <w:pgSz w:w="12240" w:h="15840"/>
           <w:pgMar w:top="1701" w:right="1701" w:bottom="1701" w:left="2268" w:header="720" w:footer="720" w:gutter="0"/>
@@ -2176,7 +2232,7 @@
     <w:p>
       <w:pPr>
         <w:sectPr>
-          <w:footerReference w:type="default" r:id="rId27"/>
+          <w:footerReference w:type="default" r:id="rId28"/>
           <w:pgSz w:w="12240" w:h="15840"/>
           <w:pgMar w:top="1701" w:right="1701" w:bottom="1701" w:left="2268" w:header="720" w:footer="720" w:gutter="0"/>
           <w:cols w:space="720"/>
@@ -2218,7 +2274,7 @@
     <w:p>
       <w:pPr>
         <w:sectPr>
-          <w:footerReference w:type="default" r:id="rId28"/>
+          <w:footerReference w:type="default" r:id="rId29"/>
           <w:type w:val="continuous"/>
           <w:pgSz w:w="12240" w:h="15840"/>
           <w:pgMar w:top="1701" w:right="1701" w:bottom="1701" w:left="2268" w:header="720" w:footer="720" w:gutter="0"/>
@@ -2247,7 +2303,7 @@
     <w:p>
       <w:pPr>
         <w:sectPr>
-          <w:footerReference w:type="default" r:id="rId29"/>
+          <w:footerReference w:type="default" r:id="rId30"/>
           <w:pgSz w:w="12240" w:h="15840"/>
           <w:pgMar w:top="1701" w:right="1701" w:bottom="1701" w:left="2268" w:header="720" w:footer="720" w:gutter="0"/>
           <w:cols w:space="720"/>
@@ -2274,7 +2330,7 @@
     <w:p>
       <w:pPr>
         <w:sectPr>
-          <w:footerReference w:type="default" r:id="rId30"/>
+          <w:footerReference w:type="default" r:id="rId31"/>
           <w:type w:val="continuous"/>
           <w:pgSz w:w="12240" w:h="15840"/>
           <w:pgMar w:top="1701" w:right="1701" w:bottom="1701" w:left="2268" w:header="720" w:footer="720" w:gutter="0"/>
@@ -2317,7 +2373,7 @@
     <w:p>
       <w:pPr>
         <w:sectPr>
-          <w:footerReference w:type="default" r:id="rId31"/>
+          <w:footerReference w:type="default" r:id="rId32"/>
           <w:pgSz w:w="12240" w:h="15840"/>
           <w:pgMar w:top="1701" w:right="1701" w:bottom="1701" w:left="2268" w:header="720" w:footer="720" w:gutter="0"/>
           <w:cols w:space="720"/>
@@ -2907,7 +2963,7 @@
       <w:r>
         <w:drawing>
           <wp:inline xmlns:a="http://schemas.openxmlformats.org/drawingml/2006/main" xmlns:pic="http://schemas.openxmlformats.org/drawingml/2006/picture">
-            <wp:extent cx="4320000" cy="1473429"/>
+            <wp:extent cx="4320000" cy="1847904"/>
             <wp:docPr id="3" name="Picture 3"/>
             <wp:cNvGraphicFramePr>
               <a:graphicFrameLocks noChangeAspect="1"/>
@@ -2928,7 +2984,7 @@
                   <pic:spPr>
                     <a:xfrm>
                       <a:off x="0" y="0"/>
-                      <a:ext cx="4320000" cy="1473429"/>
+                      <a:ext cx="4320000" cy="1847904"/>
                     </a:xfrm>
                     <a:prstGeom prst="rect"/>
                   </pic:spPr>
@@ -3030,7 +3086,7 @@
     <w:p>
       <w:pPr>
         <w:sectPr>
-          <w:footerReference w:type="default" r:id="rId32"/>
+          <w:footerReference w:type="default" r:id="rId33"/>
           <w:type w:val="continuous"/>
           <w:pgSz w:w="12240" w:h="15840"/>
           <w:pgMar w:top="1701" w:right="1701" w:bottom="1701" w:left="2268" w:header="720" w:footer="720" w:gutter="0"/>
@@ -3073,7 +3129,7 @@
     <w:p>
       <w:pPr>
         <w:sectPr>
-          <w:footerReference w:type="default" r:id="rId33"/>
+          <w:footerReference w:type="default" r:id="rId34"/>
           <w:pgSz w:w="12240" w:h="15840"/>
           <w:pgMar w:top="1701" w:right="1701" w:bottom="1701" w:left="2268" w:header="720" w:footer="720" w:gutter="0"/>
           <w:cols w:space="720"/>
@@ -3519,7 +3575,7 @@
                 <w:color w:val="000000"/>
                 <w:sz w:val="20"/>
               </w:rPr>
-              <w:t>Observación directa y revisión documental de los procedimientos internos.</w:t>
+              <w:t>Procesos administrativos de gestión de solicitudes de servicio.</w:t>
             </w:r>
           </w:p>
         </w:tc>
@@ -3540,7 +3596,7 @@
                 <w:color w:val="000000"/>
                 <w:sz w:val="20"/>
               </w:rPr>
-              <w:t>Guía de observación, documentos de la empresa, PC.</w:t>
+              <w:t>Observación directa y revisión documental del flujo de solicitudes.</w:t>
             </w:r>
           </w:p>
         </w:tc>
@@ -3561,7 +3617,7 @@
                 <w:color w:val="000000"/>
                 <w:sz w:val="20"/>
               </w:rPr>
-              <w:t>Mapeo del flujo actual de solicitudes.</w:t>
+              <w:t>Observación directa y análisis documental.</w:t>
             </w:r>
           </w:p>
         </w:tc>
@@ -3582,6 +3638,7 @@
                 <w:color w:val="000000"/>
                 <w:sz w:val="20"/>
               </w:rPr>
+              <w:t>Guía de observación, documentos internos y computadora.</w:t>
             </w:r>
           </w:p>
         </w:tc>
@@ -3625,6 +3682,27 @@
                 <w:color w:val="000000"/>
                 <w:sz w:val="20"/>
               </w:rPr>
+              <w:t>Deficiencias del control administrativo de solicitudes.</w:t>
+            </w:r>
+          </w:p>
+        </w:tc>
+        <w:tc>
+          <w:tcPr>
+            <w:tcW w:w="1644" w:type="dxa"/>
+            <w:shd w:val="clear" w:color="auto" w:fill="D9E1F2"/>
+          </w:tcPr>
+          <w:p>
+            <w:pPr>
+              <w:spacing w:before="60" w:after="60" w:line="240" w:lineRule="auto"/>
+              <w:jc w:val="both"/>
+            </w:pPr>
+            <w:r>
+              <w:rPr>
+                <w:rFonts w:ascii="Times New Roman" w:hAnsi="Times New Roman"/>
+                <w:b w:val="0"/>
+                <w:color w:val="000000"/>
+                <w:sz w:val="20"/>
+              </w:rPr>
               <w:t>Entrevistas al personal administrativo y revisión de registros históricos.</w:t>
             </w:r>
           </w:p>
@@ -3646,28 +3724,7 @@
                 <w:color w:val="000000"/>
                 <w:sz w:val="20"/>
               </w:rPr>
-              <w:t>Guía de entrevista, históricos de tickets, PC.</w:t>
-            </w:r>
-          </w:p>
-        </w:tc>
-        <w:tc>
-          <w:tcPr>
-            <w:tcW w:w="1644" w:type="dxa"/>
-            <w:shd w:val="clear" w:color="auto" w:fill="D9E1F2"/>
-          </w:tcPr>
-          <w:p>
-            <w:pPr>
-              <w:spacing w:before="60" w:after="60" w:line="240" w:lineRule="auto"/>
-              <w:jc w:val="both"/>
-            </w:pPr>
-            <w:r>
-              <w:rPr>
-                <w:rFonts w:ascii="Times New Roman" w:hAnsi="Times New Roman"/>
-                <w:b w:val="0"/>
-                <w:color w:val="000000"/>
-                <w:sz w:val="20"/>
-              </w:rPr>
-              <w:t>Matriz de deficiencias identificadas.</w:t>
+              <w:t>Entrevista no estructurada y análisis documental.</w:t>
             </w:r>
           </w:p>
         </w:tc>
@@ -3688,6 +3745,7 @@
                 <w:color w:val="000000"/>
                 <w:sz w:val="20"/>
               </w:rPr>
+              <w:t>Guía de entrevista, registros históricos de tickets y computadora.</w:t>
             </w:r>
           </w:p>
         </w:tc>
@@ -3731,6 +3789,27 @@
                 <w:color w:val="000000"/>
                 <w:sz w:val="20"/>
               </w:rPr>
+              <w:t>Impacto del control administrativo en la calidad del servicio.</w:t>
+            </w:r>
+          </w:p>
+        </w:tc>
+        <w:tc>
+          <w:tcPr>
+            <w:tcW w:w="1644" w:type="dxa"/>
+            <w:shd w:val="clear" w:color="auto" w:fill="FFFFFF"/>
+          </w:tcPr>
+          <w:p>
+            <w:pPr>
+              <w:spacing w:before="60" w:after="60" w:line="240" w:lineRule="auto"/>
+              <w:jc w:val="both"/>
+            </w:pPr>
+            <w:r>
+              <w:rPr>
+                <w:rFonts w:ascii="Times New Roman" w:hAnsi="Times New Roman"/>
+                <w:b w:val="0"/>
+                <w:color w:val="000000"/>
+                <w:sz w:val="20"/>
+              </w:rPr>
               <w:t>Análisis de tiempos de respuesta y correlación con quejas de suscriptores.</w:t>
             </w:r>
           </w:p>
@@ -3752,28 +3831,7 @@
                 <w:color w:val="000000"/>
                 <w:sz w:val="20"/>
               </w:rPr>
-              <w:t>Base de datos de incidencias, hojas de cálculo.</w:t>
-            </w:r>
-          </w:p>
-        </w:tc>
-        <w:tc>
-          <w:tcPr>
-            <w:tcW w:w="1644" w:type="dxa"/>
-            <w:shd w:val="clear" w:color="auto" w:fill="FFFFFF"/>
-          </w:tcPr>
-          <w:p>
-            <w:pPr>
-              <w:spacing w:before="60" w:after="60" w:line="240" w:lineRule="auto"/>
-              <w:jc w:val="both"/>
-            </w:pPr>
-            <w:r>
-              <w:rPr>
-                <w:rFonts w:ascii="Times New Roman" w:hAnsi="Times New Roman"/>
-                <w:b w:val="0"/>
-                <w:color w:val="000000"/>
-                <w:sz w:val="20"/>
-              </w:rPr>
-              <w:t>Informe analítico de impacto.</w:t>
+              <w:t>Análisis estadístico y revisión de registros.</w:t>
             </w:r>
           </w:p>
         </w:tc>
@@ -3794,6 +3852,7 @@
                 <w:color w:val="000000"/>
                 <w:sz w:val="20"/>
               </w:rPr>
+              <w:t>Base de datos de incidencias y hojas de cálculo.</w:t>
             </w:r>
           </w:p>
         </w:tc>
@@ -3837,6 +3896,27 @@
                 <w:color w:val="000000"/>
                 <w:sz w:val="20"/>
               </w:rPr>
+              <w:t>Mejoras al proceso de control administrativo de solicitudes.</w:t>
+            </w:r>
+          </w:p>
+        </w:tc>
+        <w:tc>
+          <w:tcPr>
+            <w:tcW w:w="1644" w:type="dxa"/>
+            <w:shd w:val="clear" w:color="auto" w:fill="D9E1F2"/>
+          </w:tcPr>
+          <w:p>
+            <w:pPr>
+              <w:spacing w:before="60" w:after="60" w:line="240" w:lineRule="auto"/>
+              <w:jc w:val="both"/>
+            </w:pPr>
+            <w:r>
+              <w:rPr>
+                <w:rFonts w:ascii="Times New Roman" w:hAnsi="Times New Roman"/>
+                <w:b w:val="0"/>
+                <w:color w:val="000000"/>
+                <w:sz w:val="20"/>
+              </w:rPr>
               <w:t>Diseño de procedimientos estandarizados y formatos de control.</w:t>
             </w:r>
           </w:p>
@@ -3858,28 +3938,7 @@
                 <w:color w:val="000000"/>
                 <w:sz w:val="20"/>
               </w:rPr>
-              <w:t>Procesador de texto, normativas internas.</w:t>
-            </w:r>
-          </w:p>
-        </w:tc>
-        <w:tc>
-          <w:tcPr>
-            <w:tcW w:w="1644" w:type="dxa"/>
-            <w:shd w:val="clear" w:color="auto" w:fill="D9E1F2"/>
-          </w:tcPr>
-          <w:p>
-            <w:pPr>
-              <w:spacing w:before="60" w:after="60" w:line="240" w:lineRule="auto"/>
-              <w:jc w:val="both"/>
-            </w:pPr>
-            <w:r>
-              <w:rPr>
-                <w:rFonts w:ascii="Times New Roman" w:hAnsi="Times New Roman"/>
-                <w:b w:val="0"/>
-                <w:color w:val="000000"/>
-                <w:sz w:val="20"/>
-              </w:rPr>
-              <w:t>Propuesta de mejora procedimental formulada.</w:t>
+              <w:t>Diseño procedimental y estandarización de formatos.</w:t>
             </w:r>
           </w:p>
         </w:tc>
@@ -3900,6 +3959,7 @@
                 <w:color w:val="000000"/>
                 <w:sz w:val="20"/>
               </w:rPr>
+              <w:t>Procesador de texto y normativas internas.</w:t>
             </w:r>
           </w:p>
         </w:tc>
@@ -6558,7 +6618,7 @@
     <w:p>
       <w:pPr>
         <w:sectPr>
-          <w:footerReference w:type="default" r:id="rId34"/>
+          <w:footerReference w:type="default" r:id="rId35"/>
           <w:type w:val="continuous"/>
           <w:pgSz w:w="12240" w:h="15840"/>
           <w:pgMar w:top="1701" w:right="1701" w:bottom="1701" w:left="2268" w:header="720" w:footer="720" w:gutter="0"/>
@@ -6601,7 +6661,7 @@
     <w:p>
       <w:pPr>
         <w:sectPr>
-          <w:footerReference w:type="default" r:id="rId35"/>
+          <w:footerReference w:type="default" r:id="rId36"/>
           <w:pgSz w:w="12240" w:h="15840"/>
           <w:pgMar w:top="1701" w:right="1701" w:bottom="1701" w:left="2268" w:header="720" w:footer="720" w:gutter="0"/>
           <w:cols w:space="720"/>
@@ -6915,7 +6975,7 @@
     <w:p>
       <w:pPr>
         <w:sectPr>
-          <w:footerReference w:type="default" r:id="rId36"/>
+          <w:footerReference w:type="default" r:id="rId37"/>
           <w:type w:val="continuous"/>
           <w:pgSz w:w="12240" w:h="15840"/>
           <w:pgMar w:top="1701" w:right="1701" w:bottom="1701" w:left="2268" w:header="720" w:footer="720" w:gutter="0"/>
@@ -6958,7 +7018,7 @@
     <w:p>
       <w:pPr>
         <w:sectPr>
-          <w:footerReference w:type="default" r:id="rId37"/>
+          <w:footerReference w:type="default" r:id="rId38"/>
           <w:pgSz w:w="12240" w:h="15840"/>
           <w:pgMar w:top="1701" w:right="1701" w:bottom="1701" w:left="2268" w:header="720" w:footer="720" w:gutter="0"/>
           <w:cols w:space="720"/>
@@ -7721,7 +7781,7 @@
     <w:p>
       <w:pPr>
         <w:sectPr>
-          <w:footerReference w:type="default" r:id="rId38"/>
+          <w:footerReference w:type="default" r:id="rId39"/>
           <w:type w:val="continuous"/>
           <w:pgSz w:w="12240" w:h="15840"/>
           <w:pgMar w:top="1701" w:right="1701" w:bottom="1701" w:left="2268" w:header="720" w:footer="720" w:gutter="0"/>
@@ -7764,7 +7824,7 @@
     <w:p>
       <w:pPr>
         <w:sectPr>
-          <w:footerReference w:type="default" r:id="rId39"/>
+          <w:footerReference w:type="default" r:id="rId40"/>
           <w:pgSz w:w="12240" w:h="15840"/>
           <w:pgMar w:top="1701" w:right="1701" w:bottom="1701" w:left="2268" w:header="720" w:footer="720" w:gutter="0"/>
           <w:cols w:space="720"/>
@@ -7976,7 +8036,7 @@
     <w:p>
       <w:pPr>
         <w:sectPr>
-          <w:footerReference w:type="default" r:id="rId40"/>
+          <w:footerReference w:type="default" r:id="rId41"/>
           <w:type w:val="continuous"/>
           <w:pgSz w:w="12240" w:h="15840"/>
           <w:pgMar w:top="1701" w:right="1701" w:bottom="1701" w:left="2268" w:header="720" w:footer="720" w:gutter="0"/>
@@ -8005,7 +8065,7 @@
     <w:p>
       <w:pPr>
         <w:sectPr>
-          <w:footerReference w:type="default" r:id="rId41"/>
+          <w:footerReference w:type="default" r:id="rId42"/>
           <w:pgSz w:w="12240" w:h="15840"/>
           <w:pgMar w:top="1701" w:right="1701" w:bottom="1701" w:left="2268" w:header="720" w:footer="720" w:gutter="0"/>
           <w:cols w:space="720"/>
@@ -8134,7 +8194,7 @@
     <w:p>
       <w:pPr>
         <w:sectPr>
-          <w:footerReference w:type="default" r:id="rId42"/>
+          <w:footerReference w:type="default" r:id="rId43"/>
           <w:type w:val="continuous"/>
           <w:pgSz w:w="12240" w:h="15840"/>
           <w:pgMar w:top="1701" w:right="1701" w:bottom="1701" w:left="2268" w:header="720" w:footer="720" w:gutter="0"/>
@@ -8160,8 +8220,89 @@
       </w:r>
       <w:bookmarkEnd w:id="bm_anexos"/>
     </w:p>
+    <w:p>
+      <w:pPr>
+        <w:sectPr>
+          <w:footerReference w:type="default" r:id="rId44"/>
+          <w:pgSz w:w="12240" w:h="15840"/>
+          <w:pgMar w:top="1701" w:right="1701" w:bottom="1701" w:left="2268" w:header="720" w:footer="720" w:gutter="0"/>
+          <w:cols w:space="720"/>
+          <w:titlePg/>
+          <w:docGrid w:linePitch="360"/>
+        </w:sectPr>
+      </w:pPr>
+    </w:p>
+    <w:p>
+      <w:bookmarkStart w:id="bm_anexoA" w:name="bm_anexoA"/>
+      <w:pPr>
+        <w:spacing w:before="0" w:after="480"/>
+        <w:jc w:val="center"/>
+      </w:pPr>
+      <w:bookmarkEnd w:id="bm_anexoA"/>
+      <w:r>
+        <w:rPr>
+          <w:rFonts w:ascii="Times New Roman" w:hAnsi="Times New Roman"/>
+          <w:b/>
+          <w:sz w:val="24"/>
+        </w:rPr>
+        <w:t>ANEXO A</w:t>
+      </w:r>
+    </w:p>
+    <w:p>
+      <w:pPr>
+        <w:spacing w:before="240" w:after="480"/>
+        <w:jc w:val="center"/>
+      </w:pPr>
+      <w:r>
+        <w:rPr>
+          <w:rFonts w:ascii="Times New Roman" w:hAnsi="Times New Roman"/>
+          <w:b/>
+          <w:sz w:val="24"/>
+        </w:rPr>
+        <w:t>[Flujograma del proceso de gestión de solicitudes de servicios]</w:t>
+      </w:r>
+    </w:p>
+    <w:p>
+      <w:pPr>
+        <w:jc w:val="center"/>
+      </w:pPr>
+      <w:r>
+        <w:drawing>
+          <wp:inline xmlns:a="http://schemas.openxmlformats.org/drawingml/2006/main" xmlns:pic="http://schemas.openxmlformats.org/drawingml/2006/picture">
+            <wp:extent cx="5040000" cy="22990909"/>
+            <wp:docPr id="5" name="Picture 5"/>
+            <wp:cNvGraphicFramePr>
+              <a:graphicFrameLocks noChangeAspect="1"/>
+            </wp:cNvGraphicFramePr>
+            <a:graphic>
+              <a:graphicData uri="http://schemas.openxmlformats.org/drawingml/2006/picture">
+                <pic:pic>
+                  <pic:nvPicPr>
+                    <pic:cNvPr id="0" name="4.png"/>
+                    <pic:cNvPicPr/>
+                  </pic:nvPicPr>
+                  <pic:blipFill>
+                    <a:blip r:embed="rId13"/>
+                    <a:stretch>
+                      <a:fillRect/>
+                    </a:stretch>
+                  </pic:blipFill>
+                  <pic:spPr>
+                    <a:xfrm>
+                      <a:off x="0" y="0"/>
+                      <a:ext cx="5040000" cy="22990909"/>
+                    </a:xfrm>
+                    <a:prstGeom prst="rect"/>
+                  </pic:spPr>
+                </pic:pic>
+              </a:graphicData>
+            </a:graphic>
+          </wp:inline>
+        </w:drawing>
+      </w:r>
+    </w:p>
     <w:sectPr>
-      <w:footerReference w:type="default" r:id="rId43"/>
+      <w:footerReference w:type="default" r:id="rId45"/>
       <w:pgSz w:w="12240" w:h="15840"/>
       <w:pgMar w:top="1701" w:right="1701" w:bottom="1701" w:left="2268" w:header="720" w:footer="720" w:gutter="0"/>
       <w:cols w:space="720"/>
@@ -8655,6 +8796,27 @@
 </file>
 
 <file path=word/footer31.xml><?xml version="1.0" encoding="utf-8"?>
+<w:ftr xmlns:m="http://schemas.openxmlformats.org/officeDocument/2006/math" xmlns:mc="http://schemas.openxmlformats.org/markup-compatibility/2006" xmlns:mo="http://schemas.microsoft.com/office/mac/office/2008/main" xmlns:mv="urn:schemas-microsoft-com:mac:vml" xmlns:o="urn:schemas-microsoft-com:office:office" xmlns:r="http://schemas.openxmlformats.org/officeDocument/2006/relationships" xmlns:v="urn:schemas-microsoft-com:vml" xmlns:w10="urn:schemas-microsoft-com:office:word" xmlns:w14="http://schemas.microsoft.com/office/word/2010/wordml" xmlns:w="http://schemas.openxmlformats.org/wordprocessingml/2006/main" xmlns:wne="http://schemas.microsoft.com/office/word/2006/wordml" xmlns:wp14="http://schemas.microsoft.com/office/word/2010/wordprocessingDrawing" xmlns:wp="http://schemas.openxmlformats.org/drawingml/2006/wordprocessingDrawing" xmlns:wpc="http://schemas.microsoft.com/office/word/2010/wordprocessingCanvas" xmlns:wpg="http://schemas.microsoft.com/office/word/2010/wordprocessingGroup" xmlns:wpi="http://schemas.microsoft.com/office/word/2010/wordprocessingInk" xmlns:wps="http://schemas.microsoft.com/office/word/2010/wordprocessingShape" mc:Ignorable="w14 wp14">
+  <w:p>
+    <w:pPr>
+      <w:pStyle w:val="Footer"/>
+      <w:jc w:val="center"/>
+    </w:pPr>
+    <w:r>
+      <w:rPr>
+        <w:rFonts w:ascii="Times New Roman" w:hAnsi="Times New Roman"/>
+        <w:sz w:val="24"/>
+      </w:rPr>
+      <w:fldChar w:fldCharType="begin"/>
+      <w:instrText xml:space="preserve"> PAGE </w:instrText>
+      <w:fldChar w:fldCharType="separate"/>
+      <w:fldChar w:fldCharType="end"/>
+    </w:r>
+  </w:p>
+</w:ftr>
+</file>
+
+<file path=word/footer32.xml><?xml version="1.0" encoding="utf-8"?>
 <w:ftr xmlns:m="http://schemas.openxmlformats.org/officeDocument/2006/math" xmlns:mc="http://schemas.openxmlformats.org/markup-compatibility/2006" xmlns:mo="http://schemas.microsoft.com/office/mac/office/2008/main" xmlns:mv="urn:schemas-microsoft-com:mac:vml" xmlns:o="urn:schemas-microsoft-com:office:office" xmlns:r="http://schemas.openxmlformats.org/officeDocument/2006/relationships" xmlns:v="urn:schemas-microsoft-com:vml" xmlns:w10="urn:schemas-microsoft-com:office:word" xmlns:w14="http://schemas.microsoft.com/office/word/2010/wordml" xmlns:w="http://schemas.openxmlformats.org/wordprocessingml/2006/main" xmlns:wne="http://schemas.microsoft.com/office/word/2006/wordml" xmlns:wp14="http://schemas.microsoft.com/office/word/2010/wordprocessingDrawing" xmlns:wp="http://schemas.openxmlformats.org/drawingml/2006/wordprocessingDrawing" xmlns:wpc="http://schemas.microsoft.com/office/word/2010/wordprocessingCanvas" xmlns:wpg="http://schemas.microsoft.com/office/word/2010/wordprocessingGroup" xmlns:wpi="http://schemas.microsoft.com/office/word/2010/wordprocessingInk" xmlns:wps="http://schemas.microsoft.com/office/word/2010/wordprocessingShape" mc:Ignorable="w14 wp14">
   <w:p>
     <w:pPr>

</xml_diff>

<commit_message>
Ajustar altura del anexo de Amaal
</commit_message>
<xml_diff>
--- a/amaal/reportes/Informe_Pasantia_IUTECP.docx
+++ b/amaal/reportes/Informe_Pasantia_IUTECP.docx
@@ -8269,7 +8269,7 @@
       <w:r>
         <w:drawing>
           <wp:inline xmlns:a="http://schemas.openxmlformats.org/drawingml/2006/main" xmlns:pic="http://schemas.openxmlformats.org/drawingml/2006/picture">
-            <wp:extent cx="5040000" cy="22990909"/>
+            <wp:extent cx="1341609" cy="6120000"/>
             <wp:docPr id="5" name="Picture 5"/>
             <wp:cNvGraphicFramePr>
               <a:graphicFrameLocks noChangeAspect="1"/>
@@ -8290,7 +8290,7 @@
                   <pic:spPr>
                     <a:xfrm>
                       <a:off x="0" y="0"/>
-                      <a:ext cx="5040000" cy="22990909"/>
+                      <a:ext cx="1341609" cy="6120000"/>
                     </a:xfrm>
                     <a:prstGeom prst="rect"/>
                   </pic:spPr>

</xml_diff>

<commit_message>
Agregar posicion del autor en Capitulo III de Amaal y Juliano
</commit_message>
<xml_diff>
--- a/amaal/reportes/Informe_Pasantia_IUTECP.docx
+++ b/amaal/reportes/Informe_Pasantia_IUTECP.docx
@@ -6754,20 +6754,6 @@
     </w:p>
     <w:p>
       <w:pPr>
-        <w:spacing w:before="480" w:after="480" w:line="360" w:lineRule="auto"/>
-        <w:jc w:val="left"/>
-      </w:pPr>
-      <w:r>
-        <w:rPr>
-          <w:rFonts w:ascii="Times New Roman" w:hAnsi="Times New Roman"/>
-          <w:b/>
-          <w:sz w:val="24"/>
-        </w:rPr>
-        <w:t>Gestión de Solicitudes de Servicio</w:t>
-      </w:r>
-    </w:p>
-    <w:p>
-      <w:pPr>
         <w:spacing w:line="360" w:lineRule="auto" w:after="0" w:before="0"/>
         <w:ind w:firstLine="709"/>
         <w:jc w:val="both"/>
@@ -6778,7 +6764,21 @@
           <w:i w:val="0"/>
           <w:sz w:val="24"/>
         </w:rPr>
-        <w:t>La gestión de solicitudes de servicio comprende el conjunto de procedimientos administrativos orientados a recepcionar, registrar, procesar y dar seguimiento a los requerimientos presentados por los clientes o suscriptores de una organización. Zeithaml, Parasuraman y Berry (1993) establecen que la calidad del servicio percibida por el cliente está directamente vinculada a la capacidad de la organización para gestionar sus solicitudes de forma ágil, transparente y con comunicación fluida en cada etapa del proceso.</w:t>
+        <w:t>Desde la perspectiva de quien desarrolla este informe, el control administrativo en IDETEL debe convertirse en una herramienta de seguimiento continuo y no limitarse a la revisión posterior de los casos.</w:t>
+      </w:r>
+    </w:p>
+    <w:p>
+      <w:pPr>
+        <w:spacing w:before="480" w:after="480" w:line="360" w:lineRule="auto"/>
+        <w:jc w:val="left"/>
+      </w:pPr>
+      <w:r>
+        <w:rPr>
+          <w:rFonts w:ascii="Times New Roman" w:hAnsi="Times New Roman"/>
+          <w:b/>
+          <w:sz w:val="24"/>
+        </w:rPr>
+        <w:t>Gestión de Solicitudes de Servicio</w:t>
       </w:r>
     </w:p>
     <w:p>
@@ -6793,21 +6793,7 @@
           <w:i w:val="0"/>
           <w:sz w:val="24"/>
         </w:rPr>
-        <w:t>En empresas de telecomunicaciones como IDETEL, la gestión de solicitudes abarca dos categorías principales: las solicitudes de afiliación de nuevos suscriptores, que implican la coordinación entre las áreas comercial, técnica y administrativa; y las incidencias reportadas por suscriptores activos, que requieren diagnóstico, despacho de cuadrillas y cierre verificado del caso. La ausencia de un sistema unificado de seguimiento para ambas categorías genera retrasos y reprocesos que impactan directamente en la satisfacción del cliente.</w:t>
-      </w:r>
-    </w:p>
-    <w:p>
-      <w:pPr>
-        <w:spacing w:before="480" w:after="480" w:line="360" w:lineRule="auto"/>
-        <w:jc w:val="left"/>
-      </w:pPr>
-      <w:r>
-        <w:rPr>
-          <w:rFonts w:ascii="Times New Roman" w:hAnsi="Times New Roman"/>
-          <w:b/>
-          <w:sz w:val="24"/>
-        </w:rPr>
-        <w:t>Procesos Administrativos y Estandarización de Procedimientos</w:t>
+        <w:t>La gestión de solicitudes de servicio comprende el conjunto de procedimientos administrativos orientados a recepcionar, registrar, procesar y dar seguimiento a los requerimientos presentados por los clientes o suscriptores de una organización. Zeithaml, Parasuraman y Berry (1993) establecen que la calidad del servicio percibida por el cliente está directamente vinculada a la capacidad de la organización para gestionar sus solicitudes de forma ágil, transparente y con comunicación fluida en cada etapa del proceso.</w:t>
       </w:r>
     </w:p>
     <w:p>
@@ -6822,7 +6808,7 @@
           <w:i w:val="0"/>
           <w:sz w:val="24"/>
         </w:rPr>
-        <w:t>El proceso administrativo constituye el marco conceptual que rige el funcionamiento de las organizaciones modernas. Chiavenato (2006) lo describe como el conjunto secuencial e interrelacionado de funciones de planificación, organización, dirección y control, orientadas al logro eficiente de los objetivos organizacionales. La estandarización de los procedimientos dentro de este marco garantiza que las actividades se ejecuten de manera uniforme, reduciendo la variabilidad y los errores derivados de la discrecionalidad individual.</w:t>
+        <w:t>En empresas de telecomunicaciones como IDETEL, la gestión de solicitudes abarca dos categorías principales: las solicitudes de afiliación de nuevos suscriptores, que implican la coordinación entre las áreas comercial, técnica y administrativa; y las incidencias reportadas por suscriptores activos, que requieren diagnóstico, despacho de cuadrillas y cierre verificado del caso. La ausencia de un sistema unificado de seguimiento para ambas categorías genera retrasos y reprocesos que impactan directamente en la satisfacción del cliente.</w:t>
       </w:r>
     </w:p>
     <w:p>
@@ -6837,7 +6823,7 @@
           <w:i w:val="0"/>
           <w:sz w:val="24"/>
         </w:rPr>
-        <w:t>La formalización de los procedimientos mediante manuales, flujogramas y formatos estandarizados constituye una herramienta esencial para el control administrativo. Según Harrington (1993), un proceso estandarizado es medible, controlable y mejorable, condiciones que permiten a la organización identificar con precisión los puntos de falla y aplicar acciones correctivas focalizadas. En el caso de IDETEL, la ausencia de procedimientos escritos para la gestión de solicitudes es una de las causas raíz de las deficiencias identificadas.</w:t>
+        <w:t>En el contexto de IDETEL, la gestión de solicitudes requiere un flujo único que permita conocer el responsable, el estado y el tiempo de atención de cada caso.</w:t>
       </w:r>
     </w:p>
     <w:p>
@@ -6851,7 +6837,7 @@
           <w:b/>
           <w:sz w:val="24"/>
         </w:rPr>
-        <w:t>Calidad del Servicio en Empresas de Telecomunicaciones</w:t>
+        <w:t>Procesos Administrativos y Estandarización de Procedimientos</w:t>
       </w:r>
     </w:p>
     <w:p>
@@ -6866,7 +6852,7 @@
           <w:i w:val="0"/>
           <w:sz w:val="24"/>
         </w:rPr>
-        <w:t>La calidad del servicio se define como el grado en que las características del servicio prestado satisfacen o superan las expectativas del cliente. Parasuraman, Zeithaml y Berry (1988) desarrollaron el modelo SERVQUAL, que identifica cinco dimensiones de la calidad del servicio: fiabilidad, capacidad de respuesta, seguridad, empatía y elementos tangibles. En el sector de telecomunicaciones, la fiabilidad y la capacidad de respuesta son las dimensiones con mayor peso en la percepción del cliente.</w:t>
+        <w:t>El proceso administrativo constituye el marco conceptual que rige el funcionamiento de las organizaciones modernas. Chiavenato (2006) lo describe como el conjunto secuencial e interrelacionado de funciones de planificación, organización, dirección y control, orientadas al logro eficiente de los objetivos organizacionales. La estandarización de los procedimientos dentro de este marco garantiza que las actividades se ejecuten de manera uniforme, reduciendo la variabilidad y los errores derivados de la discrecionalidad individual.</w:t>
       </w:r>
     </w:p>
     <w:p>
@@ -6881,21 +6867,7 @@
           <w:i w:val="0"/>
           <w:sz w:val="24"/>
         </w:rPr>
-        <w:t>Las deficiencias en el control administrativo del proceso de solicitudes de servicio impactan directamente sobre la fiabilidad y la capacidad de respuesta de IDETEL. Cuando una solicitud no es gestionada dentro de los tiempos establecidos o su estatus no puede ser verificado en tiempo real, el cliente percibe una falla en la calidad del servicio que deteriora su confianza en la organización y puede derivar en la cancelación del contrato o en la difusión de experiencias negativas.</w:t>
-      </w:r>
-    </w:p>
-    <w:p>
-      <w:pPr>
-        <w:spacing w:before="480" w:after="480" w:line="360" w:lineRule="auto"/>
-        <w:jc w:val="left"/>
-      </w:pPr>
-      <w:r>
-        <w:rPr>
-          <w:rFonts w:ascii="Times New Roman" w:hAnsi="Times New Roman"/>
-          <w:b/>
-          <w:sz w:val="24"/>
-        </w:rPr>
-        <w:t>Sistemas de Información para el Control Administrativo</w:t>
+        <w:t>La formalización de los procedimientos mediante manuales, flujogramas y formatos estandarizados constituye una herramienta esencial para el control administrativo. Según Harrington (1993), un proceso estandarizado es medible, controlable y mejorable, condiciones que permiten a la organización identificar con precisión los puntos de falla y aplicar acciones correctivas focalizadas. En el caso de IDETEL, la ausencia de procedimientos escritos para la gestión de solicitudes es una de las causas raíz de las deficiencias identificadas.</w:t>
       </w:r>
     </w:p>
     <w:p>
@@ -6910,7 +6882,21 @@
           <w:i w:val="0"/>
           <w:sz w:val="24"/>
         </w:rPr>
-        <w:t>Un sistema de información constituye un conjunto organizado de recursos tecnológicos y procedimentales orientados a la captura, almacenamiento, procesamiento y distribución de datos con el propósito de apoyar la toma de decisiones. Laudon y Laudon (2016) distinguen los sistemas de procesamiento de transacciones como la categoría que registra y gestiona las operaciones rutinarias de la organización, siendo esta la tipología más pertinente para el control de solicitudes de servicio en una empresa de telecomunicaciones.</w:t>
+        <w:t>A juicio de quien suscribe, la estandarización propuesta no busca aumentar la carga administrativa, sino eliminar ambigüedades y hacer verificable cada etapa del proceso.</w:t>
+      </w:r>
+    </w:p>
+    <w:p>
+      <w:pPr>
+        <w:spacing w:before="480" w:after="480" w:line="360" w:lineRule="auto"/>
+        <w:jc w:val="left"/>
+      </w:pPr>
+      <w:r>
+        <w:rPr>
+          <w:rFonts w:ascii="Times New Roman" w:hAnsi="Times New Roman"/>
+          <w:b/>
+          <w:sz w:val="24"/>
+        </w:rPr>
+        <w:t>Calidad del Servicio en Empresas de Telecomunicaciones</w:t>
       </w:r>
     </w:p>
     <w:p>
@@ -6925,21 +6911,7 @@
           <w:i w:val="0"/>
           <w:sz w:val="24"/>
         </w:rPr>
-        <w:t>La implementación de un sistema de tickets o plataforma de seguimiento de solicitudes en IDETEL permitiría centralizar el registro de cada caso, asignar responsables, definir tiempos de atención y generar alertas ante incumplimientos. Esta herramienta transformaría el control administrativo de reactivo a proactivo, dotando a la supervisión de información en tiempo real para la toma de decisiones y la evaluación continua del desempeño del proceso.</w:t>
-      </w:r>
-    </w:p>
-    <w:p>
-      <w:pPr>
-        <w:spacing w:before="480" w:after="480" w:line="360" w:lineRule="auto"/>
-        <w:jc w:val="left"/>
-      </w:pPr>
-      <w:r>
-        <w:rPr>
-          <w:rFonts w:ascii="Times New Roman" w:hAnsi="Times New Roman"/>
-          <w:b/>
-          <w:sz w:val="24"/>
-        </w:rPr>
-        <w:t>Proyecto Factible como Modalidad de Investigación</w:t>
+        <w:t>La calidad del servicio se define como el grado en que las características del servicio prestado satisfacen o superan las expectativas del cliente. Parasuraman, Zeithaml y Berry (1988) desarrollaron el modelo SERVQUAL, que identifica cinco dimensiones de la calidad del servicio: fiabilidad, capacidad de respuesta, seguridad, empatía y elementos tangibles. En el sector de telecomunicaciones, la fiabilidad y la capacidad de respuesta son las dimensiones con mayor peso en la percepción del cliente.</w:t>
       </w:r>
     </w:p>
     <w:p>
@@ -6954,7 +6926,7 @@
           <w:i w:val="0"/>
           <w:sz w:val="24"/>
         </w:rPr>
-        <w:t>La Universidad Pedagógica Experimental Libertador (UPEL, 2016) define el proyecto factible como la investigación, elaboración y desarrollo de una propuesta de un modelo operativo viable para solucionar problemas, requerimientos o necesidades de organizaciones o grupos sociales. Esta modalidad exige un diagnóstico de campo que evidencie la situación deficitaria y la comprobación de la viabilidad técnica y operativa de la solución planteada.</w:t>
+        <w:t>Las deficiencias en el control administrativo del proceso de solicitudes de servicio impactan directamente sobre la fiabilidad y la capacidad de respuesta de IDETEL. Cuando una solicitud no es gestionada dentro de los tiempos establecidos o su estatus no puede ser verificado en tiempo real, el cliente percibe una falla en la calidad del servicio que deteriora su confianza en la organización y puede derivar en la cancelación del contrato o en la difusión de experiencias negativas.</w:t>
       </w:r>
     </w:p>
     <w:p>
@@ -6969,7 +6941,125 @@
           <w:i w:val="0"/>
           <w:sz w:val="24"/>
         </w:rPr>
+        <w:t>Para este estudio, la calidad del servicio se relaciona directamente con la capacidad administrativa de IDETEL para responder y dar seguimiento oportuno a las solicitudes del suscriptor.</w:t>
+      </w:r>
+    </w:p>
+    <w:p>
+      <w:pPr>
+        <w:spacing w:before="480" w:after="480" w:line="360" w:lineRule="auto"/>
+        <w:jc w:val="left"/>
+      </w:pPr>
+      <w:r>
+        <w:rPr>
+          <w:rFonts w:ascii="Times New Roman" w:hAnsi="Times New Roman"/>
+          <w:b/>
+          <w:sz w:val="24"/>
+        </w:rPr>
+        <w:t>Sistemas de Información para el Control Administrativo</w:t>
+      </w:r>
+    </w:p>
+    <w:p>
+      <w:pPr>
+        <w:spacing w:line="360" w:lineRule="auto" w:after="0" w:before="0"/>
+        <w:ind w:firstLine="709"/>
+        <w:jc w:val="both"/>
+      </w:pPr>
+      <w:r>
+        <w:rPr>
+          <w:rFonts w:ascii="Times New Roman" w:hAnsi="Times New Roman"/>
+          <w:i w:val="0"/>
+          <w:sz w:val="24"/>
+        </w:rPr>
+        <w:t>Un sistema de información constituye un conjunto organizado de recursos tecnológicos y procedimentales orientados a la captura, almacenamiento, procesamiento y distribución de datos con el propósito de apoyar la toma de decisiones. Laudon y Laudon (2016) distinguen los sistemas de procesamiento de transacciones como la categoría que registra y gestiona las operaciones rutinarias de la organización, siendo esta la tipología más pertinente para el control de solicitudes de servicio en una empresa de telecomunicaciones.</w:t>
+      </w:r>
+    </w:p>
+    <w:p>
+      <w:pPr>
+        <w:spacing w:line="360" w:lineRule="auto" w:after="0" w:before="0"/>
+        <w:ind w:firstLine="709"/>
+        <w:jc w:val="both"/>
+      </w:pPr>
+      <w:r>
+        <w:rPr>
+          <w:rFonts w:ascii="Times New Roman" w:hAnsi="Times New Roman"/>
+          <w:i w:val="0"/>
+          <w:sz w:val="24"/>
+        </w:rPr>
+        <w:t>La implementación de un sistema de tickets o plataforma de seguimiento de solicitudes en IDETEL permitiría centralizar el registro de cada caso, asignar responsables, definir tiempos de atención y generar alertas ante incumplimientos. Esta herramienta transformaría el control administrativo de reactivo a proactivo, dotando a la supervisión de información en tiempo real para la toma de decisiones y la evaluación continua del desempeño del proceso.</w:t>
+      </w:r>
+    </w:p>
+    <w:p>
+      <w:pPr>
+        <w:spacing w:line="360" w:lineRule="auto" w:after="0" w:before="0"/>
+        <w:ind w:firstLine="709"/>
+        <w:jc w:val="both"/>
+      </w:pPr>
+      <w:r>
+        <w:rPr>
+          <w:rFonts w:ascii="Times New Roman" w:hAnsi="Times New Roman"/>
+          <w:i w:val="0"/>
+          <w:sz w:val="24"/>
+        </w:rPr>
+        <w:t>Desde la posición del investigador, una herramienta de seguimiento centralizada es viable para IDETEL porque permite mejorar la trazabilidad sin modificar la naturaleza de los servicios que presta la empresa.</w:t>
+      </w:r>
+    </w:p>
+    <w:p>
+      <w:pPr>
+        <w:spacing w:before="480" w:after="480" w:line="360" w:lineRule="auto"/>
+        <w:jc w:val="left"/>
+      </w:pPr>
+      <w:r>
+        <w:rPr>
+          <w:rFonts w:ascii="Times New Roman" w:hAnsi="Times New Roman"/>
+          <w:b/>
+          <w:sz w:val="24"/>
+        </w:rPr>
+        <w:t>Proyecto Factible como Modalidad de Investigación</w:t>
+      </w:r>
+    </w:p>
+    <w:p>
+      <w:pPr>
+        <w:spacing w:line="360" w:lineRule="auto" w:after="0" w:before="0"/>
+        <w:ind w:firstLine="709"/>
+        <w:jc w:val="both"/>
+      </w:pPr>
+      <w:r>
+        <w:rPr>
+          <w:rFonts w:ascii="Times New Roman" w:hAnsi="Times New Roman"/>
+          <w:i w:val="0"/>
+          <w:sz w:val="24"/>
+        </w:rPr>
+        <w:t>La Universidad Pedagógica Experimental Libertador (UPEL, 2016) define el proyecto factible como la investigación, elaboración y desarrollo de una propuesta de un modelo operativo viable para solucionar problemas, requerimientos o necesidades de organizaciones o grupos sociales. Esta modalidad exige un diagnóstico de campo que evidencie la situación deficitaria y la comprobación de la viabilidad técnica y operativa de la solución planteada.</w:t>
+      </w:r>
+    </w:p>
+    <w:p>
+      <w:pPr>
+        <w:spacing w:line="360" w:lineRule="auto" w:after="0" w:before="0"/>
+        <w:ind w:firstLine="709"/>
+        <w:jc w:val="both"/>
+      </w:pPr>
+      <w:r>
+        <w:rPr>
+          <w:rFonts w:ascii="Times New Roman" w:hAnsi="Times New Roman"/>
+          <w:i w:val="0"/>
+          <w:sz w:val="24"/>
+        </w:rPr>
         <w:t>Arias (2012) señala que el proyecto factible avanza hasta proponer y en muchos casos desarrollar la solución, demostrando su aplicabilidad en el contexto real. El presente trabajo se enmarca en esta modalidad al partir de la evaluación del control administrativo de IDETEL para proponer mejoras procedimentales cuya implementación es viable dentro de la estructura organizativa y los recursos disponibles de la empresa.</w:t>
+      </w:r>
+    </w:p>
+    <w:p>
+      <w:pPr>
+        <w:spacing w:line="360" w:lineRule="auto" w:after="0" w:before="0"/>
+        <w:ind w:firstLine="709"/>
+        <w:jc w:val="both"/>
+      </w:pPr>
+      <w:r>
+        <w:rPr>
+          <w:rFonts w:ascii="Times New Roman" w:hAnsi="Times New Roman"/>
+          <w:i w:val="0"/>
+          <w:sz w:val="24"/>
+        </w:rPr>
+        <w:t>La elección del proyecto factible responde a la necesidad de transformar el diagnóstico realizado en procedimientos y formatos aplicables a la realidad operativa de IDETEL.</w:t>
       </w:r>
     </w:p>
     <w:p>

</xml_diff>

<commit_message>
Actualizar formato de resumen y borradores
</commit_message>
<xml_diff>
--- a/amaal/reportes/Informe_Pasantia_IUTECP.docx
+++ b/amaal/reportes/Informe_Pasantia_IUTECP.docx
@@ -126,7 +126,7 @@
           <w:b/>
           <w:sz w:val="24"/>
         </w:rPr>
-        <w:t>Alrifaai Alrifaaie Amaal</w:t>
+        <w:t>Alrifaai Alrifaaie, Amaal</w:t>
         <w:br/>
       </w:r>
       <w:r>
@@ -275,7 +275,7 @@
                 <w:b/>
                 <w:sz w:val="24"/>
               </w:rPr>
-              <w:t>Lenny Mata</w:t>
+              <w:t>Mata, Lenny</w:t>
               <w:br/>
             </w:r>
             <w:r>
@@ -310,7 +310,7 @@
                 <w:b/>
                 <w:sz w:val="24"/>
               </w:rPr>
-              <w:t>Lic. Carlos Mendoza</w:t>
+              <w:t>Lic. Mendoza, Carlos</w:t>
               <w:br/>
             </w:r>
             <w:r>
@@ -348,7 +348,7 @@
                 <w:b/>
                 <w:sz w:val="24"/>
               </w:rPr>
-              <w:t>Alrifaai Alrifaaie Amaal</w:t>
+              <w:t>Alrifaai Alrifaaie, Amaal</w:t>
               <w:br/>
             </w:r>
             <w:r>
@@ -484,7 +484,7 @@
           <w:rFonts w:ascii="Times New Roman" w:hAnsi="Times New Roman"/>
           <w:sz w:val="24"/>
         </w:rPr>
-        <w:t>En mi carácter de tutor industrial del informe de pasantías presentado por: Alrifaai Alrifaaie Amaal, de Cédula de Identidad V-31.985.792; para optar al grado de Técnico Superior Universitario en la especialidad de: Administración, cuyo título es; “EVALUACIÓN DEL CONTROL ADMINISTRATIVO APLICADO A LA GESTIÓN DE SOLICITUDES DE SERVICIOS DE TELECOMUNICACIONES EN LA EMPRESA INGENIERÍA DE TELECOMUNICACIONES, C.A.”, manifiesto que cumple con los requisitos exigidos por el Instituto Universitario de Tecnología “Elías Calixto Pompa” (IUTECP); y que, por lo tanto, considero que reúne los méritos suficientes para ser evaluado por el jurado que se decida designar a tal fin.</w:t>
+        <w:t>En mi carácter de tutor industrial del informe de pasantías presentado por: Alrifaai Alrifaaie, Amaal, de Cédula de Identidad V-31.985.792; para optar al grado de Técnico Superior Universitario en la especialidad de: Administración, cuyo título es; “EVALUACIÓN DEL CONTROL ADMINISTRATIVO APLICADO A LA GESTIÓN DE SOLICITUDES DE SERVICIOS DE TELECOMUNICACIONES EN LA EMPRESA INGENIERÍA DE TELECOMUNICACIONES, C.A.”, manifiesto que cumple con los requisitos exigidos por el Instituto Universitario de Tecnología “Elías Calixto Pompa” (IUTECP); y que, por lo tanto, considero que reúne los méritos suficientes para ser evaluado por el jurado que se decida designar a tal fin.</w:t>
       </w:r>
     </w:p>
     <w:p/>
@@ -527,7 +527,7 @@
           <w:b/>
           <w:sz w:val="24"/>
         </w:rPr>
-        <w:t>Lenny Mata</w:t>
+        <w:t>Mata, Lenny</w:t>
       </w:r>
     </w:p>
     <w:p>
@@ -651,7 +651,7 @@
           <w:rFonts w:ascii="Times New Roman" w:hAnsi="Times New Roman"/>
           <w:sz w:val="24"/>
         </w:rPr>
-        <w:t>En mi carácter de tutor académico del informe de pasantías presentado por: Alrifaai Alrifaaie Amaal, de Cédula de Identidad V-31.985.792; para optar al grado de Técnico Superior Universitario en la especialidad de: Administración, cuyo título es; “EVALUACIÓN DEL CONTROL ADMINISTRATIVO APLICADO A LA GESTIÓN DE SOLICITUDES DE SERVICIOS DE TELECOMUNICACIONES EN LA EMPRESA INGENIERÍA DE TELECOMUNICACIONES, C.A.”, manifiesto que cumple con los requisitos exigidos por el Instituto Universitario de Tecnología “Elías Calixto Pompa” (IUTECP); y que, por lo tanto, considero que reúne los méritos suficientes para ser evaluado por el jurado que se decida designar a tal fin.</w:t>
+        <w:t>En mi carácter de tutor académico del informe de pasantías presentado por: Alrifaai Alrifaaie, Amaal, de Cédula de Identidad V-31.985.792; para optar al grado de Técnico Superior Universitario en la especialidad de: Administración, cuyo título es; “EVALUACIÓN DEL CONTROL ADMINISTRATIVO APLICADO A LA GESTIÓN DE SOLICITUDES DE SERVICIOS DE TELECOMUNICACIONES EN LA EMPRESA INGENIERÍA DE TELECOMUNICACIONES, C.A.”, manifiesto que cumple con los requisitos exigidos por el Instituto Universitario de Tecnología “Elías Calixto Pompa” (IUTECP); y que, por lo tanto, considero que reúne los méritos suficientes para ser evaluado por el jurado que se decida designar a tal fin.</w:t>
       </w:r>
     </w:p>
     <w:p/>
@@ -694,7 +694,7 @@
           <w:b/>
           <w:sz w:val="24"/>
         </w:rPr>
-        <w:t>Lic. Carlos Mendoza</w:t>
+        <w:t>Lic. Mendoza, Carlos</w:t>
       </w:r>
     </w:p>
     <w:p>
@@ -2214,9 +2214,206 @@
       </w:pPr>
     </w:p>
     <w:p>
+      <w:pPr>
+        <w:spacing w:after="0"/>
+        <w:jc w:val="center"/>
+      </w:pPr>
+      <w:r>
+        <w:rPr>
+          <w:rFonts w:ascii="Times New Roman" w:hAnsi="Times New Roman"/>
+          <w:b/>
+          <w:sz w:val="24"/>
+        </w:rPr>
+        <w:t>REPÚBLICA BOLIVARIANA DE VENEZUELA</w:t>
+      </w:r>
+    </w:p>
+    <w:p>
+      <w:pPr>
+        <w:spacing w:after="0"/>
+        <w:jc w:val="center"/>
+      </w:pPr>
+      <w:r>
+        <w:rPr>
+          <w:rFonts w:ascii="Times New Roman" w:hAnsi="Times New Roman"/>
+          <w:b/>
+          <w:sz w:val="24"/>
+        </w:rPr>
+        <w:t>MINISTERIO DEL PODER POPULAR PARA LA EDUCACIÓN</w:t>
+      </w:r>
+    </w:p>
+    <w:p>
+      <w:pPr>
+        <w:spacing w:after="0"/>
+        <w:jc w:val="center"/>
+      </w:pPr>
+      <w:r>
+        <w:rPr>
+          <w:rFonts w:ascii="Times New Roman" w:hAnsi="Times New Roman"/>
+          <w:b/>
+          <w:sz w:val="24"/>
+        </w:rPr>
+        <w:t>INSTITUTO UNIVERSITARIO DE TECNOLOGÍA</w:t>
+      </w:r>
+    </w:p>
+    <w:p>
+      <w:pPr>
+        <w:spacing w:after="0"/>
+        <w:jc w:val="center"/>
+      </w:pPr>
+      <w:r>
+        <w:rPr>
+          <w:rFonts w:ascii="Times New Roman" w:hAnsi="Times New Roman"/>
+          <w:b/>
+          <w:sz w:val="24"/>
+        </w:rPr>
+        <w:t>"ELÍAS CALIXTO POMPA"</w:t>
+      </w:r>
+    </w:p>
+    <w:p>
+      <w:pPr>
+        <w:spacing w:after="0"/>
+        <w:jc w:val="center"/>
+      </w:pPr>
+      <w:r>
+        <w:rPr>
+          <w:rFonts w:ascii="Times New Roman" w:hAnsi="Times New Roman"/>
+          <w:b/>
+          <w:sz w:val="24"/>
+        </w:rPr>
+        <w:t>EL TIGRE, ESTADO ANZOÁTEGUI</w:t>
+      </w:r>
+    </w:p>
+    <w:p>
+      <w:pPr>
+        <w:spacing w:after="360"/>
+      </w:pPr>
+    </w:p>
+    <w:p>
+      <w:pPr>
+        <w:spacing w:after="480"/>
+        <w:jc w:val="center"/>
+      </w:pPr>
+      <w:r>
+        <w:rPr>
+          <w:rFonts w:ascii="Times New Roman" w:hAnsi="Times New Roman"/>
+          <w:b/>
+          <w:sz w:val="24"/>
+        </w:rPr>
+        <w:t>EVALUACIÓN DEL CONTROL ADMINISTRATIVO APLICADO A LA GESTIÓN DE SOLICITUDES DE SERVICIOS DE TELECOMUNICACIONES EN LA EMPRESA INGENIERÍA DE TELECOMUNICACIONES, C.A.</w:t>
+      </w:r>
+    </w:p>
+    <w:tbl>
+      <w:tblPr>
+        <w:tblStyle w:val="TableGrid"/>
+        <w:tblW w:type="auto" w:w="0"/>
+        <w:tblLook w:firstColumn="1" w:firstRow="1" w:lastColumn="0" w:lastRow="0" w:noHBand="0" w:noVBand="1" w:val="04A0"/>
+      </w:tblPr>
+      <w:tblGrid>
+        <w:gridCol w:w="4135"/>
+        <w:gridCol w:w="4135"/>
+      </w:tblGrid>
+      <w:tr>
+        <w:tc>
+          <w:tcPr>
+            <w:tcW w:type="dxa" w:w="4135"/>
+          </w:tcPr>
+          <w:p>
+            <w:pPr>
+              <w:spacing w:before="60" w:after="60" w:line="240" w:lineRule="auto"/>
+              <w:jc w:val="center"/>
+            </w:pPr>
+            <w:r>
+              <w:rPr>
+                <w:rFonts w:ascii="Times New Roman" w:hAnsi="Times New Roman"/>
+                <w:b/>
+                <w:color w:val="000000"/>
+                <w:sz w:val="20"/>
+              </w:rPr>
+              <w:t>Autor</w:t>
+            </w:r>
+          </w:p>
+        </w:tc>
+        <w:tc>
+          <w:tcPr>
+            <w:tcW w:type="dxa" w:w="4135"/>
+          </w:tcPr>
+          <w:p>
+            <w:pPr>
+              <w:spacing w:before="60" w:after="60" w:line="240" w:lineRule="auto"/>
+              <w:jc w:val="both"/>
+            </w:pPr>
+            <w:r>
+              <w:rPr>
+                <w:rFonts w:ascii="Times New Roman" w:hAnsi="Times New Roman"/>
+                <w:b w:val="0"/>
+                <w:color w:val="000000"/>
+                <w:sz w:val="20"/>
+              </w:rPr>
+              <w:t>Alrifaai Alrifaaie, Amaal</w:t>
+            </w:r>
+          </w:p>
+        </w:tc>
+      </w:tr>
+      <w:tr>
+        <w:tc>
+          <w:tcPr>
+            <w:tcW w:type="dxa" w:w="4135"/>
+          </w:tcPr>
+          <w:p>
+            <w:pPr>
+              <w:spacing w:before="60" w:after="60" w:line="240" w:lineRule="auto"/>
+              <w:jc w:val="center"/>
+            </w:pPr>
+            <w:r>
+              <w:rPr>
+                <w:rFonts w:ascii="Times New Roman" w:hAnsi="Times New Roman"/>
+                <w:b/>
+                <w:color w:val="000000"/>
+                <w:sz w:val="20"/>
+              </w:rPr>
+              <w:t>C.I.</w:t>
+            </w:r>
+          </w:p>
+        </w:tc>
+        <w:tc>
+          <w:tcPr>
+            <w:tcW w:type="dxa" w:w="4135"/>
+          </w:tcPr>
+          <w:p>
+            <w:pPr>
+              <w:spacing w:before="60" w:after="60" w:line="240" w:lineRule="auto"/>
+              <w:jc w:val="both"/>
+            </w:pPr>
+            <w:r>
+              <w:rPr>
+                <w:rFonts w:ascii="Times New Roman" w:hAnsi="Times New Roman"/>
+                <w:b w:val="0"/>
+                <w:color w:val="000000"/>
+                <w:sz w:val="20"/>
+              </w:rPr>
+              <w:t>31.985.792</w:t>
+            </w:r>
+          </w:p>
+        </w:tc>
+      </w:tr>
+    </w:tbl>
+    <w:p>
+      <w:pPr>
+        <w:spacing w:before="240" w:after="480"/>
+        <w:jc w:val="center"/>
+      </w:pPr>
+      <w:r>
+        <w:rPr>
+          <w:rFonts w:ascii="Times New Roman" w:hAnsi="Times New Roman"/>
+          <w:sz w:val="24"/>
+        </w:rPr>
+        <w:t>julio de 2026</w:t>
+      </w:r>
+    </w:p>
+    <w:p>
       <w:bookmarkStart w:id="bm_resumen" w:name="bm_resumen"/>
       <w:pPr>
-        <w:spacing w:before="1140" w:after="480"/>
+        <w:spacing w:before="480" w:after="480"/>
         <w:jc w:val="center"/>
       </w:pPr>
       <w:r>

</xml_diff>

<commit_message>
Ajustar bloque de autor del resumen
</commit_message>
<xml_diff>
--- a/amaal/reportes/Informe_Pasantia_IUTECP.docx
+++ b/amaal/reportes/Informe_Pasantia_IUTECP.docx
@@ -2302,106 +2302,38 @@
         <w:t>EVALUACIÓN DEL CONTROL ADMINISTRATIVO APLICADO A LA GESTIÓN DE SOLICITUDES DE SERVICIOS DE TELECOMUNICACIONES EN LA EMPRESA INGENIERÍA DE TELECOMUNICACIONES, C.A.</w:t>
       </w:r>
     </w:p>
-    <w:tbl>
-      <w:tblPr>
-        <w:tblStyle w:val="TableGrid"/>
-        <w:tblW w:type="auto" w:w="0"/>
-        <w:tblLook w:firstColumn="1" w:firstRow="1" w:lastColumn="0" w:lastRow="0" w:noHBand="0" w:noVBand="1" w:val="04A0"/>
-      </w:tblPr>
-      <w:tblGrid>
-        <w:gridCol w:w="4135"/>
-        <w:gridCol w:w="4135"/>
-      </w:tblGrid>
-      <w:tr>
-        <w:tc>
-          <w:tcPr>
-            <w:tcW w:type="dxa" w:w="4135"/>
-          </w:tcPr>
-          <w:p>
-            <w:pPr>
-              <w:spacing w:before="60" w:after="60" w:line="240" w:lineRule="auto"/>
-              <w:jc w:val="center"/>
-            </w:pPr>
-            <w:r>
-              <w:rPr>
-                <w:rFonts w:ascii="Times New Roman" w:hAnsi="Times New Roman"/>
-                <w:b/>
-                <w:color w:val="000000"/>
-                <w:sz w:val="20"/>
-              </w:rPr>
-              <w:t>Autor</w:t>
-            </w:r>
-          </w:p>
-        </w:tc>
-        <w:tc>
-          <w:tcPr>
-            <w:tcW w:type="dxa" w:w="4135"/>
-          </w:tcPr>
-          <w:p>
-            <w:pPr>
-              <w:spacing w:before="60" w:after="60" w:line="240" w:lineRule="auto"/>
-              <w:jc w:val="both"/>
-            </w:pPr>
-            <w:r>
-              <w:rPr>
-                <w:rFonts w:ascii="Times New Roman" w:hAnsi="Times New Roman"/>
-                <w:b w:val="0"/>
-                <w:color w:val="000000"/>
-                <w:sz w:val="20"/>
-              </w:rPr>
-              <w:t>Alrifaai Alrifaaie, Amaal</w:t>
-            </w:r>
-          </w:p>
-        </w:tc>
-      </w:tr>
-      <w:tr>
-        <w:tc>
-          <w:tcPr>
-            <w:tcW w:type="dxa" w:w="4135"/>
-          </w:tcPr>
-          <w:p>
-            <w:pPr>
-              <w:spacing w:before="60" w:after="60" w:line="240" w:lineRule="auto"/>
-              <w:jc w:val="center"/>
-            </w:pPr>
-            <w:r>
-              <w:rPr>
-                <w:rFonts w:ascii="Times New Roman" w:hAnsi="Times New Roman"/>
-                <w:b/>
-                <w:color w:val="000000"/>
-                <w:sz w:val="20"/>
-              </w:rPr>
-              <w:t>C.I.</w:t>
-            </w:r>
-          </w:p>
-        </w:tc>
-        <w:tc>
-          <w:tcPr>
-            <w:tcW w:type="dxa" w:w="4135"/>
-          </w:tcPr>
-          <w:p>
-            <w:pPr>
-              <w:spacing w:before="60" w:after="60" w:line="240" w:lineRule="auto"/>
-              <w:jc w:val="both"/>
-            </w:pPr>
-            <w:r>
-              <w:rPr>
-                <w:rFonts w:ascii="Times New Roman" w:hAnsi="Times New Roman"/>
-                <w:b w:val="0"/>
-                <w:color w:val="000000"/>
-                <w:sz w:val="20"/>
-              </w:rPr>
-              <w:t>31.985.792</w:t>
-            </w:r>
-          </w:p>
-        </w:tc>
-      </w:tr>
-    </w:tbl>
     <w:p>
       <w:pPr>
-        <w:spacing w:before="240" w:after="480"/>
-        <w:jc w:val="center"/>
-      </w:pPr>
+        <w:spacing w:after="480"/>
+        <w:ind w:left="0"/>
+        <w:jc w:val="left"/>
+      </w:pPr>
+      <w:r>
+        <w:rPr>
+          <w:rFonts w:ascii="Times New Roman" w:hAnsi="Times New Roman"/>
+          <w:b/>
+          <w:sz w:val="24"/>
+        </w:rPr>
+        <w:t>Autor:</w:t>
+        <w:br/>
+      </w:r>
+      <w:r>
+        <w:rPr>
+          <w:rFonts w:ascii="Times New Roman" w:hAnsi="Times New Roman"/>
+          <w:sz w:val="24"/>
+        </w:rPr>
+        <w:t>Alrifaai Alrifaaie, Amaal</w:t>
+        <w:br/>
+      </w:r>
+      <w:r>
+        <w:rPr>
+          <w:rFonts w:ascii="Times New Roman" w:hAnsi="Times New Roman"/>
+          <w:b/>
+          <w:sz w:val="24"/>
+        </w:rPr>
+        <w:t>C.I.: 31.985.792</w:t>
+        <w:br/>
+      </w:r>
       <w:r>
         <w:rPr>
           <w:rFonts w:ascii="Times New Roman" w:hAnsi="Times New Roman"/>

</xml_diff>

<commit_message>
Corregir marcadores del indice en borradores
</commit_message>
<xml_diff>
--- a/amaal/reportes/Informe_Pasantia_IUTECP.docx
+++ b/amaal/reportes/Informe_Pasantia_IUTECP.docx
@@ -460,6 +460,7 @@
     </w:p>
     <w:p/>
     <w:p>
+      <w:bookmarkStart w:id="bm_aprob_ind" w:name="bm_aprob_ind"/>
       <w:pPr>
         <w:spacing w:before="480" w:after="480"/>
         <w:jc w:val="center"/>
@@ -472,6 +473,7 @@
         </w:rPr>
         <w:t>APROBACIÓN DEL TUTOR INDUSTRIAL</w:t>
       </w:r>
+      <w:bookmarkEnd w:id="bm_aprob_ind"/>
     </w:p>
     <w:p>
       <w:pPr>
@@ -627,6 +629,7 @@
     </w:p>
     <w:p/>
     <w:p>
+      <w:bookmarkStart w:id="bm_aprob_acad" w:name="bm_aprob_acad"/>
       <w:pPr>
         <w:spacing w:before="480" w:after="480"/>
         <w:jc w:val="center"/>
@@ -639,6 +642,7 @@
         </w:rPr>
         <w:t>APROBACIÓN DEL TUTOR ACADÉMICO</w:t>
       </w:r>
+      <w:bookmarkEnd w:id="bm_aprob_acad"/>
     </w:p>
     <w:p>
       <w:pPr>

</xml_diff>

<commit_message>
Amaal: tutora academica Carmen Alvarez y firma del tutor en aprobacion
</commit_message>
<xml_diff>
--- a/amaal/reportes/Informe_Pasantia_IUTECP.docx
+++ b/amaal/reportes/Informe_Pasantia_IUTECP.docx
@@ -154,7 +154,7 @@
     <w:p>
       <w:pPr>
         <w:sectPr>
-          <w:footerReference w:type="default" r:id="rId14"/>
+          <w:footerReference w:type="default" r:id="rId15"/>
           <w:pgSz w:w="12240" w:h="15840"/>
           <w:pgMar w:top="1701" w:right="1701" w:bottom="1701" w:left="2268" w:header="720" w:footer="720" w:gutter="0"/>
           <w:cols w:space="720"/>
@@ -310,7 +310,7 @@
                 <w:b/>
                 <w:sz w:val="24"/>
               </w:rPr>
-              <w:t>Lic. Mendoza, Carlos</w:t>
+              <w:t>Dra. Álvarez, Carmen</w:t>
               <w:br/>
             </w:r>
             <w:r>
@@ -319,7 +319,7 @@
                 <w:b/>
                 <w:sz w:val="24"/>
               </w:rPr>
-              <w:t>C.I.: 4.273.815</w:t>
+              <w:t>C.I.: 14.452.956</w:t>
             </w:r>
           </w:p>
         </w:tc>
@@ -379,175 +379,6 @@
     <w:p>
       <w:pPr>
         <w:sectPr>
-          <w:footerReference w:type="default" r:id="rId15"/>
-          <w:pgSz w:w="12240" w:h="15840"/>
-          <w:pgMar w:top="1701" w:right="1701" w:bottom="1701" w:left="2268" w:header="720" w:footer="720" w:gutter="0"/>
-          <w:cols w:space="720"/>
-          <w:titlePg/>
-          <w:docGrid w:linePitch="360"/>
-        </w:sectPr>
-      </w:pPr>
-    </w:p>
-    <w:p>
-      <w:pPr>
-        <w:spacing w:line="276" w:lineRule="auto" w:before="0" w:after="0"/>
-        <w:jc w:val="center"/>
-      </w:pPr>
-      <w:r>
-        <w:rPr>
-          <w:rFonts w:ascii="Times New Roman" w:hAnsi="Times New Roman"/>
-          <w:b/>
-          <w:sz w:val="24"/>
-        </w:rPr>
-        <w:t>REPÚBLICA BOLIVARIANA DE VENEZUELA</w:t>
-      </w:r>
-    </w:p>
-    <w:p>
-      <w:pPr>
-        <w:spacing w:line="276" w:lineRule="auto" w:before="0" w:after="0"/>
-        <w:jc w:val="center"/>
-      </w:pPr>
-      <w:r>
-        <w:rPr>
-          <w:rFonts w:ascii="Times New Roman" w:hAnsi="Times New Roman"/>
-          <w:b/>
-          <w:sz w:val="24"/>
-        </w:rPr>
-        <w:t>MINISTERIO DEL PODER POPULAR PARA LA EDUCACIÓN</w:t>
-      </w:r>
-    </w:p>
-    <w:p>
-      <w:pPr>
-        <w:spacing w:line="276" w:lineRule="auto" w:before="0" w:after="0"/>
-        <w:jc w:val="center"/>
-      </w:pPr>
-      <w:r>
-        <w:rPr>
-          <w:rFonts w:ascii="Times New Roman" w:hAnsi="Times New Roman"/>
-          <w:b/>
-          <w:sz w:val="24"/>
-        </w:rPr>
-        <w:t>INSTITUTO UNIVERSITARIO DE TECNOLOGÍA</w:t>
-      </w:r>
-    </w:p>
-    <w:p>
-      <w:pPr>
-        <w:spacing w:line="276" w:lineRule="auto" w:before="0" w:after="0"/>
-        <w:jc w:val="center"/>
-      </w:pPr>
-      <w:r>
-        <w:rPr>
-          <w:rFonts w:ascii="Times New Roman" w:hAnsi="Times New Roman"/>
-          <w:b/>
-          <w:sz w:val="24"/>
-        </w:rPr>
-        <w:t>"ELÍAS CALIXTO POMPA"</w:t>
-      </w:r>
-    </w:p>
-    <w:p>
-      <w:pPr>
-        <w:spacing w:line="276" w:lineRule="auto" w:before="0" w:after="0"/>
-        <w:jc w:val="center"/>
-      </w:pPr>
-      <w:r>
-        <w:rPr>
-          <w:rFonts w:ascii="Times New Roman" w:hAnsi="Times New Roman"/>
-          <w:b/>
-          <w:sz w:val="24"/>
-        </w:rPr>
-        <w:t>EL TIGRE, ESTADO ANZOÁTEGUI</w:t>
-      </w:r>
-    </w:p>
-    <w:p/>
-    <w:p>
-      <w:bookmarkStart w:id="bm_aprob_ind" w:name="bm_aprob_ind"/>
-      <w:pPr>
-        <w:spacing w:before="480" w:after="480"/>
-        <w:jc w:val="center"/>
-      </w:pPr>
-      <w:r>
-        <w:rPr>
-          <w:rFonts w:ascii="Times New Roman" w:hAnsi="Times New Roman"/>
-          <w:b/>
-          <w:sz w:val="24"/>
-        </w:rPr>
-        <w:t>APROBACIÓN DEL TUTOR INDUSTRIAL</w:t>
-      </w:r>
-      <w:bookmarkEnd w:id="bm_aprob_ind"/>
-    </w:p>
-    <w:p>
-      <w:pPr>
-        <w:spacing w:line="360" w:lineRule="auto"/>
-        <w:ind w:firstLine="0"/>
-        <w:jc w:val="both"/>
-      </w:pPr>
-      <w:r>
-        <w:rPr>
-          <w:rFonts w:ascii="Times New Roman" w:hAnsi="Times New Roman"/>
-          <w:sz w:val="24"/>
-        </w:rPr>
-        <w:t>En mi carácter de tutor industrial del informe de pasantías presentado por: Alrifaai Alrifaaie, Amaal, de Cédula de Identidad V-31.985.792; para optar al grado de Técnico Superior Universitario en la especialidad de: Administración, cuyo título es; “EVALUACIÓN DEL CONTROL ADMINISTRATIVO APLICADO A LA GESTIÓN DE SOLICITUDES DE SERVICIOS DE TELECOMUNICACIONES EN LA EMPRESA INGENIERÍA DE TELECOMUNICACIONES, C.A.”, manifiesto que cumple con los requisitos exigidos por el Instituto Universitario de Tecnología “Elías Calixto Pompa” (IUTECP); y que, por lo tanto, considero que reúne los méritos suficientes para ser evaluado por el jurado que se decida designar a tal fin.</w:t>
-      </w:r>
-    </w:p>
-    <w:p/>
-    <w:p/>
-    <w:p>
-      <w:pPr>
-        <w:spacing w:line="360" w:lineRule="auto"/>
-        <w:jc w:val="left"/>
-      </w:pPr>
-      <w:r>
-        <w:rPr>
-          <w:rFonts w:ascii="Times New Roman" w:hAnsi="Times New Roman"/>
-          <w:sz w:val="24"/>
-        </w:rPr>
-        <w:t>En la Ciudad de El Tigre, a los ___ días del mes de _______ de 2026</w:t>
-      </w:r>
-    </w:p>
-    <w:p/>
-    <w:p>
-      <w:pPr>
-        <w:jc w:val="center"/>
-      </w:pPr>
-      <w:r>
-        <w:rPr>
-          <w:rFonts w:ascii="Times New Roman" w:hAnsi="Times New Roman"/>
-          <w:sz w:val="24"/>
-        </w:rPr>
-        <w:t>___________________________________</w:t>
-      </w:r>
-    </w:p>
-    <w:p/>
-    <w:p>
-      <w:pPr>
-        <w:spacing w:line="360" w:lineRule="auto"/>
-        <w:jc w:val="center"/>
-      </w:pPr>
-      <w:r>
-        <w:rPr>
-          <w:rFonts w:ascii="Times New Roman" w:hAnsi="Times New Roman"/>
-          <w:b/>
-          <w:sz w:val="24"/>
-        </w:rPr>
-        <w:t>Mata, Lenny</w:t>
-      </w:r>
-    </w:p>
-    <w:p>
-      <w:pPr>
-        <w:spacing w:before="0"/>
-        <w:jc w:val="center"/>
-      </w:pPr>
-      <w:r>
-        <w:rPr>
-          <w:rFonts w:ascii="Times New Roman" w:hAnsi="Times New Roman"/>
-          <w:sz w:val="24"/>
-        </w:rPr>
-        <w:t>C.I.: 8969750</w:t>
-      </w:r>
-    </w:p>
-    <w:p>
-      <w:pPr>
-        <w:sectPr>
           <w:footerReference w:type="default" r:id="rId16"/>
           <w:pgSz w:w="12240" w:h="15840"/>
           <w:pgMar w:top="1701" w:right="1701" w:bottom="1701" w:left="2268" w:header="720" w:footer="720" w:gutter="0"/>
@@ -629,7 +460,7 @@
     </w:p>
     <w:p/>
     <w:p>
-      <w:bookmarkStart w:id="bm_aprob_acad" w:name="bm_aprob_acad"/>
+      <w:bookmarkStart w:id="bm_aprob_ind" w:name="bm_aprob_ind"/>
       <w:pPr>
         <w:spacing w:before="480" w:after="480"/>
         <w:jc w:val="center"/>
@@ -640,9 +471,9 @@
           <w:b/>
           <w:sz w:val="24"/>
         </w:rPr>
-        <w:t>APROBACIÓN DEL TUTOR ACADÉMICO</w:t>
-      </w:r>
-      <w:bookmarkEnd w:id="bm_aprob_acad"/>
+        <w:t>APROBACIÓN DEL TUTOR INDUSTRIAL</w:t>
+      </w:r>
+      <w:bookmarkEnd w:id="bm_aprob_ind"/>
     </w:p>
     <w:p>
       <w:pPr>
@@ -655,7 +486,7 @@
           <w:rFonts w:ascii="Times New Roman" w:hAnsi="Times New Roman"/>
           <w:sz w:val="24"/>
         </w:rPr>
-        <w:t>En mi carácter de tutor académico del informe de pasantías presentado por: Alrifaai Alrifaaie, Amaal, de Cédula de Identidad V-31.985.792; para optar al grado de Técnico Superior Universitario en la especialidad de: Administración, cuyo título es; “EVALUACIÓN DEL CONTROL ADMINISTRATIVO APLICADO A LA GESTIÓN DE SOLICITUDES DE SERVICIOS DE TELECOMUNICACIONES EN LA EMPRESA INGENIERÍA DE TELECOMUNICACIONES, C.A.”, manifiesto que cumple con los requisitos exigidos por el Instituto Universitario de Tecnología “Elías Calixto Pompa” (IUTECP); y que, por lo tanto, considero que reúne los méritos suficientes para ser evaluado por el jurado que se decida designar a tal fin.</w:t>
+        <w:t>En mi carácter de tutor industrial del informe de pasantías presentado por: Alrifaai Alrifaaie, Amaal, de Cédula de Identidad V-31.985.792; para optar al grado de Técnico Superior Universitario en la especialidad de: Administración, cuyo título es; “EVALUACIÓN DEL CONTROL ADMINISTRATIVO APLICADO A LA GESTIÓN DE SOLICITUDES DE SERVICIOS DE TELECOMUNICACIONES EN LA EMPRESA INGENIERÍA DE TELECOMUNICACIONES, C.A.”, manifiesto que cumple con los requisitos exigidos por el Instituto Universitario de Tecnología “Elías Calixto Pompa” (IUTECP); y que, por lo tanto, considero que reúne los méritos suficientes para ser evaluado por el jurado que se decida designar a tal fin.</w:t>
       </w:r>
     </w:p>
     <w:p/>
@@ -679,11 +510,38 @@
         <w:jc w:val="center"/>
       </w:pPr>
       <w:r>
-        <w:rPr>
-          <w:rFonts w:ascii="Times New Roman" w:hAnsi="Times New Roman"/>
-          <w:sz w:val="24"/>
-        </w:rPr>
-        <w:t>___________________________________</w:t>
+        <w:drawing>
+          <wp:inline xmlns:a="http://schemas.openxmlformats.org/drawingml/2006/main" xmlns:pic="http://schemas.openxmlformats.org/drawingml/2006/picture">
+            <wp:extent cx="1440000" cy="563916"/>
+            <wp:docPr id="2" name="Picture 2"/>
+            <wp:cNvGraphicFramePr>
+              <a:graphicFrameLocks noChangeAspect="1"/>
+            </wp:cNvGraphicFramePr>
+            <a:graphic>
+              <a:graphicData uri="http://schemas.openxmlformats.org/drawingml/2006/picture">
+                <pic:pic>
+                  <pic:nvPicPr>
+                    <pic:cNvPr id="0" name="firma_tutor_amaal.png"/>
+                    <pic:cNvPicPr/>
+                  </pic:nvPicPr>
+                  <pic:blipFill>
+                    <a:blip r:embed="rId10"/>
+                    <a:stretch>
+                      <a:fillRect/>
+                    </a:stretch>
+                  </pic:blipFill>
+                  <pic:spPr>
+                    <a:xfrm>
+                      <a:off x="0" y="0"/>
+                      <a:ext cx="1440000" cy="563916"/>
+                    </a:xfrm>
+                    <a:prstGeom prst="rect"/>
+                  </pic:spPr>
+                </pic:pic>
+              </a:graphicData>
+            </a:graphic>
+          </wp:inline>
+        </w:drawing>
       </w:r>
     </w:p>
     <w:p/>
@@ -698,7 +556,7 @@
           <w:b/>
           <w:sz w:val="24"/>
         </w:rPr>
-        <w:t>Lic. Mendoza, Carlos</w:t>
+        <w:t>Mata, Lenny</w:t>
       </w:r>
     </w:p>
     <w:p>
@@ -711,7 +569,7 @@
           <w:rFonts w:ascii="Times New Roman" w:hAnsi="Times New Roman"/>
           <w:sz w:val="24"/>
         </w:rPr>
-        <w:t>C.I.: 4.273.815</w:t>
+        <w:t>C.I.: 8969750</w:t>
       </w:r>
     </w:p>
     <w:p>
@@ -728,7 +586,7 @@
     </w:p>
     <w:p>
       <w:pPr>
-        <w:spacing w:before="1140" w:after="480"/>
+        <w:spacing w:line="276" w:lineRule="auto" w:before="0" w:after="0"/>
         <w:jc w:val="center"/>
       </w:pPr>
       <w:r>
@@ -737,7 +595,150 @@
           <w:b/>
           <w:sz w:val="24"/>
         </w:rPr>
-        <w:t>ÍNDICE DE CONTENIDO</w:t>
+        <w:t>REPÚBLICA BOLIVARIANA DE VENEZUELA</w:t>
+      </w:r>
+    </w:p>
+    <w:p>
+      <w:pPr>
+        <w:spacing w:line="276" w:lineRule="auto" w:before="0" w:after="0"/>
+        <w:jc w:val="center"/>
+      </w:pPr>
+      <w:r>
+        <w:rPr>
+          <w:rFonts w:ascii="Times New Roman" w:hAnsi="Times New Roman"/>
+          <w:b/>
+          <w:sz w:val="24"/>
+        </w:rPr>
+        <w:t>MINISTERIO DEL PODER POPULAR PARA LA EDUCACIÓN</w:t>
+      </w:r>
+    </w:p>
+    <w:p>
+      <w:pPr>
+        <w:spacing w:line="276" w:lineRule="auto" w:before="0" w:after="0"/>
+        <w:jc w:val="center"/>
+      </w:pPr>
+      <w:r>
+        <w:rPr>
+          <w:rFonts w:ascii="Times New Roman" w:hAnsi="Times New Roman"/>
+          <w:b/>
+          <w:sz w:val="24"/>
+        </w:rPr>
+        <w:t>INSTITUTO UNIVERSITARIO DE TECNOLOGÍA</w:t>
+      </w:r>
+    </w:p>
+    <w:p>
+      <w:pPr>
+        <w:spacing w:line="276" w:lineRule="auto" w:before="0" w:after="0"/>
+        <w:jc w:val="center"/>
+      </w:pPr>
+      <w:r>
+        <w:rPr>
+          <w:rFonts w:ascii="Times New Roman" w:hAnsi="Times New Roman"/>
+          <w:b/>
+          <w:sz w:val="24"/>
+        </w:rPr>
+        <w:t>"ELÍAS CALIXTO POMPA"</w:t>
+      </w:r>
+    </w:p>
+    <w:p>
+      <w:pPr>
+        <w:spacing w:line="276" w:lineRule="auto" w:before="0" w:after="0"/>
+        <w:jc w:val="center"/>
+      </w:pPr>
+      <w:r>
+        <w:rPr>
+          <w:rFonts w:ascii="Times New Roman" w:hAnsi="Times New Roman"/>
+          <w:b/>
+          <w:sz w:val="24"/>
+        </w:rPr>
+        <w:t>EL TIGRE, ESTADO ANZOÁTEGUI</w:t>
+      </w:r>
+    </w:p>
+    <w:p/>
+    <w:p>
+      <w:bookmarkStart w:id="bm_aprob_acad" w:name="bm_aprob_acad"/>
+      <w:pPr>
+        <w:spacing w:before="480" w:after="480"/>
+        <w:jc w:val="center"/>
+      </w:pPr>
+      <w:r>
+        <w:rPr>
+          <w:rFonts w:ascii="Times New Roman" w:hAnsi="Times New Roman"/>
+          <w:b/>
+          <w:sz w:val="24"/>
+        </w:rPr>
+        <w:t>APROBACIÓN DEL TUTOR ACADÉMICO</w:t>
+      </w:r>
+      <w:bookmarkEnd w:id="bm_aprob_acad"/>
+    </w:p>
+    <w:p>
+      <w:pPr>
+        <w:spacing w:line="360" w:lineRule="auto"/>
+        <w:ind w:firstLine="0"/>
+        <w:jc w:val="both"/>
+      </w:pPr>
+      <w:r>
+        <w:rPr>
+          <w:rFonts w:ascii="Times New Roman" w:hAnsi="Times New Roman"/>
+          <w:sz w:val="24"/>
+        </w:rPr>
+        <w:t>En mi carácter de tutor académico del informe de pasantías presentado por: Alrifaai Alrifaaie, Amaal, de Cédula de Identidad V-31.985.792; para optar al grado de Técnico Superior Universitario en la especialidad de: Administración, cuyo título es; “EVALUACIÓN DEL CONTROL ADMINISTRATIVO APLICADO A LA GESTIÓN DE SOLICITUDES DE SERVICIOS DE TELECOMUNICACIONES EN LA EMPRESA INGENIERÍA DE TELECOMUNICACIONES, C.A.”, manifiesto que cumple con los requisitos exigidos por el Instituto Universitario de Tecnología “Elías Calixto Pompa” (IUTECP); y que, por lo tanto, considero que reúne los méritos suficientes para ser evaluado por el jurado que se decida designar a tal fin.</w:t>
+      </w:r>
+    </w:p>
+    <w:p/>
+    <w:p/>
+    <w:p>
+      <w:pPr>
+        <w:spacing w:line="360" w:lineRule="auto"/>
+        <w:jc w:val="left"/>
+      </w:pPr>
+      <w:r>
+        <w:rPr>
+          <w:rFonts w:ascii="Times New Roman" w:hAnsi="Times New Roman"/>
+          <w:sz w:val="24"/>
+        </w:rPr>
+        <w:t>En la Ciudad de El Tigre, a los ___ días del mes de _______ de 2026</w:t>
+      </w:r>
+    </w:p>
+    <w:p/>
+    <w:p>
+      <w:pPr>
+        <w:jc w:val="center"/>
+      </w:pPr>
+      <w:r>
+        <w:rPr>
+          <w:rFonts w:ascii="Times New Roman" w:hAnsi="Times New Roman"/>
+          <w:sz w:val="24"/>
+        </w:rPr>
+        <w:t>___________________________________</w:t>
+      </w:r>
+    </w:p>
+    <w:p/>
+    <w:p>
+      <w:pPr>
+        <w:spacing w:line="360" w:lineRule="auto"/>
+        <w:jc w:val="center"/>
+      </w:pPr>
+      <w:r>
+        <w:rPr>
+          <w:rFonts w:ascii="Times New Roman" w:hAnsi="Times New Roman"/>
+          <w:b/>
+          <w:sz w:val="24"/>
+        </w:rPr>
+        <w:t>Dra. Álvarez, Carmen</w:t>
+      </w:r>
+    </w:p>
+    <w:p>
+      <w:pPr>
+        <w:spacing w:before="0"/>
+        <w:jc w:val="center"/>
+      </w:pPr>
+      <w:r>
+        <w:rPr>
+          <w:rFonts w:ascii="Times New Roman" w:hAnsi="Times New Roman"/>
+          <w:sz w:val="24"/>
+        </w:rPr>
+        <w:t>C.I.: 14.452.956</w:t>
       </w:r>
     </w:p>
     <w:p>
@@ -754,6 +755,32 @@
     </w:p>
     <w:p>
       <w:pPr>
+        <w:spacing w:before="1140" w:after="480"/>
+        <w:jc w:val="center"/>
+      </w:pPr>
+      <w:r>
+        <w:rPr>
+          <w:rFonts w:ascii="Times New Roman" w:hAnsi="Times New Roman"/>
+          <w:b/>
+          <w:sz w:val="24"/>
+        </w:rPr>
+        <w:t>ÍNDICE DE CONTENIDO</w:t>
+      </w:r>
+    </w:p>
+    <w:p>
+      <w:pPr>
+        <w:sectPr>
+          <w:footerReference w:type="default" r:id="rId19"/>
+          <w:pgSz w:w="12240" w:h="15840"/>
+          <w:pgMar w:top="1701" w:right="1701" w:bottom="1701" w:left="2268" w:header="720" w:footer="720" w:gutter="0"/>
+          <w:cols w:space="720"/>
+          <w:titlePg/>
+          <w:docGrid w:linePitch="360"/>
+        </w:sectPr>
+      </w:pPr>
+    </w:p>
+    <w:p>
+      <w:pPr>
         <w:spacing w:after="240"/>
         <w:jc w:val="right"/>
       </w:pPr>
@@ -1770,7 +1797,7 @@
     <w:p>
       <w:pPr>
         <w:sectPr>
-          <w:footerReference w:type="default" r:id="rId19"/>
+          <w:footerReference w:type="default" r:id="rId20"/>
           <w:type w:val="continuous"/>
           <w:pgSz w:w="12240" w:h="15840"/>
           <w:pgMar w:top="1701" w:right="1701" w:bottom="1701" w:left="2268" w:header="720" w:footer="720" w:gutter="0"/>
@@ -1799,7 +1826,7 @@
     <w:p>
       <w:pPr>
         <w:sectPr>
-          <w:footerReference w:type="default" r:id="rId20"/>
+          <w:footerReference w:type="default" r:id="rId21"/>
           <w:pgSz w:w="12240" w:h="15840"/>
           <w:pgMar w:top="1701" w:right="1701" w:bottom="1701" w:left="2268" w:header="720" w:footer="720" w:gutter="0"/>
           <w:cols w:space="720"/>
@@ -1902,7 +1929,7 @@
     <w:p>
       <w:pPr>
         <w:sectPr>
-          <w:footerReference w:type="default" r:id="rId21"/>
+          <w:footerReference w:type="default" r:id="rId22"/>
           <w:type w:val="continuous"/>
           <w:pgSz w:w="12240" w:h="15840"/>
           <w:pgMar w:top="1701" w:right="1701" w:bottom="1701" w:left="2268" w:header="720" w:footer="720" w:gutter="0"/>
@@ -1931,7 +1958,7 @@
     <w:p>
       <w:pPr>
         <w:sectPr>
-          <w:footerReference w:type="default" r:id="rId22"/>
+          <w:footerReference w:type="default" r:id="rId23"/>
           <w:pgSz w:w="12240" w:h="15840"/>
           <w:pgMar w:top="1701" w:right="1701" w:bottom="1701" w:left="2268" w:header="720" w:footer="720" w:gutter="0"/>
           <w:cols w:space="720"/>
@@ -1943,7 +1970,7 @@
     <w:p>
       <w:pPr>
         <w:sectPr>
-          <w:footerReference w:type="default" r:id="rId23"/>
+          <w:footerReference w:type="default" r:id="rId24"/>
           <w:type w:val="continuous"/>
           <w:pgSz w:w="12240" w:h="15840"/>
           <w:pgMar w:top="1701" w:right="1701" w:bottom="1701" w:left="2268" w:header="720" w:footer="720" w:gutter="0"/>
@@ -1972,7 +1999,7 @@
     <w:p>
       <w:pPr>
         <w:sectPr>
-          <w:footerReference w:type="default" r:id="rId24"/>
+          <w:footerReference w:type="default" r:id="rId25"/>
           <w:pgSz w:w="12240" w:h="15840"/>
           <w:pgMar w:top="1701" w:right="1701" w:bottom="1701" w:left="2268" w:header="720" w:footer="720" w:gutter="0"/>
           <w:cols w:space="720"/>
@@ -2107,7 +2134,7 @@
     <w:p>
       <w:pPr>
         <w:sectPr>
-          <w:footerReference w:type="default" r:id="rId25"/>
+          <w:footerReference w:type="default" r:id="rId26"/>
           <w:type w:val="continuous"/>
           <w:pgSz w:w="12240" w:h="15840"/>
           <w:pgMar w:top="1701" w:right="1701" w:bottom="1701" w:left="2268" w:header="720" w:footer="720" w:gutter="0"/>
@@ -2136,7 +2163,7 @@
     <w:p>
       <w:pPr>
         <w:sectPr>
-          <w:footerReference w:type="default" r:id="rId26"/>
+          <w:footerReference w:type="default" r:id="rId27"/>
           <w:pgSz w:w="12240" w:h="15840"/>
           <w:pgMar w:top="1701" w:right="1701" w:bottom="1701" w:left="2268" w:header="720" w:footer="720" w:gutter="0"/>
           <w:cols w:space="720"/>
@@ -2207,7 +2234,7 @@
     <w:p>
       <w:pPr>
         <w:sectPr>
-          <w:footerReference w:type="default" r:id="rId27"/>
+          <w:footerReference w:type="default" r:id="rId28"/>
           <w:type w:val="continuous"/>
           <w:pgSz w:w="12240" w:h="15840"/>
           <w:pgMar w:top="1701" w:right="1701" w:bottom="1701" w:left="2268" w:header="720" w:footer="720" w:gutter="0"/>
@@ -2364,7 +2391,7 @@
     <w:p>
       <w:pPr>
         <w:sectPr>
-          <w:footerReference w:type="default" r:id="rId28"/>
+          <w:footerReference w:type="default" r:id="rId29"/>
           <w:pgSz w:w="12240" w:h="15840"/>
           <w:pgMar w:top="1701" w:right="1701" w:bottom="1701" w:left="2268" w:header="720" w:footer="720" w:gutter="0"/>
           <w:cols w:space="720"/>
@@ -2406,7 +2433,7 @@
     <w:p>
       <w:pPr>
         <w:sectPr>
-          <w:footerReference w:type="default" r:id="rId29"/>
+          <w:footerReference w:type="default" r:id="rId30"/>
           <w:type w:val="continuous"/>
           <w:pgSz w:w="12240" w:h="15840"/>
           <w:pgMar w:top="1701" w:right="1701" w:bottom="1701" w:left="2268" w:header="720" w:footer="720" w:gutter="0"/>
@@ -2435,7 +2462,7 @@
     <w:p>
       <w:pPr>
         <w:sectPr>
-          <w:footerReference w:type="default" r:id="rId30"/>
+          <w:footerReference w:type="default" r:id="rId31"/>
           <w:pgSz w:w="12240" w:h="15840"/>
           <w:pgMar w:top="1701" w:right="1701" w:bottom="1701" w:left="2268" w:header="720" w:footer="720" w:gutter="0"/>
           <w:cols w:space="720"/>
@@ -2462,7 +2489,7 @@
     <w:p>
       <w:pPr>
         <w:sectPr>
-          <w:footerReference w:type="default" r:id="rId31"/>
+          <w:footerReference w:type="default" r:id="rId32"/>
           <w:type w:val="continuous"/>
           <w:pgSz w:w="12240" w:h="15840"/>
           <w:pgMar w:top="1701" w:right="1701" w:bottom="1701" w:left="2268" w:header="720" w:footer="720" w:gutter="0"/>
@@ -2505,7 +2532,7 @@
     <w:p>
       <w:pPr>
         <w:sectPr>
-          <w:footerReference w:type="default" r:id="rId32"/>
+          <w:footerReference w:type="default" r:id="rId33"/>
           <w:pgSz w:w="12240" w:h="15840"/>
           <w:pgMar w:top="1701" w:right="1701" w:bottom="1701" w:left="2268" w:header="720" w:footer="720" w:gutter="0"/>
           <w:cols w:space="720"/>
@@ -2970,7 +2997,7 @@
         <w:drawing>
           <wp:inline xmlns:a="http://schemas.openxmlformats.org/drawingml/2006/main" xmlns:pic="http://schemas.openxmlformats.org/drawingml/2006/picture">
             <wp:extent cx="1800000" cy="1125000"/>
-            <wp:docPr id="2" name="Picture 2"/>
+            <wp:docPr id="3" name="Picture 3"/>
             <wp:cNvGraphicFramePr>
               <a:graphicFrameLocks noChangeAspect="1"/>
             </wp:cNvGraphicFramePr>
@@ -2982,7 +3009,7 @@
                     <pic:cNvPicPr/>
                   </pic:nvPicPr>
                   <pic:blipFill>
-                    <a:blip r:embed="rId10"/>
+                    <a:blip r:embed="rId11"/>
                     <a:stretch>
                       <a:fillRect/>
                     </a:stretch>
@@ -3096,7 +3123,7 @@
         <w:drawing>
           <wp:inline xmlns:a="http://schemas.openxmlformats.org/drawingml/2006/main" xmlns:pic="http://schemas.openxmlformats.org/drawingml/2006/picture">
             <wp:extent cx="4320000" cy="1847904"/>
-            <wp:docPr id="3" name="Picture 3"/>
+            <wp:docPr id="4" name="Picture 4"/>
             <wp:cNvGraphicFramePr>
               <a:graphicFrameLocks noChangeAspect="1"/>
             </wp:cNvGraphicFramePr>
@@ -3108,7 +3135,7 @@
                     <pic:cNvPicPr/>
                   </pic:nvPicPr>
                   <pic:blipFill>
-                    <a:blip r:embed="rId11"/>
+                    <a:blip r:embed="rId12"/>
                     <a:stretch>
                       <a:fillRect/>
                     </a:stretch>
@@ -3160,7 +3187,7 @@
         <w:drawing>
           <wp:inline xmlns:a="http://schemas.openxmlformats.org/drawingml/2006/main" xmlns:pic="http://schemas.openxmlformats.org/drawingml/2006/picture">
             <wp:extent cx="4320000" cy="2680292"/>
-            <wp:docPr id="4" name="Picture 4"/>
+            <wp:docPr id="5" name="Picture 5"/>
             <wp:cNvGraphicFramePr>
               <a:graphicFrameLocks noChangeAspect="1"/>
             </wp:cNvGraphicFramePr>
@@ -3172,7 +3199,7 @@
                     <pic:cNvPicPr/>
                   </pic:nvPicPr>
                   <pic:blipFill>
-                    <a:blip r:embed="rId12"/>
+                    <a:blip r:embed="rId13"/>
                     <a:stretch>
                       <a:fillRect/>
                     </a:stretch>
@@ -3218,7 +3245,7 @@
     <w:p>
       <w:pPr>
         <w:sectPr>
-          <w:footerReference w:type="default" r:id="rId33"/>
+          <w:footerReference w:type="default" r:id="rId34"/>
           <w:type w:val="continuous"/>
           <w:pgSz w:w="12240" w:h="15840"/>
           <w:pgMar w:top="1701" w:right="1701" w:bottom="1701" w:left="2268" w:header="720" w:footer="720" w:gutter="0"/>
@@ -3261,7 +3288,7 @@
     <w:p>
       <w:pPr>
         <w:sectPr>
-          <w:footerReference w:type="default" r:id="rId34"/>
+          <w:footerReference w:type="default" r:id="rId35"/>
           <w:pgSz w:w="12240" w:h="15840"/>
           <w:pgMar w:top="1701" w:right="1701" w:bottom="1701" w:left="2268" w:header="720" w:footer="720" w:gutter="0"/>
           <w:cols w:space="720"/>
@@ -6750,7 +6777,7 @@
     <w:p>
       <w:pPr>
         <w:sectPr>
-          <w:footerReference w:type="default" r:id="rId35"/>
+          <w:footerReference w:type="default" r:id="rId36"/>
           <w:type w:val="continuous"/>
           <w:pgSz w:w="12240" w:h="15840"/>
           <w:pgMar w:top="1701" w:right="1701" w:bottom="1701" w:left="2268" w:header="720" w:footer="720" w:gutter="0"/>
@@ -6793,7 +6820,7 @@
     <w:p>
       <w:pPr>
         <w:sectPr>
-          <w:footerReference w:type="default" r:id="rId36"/>
+          <w:footerReference w:type="default" r:id="rId37"/>
           <w:pgSz w:w="12240" w:h="15840"/>
           <w:pgMar w:top="1701" w:right="1701" w:bottom="1701" w:left="2268" w:header="720" w:footer="720" w:gutter="0"/>
           <w:cols w:space="720"/>
@@ -7197,7 +7224,7 @@
     <w:p>
       <w:pPr>
         <w:sectPr>
-          <w:footerReference w:type="default" r:id="rId37"/>
+          <w:footerReference w:type="default" r:id="rId38"/>
           <w:type w:val="continuous"/>
           <w:pgSz w:w="12240" w:h="15840"/>
           <w:pgMar w:top="1701" w:right="1701" w:bottom="1701" w:left="2268" w:header="720" w:footer="720" w:gutter="0"/>
@@ -7240,7 +7267,7 @@
     <w:p>
       <w:pPr>
         <w:sectPr>
-          <w:footerReference w:type="default" r:id="rId38"/>
+          <w:footerReference w:type="default" r:id="rId39"/>
           <w:pgSz w:w="12240" w:h="15840"/>
           <w:pgMar w:top="1701" w:right="1701" w:bottom="1701" w:left="2268" w:header="720" w:footer="720" w:gutter="0"/>
           <w:cols w:space="720"/>
@@ -8003,7 +8030,7 @@
     <w:p>
       <w:pPr>
         <w:sectPr>
-          <w:footerReference w:type="default" r:id="rId39"/>
+          <w:footerReference w:type="default" r:id="rId40"/>
           <w:type w:val="continuous"/>
           <w:pgSz w:w="12240" w:h="15840"/>
           <w:pgMar w:top="1701" w:right="1701" w:bottom="1701" w:left="2268" w:header="720" w:footer="720" w:gutter="0"/>
@@ -8046,7 +8073,7 @@
     <w:p>
       <w:pPr>
         <w:sectPr>
-          <w:footerReference w:type="default" r:id="rId40"/>
+          <w:footerReference w:type="default" r:id="rId41"/>
           <w:pgSz w:w="12240" w:h="15840"/>
           <w:pgMar w:top="1701" w:right="1701" w:bottom="1701" w:left="2268" w:header="720" w:footer="720" w:gutter="0"/>
           <w:cols w:space="720"/>
@@ -8258,7 +8285,7 @@
     <w:p>
       <w:pPr>
         <w:sectPr>
-          <w:footerReference w:type="default" r:id="rId41"/>
+          <w:footerReference w:type="default" r:id="rId42"/>
           <w:type w:val="continuous"/>
           <w:pgSz w:w="12240" w:h="15840"/>
           <w:pgMar w:top="1701" w:right="1701" w:bottom="1701" w:left="2268" w:header="720" w:footer="720" w:gutter="0"/>
@@ -8287,7 +8314,7 @@
     <w:p>
       <w:pPr>
         <w:sectPr>
-          <w:footerReference w:type="default" r:id="rId42"/>
+          <w:footerReference w:type="default" r:id="rId43"/>
           <w:pgSz w:w="12240" w:h="15840"/>
           <w:pgMar w:top="1701" w:right="1701" w:bottom="1701" w:left="2268" w:header="720" w:footer="720" w:gutter="0"/>
           <w:cols w:space="720"/>
@@ -8416,7 +8443,7 @@
     <w:p>
       <w:pPr>
         <w:sectPr>
-          <w:footerReference w:type="default" r:id="rId43"/>
+          <w:footerReference w:type="default" r:id="rId44"/>
           <w:type w:val="continuous"/>
           <w:pgSz w:w="12240" w:h="15840"/>
           <w:pgMar w:top="1701" w:right="1701" w:bottom="1701" w:left="2268" w:header="720" w:footer="720" w:gutter="0"/>
@@ -8445,7 +8472,7 @@
     <w:p>
       <w:pPr>
         <w:sectPr>
-          <w:footerReference w:type="default" r:id="rId44"/>
+          <w:footerReference w:type="default" r:id="rId45"/>
           <w:pgSz w:w="12240" w:h="15840"/>
           <w:pgMar w:top="1701" w:right="1701" w:bottom="1701" w:left="2268" w:header="720" w:footer="720" w:gutter="0"/>
           <w:cols w:space="720"/>
@@ -8492,7 +8519,7 @@
         <w:drawing>
           <wp:inline xmlns:a="http://schemas.openxmlformats.org/drawingml/2006/main" xmlns:pic="http://schemas.openxmlformats.org/drawingml/2006/picture">
             <wp:extent cx="1341609" cy="6120000"/>
-            <wp:docPr id="5" name="Picture 5"/>
+            <wp:docPr id="6" name="Picture 6"/>
             <wp:cNvGraphicFramePr>
               <a:graphicFrameLocks noChangeAspect="1"/>
             </wp:cNvGraphicFramePr>
@@ -8504,7 +8531,7 @@
                     <pic:cNvPicPr/>
                   </pic:nvPicPr>
                   <pic:blipFill>
-                    <a:blip r:embed="rId13"/>
+                    <a:blip r:embed="rId14"/>
                     <a:stretch>
                       <a:fillRect/>
                     </a:stretch>
@@ -8524,7 +8551,7 @@
       </w:r>
     </w:p>
     <w:sectPr>
-      <w:footerReference w:type="default" r:id="rId45"/>
+      <w:footerReference w:type="default" r:id="rId46"/>
       <w:pgSz w:w="12240" w:h="15840"/>
       <w:pgMar w:top="1701" w:right="1701" w:bottom="1701" w:left="2268" w:header="720" w:footer="720" w:gutter="0"/>
       <w:cols w:space="720"/>

</xml_diff>

<commit_message>
Recompilar todos los entregables (2)
</commit_message>
<xml_diff>
--- a/amaal/reportes/Informe_Pasantia_IUTECP.docx
+++ b/amaal/reportes/Informe_Pasantia_IUTECP.docx
@@ -3120,21 +3120,6 @@
       </w:r>
     </w:p>
     <w:p>
-      <w:pPr>
-        <w:spacing w:line="360" w:lineRule="auto" w:after="0" w:before="0"/>
-        <w:ind w:firstLine="709"/>
-        <w:jc w:val="both"/>
-      </w:pPr>
-      <w:r>
-        <w:rPr>
-          <w:rFonts w:ascii="Times New Roman" w:hAnsi="Times New Roman"/>
-          <w:i w:val="0"/>
-          <w:sz w:val="24"/>
-        </w:rPr>
-        <w:t>El logotipo identifica visualmente a Ingeniería de Telecomunicaciones, C.A. y representa la imagen institucional de la empresa donde se desarrolló la pasantía profesional en las áreas de Atención al Cliente y Administración.</w:t>
-      </w:r>
-    </w:p>
-    <w:p>
       <w:bookmarkStart w:id="bm_cap1_ubic" w:name="bm_cap1_ubic"/>
       <w:pPr>
         <w:spacing w:before="480" w:after="480" w:line="360" w:lineRule="auto"/>
@@ -3507,6 +3492,20 @@
     </w:p>
     <w:p>
       <w:pPr>
+        <w:spacing w:before="480" w:after="480" w:line="360" w:lineRule="auto"/>
+        <w:jc w:val="left"/>
+      </w:pPr>
+      <w:r>
+        <w:rPr>
+          <w:rFonts w:ascii="Times New Roman" w:hAnsi="Times New Roman"/>
+          <w:b/>
+          <w:sz w:val="24"/>
+        </w:rPr>
+        <w:t>Nivel macro</w:t>
+      </w:r>
+    </w:p>
+    <w:p>
+      <w:pPr>
         <w:spacing w:line="360" w:lineRule="auto" w:after="0" w:before="0"/>
         <w:ind w:firstLine="709"/>
         <w:jc w:val="both"/>
@@ -3522,6 +3521,20 @@
     </w:p>
     <w:p>
       <w:pPr>
+        <w:spacing w:before="480" w:after="480" w:line="360" w:lineRule="auto"/>
+        <w:jc w:val="left"/>
+      </w:pPr>
+      <w:r>
+        <w:rPr>
+          <w:rFonts w:ascii="Times New Roman" w:hAnsi="Times New Roman"/>
+          <w:b/>
+          <w:sz w:val="24"/>
+        </w:rPr>
+        <w:t>Nivel meso</w:t>
+      </w:r>
+    </w:p>
+    <w:p>
+      <w:pPr>
         <w:spacing w:line="360" w:lineRule="auto" w:after="0" w:before="0"/>
         <w:ind w:firstLine="709"/>
         <w:jc w:val="both"/>
@@ -3537,6 +3550,20 @@
     </w:p>
     <w:p>
       <w:pPr>
+        <w:spacing w:before="480" w:after="480" w:line="360" w:lineRule="auto"/>
+        <w:jc w:val="left"/>
+      </w:pPr>
+      <w:r>
+        <w:rPr>
+          <w:rFonts w:ascii="Times New Roman" w:hAnsi="Times New Roman"/>
+          <w:b/>
+          <w:sz w:val="24"/>
+        </w:rPr>
+        <w:t>Nivel micro</w:t>
+      </w:r>
+    </w:p>
+    <w:p>
+      <w:pPr>
         <w:spacing w:line="360" w:lineRule="auto" w:after="0" w:before="0"/>
         <w:ind w:firstLine="709"/>
         <w:jc w:val="both"/>
@@ -3563,6 +3590,20 @@
           <w:sz w:val="24"/>
         </w:rPr>
         <w:t>Las principales manifestaciones se relacionan con demoras en la actualización de casos, comunicación fragmentada entre áreas, ausencia de tiempos de referencia por etapa y carencia de indicadores básicos de seguimiento. Como consecuencias pueden generarse reprocesos, mayor tiempo de respuesta y dificultades para ofrecer al suscriptor información precisa sobre el estado de su solicitud.</w:t>
+      </w:r>
+    </w:p>
+    <w:p>
+      <w:pPr>
+        <w:spacing w:before="480" w:after="480" w:line="360" w:lineRule="auto"/>
+        <w:jc w:val="left"/>
+      </w:pPr>
+      <w:r>
+        <w:rPr>
+          <w:rFonts w:ascii="Times New Roman" w:hAnsi="Times New Roman"/>
+          <w:b/>
+          <w:sz w:val="24"/>
+        </w:rPr>
+        <w:t>Técnica empleada para el diagnóstico</w:t>
       </w:r>
     </w:p>
     <w:p>
@@ -8952,7 +8993,7 @@
       <w:r>
         <w:drawing>
           <wp:inline xmlns:a="http://schemas.openxmlformats.org/drawingml/2006/main" xmlns:pic="http://schemas.openxmlformats.org/drawingml/2006/picture">
-            <wp:extent cx="4860000" cy="22169805"/>
+            <wp:extent cx="3960000" cy="18064286"/>
             <wp:docPr id="7" name="Picture 7"/>
             <wp:cNvGraphicFramePr>
               <a:graphicFrameLocks noChangeAspect="1"/>
@@ -8973,7 +9014,7 @@
                   <pic:spPr>
                     <a:xfrm>
                       <a:off x="0" y="0"/>
-                      <a:ext cx="4860000" cy="22169805"/>
+                      <a:ext cx="3960000" cy="18064286"/>
                     </a:xfrm>
                     <a:prstGeom prst="rect"/>
                   </pic:spPr>

</xml_diff>

<commit_message>
Soportar dimensiones de imagen en anexos y recompilar todo
</commit_message>
<xml_diff>
--- a/amaal/reportes/Informe_Pasantia_IUTECP.docx
+++ b/amaal/reportes/Informe_Pasantia_IUTECP.docx
@@ -154,7 +154,7 @@
     <w:p>
       <w:pPr>
         <w:sectPr>
-          <w:footerReference w:type="default" r:id="rId16"/>
+          <w:footerReference w:type="default" r:id="rId15"/>
           <w:pgSz w:w="12240" w:h="15840"/>
           <w:pgMar w:top="1701" w:right="1701" w:bottom="1701" w:left="2268" w:header="720" w:footer="720" w:gutter="0"/>
           <w:cols w:space="720"/>
@@ -379,7 +379,7 @@
     <w:p>
       <w:pPr>
         <w:sectPr>
-          <w:footerReference w:type="default" r:id="rId17"/>
+          <w:footerReference w:type="default" r:id="rId16"/>
           <w:pgSz w:w="12240" w:h="15840"/>
           <w:pgMar w:top="1701" w:right="1701" w:bottom="1701" w:left="2268" w:header="720" w:footer="720" w:gutter="0"/>
           <w:cols w:space="720"/>
@@ -575,6 +575,175 @@
     <w:p>
       <w:pPr>
         <w:sectPr>
+          <w:footerReference w:type="default" r:id="rId17"/>
+          <w:pgSz w:w="12240" w:h="15840"/>
+          <w:pgMar w:top="1701" w:right="1701" w:bottom="1701" w:left="2268" w:header="720" w:footer="720" w:gutter="0"/>
+          <w:cols w:space="720"/>
+          <w:titlePg/>
+          <w:docGrid w:linePitch="360"/>
+        </w:sectPr>
+      </w:pPr>
+    </w:p>
+    <w:p>
+      <w:pPr>
+        <w:spacing w:line="276" w:lineRule="auto" w:before="0" w:after="0"/>
+        <w:jc w:val="center"/>
+      </w:pPr>
+      <w:r>
+        <w:rPr>
+          <w:rFonts w:ascii="Times New Roman" w:hAnsi="Times New Roman"/>
+          <w:b/>
+          <w:sz w:val="24"/>
+        </w:rPr>
+        <w:t>REPÚBLICA BOLIVARIANA DE VENEZUELA</w:t>
+      </w:r>
+    </w:p>
+    <w:p>
+      <w:pPr>
+        <w:spacing w:line="276" w:lineRule="auto" w:before="0" w:after="0"/>
+        <w:jc w:val="center"/>
+      </w:pPr>
+      <w:r>
+        <w:rPr>
+          <w:rFonts w:ascii="Times New Roman" w:hAnsi="Times New Roman"/>
+          <w:b/>
+          <w:sz w:val="24"/>
+        </w:rPr>
+        <w:t>MINISTERIO DEL PODER POPULAR PARA LA EDUCACIÓN UNIVERSITARIA</w:t>
+      </w:r>
+    </w:p>
+    <w:p>
+      <w:pPr>
+        <w:spacing w:line="276" w:lineRule="auto" w:before="0" w:after="0"/>
+        <w:jc w:val="center"/>
+      </w:pPr>
+      <w:r>
+        <w:rPr>
+          <w:rFonts w:ascii="Times New Roman" w:hAnsi="Times New Roman"/>
+          <w:b/>
+          <w:sz w:val="24"/>
+        </w:rPr>
+        <w:t>INSTITUTO UNIVERSITARIO DE TECNOLOGÍA</w:t>
+      </w:r>
+    </w:p>
+    <w:p>
+      <w:pPr>
+        <w:spacing w:line="276" w:lineRule="auto" w:before="0" w:after="0"/>
+        <w:jc w:val="center"/>
+      </w:pPr>
+      <w:r>
+        <w:rPr>
+          <w:rFonts w:ascii="Times New Roman" w:hAnsi="Times New Roman"/>
+          <w:b/>
+          <w:sz w:val="24"/>
+        </w:rPr>
+        <w:t>"ELÍAS CALIXTO POMPA"</w:t>
+      </w:r>
+    </w:p>
+    <w:p>
+      <w:pPr>
+        <w:spacing w:line="276" w:lineRule="auto" w:before="0" w:after="0"/>
+        <w:jc w:val="center"/>
+      </w:pPr>
+      <w:r>
+        <w:rPr>
+          <w:rFonts w:ascii="Times New Roman" w:hAnsi="Times New Roman"/>
+          <w:b/>
+          <w:sz w:val="24"/>
+        </w:rPr>
+        <w:t>EL TIGRE, ESTADO ANZOÁTEGUI</w:t>
+      </w:r>
+    </w:p>
+    <w:p/>
+    <w:p>
+      <w:bookmarkStart w:id="bm_aprob_acad" w:name="bm_aprob_acad"/>
+      <w:pPr>
+        <w:spacing w:before="480" w:after="480"/>
+        <w:jc w:val="center"/>
+      </w:pPr>
+      <w:r>
+        <w:rPr>
+          <w:rFonts w:ascii="Times New Roman" w:hAnsi="Times New Roman"/>
+          <w:b/>
+          <w:sz w:val="24"/>
+        </w:rPr>
+        <w:t>APROBACIÓN DEL TUTOR ACADÉMICO</w:t>
+      </w:r>
+      <w:bookmarkEnd w:id="bm_aprob_acad"/>
+    </w:p>
+    <w:p>
+      <w:pPr>
+        <w:spacing w:line="360" w:lineRule="auto"/>
+        <w:ind w:firstLine="0"/>
+        <w:jc w:val="both"/>
+      </w:pPr>
+      <w:r>
+        <w:rPr>
+          <w:rFonts w:ascii="Times New Roman" w:hAnsi="Times New Roman"/>
+          <w:sz w:val="24"/>
+        </w:rPr>
+        <w:t>En mi carácter de tutor académico del informe de pasantías presentado por: Alrifaai Alrifaaie, Amaal, de Cédula de Identidad V-31.985.792; para optar al grado de Técnico Superior Universitario en la especialidad de: Administración, cuyo título es; “EVALUACIÓN DEL CONTROL ADMINISTRATIVO APLICADO A LA GESTIÓN DE SOLICITUDES DE SERVICIOS DE TELECOMUNICACIONES EN LA EMPRESA INGENIERÍA DE TELECOMUNICACIONES, C.A.”, manifiesto que cumple con los requisitos exigidos por el Instituto Universitario de Tecnología “Elías Calixto Pompa” (IUTECP); y que, por lo tanto, considero que reúne los méritos suficientes para ser evaluado por el jurado que se decida designar a tal fin.</w:t>
+      </w:r>
+    </w:p>
+    <w:p/>
+    <w:p/>
+    <w:p>
+      <w:pPr>
+        <w:spacing w:line="360" w:lineRule="auto"/>
+        <w:jc w:val="left"/>
+      </w:pPr>
+      <w:r>
+        <w:rPr>
+          <w:rFonts w:ascii="Times New Roman" w:hAnsi="Times New Roman"/>
+          <w:sz w:val="24"/>
+        </w:rPr>
+        <w:t>En la Ciudad de El Tigre, a los ___ días del mes de _______ de 2026</w:t>
+      </w:r>
+    </w:p>
+    <w:p/>
+    <w:p>
+      <w:pPr>
+        <w:jc w:val="center"/>
+      </w:pPr>
+      <w:r>
+        <w:rPr>
+          <w:rFonts w:ascii="Times New Roman" w:hAnsi="Times New Roman"/>
+          <w:sz w:val="24"/>
+        </w:rPr>
+        <w:t>___________________________________</w:t>
+      </w:r>
+    </w:p>
+    <w:p/>
+    <w:p>
+      <w:pPr>
+        <w:spacing w:line="360" w:lineRule="auto"/>
+        <w:jc w:val="center"/>
+      </w:pPr>
+      <w:r>
+        <w:rPr>
+          <w:rFonts w:ascii="Times New Roman" w:hAnsi="Times New Roman"/>
+          <w:b/>
+          <w:sz w:val="24"/>
+        </w:rPr>
+        <w:t>Dra. Álvarez, Carmen</w:t>
+      </w:r>
+    </w:p>
+    <w:p>
+      <w:pPr>
+        <w:spacing w:before="0"/>
+        <w:jc w:val="center"/>
+      </w:pPr>
+      <w:r>
+        <w:rPr>
+          <w:rFonts w:ascii="Times New Roman" w:hAnsi="Times New Roman"/>
+          <w:sz w:val="24"/>
+        </w:rPr>
+        <w:t>C.I.: 14.452.956</w:t>
+      </w:r>
+    </w:p>
+    <w:p>
+      <w:pPr>
+        <w:sectPr>
           <w:footerReference w:type="default" r:id="rId18"/>
           <w:pgSz w:w="12240" w:h="15840"/>
           <w:pgMar w:top="1701" w:right="1701" w:bottom="1701" w:left="2268" w:header="720" w:footer="720" w:gutter="0"/>
@@ -586,7 +755,7 @@
     </w:p>
     <w:p>
       <w:pPr>
-        <w:spacing w:line="276" w:lineRule="auto" w:before="0" w:after="0"/>
+        <w:spacing w:before="1140" w:after="480"/>
         <w:jc w:val="center"/>
       </w:pPr>
       <w:r>
@@ -595,150 +764,7 @@
           <w:b/>
           <w:sz w:val="24"/>
         </w:rPr>
-        <w:t>REPÚBLICA BOLIVARIANA DE VENEZUELA</w:t>
-      </w:r>
-    </w:p>
-    <w:p>
-      <w:pPr>
-        <w:spacing w:line="276" w:lineRule="auto" w:before="0" w:after="0"/>
-        <w:jc w:val="center"/>
-      </w:pPr>
-      <w:r>
-        <w:rPr>
-          <w:rFonts w:ascii="Times New Roman" w:hAnsi="Times New Roman"/>
-          <w:b/>
-          <w:sz w:val="24"/>
-        </w:rPr>
-        <w:t>MINISTERIO DEL PODER POPULAR PARA LA EDUCACIÓN UNIVERSITARIA</w:t>
-      </w:r>
-    </w:p>
-    <w:p>
-      <w:pPr>
-        <w:spacing w:line="276" w:lineRule="auto" w:before="0" w:after="0"/>
-        <w:jc w:val="center"/>
-      </w:pPr>
-      <w:r>
-        <w:rPr>
-          <w:rFonts w:ascii="Times New Roman" w:hAnsi="Times New Roman"/>
-          <w:b/>
-          <w:sz w:val="24"/>
-        </w:rPr>
-        <w:t>INSTITUTO UNIVERSITARIO DE TECNOLOGÍA</w:t>
-      </w:r>
-    </w:p>
-    <w:p>
-      <w:pPr>
-        <w:spacing w:line="276" w:lineRule="auto" w:before="0" w:after="0"/>
-        <w:jc w:val="center"/>
-      </w:pPr>
-      <w:r>
-        <w:rPr>
-          <w:rFonts w:ascii="Times New Roman" w:hAnsi="Times New Roman"/>
-          <w:b/>
-          <w:sz w:val="24"/>
-        </w:rPr>
-        <w:t>"ELÍAS CALIXTO POMPA"</w:t>
-      </w:r>
-    </w:p>
-    <w:p>
-      <w:pPr>
-        <w:spacing w:line="276" w:lineRule="auto" w:before="0" w:after="0"/>
-        <w:jc w:val="center"/>
-      </w:pPr>
-      <w:r>
-        <w:rPr>
-          <w:rFonts w:ascii="Times New Roman" w:hAnsi="Times New Roman"/>
-          <w:b/>
-          <w:sz w:val="24"/>
-        </w:rPr>
-        <w:t>EL TIGRE, ESTADO ANZOÁTEGUI</w:t>
-      </w:r>
-    </w:p>
-    <w:p/>
-    <w:p>
-      <w:bookmarkStart w:id="bm_aprob_acad" w:name="bm_aprob_acad"/>
-      <w:pPr>
-        <w:spacing w:before="480" w:after="480"/>
-        <w:jc w:val="center"/>
-      </w:pPr>
-      <w:r>
-        <w:rPr>
-          <w:rFonts w:ascii="Times New Roman" w:hAnsi="Times New Roman"/>
-          <w:b/>
-          <w:sz w:val="24"/>
-        </w:rPr>
-        <w:t>APROBACIÓN DEL TUTOR ACADÉMICO</w:t>
-      </w:r>
-      <w:bookmarkEnd w:id="bm_aprob_acad"/>
-    </w:p>
-    <w:p>
-      <w:pPr>
-        <w:spacing w:line="360" w:lineRule="auto"/>
-        <w:ind w:firstLine="0"/>
-        <w:jc w:val="both"/>
-      </w:pPr>
-      <w:r>
-        <w:rPr>
-          <w:rFonts w:ascii="Times New Roman" w:hAnsi="Times New Roman"/>
-          <w:sz w:val="24"/>
-        </w:rPr>
-        <w:t>En mi carácter de tutor académico del informe de pasantías presentado por: Alrifaai Alrifaaie, Amaal, de Cédula de Identidad V-31.985.792; para optar al grado de Técnico Superior Universitario en la especialidad de: Administración, cuyo título es; “EVALUACIÓN DEL CONTROL ADMINISTRATIVO APLICADO A LA GESTIÓN DE SOLICITUDES DE SERVICIOS DE TELECOMUNICACIONES EN LA EMPRESA INGENIERÍA DE TELECOMUNICACIONES, C.A.”, manifiesto que cumple con los requisitos exigidos por el Instituto Universitario de Tecnología “Elías Calixto Pompa” (IUTECP); y que, por lo tanto, considero que reúne los méritos suficientes para ser evaluado por el jurado que se decida designar a tal fin.</w:t>
-      </w:r>
-    </w:p>
-    <w:p/>
-    <w:p/>
-    <w:p>
-      <w:pPr>
-        <w:spacing w:line="360" w:lineRule="auto"/>
-        <w:jc w:val="left"/>
-      </w:pPr>
-      <w:r>
-        <w:rPr>
-          <w:rFonts w:ascii="Times New Roman" w:hAnsi="Times New Roman"/>
-          <w:sz w:val="24"/>
-        </w:rPr>
-        <w:t>En la Ciudad de El Tigre, a los ___ días del mes de _______ de 2026</w:t>
-      </w:r>
-    </w:p>
-    <w:p/>
-    <w:p>
-      <w:pPr>
-        <w:jc w:val="center"/>
-      </w:pPr>
-      <w:r>
-        <w:rPr>
-          <w:rFonts w:ascii="Times New Roman" w:hAnsi="Times New Roman"/>
-          <w:sz w:val="24"/>
-        </w:rPr>
-        <w:t>___________________________________</w:t>
-      </w:r>
-    </w:p>
-    <w:p/>
-    <w:p>
-      <w:pPr>
-        <w:spacing w:line="360" w:lineRule="auto"/>
-        <w:jc w:val="center"/>
-      </w:pPr>
-      <w:r>
-        <w:rPr>
-          <w:rFonts w:ascii="Times New Roman" w:hAnsi="Times New Roman"/>
-          <w:b/>
-          <w:sz w:val="24"/>
-        </w:rPr>
-        <w:t>Dra. Álvarez, Carmen</w:t>
-      </w:r>
-    </w:p>
-    <w:p>
-      <w:pPr>
-        <w:spacing w:before="0"/>
-        <w:jc w:val="center"/>
-      </w:pPr>
-      <w:r>
-        <w:rPr>
-          <w:rFonts w:ascii="Times New Roman" w:hAnsi="Times New Roman"/>
-          <w:sz w:val="24"/>
-        </w:rPr>
-        <w:t>C.I.: 14.452.956</w:t>
+        <w:t>ÍNDICE DE CONTENIDO</w:t>
       </w:r>
     </w:p>
     <w:p>
@@ -755,32 +781,6 @@
     </w:p>
     <w:p>
       <w:pPr>
-        <w:spacing w:before="1140" w:after="480"/>
-        <w:jc w:val="center"/>
-      </w:pPr>
-      <w:r>
-        <w:rPr>
-          <w:rFonts w:ascii="Times New Roman" w:hAnsi="Times New Roman"/>
-          <w:b/>
-          <w:sz w:val="24"/>
-        </w:rPr>
-        <w:t>ÍNDICE DE CONTENIDO</w:t>
-      </w:r>
-    </w:p>
-    <w:p>
-      <w:pPr>
-        <w:sectPr>
-          <w:footerReference w:type="default" r:id="rId20"/>
-          <w:pgSz w:w="12240" w:h="15840"/>
-          <w:pgMar w:top="1701" w:right="1701" w:bottom="1701" w:left="2268" w:header="720" w:footer="720" w:gutter="0"/>
-          <w:cols w:space="720"/>
-          <w:titlePg/>
-          <w:docGrid w:linePitch="360"/>
-        </w:sectPr>
-      </w:pPr>
-    </w:p>
-    <w:p>
-      <w:pPr>
         <w:spacing w:after="240"/>
         <w:jc w:val="right"/>
       </w:pPr>
@@ -1797,7 +1797,7 @@
     <w:p>
       <w:pPr>
         <w:sectPr>
-          <w:footerReference w:type="default" r:id="rId21"/>
+          <w:footerReference w:type="default" r:id="rId20"/>
           <w:type w:val="continuous"/>
           <w:pgSz w:w="12240" w:h="15840"/>
           <w:pgMar w:top="1701" w:right="1701" w:bottom="1701" w:left="2268" w:header="720" w:footer="720" w:gutter="0"/>
@@ -1826,7 +1826,7 @@
     <w:p>
       <w:pPr>
         <w:sectPr>
-          <w:footerReference w:type="default" r:id="rId22"/>
+          <w:footerReference w:type="default" r:id="rId21"/>
           <w:pgSz w:w="12240" w:h="15840"/>
           <w:pgMar w:top="1701" w:right="1701" w:bottom="1701" w:left="2268" w:header="720" w:footer="720" w:gutter="0"/>
           <w:cols w:space="720"/>
@@ -1929,7 +1929,7 @@
     <w:p>
       <w:pPr>
         <w:sectPr>
-          <w:footerReference w:type="default" r:id="rId23"/>
+          <w:footerReference w:type="default" r:id="rId22"/>
           <w:type w:val="continuous"/>
           <w:pgSz w:w="12240" w:h="15840"/>
           <w:pgMar w:top="1701" w:right="1701" w:bottom="1701" w:left="2268" w:header="720" w:footer="720" w:gutter="0"/>
@@ -1958,7 +1958,7 @@
     <w:p>
       <w:pPr>
         <w:sectPr>
-          <w:footerReference w:type="default" r:id="rId24"/>
+          <w:footerReference w:type="default" r:id="rId23"/>
           <w:pgSz w:w="12240" w:h="15840"/>
           <w:pgMar w:top="1701" w:right="1701" w:bottom="1701" w:left="2268" w:header="720" w:footer="720" w:gutter="0"/>
           <w:cols w:space="720"/>
@@ -1970,7 +1970,7 @@
     <w:p>
       <w:pPr>
         <w:sectPr>
-          <w:footerReference w:type="default" r:id="rId25"/>
+          <w:footerReference w:type="default" r:id="rId24"/>
           <w:type w:val="continuous"/>
           <w:pgSz w:w="12240" w:h="15840"/>
           <w:pgMar w:top="1701" w:right="1701" w:bottom="1701" w:left="2268" w:header="720" w:footer="720" w:gutter="0"/>
@@ -1999,7 +1999,7 @@
     <w:p>
       <w:pPr>
         <w:sectPr>
-          <w:footerReference w:type="default" r:id="rId26"/>
+          <w:footerReference w:type="default" r:id="rId25"/>
           <w:pgSz w:w="12240" w:h="15840"/>
           <w:pgMar w:top="1701" w:right="1701" w:bottom="1701" w:left="2268" w:header="720" w:footer="720" w:gutter="0"/>
           <w:cols w:space="720"/>
@@ -2166,7 +2166,7 @@
     <w:p>
       <w:pPr>
         <w:sectPr>
-          <w:footerReference w:type="default" r:id="rId27"/>
+          <w:footerReference w:type="default" r:id="rId26"/>
           <w:type w:val="continuous"/>
           <w:pgSz w:w="12240" w:h="15840"/>
           <w:pgMar w:top="1701" w:right="1701" w:bottom="1701" w:left="2268" w:header="720" w:footer="720" w:gutter="0"/>
@@ -2195,7 +2195,7 @@
     <w:p>
       <w:pPr>
         <w:sectPr>
-          <w:footerReference w:type="default" r:id="rId28"/>
+          <w:footerReference w:type="default" r:id="rId27"/>
           <w:pgSz w:w="12240" w:h="15840"/>
           <w:pgMar w:top="1701" w:right="1701" w:bottom="1701" w:left="2268" w:header="720" w:footer="720" w:gutter="0"/>
           <w:cols w:space="720"/>
@@ -2266,7 +2266,7 @@
     <w:p>
       <w:pPr>
         <w:sectPr>
-          <w:footerReference w:type="default" r:id="rId29"/>
+          <w:footerReference w:type="default" r:id="rId28"/>
           <w:type w:val="continuous"/>
           <w:pgSz w:w="12240" w:h="15840"/>
           <w:pgMar w:top="1701" w:right="1701" w:bottom="1701" w:left="2268" w:header="720" w:footer="720" w:gutter="0"/>
@@ -2423,7 +2423,7 @@
     <w:p>
       <w:pPr>
         <w:sectPr>
-          <w:footerReference w:type="default" r:id="rId30"/>
+          <w:footerReference w:type="default" r:id="rId29"/>
           <w:pgSz w:w="12240" w:h="15840"/>
           <w:pgMar w:top="1701" w:right="1701" w:bottom="1701" w:left="2268" w:header="720" w:footer="720" w:gutter="0"/>
           <w:cols w:space="720"/>
@@ -2465,7 +2465,7 @@
     <w:p>
       <w:pPr>
         <w:sectPr>
-          <w:footerReference w:type="default" r:id="rId31"/>
+          <w:footerReference w:type="default" r:id="rId30"/>
           <w:type w:val="continuous"/>
           <w:pgSz w:w="12240" w:h="15840"/>
           <w:pgMar w:top="1701" w:right="1701" w:bottom="1701" w:left="2268" w:header="720" w:footer="720" w:gutter="0"/>
@@ -2494,7 +2494,7 @@
     <w:p>
       <w:pPr>
         <w:sectPr>
-          <w:footerReference w:type="default" r:id="rId32"/>
+          <w:footerReference w:type="default" r:id="rId31"/>
           <w:pgSz w:w="12240" w:h="15840"/>
           <w:pgMar w:top="1701" w:right="1701" w:bottom="1701" w:left="2268" w:header="720" w:footer="720" w:gutter="0"/>
           <w:cols w:space="720"/>
@@ -2566,7 +2566,7 @@
     <w:p>
       <w:pPr>
         <w:sectPr>
-          <w:footerReference w:type="default" r:id="rId33"/>
+          <w:footerReference w:type="default" r:id="rId32"/>
           <w:type w:val="continuous"/>
           <w:pgSz w:w="12240" w:h="15840"/>
           <w:pgMar w:top="1701" w:right="1701" w:bottom="1701" w:left="2268" w:header="720" w:footer="720" w:gutter="0"/>
@@ -2609,7 +2609,7 @@
     <w:p>
       <w:pPr>
         <w:sectPr>
-          <w:footerReference w:type="default" r:id="rId34"/>
+          <w:footerReference w:type="default" r:id="rId33"/>
           <w:pgSz w:w="12240" w:h="15840"/>
           <w:pgMar w:top="1701" w:right="1701" w:bottom="1701" w:left="2268" w:header="720" w:footer="720" w:gutter="0"/>
           <w:cols w:space="720"/>
@@ -3035,91 +3035,6 @@
       </w:r>
     </w:p>
     <w:p>
-      <w:pPr>
-        <w:spacing w:before="480"/>
-        <w:jc w:val="center"/>
-      </w:pPr>
-      <w:r>
-        <w:drawing>
-          <wp:inline xmlns:a="http://schemas.openxmlformats.org/drawingml/2006/main" xmlns:pic="http://schemas.openxmlformats.org/drawingml/2006/picture">
-            <wp:extent cx="1512000" cy="1512000"/>
-            <wp:docPr id="3" name="Picture 3"/>
-            <wp:cNvGraphicFramePr>
-              <a:graphicFrameLocks noChangeAspect="1"/>
-            </wp:cNvGraphicFramePr>
-            <a:graphic>
-              <a:graphicData uri="http://schemas.openxmlformats.org/drawingml/2006/picture">
-                <pic:pic>
-                  <pic:nvPicPr>
-                    <pic:cNvPr id="0" name="logo.jpg"/>
-                    <pic:cNvPicPr/>
-                  </pic:nvPicPr>
-                  <pic:blipFill>
-                    <a:blip r:embed="rId11"/>
-                    <a:stretch>
-                      <a:fillRect/>
-                    </a:stretch>
-                  </pic:blipFill>
-                  <pic:spPr>
-                    <a:xfrm>
-                      <a:off x="0" y="0"/>
-                      <a:ext cx="1512000" cy="1512000"/>
-                    </a:xfrm>
-                    <a:prstGeom prst="rect"/>
-                  </pic:spPr>
-                </pic:pic>
-              </a:graphicData>
-            </a:graphic>
-          </wp:inline>
-        </w:drawing>
-      </w:r>
-    </w:p>
-    <w:p>
-      <w:bookmarkStart w:id="bm_grafico1" w:name="bm_grafico1"/>
-      <w:pPr>
-        <w:spacing w:before="120" w:after="480"/>
-        <w:jc w:val="center"/>
-      </w:pPr>
-      <w:r>
-        <w:rPr>
-          <w:rFonts w:ascii="Times New Roman" w:hAnsi="Times New Roman"/>
-          <w:i/>
-          <w:sz w:val="24"/>
-        </w:rPr>
-        <w:t xml:space="preserve">Gráfico 1. </w:t>
-      </w:r>
-      <w:r>
-        <w:rPr>
-          <w:rFonts w:ascii="Times New Roman" w:hAnsi="Times New Roman"/>
-          <w:b/>
-          <w:sz w:val="24"/>
-        </w:rPr>
-        <w:t>Logotipo de Ingeniería de Telecomunicaciones, C.A.</w:t>
-      </w:r>
-      <w:bookmarkEnd w:id="bm_grafico1"/>
-    </w:p>
-    <w:p>
-      <w:pPr>
-        <w:spacing w:before="0" w:after="240"/>
-        <w:jc w:val="center"/>
-      </w:pPr>
-      <w:r>
-        <w:rPr>
-          <w:rFonts w:ascii="Times New Roman" w:hAnsi="Times New Roman"/>
-          <w:i/>
-          <w:sz w:val="24"/>
-        </w:rPr>
-        <w:t xml:space="preserve">Fuente: </w:t>
-      </w:r>
-      <w:r>
-        <w:rPr>
-          <w:rFonts w:ascii="Times New Roman" w:hAnsi="Times New Roman"/>
-          <w:sz w:val="24"/>
-        </w:rPr>
-        <w:t>Ingeniería de Telecomunicaciones, C.A. (2026).</w:t>
-      </w:r>
-    </w:p>
-    <w:p>
       <w:bookmarkStart w:id="bm_cap1_ubic" w:name="bm_cap1_ubic"/>
       <w:pPr>
         <w:spacing w:before="480" w:after="480" w:line="360" w:lineRule="auto"/>
@@ -3159,7 +3074,7 @@
         <w:drawing>
           <wp:inline xmlns:a="http://schemas.openxmlformats.org/drawingml/2006/main" xmlns:pic="http://schemas.openxmlformats.org/drawingml/2006/picture">
             <wp:extent cx="1800000" cy="1125000"/>
-            <wp:docPr id="4" name="Picture 4"/>
+            <wp:docPr id="3" name="Picture 3"/>
             <wp:cNvGraphicFramePr>
               <a:graphicFrameLocks noChangeAspect="1"/>
             </wp:cNvGraphicFramePr>
@@ -3171,7 +3086,7 @@
                     <pic:cNvPicPr/>
                   </pic:nvPicPr>
                   <pic:blipFill>
-                    <a:blip r:embed="rId12"/>
+                    <a:blip r:embed="rId11"/>
                     <a:stretch>
                       <a:fillRect/>
                     </a:stretch>
@@ -3300,7 +3215,7 @@
         <w:drawing>
           <wp:inline xmlns:a="http://schemas.openxmlformats.org/drawingml/2006/main" xmlns:pic="http://schemas.openxmlformats.org/drawingml/2006/picture">
             <wp:extent cx="4320000" cy="1847904"/>
-            <wp:docPr id="5" name="Picture 5"/>
+            <wp:docPr id="4" name="Picture 4"/>
             <wp:cNvGraphicFramePr>
               <a:graphicFrameLocks noChangeAspect="1"/>
             </wp:cNvGraphicFramePr>
@@ -3312,7 +3227,7 @@
                     <pic:cNvPicPr/>
                   </pic:nvPicPr>
                   <pic:blipFill>
-                    <a:blip r:embed="rId13"/>
+                    <a:blip r:embed="rId12"/>
                     <a:stretch>
                       <a:fillRect/>
                     </a:stretch>
@@ -3364,7 +3279,7 @@
         <w:drawing>
           <wp:inline xmlns:a="http://schemas.openxmlformats.org/drawingml/2006/main" xmlns:pic="http://schemas.openxmlformats.org/drawingml/2006/picture">
             <wp:extent cx="4320000" cy="2680292"/>
-            <wp:docPr id="6" name="Picture 6"/>
+            <wp:docPr id="5" name="Picture 5"/>
             <wp:cNvGraphicFramePr>
               <a:graphicFrameLocks noChangeAspect="1"/>
             </wp:cNvGraphicFramePr>
@@ -3376,7 +3291,7 @@
                     <pic:cNvPicPr/>
                   </pic:nvPicPr>
                   <pic:blipFill>
-                    <a:blip r:embed="rId14"/>
+                    <a:blip r:embed="rId13"/>
                     <a:stretch>
                       <a:fillRect/>
                     </a:stretch>
@@ -3422,7 +3337,7 @@
     <w:p>
       <w:pPr>
         <w:sectPr>
-          <w:footerReference w:type="default" r:id="rId35"/>
+          <w:footerReference w:type="default" r:id="rId34"/>
           <w:type w:val="continuous"/>
           <w:pgSz w:w="12240" w:h="15840"/>
           <w:pgMar w:top="1701" w:right="1701" w:bottom="1701" w:left="2268" w:header="720" w:footer="720" w:gutter="0"/>
@@ -3465,7 +3380,7 @@
     <w:p>
       <w:pPr>
         <w:sectPr>
-          <w:footerReference w:type="default" r:id="rId36"/>
+          <w:footerReference w:type="default" r:id="rId35"/>
           <w:pgSz w:w="12240" w:h="15840"/>
           <w:pgMar w:top="1701" w:right="1701" w:bottom="1701" w:left="2268" w:header="720" w:footer="720" w:gutter="0"/>
           <w:cols w:space="720"/>
@@ -7267,7 +7182,7 @@
     <w:p>
       <w:pPr>
         <w:sectPr>
-          <w:footerReference w:type="default" r:id="rId37"/>
+          <w:footerReference w:type="default" r:id="rId36"/>
           <w:type w:val="continuous"/>
           <w:pgSz w:w="12240" w:h="15840"/>
           <w:pgMar w:top="1701" w:right="1701" w:bottom="1701" w:left="2268" w:header="720" w:footer="720" w:gutter="0"/>
@@ -7310,7 +7225,7 @@
     <w:p>
       <w:pPr>
         <w:sectPr>
-          <w:footerReference w:type="default" r:id="rId38"/>
+          <w:footerReference w:type="default" r:id="rId37"/>
           <w:pgSz w:w="12240" w:h="15840"/>
           <w:pgMar w:top="1701" w:right="1701" w:bottom="1701" w:left="2268" w:header="720" w:footer="720" w:gutter="0"/>
           <w:cols w:space="720"/>
@@ -7699,7 +7614,7 @@
     <w:p>
       <w:pPr>
         <w:sectPr>
-          <w:footerReference w:type="default" r:id="rId39"/>
+          <w:footerReference w:type="default" r:id="rId38"/>
           <w:type w:val="continuous"/>
           <w:pgSz w:w="12240" w:h="15840"/>
           <w:pgMar w:top="1701" w:right="1701" w:bottom="1701" w:left="2268" w:header="720" w:footer="720" w:gutter="0"/>
@@ -7742,7 +7657,7 @@
     <w:p>
       <w:pPr>
         <w:sectPr>
-          <w:footerReference w:type="default" r:id="rId40"/>
+          <w:footerReference w:type="default" r:id="rId39"/>
           <w:pgSz w:w="12240" w:h="15840"/>
           <w:pgMar w:top="1701" w:right="1701" w:bottom="1701" w:left="2268" w:header="720" w:footer="720" w:gutter="0"/>
           <w:cols w:space="720"/>
@@ -8505,7 +8420,7 @@
     <w:p>
       <w:pPr>
         <w:sectPr>
-          <w:footerReference w:type="default" r:id="rId41"/>
+          <w:footerReference w:type="default" r:id="rId40"/>
           <w:type w:val="continuous"/>
           <w:pgSz w:w="12240" w:h="15840"/>
           <w:pgMar w:top="1701" w:right="1701" w:bottom="1701" w:left="2268" w:header="720" w:footer="720" w:gutter="0"/>
@@ -8548,7 +8463,7 @@
     <w:p>
       <w:pPr>
         <w:sectPr>
-          <w:footerReference w:type="default" r:id="rId42"/>
+          <w:footerReference w:type="default" r:id="rId41"/>
           <w:pgSz w:w="12240" w:h="15840"/>
           <w:pgMar w:top="1701" w:right="1701" w:bottom="1701" w:left="2268" w:header="720" w:footer="720" w:gutter="0"/>
           <w:cols w:space="720"/>
@@ -8760,7 +8675,7 @@
     <w:p>
       <w:pPr>
         <w:sectPr>
-          <w:footerReference w:type="default" r:id="rId43"/>
+          <w:footerReference w:type="default" r:id="rId42"/>
           <w:type w:val="continuous"/>
           <w:pgSz w:w="12240" w:h="15840"/>
           <w:pgMar w:top="1701" w:right="1701" w:bottom="1701" w:left="2268" w:header="720" w:footer="720" w:gutter="0"/>
@@ -8789,7 +8704,7 @@
     <w:p>
       <w:pPr>
         <w:sectPr>
-          <w:footerReference w:type="default" r:id="rId44"/>
+          <w:footerReference w:type="default" r:id="rId43"/>
           <w:pgSz w:w="12240" w:h="15840"/>
           <w:pgMar w:top="1701" w:right="1701" w:bottom="1701" w:left="2268" w:header="720" w:footer="720" w:gutter="0"/>
           <w:cols w:space="720"/>
@@ -8918,7 +8833,7 @@
     <w:p>
       <w:pPr>
         <w:sectPr>
-          <w:footerReference w:type="default" r:id="rId45"/>
+          <w:footerReference w:type="default" r:id="rId44"/>
           <w:type w:val="continuous"/>
           <w:pgSz w:w="12240" w:h="15840"/>
           <w:pgMar w:top="1701" w:right="1701" w:bottom="1701" w:left="2268" w:header="720" w:footer="720" w:gutter="0"/>
@@ -8947,7 +8862,7 @@
     <w:p>
       <w:pPr>
         <w:sectPr>
-          <w:footerReference w:type="default" r:id="rId46"/>
+          <w:footerReference w:type="default" r:id="rId45"/>
           <w:pgSz w:w="12240" w:h="15840"/>
           <w:pgMar w:top="1701" w:right="1701" w:bottom="1701" w:left="2268" w:header="720" w:footer="720" w:gutter="0"/>
           <w:cols w:space="720"/>
@@ -8993,8 +8908,8 @@
       <w:r>
         <w:drawing>
           <wp:inline xmlns:a="http://schemas.openxmlformats.org/drawingml/2006/main" xmlns:pic="http://schemas.openxmlformats.org/drawingml/2006/picture">
-            <wp:extent cx="3960000" cy="18064286"/>
-            <wp:docPr id="7" name="Picture 7"/>
+            <wp:extent cx="3960000" cy="4860000"/>
+            <wp:docPr id="6" name="Picture 6"/>
             <wp:cNvGraphicFramePr>
               <a:graphicFrameLocks noChangeAspect="1"/>
             </wp:cNvGraphicFramePr>
@@ -9006,7 +8921,7 @@
                     <pic:cNvPicPr/>
                   </pic:nvPicPr>
                   <pic:blipFill>
-                    <a:blip r:embed="rId15"/>
+                    <a:blip r:embed="rId14"/>
                     <a:stretch>
                       <a:fillRect/>
                     </a:stretch>
@@ -9014,7 +8929,7 @@
                   <pic:spPr>
                     <a:xfrm>
                       <a:off x="0" y="0"/>
-                      <a:ext cx="3960000" cy="18064286"/>
+                      <a:ext cx="3960000" cy="4860000"/>
                     </a:xfrm>
                     <a:prstGeom prst="rect"/>
                   </pic:spPr>
@@ -9026,7 +8941,7 @@
       </w:r>
     </w:p>
     <w:sectPr>
-      <w:footerReference w:type="default" r:id="rId47"/>
+      <w:footerReference w:type="default" r:id="rId46"/>
       <w:pgSz w:w="12240" w:h="15840"/>
       <w:pgMar w:top="1701" w:right="1701" w:bottom="1701" w:left="2268" w:header="720" w:footer="720" w:gutter="0"/>
       <w:cols w:space="720"/>

</xml_diff>

<commit_message>
Corregir contraportadas y lista de figuras
</commit_message>
<xml_diff>
--- a/amaal/reportes/Informe_Pasantia_IUTECP.docx
+++ b/amaal/reportes/Informe_Pasantia_IUTECP.docx
@@ -164,7 +164,7 @@
     </w:p>
     <w:p>
       <w:pPr>
-        <w:spacing w:line="276" w:lineRule="auto" w:before="0" w:after="0"/>
+        <w:spacing w:line="240" w:lineRule="auto" w:before="0" w:after="0"/>
         <w:jc w:val="center"/>
       </w:pPr>
       <w:r>
@@ -214,7 +214,7 @@
     </w:p>
     <w:p>
       <w:pPr>
-        <w:spacing w:line="276" w:lineRule="auto" w:before="3053" w:after="0"/>
+        <w:spacing w:line="276" w:lineRule="auto" w:before="1280" w:after="0"/>
         <w:jc w:val="center"/>
       </w:pPr>
       <w:r>
@@ -228,7 +228,21 @@
     </w:p>
     <w:p>
       <w:pPr>
-        <w:spacing w:before="2544" w:after="0" w:line="20" w:lineRule="exact"/>
+        <w:spacing w:line="276" w:lineRule="auto" w:before="440" w:after="0"/>
+        <w:jc w:val="center"/>
+      </w:pPr>
+      <w:r>
+        <w:rPr>
+          <w:rFonts w:ascii="Times New Roman" w:hAnsi="Times New Roman"/>
+          <w:b/>
+          <w:sz w:val="24"/>
+        </w:rPr>
+        <w:t>Informe de pasantías para obtener el título de Técnico Superior Universitario en la especialidad de: Administración</w:t>
+      </w:r>
+    </w:p>
+    <w:p>
+      <w:pPr>
+        <w:spacing w:before="2100" w:after="0" w:line="20" w:lineRule="exact"/>
       </w:pPr>
     </w:p>
     <w:tbl>
@@ -257,7 +271,7 @@
           </w:tcPr>
           <w:p>
             <w:pPr>
-              <w:spacing w:line="276" w:lineRule="auto"/>
+              <w:spacing w:line="240" w:lineRule="auto"/>
               <w:jc w:val="left"/>
             </w:pPr>
             <w:r>
@@ -330,7 +344,7 @@
           </w:tcPr>
           <w:p>
             <w:pPr>
-              <w:spacing w:line="276" w:lineRule="auto"/>
+              <w:spacing w:line="240" w:lineRule="auto"/>
               <w:jc w:val="right"/>
             </w:pPr>
             <w:r>
@@ -365,7 +379,7 @@
     </w:tbl>
     <w:p>
       <w:pPr>
-        <w:spacing w:line="276" w:lineRule="auto" w:before="1272" w:after="0"/>
+        <w:spacing w:line="276" w:lineRule="auto" w:before="800" w:after="0"/>
         <w:jc w:val="center"/>
       </w:pPr>
       <w:r>
@@ -897,36 +911,6 @@
           <w:b w:val="0"/>
           <w:sz w:val="24"/>
         </w:rPr>
-        <w:t>LISTA DE FIGURAS</w:t>
-        <w:tab/>
-      </w:r>
-      <w:r>
-        <w:rPr>
-          <w:rFonts w:ascii="Times New Roman" w:hAnsi="Times New Roman"/>
-          <w:b w:val="0"/>
-          <w:sz w:val="24"/>
-        </w:rPr>
-        <w:fldChar w:fldCharType="begin"/>
-        <w:instrText xml:space="preserve"> PAGEREF bm_lista_figuras \h </w:instrText>
-        <w:fldChar w:fldCharType="separate"/>
-        <w:t>?</w:t>
-        <w:fldChar w:fldCharType="end"/>
-      </w:r>
-    </w:p>
-    <w:p>
-      <w:pPr>
-        <w:tabs>
-          <w:tab w:pos="8271" w:val="right" w:leader="dot"/>
-        </w:tabs>
-        <w:spacing w:line="360" w:lineRule="auto" w:before="0" w:after="80"/>
-        <w:ind w:left="0"/>
-      </w:pPr>
-      <w:r>
-        <w:rPr>
-          <w:rFonts w:ascii="Times New Roman" w:hAnsi="Times New Roman"/>
-          <w:b w:val="0"/>
-          <w:sz w:val="24"/>
-        </w:rPr>
         <w:t>LISTA DE GRÁFICOS</w:t>
         <w:tab/>
       </w:r>
@@ -1940,7 +1924,7 @@
       </w:pPr>
     </w:p>
     <w:p>
-      <w:bookmarkStart w:id="bm_lista_figuras" w:name="bm_lista_figuras"/>
+      <w:bookmarkStart w:id="bm_lista_graficos" w:name="bm_lista_graficos"/>
       <w:pPr>
         <w:spacing w:before="1140" w:after="480"/>
         <w:jc w:val="center"/>
@@ -1951,9 +1935,9 @@
           <w:b/>
           <w:sz w:val="24"/>
         </w:rPr>
-        <w:t>LISTA DE FIGURAS</w:t>
-      </w:r>
-      <w:bookmarkEnd w:id="bm_lista_figuras"/>
+        <w:t>LISTA DE GRÁFICOS</w:t>
+      </w:r>
+      <w:bookmarkEnd w:id="bm_lista_graficos"/>
     </w:p>
     <w:p>
       <w:pPr>
@@ -1966,6 +1950,161 @@
           <w:docGrid w:linePitch="360"/>
         </w:sectPr>
       </w:pPr>
+    </w:p>
+    <w:p>
+      <w:pPr>
+        <w:tabs>
+          <w:tab w:pos="8271" w:val="right"/>
+        </w:tabs>
+        <w:spacing w:before="240" w:after="240"/>
+      </w:pPr>
+      <w:r>
+        <w:rPr>
+          <w:rFonts w:ascii="Times New Roman" w:hAnsi="Times New Roman"/>
+          <w:b/>
+          <w:sz w:val="24"/>
+        </w:rPr>
+        <w:t>GRÁFICO</w:t>
+      </w:r>
+      <w:r>
+        <w:tab/>
+      </w:r>
+      <w:r>
+        <w:rPr>
+          <w:rFonts w:ascii="Times New Roman" w:hAnsi="Times New Roman"/>
+          <w:b/>
+          <w:sz w:val="24"/>
+        </w:rPr>
+        <w:t>pp.</w:t>
+      </w:r>
+    </w:p>
+    <w:p>
+      <w:pPr>
+        <w:tabs>
+          <w:tab w:pos="1020" w:val="left"/>
+          <w:tab w:pos="8271" w:val="right" w:leader="dot"/>
+        </w:tabs>
+        <w:spacing w:line="360" w:lineRule="auto" w:before="0" w:after="80"/>
+        <w:ind w:left="1020" w:hanging="1020"/>
+      </w:pPr>
+      <w:r>
+        <w:rPr>
+          <w:rFonts w:ascii="Times New Roman" w:hAnsi="Times New Roman"/>
+          <w:sz w:val="24"/>
+        </w:rPr>
+        <w:t>1</w:t>
+        <w:tab/>
+        <w:t>Logotipo de Ingeniería de Telecomunicaciones, C.A.</w:t>
+        <w:tab/>
+      </w:r>
+      <w:r>
+        <w:rPr>
+          <w:rFonts w:ascii="Times New Roman" w:hAnsi="Times New Roman"/>
+          <w:b w:val="0"/>
+          <w:sz w:val="24"/>
+        </w:rPr>
+        <w:fldChar w:fldCharType="begin"/>
+        <w:instrText xml:space="preserve"> PAGEREF bm_grafico1 \h </w:instrText>
+        <w:fldChar w:fldCharType="separate"/>
+        <w:t>?</w:t>
+        <w:fldChar w:fldCharType="end"/>
+      </w:r>
+    </w:p>
+    <w:p>
+      <w:pPr>
+        <w:tabs>
+          <w:tab w:pos="1020" w:val="left"/>
+          <w:tab w:pos="8271" w:val="right" w:leader="dot"/>
+        </w:tabs>
+        <w:spacing w:line="360" w:lineRule="auto" w:before="0" w:after="80"/>
+        <w:ind w:left="1020" w:hanging="1020"/>
+      </w:pPr>
+      <w:r>
+        <w:rPr>
+          <w:rFonts w:ascii="Times New Roman" w:hAnsi="Times New Roman"/>
+          <w:sz w:val="24"/>
+        </w:rPr>
+        <w:t>2</w:t>
+        <w:tab/>
+        <w:t>Representación cartográfica y ubicación espacial de Ingeniería de Telecomunicaciones, C.A.</w:t>
+        <w:tab/>
+      </w:r>
+      <w:r>
+        <w:rPr>
+          <w:rFonts w:ascii="Times New Roman" w:hAnsi="Times New Roman"/>
+          <w:b w:val="0"/>
+          <w:sz w:val="24"/>
+        </w:rPr>
+        <w:fldChar w:fldCharType="begin"/>
+        <w:instrText xml:space="preserve"> PAGEREF bm_grafico2 \h </w:instrText>
+        <w:fldChar w:fldCharType="separate"/>
+        <w:t>?</w:t>
+        <w:fldChar w:fldCharType="end"/>
+      </w:r>
+    </w:p>
+    <w:p>
+      <w:pPr>
+        <w:tabs>
+          <w:tab w:pos="1020" w:val="left"/>
+          <w:tab w:pos="8271" w:val="right" w:leader="dot"/>
+        </w:tabs>
+        <w:spacing w:line="360" w:lineRule="auto" w:before="0" w:after="80"/>
+        <w:ind w:left="1020" w:hanging="1020"/>
+      </w:pPr>
+      <w:r>
+        <w:rPr>
+          <w:rFonts w:ascii="Times New Roman" w:hAnsi="Times New Roman"/>
+          <w:sz w:val="24"/>
+        </w:rPr>
+        <w:t>3</w:t>
+        <w:tab/>
+        <w:t>Organigrama estructural y niveles jerárquicos de Ingeniería de Telecomunicaciones, C.A.</w:t>
+        <w:tab/>
+      </w:r>
+      <w:r>
+        <w:rPr>
+          <w:rFonts w:ascii="Times New Roman" w:hAnsi="Times New Roman"/>
+          <w:b w:val="0"/>
+          <w:sz w:val="24"/>
+        </w:rPr>
+        <w:fldChar w:fldCharType="begin"/>
+        <w:instrText xml:space="preserve"> PAGEREF bm_grafico3 \h </w:instrText>
+        <w:fldChar w:fldCharType="separate"/>
+        <w:t>?</w:t>
+        <w:fldChar w:fldCharType="end"/>
+      </w:r>
+    </w:p>
+    <w:p>
+      <w:pPr>
+        <w:tabs>
+          <w:tab w:pos="1020" w:val="left"/>
+          <w:tab w:pos="8271" w:val="right" w:leader="dot"/>
+        </w:tabs>
+        <w:spacing w:line="360" w:lineRule="auto" w:before="0" w:after="80"/>
+        <w:ind w:left="1020" w:hanging="1020"/>
+      </w:pPr>
+      <w:r>
+        <w:rPr>
+          <w:rFonts w:ascii="Times New Roman" w:hAnsi="Times New Roman"/>
+          <w:sz w:val="24"/>
+        </w:rPr>
+        <w:t>4</w:t>
+        <w:tab/>
+        <w:t>Organigrama del Departamento de Administración.</w:t>
+        <w:tab/>
+      </w:r>
+      <w:r>
+        <w:rPr>
+          <w:rFonts w:ascii="Times New Roman" w:hAnsi="Times New Roman"/>
+          <w:b w:val="0"/>
+          <w:sz w:val="24"/>
+        </w:rPr>
+        <w:fldChar w:fldCharType="begin"/>
+        <w:instrText xml:space="preserve"> PAGEREF bm_grafico4 \h </w:instrText>
+        <w:fldChar w:fldCharType="separate"/>
+        <w:t>?</w:t>
+        <w:fldChar w:fldCharType="end"/>
+      </w:r>
     </w:p>
     <w:p>
       <w:pPr>
@@ -1981,7 +2120,7 @@
       </w:pPr>
     </w:p>
     <w:p>
-      <w:bookmarkStart w:id="bm_lista_graficos" w:name="bm_lista_graficos"/>
+      <w:bookmarkStart w:id="bm_lista_anexos" w:name="bm_lista_anexos"/>
       <w:pPr>
         <w:spacing w:before="1140" w:after="480"/>
         <w:jc w:val="center"/>
@@ -1992,9 +2131,9 @@
           <w:b/>
           <w:sz w:val="24"/>
         </w:rPr>
-        <w:t>LISTA DE GRÁFICOS</w:t>
-      </w:r>
-      <w:bookmarkEnd w:id="bm_lista_graficos"/>
+        <w:t>LISTA DE ANEXOS</w:t>
+      </w:r>
+      <w:bookmarkEnd w:id="bm_lista_anexos"/>
     </w:p>
     <w:p>
       <w:pPr>
@@ -2021,7 +2160,7 @@
           <w:b/>
           <w:sz w:val="24"/>
         </w:rPr>
-        <w:t>GRÁFICO</w:t>
+        <w:t>ANEXOS</w:t>
       </w:r>
       <w:r>
         <w:tab/>
@@ -2049,9 +2188,9 @@
           <w:rFonts w:ascii="Times New Roman" w:hAnsi="Times New Roman"/>
           <w:sz w:val="24"/>
         </w:rPr>
-        <w:t>1</w:t>
+        <w:t>A</w:t>
         <w:tab/>
-        <w:t>Logotipo de Ingeniería de Telecomunicaciones, C.A.</w:t>
+        <w:t>Flujograma del proceso propuesto de gestión de solicitudes de servicios</w:t>
         <w:tab/>
       </w:r>
       <w:r>
@@ -2061,103 +2200,7 @@
           <w:sz w:val="24"/>
         </w:rPr>
         <w:fldChar w:fldCharType="begin"/>
-        <w:instrText xml:space="preserve"> PAGEREF bm_grafico1 \h </w:instrText>
-        <w:fldChar w:fldCharType="separate"/>
-        <w:t>?</w:t>
-        <w:fldChar w:fldCharType="end"/>
-      </w:r>
-    </w:p>
-    <w:p>
-      <w:pPr>
-        <w:tabs>
-          <w:tab w:pos="1020" w:val="left"/>
-          <w:tab w:pos="8271" w:val="right" w:leader="dot"/>
-        </w:tabs>
-        <w:spacing w:line="360" w:lineRule="auto" w:before="0" w:after="80"/>
-        <w:ind w:left="1020" w:hanging="1020"/>
-      </w:pPr>
-      <w:r>
-        <w:rPr>
-          <w:rFonts w:ascii="Times New Roman" w:hAnsi="Times New Roman"/>
-          <w:sz w:val="24"/>
-        </w:rPr>
-        <w:t>2</w:t>
-        <w:tab/>
-        <w:t>Representación cartográfica y ubicación espacial de Ingeniería de Telecomunicaciones, C.A.</w:t>
-        <w:tab/>
-      </w:r>
-      <w:r>
-        <w:rPr>
-          <w:rFonts w:ascii="Times New Roman" w:hAnsi="Times New Roman"/>
-          <w:b w:val="0"/>
-          <w:sz w:val="24"/>
-        </w:rPr>
-        <w:fldChar w:fldCharType="begin"/>
-        <w:instrText xml:space="preserve"> PAGEREF bm_grafico2 \h </w:instrText>
-        <w:fldChar w:fldCharType="separate"/>
-        <w:t>?</w:t>
-        <w:fldChar w:fldCharType="end"/>
-      </w:r>
-    </w:p>
-    <w:p>
-      <w:pPr>
-        <w:tabs>
-          <w:tab w:pos="1020" w:val="left"/>
-          <w:tab w:pos="8271" w:val="right" w:leader="dot"/>
-        </w:tabs>
-        <w:spacing w:line="360" w:lineRule="auto" w:before="0" w:after="80"/>
-        <w:ind w:left="1020" w:hanging="1020"/>
-      </w:pPr>
-      <w:r>
-        <w:rPr>
-          <w:rFonts w:ascii="Times New Roman" w:hAnsi="Times New Roman"/>
-          <w:sz w:val="24"/>
-        </w:rPr>
-        <w:t>3</w:t>
-        <w:tab/>
-        <w:t>Organigrama estructural y niveles jerárquicos de Ingeniería de Telecomunicaciones, C.A.</w:t>
-        <w:tab/>
-      </w:r>
-      <w:r>
-        <w:rPr>
-          <w:rFonts w:ascii="Times New Roman" w:hAnsi="Times New Roman"/>
-          <w:b w:val="0"/>
-          <w:sz w:val="24"/>
-        </w:rPr>
-        <w:fldChar w:fldCharType="begin"/>
-        <w:instrText xml:space="preserve"> PAGEREF bm_grafico3 \h </w:instrText>
-        <w:fldChar w:fldCharType="separate"/>
-        <w:t>?</w:t>
-        <w:fldChar w:fldCharType="end"/>
-      </w:r>
-    </w:p>
-    <w:p>
-      <w:pPr>
-        <w:tabs>
-          <w:tab w:pos="1020" w:val="left"/>
-          <w:tab w:pos="8271" w:val="right" w:leader="dot"/>
-        </w:tabs>
-        <w:spacing w:line="360" w:lineRule="auto" w:before="0" w:after="80"/>
-        <w:ind w:left="1020" w:hanging="1020"/>
-      </w:pPr>
-      <w:r>
-        <w:rPr>
-          <w:rFonts w:ascii="Times New Roman" w:hAnsi="Times New Roman"/>
-          <w:sz w:val="24"/>
-        </w:rPr>
-        <w:t>4</w:t>
-        <w:tab/>
-        <w:t>Organigrama del Departamento de Administración.</w:t>
-        <w:tab/>
-      </w:r>
-      <w:r>
-        <w:rPr>
-          <w:rFonts w:ascii="Times New Roman" w:hAnsi="Times New Roman"/>
-          <w:b w:val="0"/>
-          <w:sz w:val="24"/>
-        </w:rPr>
-        <w:fldChar w:fldCharType="begin"/>
-        <w:instrText xml:space="preserve"> PAGEREF bm_grafico4 \h </w:instrText>
+        <w:instrText xml:space="preserve"> PAGEREF bm_anexoA \h </w:instrText>
         <w:fldChar w:fldCharType="separate"/>
         <w:t>?</w:t>
         <w:fldChar w:fldCharType="end"/>
@@ -2177,9 +2220,8 @@
       </w:pPr>
     </w:p>
     <w:p>
-      <w:bookmarkStart w:id="bm_lista_anexos" w:name="bm_lista_anexos"/>
-      <w:pPr>
-        <w:spacing w:before="1140" w:after="480"/>
+      <w:pPr>
+        <w:spacing w:after="0"/>
         <w:jc w:val="center"/>
       </w:pPr>
       <w:r>
@@ -2188,9 +2230,138 @@
           <w:b/>
           <w:sz w:val="24"/>
         </w:rPr>
-        <w:t>LISTA DE ANEXOS</w:t>
-      </w:r>
-      <w:bookmarkEnd w:id="bm_lista_anexos"/>
+        <w:t>REPÚBLICA BOLIVARIANA DE VENEZUELA</w:t>
+      </w:r>
+    </w:p>
+    <w:p>
+      <w:pPr>
+        <w:spacing w:after="0"/>
+        <w:jc w:val="center"/>
+      </w:pPr>
+      <w:r>
+        <w:rPr>
+          <w:rFonts w:ascii="Times New Roman" w:hAnsi="Times New Roman"/>
+          <w:b/>
+          <w:sz w:val="24"/>
+        </w:rPr>
+        <w:t>MINISTERIO DEL PODER POPULAR PARA LA EDUCACIÓN UNIVERSITARIA</w:t>
+      </w:r>
+    </w:p>
+    <w:p>
+      <w:pPr>
+        <w:spacing w:after="0"/>
+        <w:jc w:val="center"/>
+      </w:pPr>
+      <w:r>
+        <w:rPr>
+          <w:rFonts w:ascii="Times New Roman" w:hAnsi="Times New Roman"/>
+          <w:b/>
+          <w:sz w:val="24"/>
+        </w:rPr>
+        <w:t>INSTITUTO UNIVERSITARIO DE TECNOLOGÍA</w:t>
+      </w:r>
+    </w:p>
+    <w:p>
+      <w:pPr>
+        <w:spacing w:after="0"/>
+        <w:jc w:val="center"/>
+      </w:pPr>
+      <w:r>
+        <w:rPr>
+          <w:rFonts w:ascii="Times New Roman" w:hAnsi="Times New Roman"/>
+          <w:b/>
+          <w:sz w:val="24"/>
+        </w:rPr>
+        <w:t>"ELÍAS CALIXTO POMPA"</w:t>
+      </w:r>
+    </w:p>
+    <w:p>
+      <w:pPr>
+        <w:spacing w:after="0"/>
+        <w:jc w:val="center"/>
+      </w:pPr>
+      <w:r>
+        <w:rPr>
+          <w:rFonts w:ascii="Times New Roman" w:hAnsi="Times New Roman"/>
+          <w:b/>
+          <w:sz w:val="24"/>
+        </w:rPr>
+        <w:t>EL TIGRE, ESTADO ANZOÁTEGUI</w:t>
+      </w:r>
+    </w:p>
+    <w:p>
+      <w:pPr>
+        <w:spacing w:after="360"/>
+      </w:pPr>
+    </w:p>
+    <w:p>
+      <w:pPr>
+        <w:spacing w:after="480"/>
+        <w:jc w:val="center"/>
+      </w:pPr>
+      <w:r>
+        <w:rPr>
+          <w:rFonts w:ascii="Times New Roman" w:hAnsi="Times New Roman"/>
+          <w:b/>
+          <w:sz w:val="24"/>
+        </w:rPr>
+        <w:t>EVALUACIÓN DEL CONTROL ADMINISTRATIVO APLICADO A LA GESTIÓN DE SOLICITUDES DE SERVICIOS DE TELECOMUNICACIONES EN LA EMPRESA INGENIERÍA DE TELECOMUNICACIONES, C.A.</w:t>
+      </w:r>
+    </w:p>
+    <w:p>
+      <w:pPr>
+        <w:spacing w:after="480"/>
+        <w:ind w:left="0"/>
+        <w:jc w:val="right"/>
+      </w:pPr>
+      <w:r>
+        <w:rPr>
+          <w:rFonts w:ascii="Times New Roman" w:hAnsi="Times New Roman"/>
+          <w:b/>
+          <w:sz w:val="24"/>
+        </w:rPr>
+        <w:t>Autor:</w:t>
+        <w:br/>
+      </w:r>
+      <w:r>
+        <w:rPr>
+          <w:rFonts w:ascii="Times New Roman" w:hAnsi="Times New Roman"/>
+          <w:sz w:val="24"/>
+        </w:rPr>
+        <w:t>Alrifaai Alrifaaie, Amaal</w:t>
+        <w:br/>
+      </w:r>
+      <w:r>
+        <w:rPr>
+          <w:rFonts w:ascii="Times New Roman" w:hAnsi="Times New Roman"/>
+          <w:sz w:val="24"/>
+        </w:rPr>
+        <w:t>C.I.: 31.985.792</w:t>
+        <w:br/>
+      </w:r>
+      <w:r>
+        <w:rPr>
+          <w:rFonts w:ascii="Times New Roman" w:hAnsi="Times New Roman"/>
+          <w:sz w:val="24"/>
+        </w:rPr>
+        <w:t>agosto de 2026</w:t>
+      </w:r>
+    </w:p>
+    <w:p>
+      <w:bookmarkStart w:id="bm_resumen" w:name="bm_resumen"/>
+      <w:pPr>
+        <w:spacing w:before="480" w:after="480"/>
+        <w:jc w:val="center"/>
+      </w:pPr>
+      <w:r>
+        <w:rPr>
+          <w:rFonts w:ascii="Times New Roman" w:hAnsi="Times New Roman"/>
+          <w:b/>
+          <w:sz w:val="24"/>
+        </w:rPr>
+        <w:t>RESUMEN</w:t>
+      </w:r>
+      <w:bookmarkEnd w:id="bm_resumen"/>
     </w:p>
     <w:p>
       <w:pPr>
@@ -2206,61 +2377,32 @@
     </w:p>
     <w:p>
       <w:pPr>
-        <w:tabs>
-          <w:tab w:pos="8271" w:val="right"/>
-        </w:tabs>
-        <w:spacing w:before="240" w:after="240"/>
-      </w:pPr>
-      <w:r>
-        <w:rPr>
-          <w:rFonts w:ascii="Times New Roman" w:hAnsi="Times New Roman"/>
+        <w:spacing w:line="360" w:lineRule="auto" w:after="0" w:before="0"/>
+        <w:ind w:firstLine="709"/>
+        <w:jc w:val="both"/>
+      </w:pPr>
+      <w:r>
+        <w:rPr>
+          <w:rFonts w:ascii="Times New Roman" w:hAnsi="Times New Roman"/>
+          <w:i w:val="0"/>
+          <w:sz w:val="24"/>
+        </w:rPr>
+        <w:t>El presente informe recoge las actividades desarrolladas durante diez (10) semanas de pasantías profesionales en Ingeniería de Telecomunicaciones, C.A. (IDETEL), con una primera etapa de rotación por Atención al Cliente y una segunda etapa de apoyo en el área de Administración. Durante la práctica se observó el recorrido de solicitudes de afiliación e incidencias, el registro de pagos, la facturación, el seguimiento de casos y la elaboración de reportes administrativos. La situación problemática se relaciona con la ausencia de un procedimiento formalizado y unificado para controlar las solicitudes desde su recepción hasta el cierre, lo que dificulta conocer responsables, tiempos y estatus de cada caso. El objetivo general fue evaluar el control administrativo aplicado a la gestión de solicitudes de servicios de telecomunicaciones para identificar debilidades y formular mejoras. Se realizaron observaciones directas, revisión de registros, entrevistas estructuradas al personal y un análisis causa-efecto de las fallas detectadas. Posteriormente se diseñó un flujo estandarizado, formatos de control y criterios de seguimiento mediante indicadores básicos. Se concluye que la principal necesidad consiste en formalizar el recorrido de las solicitudes y centralizar la información necesaria para su seguimiento. Se recomienda implementar progresivamente el procedimiento propuesto, asignar responsables por etapa y revisar periódicamente los tiempos de respuesta para detectar desviaciones y oportunidades de mejora.</w:t>
+      </w:r>
+    </w:p>
+    <w:p/>
+    <w:p>
+      <w:pPr>
+        <w:ind w:firstLine="709"/>
+      </w:pPr>
+      <w:r>
+        <w:rPr>
           <w:b/>
-          <w:sz w:val="24"/>
-        </w:rPr>
-        <w:t>ANEXOS</w:t>
-      </w:r>
-      <w:r>
-        <w:tab/>
-      </w:r>
-      <w:r>
-        <w:rPr>
-          <w:rFonts w:ascii="Times New Roman" w:hAnsi="Times New Roman"/>
-          <w:b/>
-          <w:sz w:val="24"/>
-        </w:rPr>
-        <w:t>pp.</w:t>
-      </w:r>
-    </w:p>
-    <w:p>
-      <w:pPr>
-        <w:tabs>
-          <w:tab w:pos="1020" w:val="left"/>
-          <w:tab w:pos="8271" w:val="right" w:leader="dot"/>
-        </w:tabs>
-        <w:spacing w:line="360" w:lineRule="auto" w:before="0" w:after="80"/>
-        <w:ind w:left="1020" w:hanging="1020"/>
-      </w:pPr>
-      <w:r>
-        <w:rPr>
-          <w:rFonts w:ascii="Times New Roman" w:hAnsi="Times New Roman"/>
-          <w:sz w:val="24"/>
-        </w:rPr>
-        <w:t>A</w:t>
-        <w:tab/>
-        <w:t>Flujograma del proceso propuesto de gestión de solicitudes de servicios</w:t>
-        <w:tab/>
-      </w:r>
-      <w:r>
-        <w:rPr>
-          <w:rFonts w:ascii="Times New Roman" w:hAnsi="Times New Roman"/>
-          <w:b w:val="0"/>
-          <w:sz w:val="24"/>
-        </w:rPr>
-        <w:fldChar w:fldCharType="begin"/>
-        <w:instrText xml:space="preserve"> PAGEREF bm_anexoA \h </w:instrText>
-        <w:fldChar w:fldCharType="separate"/>
-        <w:t>?</w:t>
-        <w:fldChar w:fldCharType="end"/>
+        </w:rPr>
+        <w:t xml:space="preserve">Palabras claves: </w:t>
+      </w:r>
+      <w:r>
+        <w:t>control administrativo, solicitudes de servicio, trazabilidad, telecomunicaciones, pasantías</w:t>
       </w:r>
     </w:p>
     <w:p>
@@ -2277,8 +2419,9 @@
       </w:pPr>
     </w:p>
     <w:p>
-      <w:pPr>
-        <w:spacing w:after="0"/>
+      <w:bookmarkStart w:id="bm_introduccion" w:name="bm_introduccion"/>
+      <w:pPr>
+        <w:spacing w:before="1140" w:after="480"/>
         <w:jc w:val="center"/>
       </w:pPr>
       <w:r>
@@ -2287,138 +2430,9 @@
           <w:b/>
           <w:sz w:val="24"/>
         </w:rPr>
-        <w:t>REPÚBLICA BOLIVARIANA DE VENEZUELA</w:t>
-      </w:r>
-    </w:p>
-    <w:p>
-      <w:pPr>
-        <w:spacing w:after="0"/>
-        <w:jc w:val="center"/>
-      </w:pPr>
-      <w:r>
-        <w:rPr>
-          <w:rFonts w:ascii="Times New Roman" w:hAnsi="Times New Roman"/>
-          <w:b/>
-          <w:sz w:val="24"/>
-        </w:rPr>
-        <w:t>MINISTERIO DEL PODER POPULAR PARA LA EDUCACIÓN UNIVERSITARIA</w:t>
-      </w:r>
-    </w:p>
-    <w:p>
-      <w:pPr>
-        <w:spacing w:after="0"/>
-        <w:jc w:val="center"/>
-      </w:pPr>
-      <w:r>
-        <w:rPr>
-          <w:rFonts w:ascii="Times New Roman" w:hAnsi="Times New Roman"/>
-          <w:b/>
-          <w:sz w:val="24"/>
-        </w:rPr>
-        <w:t>INSTITUTO UNIVERSITARIO DE TECNOLOGÍA</w:t>
-      </w:r>
-    </w:p>
-    <w:p>
-      <w:pPr>
-        <w:spacing w:after="0"/>
-        <w:jc w:val="center"/>
-      </w:pPr>
-      <w:r>
-        <w:rPr>
-          <w:rFonts w:ascii="Times New Roman" w:hAnsi="Times New Roman"/>
-          <w:b/>
-          <w:sz w:val="24"/>
-        </w:rPr>
-        <w:t>"ELÍAS CALIXTO POMPA"</w:t>
-      </w:r>
-    </w:p>
-    <w:p>
-      <w:pPr>
-        <w:spacing w:after="0"/>
-        <w:jc w:val="center"/>
-      </w:pPr>
-      <w:r>
-        <w:rPr>
-          <w:rFonts w:ascii="Times New Roman" w:hAnsi="Times New Roman"/>
-          <w:b/>
-          <w:sz w:val="24"/>
-        </w:rPr>
-        <w:t>EL TIGRE, ESTADO ANZOÁTEGUI</w:t>
-      </w:r>
-    </w:p>
-    <w:p>
-      <w:pPr>
-        <w:spacing w:after="360"/>
-      </w:pPr>
-    </w:p>
-    <w:p>
-      <w:pPr>
-        <w:spacing w:after="480"/>
-        <w:jc w:val="center"/>
-      </w:pPr>
-      <w:r>
-        <w:rPr>
-          <w:rFonts w:ascii="Times New Roman" w:hAnsi="Times New Roman"/>
-          <w:b/>
-          <w:sz w:val="24"/>
-        </w:rPr>
-        <w:t>EVALUACIÓN DEL CONTROL ADMINISTRATIVO APLICADO A LA GESTIÓN DE SOLICITUDES DE SERVICIOS DE TELECOMUNICACIONES EN LA EMPRESA INGENIERÍA DE TELECOMUNICACIONES, C.A.</w:t>
-      </w:r>
-    </w:p>
-    <w:p>
-      <w:pPr>
-        <w:spacing w:after="480"/>
-        <w:ind w:left="0"/>
-        <w:jc w:val="right"/>
-      </w:pPr>
-      <w:r>
-        <w:rPr>
-          <w:rFonts w:ascii="Times New Roman" w:hAnsi="Times New Roman"/>
-          <w:b/>
-          <w:sz w:val="24"/>
-        </w:rPr>
-        <w:t>Autor:</w:t>
-        <w:br/>
-      </w:r>
-      <w:r>
-        <w:rPr>
-          <w:rFonts w:ascii="Times New Roman" w:hAnsi="Times New Roman"/>
-          <w:sz w:val="24"/>
-        </w:rPr>
-        <w:t>Alrifaai Alrifaaie, Amaal</w:t>
-        <w:br/>
-      </w:r>
-      <w:r>
-        <w:rPr>
-          <w:rFonts w:ascii="Times New Roman" w:hAnsi="Times New Roman"/>
-          <w:sz w:val="24"/>
-        </w:rPr>
-        <w:t>C.I.: 31.985.792</w:t>
-        <w:br/>
-      </w:r>
-      <w:r>
-        <w:rPr>
-          <w:rFonts w:ascii="Times New Roman" w:hAnsi="Times New Roman"/>
-          <w:sz w:val="24"/>
-        </w:rPr>
-        <w:t>agosto de 2026</w:t>
-      </w:r>
-    </w:p>
-    <w:p>
-      <w:bookmarkStart w:id="bm_resumen" w:name="bm_resumen"/>
-      <w:pPr>
-        <w:spacing w:before="480" w:after="480"/>
-        <w:jc w:val="center"/>
-      </w:pPr>
-      <w:r>
-        <w:rPr>
-          <w:rFonts w:ascii="Times New Roman" w:hAnsi="Times New Roman"/>
-          <w:b/>
-          <w:sz w:val="24"/>
-        </w:rPr>
-        <w:t>RESUMEN</w:t>
-      </w:r>
-      <w:bookmarkEnd w:id="bm_resumen"/>
+        <w:t>INTRODUCCIÓN</w:t>
+      </w:r>
+      <w:bookmarkEnd w:id="bm_introduccion"/>
     </w:p>
     <w:p>
       <w:pPr>
@@ -2444,22 +2458,52 @@
           <w:i w:val="0"/>
           <w:sz w:val="24"/>
         </w:rPr>
-        <w:t>El presente informe recoge las actividades desarrolladas durante diez (10) semanas de pasantías profesionales en Ingeniería de Telecomunicaciones, C.A. (IDETEL), con una primera etapa de rotación por Atención al Cliente y una segunda etapa de apoyo en el área de Administración. Durante la práctica se observó el recorrido de solicitudes de afiliación e incidencias, el registro de pagos, la facturación, el seguimiento de casos y la elaboración de reportes administrativos. La situación problemática se relaciona con la ausencia de un procedimiento formalizado y unificado para controlar las solicitudes desde su recepción hasta el cierre, lo que dificulta conocer responsables, tiempos y estatus de cada caso. El objetivo general fue evaluar el control administrativo aplicado a la gestión de solicitudes de servicios de telecomunicaciones para identificar debilidades y formular mejoras. Se realizaron observaciones directas, revisión de registros, entrevistas estructuradas al personal y un análisis causa-efecto de las fallas detectadas. Posteriormente se diseñó un flujo estandarizado, formatos de control y criterios de seguimiento mediante indicadores básicos. Se concluye que la principal necesidad consiste en formalizar el recorrido de las solicitudes y centralizar la información necesaria para su seguimiento. Se recomienda implementar progresivamente el procedimiento propuesto, asignar responsables por etapa y revisar periódicamente los tiempos de respuesta para detectar desviaciones y oportunidades de mejora.</w:t>
+        <w:t>La atención de solicitudes de servicio exige coordinación entre las áreas que reciben el requerimiento, registran la información, procesan pagos o documentación y ejecutan las acciones técnicas necesarias para cerrar cada caso. En una empresa de telecomunicaciones, el control administrativo de ese recorrido permite conocer el estado de las afiliaciones e incidencias y facilita la comunicación con el suscriptor.</w:t>
       </w:r>
     </w:p>
-    <w:p/>
     <w:p>
       <w:pPr>
+        <w:spacing w:line="360" w:lineRule="auto" w:after="0" w:before="0"/>
         <w:ind w:firstLine="709"/>
-      </w:pPr>
-      <w:r>
-        <w:rPr>
-          <w:b/>
-        </w:rPr>
-        <w:t xml:space="preserve">Palabras claves: </w:t>
-      </w:r>
-      <w:r>
-        <w:t>control administrativo, solicitudes de servicio, trazabilidad, telecomunicaciones, pasantías</w:t>
+        <w:jc w:val="both"/>
+      </w:pPr>
+      <w:r>
+        <w:rPr>
+          <w:rFonts w:ascii="Times New Roman" w:hAnsi="Times New Roman"/>
+          <w:i w:val="0"/>
+          <w:sz w:val="24"/>
+        </w:rPr>
+        <w:t>Las pasantías en Ingeniería de Telecomunicaciones, C.A. (IDETEL) permitieron observar esta dinámica desde dos espacios vinculados: durante las primeras semanas se apoyaron tareas de Atención al Cliente y posteriormente se desarrollaron actividades en Administración. La rotación permitió identificar cómo la información originada en la atención inicial debe continuar hacia los procesos administrativos, comerciales y técnicos hasta alcanzar el cierre de la solicitud.</w:t>
+      </w:r>
+    </w:p>
+    <w:p>
+      <w:pPr>
+        <w:spacing w:line="360" w:lineRule="auto" w:after="0" w:before="0"/>
+        <w:ind w:firstLine="709"/>
+        <w:jc w:val="both"/>
+      </w:pPr>
+      <w:r>
+        <w:rPr>
+          <w:rFonts w:ascii="Times New Roman" w:hAnsi="Times New Roman"/>
+          <w:i w:val="0"/>
+          <w:sz w:val="24"/>
+        </w:rPr>
+        <w:t>El propósito del informe es evaluar el control administrativo aplicado a la gestión de solicitudes de servicios para determinar las principales debilidades y formular mejoras procedimentales. El trabajo se apoya en fundamentos de control administrativo, gestión de solicitudes, estandarización de procedimientos, calidad del servicio y sistemas de información, relacionándolos con las actividades realizadas durante la pasantía.</w:t>
+      </w:r>
+    </w:p>
+    <w:p>
+      <w:pPr>
+        <w:spacing w:line="360" w:lineRule="auto" w:after="0" w:before="0"/>
+        <w:ind w:firstLine="709"/>
+        <w:jc w:val="both"/>
+      </w:pPr>
+      <w:r>
+        <w:rPr>
+          <w:rFonts w:ascii="Times New Roman" w:hAnsi="Times New Roman"/>
+          <w:i w:val="0"/>
+          <w:sz w:val="24"/>
+        </w:rPr>
+        <w:t>El informe se organiza en cinco capítulos. El Capítulo I presenta la realidad organizacional de IDETEL; el Capítulo II desarrolla el diagnóstico situacional, los objetivos, la planificación y el cronograma; el Capítulo III expone las bases teóricas; el Capítulo IV describe las actividades ejecutadas durante las diez semanas; y el Capítulo V presenta las conclusiones y recomendaciones derivadas de la experiencia.</w:t>
       </w:r>
     </w:p>
     <w:p>
@@ -2476,107 +2520,6 @@
       </w:pPr>
     </w:p>
     <w:p>
-      <w:bookmarkStart w:id="bm_introduccion" w:name="bm_introduccion"/>
-      <w:pPr>
-        <w:spacing w:before="1140" w:after="480"/>
-        <w:jc w:val="center"/>
-      </w:pPr>
-      <w:r>
-        <w:rPr>
-          <w:rFonts w:ascii="Times New Roman" w:hAnsi="Times New Roman"/>
-          <w:b/>
-          <w:sz w:val="24"/>
-        </w:rPr>
-        <w:t>INTRODUCCIÓN</w:t>
-      </w:r>
-      <w:bookmarkEnd w:id="bm_introduccion"/>
-    </w:p>
-    <w:p>
-      <w:pPr>
-        <w:sectPr>
-          <w:footerReference w:type="default" r:id="rId31"/>
-          <w:pgSz w:w="12240" w:h="15840"/>
-          <w:pgMar w:top="1701" w:right="1701" w:bottom="1701" w:left="2268" w:header="720" w:footer="720" w:gutter="0"/>
-          <w:cols w:space="720"/>
-          <w:titlePg/>
-          <w:docGrid w:linePitch="360"/>
-        </w:sectPr>
-      </w:pPr>
-    </w:p>
-    <w:p>
-      <w:pPr>
-        <w:spacing w:line="360" w:lineRule="auto" w:after="0" w:before="0"/>
-        <w:ind w:firstLine="709"/>
-        <w:jc w:val="both"/>
-      </w:pPr>
-      <w:r>
-        <w:rPr>
-          <w:rFonts w:ascii="Times New Roman" w:hAnsi="Times New Roman"/>
-          <w:i w:val="0"/>
-          <w:sz w:val="24"/>
-        </w:rPr>
-        <w:t>La atención de solicitudes de servicio exige coordinación entre las áreas que reciben el requerimiento, registran la información, procesan pagos o documentación y ejecutan las acciones técnicas necesarias para cerrar cada caso. En una empresa de telecomunicaciones, el control administrativo de ese recorrido permite conocer el estado de las afiliaciones e incidencias y facilita la comunicación con el suscriptor.</w:t>
-      </w:r>
-    </w:p>
-    <w:p>
-      <w:pPr>
-        <w:spacing w:line="360" w:lineRule="auto" w:after="0" w:before="0"/>
-        <w:ind w:firstLine="709"/>
-        <w:jc w:val="both"/>
-      </w:pPr>
-      <w:r>
-        <w:rPr>
-          <w:rFonts w:ascii="Times New Roman" w:hAnsi="Times New Roman"/>
-          <w:i w:val="0"/>
-          <w:sz w:val="24"/>
-        </w:rPr>
-        <w:t>Las pasantías en Ingeniería de Telecomunicaciones, C.A. (IDETEL) permitieron observar esta dinámica desde dos espacios vinculados: durante las primeras semanas se apoyaron tareas de Atención al Cliente y posteriormente se desarrollaron actividades en Administración. La rotación permitió identificar cómo la información originada en la atención inicial debe continuar hacia los procesos administrativos, comerciales y técnicos hasta alcanzar el cierre de la solicitud.</w:t>
-      </w:r>
-    </w:p>
-    <w:p>
-      <w:pPr>
-        <w:spacing w:line="360" w:lineRule="auto" w:after="0" w:before="0"/>
-        <w:ind w:firstLine="709"/>
-        <w:jc w:val="both"/>
-      </w:pPr>
-      <w:r>
-        <w:rPr>
-          <w:rFonts w:ascii="Times New Roman" w:hAnsi="Times New Roman"/>
-          <w:i w:val="0"/>
-          <w:sz w:val="24"/>
-        </w:rPr>
-        <w:t>El propósito del informe es evaluar el control administrativo aplicado a la gestión de solicitudes de servicios para determinar las principales debilidades y formular mejoras procedimentales. El trabajo se apoya en fundamentos de control administrativo, gestión de solicitudes, estandarización de procedimientos, calidad del servicio y sistemas de información, relacionándolos con las actividades realizadas durante la pasantía.</w:t>
-      </w:r>
-    </w:p>
-    <w:p>
-      <w:pPr>
-        <w:spacing w:line="360" w:lineRule="auto" w:after="0" w:before="0"/>
-        <w:ind w:firstLine="709"/>
-        <w:jc w:val="both"/>
-      </w:pPr>
-      <w:r>
-        <w:rPr>
-          <w:rFonts w:ascii="Times New Roman" w:hAnsi="Times New Roman"/>
-          <w:i w:val="0"/>
-          <w:sz w:val="24"/>
-        </w:rPr>
-        <w:t>El informe se organiza en cinco capítulos. El Capítulo I presenta la realidad organizacional de IDETEL; el Capítulo II desarrolla el diagnóstico situacional, los objetivos, la planificación y el cronograma; el Capítulo III expone las bases teóricas; el Capítulo IV describe las actividades ejecutadas durante las diez semanas; y el Capítulo V presenta las conclusiones y recomendaciones derivadas de la experiencia.</w:t>
-      </w:r>
-    </w:p>
-    <w:p>
-      <w:pPr>
-        <w:sectPr>
-          <w:footerReference w:type="default" r:id="rId32"/>
-          <w:type w:val="continuous"/>
-          <w:pgSz w:w="12240" w:h="15840"/>
-          <w:pgMar w:top="1701" w:right="1701" w:bottom="1701" w:left="2268" w:header="720" w:footer="720" w:gutter="0"/>
-          <w:cols w:space="720"/>
-          <w:titlePg/>
-          <w:docGrid w:linePitch="360"/>
-        </w:sectPr>
-      </w:pPr>
-    </w:p>
-    <w:p>
       <w:pPr>
         <w:spacing w:before="1140" w:after="480"/>
         <w:jc w:val="center"/>
@@ -2609,7 +2552,7 @@
     <w:p>
       <w:pPr>
         <w:sectPr>
-          <w:footerReference w:type="default" r:id="rId33"/>
+          <w:footerReference w:type="default" r:id="rId31"/>
           <w:pgSz w:w="12240" w:h="15840"/>
           <w:pgMar w:top="1701" w:right="1701" w:bottom="1701" w:left="2268" w:header="720" w:footer="720" w:gutter="0"/>
           <w:cols w:space="720"/>
@@ -3337,7 +3280,7 @@
     <w:p>
       <w:pPr>
         <w:sectPr>
-          <w:footerReference w:type="default" r:id="rId34"/>
+          <w:footerReference w:type="default" r:id="rId32"/>
           <w:type w:val="continuous"/>
           <w:pgSz w:w="12240" w:h="15840"/>
           <w:pgMar w:top="1701" w:right="1701" w:bottom="1701" w:left="2268" w:header="720" w:footer="720" w:gutter="0"/>
@@ -3380,7 +3323,7 @@
     <w:p>
       <w:pPr>
         <w:sectPr>
-          <w:footerReference w:type="default" r:id="rId35"/>
+          <w:footerReference w:type="default" r:id="rId33"/>
           <w:pgSz w:w="12240" w:h="15840"/>
           <w:pgMar w:top="1701" w:right="1701" w:bottom="1701" w:left="2268" w:header="720" w:footer="720" w:gutter="0"/>
           <w:cols w:space="720"/>
@@ -7182,6 +7125,438 @@
     <w:p>
       <w:pPr>
         <w:sectPr>
+          <w:footerReference w:type="default" r:id="rId34"/>
+          <w:type w:val="continuous"/>
+          <w:pgSz w:w="12240" w:h="15840"/>
+          <w:pgMar w:top="1701" w:right="1701" w:bottom="1701" w:left="2268" w:header="720" w:footer="720" w:gutter="0"/>
+          <w:cols w:space="720"/>
+          <w:titlePg/>
+          <w:docGrid w:linePitch="360"/>
+        </w:sectPr>
+      </w:pPr>
+    </w:p>
+    <w:p>
+      <w:pPr>
+        <w:spacing w:before="1140" w:after="480"/>
+        <w:jc w:val="center"/>
+      </w:pPr>
+      <w:r>
+        <w:rPr>
+          <w:rFonts w:ascii="Times New Roman" w:hAnsi="Times New Roman"/>
+          <w:b/>
+          <w:sz w:val="24"/>
+        </w:rPr>
+        <w:t>CAPÍTULO III</w:t>
+      </w:r>
+    </w:p>
+    <w:p>
+      <w:bookmarkStart w:id="bm_cap3" w:name="bm_cap3"/>
+      <w:pPr>
+        <w:spacing w:before="480"/>
+        <w:jc w:val="center"/>
+      </w:pPr>
+      <w:r>
+        <w:rPr>
+          <w:rFonts w:ascii="Times New Roman" w:hAnsi="Times New Roman"/>
+          <w:b/>
+          <w:sz w:val="24"/>
+        </w:rPr>
+        <w:t>MARCO TEÓRICO</w:t>
+      </w:r>
+      <w:bookmarkEnd w:id="bm_cap3"/>
+    </w:p>
+    <w:p>
+      <w:pPr>
+        <w:sectPr>
+          <w:footerReference w:type="default" r:id="rId35"/>
+          <w:pgSz w:w="12240" w:h="15840"/>
+          <w:pgMar w:top="1701" w:right="1701" w:bottom="1701" w:left="2268" w:header="720" w:footer="720" w:gutter="0"/>
+          <w:cols w:space="720"/>
+          <w:titlePg/>
+          <w:docGrid w:linePitch="360"/>
+        </w:sectPr>
+      </w:pPr>
+    </w:p>
+    <w:p>
+      <w:bookmarkStart w:id="bm_cap3_bases" w:name="bm_cap3_bases"/>
+      <w:pPr>
+        <w:spacing w:before="480" w:after="480" w:line="360" w:lineRule="auto"/>
+        <w:jc w:val="left"/>
+      </w:pPr>
+      <w:r>
+        <w:rPr>
+          <w:rFonts w:ascii="Times New Roman" w:hAnsi="Times New Roman"/>
+          <w:b/>
+          <w:sz w:val="24"/>
+        </w:rPr>
+        <w:t>Control Administrativo</w:t>
+      </w:r>
+      <w:bookmarkEnd w:id="bm_cap3_bases"/>
+    </w:p>
+    <w:p>
+      <w:pPr>
+        <w:spacing w:line="360" w:lineRule="auto" w:after="0" w:before="0"/>
+        <w:ind w:firstLine="709"/>
+        <w:jc w:val="both"/>
+      </w:pPr>
+      <w:r>
+        <w:rPr>
+          <w:rFonts w:ascii="Times New Roman" w:hAnsi="Times New Roman"/>
+          <w:i w:val="0"/>
+          <w:sz w:val="24"/>
+        </w:rPr>
+        <w:t>El control administrativo constituye una de las funciones fundamentales del proceso administrativo y se define como el mecanismo mediante el cual la organización verifica que las actividades ejecutadas se correspondan con lo planificado, detectando desviaciones y aplicando las medidas correctivas necesarias. Robbins y Coulter (2010) señalan que el control eficaz no solo identifica fallas, sino que proporciona información oportuna para la toma de decisiones gerenciales, convirtiéndose en un instrumento de mejora continua y no únicamente de fiscalización.</w:t>
+      </w:r>
+    </w:p>
+    <w:p>
+      <w:pPr>
+        <w:spacing w:line="360" w:lineRule="auto" w:after="0" w:before="0"/>
+        <w:ind w:firstLine="709"/>
+        <w:jc w:val="both"/>
+      </w:pPr>
+      <w:r>
+        <w:rPr>
+          <w:rFonts w:ascii="Times New Roman" w:hAnsi="Times New Roman"/>
+          <w:i w:val="0"/>
+          <w:sz w:val="24"/>
+        </w:rPr>
+        <w:t>En el contexto del Departamento de Administración de Ingeniería de Telecomunicaciones, C.A., el control administrativo se aplica sobre el ciclo de gestión de solicitudes de servicio, abarcando desde la recepción de la solicitud del suscriptor hasta el cierre definitivo del caso. La ausencia de mecanismos formales de control en este ciclo genera inconsistencias entre los departamentos involucrados y dificulta la evaluación del desempeño del proceso de atención.</w:t>
+      </w:r>
+    </w:p>
+    <w:p>
+      <w:pPr>
+        <w:spacing w:line="240" w:lineRule="auto" w:before="720" w:after="240"/>
+        <w:ind w:left="709" w:right="709"/>
+        <w:jc w:val="both"/>
+      </w:pPr>
+      <w:r>
+        <w:rPr>
+          <w:rFonts w:ascii="Times New Roman" w:hAnsi="Times New Roman"/>
+          <w:sz w:val="24"/>
+        </w:rPr>
+        <w:t>El control es el proceso de monitorear las actividades para asegurarse de que se lleven a cabo según lo planeado y para corregir cualquier desviación significativa. Los gerentes no pueden saber realmente si sus unidades están desempeñándose adecuadamente hasta que evalúan qué actividades se han llevado a cabo y comparan el desempeño real con el estándar deseado.</w:t>
+      </w:r>
+      <w:r>
+        <w:rPr>
+          <w:rFonts w:ascii="Times New Roman" w:hAnsi="Times New Roman"/>
+          <w:sz w:val="24"/>
+        </w:rPr>
+        <w:t xml:space="preserve"> (Robbins y Coulter, 2010, p. 398)</w:t>
+      </w:r>
+    </w:p>
+    <w:p>
+      <w:pPr>
+        <w:spacing w:line="360" w:lineRule="auto" w:after="0" w:before="0"/>
+        <w:ind w:firstLine="709"/>
+        <w:jc w:val="both"/>
+      </w:pPr>
+      <w:r>
+        <w:rPr>
+          <w:rFonts w:ascii="Times New Roman" w:hAnsi="Times New Roman"/>
+          <w:i w:val="0"/>
+          <w:sz w:val="24"/>
+        </w:rPr>
+        <w:t>Desde la perspectiva de quien desarrolla este informe, el control administrativo en IDETEL debe convertirse en una herramienta de seguimiento continuo y no limitarse a la revisión posterior de los casos.</w:t>
+      </w:r>
+    </w:p>
+    <w:p>
+      <w:pPr>
+        <w:spacing w:before="480" w:after="480" w:line="360" w:lineRule="auto"/>
+        <w:jc w:val="left"/>
+      </w:pPr>
+      <w:r>
+        <w:rPr>
+          <w:rFonts w:ascii="Times New Roman" w:hAnsi="Times New Roman"/>
+          <w:b/>
+          <w:sz w:val="24"/>
+        </w:rPr>
+        <w:t>Gestión de Solicitudes de Servicio</w:t>
+      </w:r>
+    </w:p>
+    <w:p>
+      <w:pPr>
+        <w:spacing w:line="360" w:lineRule="auto" w:after="0" w:before="0"/>
+        <w:ind w:firstLine="709"/>
+        <w:jc w:val="both"/>
+      </w:pPr>
+      <w:r>
+        <w:rPr>
+          <w:rFonts w:ascii="Times New Roman" w:hAnsi="Times New Roman"/>
+          <w:i w:val="0"/>
+          <w:sz w:val="24"/>
+        </w:rPr>
+        <w:t>La gestión de solicitudes de servicio comprende el conjunto de procedimientos administrativos orientados a recepcionar, registrar, procesar y dar seguimiento a los requerimientos presentados por los clientes o suscriptores de una organización. Zeithaml, Parasuraman y Berry (1993) establecen que la calidad del servicio percibida por el cliente está directamente vinculada a la capacidad de la organización para gestionar sus solicitudes de forma ágil, transparente y con comunicación fluida en cada etapa del proceso.</w:t>
+      </w:r>
+    </w:p>
+    <w:p>
+      <w:pPr>
+        <w:spacing w:line="360" w:lineRule="auto" w:after="0" w:before="0"/>
+        <w:ind w:firstLine="709"/>
+        <w:jc w:val="both"/>
+      </w:pPr>
+      <w:r>
+        <w:rPr>
+          <w:rFonts w:ascii="Times New Roman" w:hAnsi="Times New Roman"/>
+          <w:i w:val="0"/>
+          <w:sz w:val="24"/>
+        </w:rPr>
+        <w:t>En empresas de telecomunicaciones como IDETEL, la gestión de solicitudes abarca dos categorías principales: las solicitudes de afiliación de nuevos suscriptores, que implican la coordinación entre las áreas comercial, técnica y administrativa; y las incidencias reportadas por suscriptores activos, que requieren diagnóstico, despacho de cuadrillas y cierre verificado del caso. La ausencia de un sistema unificado de seguimiento para ambas categorías genera retrasos y reprocesos que impactan directamente en la satisfacción del cliente.</w:t>
+      </w:r>
+    </w:p>
+    <w:p>
+      <w:pPr>
+        <w:spacing w:line="360" w:lineRule="auto" w:after="0" w:before="0"/>
+        <w:ind w:firstLine="709"/>
+        <w:jc w:val="both"/>
+      </w:pPr>
+      <w:r>
+        <w:rPr>
+          <w:rFonts w:ascii="Times New Roman" w:hAnsi="Times New Roman"/>
+          <w:i w:val="0"/>
+          <w:sz w:val="24"/>
+        </w:rPr>
+        <w:t>En el contexto de IDETEL, la gestión de solicitudes requiere un flujo único que permita conocer el responsable, el estado y el tiempo de atención de cada caso.</w:t>
+      </w:r>
+    </w:p>
+    <w:p>
+      <w:pPr>
+        <w:spacing w:before="480" w:after="480" w:line="360" w:lineRule="auto"/>
+        <w:jc w:val="left"/>
+      </w:pPr>
+      <w:r>
+        <w:rPr>
+          <w:rFonts w:ascii="Times New Roman" w:hAnsi="Times New Roman"/>
+          <w:b/>
+          <w:sz w:val="24"/>
+        </w:rPr>
+        <w:t>Procesos Administrativos y Estandarización de Procedimientos</w:t>
+      </w:r>
+    </w:p>
+    <w:p>
+      <w:pPr>
+        <w:spacing w:line="360" w:lineRule="auto" w:after="0" w:before="0"/>
+        <w:ind w:firstLine="709"/>
+        <w:jc w:val="both"/>
+      </w:pPr>
+      <w:r>
+        <w:rPr>
+          <w:rFonts w:ascii="Times New Roman" w:hAnsi="Times New Roman"/>
+          <w:i w:val="0"/>
+          <w:sz w:val="24"/>
+        </w:rPr>
+        <w:t>El proceso administrativo constituye el marco conceptual que rige el funcionamiento de las organizaciones modernas. Chiavenato (2006) lo describe como el conjunto secuencial e interrelacionado de funciones de planificación, organización, dirección y control, orientadas al logro eficiente de los objetivos organizacionales. La estandarización de los procedimientos dentro de este marco garantiza que las actividades se ejecuten de manera uniforme, reduciendo la variabilidad y los errores derivados de la discrecionalidad individual.</w:t>
+      </w:r>
+    </w:p>
+    <w:p>
+      <w:pPr>
+        <w:spacing w:line="360" w:lineRule="auto" w:after="0" w:before="0"/>
+        <w:ind w:firstLine="709"/>
+        <w:jc w:val="both"/>
+      </w:pPr>
+      <w:r>
+        <w:rPr>
+          <w:rFonts w:ascii="Times New Roman" w:hAnsi="Times New Roman"/>
+          <w:i w:val="0"/>
+          <w:sz w:val="24"/>
+        </w:rPr>
+        <w:t>La formalización de los procedimientos mediante manuales, flujogramas y formatos estandarizados constituye una herramienta esencial para el control administrativo. Según Harrington (1993), un proceso estandarizado es medible, controlable y mejorable, condiciones que permiten a la organización identificar con precisión los puntos de falla y aplicar acciones correctivas focalizadas. En el caso de IDETEL, la ausencia de procedimientos escritos para la gestión de solicitudes es una de las causas raíz de las deficiencias identificadas.</w:t>
+      </w:r>
+    </w:p>
+    <w:p>
+      <w:pPr>
+        <w:spacing w:line="360" w:lineRule="auto" w:after="0" w:before="0"/>
+        <w:ind w:firstLine="709"/>
+        <w:jc w:val="both"/>
+      </w:pPr>
+      <w:r>
+        <w:rPr>
+          <w:rFonts w:ascii="Times New Roman" w:hAnsi="Times New Roman"/>
+          <w:i w:val="0"/>
+          <w:sz w:val="24"/>
+        </w:rPr>
+        <w:t>A juicio de quien suscribe, la estandarización propuesta no busca aumentar la carga administrativa, sino eliminar ambigüedades y hacer verificable cada etapa del proceso.</w:t>
+      </w:r>
+    </w:p>
+    <w:p>
+      <w:pPr>
+        <w:spacing w:before="480" w:after="480" w:line="360" w:lineRule="auto"/>
+        <w:jc w:val="left"/>
+      </w:pPr>
+      <w:r>
+        <w:rPr>
+          <w:rFonts w:ascii="Times New Roman" w:hAnsi="Times New Roman"/>
+          <w:b/>
+          <w:sz w:val="24"/>
+        </w:rPr>
+        <w:t>Calidad del Servicio en Empresas de Telecomunicaciones</w:t>
+      </w:r>
+    </w:p>
+    <w:p>
+      <w:pPr>
+        <w:spacing w:line="360" w:lineRule="auto" w:after="0" w:before="0"/>
+        <w:ind w:firstLine="709"/>
+        <w:jc w:val="both"/>
+      </w:pPr>
+      <w:r>
+        <w:rPr>
+          <w:rFonts w:ascii="Times New Roman" w:hAnsi="Times New Roman"/>
+          <w:i w:val="0"/>
+          <w:sz w:val="24"/>
+        </w:rPr>
+        <w:t>La calidad del servicio se define como el grado en que las características del servicio prestado satisfacen o superan las expectativas del cliente. Parasuraman, Zeithaml y Berry (1988) desarrollaron el modelo SERVQUAL, que identifica cinco dimensiones de la calidad del servicio: fiabilidad, capacidad de respuesta, seguridad, empatía y elementos tangibles. En el sector de telecomunicaciones, la fiabilidad y la capacidad de respuesta son las dimensiones con mayor peso en la percepción del cliente.</w:t>
+      </w:r>
+    </w:p>
+    <w:p>
+      <w:pPr>
+        <w:spacing w:line="360" w:lineRule="auto" w:after="0" w:before="0"/>
+        <w:ind w:firstLine="709"/>
+        <w:jc w:val="both"/>
+      </w:pPr>
+      <w:r>
+        <w:rPr>
+          <w:rFonts w:ascii="Times New Roman" w:hAnsi="Times New Roman"/>
+          <w:i w:val="0"/>
+          <w:sz w:val="24"/>
+        </w:rPr>
+        <w:t>Las deficiencias en el control administrativo del proceso de solicitudes de servicio impactan directamente sobre la fiabilidad y la capacidad de respuesta de IDETEL. Cuando una solicitud no es gestionada dentro de los tiempos establecidos o su estatus no puede ser verificado en tiempo real, el cliente percibe una falla en la calidad del servicio que deteriora su confianza en la organización y puede derivar en la cancelación del contrato o en la difusión de experiencias negativas.</w:t>
+      </w:r>
+    </w:p>
+    <w:p>
+      <w:pPr>
+        <w:spacing w:line="360" w:lineRule="auto" w:after="0" w:before="0"/>
+        <w:ind w:firstLine="709"/>
+        <w:jc w:val="both"/>
+      </w:pPr>
+      <w:r>
+        <w:rPr>
+          <w:rFonts w:ascii="Times New Roman" w:hAnsi="Times New Roman"/>
+          <w:i w:val="0"/>
+          <w:sz w:val="24"/>
+        </w:rPr>
+        <w:t>Para este estudio, la calidad del servicio se relaciona directamente con la capacidad administrativa de IDETEL para responder y dar seguimiento oportuno a las solicitudes del suscriptor.</w:t>
+      </w:r>
+    </w:p>
+    <w:p>
+      <w:pPr>
+        <w:spacing w:before="480" w:after="480" w:line="360" w:lineRule="auto"/>
+        <w:jc w:val="left"/>
+      </w:pPr>
+      <w:r>
+        <w:rPr>
+          <w:rFonts w:ascii="Times New Roman" w:hAnsi="Times New Roman"/>
+          <w:b/>
+          <w:sz w:val="24"/>
+        </w:rPr>
+        <w:t>Sistemas de Información para el Control Administrativo</w:t>
+      </w:r>
+    </w:p>
+    <w:p>
+      <w:pPr>
+        <w:spacing w:line="360" w:lineRule="auto" w:after="0" w:before="0"/>
+        <w:ind w:firstLine="709"/>
+        <w:jc w:val="both"/>
+      </w:pPr>
+      <w:r>
+        <w:rPr>
+          <w:rFonts w:ascii="Times New Roman" w:hAnsi="Times New Roman"/>
+          <w:i w:val="0"/>
+          <w:sz w:val="24"/>
+        </w:rPr>
+        <w:t>Un sistema de información constituye un conjunto organizado de recursos tecnológicos y procedimentales orientados a la captura, almacenamiento, procesamiento y distribución de datos con el propósito de apoyar la toma de decisiones. Laudon y Laudon (2016) distinguen los sistemas de procesamiento de transacciones como la categoría que registra y gestiona las operaciones rutinarias de la organización, siendo esta la tipología más pertinente para el control de solicitudes de servicio en una empresa de telecomunicaciones.</w:t>
+      </w:r>
+    </w:p>
+    <w:p>
+      <w:pPr>
+        <w:spacing w:line="360" w:lineRule="auto" w:after="0" w:before="0"/>
+        <w:ind w:firstLine="709"/>
+        <w:jc w:val="both"/>
+      </w:pPr>
+      <w:r>
+        <w:rPr>
+          <w:rFonts w:ascii="Times New Roman" w:hAnsi="Times New Roman"/>
+          <w:i w:val="0"/>
+          <w:sz w:val="24"/>
+        </w:rPr>
+        <w:t>La implementación de un sistema de tickets o plataforma de seguimiento de solicitudes en IDETEL permitiría centralizar el registro de cada caso, asignar responsables, definir tiempos de atención y generar alertas ante incumplimientos. Esta herramienta transformaría el control administrativo de reactivo a proactivo, dotando a la supervisión de información en tiempo real para la toma de decisiones y la evaluación continua del desempeño del proceso.</w:t>
+      </w:r>
+    </w:p>
+    <w:p>
+      <w:pPr>
+        <w:spacing w:line="360" w:lineRule="auto" w:after="0" w:before="0"/>
+        <w:ind w:firstLine="709"/>
+        <w:jc w:val="both"/>
+      </w:pPr>
+      <w:r>
+        <w:rPr>
+          <w:rFonts w:ascii="Times New Roman" w:hAnsi="Times New Roman"/>
+          <w:i w:val="0"/>
+          <w:sz w:val="24"/>
+        </w:rPr>
+        <w:t>Desde la posición del autor, una herramienta de seguimiento centralizada es viable para IDETEL porque permite mejorar la trazabilidad sin modificar la naturaleza de los servicios que presta la empresa.</w:t>
+      </w:r>
+    </w:p>
+    <w:p>
+      <w:pPr>
+        <w:spacing w:before="480" w:after="480" w:line="360" w:lineRule="auto"/>
+        <w:jc w:val="left"/>
+      </w:pPr>
+      <w:r>
+        <w:rPr>
+          <w:rFonts w:ascii="Times New Roman" w:hAnsi="Times New Roman"/>
+          <w:b/>
+          <w:sz w:val="24"/>
+        </w:rPr>
+        <w:t>Proyecto Factible como Modalidad de Investigación</w:t>
+      </w:r>
+    </w:p>
+    <w:p>
+      <w:pPr>
+        <w:spacing w:line="360" w:lineRule="auto" w:after="0" w:before="0"/>
+        <w:ind w:firstLine="709"/>
+        <w:jc w:val="both"/>
+      </w:pPr>
+      <w:r>
+        <w:rPr>
+          <w:rFonts w:ascii="Times New Roman" w:hAnsi="Times New Roman"/>
+          <w:i w:val="0"/>
+          <w:sz w:val="24"/>
+        </w:rPr>
+        <w:t>La Universidad Pedagógica Experimental Libertador (UPEL, 2016) define el proyecto factible como la investigación, elaboración y desarrollo de una propuesta de un modelo operativo viable para solucionar problemas, requerimientos o necesidades de organizaciones o grupos sociales. Esta modalidad exige un diagnóstico de campo que evidencie la situación deficitaria y la comprobación de la viabilidad técnica y operativa de la solución planteada.</w:t>
+      </w:r>
+    </w:p>
+    <w:p>
+      <w:pPr>
+        <w:spacing w:line="360" w:lineRule="auto" w:after="0" w:before="0"/>
+        <w:ind w:firstLine="709"/>
+        <w:jc w:val="both"/>
+      </w:pPr>
+      <w:r>
+        <w:rPr>
+          <w:rFonts w:ascii="Times New Roman" w:hAnsi="Times New Roman"/>
+          <w:i w:val="0"/>
+          <w:sz w:val="24"/>
+        </w:rPr>
+        <w:t>Arias (2012) señala que el proyecto factible avanza hasta proponer y en muchos casos desarrollar la solución, demostrando su aplicabilidad en el contexto real. El presente trabajo se enmarca en esta modalidad al partir de la evaluación del control administrativo de IDETEL para proponer mejoras procedimentales cuya implementación es viable dentro de la estructura organizativa y los recursos disponibles de la empresa.</w:t>
+      </w:r>
+    </w:p>
+    <w:p>
+      <w:pPr>
+        <w:spacing w:line="360" w:lineRule="auto" w:after="0" w:before="0"/>
+        <w:ind w:firstLine="709"/>
+        <w:jc w:val="both"/>
+      </w:pPr>
+      <w:r>
+        <w:rPr>
+          <w:rFonts w:ascii="Times New Roman" w:hAnsi="Times New Roman"/>
+          <w:i w:val="0"/>
+          <w:sz w:val="24"/>
+        </w:rPr>
+        <w:t>La elección del proyecto factible responde a la necesidad de transformar el diagnóstico realizado en procedimientos y formatos aplicables a la realidad operativa de IDETEL.</w:t>
+      </w:r>
+    </w:p>
+    <w:p>
+      <w:pPr>
+        <w:sectPr>
           <w:footerReference w:type="default" r:id="rId36"/>
           <w:type w:val="continuous"/>
           <w:pgSz w:w="12240" w:h="15840"/>
@@ -7203,11 +7578,11 @@
           <w:b/>
           <w:sz w:val="24"/>
         </w:rPr>
-        <w:t>CAPÍTULO III</w:t>
+        <w:t>CAPÍTULO IV</w:t>
       </w:r>
     </w:p>
     <w:p>
-      <w:bookmarkStart w:id="bm_cap3" w:name="bm_cap3"/>
+      <w:bookmarkStart w:id="bm_cap4" w:name="bm_cap4"/>
       <w:pPr>
         <w:spacing w:before="480"/>
         <w:jc w:val="center"/>
@@ -7218,9 +7593,9 @@
           <w:b/>
           <w:sz w:val="24"/>
         </w:rPr>
-        <w:t>MARCO TEÓRICO</w:t>
-      </w:r>
-      <w:bookmarkEnd w:id="bm_cap3"/>
+        <w:t>ACTIVIDADES REALIZADAS</w:t>
+      </w:r>
+      <w:bookmarkEnd w:id="bm_cap4"/>
     </w:p>
     <w:p>
       <w:pPr>
@@ -7235,7 +7610,7 @@
       </w:pPr>
     </w:p>
     <w:p>
-      <w:bookmarkStart w:id="bm_cap3_bases" w:name="bm_cap3_bases"/>
+      <w:bookmarkStart w:id="bm_cap4_desc" w:name="bm_cap4_desc"/>
       <w:pPr>
         <w:spacing w:before="480" w:after="480" w:line="360" w:lineRule="auto"/>
         <w:jc w:val="left"/>
@@ -7246,9 +7621,9 @@
           <w:b/>
           <w:sz w:val="24"/>
         </w:rPr>
-        <w:t>Control Administrativo</w:t>
-      </w:r>
-      <w:bookmarkEnd w:id="bm_cap3_bases"/>
+        <w:t>Descripción de Actividades Ejecutadas por Semana</w:t>
+      </w:r>
+      <w:bookmarkEnd w:id="bm_cap4_desc"/>
     </w:p>
     <w:p>
       <w:pPr>
@@ -7262,28 +7637,56 @@
           <w:i w:val="0"/>
           <w:sz w:val="24"/>
         </w:rPr>
-        <w:t>El control administrativo constituye una de las funciones fundamentales del proceso administrativo y se define como el mecanismo mediante el cual la organización verifica que las actividades ejecutadas se correspondan con lo planificado, detectando desviaciones y aplicando las medidas correctivas necesarias. Robbins y Coulter (2010) señalan que el control eficaz no solo identifica fallas, sino que proporciona información oportuna para la toma de decisiones gerenciales, convirtiéndose en un instrumento de mejora continua y no únicamente de fiscalización.</w:t>
+        <w:t>Durante las diez (10) semanas de pasantías se desarrollaron actividades operativas y de análisis mediante una rotación inicial por Atención al Cliente y una segunda etapa de apoyo en Administración:</w:t>
       </w:r>
     </w:p>
     <w:p>
       <w:pPr>
-        <w:spacing w:line="360" w:lineRule="auto" w:after="0" w:before="0"/>
+        <w:spacing w:before="480" w:after="480" w:line="360" w:lineRule="auto"/>
+        <w:jc w:val="left"/>
+      </w:pPr>
+      <w:r>
+        <w:rPr>
+          <w:rFonts w:ascii="Times New Roman" w:hAnsi="Times New Roman"/>
+          <w:b/>
+          <w:sz w:val="24"/>
+        </w:rPr>
+        <w:t>Semana 1</w:t>
+      </w:r>
+    </w:p>
+    <w:p>
+      <w:pPr>
+        <w:spacing w:line="360" w:lineRule="auto"/>
         <w:ind w:firstLine="709"/>
         <w:jc w:val="both"/>
       </w:pPr>
       <w:r>
         <w:rPr>
           <w:rFonts w:ascii="Times New Roman" w:hAnsi="Times New Roman"/>
-          <w:i w:val="0"/>
-          <w:sz w:val="24"/>
-        </w:rPr>
-        <w:t>En el contexto del Departamento de Administración de Ingeniería de Telecomunicaciones, C.A., el control administrativo se aplica sobre el ciclo de gestión de solicitudes de servicio, abarcando desde la recepción de la solicitud del suscriptor hasta el cierre definitivo del caso. La ausencia de mecanismos formales de control en este ciclo genera inconsistencias entre los departamentos involucrados y dificulta la evaluación del desempeño del proceso de atención.</w:t>
+          <w:sz w:val="24"/>
+        </w:rPr>
+        <w:t xml:space="preserve">1. </w:t>
+      </w:r>
+      <w:r>
+        <w:rPr>
+          <w:rFonts w:ascii="Times New Roman" w:hAnsi="Times New Roman"/>
+          <w:b/>
+          <w:sz w:val="24"/>
+        </w:rPr>
+        <w:t xml:space="preserve">Actividad operativa: </w:t>
+      </w:r>
+      <w:r>
+        <w:rPr>
+          <w:rFonts w:ascii="Times New Roman" w:hAnsi="Times New Roman"/>
+          <w:sz w:val="24"/>
+        </w:rPr>
+        <w:t>Inducción institucional y rotación inicial por Atención al Cliente, reconocimiento de los tipos de solicitudes recibidas, revisión del proceso de registro de pagos y familiarización con la información utilizada para atender a los suscriptores.</w:t>
       </w:r>
     </w:p>
     <w:p>
       <w:pPr>
-        <w:spacing w:line="240" w:lineRule="auto" w:before="720" w:after="240"/>
-        <w:ind w:left="709" w:right="709"/>
+        <w:spacing w:line="360" w:lineRule="auto"/>
+        <w:ind w:firstLine="709"/>
         <w:jc w:val="both"/>
       </w:pPr>
       <w:r>
@@ -7291,33 +7694,98 @@
           <w:rFonts w:ascii="Times New Roman" w:hAnsi="Times New Roman"/>
           <w:sz w:val="24"/>
         </w:rPr>
-        <w:t>El control es el proceso de monitorear las actividades para asegurarse de que se lleven a cabo según lo planeado y para corregir cualquier desviación significativa. Los gerentes no pueden saber realmente si sus unidades están desempeñándose adecuadamente hasta que evalúan qué actividades se han llevado a cabo y comparan el desempeño real con el estándar deseado.</w:t>
-      </w:r>
-      <w:r>
-        <w:rPr>
-          <w:rFonts w:ascii="Times New Roman" w:hAnsi="Times New Roman"/>
-          <w:sz w:val="24"/>
-        </w:rPr>
-        <w:t xml:space="preserve"> (Robbins y Coulter, 2010, p. 398)</w:t>
+        <w:t xml:space="preserve">2. </w:t>
+      </w:r>
+      <w:r>
+        <w:rPr>
+          <w:rFonts w:ascii="Times New Roman" w:hAnsi="Times New Roman"/>
+          <w:b/>
+          <w:sz w:val="24"/>
+        </w:rPr>
+        <w:t xml:space="preserve">Actividad de investigación: </w:t>
+      </w:r>
+      <w:r>
+        <w:rPr>
+          <w:rFonts w:ascii="Times New Roman" w:hAnsi="Times New Roman"/>
+          <w:sz w:val="24"/>
+        </w:rPr>
+        <w:t>Observación directa del punto de inicio de las solicitudes de afiliación e incidencias, identificando los datos que se generan en Atención al Cliente y la forma en que son comunicados a otras áreas.</w:t>
       </w:r>
     </w:p>
     <w:p>
       <w:pPr>
-        <w:spacing w:line="360" w:lineRule="auto" w:after="0" w:before="0"/>
+        <w:spacing w:before="480" w:after="480" w:line="360" w:lineRule="auto"/>
+        <w:jc w:val="left"/>
+      </w:pPr>
+      <w:r>
+        <w:rPr>
+          <w:rFonts w:ascii="Times New Roman" w:hAnsi="Times New Roman"/>
+          <w:b/>
+          <w:sz w:val="24"/>
+        </w:rPr>
+        <w:t>Semana 2</w:t>
+      </w:r>
+    </w:p>
+    <w:p>
+      <w:pPr>
+        <w:spacing w:line="360" w:lineRule="auto"/>
         <w:ind w:firstLine="709"/>
         <w:jc w:val="both"/>
       </w:pPr>
       <w:r>
         <w:rPr>
           <w:rFonts w:ascii="Times New Roman" w:hAnsi="Times New Roman"/>
-          <w:i w:val="0"/>
-          <w:sz w:val="24"/>
-        </w:rPr>
-        <w:t>Desde la perspectiva de quien desarrolla este informe, el control administrativo en IDETEL debe convertirse en una herramienta de seguimiento continuo y no limitarse a la revisión posterior de los casos.</w:t>
+          <w:sz w:val="24"/>
+        </w:rPr>
+        <w:t xml:space="preserve">1. </w:t>
+      </w:r>
+      <w:r>
+        <w:rPr>
+          <w:rFonts w:ascii="Times New Roman" w:hAnsi="Times New Roman"/>
+          <w:b/>
+          <w:sz w:val="24"/>
+        </w:rPr>
+        <w:t xml:space="preserve">Actividad operativa: </w:t>
+      </w:r>
+      <w:r>
+        <w:rPr>
+          <w:rFonts w:ascii="Times New Roman" w:hAnsi="Times New Roman"/>
+          <w:sz w:val="24"/>
+        </w:rPr>
+        <w:t>Apoyo en Atención al Cliente mediante recepción y registro de pagos, verificación de datos básicos de suscriptores y orientación inicial sobre solicitudes e incidencias reportadas.</w:t>
       </w:r>
     </w:p>
     <w:p>
       <w:pPr>
+        <w:spacing w:line="360" w:lineRule="auto"/>
+        <w:ind w:firstLine="709"/>
+        <w:jc w:val="both"/>
+      </w:pPr>
+      <w:r>
+        <w:rPr>
+          <w:rFonts w:ascii="Times New Roman" w:hAnsi="Times New Roman"/>
+          <w:sz w:val="24"/>
+        </w:rPr>
+        <w:t xml:space="preserve">2. </w:t>
+      </w:r>
+      <w:r>
+        <w:rPr>
+          <w:rFonts w:ascii="Times New Roman" w:hAnsi="Times New Roman"/>
+          <w:b/>
+          <w:sz w:val="24"/>
+        </w:rPr>
+        <w:t xml:space="preserve">Actividad de investigación: </w:t>
+      </w:r>
+      <w:r>
+        <w:rPr>
+          <w:rFonts w:ascii="Times New Roman" w:hAnsi="Times New Roman"/>
+          <w:sz w:val="24"/>
+        </w:rPr>
+        <w:t>Levantamiento del recorrido de las solicitudes desde su recepción, revisión de registros disponibles y elaboración de un esquema preliminar de las etapas y áreas que intervienen en cada tipo de caso.</w:t>
+      </w:r>
+    </w:p>
+    <w:p>
+      <w:pPr>
         <w:spacing w:before="480" w:after="480" w:line="360" w:lineRule="auto"/>
         <w:jc w:val="left"/>
       </w:pPr>
@@ -7327,56 +7795,141 @@
           <w:b/>
           <w:sz w:val="24"/>
         </w:rPr>
-        <w:t>Gestión de Solicitudes de Servicio</w:t>
+        <w:t>Semana 3</w:t>
       </w:r>
     </w:p>
     <w:p>
       <w:pPr>
-        <w:spacing w:line="360" w:lineRule="auto" w:after="0" w:before="0"/>
+        <w:spacing w:line="360" w:lineRule="auto"/>
         <w:ind w:firstLine="709"/>
         <w:jc w:val="both"/>
       </w:pPr>
       <w:r>
         <w:rPr>
           <w:rFonts w:ascii="Times New Roman" w:hAnsi="Times New Roman"/>
-          <w:i w:val="0"/>
-          <w:sz w:val="24"/>
-        </w:rPr>
-        <w:t>La gestión de solicitudes de servicio comprende el conjunto de procedimientos administrativos orientados a recepcionar, registrar, procesar y dar seguimiento a los requerimientos presentados por los clientes o suscriptores de una organización. Zeithaml, Parasuraman y Berry (1993) establecen que la calidad del servicio percibida por el cliente está directamente vinculada a la capacidad de la organización para gestionar sus solicitudes de forma ágil, transparente y con comunicación fluida en cada etapa del proceso.</w:t>
+          <w:sz w:val="24"/>
+        </w:rPr>
+        <w:t xml:space="preserve">1. </w:t>
+      </w:r>
+      <w:r>
+        <w:rPr>
+          <w:rFonts w:ascii="Times New Roman" w:hAnsi="Times New Roman"/>
+          <w:b/>
+          <w:sz w:val="24"/>
+        </w:rPr>
+        <w:t xml:space="preserve">Actividad operativa: </w:t>
+      </w:r>
+      <w:r>
+        <w:rPr>
+          <w:rFonts w:ascii="Times New Roman" w:hAnsi="Times New Roman"/>
+          <w:sz w:val="24"/>
+        </w:rPr>
+        <w:t>Continuación del apoyo en Atención al Cliente, registro de pagos y solicitudes, actualización de información básica y seguimiento inicial de casos remitidos a otras áreas.</w:t>
       </w:r>
     </w:p>
     <w:p>
       <w:pPr>
-        <w:spacing w:line="360" w:lineRule="auto" w:after="0" w:before="0"/>
+        <w:spacing w:line="360" w:lineRule="auto"/>
         <w:ind w:firstLine="709"/>
         <w:jc w:val="both"/>
       </w:pPr>
       <w:r>
         <w:rPr>
           <w:rFonts w:ascii="Times New Roman" w:hAnsi="Times New Roman"/>
-          <w:i w:val="0"/>
-          <w:sz w:val="24"/>
-        </w:rPr>
-        <w:t>En empresas de telecomunicaciones como IDETEL, la gestión de solicitudes abarca dos categorías principales: las solicitudes de afiliación de nuevos suscriptores, que implican la coordinación entre las áreas comercial, técnica y administrativa; y las incidencias reportadas por suscriptores activos, que requieren diagnóstico, despacho de cuadrillas y cierre verificado del caso. La ausencia de un sistema unificado de seguimiento para ambas categorías genera retrasos y reprocesos que impactan directamente en la satisfacción del cliente.</w:t>
+          <w:sz w:val="24"/>
+        </w:rPr>
+        <w:t xml:space="preserve">2. </w:t>
+      </w:r>
+      <w:r>
+        <w:rPr>
+          <w:rFonts w:ascii="Times New Roman" w:hAnsi="Times New Roman"/>
+          <w:b/>
+          <w:sz w:val="24"/>
+        </w:rPr>
+        <w:t xml:space="preserve">Actividad de investigación: </w:t>
+      </w:r>
+      <w:r>
+        <w:rPr>
+          <w:rFonts w:ascii="Times New Roman" w:hAnsi="Times New Roman"/>
+          <w:sz w:val="24"/>
+        </w:rPr>
+        <w:t>Diseño de una guía de entrevista estructurada y revisión del flujo observado para precisar los puntos donde se pierde continuidad o se dificulta conocer el estatus de las solicitudes.</w:t>
       </w:r>
     </w:p>
     <w:p>
       <w:pPr>
-        <w:spacing w:line="360" w:lineRule="auto" w:after="0" w:before="0"/>
+        <w:spacing w:before="480" w:after="480" w:line="360" w:lineRule="auto"/>
+        <w:jc w:val="left"/>
+      </w:pPr>
+      <w:r>
+        <w:rPr>
+          <w:rFonts w:ascii="Times New Roman" w:hAnsi="Times New Roman"/>
+          <w:b/>
+          <w:sz w:val="24"/>
+        </w:rPr>
+        <w:t>Semana 4</w:t>
+      </w:r>
+    </w:p>
+    <w:p>
+      <w:pPr>
+        <w:spacing w:line="360" w:lineRule="auto"/>
         <w:ind w:firstLine="709"/>
         <w:jc w:val="both"/>
       </w:pPr>
       <w:r>
         <w:rPr>
           <w:rFonts w:ascii="Times New Roman" w:hAnsi="Times New Roman"/>
-          <w:i w:val="0"/>
-          <w:sz w:val="24"/>
-        </w:rPr>
-        <w:t>En el contexto de IDETEL, la gestión de solicitudes requiere un flujo único que permita conocer el responsable, el estado y el tiempo de atención de cada caso.</w:t>
+          <w:sz w:val="24"/>
+        </w:rPr>
+        <w:t xml:space="preserve">1. </w:t>
+      </w:r>
+      <w:r>
+        <w:rPr>
+          <w:rFonts w:ascii="Times New Roman" w:hAnsi="Times New Roman"/>
+          <w:b/>
+          <w:sz w:val="24"/>
+        </w:rPr>
+        <w:t xml:space="preserve">Actividad operativa: </w:t>
+      </w:r>
+      <w:r>
+        <w:rPr>
+          <w:rFonts w:ascii="Times New Roman" w:hAnsi="Times New Roman"/>
+          <w:sz w:val="24"/>
+        </w:rPr>
+        <w:t>Inicio de la rotación por Administración con apoyo en procesamiento de pagos, facturación, revisión de documentación y seguimiento administrativo de solicitudes activas.</w:t>
       </w:r>
     </w:p>
     <w:p>
       <w:pPr>
+        <w:spacing w:line="360" w:lineRule="auto"/>
+        <w:ind w:firstLine="709"/>
+        <w:jc w:val="both"/>
+      </w:pPr>
+      <w:r>
+        <w:rPr>
+          <w:rFonts w:ascii="Times New Roman" w:hAnsi="Times New Roman"/>
+          <w:sz w:val="24"/>
+        </w:rPr>
+        <w:t xml:space="preserve">2. </w:t>
+      </w:r>
+      <w:r>
+        <w:rPr>
+          <w:rFonts w:ascii="Times New Roman" w:hAnsi="Times New Roman"/>
+          <w:b/>
+          <w:sz w:val="24"/>
+        </w:rPr>
+        <w:t xml:space="preserve">Actividad de investigación: </w:t>
+      </w:r>
+      <w:r>
+        <w:rPr>
+          <w:rFonts w:ascii="Times New Roman" w:hAnsi="Times New Roman"/>
+          <w:sz w:val="24"/>
+        </w:rPr>
+        <w:t>Aplicación de entrevistas estructuradas al personal vinculado con Administración, Atención al Cliente y áreas relacionadas, registrando las principales fallas percibidas en comunicación, control y seguimiento.</w:t>
+      </w:r>
+    </w:p>
+    <w:p>
+      <w:pPr>
         <w:spacing w:before="480" w:after="480" w:line="360" w:lineRule="auto"/>
         <w:jc w:val="left"/>
       </w:pPr>
@@ -7386,56 +7939,141 @@
           <w:b/>
           <w:sz w:val="24"/>
         </w:rPr>
-        <w:t>Procesos Administrativos y Estandarización de Procedimientos</w:t>
+        <w:t>Semana 5</w:t>
       </w:r>
     </w:p>
     <w:p>
       <w:pPr>
-        <w:spacing w:line="360" w:lineRule="auto" w:after="0" w:before="0"/>
+        <w:spacing w:line="360" w:lineRule="auto"/>
         <w:ind w:firstLine="709"/>
         <w:jc w:val="both"/>
       </w:pPr>
       <w:r>
         <w:rPr>
           <w:rFonts w:ascii="Times New Roman" w:hAnsi="Times New Roman"/>
-          <w:i w:val="0"/>
-          <w:sz w:val="24"/>
-        </w:rPr>
-        <w:t>El proceso administrativo constituye el marco conceptual que rige el funcionamiento de las organizaciones modernas. Chiavenato (2006) lo describe como el conjunto secuencial e interrelacionado de funciones de planificación, organización, dirección y control, orientadas al logro eficiente de los objetivos organizacionales. La estandarización de los procedimientos dentro de este marco garantiza que las actividades se ejecuten de manera uniforme, reduciendo la variabilidad y los errores derivados de la discrecionalidad individual.</w:t>
+          <w:sz w:val="24"/>
+        </w:rPr>
+        <w:t xml:space="preserve">1. </w:t>
+      </w:r>
+      <w:r>
+        <w:rPr>
+          <w:rFonts w:ascii="Times New Roman" w:hAnsi="Times New Roman"/>
+          <w:b/>
+          <w:sz w:val="24"/>
+        </w:rPr>
+        <w:t xml:space="preserve">Actividad operativa: </w:t>
+      </w:r>
+      <w:r>
+        <w:rPr>
+          <w:rFonts w:ascii="Times New Roman" w:hAnsi="Times New Roman"/>
+          <w:sz w:val="24"/>
+        </w:rPr>
+        <w:t>Apoyo en tareas administrativas de facturación, actualización de registros y verificación del cierre de solicitudes e incidencias correspondientes al período.</w:t>
       </w:r>
     </w:p>
     <w:p>
       <w:pPr>
-        <w:spacing w:line="360" w:lineRule="auto" w:after="0" w:before="0"/>
+        <w:spacing w:line="360" w:lineRule="auto"/>
         <w:ind w:firstLine="709"/>
         <w:jc w:val="both"/>
       </w:pPr>
       <w:r>
         <w:rPr>
           <w:rFonts w:ascii="Times New Roman" w:hAnsi="Times New Roman"/>
-          <w:i w:val="0"/>
-          <w:sz w:val="24"/>
-        </w:rPr>
-        <w:t>La formalización de los procedimientos mediante manuales, flujogramas y formatos estandarizados constituye una herramienta esencial para el control administrativo. Según Harrington (1993), un proceso estandarizado es medible, controlable y mejorable, condiciones que permiten a la organización identificar con precisión los puntos de falla y aplicar acciones correctivas focalizadas. En el caso de IDETEL, la ausencia de procedimientos escritos para la gestión de solicitudes es una de las causas raíz de las deficiencias identificadas.</w:t>
+          <w:sz w:val="24"/>
+        </w:rPr>
+        <w:t xml:space="preserve">2. </w:t>
+      </w:r>
+      <w:r>
+        <w:rPr>
+          <w:rFonts w:ascii="Times New Roman" w:hAnsi="Times New Roman"/>
+          <w:b/>
+          <w:sz w:val="24"/>
+        </w:rPr>
+        <w:t xml:space="preserve">Actividad de investigación: </w:t>
+      </w:r>
+      <w:r>
+        <w:rPr>
+          <w:rFonts w:ascii="Times New Roman" w:hAnsi="Times New Roman"/>
+          <w:sz w:val="24"/>
+        </w:rPr>
+        <w:t>Organización de los hallazgos del diagnóstico y elaboración del diagrama de Ishikawa para representar las causas relacionadas con procedimiento, comunicación, registro y seguimiento; inicio de la revisión de bases teóricas.</w:t>
       </w:r>
     </w:p>
     <w:p>
       <w:pPr>
-        <w:spacing w:line="360" w:lineRule="auto" w:after="0" w:before="0"/>
+        <w:spacing w:before="480" w:after="480" w:line="360" w:lineRule="auto"/>
+        <w:jc w:val="left"/>
+      </w:pPr>
+      <w:r>
+        <w:rPr>
+          <w:rFonts w:ascii="Times New Roman" w:hAnsi="Times New Roman"/>
+          <w:b/>
+          <w:sz w:val="24"/>
+        </w:rPr>
+        <w:t>Semana 6</w:t>
+      </w:r>
+    </w:p>
+    <w:p>
+      <w:pPr>
+        <w:spacing w:line="360" w:lineRule="auto"/>
         <w:ind w:firstLine="709"/>
         <w:jc w:val="both"/>
       </w:pPr>
       <w:r>
         <w:rPr>
           <w:rFonts w:ascii="Times New Roman" w:hAnsi="Times New Roman"/>
-          <w:i w:val="0"/>
-          <w:sz w:val="24"/>
-        </w:rPr>
-        <w:t>A juicio de quien suscribe, la estandarización propuesta no busca aumentar la carga administrativa, sino eliminar ambigüedades y hacer verificable cada etapa del proceso.</w:t>
+          <w:sz w:val="24"/>
+        </w:rPr>
+        <w:t xml:space="preserve">1. </w:t>
+      </w:r>
+      <w:r>
+        <w:rPr>
+          <w:rFonts w:ascii="Times New Roman" w:hAnsi="Times New Roman"/>
+          <w:b/>
+          <w:sz w:val="24"/>
+        </w:rPr>
+        <w:t xml:space="preserve">Actividad operativa: </w:t>
+      </w:r>
+      <w:r>
+        <w:rPr>
+          <w:rFonts w:ascii="Times New Roman" w:hAnsi="Times New Roman"/>
+          <w:sz w:val="24"/>
+        </w:rPr>
+        <w:t>Procesamiento de pagos y documentos administrativos, apoyo en facturación y elaboración de reportes básicos requeridos por la supervisión.</w:t>
       </w:r>
     </w:p>
     <w:p>
       <w:pPr>
+        <w:spacing w:line="360" w:lineRule="auto"/>
+        <w:ind w:firstLine="709"/>
+        <w:jc w:val="both"/>
+      </w:pPr>
+      <w:r>
+        <w:rPr>
+          <w:rFonts w:ascii="Times New Roman" w:hAnsi="Times New Roman"/>
+          <w:sz w:val="24"/>
+        </w:rPr>
+        <w:t xml:space="preserve">2. </w:t>
+      </w:r>
+      <w:r>
+        <w:rPr>
+          <w:rFonts w:ascii="Times New Roman" w:hAnsi="Times New Roman"/>
+          <w:b/>
+          <w:sz w:val="24"/>
+        </w:rPr>
+        <w:t xml:space="preserve">Actividad de investigación: </w:t>
+      </w:r>
+      <w:r>
+        <w:rPr>
+          <w:rFonts w:ascii="Times New Roman" w:hAnsi="Times New Roman"/>
+          <w:sz w:val="24"/>
+        </w:rPr>
+        <w:t>Análisis del impacto de las deficiencias identificadas sobre los tiempos de respuesta, la trazabilidad y la atención al suscriptor, complementando el desarrollo del marco teórico.</w:t>
+      </w:r>
+    </w:p>
+    <w:p>
+      <w:pPr>
         <w:spacing w:before="480" w:after="480" w:line="360" w:lineRule="auto"/>
         <w:jc w:val="left"/>
       </w:pPr>
@@ -7445,56 +8083,141 @@
           <w:b/>
           <w:sz w:val="24"/>
         </w:rPr>
-        <w:t>Calidad del Servicio en Empresas de Telecomunicaciones</w:t>
+        <w:t>Semana 7</w:t>
       </w:r>
     </w:p>
     <w:p>
       <w:pPr>
-        <w:spacing w:line="360" w:lineRule="auto" w:after="0" w:before="0"/>
+        <w:spacing w:line="360" w:lineRule="auto"/>
         <w:ind w:firstLine="709"/>
         <w:jc w:val="both"/>
       </w:pPr>
       <w:r>
         <w:rPr>
           <w:rFonts w:ascii="Times New Roman" w:hAnsi="Times New Roman"/>
-          <w:i w:val="0"/>
-          <w:sz w:val="24"/>
-        </w:rPr>
-        <w:t>La calidad del servicio se define como el grado en que las características del servicio prestado satisfacen o superan las expectativas del cliente. Parasuraman, Zeithaml y Berry (1988) desarrollaron el modelo SERVQUAL, que identifica cinco dimensiones de la calidad del servicio: fiabilidad, capacidad de respuesta, seguridad, empatía y elementos tangibles. En el sector de telecomunicaciones, la fiabilidad y la capacidad de respuesta son las dimensiones con mayor peso en la percepción del cliente.</w:t>
+          <w:sz w:val="24"/>
+        </w:rPr>
+        <w:t xml:space="preserve">1. </w:t>
+      </w:r>
+      <w:r>
+        <w:rPr>
+          <w:rFonts w:ascii="Times New Roman" w:hAnsi="Times New Roman"/>
+          <w:b/>
+          <w:sz w:val="24"/>
+        </w:rPr>
+        <w:t xml:space="preserve">Actividad operativa: </w:t>
+      </w:r>
+      <w:r>
+        <w:rPr>
+          <w:rFonts w:ascii="Times New Roman" w:hAnsi="Times New Roman"/>
+          <w:sz w:val="24"/>
+        </w:rPr>
+        <w:t>Apoyo en seguimiento de casos, actualización de registros administrativos y organización de documentación vinculada con solicitudes de servicio.</w:t>
       </w:r>
     </w:p>
     <w:p>
       <w:pPr>
-        <w:spacing w:line="360" w:lineRule="auto" w:after="0" w:before="0"/>
+        <w:spacing w:line="360" w:lineRule="auto"/>
         <w:ind w:firstLine="709"/>
         <w:jc w:val="both"/>
       </w:pPr>
       <w:r>
         <w:rPr>
           <w:rFonts w:ascii="Times New Roman" w:hAnsi="Times New Roman"/>
-          <w:i w:val="0"/>
-          <w:sz w:val="24"/>
-        </w:rPr>
-        <w:t>Las deficiencias en el control administrativo del proceso de solicitudes de servicio impactan directamente sobre la fiabilidad y la capacidad de respuesta de IDETEL. Cuando una solicitud no es gestionada dentro de los tiempos establecidos o su estatus no puede ser verificado en tiempo real, el cliente percibe una falla en la calidad del servicio que deteriora su confianza en la organización y puede derivar en la cancelación del contrato o en la difusión de experiencias negativas.</w:t>
+          <w:sz w:val="24"/>
+        </w:rPr>
+        <w:t xml:space="preserve">2. </w:t>
+      </w:r>
+      <w:r>
+        <w:rPr>
+          <w:rFonts w:ascii="Times New Roman" w:hAnsi="Times New Roman"/>
+          <w:b/>
+          <w:sz w:val="24"/>
+        </w:rPr>
+        <w:t xml:space="preserve">Actividad de investigación: </w:t>
+      </w:r>
+      <w:r>
+        <w:rPr>
+          <w:rFonts w:ascii="Times New Roman" w:hAnsi="Times New Roman"/>
+          <w:sz w:val="24"/>
+        </w:rPr>
+        <w:t>Diseño del nuevo flujo estandarizado para la gestión de solicitudes, estableciendo etapas, responsables, tiempos de referencia y puntos de control desde la recepción hasta el cierre.</w:t>
       </w:r>
     </w:p>
     <w:p>
       <w:pPr>
-        <w:spacing w:line="360" w:lineRule="auto" w:after="0" w:before="0"/>
+        <w:spacing w:before="480" w:after="480" w:line="360" w:lineRule="auto"/>
+        <w:jc w:val="left"/>
+      </w:pPr>
+      <w:r>
+        <w:rPr>
+          <w:rFonts w:ascii="Times New Roman" w:hAnsi="Times New Roman"/>
+          <w:b/>
+          <w:sz w:val="24"/>
+        </w:rPr>
+        <w:t>Semana 8</w:t>
+      </w:r>
+    </w:p>
+    <w:p>
+      <w:pPr>
+        <w:spacing w:line="360" w:lineRule="auto"/>
         <w:ind w:firstLine="709"/>
         <w:jc w:val="both"/>
       </w:pPr>
       <w:r>
         <w:rPr>
           <w:rFonts w:ascii="Times New Roman" w:hAnsi="Times New Roman"/>
-          <w:i w:val="0"/>
-          <w:sz w:val="24"/>
-        </w:rPr>
-        <w:t>Para este estudio, la calidad del servicio se relaciona directamente con la capacidad administrativa de IDETEL para responder y dar seguimiento oportuno a las solicitudes del suscriptor.</w:t>
+          <w:sz w:val="24"/>
+        </w:rPr>
+        <w:t xml:space="preserve">1. </w:t>
+      </w:r>
+      <w:r>
+        <w:rPr>
+          <w:rFonts w:ascii="Times New Roman" w:hAnsi="Times New Roman"/>
+          <w:b/>
+          <w:sz w:val="24"/>
+        </w:rPr>
+        <w:t xml:space="preserve">Actividad operativa: </w:t>
+      </w:r>
+      <w:r>
+        <w:rPr>
+          <w:rFonts w:ascii="Times New Roman" w:hAnsi="Times New Roman"/>
+          <w:sz w:val="24"/>
+        </w:rPr>
+        <w:t>Colaboración en facturación, seguimiento de incidencias y preparación de reportes administrativos del período.</w:t>
       </w:r>
     </w:p>
     <w:p>
       <w:pPr>
+        <w:spacing w:line="360" w:lineRule="auto"/>
+        <w:ind w:firstLine="709"/>
+        <w:jc w:val="both"/>
+      </w:pPr>
+      <w:r>
+        <w:rPr>
+          <w:rFonts w:ascii="Times New Roman" w:hAnsi="Times New Roman"/>
+          <w:sz w:val="24"/>
+        </w:rPr>
+        <w:t xml:space="preserve">2. </w:t>
+      </w:r>
+      <w:r>
+        <w:rPr>
+          <w:rFonts w:ascii="Times New Roman" w:hAnsi="Times New Roman"/>
+          <w:b/>
+          <w:sz w:val="24"/>
+        </w:rPr>
+        <w:t xml:space="preserve">Actividad de investigación: </w:t>
+      </w:r>
+      <w:r>
+        <w:rPr>
+          <w:rFonts w:ascii="Times New Roman" w:hAnsi="Times New Roman"/>
+          <w:sz w:val="24"/>
+        </w:rPr>
+        <w:t>Diseño de formatos estandarizados para afiliaciones e incidencias y redacción del procedimiento de control que acompaña al flujo propuesto.</w:t>
+      </w:r>
+    </w:p>
+    <w:p>
+      <w:pPr>
         <w:spacing w:before="480" w:after="480" w:line="360" w:lineRule="auto"/>
         <w:jc w:val="left"/>
       </w:pPr>
@@ -7504,111 +8227,137 @@
           <w:b/>
           <w:sz w:val="24"/>
         </w:rPr>
-        <w:t>Sistemas de Información para el Control Administrativo</w:t>
+        <w:t>Semana 9</w:t>
       </w:r>
     </w:p>
     <w:p>
       <w:pPr>
-        <w:spacing w:line="360" w:lineRule="auto" w:after="0" w:before="0"/>
+        <w:spacing w:line="360" w:lineRule="auto"/>
         <w:ind w:firstLine="709"/>
         <w:jc w:val="both"/>
       </w:pPr>
       <w:r>
         <w:rPr>
           <w:rFonts w:ascii="Times New Roman" w:hAnsi="Times New Roman"/>
-          <w:i w:val="0"/>
-          <w:sz w:val="24"/>
-        </w:rPr>
-        <w:t>Un sistema de información constituye un conjunto organizado de recursos tecnológicos y procedimentales orientados a la captura, almacenamiento, procesamiento y distribución de datos con el propósito de apoyar la toma de decisiones. Laudon y Laudon (2016) distinguen los sistemas de procesamiento de transacciones como la categoría que registra y gestiona las operaciones rutinarias de la organización, siendo esta la tipología más pertinente para el control de solicitudes de servicio en una empresa de telecomunicaciones.</w:t>
+          <w:sz w:val="24"/>
+        </w:rPr>
+        <w:t xml:space="preserve">1. </w:t>
+      </w:r>
+      <w:r>
+        <w:rPr>
+          <w:rFonts w:ascii="Times New Roman" w:hAnsi="Times New Roman"/>
+          <w:b/>
+          <w:sz w:val="24"/>
+        </w:rPr>
+        <w:t xml:space="preserve">Actividad operativa: </w:t>
+      </w:r>
+      <w:r>
+        <w:rPr>
+          <w:rFonts w:ascii="Times New Roman" w:hAnsi="Times New Roman"/>
+          <w:sz w:val="24"/>
+        </w:rPr>
+        <w:t>Participación en las actividades regulares de Administración y apoyo en el cierre y seguimiento de casos correspondientes al período de pasantías.</w:t>
       </w:r>
     </w:p>
     <w:p>
       <w:pPr>
-        <w:spacing w:line="360" w:lineRule="auto" w:after="0" w:before="0"/>
+        <w:spacing w:line="360" w:lineRule="auto"/>
         <w:ind w:firstLine="709"/>
         <w:jc w:val="both"/>
       </w:pPr>
       <w:r>
         <w:rPr>
           <w:rFonts w:ascii="Times New Roman" w:hAnsi="Times New Roman"/>
-          <w:i w:val="0"/>
-          <w:sz w:val="24"/>
-        </w:rPr>
-        <w:t>La implementación de un sistema de tickets o plataforma de seguimiento de solicitudes en IDETEL permitiría centralizar el registro de cada caso, asignar responsables, definir tiempos de atención y generar alertas ante incumplimientos. Esta herramienta transformaría el control administrativo de reactivo a proactivo, dotando a la supervisión de información en tiempo real para la toma de decisiones y la evaluación continua del desempeño del proceso.</w:t>
+          <w:sz w:val="24"/>
+        </w:rPr>
+        <w:t xml:space="preserve">2. </w:t>
+      </w:r>
+      <w:r>
+        <w:rPr>
+          <w:rFonts w:ascii="Times New Roman" w:hAnsi="Times New Roman"/>
+          <w:b/>
+          <w:sz w:val="24"/>
+        </w:rPr>
+        <w:t xml:space="preserve">Actividad de investigación: </w:t>
+      </w:r>
+      <w:r>
+        <w:rPr>
+          <w:rFonts w:ascii="Times New Roman" w:hAnsi="Times New Roman"/>
+          <w:sz w:val="24"/>
+        </w:rPr>
+        <w:t>Redacción y validación de la propuesta de mejora con el tutor industrial, incorporación de observaciones y preparación del flujograma definitivo del proceso propuesto.</w:t>
       </w:r>
     </w:p>
     <w:p>
       <w:pPr>
-        <w:spacing w:line="360" w:lineRule="auto" w:after="0" w:before="0"/>
+        <w:spacing w:before="480" w:after="480" w:line="360" w:lineRule="auto"/>
+        <w:jc w:val="left"/>
+      </w:pPr>
+      <w:r>
+        <w:rPr>
+          <w:rFonts w:ascii="Times New Roman" w:hAnsi="Times New Roman"/>
+          <w:b/>
+          <w:sz w:val="24"/>
+        </w:rPr>
+        <w:t>Semana 10</w:t>
+      </w:r>
+    </w:p>
+    <w:p>
+      <w:pPr>
+        <w:spacing w:line="360" w:lineRule="auto"/>
         <w:ind w:firstLine="709"/>
         <w:jc w:val="both"/>
       </w:pPr>
       <w:r>
         <w:rPr>
           <w:rFonts w:ascii="Times New Roman" w:hAnsi="Times New Roman"/>
-          <w:i w:val="0"/>
-          <w:sz w:val="24"/>
-        </w:rPr>
-        <w:t>Desde la posición del autor, una herramienta de seguimiento centralizada es viable para IDETEL porque permite mejorar la trazabilidad sin modificar la naturaleza de los servicios que presta la empresa.</w:t>
+          <w:sz w:val="24"/>
+        </w:rPr>
+        <w:t xml:space="preserve">1. </w:t>
+      </w:r>
+      <w:r>
+        <w:rPr>
+          <w:rFonts w:ascii="Times New Roman" w:hAnsi="Times New Roman"/>
+          <w:b/>
+          <w:sz w:val="24"/>
+        </w:rPr>
+        <w:t xml:space="preserve">Actividad operativa: </w:t>
+      </w:r>
+      <w:r>
+        <w:rPr>
+          <w:rFonts w:ascii="Times New Roman" w:hAnsi="Times New Roman"/>
+          <w:sz w:val="24"/>
+        </w:rPr>
+        <w:t>Presentación de los resultados y de la propuesta ante la supervisión del área, gestión de los recaudos de cierre y organización final de la documentación de pasantías.</w:t>
       </w:r>
     </w:p>
     <w:p>
       <w:pPr>
-        <w:spacing w:before="480" w:after="480" w:line="360" w:lineRule="auto"/>
-        <w:jc w:val="left"/>
-      </w:pPr>
-      <w:r>
-        <w:rPr>
-          <w:rFonts w:ascii="Times New Roman" w:hAnsi="Times New Roman"/>
-          <w:b/>
-          <w:sz w:val="24"/>
-        </w:rPr>
-        <w:t>Proyecto Factible como Modalidad de Investigación</w:t>
-      </w:r>
-    </w:p>
-    <w:p>
-      <w:pPr>
-        <w:spacing w:line="360" w:lineRule="auto" w:after="0" w:before="0"/>
+        <w:spacing w:line="360" w:lineRule="auto"/>
         <w:ind w:firstLine="709"/>
         <w:jc w:val="both"/>
       </w:pPr>
       <w:r>
         <w:rPr>
           <w:rFonts w:ascii="Times New Roman" w:hAnsi="Times New Roman"/>
-          <w:i w:val="0"/>
-          <w:sz w:val="24"/>
-        </w:rPr>
-        <w:t>La Universidad Pedagógica Experimental Libertador (UPEL, 2016) define el proyecto factible como la investigación, elaboración y desarrollo de una propuesta de un modelo operativo viable para solucionar problemas, requerimientos o necesidades de organizaciones o grupos sociales. Esta modalidad exige un diagnóstico de campo que evidencie la situación deficitaria y la comprobación de la viabilidad técnica y operativa de la solución planteada.</w:t>
-      </w:r>
-    </w:p>
-    <w:p>
-      <w:pPr>
-        <w:spacing w:line="360" w:lineRule="auto" w:after="0" w:before="0"/>
-        <w:ind w:firstLine="709"/>
-        <w:jc w:val="both"/>
-      </w:pPr>
-      <w:r>
-        <w:rPr>
-          <w:rFonts w:ascii="Times New Roman" w:hAnsi="Times New Roman"/>
-          <w:i w:val="0"/>
-          <w:sz w:val="24"/>
-        </w:rPr>
-        <w:t>Arias (2012) señala que el proyecto factible avanza hasta proponer y en muchos casos desarrollar la solución, demostrando su aplicabilidad en el contexto real. El presente trabajo se enmarca en esta modalidad al partir de la evaluación del control administrativo de IDETEL para proponer mejoras procedimentales cuya implementación es viable dentro de la estructura organizativa y los recursos disponibles de la empresa.</w:t>
-      </w:r>
-    </w:p>
-    <w:p>
-      <w:pPr>
-        <w:spacing w:line="360" w:lineRule="auto" w:after="0" w:before="0"/>
-        <w:ind w:firstLine="709"/>
-        <w:jc w:val="both"/>
-      </w:pPr>
-      <w:r>
-        <w:rPr>
-          <w:rFonts w:ascii="Times New Roman" w:hAnsi="Times New Roman"/>
-          <w:i w:val="0"/>
-          <w:sz w:val="24"/>
-        </w:rPr>
-        <w:t>La elección del proyecto factible responde a la necesidad de transformar el diagnóstico realizado en procedimientos y formatos aplicables a la realidad operativa de IDETEL.</w:t>
+          <w:sz w:val="24"/>
+        </w:rPr>
+        <w:t xml:space="preserve">2. </w:t>
+      </w:r>
+      <w:r>
+        <w:rPr>
+          <w:rFonts w:ascii="Times New Roman" w:hAnsi="Times New Roman"/>
+          <w:b/>
+          <w:sz w:val="24"/>
+        </w:rPr>
+        <w:t xml:space="preserve">Actividad de investigación: </w:t>
+      </w:r>
+      <w:r>
+        <w:rPr>
+          <w:rFonts w:ascii="Times New Roman" w:hAnsi="Times New Roman"/>
+          <w:sz w:val="24"/>
+        </w:rPr>
+        <w:t>Consolidación del informe académico, revisión de la normativa IUTECP, incorporación de anexos y correcciones finales para la entrega institucional.</w:t>
       </w:r>
     </w:p>
     <w:p>
@@ -7635,11 +8384,11 @@
           <w:b/>
           <w:sz w:val="24"/>
         </w:rPr>
-        <w:t>CAPÍTULO IV</w:t>
+        <w:t>CAPÍTULO V</w:t>
       </w:r>
     </w:p>
     <w:p>
-      <w:bookmarkStart w:id="bm_cap4" w:name="bm_cap4"/>
+      <w:bookmarkStart w:id="bm_cap5" w:name="bm_cap5"/>
       <w:pPr>
         <w:spacing w:before="480"/>
         <w:jc w:val="center"/>
@@ -7650,9 +8399,9 @@
           <w:b/>
           <w:sz w:val="24"/>
         </w:rPr>
-        <w:t>ACTIVIDADES REALIZADAS</w:t>
-      </w:r>
-      <w:bookmarkEnd w:id="bm_cap4"/>
+        <w:t>CONCLUSIONES Y RECOMENDACIONES</w:t>
+      </w:r>
+      <w:bookmarkEnd w:id="bm_cap5"/>
     </w:p>
     <w:p>
       <w:pPr>
@@ -7667,7 +8416,7 @@
       </w:pPr>
     </w:p>
     <w:p>
-      <w:bookmarkStart w:id="bm_cap4_desc" w:name="bm_cap4_desc"/>
+      <w:bookmarkStart w:id="bm_cap5_concl" w:name="bm_cap5_concl"/>
       <w:pPr>
         <w:spacing w:before="480" w:after="480" w:line="360" w:lineRule="auto"/>
         <w:jc w:val="left"/>
@@ -7678,38 +8427,9 @@
           <w:b/>
           <w:sz w:val="24"/>
         </w:rPr>
-        <w:t>Descripción de Actividades Ejecutadas por Semana</w:t>
-      </w:r>
-      <w:bookmarkEnd w:id="bm_cap4_desc"/>
-    </w:p>
-    <w:p>
-      <w:pPr>
-        <w:spacing w:line="360" w:lineRule="auto" w:after="0" w:before="0"/>
-        <w:ind w:firstLine="709"/>
-        <w:jc w:val="both"/>
-      </w:pPr>
-      <w:r>
-        <w:rPr>
-          <w:rFonts w:ascii="Times New Roman" w:hAnsi="Times New Roman"/>
-          <w:i w:val="0"/>
-          <w:sz w:val="24"/>
-        </w:rPr>
-        <w:t>Durante las diez (10) semanas de pasantías se desarrollaron actividades operativas y de análisis mediante una rotación inicial por Atención al Cliente y una segunda etapa de apoyo en Administración:</w:t>
-      </w:r>
-    </w:p>
-    <w:p>
-      <w:pPr>
-        <w:spacing w:before="480" w:after="480" w:line="360" w:lineRule="auto"/>
-        <w:jc w:val="left"/>
-      </w:pPr>
-      <w:r>
-        <w:rPr>
-          <w:rFonts w:ascii="Times New Roman" w:hAnsi="Times New Roman"/>
-          <w:b/>
-          <w:sz w:val="24"/>
-        </w:rPr>
-        <w:t>Semana 1</w:t>
-      </w:r>
+        <w:t>Conclusiones</w:t>
+      </w:r>
+      <w:bookmarkEnd w:id="bm_cap5_concl"/>
     </w:p>
     <w:p>
       <w:pPr>
@@ -7727,17 +8447,9 @@
       <w:r>
         <w:rPr>
           <w:rFonts w:ascii="Times New Roman" w:hAnsi="Times New Roman"/>
-          <w:b/>
-          <w:sz w:val="24"/>
-        </w:rPr>
-        <w:t xml:space="preserve">Actividad operativa: </w:t>
-      </w:r>
-      <w:r>
-        <w:rPr>
-          <w:rFonts w:ascii="Times New Roman" w:hAnsi="Times New Roman"/>
-          <w:sz w:val="24"/>
-        </w:rPr>
-        <w:t>Inducción institucional y rotación inicial por Atención al Cliente, reconocimiento de los tipos de solicitudes recibidas, revisión del proceso de registro de pagos y familiarización con la información utilizada para atender a los suscriptores.</w:t>
+          <w:sz w:val="24"/>
+        </w:rPr>
+        <w:t>Se describió el proceso actual de gestión de solicitudes de IDETEL, identificando que la información se origina en Atención al Cliente y continúa hacia Administración y las áreas técnicas, sin contar con un procedimiento único que establezca de forma visible el recorrido completo del caso.</w:t>
       </w:r>
     </w:p>
     <w:p>
@@ -7756,31 +8468,9 @@
       <w:r>
         <w:rPr>
           <w:rFonts w:ascii="Times New Roman" w:hAnsi="Times New Roman"/>
-          <w:b/>
-          <w:sz w:val="24"/>
-        </w:rPr>
-        <w:t xml:space="preserve">Actividad de investigación: </w:t>
-      </w:r>
-      <w:r>
-        <w:rPr>
-          <w:rFonts w:ascii="Times New Roman" w:hAnsi="Times New Roman"/>
-          <w:sz w:val="24"/>
-        </w:rPr>
-        <w:t>Observación directa del punto de inicio de las solicitudes de afiliación e incidencias, identificando los datos que se generan en Atención al Cliente y la forma en que son comunicados a otras áreas.</w:t>
-      </w:r>
-    </w:p>
-    <w:p>
-      <w:pPr>
-        <w:spacing w:before="480" w:after="480" w:line="360" w:lineRule="auto"/>
-        <w:jc w:val="left"/>
-      </w:pPr>
-      <w:r>
-        <w:rPr>
-          <w:rFonts w:ascii="Times New Roman" w:hAnsi="Times New Roman"/>
-          <w:b/>
-          <w:sz w:val="24"/>
-        </w:rPr>
-        <w:t>Semana 2</w:t>
+          <w:sz w:val="24"/>
+        </w:rPr>
+        <w:t>Se identificaron como principales deficiencias la falta de formatos uniformes, la actualización no centralizada del estatus, la ausencia de tiempos de referencia por etapa y las dificultades de comunicación entre las áreas que participan en afiliaciones e incidencias.</w:t>
       </w:r>
     </w:p>
     <w:p>
@@ -7794,22 +8484,14 @@
           <w:rFonts w:ascii="Times New Roman" w:hAnsi="Times New Roman"/>
           <w:sz w:val="24"/>
         </w:rPr>
-        <w:t xml:space="preserve">1. </w:t>
-      </w:r>
-      <w:r>
-        <w:rPr>
-          <w:rFonts w:ascii="Times New Roman" w:hAnsi="Times New Roman"/>
-          <w:b/>
-          <w:sz w:val="24"/>
-        </w:rPr>
-        <w:t xml:space="preserve">Actividad operativa: </w:t>
-      </w:r>
-      <w:r>
-        <w:rPr>
-          <w:rFonts w:ascii="Times New Roman" w:hAnsi="Times New Roman"/>
-          <w:sz w:val="24"/>
-        </w:rPr>
-        <w:t>Apoyo en Atención al Cliente mediante recepción y registro de pagos, verificación de datos básicos de suscriptores y orientación inicial sobre solicitudes e incidencias reportadas.</w:t>
+        <w:t xml:space="preserve">3. </w:t>
+      </w:r>
+      <w:r>
+        <w:rPr>
+          <w:rFonts w:ascii="Times New Roman" w:hAnsi="Times New Roman"/>
+          <w:sz w:val="24"/>
+        </w:rPr>
+        <w:t>Se determinó que estas debilidades afectan la trazabilidad y pueden prolongar los tiempos de respuesta, debido a que el personal debe verificar información en distintos registros antes de informar el estado de una solicitud o confirmar su cierre.</w:t>
       </w:r>
     </w:p>
     <w:p>
@@ -7823,25 +8505,18 @@
           <w:rFonts w:ascii="Times New Roman" w:hAnsi="Times New Roman"/>
           <w:sz w:val="24"/>
         </w:rPr>
-        <w:t xml:space="preserve">2. </w:t>
-      </w:r>
-      <w:r>
-        <w:rPr>
-          <w:rFonts w:ascii="Times New Roman" w:hAnsi="Times New Roman"/>
-          <w:b/>
-          <w:sz w:val="24"/>
-        </w:rPr>
-        <w:t xml:space="preserve">Actividad de investigación: </w:t>
-      </w:r>
-      <w:r>
-        <w:rPr>
-          <w:rFonts w:ascii="Times New Roman" w:hAnsi="Times New Roman"/>
-          <w:sz w:val="24"/>
-        </w:rPr>
-        <w:t>Levantamiento del recorrido de las solicitudes desde su recepción, revisión de registros disponibles y elaboración de un esquema preliminar de las etapas y áreas que intervienen en cada tipo de caso.</w:t>
+        <w:t xml:space="preserve">4. </w:t>
+      </w:r>
+      <w:r>
+        <w:rPr>
+          <w:rFonts w:ascii="Times New Roman" w:hAnsi="Times New Roman"/>
+          <w:sz w:val="24"/>
+        </w:rPr>
+        <w:t>Se formuló una propuesta de mejora que incorpora un flujo estandarizado, responsables por etapa, formatos de registro y mecanismos básicos de seguimiento, orientados a facilitar el control administrativo y la continuidad de la atención al suscriptor.</w:t>
       </w:r>
     </w:p>
     <w:p>
+      <w:bookmarkStart w:id="bm_cap5_recom" w:name="bm_cap5_recom"/>
       <w:pPr>
         <w:spacing w:before="480" w:after="480" w:line="360" w:lineRule="auto"/>
         <w:jc w:val="left"/>
@@ -7852,8 +8527,9 @@
           <w:b/>
           <w:sz w:val="24"/>
         </w:rPr>
-        <w:t>Semana 3</w:t>
-      </w:r>
+        <w:t>Recomendaciones</w:t>
+      </w:r>
+      <w:bookmarkEnd w:id="bm_cap5_recom"/>
     </w:p>
     <w:p>
       <w:pPr>
@@ -7871,17 +8547,9 @@
       <w:r>
         <w:rPr>
           <w:rFonts w:ascii="Times New Roman" w:hAnsi="Times New Roman"/>
-          <w:b/>
-          <w:sz w:val="24"/>
-        </w:rPr>
-        <w:t xml:space="preserve">Actividad operativa: </w:t>
-      </w:r>
-      <w:r>
-        <w:rPr>
-          <w:rFonts w:ascii="Times New Roman" w:hAnsi="Times New Roman"/>
-          <w:sz w:val="24"/>
-        </w:rPr>
-        <w:t>Continuación del apoyo en Atención al Cliente, registro de pagos y solicitudes, actualización de información básica y seguimiento inicial de casos remitidos a otras áreas.</w:t>
+          <w:sz w:val="24"/>
+        </w:rPr>
+        <w:t>Implementar progresivamente el flujo estandarizado propuesto y verificar su funcionamiento con un grupo controlado de solicitudes antes de aplicarlo a todos los casos.</w:t>
       </w:r>
     </w:p>
     <w:p>
@@ -7900,31 +8568,9 @@
       <w:r>
         <w:rPr>
           <w:rFonts w:ascii="Times New Roman" w:hAnsi="Times New Roman"/>
-          <w:b/>
-          <w:sz w:val="24"/>
-        </w:rPr>
-        <w:t xml:space="preserve">Actividad de investigación: </w:t>
-      </w:r>
-      <w:r>
-        <w:rPr>
-          <w:rFonts w:ascii="Times New Roman" w:hAnsi="Times New Roman"/>
-          <w:sz w:val="24"/>
-        </w:rPr>
-        <w:t>Diseño de una guía de entrevista estructurada y revisión del flujo observado para precisar los puntos donde se pierde continuidad o se dificulta conocer el estatus de las solicitudes.</w:t>
-      </w:r>
-    </w:p>
-    <w:p>
-      <w:pPr>
-        <w:spacing w:before="480" w:after="480" w:line="360" w:lineRule="auto"/>
-        <w:jc w:val="left"/>
-      </w:pPr>
-      <w:r>
-        <w:rPr>
-          <w:rFonts w:ascii="Times New Roman" w:hAnsi="Times New Roman"/>
-          <w:b/>
-          <w:sz w:val="24"/>
-        </w:rPr>
-        <w:t>Semana 4</w:t>
+          <w:sz w:val="24"/>
+        </w:rPr>
+        <w:t>Utilizar de manera uniforme los formatos de registro de afiliaciones e incidencias y definir claramente el responsable de actualizar el estatus en cada etapa.</w:t>
       </w:r>
     </w:p>
     <w:p>
@@ -7938,22 +8584,14 @@
           <w:rFonts w:ascii="Times New Roman" w:hAnsi="Times New Roman"/>
           <w:sz w:val="24"/>
         </w:rPr>
-        <w:t xml:space="preserve">1. </w:t>
-      </w:r>
-      <w:r>
-        <w:rPr>
-          <w:rFonts w:ascii="Times New Roman" w:hAnsi="Times New Roman"/>
-          <w:b/>
-          <w:sz w:val="24"/>
-        </w:rPr>
-        <w:t xml:space="preserve">Actividad operativa: </w:t>
-      </w:r>
-      <w:r>
-        <w:rPr>
-          <w:rFonts w:ascii="Times New Roman" w:hAnsi="Times New Roman"/>
-          <w:sz w:val="24"/>
-        </w:rPr>
-        <w:t>Inicio de la rotación por Administración con apoyo en procesamiento de pagos, facturación, revisión de documentación y seguimiento administrativo de solicitudes activas.</w:t>
+        <w:t xml:space="preserve">3. </w:t>
+      </w:r>
+      <w:r>
+        <w:rPr>
+          <w:rFonts w:ascii="Times New Roman" w:hAnsi="Times New Roman"/>
+          <w:sz w:val="24"/>
+        </w:rPr>
+        <w:t>Registrar y revisar periódicamente tiempos de respuesta, solicitudes pendientes y casos cerrados para identificar retrasos recurrentes y aplicar acciones correctivas.</w:t>
       </w:r>
     </w:p>
     <w:p>
@@ -7967,454 +8605,14 @@
           <w:rFonts w:ascii="Times New Roman" w:hAnsi="Times New Roman"/>
           <w:sz w:val="24"/>
         </w:rPr>
-        <w:t xml:space="preserve">2. </w:t>
-      </w:r>
-      <w:r>
-        <w:rPr>
-          <w:rFonts w:ascii="Times New Roman" w:hAnsi="Times New Roman"/>
-          <w:b/>
-          <w:sz w:val="24"/>
-        </w:rPr>
-        <w:t xml:space="preserve">Actividad de investigación: </w:t>
-      </w:r>
-      <w:r>
-        <w:rPr>
-          <w:rFonts w:ascii="Times New Roman" w:hAnsi="Times New Roman"/>
-          <w:sz w:val="24"/>
-        </w:rPr>
-        <w:t>Aplicación de entrevistas estructuradas al personal vinculado con Administración, Atención al Cliente y áreas relacionadas, registrando las principales fallas percibidas en comunicación, control y seguimiento.</w:t>
-      </w:r>
-    </w:p>
-    <w:p>
-      <w:pPr>
-        <w:spacing w:before="480" w:after="480" w:line="360" w:lineRule="auto"/>
-        <w:jc w:val="left"/>
-      </w:pPr>
-      <w:r>
-        <w:rPr>
-          <w:rFonts w:ascii="Times New Roman" w:hAnsi="Times New Roman"/>
-          <w:b/>
-          <w:sz w:val="24"/>
-        </w:rPr>
-        <w:t>Semana 5</w:t>
-      </w:r>
-    </w:p>
-    <w:p>
-      <w:pPr>
-        <w:spacing w:line="360" w:lineRule="auto"/>
-        <w:ind w:firstLine="709"/>
-        <w:jc w:val="both"/>
-      </w:pPr>
-      <w:r>
-        <w:rPr>
-          <w:rFonts w:ascii="Times New Roman" w:hAnsi="Times New Roman"/>
-          <w:sz w:val="24"/>
-        </w:rPr>
-        <w:t xml:space="preserve">1. </w:t>
-      </w:r>
-      <w:r>
-        <w:rPr>
-          <w:rFonts w:ascii="Times New Roman" w:hAnsi="Times New Roman"/>
-          <w:b/>
-          <w:sz w:val="24"/>
-        </w:rPr>
-        <w:t xml:space="preserve">Actividad operativa: </w:t>
-      </w:r>
-      <w:r>
-        <w:rPr>
-          <w:rFonts w:ascii="Times New Roman" w:hAnsi="Times New Roman"/>
-          <w:sz w:val="24"/>
-        </w:rPr>
-        <w:t>Apoyo en tareas administrativas de facturación, actualización de registros y verificación del cierre de solicitudes e incidencias correspondientes al período.</w:t>
-      </w:r>
-    </w:p>
-    <w:p>
-      <w:pPr>
-        <w:spacing w:line="360" w:lineRule="auto"/>
-        <w:ind w:firstLine="709"/>
-        <w:jc w:val="both"/>
-      </w:pPr>
-      <w:r>
-        <w:rPr>
-          <w:rFonts w:ascii="Times New Roman" w:hAnsi="Times New Roman"/>
-          <w:sz w:val="24"/>
-        </w:rPr>
-        <w:t xml:space="preserve">2. </w:t>
-      </w:r>
-      <w:r>
-        <w:rPr>
-          <w:rFonts w:ascii="Times New Roman" w:hAnsi="Times New Roman"/>
-          <w:b/>
-          <w:sz w:val="24"/>
-        </w:rPr>
-        <w:t xml:space="preserve">Actividad de investigación: </w:t>
-      </w:r>
-      <w:r>
-        <w:rPr>
-          <w:rFonts w:ascii="Times New Roman" w:hAnsi="Times New Roman"/>
-          <w:sz w:val="24"/>
-        </w:rPr>
-        <w:t>Organización de los hallazgos del diagnóstico y elaboración del diagrama de Ishikawa para representar las causas relacionadas con procedimiento, comunicación, registro y seguimiento; inicio de la revisión de bases teóricas.</w:t>
-      </w:r>
-    </w:p>
-    <w:p>
-      <w:pPr>
-        <w:spacing w:before="480" w:after="480" w:line="360" w:lineRule="auto"/>
-        <w:jc w:val="left"/>
-      </w:pPr>
-      <w:r>
-        <w:rPr>
-          <w:rFonts w:ascii="Times New Roman" w:hAnsi="Times New Roman"/>
-          <w:b/>
-          <w:sz w:val="24"/>
-        </w:rPr>
-        <w:t>Semana 6</w:t>
-      </w:r>
-    </w:p>
-    <w:p>
-      <w:pPr>
-        <w:spacing w:line="360" w:lineRule="auto"/>
-        <w:ind w:firstLine="709"/>
-        <w:jc w:val="both"/>
-      </w:pPr>
-      <w:r>
-        <w:rPr>
-          <w:rFonts w:ascii="Times New Roman" w:hAnsi="Times New Roman"/>
-          <w:sz w:val="24"/>
-        </w:rPr>
-        <w:t xml:space="preserve">1. </w:t>
-      </w:r>
-      <w:r>
-        <w:rPr>
-          <w:rFonts w:ascii="Times New Roman" w:hAnsi="Times New Roman"/>
-          <w:b/>
-          <w:sz w:val="24"/>
-        </w:rPr>
-        <w:t xml:space="preserve">Actividad operativa: </w:t>
-      </w:r>
-      <w:r>
-        <w:rPr>
-          <w:rFonts w:ascii="Times New Roman" w:hAnsi="Times New Roman"/>
-          <w:sz w:val="24"/>
-        </w:rPr>
-        <w:t>Procesamiento de pagos y documentos administrativos, apoyo en facturación y elaboración de reportes básicos requeridos por la supervisión.</w:t>
-      </w:r>
-    </w:p>
-    <w:p>
-      <w:pPr>
-        <w:spacing w:line="360" w:lineRule="auto"/>
-        <w:ind w:firstLine="709"/>
-        <w:jc w:val="both"/>
-      </w:pPr>
-      <w:r>
-        <w:rPr>
-          <w:rFonts w:ascii="Times New Roman" w:hAnsi="Times New Roman"/>
-          <w:sz w:val="24"/>
-        </w:rPr>
-        <w:t xml:space="preserve">2. </w:t>
-      </w:r>
-      <w:r>
-        <w:rPr>
-          <w:rFonts w:ascii="Times New Roman" w:hAnsi="Times New Roman"/>
-          <w:b/>
-          <w:sz w:val="24"/>
-        </w:rPr>
-        <w:t xml:space="preserve">Actividad de investigación: </w:t>
-      </w:r>
-      <w:r>
-        <w:rPr>
-          <w:rFonts w:ascii="Times New Roman" w:hAnsi="Times New Roman"/>
-          <w:sz w:val="24"/>
-        </w:rPr>
-        <w:t>Análisis del impacto de las deficiencias identificadas sobre los tiempos de respuesta, la trazabilidad y la atención al suscriptor, complementando el desarrollo del marco teórico.</w:t>
-      </w:r>
-    </w:p>
-    <w:p>
-      <w:pPr>
-        <w:spacing w:before="480" w:after="480" w:line="360" w:lineRule="auto"/>
-        <w:jc w:val="left"/>
-      </w:pPr>
-      <w:r>
-        <w:rPr>
-          <w:rFonts w:ascii="Times New Roman" w:hAnsi="Times New Roman"/>
-          <w:b/>
-          <w:sz w:val="24"/>
-        </w:rPr>
-        <w:t>Semana 7</w:t>
-      </w:r>
-    </w:p>
-    <w:p>
-      <w:pPr>
-        <w:spacing w:line="360" w:lineRule="auto"/>
-        <w:ind w:firstLine="709"/>
-        <w:jc w:val="both"/>
-      </w:pPr>
-      <w:r>
-        <w:rPr>
-          <w:rFonts w:ascii="Times New Roman" w:hAnsi="Times New Roman"/>
-          <w:sz w:val="24"/>
-        </w:rPr>
-        <w:t xml:space="preserve">1. </w:t>
-      </w:r>
-      <w:r>
-        <w:rPr>
-          <w:rFonts w:ascii="Times New Roman" w:hAnsi="Times New Roman"/>
-          <w:b/>
-          <w:sz w:val="24"/>
-        </w:rPr>
-        <w:t xml:space="preserve">Actividad operativa: </w:t>
-      </w:r>
-      <w:r>
-        <w:rPr>
-          <w:rFonts w:ascii="Times New Roman" w:hAnsi="Times New Roman"/>
-          <w:sz w:val="24"/>
-        </w:rPr>
-        <w:t>Apoyo en seguimiento de casos, actualización de registros administrativos y organización de documentación vinculada con solicitudes de servicio.</w:t>
-      </w:r>
-    </w:p>
-    <w:p>
-      <w:pPr>
-        <w:spacing w:line="360" w:lineRule="auto"/>
-        <w:ind w:firstLine="709"/>
-        <w:jc w:val="both"/>
-      </w:pPr>
-      <w:r>
-        <w:rPr>
-          <w:rFonts w:ascii="Times New Roman" w:hAnsi="Times New Roman"/>
-          <w:sz w:val="24"/>
-        </w:rPr>
-        <w:t xml:space="preserve">2. </w:t>
-      </w:r>
-      <w:r>
-        <w:rPr>
-          <w:rFonts w:ascii="Times New Roman" w:hAnsi="Times New Roman"/>
-          <w:b/>
-          <w:sz w:val="24"/>
-        </w:rPr>
-        <w:t xml:space="preserve">Actividad de investigación: </w:t>
-      </w:r>
-      <w:r>
-        <w:rPr>
-          <w:rFonts w:ascii="Times New Roman" w:hAnsi="Times New Roman"/>
-          <w:sz w:val="24"/>
-        </w:rPr>
-        <w:t>Diseño del nuevo flujo estandarizado para la gestión de solicitudes, estableciendo etapas, responsables, tiempos de referencia y puntos de control desde la recepción hasta el cierre.</w:t>
-      </w:r>
-    </w:p>
-    <w:p>
-      <w:pPr>
-        <w:spacing w:before="480" w:after="480" w:line="360" w:lineRule="auto"/>
-        <w:jc w:val="left"/>
-      </w:pPr>
-      <w:r>
-        <w:rPr>
-          <w:rFonts w:ascii="Times New Roman" w:hAnsi="Times New Roman"/>
-          <w:b/>
-          <w:sz w:val="24"/>
-        </w:rPr>
-        <w:t>Semana 8</w:t>
-      </w:r>
-    </w:p>
-    <w:p>
-      <w:pPr>
-        <w:spacing w:line="360" w:lineRule="auto"/>
-        <w:ind w:firstLine="709"/>
-        <w:jc w:val="both"/>
-      </w:pPr>
-      <w:r>
-        <w:rPr>
-          <w:rFonts w:ascii="Times New Roman" w:hAnsi="Times New Roman"/>
-          <w:sz w:val="24"/>
-        </w:rPr>
-        <w:t xml:space="preserve">1. </w:t>
-      </w:r>
-      <w:r>
-        <w:rPr>
-          <w:rFonts w:ascii="Times New Roman" w:hAnsi="Times New Roman"/>
-          <w:b/>
-          <w:sz w:val="24"/>
-        </w:rPr>
-        <w:t xml:space="preserve">Actividad operativa: </w:t>
-      </w:r>
-      <w:r>
-        <w:rPr>
-          <w:rFonts w:ascii="Times New Roman" w:hAnsi="Times New Roman"/>
-          <w:sz w:val="24"/>
-        </w:rPr>
-        <w:t>Colaboración en facturación, seguimiento de incidencias y preparación de reportes administrativos del período.</w:t>
-      </w:r>
-    </w:p>
-    <w:p>
-      <w:pPr>
-        <w:spacing w:line="360" w:lineRule="auto"/>
-        <w:ind w:firstLine="709"/>
-        <w:jc w:val="both"/>
-      </w:pPr>
-      <w:r>
-        <w:rPr>
-          <w:rFonts w:ascii="Times New Roman" w:hAnsi="Times New Roman"/>
-          <w:sz w:val="24"/>
-        </w:rPr>
-        <w:t xml:space="preserve">2. </w:t>
-      </w:r>
-      <w:r>
-        <w:rPr>
-          <w:rFonts w:ascii="Times New Roman" w:hAnsi="Times New Roman"/>
-          <w:b/>
-          <w:sz w:val="24"/>
-        </w:rPr>
-        <w:t xml:space="preserve">Actividad de investigación: </w:t>
-      </w:r>
-      <w:r>
-        <w:rPr>
-          <w:rFonts w:ascii="Times New Roman" w:hAnsi="Times New Roman"/>
-          <w:sz w:val="24"/>
-        </w:rPr>
-        <w:t>Diseño de formatos estandarizados para afiliaciones e incidencias y redacción del procedimiento de control que acompaña al flujo propuesto.</w:t>
-      </w:r>
-    </w:p>
-    <w:p>
-      <w:pPr>
-        <w:spacing w:before="480" w:after="480" w:line="360" w:lineRule="auto"/>
-        <w:jc w:val="left"/>
-      </w:pPr>
-      <w:r>
-        <w:rPr>
-          <w:rFonts w:ascii="Times New Roman" w:hAnsi="Times New Roman"/>
-          <w:b/>
-          <w:sz w:val="24"/>
-        </w:rPr>
-        <w:t>Semana 9</w:t>
-      </w:r>
-    </w:p>
-    <w:p>
-      <w:pPr>
-        <w:spacing w:line="360" w:lineRule="auto"/>
-        <w:ind w:firstLine="709"/>
-        <w:jc w:val="both"/>
-      </w:pPr>
-      <w:r>
-        <w:rPr>
-          <w:rFonts w:ascii="Times New Roman" w:hAnsi="Times New Roman"/>
-          <w:sz w:val="24"/>
-        </w:rPr>
-        <w:t xml:space="preserve">1. </w:t>
-      </w:r>
-      <w:r>
-        <w:rPr>
-          <w:rFonts w:ascii="Times New Roman" w:hAnsi="Times New Roman"/>
-          <w:b/>
-          <w:sz w:val="24"/>
-        </w:rPr>
-        <w:t xml:space="preserve">Actividad operativa: </w:t>
-      </w:r>
-      <w:r>
-        <w:rPr>
-          <w:rFonts w:ascii="Times New Roman" w:hAnsi="Times New Roman"/>
-          <w:sz w:val="24"/>
-        </w:rPr>
-        <w:t>Participación en las actividades regulares de Administración y apoyo en el cierre y seguimiento de casos correspondientes al período de pasantías.</w:t>
-      </w:r>
-    </w:p>
-    <w:p>
-      <w:pPr>
-        <w:spacing w:line="360" w:lineRule="auto"/>
-        <w:ind w:firstLine="709"/>
-        <w:jc w:val="both"/>
-      </w:pPr>
-      <w:r>
-        <w:rPr>
-          <w:rFonts w:ascii="Times New Roman" w:hAnsi="Times New Roman"/>
-          <w:sz w:val="24"/>
-        </w:rPr>
-        <w:t xml:space="preserve">2. </w:t>
-      </w:r>
-      <w:r>
-        <w:rPr>
-          <w:rFonts w:ascii="Times New Roman" w:hAnsi="Times New Roman"/>
-          <w:b/>
-          <w:sz w:val="24"/>
-        </w:rPr>
-        <w:t xml:space="preserve">Actividad de investigación: </w:t>
-      </w:r>
-      <w:r>
-        <w:rPr>
-          <w:rFonts w:ascii="Times New Roman" w:hAnsi="Times New Roman"/>
-          <w:sz w:val="24"/>
-        </w:rPr>
-        <w:t>Redacción y validación de la propuesta de mejora con el tutor industrial, incorporación de observaciones y preparación del flujograma definitivo del proceso propuesto.</w:t>
-      </w:r>
-    </w:p>
-    <w:p>
-      <w:pPr>
-        <w:spacing w:before="480" w:after="480" w:line="360" w:lineRule="auto"/>
-        <w:jc w:val="left"/>
-      </w:pPr>
-      <w:r>
-        <w:rPr>
-          <w:rFonts w:ascii="Times New Roman" w:hAnsi="Times New Roman"/>
-          <w:b/>
-          <w:sz w:val="24"/>
-        </w:rPr>
-        <w:t>Semana 10</w:t>
-      </w:r>
-    </w:p>
-    <w:p>
-      <w:pPr>
-        <w:spacing w:line="360" w:lineRule="auto"/>
-        <w:ind w:firstLine="709"/>
-        <w:jc w:val="both"/>
-      </w:pPr>
-      <w:r>
-        <w:rPr>
-          <w:rFonts w:ascii="Times New Roman" w:hAnsi="Times New Roman"/>
-          <w:sz w:val="24"/>
-        </w:rPr>
-        <w:t xml:space="preserve">1. </w:t>
-      </w:r>
-      <w:r>
-        <w:rPr>
-          <w:rFonts w:ascii="Times New Roman" w:hAnsi="Times New Roman"/>
-          <w:b/>
-          <w:sz w:val="24"/>
-        </w:rPr>
-        <w:t xml:space="preserve">Actividad operativa: </w:t>
-      </w:r>
-      <w:r>
-        <w:rPr>
-          <w:rFonts w:ascii="Times New Roman" w:hAnsi="Times New Roman"/>
-          <w:sz w:val="24"/>
-        </w:rPr>
-        <w:t>Presentación de los resultados y de la propuesta ante la supervisión del área, gestión de los recaudos de cierre y organización final de la documentación de pasantías.</w:t>
-      </w:r>
-    </w:p>
-    <w:p>
-      <w:pPr>
-        <w:spacing w:line="360" w:lineRule="auto"/>
-        <w:ind w:firstLine="709"/>
-        <w:jc w:val="both"/>
-      </w:pPr>
-      <w:r>
-        <w:rPr>
-          <w:rFonts w:ascii="Times New Roman" w:hAnsi="Times New Roman"/>
-          <w:sz w:val="24"/>
-        </w:rPr>
-        <w:t xml:space="preserve">2. </w:t>
-      </w:r>
-      <w:r>
-        <w:rPr>
-          <w:rFonts w:ascii="Times New Roman" w:hAnsi="Times New Roman"/>
-          <w:b/>
-          <w:sz w:val="24"/>
-        </w:rPr>
-        <w:t xml:space="preserve">Actividad de investigación: </w:t>
-      </w:r>
-      <w:r>
-        <w:rPr>
-          <w:rFonts w:ascii="Times New Roman" w:hAnsi="Times New Roman"/>
-          <w:sz w:val="24"/>
-        </w:rPr>
-        <w:t>Consolidación del informe académico, revisión de la normativa IUTECP, incorporación de anexos y correcciones finales para la entrega institucional.</w:t>
+        <w:t xml:space="preserve">4. </w:t>
+      </w:r>
+      <w:r>
+        <w:rPr>
+          <w:rFonts w:ascii="Times New Roman" w:hAnsi="Times New Roman"/>
+          <w:sz w:val="24"/>
+        </w:rPr>
+        <w:t>Evaluar posteriormente una herramienta digital centralizada de seguimiento cuando el procedimiento administrativo ya se encuentre formalizado y validado por las áreas involucradas.</w:t>
       </w:r>
     </w:p>
     <w:p>
@@ -8431,6 +8629,7 @@
       </w:pPr>
     </w:p>
     <w:p>
+      <w:bookmarkStart w:id="bm_referencias" w:name="bm_referencias"/>
       <w:pPr>
         <w:spacing w:before="1140" w:after="480"/>
         <w:jc w:val="center"/>
@@ -8441,24 +8640,9 @@
           <w:b/>
           <w:sz w:val="24"/>
         </w:rPr>
-        <w:t>CAPÍTULO V</w:t>
-      </w:r>
-    </w:p>
-    <w:p>
-      <w:bookmarkStart w:id="bm_cap5" w:name="bm_cap5"/>
-      <w:pPr>
-        <w:spacing w:before="480"/>
-        <w:jc w:val="center"/>
-      </w:pPr>
-      <w:r>
-        <w:rPr>
-          <w:rFonts w:ascii="Times New Roman" w:hAnsi="Times New Roman"/>
-          <w:b/>
-          <w:sz w:val="24"/>
-        </w:rPr>
-        <w:t>CONCLUSIONES Y RECOMENDACIONES</w:t>
-      </w:r>
-      <w:bookmarkEnd w:id="bm_cap5"/>
+        <w:t>REFERENCIAS</w:t>
+      </w:r>
+      <w:bookmarkEnd w:id="bm_referencias"/>
     </w:p>
     <w:p>
       <w:pPr>
@@ -8473,25 +8657,14 @@
       </w:pPr>
     </w:p>
     <w:p>
-      <w:bookmarkStart w:id="bm_cap5_concl" w:name="bm_cap5_concl"/>
-      <w:pPr>
-        <w:spacing w:before="480" w:after="480" w:line="360" w:lineRule="auto"/>
-        <w:jc w:val="left"/>
-      </w:pPr>
-      <w:r>
-        <w:rPr>
-          <w:rFonts w:ascii="Times New Roman" w:hAnsi="Times New Roman"/>
-          <w:b/>
-          <w:sz w:val="24"/>
-        </w:rPr>
-        <w:t>Conclusiones</w:t>
-      </w:r>
-      <w:bookmarkEnd w:id="bm_cap5_concl"/>
+      <w:pPr>
+        <w:spacing w:before="480" w:after="0"/>
+      </w:pPr>
     </w:p>
     <w:p>
       <w:pPr>
-        <w:spacing w:line="360" w:lineRule="auto"/>
-        <w:ind w:firstLine="709"/>
+        <w:spacing w:line="240" w:lineRule="auto" w:after="480" w:before="0"/>
+        <w:ind w:left="425" w:hanging="425"/>
         <w:jc w:val="both"/>
       </w:pPr>
       <w:r>
@@ -8499,20 +8672,13 @@
           <w:rFonts w:ascii="Times New Roman" w:hAnsi="Times New Roman"/>
           <w:sz w:val="24"/>
         </w:rPr>
-        <w:t xml:space="preserve">1. </w:t>
-      </w:r>
-      <w:r>
-        <w:rPr>
-          <w:rFonts w:ascii="Times New Roman" w:hAnsi="Times New Roman"/>
-          <w:sz w:val="24"/>
-        </w:rPr>
-        <w:t>Se describió el proceso actual de gestión de solicitudes de IDETEL, identificando que la información se origina en Atención al Cliente y continúa hacia Administración y las áreas técnicas, sin contar con un procedimiento único que establezca de forma visible el recorrido completo del caso.</w:t>
+        <w:t>Arias, F. (2012). El proyecto de investigación: Introducción a la metodología científica (6ta ed.). Episteme, Venezuela.</w:t>
       </w:r>
     </w:p>
     <w:p>
       <w:pPr>
-        <w:spacing w:line="360" w:lineRule="auto"/>
-        <w:ind w:firstLine="709"/>
+        <w:spacing w:line="240" w:lineRule="auto" w:after="480" w:before="0"/>
+        <w:ind w:left="425" w:hanging="425"/>
         <w:jc w:val="both"/>
       </w:pPr>
       <w:r>
@@ -8520,20 +8686,13 @@
           <w:rFonts w:ascii="Times New Roman" w:hAnsi="Times New Roman"/>
           <w:sz w:val="24"/>
         </w:rPr>
-        <w:t xml:space="preserve">2. </w:t>
-      </w:r>
-      <w:r>
-        <w:rPr>
-          <w:rFonts w:ascii="Times New Roman" w:hAnsi="Times New Roman"/>
-          <w:sz w:val="24"/>
-        </w:rPr>
-        <w:t>Se identificaron como principales deficiencias la falta de formatos uniformes, la actualización no centralizada del estatus, la ausencia de tiempos de referencia por etapa y las dificultades de comunicación entre las áreas que participan en afiliaciones e incidencias.</w:t>
+        <w:t>Chiavenato, I. (2006). Introducción a la teoría general de la administración (7ma ed.). McGraw-Hill, México.</w:t>
       </w:r>
     </w:p>
     <w:p>
       <w:pPr>
-        <w:spacing w:line="360" w:lineRule="auto"/>
-        <w:ind w:firstLine="709"/>
+        <w:spacing w:line="240" w:lineRule="auto" w:after="480" w:before="0"/>
+        <w:ind w:left="425" w:hanging="425"/>
         <w:jc w:val="both"/>
       </w:pPr>
       <w:r>
@@ -8541,20 +8700,13 @@
           <w:rFonts w:ascii="Times New Roman" w:hAnsi="Times New Roman"/>
           <w:sz w:val="24"/>
         </w:rPr>
-        <w:t xml:space="preserve">3. </w:t>
-      </w:r>
-      <w:r>
-        <w:rPr>
-          <w:rFonts w:ascii="Times New Roman" w:hAnsi="Times New Roman"/>
-          <w:sz w:val="24"/>
-        </w:rPr>
-        <w:t>Se determinó que estas debilidades afectan la trazabilidad y pueden prolongar los tiempos de respuesta, debido a que el personal debe verificar información en distintos registros antes de informar el estado de una solicitud o confirmar su cierre.</w:t>
+        <w:t>Harrington, H. J. (1993). Mejoramiento de los procesos de la empresa. McGraw-Hill, Colombia.</w:t>
       </w:r>
     </w:p>
     <w:p>
       <w:pPr>
-        <w:spacing w:line="360" w:lineRule="auto"/>
-        <w:ind w:firstLine="709"/>
+        <w:spacing w:line="240" w:lineRule="auto" w:after="480" w:before="0"/>
+        <w:ind w:left="425" w:hanging="425"/>
         <w:jc w:val="both"/>
       </w:pPr>
       <w:r>
@@ -8562,36 +8714,27 @@
           <w:rFonts w:ascii="Times New Roman" w:hAnsi="Times New Roman"/>
           <w:sz w:val="24"/>
         </w:rPr>
-        <w:t xml:space="preserve">4. </w:t>
-      </w:r>
-      <w:r>
-        <w:rPr>
-          <w:rFonts w:ascii="Times New Roman" w:hAnsi="Times New Roman"/>
-          <w:sz w:val="24"/>
-        </w:rPr>
-        <w:t>Se formuló una propuesta de mejora que incorpora un flujo estandarizado, responsables por etapa, formatos de registro y mecanismos básicos de seguimiento, orientados a facilitar el control administrativo y la continuidad de la atención al suscriptor.</w:t>
+        <w:t>Laudon, K., y Laudon, J. (2016). Sistemas de información gerencial (14va ed.). Pearson Educación, México.</w:t>
       </w:r>
     </w:p>
     <w:p>
-      <w:bookmarkStart w:id="bm_cap5_recom" w:name="bm_cap5_recom"/>
-      <w:pPr>
-        <w:spacing w:before="480" w:after="480" w:line="360" w:lineRule="auto"/>
-        <w:jc w:val="left"/>
-      </w:pPr>
-      <w:r>
-        <w:rPr>
-          <w:rFonts w:ascii="Times New Roman" w:hAnsi="Times New Roman"/>
-          <w:b/>
-          <w:sz w:val="24"/>
-        </w:rPr>
-        <w:t>Recomendaciones</w:t>
-      </w:r>
-      <w:bookmarkEnd w:id="bm_cap5_recom"/>
+      <w:pPr>
+        <w:spacing w:line="240" w:lineRule="auto" w:after="480" w:before="0"/>
+        <w:ind w:left="425" w:hanging="425"/>
+        <w:jc w:val="both"/>
+      </w:pPr>
+      <w:r>
+        <w:rPr>
+          <w:rFonts w:ascii="Times New Roman" w:hAnsi="Times New Roman"/>
+          <w:sz w:val="24"/>
+        </w:rPr>
+        <w:t>Parasuraman, A., Zeithaml, V., y Berry, L. (1988). SERVQUAL: A multiple-item scale for measuring consumer perceptions of service quality. Journal of Retailing, 64(1), 12-40.</w:t>
+      </w:r>
     </w:p>
     <w:p>
       <w:pPr>
-        <w:spacing w:line="360" w:lineRule="auto"/>
-        <w:ind w:firstLine="709"/>
+        <w:spacing w:line="240" w:lineRule="auto" w:after="480" w:before="0"/>
+        <w:ind w:left="425" w:hanging="425"/>
         <w:jc w:val="both"/>
       </w:pPr>
       <w:r>
@@ -8599,20 +8742,13 @@
           <w:rFonts w:ascii="Times New Roman" w:hAnsi="Times New Roman"/>
           <w:sz w:val="24"/>
         </w:rPr>
-        <w:t xml:space="preserve">1. </w:t>
-      </w:r>
-      <w:r>
-        <w:rPr>
-          <w:rFonts w:ascii="Times New Roman" w:hAnsi="Times New Roman"/>
-          <w:sz w:val="24"/>
-        </w:rPr>
-        <w:t>Implementar progresivamente el flujo estandarizado propuesto y verificar su funcionamiento con un grupo controlado de solicitudes antes de aplicarlo a todos los casos.</w:t>
+        <w:t>Robbins, S., y Coulter, M. (2010). Administración (10ma ed.). Pearson Educación, México.</w:t>
       </w:r>
     </w:p>
     <w:p>
       <w:pPr>
-        <w:spacing w:line="360" w:lineRule="auto"/>
-        <w:ind w:firstLine="709"/>
+        <w:spacing w:line="240" w:lineRule="auto" w:after="480" w:before="0"/>
+        <w:ind w:left="425" w:hanging="425"/>
         <w:jc w:val="both"/>
       </w:pPr>
       <w:r>
@@ -8620,20 +8756,13 @@
           <w:rFonts w:ascii="Times New Roman" w:hAnsi="Times New Roman"/>
           <w:sz w:val="24"/>
         </w:rPr>
-        <w:t xml:space="preserve">2. </w:t>
-      </w:r>
-      <w:r>
-        <w:rPr>
-          <w:rFonts w:ascii="Times New Roman" w:hAnsi="Times New Roman"/>
-          <w:sz w:val="24"/>
-        </w:rPr>
-        <w:t>Utilizar de manera uniforme los formatos de registro de afiliaciones e incidencias y definir claramente el responsable de actualizar el estatus en cada etapa.</w:t>
+        <w:t>Universidad Pedagógica Experimental Libertador. (2016). Manual de trabajos de grado de especialización y maestría y tesis doctorales (5ta ed.). FEDUPEL, Venezuela.</w:t>
       </w:r>
     </w:p>
     <w:p>
       <w:pPr>
-        <w:spacing w:line="360" w:lineRule="auto"/>
-        <w:ind w:firstLine="709"/>
+        <w:spacing w:line="240" w:lineRule="auto" w:after="480" w:before="0"/>
+        <w:ind w:left="425" w:hanging="425"/>
         <w:jc w:val="both"/>
       </w:pPr>
       <w:r>
@@ -8641,35 +8770,7 @@
           <w:rFonts w:ascii="Times New Roman" w:hAnsi="Times New Roman"/>
           <w:sz w:val="24"/>
         </w:rPr>
-        <w:t xml:space="preserve">3. </w:t>
-      </w:r>
-      <w:r>
-        <w:rPr>
-          <w:rFonts w:ascii="Times New Roman" w:hAnsi="Times New Roman"/>
-          <w:sz w:val="24"/>
-        </w:rPr>
-        <w:t>Registrar y revisar periódicamente tiempos de respuesta, solicitudes pendientes y casos cerrados para identificar retrasos recurrentes y aplicar acciones correctivas.</w:t>
-      </w:r>
-    </w:p>
-    <w:p>
-      <w:pPr>
-        <w:spacing w:line="360" w:lineRule="auto"/>
-        <w:ind w:firstLine="709"/>
-        <w:jc w:val="both"/>
-      </w:pPr>
-      <w:r>
-        <w:rPr>
-          <w:rFonts w:ascii="Times New Roman" w:hAnsi="Times New Roman"/>
-          <w:sz w:val="24"/>
-        </w:rPr>
-        <w:t xml:space="preserve">4. </w:t>
-      </w:r>
-      <w:r>
-        <w:rPr>
-          <w:rFonts w:ascii="Times New Roman" w:hAnsi="Times New Roman"/>
-          <w:sz w:val="24"/>
-        </w:rPr>
-        <w:t>Evaluar posteriormente una herramienta digital centralizada de seguimiento cuando el procedimiento administrativo ya se encuentre formalizado y validado por las áreas involucradas.</w:t>
+        <w:t>Zeithaml, V., Parasuraman, A., y Berry, L. (1993). Calidad total en la gestión de servicios. Díaz de Santos, España.</w:t>
       </w:r>
     </w:p>
     <w:p>
@@ -8686,164 +8787,6 @@
       </w:pPr>
     </w:p>
     <w:p>
-      <w:bookmarkStart w:id="bm_referencias" w:name="bm_referencias"/>
-      <w:pPr>
-        <w:spacing w:before="1140" w:after="480"/>
-        <w:jc w:val="center"/>
-      </w:pPr>
-      <w:r>
-        <w:rPr>
-          <w:rFonts w:ascii="Times New Roman" w:hAnsi="Times New Roman"/>
-          <w:b/>
-          <w:sz w:val="24"/>
-        </w:rPr>
-        <w:t>REFERENCIAS</w:t>
-      </w:r>
-      <w:bookmarkEnd w:id="bm_referencias"/>
-    </w:p>
-    <w:p>
-      <w:pPr>
-        <w:sectPr>
-          <w:footerReference w:type="default" r:id="rId43"/>
-          <w:pgSz w:w="12240" w:h="15840"/>
-          <w:pgMar w:top="1701" w:right="1701" w:bottom="1701" w:left="2268" w:header="720" w:footer="720" w:gutter="0"/>
-          <w:cols w:space="720"/>
-          <w:titlePg/>
-          <w:docGrid w:linePitch="360"/>
-        </w:sectPr>
-      </w:pPr>
-    </w:p>
-    <w:p>
-      <w:pPr>
-        <w:spacing w:before="480" w:after="0"/>
-      </w:pPr>
-    </w:p>
-    <w:p>
-      <w:pPr>
-        <w:spacing w:line="240" w:lineRule="auto" w:after="480" w:before="0"/>
-        <w:ind w:left="425" w:hanging="425"/>
-        <w:jc w:val="both"/>
-      </w:pPr>
-      <w:r>
-        <w:rPr>
-          <w:rFonts w:ascii="Times New Roman" w:hAnsi="Times New Roman"/>
-          <w:sz w:val="24"/>
-        </w:rPr>
-        <w:t>Arias, F. (2012). El proyecto de investigación: Introducción a la metodología científica (6ta ed.). Episteme, Venezuela.</w:t>
-      </w:r>
-    </w:p>
-    <w:p>
-      <w:pPr>
-        <w:spacing w:line="240" w:lineRule="auto" w:after="480" w:before="0"/>
-        <w:ind w:left="425" w:hanging="425"/>
-        <w:jc w:val="both"/>
-      </w:pPr>
-      <w:r>
-        <w:rPr>
-          <w:rFonts w:ascii="Times New Roman" w:hAnsi="Times New Roman"/>
-          <w:sz w:val="24"/>
-        </w:rPr>
-        <w:t>Chiavenato, I. (2006). Introducción a la teoría general de la administración (7ma ed.). McGraw-Hill, México.</w:t>
-      </w:r>
-    </w:p>
-    <w:p>
-      <w:pPr>
-        <w:spacing w:line="240" w:lineRule="auto" w:after="480" w:before="0"/>
-        <w:ind w:left="425" w:hanging="425"/>
-        <w:jc w:val="both"/>
-      </w:pPr>
-      <w:r>
-        <w:rPr>
-          <w:rFonts w:ascii="Times New Roman" w:hAnsi="Times New Roman"/>
-          <w:sz w:val="24"/>
-        </w:rPr>
-        <w:t>Harrington, H. J. (1993). Mejoramiento de los procesos de la empresa. McGraw-Hill, Colombia.</w:t>
-      </w:r>
-    </w:p>
-    <w:p>
-      <w:pPr>
-        <w:spacing w:line="240" w:lineRule="auto" w:after="480" w:before="0"/>
-        <w:ind w:left="425" w:hanging="425"/>
-        <w:jc w:val="both"/>
-      </w:pPr>
-      <w:r>
-        <w:rPr>
-          <w:rFonts w:ascii="Times New Roman" w:hAnsi="Times New Roman"/>
-          <w:sz w:val="24"/>
-        </w:rPr>
-        <w:t>Laudon, K., y Laudon, J. (2016). Sistemas de información gerencial (14va ed.). Pearson Educación, México.</w:t>
-      </w:r>
-    </w:p>
-    <w:p>
-      <w:pPr>
-        <w:spacing w:line="240" w:lineRule="auto" w:after="480" w:before="0"/>
-        <w:ind w:left="425" w:hanging="425"/>
-        <w:jc w:val="both"/>
-      </w:pPr>
-      <w:r>
-        <w:rPr>
-          <w:rFonts w:ascii="Times New Roman" w:hAnsi="Times New Roman"/>
-          <w:sz w:val="24"/>
-        </w:rPr>
-        <w:t>Parasuraman, A., Zeithaml, V., y Berry, L. (1988). SERVQUAL: A multiple-item scale for measuring consumer perceptions of service quality. Journal of Retailing, 64(1), 12-40.</w:t>
-      </w:r>
-    </w:p>
-    <w:p>
-      <w:pPr>
-        <w:spacing w:line="240" w:lineRule="auto" w:after="480" w:before="0"/>
-        <w:ind w:left="425" w:hanging="425"/>
-        <w:jc w:val="both"/>
-      </w:pPr>
-      <w:r>
-        <w:rPr>
-          <w:rFonts w:ascii="Times New Roman" w:hAnsi="Times New Roman"/>
-          <w:sz w:val="24"/>
-        </w:rPr>
-        <w:t>Robbins, S., y Coulter, M. (2010). Administración (10ma ed.). Pearson Educación, México.</w:t>
-      </w:r>
-    </w:p>
-    <w:p>
-      <w:pPr>
-        <w:spacing w:line="240" w:lineRule="auto" w:after="480" w:before="0"/>
-        <w:ind w:left="425" w:hanging="425"/>
-        <w:jc w:val="both"/>
-      </w:pPr>
-      <w:r>
-        <w:rPr>
-          <w:rFonts w:ascii="Times New Roman" w:hAnsi="Times New Roman"/>
-          <w:sz w:val="24"/>
-        </w:rPr>
-        <w:t>Universidad Pedagógica Experimental Libertador. (2016). Manual de trabajos de grado de especialización y maestría y tesis doctorales (5ta ed.). FEDUPEL, Venezuela.</w:t>
-      </w:r>
-    </w:p>
-    <w:p>
-      <w:pPr>
-        <w:spacing w:line="240" w:lineRule="auto" w:after="480" w:before="0"/>
-        <w:ind w:left="425" w:hanging="425"/>
-        <w:jc w:val="both"/>
-      </w:pPr>
-      <w:r>
-        <w:rPr>
-          <w:rFonts w:ascii="Times New Roman" w:hAnsi="Times New Roman"/>
-          <w:sz w:val="24"/>
-        </w:rPr>
-        <w:t>Zeithaml, V., Parasuraman, A., y Berry, L. (1993). Calidad total en la gestión de servicios. Díaz de Santos, España.</w:t>
-      </w:r>
-    </w:p>
-    <w:p>
-      <w:pPr>
-        <w:sectPr>
-          <w:footerReference w:type="default" r:id="rId44"/>
-          <w:type w:val="continuous"/>
-          <w:pgSz w:w="12240" w:h="15840"/>
-          <w:pgMar w:top="1701" w:right="1701" w:bottom="1701" w:left="2268" w:header="720" w:footer="720" w:gutter="0"/>
-          <w:cols w:space="720"/>
-          <w:titlePg/>
-          <w:docGrid w:linePitch="360"/>
-        </w:sectPr>
-      </w:pPr>
-    </w:p>
-    <w:p>
       <w:bookmarkStart w:id="bm_anexos" w:name="bm_anexos"/>
       <w:pPr>
         <w:spacing w:before="4740"/>
@@ -8862,7 +8805,7 @@
     <w:p>
       <w:pPr>
         <w:sectPr>
-          <w:footerReference w:type="default" r:id="rId45"/>
+          <w:footerReference w:type="default" r:id="rId43"/>
           <w:pgSz w:w="12240" w:h="15840"/>
           <w:pgMar w:top="1701" w:right="1701" w:bottom="1701" w:left="2268" w:header="720" w:footer="720" w:gutter="0"/>
           <w:cols w:space="720"/>
@@ -8941,7 +8884,7 @@
       </w:r>
     </w:p>
     <w:sectPr>
-      <w:footerReference w:type="default" r:id="rId46"/>
+      <w:footerReference w:type="default" r:id="rId44"/>
       <w:pgSz w:w="12240" w:h="15840"/>
       <w:pgMar w:top="1701" w:right="1701" w:bottom="1701" w:left="2268" w:header="720" w:footer="720" w:gutter="0"/>
       <w:cols w:space="720"/>
@@ -9122,7 +9065,7 @@
         <w:sz w:val="24"/>
       </w:rPr>
       <w:fldChar w:fldCharType="begin"/>
-      <w:instrText xml:space="preserve"> PAGE \* roman </w:instrText>
+      <w:instrText xml:space="preserve"> PAGE </w:instrText>
       <w:fldChar w:fldCharType="separate"/>
       <w:fldChar w:fldCharType="end"/>
     </w:r>
@@ -9143,7 +9086,7 @@
         <w:sz w:val="24"/>
       </w:rPr>
       <w:fldChar w:fldCharType="begin"/>
-      <w:instrText xml:space="preserve"> PAGE \* roman </w:instrText>
+      <w:instrText xml:space="preserve"> PAGE </w:instrText>
       <w:fldChar w:fldCharType="separate"/>
       <w:fldChar w:fldCharType="end"/>
     </w:r>
@@ -9414,48 +9357,6 @@
 </file>
 
 <file path=word/footer30.xml><?xml version="1.0" encoding="utf-8"?>
-<w:ftr xmlns:m="http://schemas.openxmlformats.org/officeDocument/2006/math" xmlns:mc="http://schemas.openxmlformats.org/markup-compatibility/2006" xmlns:mo="http://schemas.microsoft.com/office/mac/office/2008/main" xmlns:mv="urn:schemas-microsoft-com:mac:vml" xmlns:o="urn:schemas-microsoft-com:office:office" xmlns:r="http://schemas.openxmlformats.org/officeDocument/2006/relationships" xmlns:v="urn:schemas-microsoft-com:vml" xmlns:w10="urn:schemas-microsoft-com:office:word" xmlns:w14="http://schemas.microsoft.com/office/word/2010/wordml" xmlns:w="http://schemas.openxmlformats.org/wordprocessingml/2006/main" xmlns:wne="http://schemas.microsoft.com/office/word/2006/wordml" xmlns:wp14="http://schemas.microsoft.com/office/word/2010/wordprocessingDrawing" xmlns:wp="http://schemas.openxmlformats.org/drawingml/2006/wordprocessingDrawing" xmlns:wpc="http://schemas.microsoft.com/office/word/2010/wordprocessingCanvas" xmlns:wpg="http://schemas.microsoft.com/office/word/2010/wordprocessingGroup" xmlns:wpi="http://schemas.microsoft.com/office/word/2010/wordprocessingInk" xmlns:wps="http://schemas.microsoft.com/office/word/2010/wordprocessingShape" mc:Ignorable="w14 wp14">
-  <w:p>
-    <w:pPr>
-      <w:pStyle w:val="Footer"/>
-      <w:jc w:val="center"/>
-    </w:pPr>
-    <w:r>
-      <w:rPr>
-        <w:rFonts w:ascii="Times New Roman" w:hAnsi="Times New Roman"/>
-        <w:sz w:val="24"/>
-      </w:rPr>
-      <w:fldChar w:fldCharType="begin"/>
-      <w:instrText xml:space="preserve"> PAGE </w:instrText>
-      <w:fldChar w:fldCharType="separate"/>
-      <w:fldChar w:fldCharType="end"/>
-    </w:r>
-  </w:p>
-</w:ftr>
-</file>
-
-<file path=word/footer31.xml><?xml version="1.0" encoding="utf-8"?>
-<w:ftr xmlns:m="http://schemas.openxmlformats.org/officeDocument/2006/math" xmlns:mc="http://schemas.openxmlformats.org/markup-compatibility/2006" xmlns:mo="http://schemas.microsoft.com/office/mac/office/2008/main" xmlns:mv="urn:schemas-microsoft-com:mac:vml" xmlns:o="urn:schemas-microsoft-com:office:office" xmlns:r="http://schemas.openxmlformats.org/officeDocument/2006/relationships" xmlns:v="urn:schemas-microsoft-com:vml" xmlns:w10="urn:schemas-microsoft-com:office:word" xmlns:w14="http://schemas.microsoft.com/office/word/2010/wordml" xmlns:w="http://schemas.openxmlformats.org/wordprocessingml/2006/main" xmlns:wne="http://schemas.microsoft.com/office/word/2006/wordml" xmlns:wp14="http://schemas.microsoft.com/office/word/2010/wordprocessingDrawing" xmlns:wp="http://schemas.openxmlformats.org/drawingml/2006/wordprocessingDrawing" xmlns:wpc="http://schemas.microsoft.com/office/word/2010/wordprocessingCanvas" xmlns:wpg="http://schemas.microsoft.com/office/word/2010/wordprocessingGroup" xmlns:wpi="http://schemas.microsoft.com/office/word/2010/wordprocessingInk" xmlns:wps="http://schemas.microsoft.com/office/word/2010/wordprocessingShape" mc:Ignorable="w14 wp14">
-  <w:p>
-    <w:pPr>
-      <w:pStyle w:val="Footer"/>
-      <w:jc w:val="center"/>
-    </w:pPr>
-    <w:r>
-      <w:rPr>
-        <w:rFonts w:ascii="Times New Roman" w:hAnsi="Times New Roman"/>
-        <w:sz w:val="24"/>
-      </w:rPr>
-      <w:fldChar w:fldCharType="begin"/>
-      <w:instrText xml:space="preserve"> PAGE </w:instrText>
-      <w:fldChar w:fldCharType="separate"/>
-      <w:fldChar w:fldCharType="end"/>
-    </w:r>
-  </w:p>
-</w:ftr>
-</file>
-
-<file path=word/footer32.xml><?xml version="1.0" encoding="utf-8"?>
 <w:ftr xmlns:m="http://schemas.openxmlformats.org/officeDocument/2006/math" xmlns:mc="http://schemas.openxmlformats.org/markup-compatibility/2006" xmlns:mo="http://schemas.microsoft.com/office/mac/office/2008/main" xmlns:mv="urn:schemas-microsoft-com:mac:vml" xmlns:o="urn:schemas-microsoft-com:office:office" xmlns:r="http://schemas.openxmlformats.org/officeDocument/2006/relationships" xmlns:v="urn:schemas-microsoft-com:vml" xmlns:w10="urn:schemas-microsoft-com:office:word" xmlns:w14="http://schemas.microsoft.com/office/word/2010/wordml" xmlns:w="http://schemas.openxmlformats.org/wordprocessingml/2006/main" xmlns:wne="http://schemas.microsoft.com/office/word/2006/wordml" xmlns:wp14="http://schemas.microsoft.com/office/word/2010/wordprocessingDrawing" xmlns:wp="http://schemas.openxmlformats.org/drawingml/2006/wordprocessingDrawing" xmlns:wpc="http://schemas.microsoft.com/office/word/2010/wordprocessingCanvas" xmlns:wpg="http://schemas.microsoft.com/office/word/2010/wordprocessingGroup" xmlns:wpi="http://schemas.microsoft.com/office/word/2010/wordprocessingInk" xmlns:wps="http://schemas.microsoft.com/office/word/2010/wordprocessingShape" mc:Ignorable="w14 wp14">
   <w:p>
     <w:pPr>

</xml_diff>

<commit_message>
Restaurar logos en el capítulo I
</commit_message>
<xml_diff>
--- a/amaal/reportes/Informe_Pasantia_IUTECP.docx
+++ b/amaal/reportes/Informe_Pasantia_IUTECP.docx
@@ -154,7 +154,7 @@
     <w:p>
       <w:pPr>
         <w:sectPr>
-          <w:footerReference w:type="default" r:id="rId15"/>
+          <w:footerReference w:type="default" r:id="rId16"/>
           <w:pgSz w:w="12240" w:h="15840"/>
           <w:pgMar w:top="1701" w:right="1701" w:bottom="1701" w:left="2268" w:header="720" w:footer="720" w:gutter="0"/>
           <w:cols w:space="720"/>
@@ -393,7 +393,7 @@
     <w:p>
       <w:pPr>
         <w:sectPr>
-          <w:footerReference w:type="default" r:id="rId16"/>
+          <w:footerReference w:type="default" r:id="rId17"/>
           <w:pgSz w:w="12240" w:h="15840"/>
           <w:pgMar w:top="1701" w:right="1701" w:bottom="1701" w:left="2268" w:header="720" w:footer="720" w:gutter="0"/>
           <w:cols w:space="720"/>
@@ -589,175 +589,6 @@
     <w:p>
       <w:pPr>
         <w:sectPr>
-          <w:footerReference w:type="default" r:id="rId17"/>
-          <w:pgSz w:w="12240" w:h="15840"/>
-          <w:pgMar w:top="1701" w:right="1701" w:bottom="1701" w:left="2268" w:header="720" w:footer="720" w:gutter="0"/>
-          <w:cols w:space="720"/>
-          <w:titlePg/>
-          <w:docGrid w:linePitch="360"/>
-        </w:sectPr>
-      </w:pPr>
-    </w:p>
-    <w:p>
-      <w:pPr>
-        <w:spacing w:line="276" w:lineRule="auto" w:before="0" w:after="0"/>
-        <w:jc w:val="center"/>
-      </w:pPr>
-      <w:r>
-        <w:rPr>
-          <w:rFonts w:ascii="Times New Roman" w:hAnsi="Times New Roman"/>
-          <w:b/>
-          <w:sz w:val="24"/>
-        </w:rPr>
-        <w:t>REPÚBLICA BOLIVARIANA DE VENEZUELA</w:t>
-      </w:r>
-    </w:p>
-    <w:p>
-      <w:pPr>
-        <w:spacing w:line="276" w:lineRule="auto" w:before="0" w:after="0"/>
-        <w:jc w:val="center"/>
-      </w:pPr>
-      <w:r>
-        <w:rPr>
-          <w:rFonts w:ascii="Times New Roman" w:hAnsi="Times New Roman"/>
-          <w:b/>
-          <w:sz w:val="24"/>
-        </w:rPr>
-        <w:t>MINISTERIO DEL PODER POPULAR PARA LA EDUCACIÓN UNIVERSITARIA</w:t>
-      </w:r>
-    </w:p>
-    <w:p>
-      <w:pPr>
-        <w:spacing w:line="276" w:lineRule="auto" w:before="0" w:after="0"/>
-        <w:jc w:val="center"/>
-      </w:pPr>
-      <w:r>
-        <w:rPr>
-          <w:rFonts w:ascii="Times New Roman" w:hAnsi="Times New Roman"/>
-          <w:b/>
-          <w:sz w:val="24"/>
-        </w:rPr>
-        <w:t>INSTITUTO UNIVERSITARIO DE TECNOLOGÍA</w:t>
-      </w:r>
-    </w:p>
-    <w:p>
-      <w:pPr>
-        <w:spacing w:line="276" w:lineRule="auto" w:before="0" w:after="0"/>
-        <w:jc w:val="center"/>
-      </w:pPr>
-      <w:r>
-        <w:rPr>
-          <w:rFonts w:ascii="Times New Roman" w:hAnsi="Times New Roman"/>
-          <w:b/>
-          <w:sz w:val="24"/>
-        </w:rPr>
-        <w:t>"ELÍAS CALIXTO POMPA"</w:t>
-      </w:r>
-    </w:p>
-    <w:p>
-      <w:pPr>
-        <w:spacing w:line="276" w:lineRule="auto" w:before="0" w:after="0"/>
-        <w:jc w:val="center"/>
-      </w:pPr>
-      <w:r>
-        <w:rPr>
-          <w:rFonts w:ascii="Times New Roman" w:hAnsi="Times New Roman"/>
-          <w:b/>
-          <w:sz w:val="24"/>
-        </w:rPr>
-        <w:t>EL TIGRE, ESTADO ANZOÁTEGUI</w:t>
-      </w:r>
-    </w:p>
-    <w:p/>
-    <w:p>
-      <w:bookmarkStart w:id="bm_aprob_acad" w:name="bm_aprob_acad"/>
-      <w:pPr>
-        <w:spacing w:before="480" w:after="480"/>
-        <w:jc w:val="center"/>
-      </w:pPr>
-      <w:r>
-        <w:rPr>
-          <w:rFonts w:ascii="Times New Roman" w:hAnsi="Times New Roman"/>
-          <w:b/>
-          <w:sz w:val="24"/>
-        </w:rPr>
-        <w:t>APROBACIÓN DEL TUTOR ACADÉMICO</w:t>
-      </w:r>
-      <w:bookmarkEnd w:id="bm_aprob_acad"/>
-    </w:p>
-    <w:p>
-      <w:pPr>
-        <w:spacing w:line="360" w:lineRule="auto"/>
-        <w:ind w:firstLine="0"/>
-        <w:jc w:val="both"/>
-      </w:pPr>
-      <w:r>
-        <w:rPr>
-          <w:rFonts w:ascii="Times New Roman" w:hAnsi="Times New Roman"/>
-          <w:sz w:val="24"/>
-        </w:rPr>
-        <w:t>En mi carácter de tutor académico del informe de pasantías presentado por: Alrifaai Alrifaaie, Amaal, de Cédula de Identidad V-31.985.792; para optar al grado de Técnico Superior Universitario en la especialidad de: Administración, cuyo título es; “EVALUACIÓN DEL CONTROL ADMINISTRATIVO APLICADO A LA GESTIÓN DE SOLICITUDES DE SERVICIOS DE TELECOMUNICACIONES EN LA EMPRESA INGENIERÍA DE TELECOMUNICACIONES, C.A.”, manifiesto que cumple con los requisitos exigidos por el Instituto Universitario de Tecnología “Elías Calixto Pompa” (IUTECP); y que, por lo tanto, considero que reúne los méritos suficientes para ser evaluado por el jurado que se decida designar a tal fin.</w:t>
-      </w:r>
-    </w:p>
-    <w:p/>
-    <w:p/>
-    <w:p>
-      <w:pPr>
-        <w:spacing w:line="360" w:lineRule="auto"/>
-        <w:jc w:val="left"/>
-      </w:pPr>
-      <w:r>
-        <w:rPr>
-          <w:rFonts w:ascii="Times New Roman" w:hAnsi="Times New Roman"/>
-          <w:sz w:val="24"/>
-        </w:rPr>
-        <w:t>En la Ciudad de El Tigre, a los ___ días del mes de _______ de 2026</w:t>
-      </w:r>
-    </w:p>
-    <w:p/>
-    <w:p>
-      <w:pPr>
-        <w:jc w:val="center"/>
-      </w:pPr>
-      <w:r>
-        <w:rPr>
-          <w:rFonts w:ascii="Times New Roman" w:hAnsi="Times New Roman"/>
-          <w:sz w:val="24"/>
-        </w:rPr>
-        <w:t>___________________________________</w:t>
-      </w:r>
-    </w:p>
-    <w:p/>
-    <w:p>
-      <w:pPr>
-        <w:spacing w:line="360" w:lineRule="auto"/>
-        <w:jc w:val="center"/>
-      </w:pPr>
-      <w:r>
-        <w:rPr>
-          <w:rFonts w:ascii="Times New Roman" w:hAnsi="Times New Roman"/>
-          <w:b/>
-          <w:sz w:val="24"/>
-        </w:rPr>
-        <w:t>Dra. Álvarez, Carmen</w:t>
-      </w:r>
-    </w:p>
-    <w:p>
-      <w:pPr>
-        <w:spacing w:before="0"/>
-        <w:jc w:val="center"/>
-      </w:pPr>
-      <w:r>
-        <w:rPr>
-          <w:rFonts w:ascii="Times New Roman" w:hAnsi="Times New Roman"/>
-          <w:sz w:val="24"/>
-        </w:rPr>
-        <w:t>C.I.: 14.452.956</w:t>
-      </w:r>
-    </w:p>
-    <w:p>
-      <w:pPr>
-        <w:sectPr>
           <w:footerReference w:type="default" r:id="rId18"/>
           <w:pgSz w:w="12240" w:h="15840"/>
           <w:pgMar w:top="1701" w:right="1701" w:bottom="1701" w:left="2268" w:header="720" w:footer="720" w:gutter="0"/>
@@ -769,7 +600,7 @@
     </w:p>
     <w:p>
       <w:pPr>
-        <w:spacing w:before="1140" w:after="480"/>
+        <w:spacing w:line="276" w:lineRule="auto" w:before="0" w:after="0"/>
         <w:jc w:val="center"/>
       </w:pPr>
       <w:r>
@@ -778,7 +609,150 @@
           <w:b/>
           <w:sz w:val="24"/>
         </w:rPr>
-        <w:t>ÍNDICE DE CONTENIDO</w:t>
+        <w:t>REPÚBLICA BOLIVARIANA DE VENEZUELA</w:t>
+      </w:r>
+    </w:p>
+    <w:p>
+      <w:pPr>
+        <w:spacing w:line="276" w:lineRule="auto" w:before="0" w:after="0"/>
+        <w:jc w:val="center"/>
+      </w:pPr>
+      <w:r>
+        <w:rPr>
+          <w:rFonts w:ascii="Times New Roman" w:hAnsi="Times New Roman"/>
+          <w:b/>
+          <w:sz w:val="24"/>
+        </w:rPr>
+        <w:t>MINISTERIO DEL PODER POPULAR PARA LA EDUCACIÓN UNIVERSITARIA</w:t>
+      </w:r>
+    </w:p>
+    <w:p>
+      <w:pPr>
+        <w:spacing w:line="276" w:lineRule="auto" w:before="0" w:after="0"/>
+        <w:jc w:val="center"/>
+      </w:pPr>
+      <w:r>
+        <w:rPr>
+          <w:rFonts w:ascii="Times New Roman" w:hAnsi="Times New Roman"/>
+          <w:b/>
+          <w:sz w:val="24"/>
+        </w:rPr>
+        <w:t>INSTITUTO UNIVERSITARIO DE TECNOLOGÍA</w:t>
+      </w:r>
+    </w:p>
+    <w:p>
+      <w:pPr>
+        <w:spacing w:line="276" w:lineRule="auto" w:before="0" w:after="0"/>
+        <w:jc w:val="center"/>
+      </w:pPr>
+      <w:r>
+        <w:rPr>
+          <w:rFonts w:ascii="Times New Roman" w:hAnsi="Times New Roman"/>
+          <w:b/>
+          <w:sz w:val="24"/>
+        </w:rPr>
+        <w:t>"ELÍAS CALIXTO POMPA"</w:t>
+      </w:r>
+    </w:p>
+    <w:p>
+      <w:pPr>
+        <w:spacing w:line="276" w:lineRule="auto" w:before="0" w:after="0"/>
+        <w:jc w:val="center"/>
+      </w:pPr>
+      <w:r>
+        <w:rPr>
+          <w:rFonts w:ascii="Times New Roman" w:hAnsi="Times New Roman"/>
+          <w:b/>
+          <w:sz w:val="24"/>
+        </w:rPr>
+        <w:t>EL TIGRE, ESTADO ANZOÁTEGUI</w:t>
+      </w:r>
+    </w:p>
+    <w:p/>
+    <w:p>
+      <w:bookmarkStart w:id="bm_aprob_acad" w:name="bm_aprob_acad"/>
+      <w:pPr>
+        <w:spacing w:before="480" w:after="480"/>
+        <w:jc w:val="center"/>
+      </w:pPr>
+      <w:r>
+        <w:rPr>
+          <w:rFonts w:ascii="Times New Roman" w:hAnsi="Times New Roman"/>
+          <w:b/>
+          <w:sz w:val="24"/>
+        </w:rPr>
+        <w:t>APROBACIÓN DEL TUTOR ACADÉMICO</w:t>
+      </w:r>
+      <w:bookmarkEnd w:id="bm_aprob_acad"/>
+    </w:p>
+    <w:p>
+      <w:pPr>
+        <w:spacing w:line="360" w:lineRule="auto"/>
+        <w:ind w:firstLine="0"/>
+        <w:jc w:val="both"/>
+      </w:pPr>
+      <w:r>
+        <w:rPr>
+          <w:rFonts w:ascii="Times New Roman" w:hAnsi="Times New Roman"/>
+          <w:sz w:val="24"/>
+        </w:rPr>
+        <w:t>En mi carácter de tutor académico del informe de pasantías presentado por: Alrifaai Alrifaaie, Amaal, de Cédula de Identidad V-31.985.792; para optar al grado de Técnico Superior Universitario en la especialidad de: Administración, cuyo título es; “EVALUACIÓN DEL CONTROL ADMINISTRATIVO APLICADO A LA GESTIÓN DE SOLICITUDES DE SERVICIOS DE TELECOMUNICACIONES EN LA EMPRESA INGENIERÍA DE TELECOMUNICACIONES, C.A.”, manifiesto que cumple con los requisitos exigidos por el Instituto Universitario de Tecnología “Elías Calixto Pompa” (IUTECP); y que, por lo tanto, considero que reúne los méritos suficientes para ser evaluado por el jurado que se decida designar a tal fin.</w:t>
+      </w:r>
+    </w:p>
+    <w:p/>
+    <w:p/>
+    <w:p>
+      <w:pPr>
+        <w:spacing w:line="360" w:lineRule="auto"/>
+        <w:jc w:val="left"/>
+      </w:pPr>
+      <w:r>
+        <w:rPr>
+          <w:rFonts w:ascii="Times New Roman" w:hAnsi="Times New Roman"/>
+          <w:sz w:val="24"/>
+        </w:rPr>
+        <w:t>En la Ciudad de El Tigre, a los ___ días del mes de _______ de 2026</w:t>
+      </w:r>
+    </w:p>
+    <w:p/>
+    <w:p>
+      <w:pPr>
+        <w:jc w:val="center"/>
+      </w:pPr>
+      <w:r>
+        <w:rPr>
+          <w:rFonts w:ascii="Times New Roman" w:hAnsi="Times New Roman"/>
+          <w:sz w:val="24"/>
+        </w:rPr>
+        <w:t>___________________________________</w:t>
+      </w:r>
+    </w:p>
+    <w:p/>
+    <w:p>
+      <w:pPr>
+        <w:spacing w:line="360" w:lineRule="auto"/>
+        <w:jc w:val="center"/>
+      </w:pPr>
+      <w:r>
+        <w:rPr>
+          <w:rFonts w:ascii="Times New Roman" w:hAnsi="Times New Roman"/>
+          <w:b/>
+          <w:sz w:val="24"/>
+        </w:rPr>
+        <w:t>Dra. Álvarez, Carmen</w:t>
+      </w:r>
+    </w:p>
+    <w:p>
+      <w:pPr>
+        <w:spacing w:before="0"/>
+        <w:jc w:val="center"/>
+      </w:pPr>
+      <w:r>
+        <w:rPr>
+          <w:rFonts w:ascii="Times New Roman" w:hAnsi="Times New Roman"/>
+          <w:sz w:val="24"/>
+        </w:rPr>
+        <w:t>C.I.: 14.452.956</w:t>
       </w:r>
     </w:p>
     <w:p>
@@ -795,6 +769,32 @@
     </w:p>
     <w:p>
       <w:pPr>
+        <w:spacing w:before="1140" w:after="480"/>
+        <w:jc w:val="center"/>
+      </w:pPr>
+      <w:r>
+        <w:rPr>
+          <w:rFonts w:ascii="Times New Roman" w:hAnsi="Times New Roman"/>
+          <w:b/>
+          <w:sz w:val="24"/>
+        </w:rPr>
+        <w:t>ÍNDICE DE CONTENIDO</w:t>
+      </w:r>
+    </w:p>
+    <w:p>
+      <w:pPr>
+        <w:sectPr>
+          <w:footerReference w:type="default" r:id="rId20"/>
+          <w:pgSz w:w="12240" w:h="15840"/>
+          <w:pgMar w:top="1701" w:right="1701" w:bottom="1701" w:left="2268" w:header="720" w:footer="720" w:gutter="0"/>
+          <w:cols w:space="720"/>
+          <w:titlePg/>
+          <w:docGrid w:linePitch="360"/>
+        </w:sectPr>
+      </w:pPr>
+    </w:p>
+    <w:p>
+      <w:pPr>
         <w:spacing w:after="240"/>
         <w:jc w:val="right"/>
       </w:pPr>
@@ -1781,7 +1781,7 @@
     <w:p>
       <w:pPr>
         <w:sectPr>
-          <w:footerReference w:type="default" r:id="rId20"/>
+          <w:footerReference w:type="default" r:id="rId21"/>
           <w:type w:val="continuous"/>
           <w:pgSz w:w="12240" w:h="15840"/>
           <w:pgMar w:top="1701" w:right="1701" w:bottom="1701" w:left="2268" w:header="720" w:footer="720" w:gutter="0"/>
@@ -1810,7 +1810,7 @@
     <w:p>
       <w:pPr>
         <w:sectPr>
-          <w:footerReference w:type="default" r:id="rId21"/>
+          <w:footerReference w:type="default" r:id="rId22"/>
           <w:pgSz w:w="12240" w:h="15840"/>
           <w:pgMar w:top="1701" w:right="1701" w:bottom="1701" w:left="2268" w:header="720" w:footer="720" w:gutter="0"/>
           <w:cols w:space="720"/>
@@ -1913,7 +1913,7 @@
     <w:p>
       <w:pPr>
         <w:sectPr>
-          <w:footerReference w:type="default" r:id="rId22"/>
+          <w:footerReference w:type="default" r:id="rId23"/>
           <w:type w:val="continuous"/>
           <w:pgSz w:w="12240" w:h="15840"/>
           <w:pgMar w:top="1701" w:right="1701" w:bottom="1701" w:left="2268" w:header="720" w:footer="720" w:gutter="0"/>
@@ -1942,7 +1942,7 @@
     <w:p>
       <w:pPr>
         <w:sectPr>
-          <w:footerReference w:type="default" r:id="rId23"/>
+          <w:footerReference w:type="default" r:id="rId24"/>
           <w:pgSz w:w="12240" w:h="15840"/>
           <w:pgMar w:top="1701" w:right="1701" w:bottom="1701" w:left="2268" w:header="720" w:footer="720" w:gutter="0"/>
           <w:cols w:space="720"/>
@@ -2109,7 +2109,7 @@
     <w:p>
       <w:pPr>
         <w:sectPr>
-          <w:footerReference w:type="default" r:id="rId24"/>
+          <w:footerReference w:type="default" r:id="rId25"/>
           <w:type w:val="continuous"/>
           <w:pgSz w:w="12240" w:h="15840"/>
           <w:pgMar w:top="1701" w:right="1701" w:bottom="1701" w:left="2268" w:header="720" w:footer="720" w:gutter="0"/>
@@ -2138,7 +2138,7 @@
     <w:p>
       <w:pPr>
         <w:sectPr>
-          <w:footerReference w:type="default" r:id="rId25"/>
+          <w:footerReference w:type="default" r:id="rId26"/>
           <w:pgSz w:w="12240" w:h="15840"/>
           <w:pgMar w:top="1701" w:right="1701" w:bottom="1701" w:left="2268" w:header="720" w:footer="720" w:gutter="0"/>
           <w:cols w:space="720"/>
@@ -2209,7 +2209,7 @@
     <w:p>
       <w:pPr>
         <w:sectPr>
-          <w:footerReference w:type="default" r:id="rId26"/>
+          <w:footerReference w:type="default" r:id="rId27"/>
           <w:type w:val="continuous"/>
           <w:pgSz w:w="12240" w:h="15840"/>
           <w:pgMar w:top="1701" w:right="1701" w:bottom="1701" w:left="2268" w:header="720" w:footer="720" w:gutter="0"/>
@@ -2366,7 +2366,7 @@
     <w:p>
       <w:pPr>
         <w:sectPr>
-          <w:footerReference w:type="default" r:id="rId27"/>
+          <w:footerReference w:type="default" r:id="rId28"/>
           <w:pgSz w:w="12240" w:h="15840"/>
           <w:pgMar w:top="1701" w:right="1701" w:bottom="1701" w:left="2268" w:header="720" w:footer="720" w:gutter="0"/>
           <w:cols w:space="720"/>
@@ -2408,7 +2408,7 @@
     <w:p>
       <w:pPr>
         <w:sectPr>
-          <w:footerReference w:type="default" r:id="rId28"/>
+          <w:footerReference w:type="default" r:id="rId29"/>
           <w:type w:val="continuous"/>
           <w:pgSz w:w="12240" w:h="15840"/>
           <w:pgMar w:top="1701" w:right="1701" w:bottom="1701" w:left="2268" w:header="720" w:footer="720" w:gutter="0"/>
@@ -2437,7 +2437,7 @@
     <w:p>
       <w:pPr>
         <w:sectPr>
-          <w:footerReference w:type="default" r:id="rId29"/>
+          <w:footerReference w:type="default" r:id="rId30"/>
           <w:pgSz w:w="12240" w:h="15840"/>
           <w:pgMar w:top="1701" w:right="1701" w:bottom="1701" w:left="2268" w:header="720" w:footer="720" w:gutter="0"/>
           <w:cols w:space="720"/>
@@ -2509,7 +2509,7 @@
     <w:p>
       <w:pPr>
         <w:sectPr>
-          <w:footerReference w:type="default" r:id="rId30"/>
+          <w:footerReference w:type="default" r:id="rId31"/>
           <w:type w:val="continuous"/>
           <w:pgSz w:w="12240" w:h="15840"/>
           <w:pgMar w:top="1701" w:right="1701" w:bottom="1701" w:left="2268" w:header="720" w:footer="720" w:gutter="0"/>
@@ -2552,7 +2552,7 @@
     <w:p>
       <w:pPr>
         <w:sectPr>
-          <w:footerReference w:type="default" r:id="rId31"/>
+          <w:footerReference w:type="default" r:id="rId32"/>
           <w:pgSz w:w="12240" w:h="15840"/>
           <w:pgMar w:top="1701" w:right="1701" w:bottom="1701" w:left="2268" w:header="720" w:footer="720" w:gutter="0"/>
           <w:cols w:space="720"/>
@@ -2607,6 +2607,91 @@
       </w:r>
     </w:p>
     <w:p>
+      <w:pPr>
+        <w:spacing w:before="480"/>
+        <w:jc w:val="center"/>
+      </w:pPr>
+      <w:r>
+        <w:drawing>
+          <wp:inline xmlns:a="http://schemas.openxmlformats.org/drawingml/2006/main" xmlns:pic="http://schemas.openxmlformats.org/drawingml/2006/picture">
+            <wp:extent cx="1512000" cy="1512000"/>
+            <wp:docPr id="3" name="Picture 3"/>
+            <wp:cNvGraphicFramePr>
+              <a:graphicFrameLocks noChangeAspect="1"/>
+            </wp:cNvGraphicFramePr>
+            <a:graphic>
+              <a:graphicData uri="http://schemas.openxmlformats.org/drawingml/2006/picture">
+                <pic:pic>
+                  <pic:nvPicPr>
+                    <pic:cNvPr id="0" name="logo.jpg"/>
+                    <pic:cNvPicPr/>
+                  </pic:nvPicPr>
+                  <pic:blipFill>
+                    <a:blip r:embed="rId11"/>
+                    <a:stretch>
+                      <a:fillRect/>
+                    </a:stretch>
+                  </pic:blipFill>
+                  <pic:spPr>
+                    <a:xfrm>
+                      <a:off x="0" y="0"/>
+                      <a:ext cx="1512000" cy="1512000"/>
+                    </a:xfrm>
+                    <a:prstGeom prst="rect"/>
+                  </pic:spPr>
+                </pic:pic>
+              </a:graphicData>
+            </a:graphic>
+          </wp:inline>
+        </w:drawing>
+      </w:r>
+    </w:p>
+    <w:p>
+      <w:bookmarkStart w:id="bm_grafico1" w:name="bm_grafico1"/>
+      <w:pPr>
+        <w:spacing w:before="120" w:after="480"/>
+        <w:jc w:val="center"/>
+      </w:pPr>
+      <w:r>
+        <w:rPr>
+          <w:rFonts w:ascii="Times New Roman" w:hAnsi="Times New Roman"/>
+          <w:i/>
+          <w:sz w:val="24"/>
+        </w:rPr>
+        <w:t xml:space="preserve">Gráfico 1. </w:t>
+      </w:r>
+      <w:r>
+        <w:rPr>
+          <w:rFonts w:ascii="Times New Roman" w:hAnsi="Times New Roman"/>
+          <w:b/>
+          <w:sz w:val="24"/>
+        </w:rPr>
+        <w:t>Logotipo de Ingeniería de Telecomunicaciones, C.A.</w:t>
+      </w:r>
+      <w:bookmarkEnd w:id="bm_grafico1"/>
+    </w:p>
+    <w:p>
+      <w:pPr>
+        <w:spacing w:before="0" w:after="240"/>
+        <w:jc w:val="center"/>
+      </w:pPr>
+      <w:r>
+        <w:rPr>
+          <w:rFonts w:ascii="Times New Roman" w:hAnsi="Times New Roman"/>
+          <w:i/>
+          <w:sz w:val="24"/>
+        </w:rPr>
+        <w:t xml:space="preserve">Fuente: </w:t>
+      </w:r>
+      <w:r>
+        <w:rPr>
+          <w:rFonts w:ascii="Times New Roman" w:hAnsi="Times New Roman"/>
+          <w:sz w:val="24"/>
+        </w:rPr>
+        <w:t>Ingeniería de Telecomunicaciones, C.A. (2026).</w:t>
+      </w:r>
+    </w:p>
+    <w:p>
       <w:bookmarkStart w:id="bm_cap1_resena" w:name="bm_cap1_resena"/>
       <w:pPr>
         <w:spacing w:before="480" w:after="480" w:line="360" w:lineRule="auto"/>
@@ -3017,7 +3102,7 @@
         <w:drawing>
           <wp:inline xmlns:a="http://schemas.openxmlformats.org/drawingml/2006/main" xmlns:pic="http://schemas.openxmlformats.org/drawingml/2006/picture">
             <wp:extent cx="1800000" cy="1125000"/>
-            <wp:docPr id="3" name="Picture 3"/>
+            <wp:docPr id="4" name="Picture 4"/>
             <wp:cNvGraphicFramePr>
               <a:graphicFrameLocks noChangeAspect="1"/>
             </wp:cNvGraphicFramePr>
@@ -3029,7 +3114,7 @@
                     <pic:cNvPicPr/>
                   </pic:nvPicPr>
                   <pic:blipFill>
-                    <a:blip r:embed="rId11"/>
+                    <a:blip r:embed="rId12"/>
                     <a:stretch>
                       <a:fillRect/>
                     </a:stretch>
@@ -3158,7 +3243,7 @@
         <w:drawing>
           <wp:inline xmlns:a="http://schemas.openxmlformats.org/drawingml/2006/main" xmlns:pic="http://schemas.openxmlformats.org/drawingml/2006/picture">
             <wp:extent cx="4320000" cy="1847904"/>
-            <wp:docPr id="4" name="Picture 4"/>
+            <wp:docPr id="5" name="Picture 5"/>
             <wp:cNvGraphicFramePr>
               <a:graphicFrameLocks noChangeAspect="1"/>
             </wp:cNvGraphicFramePr>
@@ -3170,7 +3255,7 @@
                     <pic:cNvPicPr/>
                   </pic:nvPicPr>
                   <pic:blipFill>
-                    <a:blip r:embed="rId12"/>
+                    <a:blip r:embed="rId13"/>
                     <a:stretch>
                       <a:fillRect/>
                     </a:stretch>
@@ -3222,7 +3307,7 @@
         <w:drawing>
           <wp:inline xmlns:a="http://schemas.openxmlformats.org/drawingml/2006/main" xmlns:pic="http://schemas.openxmlformats.org/drawingml/2006/picture">
             <wp:extent cx="4320000" cy="2680292"/>
-            <wp:docPr id="5" name="Picture 5"/>
+            <wp:docPr id="6" name="Picture 6"/>
             <wp:cNvGraphicFramePr>
               <a:graphicFrameLocks noChangeAspect="1"/>
             </wp:cNvGraphicFramePr>
@@ -3234,7 +3319,7 @@
                     <pic:cNvPicPr/>
                   </pic:nvPicPr>
                   <pic:blipFill>
-                    <a:blip r:embed="rId13"/>
+                    <a:blip r:embed="rId14"/>
                     <a:stretch>
                       <a:fillRect/>
                     </a:stretch>
@@ -3280,7 +3365,7 @@
     <w:p>
       <w:pPr>
         <w:sectPr>
-          <w:footerReference w:type="default" r:id="rId32"/>
+          <w:footerReference w:type="default" r:id="rId33"/>
           <w:type w:val="continuous"/>
           <w:pgSz w:w="12240" w:h="15840"/>
           <w:pgMar w:top="1701" w:right="1701" w:bottom="1701" w:left="2268" w:header="720" w:footer="720" w:gutter="0"/>
@@ -3323,7 +3408,7 @@
     <w:p>
       <w:pPr>
         <w:sectPr>
-          <w:footerReference w:type="default" r:id="rId33"/>
+          <w:footerReference w:type="default" r:id="rId34"/>
           <w:pgSz w:w="12240" w:h="15840"/>
           <w:pgMar w:top="1701" w:right="1701" w:bottom="1701" w:left="2268" w:header="720" w:footer="720" w:gutter="0"/>
           <w:cols w:space="720"/>
@@ -7125,7 +7210,7 @@
     <w:p>
       <w:pPr>
         <w:sectPr>
-          <w:footerReference w:type="default" r:id="rId34"/>
+          <w:footerReference w:type="default" r:id="rId35"/>
           <w:type w:val="continuous"/>
           <w:pgSz w:w="12240" w:h="15840"/>
           <w:pgMar w:top="1701" w:right="1701" w:bottom="1701" w:left="2268" w:header="720" w:footer="720" w:gutter="0"/>
@@ -7168,7 +7253,7 @@
     <w:p>
       <w:pPr>
         <w:sectPr>
-          <w:footerReference w:type="default" r:id="rId35"/>
+          <w:footerReference w:type="default" r:id="rId36"/>
           <w:pgSz w:w="12240" w:h="15840"/>
           <w:pgMar w:top="1701" w:right="1701" w:bottom="1701" w:left="2268" w:header="720" w:footer="720" w:gutter="0"/>
           <w:cols w:space="720"/>
@@ -7557,7 +7642,7 @@
     <w:p>
       <w:pPr>
         <w:sectPr>
-          <w:footerReference w:type="default" r:id="rId36"/>
+          <w:footerReference w:type="default" r:id="rId37"/>
           <w:type w:val="continuous"/>
           <w:pgSz w:w="12240" w:h="15840"/>
           <w:pgMar w:top="1701" w:right="1701" w:bottom="1701" w:left="2268" w:header="720" w:footer="720" w:gutter="0"/>
@@ -7600,7 +7685,7 @@
     <w:p>
       <w:pPr>
         <w:sectPr>
-          <w:footerReference w:type="default" r:id="rId37"/>
+          <w:footerReference w:type="default" r:id="rId38"/>
           <w:pgSz w:w="12240" w:h="15840"/>
           <w:pgMar w:top="1701" w:right="1701" w:bottom="1701" w:left="2268" w:header="720" w:footer="720" w:gutter="0"/>
           <w:cols w:space="720"/>
@@ -8363,7 +8448,7 @@
     <w:p>
       <w:pPr>
         <w:sectPr>
-          <w:footerReference w:type="default" r:id="rId38"/>
+          <w:footerReference w:type="default" r:id="rId39"/>
           <w:type w:val="continuous"/>
           <w:pgSz w:w="12240" w:h="15840"/>
           <w:pgMar w:top="1701" w:right="1701" w:bottom="1701" w:left="2268" w:header="720" w:footer="720" w:gutter="0"/>
@@ -8406,7 +8491,7 @@
     <w:p>
       <w:pPr>
         <w:sectPr>
-          <w:footerReference w:type="default" r:id="rId39"/>
+          <w:footerReference w:type="default" r:id="rId40"/>
           <w:pgSz w:w="12240" w:h="15840"/>
           <w:pgMar w:top="1701" w:right="1701" w:bottom="1701" w:left="2268" w:header="720" w:footer="720" w:gutter="0"/>
           <w:cols w:space="720"/>
@@ -8618,7 +8703,7 @@
     <w:p>
       <w:pPr>
         <w:sectPr>
-          <w:footerReference w:type="default" r:id="rId40"/>
+          <w:footerReference w:type="default" r:id="rId41"/>
           <w:type w:val="continuous"/>
           <w:pgSz w:w="12240" w:h="15840"/>
           <w:pgMar w:top="1701" w:right="1701" w:bottom="1701" w:left="2268" w:header="720" w:footer="720" w:gutter="0"/>
@@ -8647,7 +8732,7 @@
     <w:p>
       <w:pPr>
         <w:sectPr>
-          <w:footerReference w:type="default" r:id="rId41"/>
+          <w:footerReference w:type="default" r:id="rId42"/>
           <w:pgSz w:w="12240" w:h="15840"/>
           <w:pgMar w:top="1701" w:right="1701" w:bottom="1701" w:left="2268" w:header="720" w:footer="720" w:gutter="0"/>
           <w:cols w:space="720"/>
@@ -8776,7 +8861,7 @@
     <w:p>
       <w:pPr>
         <w:sectPr>
-          <w:footerReference w:type="default" r:id="rId42"/>
+          <w:footerReference w:type="default" r:id="rId43"/>
           <w:type w:val="continuous"/>
           <w:pgSz w:w="12240" w:h="15840"/>
           <w:pgMar w:top="1701" w:right="1701" w:bottom="1701" w:left="2268" w:header="720" w:footer="720" w:gutter="0"/>
@@ -8805,7 +8890,7 @@
     <w:p>
       <w:pPr>
         <w:sectPr>
-          <w:footerReference w:type="default" r:id="rId43"/>
+          <w:footerReference w:type="default" r:id="rId44"/>
           <w:pgSz w:w="12240" w:h="15840"/>
           <w:pgMar w:top="1701" w:right="1701" w:bottom="1701" w:left="2268" w:header="720" w:footer="720" w:gutter="0"/>
           <w:cols w:space="720"/>
@@ -8852,7 +8937,7 @@
         <w:drawing>
           <wp:inline xmlns:a="http://schemas.openxmlformats.org/drawingml/2006/main" xmlns:pic="http://schemas.openxmlformats.org/drawingml/2006/picture">
             <wp:extent cx="3960000" cy="4860000"/>
-            <wp:docPr id="6" name="Picture 6"/>
+            <wp:docPr id="7" name="Picture 7"/>
             <wp:cNvGraphicFramePr>
               <a:graphicFrameLocks noChangeAspect="1"/>
             </wp:cNvGraphicFramePr>
@@ -8864,7 +8949,7 @@
                     <pic:cNvPicPr/>
                   </pic:nvPicPr>
                   <pic:blipFill>
-                    <a:blip r:embed="rId14"/>
+                    <a:blip r:embed="rId15"/>
                     <a:stretch>
                       <a:fillRect/>
                     </a:stretch>
@@ -8884,7 +8969,7 @@
       </w:r>
     </w:p>
     <w:sectPr>
-      <w:footerReference w:type="default" r:id="rId44"/>
+      <w:footerReference w:type="default" r:id="rId45"/>
       <w:pgSz w:w="12240" w:h="15840"/>
       <w:pgMar w:top="1701" w:right="1701" w:bottom="1701" w:left="2268" w:header="720" w:footer="720" w:gutter="0"/>
       <w:cols w:space="720"/>

</xml_diff>

<commit_message>
Ubicar logos antes de la ubicación geográfica
</commit_message>
<xml_diff>
--- a/amaal/reportes/Informe_Pasantia_IUTECP.docx
+++ b/amaal/reportes/Informe_Pasantia_IUTECP.docx
@@ -2607,6 +2607,377 @@
       </w:r>
     </w:p>
     <w:p>
+      <w:bookmarkStart w:id="bm_cap1_resena" w:name="bm_cap1_resena"/>
+      <w:pPr>
+        <w:spacing w:before="480" w:after="480" w:line="360" w:lineRule="auto"/>
+        <w:jc w:val="left"/>
+      </w:pPr>
+      <w:r>
+        <w:rPr>
+          <w:rFonts w:ascii="Times New Roman" w:hAnsi="Times New Roman"/>
+          <w:b/>
+          <w:sz w:val="24"/>
+        </w:rPr>
+        <w:t>Reseña histórica</w:t>
+      </w:r>
+      <w:bookmarkEnd w:id="bm_cap1_resena"/>
+    </w:p>
+    <w:p>
+      <w:pPr>
+        <w:spacing w:line="360" w:lineRule="auto" w:after="0" w:before="0"/>
+        <w:ind w:firstLine="709"/>
+        <w:jc w:val="both"/>
+      </w:pPr>
+      <w:r>
+        <w:rPr>
+          <w:rFonts w:ascii="Times New Roman" w:hAnsi="Times New Roman"/>
+          <w:i w:val="0"/>
+          <w:sz w:val="24"/>
+        </w:rPr>
+        <w:t>Ingeniería de Telecomunicaciones, C.A. se consolidó en la ciudad de El Tigre, estado Anzoátegui, acumulando una trayectoria de más de cuatro (4) décadas en el mercado tecnológico de la región oriental de Venezuela. Un hito fundamental en su evolución histórica se remonta al año 1983, cuando la organización se convirtió en el primer Distribuidor Autorizado Motorola para sistemas de radio de dos vías en el oriente del país, alianza estratégica que se ha mantenido vigente e ininterrumpida a lo largo de las décadas.</w:t>
+      </w:r>
+    </w:p>
+    <w:p>
+      <w:pPr>
+        <w:spacing w:line="360" w:lineRule="auto" w:after="0" w:before="0"/>
+        <w:ind w:firstLine="709"/>
+        <w:jc w:val="both"/>
+      </w:pPr>
+      <w:r>
+        <w:rPr>
+          <w:rFonts w:ascii="Times New Roman" w:hAnsi="Times New Roman"/>
+          <w:i w:val="0"/>
+          <w:sz w:val="24"/>
+        </w:rPr>
+        <w:t>A través de los años, impulsada por las demandas operativas de la Faja Petrolífera del Orinoco y las necesidades de conectividad comercial, la empresa expandió sus líneas tecnológicas progresivamente. Pasó de suministrar sistemas de radiocomunicación analógica convencional en bandas VHF/UHF y sistemas Trunking analógicos (800 MHz), a liderar el mercado regional con tecnologías de radiocomunicación digital de gama alta como los estándares TETRA (europeo) y P25 (americano), esenciales para operaciones industriales de misión crítica.</w:t>
+      </w:r>
+    </w:p>
+    <w:p>
+      <w:pPr>
+        <w:spacing w:line="360" w:lineRule="auto" w:after="0" w:before="0"/>
+        <w:ind w:firstLine="709"/>
+        <w:jc w:val="both"/>
+      </w:pPr>
+      <w:r>
+        <w:rPr>
+          <w:rFonts w:ascii="Times New Roman" w:hAnsi="Times New Roman"/>
+          <w:i w:val="0"/>
+          <w:sz w:val="24"/>
+        </w:rPr>
+        <w:t>Con la maduración del sector tecnológico, IDETEL incorporó a su portafolio soluciones de ampliación de cobertura inalámbrica, enlaces de microondas en bandas licenciadas y no licenciadas, redes de telemetría y telecomunicaciones alámbricas, consolidando su modelo de negocios en torno a Proyectos IPC (Ingeniería, Procura y Construcción), respaldado por un laboratorio técnico especializado y personal altamente calificado.</w:t>
+      </w:r>
+    </w:p>
+    <w:p>
+      <w:bookmarkStart w:id="bm_cap1_mision" w:name="bm_cap1_mision"/>
+      <w:pPr>
+        <w:spacing w:before="480" w:after="480" w:line="360" w:lineRule="auto"/>
+        <w:jc w:val="left"/>
+      </w:pPr>
+      <w:r>
+        <w:rPr>
+          <w:rFonts w:ascii="Times New Roman" w:hAnsi="Times New Roman"/>
+          <w:b/>
+          <w:sz w:val="24"/>
+        </w:rPr>
+        <w:t>Misión</w:t>
+      </w:r>
+      <w:bookmarkEnd w:id="bm_cap1_mision"/>
+    </w:p>
+    <w:p>
+      <w:pPr>
+        <w:spacing w:line="360" w:lineRule="auto" w:after="0" w:before="0"/>
+        <w:ind w:firstLine="709"/>
+        <w:jc w:val="both"/>
+      </w:pPr>
+      <w:r>
+        <w:rPr>
+          <w:rFonts w:ascii="Times New Roman" w:hAnsi="Times New Roman"/>
+          <w:i w:val="0"/>
+          <w:sz w:val="24"/>
+        </w:rPr>
+        <w:t>Brindar soluciones con altos estándares de confiabilidad en servicios de radiocomunicación y datos al segmento de mercado PyME, así como la entrega de servicios de calidad en el sector petrolero, asociados a los esfuerzos en ingeniería (integración multidisciplinaria), planificación y ejecución de proyectos de telecomunicaciones y automatización.</w:t>
+      </w:r>
+    </w:p>
+    <w:p>
+      <w:bookmarkStart w:id="bm_cap1_vision" w:name="bm_cap1_vision"/>
+      <w:pPr>
+        <w:spacing w:before="480" w:after="480" w:line="360" w:lineRule="auto"/>
+        <w:jc w:val="left"/>
+      </w:pPr>
+      <w:r>
+        <w:rPr>
+          <w:rFonts w:ascii="Times New Roman" w:hAnsi="Times New Roman"/>
+          <w:b/>
+          <w:sz w:val="24"/>
+        </w:rPr>
+        <w:t>Visión</w:t>
+      </w:r>
+      <w:bookmarkEnd w:id="bm_cap1_vision"/>
+    </w:p>
+    <w:p>
+      <w:pPr>
+        <w:spacing w:line="360" w:lineRule="auto" w:after="0" w:before="0"/>
+        <w:ind w:firstLine="709"/>
+        <w:jc w:val="both"/>
+      </w:pPr>
+      <w:r>
+        <w:rPr>
+          <w:rFonts w:ascii="Times New Roman" w:hAnsi="Times New Roman"/>
+          <w:i w:val="0"/>
+          <w:sz w:val="24"/>
+        </w:rPr>
+        <w:t>Ser reconocidos por los clientes como un proveedor de servicios altamente confiable y con altos estándares técnicos y de ingeniería, con capacidad de brindar soluciones multidisciplinarias en el área de automatización y telecomunicaciones, fortaleciendo continuamente el capital humano mediante capacitación y mejora progresiva de las instalaciones, con el fin de obtener la innovación, competitividad y liderazgo necesarios para sobresalir en el mercado de nuevas tecnologías.</w:t>
+      </w:r>
+    </w:p>
+    <w:p>
+      <w:bookmarkStart w:id="bm_cap1_valores" w:name="bm_cap1_valores"/>
+      <w:pPr>
+        <w:spacing w:before="480" w:after="480" w:line="360" w:lineRule="auto"/>
+        <w:jc w:val="left"/>
+      </w:pPr>
+      <w:r>
+        <w:rPr>
+          <w:rFonts w:ascii="Times New Roman" w:hAnsi="Times New Roman"/>
+          <w:b/>
+          <w:sz w:val="24"/>
+        </w:rPr>
+        <w:t>Valores</w:t>
+      </w:r>
+      <w:bookmarkEnd w:id="bm_cap1_valores"/>
+    </w:p>
+    <w:p>
+      <w:pPr>
+        <w:spacing w:line="360" w:lineRule="auto" w:after="0" w:before="0"/>
+        <w:ind w:firstLine="709"/>
+        <w:jc w:val="both"/>
+      </w:pPr>
+      <w:r>
+        <w:rPr>
+          <w:rFonts w:ascii="Times New Roman" w:hAnsi="Times New Roman"/>
+          <w:i w:val="0"/>
+          <w:sz w:val="24"/>
+        </w:rPr>
+        <w:t>Los valores que orientan las actividades de la organización destacan:</w:t>
+      </w:r>
+    </w:p>
+    <w:p>
+      <w:pPr>
+        <w:spacing w:line="360" w:lineRule="auto"/>
+        <w:ind w:firstLine="709"/>
+        <w:jc w:val="both"/>
+      </w:pPr>
+      <w:r>
+        <w:rPr>
+          <w:rFonts w:ascii="Times New Roman" w:hAnsi="Times New Roman"/>
+          <w:sz w:val="24"/>
+        </w:rPr>
+        <w:t xml:space="preserve">1. </w:t>
+      </w:r>
+      <w:r>
+        <w:rPr>
+          <w:rFonts w:ascii="Times New Roman" w:hAnsi="Times New Roman"/>
+          <w:b/>
+          <w:sz w:val="24"/>
+        </w:rPr>
+        <w:t xml:space="preserve">Confiabilidad: </w:t>
+      </w:r>
+      <w:r>
+        <w:rPr>
+          <w:rFonts w:ascii="Times New Roman" w:hAnsi="Times New Roman"/>
+          <w:sz w:val="24"/>
+        </w:rPr>
+        <w:t>Compromiso de entregar soluciones tecnológicas robustas que cumplan con los más altos estándares técnicos y de ingeniería para garantizar operaciones continuas y seguras.</w:t>
+      </w:r>
+    </w:p>
+    <w:p>
+      <w:pPr>
+        <w:spacing w:line="360" w:lineRule="auto"/>
+        <w:ind w:firstLine="709"/>
+        <w:jc w:val="both"/>
+      </w:pPr>
+      <w:r>
+        <w:rPr>
+          <w:rFonts w:ascii="Times New Roman" w:hAnsi="Times New Roman"/>
+          <w:sz w:val="24"/>
+        </w:rPr>
+        <w:t xml:space="preserve">2. </w:t>
+      </w:r>
+      <w:r>
+        <w:rPr>
+          <w:rFonts w:ascii="Times New Roman" w:hAnsi="Times New Roman"/>
+          <w:b/>
+          <w:sz w:val="24"/>
+        </w:rPr>
+        <w:t xml:space="preserve">Innovación y Competitividad: </w:t>
+      </w:r>
+      <w:r>
+        <w:rPr>
+          <w:rFonts w:ascii="Times New Roman" w:hAnsi="Times New Roman"/>
+          <w:sz w:val="24"/>
+        </w:rPr>
+        <w:t>Búsqueda constante de actualización y adopción de tecnologías de última generación para sobresalir y liderar el mercado de soluciones inalámbricas y ópticas.</w:t>
+      </w:r>
+    </w:p>
+    <w:p>
+      <w:pPr>
+        <w:spacing w:line="360" w:lineRule="auto"/>
+        <w:ind w:firstLine="709"/>
+        <w:jc w:val="both"/>
+      </w:pPr>
+      <w:r>
+        <w:rPr>
+          <w:rFonts w:ascii="Times New Roman" w:hAnsi="Times New Roman"/>
+          <w:sz w:val="24"/>
+        </w:rPr>
+        <w:t xml:space="preserve">3. </w:t>
+      </w:r>
+      <w:r>
+        <w:rPr>
+          <w:rFonts w:ascii="Times New Roman" w:hAnsi="Times New Roman"/>
+          <w:b/>
+          <w:sz w:val="24"/>
+        </w:rPr>
+        <w:t xml:space="preserve">Seguridad Laboral e Higiene Ocupacional: </w:t>
+      </w:r>
+      <w:r>
+        <w:rPr>
+          <w:rFonts w:ascii="Times New Roman" w:hAnsi="Times New Roman"/>
+          <w:sz w:val="24"/>
+        </w:rPr>
+        <w:t>Aplicación rigurosa de normas de protección e integridad física del personal en cada obra, instalación en campo o infraestructura crítica atendida.</w:t>
+      </w:r>
+    </w:p>
+    <w:p>
+      <w:pPr>
+        <w:spacing w:line="360" w:lineRule="auto"/>
+        <w:ind w:firstLine="709"/>
+        <w:jc w:val="both"/>
+      </w:pPr>
+      <w:r>
+        <w:rPr>
+          <w:rFonts w:ascii="Times New Roman" w:hAnsi="Times New Roman"/>
+          <w:sz w:val="24"/>
+        </w:rPr>
+        <w:t xml:space="preserve">4. </w:t>
+      </w:r>
+      <w:r>
+        <w:rPr>
+          <w:rFonts w:ascii="Times New Roman" w:hAnsi="Times New Roman"/>
+          <w:b/>
+          <w:sz w:val="24"/>
+        </w:rPr>
+        <w:t xml:space="preserve">Excelencia Técnica: </w:t>
+      </w:r>
+      <w:r>
+        <w:rPr>
+          <w:rFonts w:ascii="Times New Roman" w:hAnsi="Times New Roman"/>
+          <w:sz w:val="24"/>
+        </w:rPr>
+        <w:t>Orientación hacia la precisión en los procesos de diseño, empalme por fusión, certificación de redes y asesoría en laboratorio.</w:t>
+      </w:r>
+    </w:p>
+    <w:p>
+      <w:bookmarkStart w:id="bm_cap1_obj" w:name="bm_cap1_obj"/>
+      <w:pPr>
+        <w:spacing w:before="480" w:after="480" w:line="360" w:lineRule="auto"/>
+        <w:jc w:val="left"/>
+      </w:pPr>
+      <w:r>
+        <w:rPr>
+          <w:rFonts w:ascii="Times New Roman" w:hAnsi="Times New Roman"/>
+          <w:b/>
+          <w:sz w:val="24"/>
+        </w:rPr>
+        <w:t>Objetivos Organizacionales</w:t>
+      </w:r>
+      <w:bookmarkEnd w:id="bm_cap1_obj"/>
+    </w:p>
+    <w:p>
+      <w:pPr>
+        <w:spacing w:before="480" w:after="480" w:line="360" w:lineRule="auto"/>
+        <w:jc w:val="left"/>
+      </w:pPr>
+      <w:r>
+        <w:rPr>
+          <w:rFonts w:ascii="Times New Roman" w:hAnsi="Times New Roman"/>
+          <w:b/>
+          <w:sz w:val="24"/>
+        </w:rPr>
+        <w:t>Objetivo General</w:t>
+      </w:r>
+    </w:p>
+    <w:p>
+      <w:pPr>
+        <w:spacing w:line="360" w:lineRule="auto" w:after="0" w:before="0"/>
+        <w:ind w:firstLine="709"/>
+        <w:jc w:val="both"/>
+      </w:pPr>
+      <w:r>
+        <w:rPr>
+          <w:rFonts w:ascii="Times New Roman" w:hAnsi="Times New Roman"/>
+          <w:i w:val="0"/>
+          <w:sz w:val="24"/>
+        </w:rPr>
+        <w:t>Ejecutar todo género de actividad o prestación de servicios relacionados directa o indirectamente con el ramo de las comunicaciones, computación y la electrónica en general.</w:t>
+      </w:r>
+    </w:p>
+    <w:p>
+      <w:pPr>
+        <w:spacing w:before="480" w:after="480" w:line="360" w:lineRule="auto"/>
+        <w:jc w:val="left"/>
+      </w:pPr>
+      <w:r>
+        <w:rPr>
+          <w:rFonts w:ascii="Times New Roman" w:hAnsi="Times New Roman"/>
+          <w:b/>
+          <w:sz w:val="24"/>
+        </w:rPr>
+        <w:t>Objetivos Específicos</w:t>
+      </w:r>
+    </w:p>
+    <w:p>
+      <w:pPr>
+        <w:spacing w:line="360" w:lineRule="auto"/>
+        <w:ind w:firstLine="709"/>
+        <w:jc w:val="both"/>
+      </w:pPr>
+      <w:r>
+        <w:rPr>
+          <w:rFonts w:ascii="Times New Roman" w:hAnsi="Times New Roman"/>
+          <w:sz w:val="24"/>
+        </w:rPr>
+        <w:t xml:space="preserve">1. </w:t>
+      </w:r>
+      <w:r>
+        <w:rPr>
+          <w:rFonts w:ascii="Times New Roman" w:hAnsi="Times New Roman"/>
+          <w:sz w:val="24"/>
+        </w:rPr>
+        <w:t>Prestar servicios de importación, manufacturación, asesoría, ventas, instalaciones, arrendamientos, supervisión y mantenimiento en el área de telecomunicaciones.</w:t>
+      </w:r>
+    </w:p>
+    <w:p>
+      <w:pPr>
+        <w:spacing w:line="360" w:lineRule="auto"/>
+        <w:ind w:firstLine="709"/>
+        <w:jc w:val="both"/>
+      </w:pPr>
+      <w:r>
+        <w:rPr>
+          <w:rFonts w:ascii="Times New Roman" w:hAnsi="Times New Roman"/>
+          <w:sz w:val="24"/>
+        </w:rPr>
+        <w:t xml:space="preserve">2. </w:t>
+      </w:r>
+      <w:r>
+        <w:rPr>
+          <w:rFonts w:ascii="Times New Roman" w:hAnsi="Times New Roman"/>
+          <w:sz w:val="24"/>
+        </w:rPr>
+        <w:t>Representar total o parcialmente cualquier producto comercial relacionado con sus operaciones mercantiles.</w:t>
+      </w:r>
+    </w:p>
+    <w:p>
       <w:pPr>
         <w:spacing w:before="480"/>
         <w:jc w:val="center"/>
@@ -2689,377 +3060,6 @@
           <w:sz w:val="24"/>
         </w:rPr>
         <w:t>Ingeniería de Telecomunicaciones, C.A. (2026).</w:t>
-      </w:r>
-    </w:p>
-    <w:p>
-      <w:bookmarkStart w:id="bm_cap1_resena" w:name="bm_cap1_resena"/>
-      <w:pPr>
-        <w:spacing w:before="480" w:after="480" w:line="360" w:lineRule="auto"/>
-        <w:jc w:val="left"/>
-      </w:pPr>
-      <w:r>
-        <w:rPr>
-          <w:rFonts w:ascii="Times New Roman" w:hAnsi="Times New Roman"/>
-          <w:b/>
-          <w:sz w:val="24"/>
-        </w:rPr>
-        <w:t>Reseña histórica</w:t>
-      </w:r>
-      <w:bookmarkEnd w:id="bm_cap1_resena"/>
-    </w:p>
-    <w:p>
-      <w:pPr>
-        <w:spacing w:line="360" w:lineRule="auto" w:after="0" w:before="0"/>
-        <w:ind w:firstLine="709"/>
-        <w:jc w:val="both"/>
-      </w:pPr>
-      <w:r>
-        <w:rPr>
-          <w:rFonts w:ascii="Times New Roman" w:hAnsi="Times New Roman"/>
-          <w:i w:val="0"/>
-          <w:sz w:val="24"/>
-        </w:rPr>
-        <w:t>Ingeniería de Telecomunicaciones, C.A. se consolidó en la ciudad de El Tigre, estado Anzoátegui, acumulando una trayectoria de más de cuatro (4) décadas en el mercado tecnológico de la región oriental de Venezuela. Un hito fundamental en su evolución histórica se remonta al año 1983, cuando la organización se convirtió en el primer Distribuidor Autorizado Motorola para sistemas de radio de dos vías en el oriente del país, alianza estratégica que se ha mantenido vigente e ininterrumpida a lo largo de las décadas.</w:t>
-      </w:r>
-    </w:p>
-    <w:p>
-      <w:pPr>
-        <w:spacing w:line="360" w:lineRule="auto" w:after="0" w:before="0"/>
-        <w:ind w:firstLine="709"/>
-        <w:jc w:val="both"/>
-      </w:pPr>
-      <w:r>
-        <w:rPr>
-          <w:rFonts w:ascii="Times New Roman" w:hAnsi="Times New Roman"/>
-          <w:i w:val="0"/>
-          <w:sz w:val="24"/>
-        </w:rPr>
-        <w:t>A través de los años, impulsada por las demandas operativas de la Faja Petrolífera del Orinoco y las necesidades de conectividad comercial, la empresa expandió sus líneas tecnológicas progresivamente. Pasó de suministrar sistemas de radiocomunicación analógica convencional en bandas VHF/UHF y sistemas Trunking analógicos (800 MHz), a liderar el mercado regional con tecnologías de radiocomunicación digital de gama alta como los estándares TETRA (europeo) y P25 (americano), esenciales para operaciones industriales de misión crítica.</w:t>
-      </w:r>
-    </w:p>
-    <w:p>
-      <w:pPr>
-        <w:spacing w:line="360" w:lineRule="auto" w:after="0" w:before="0"/>
-        <w:ind w:firstLine="709"/>
-        <w:jc w:val="both"/>
-      </w:pPr>
-      <w:r>
-        <w:rPr>
-          <w:rFonts w:ascii="Times New Roman" w:hAnsi="Times New Roman"/>
-          <w:i w:val="0"/>
-          <w:sz w:val="24"/>
-        </w:rPr>
-        <w:t>Con la maduración del sector tecnológico, IDETEL incorporó a su portafolio soluciones de ampliación de cobertura inalámbrica, enlaces de microondas en bandas licenciadas y no licenciadas, redes de telemetría y telecomunicaciones alámbricas, consolidando su modelo de negocios en torno a Proyectos IPC (Ingeniería, Procura y Construcción), respaldado por un laboratorio técnico especializado y personal altamente calificado.</w:t>
-      </w:r>
-    </w:p>
-    <w:p>
-      <w:bookmarkStart w:id="bm_cap1_mision" w:name="bm_cap1_mision"/>
-      <w:pPr>
-        <w:spacing w:before="480" w:after="480" w:line="360" w:lineRule="auto"/>
-        <w:jc w:val="left"/>
-      </w:pPr>
-      <w:r>
-        <w:rPr>
-          <w:rFonts w:ascii="Times New Roman" w:hAnsi="Times New Roman"/>
-          <w:b/>
-          <w:sz w:val="24"/>
-        </w:rPr>
-        <w:t>Misión</w:t>
-      </w:r>
-      <w:bookmarkEnd w:id="bm_cap1_mision"/>
-    </w:p>
-    <w:p>
-      <w:pPr>
-        <w:spacing w:line="360" w:lineRule="auto" w:after="0" w:before="0"/>
-        <w:ind w:firstLine="709"/>
-        <w:jc w:val="both"/>
-      </w:pPr>
-      <w:r>
-        <w:rPr>
-          <w:rFonts w:ascii="Times New Roman" w:hAnsi="Times New Roman"/>
-          <w:i w:val="0"/>
-          <w:sz w:val="24"/>
-        </w:rPr>
-        <w:t>Brindar soluciones con altos estándares de confiabilidad en servicios de radiocomunicación y datos al segmento de mercado PyME, así como la entrega de servicios de calidad en el sector petrolero, asociados a los esfuerzos en ingeniería (integración multidisciplinaria), planificación y ejecución de proyectos de telecomunicaciones y automatización.</w:t>
-      </w:r>
-    </w:p>
-    <w:p>
-      <w:bookmarkStart w:id="bm_cap1_vision" w:name="bm_cap1_vision"/>
-      <w:pPr>
-        <w:spacing w:before="480" w:after="480" w:line="360" w:lineRule="auto"/>
-        <w:jc w:val="left"/>
-      </w:pPr>
-      <w:r>
-        <w:rPr>
-          <w:rFonts w:ascii="Times New Roman" w:hAnsi="Times New Roman"/>
-          <w:b/>
-          <w:sz w:val="24"/>
-        </w:rPr>
-        <w:t>Visión</w:t>
-      </w:r>
-      <w:bookmarkEnd w:id="bm_cap1_vision"/>
-    </w:p>
-    <w:p>
-      <w:pPr>
-        <w:spacing w:line="360" w:lineRule="auto" w:after="0" w:before="0"/>
-        <w:ind w:firstLine="709"/>
-        <w:jc w:val="both"/>
-      </w:pPr>
-      <w:r>
-        <w:rPr>
-          <w:rFonts w:ascii="Times New Roman" w:hAnsi="Times New Roman"/>
-          <w:i w:val="0"/>
-          <w:sz w:val="24"/>
-        </w:rPr>
-        <w:t>Ser reconocidos por los clientes como un proveedor de servicios altamente confiable y con altos estándares técnicos y de ingeniería, con capacidad de brindar soluciones multidisciplinarias en el área de automatización y telecomunicaciones, fortaleciendo continuamente el capital humano mediante capacitación y mejora progresiva de las instalaciones, con el fin de obtener la innovación, competitividad y liderazgo necesarios para sobresalir en el mercado de nuevas tecnologías.</w:t>
-      </w:r>
-    </w:p>
-    <w:p>
-      <w:bookmarkStart w:id="bm_cap1_valores" w:name="bm_cap1_valores"/>
-      <w:pPr>
-        <w:spacing w:before="480" w:after="480" w:line="360" w:lineRule="auto"/>
-        <w:jc w:val="left"/>
-      </w:pPr>
-      <w:r>
-        <w:rPr>
-          <w:rFonts w:ascii="Times New Roman" w:hAnsi="Times New Roman"/>
-          <w:b/>
-          <w:sz w:val="24"/>
-        </w:rPr>
-        <w:t>Valores</w:t>
-      </w:r>
-      <w:bookmarkEnd w:id="bm_cap1_valores"/>
-    </w:p>
-    <w:p>
-      <w:pPr>
-        <w:spacing w:line="360" w:lineRule="auto" w:after="0" w:before="0"/>
-        <w:ind w:firstLine="709"/>
-        <w:jc w:val="both"/>
-      </w:pPr>
-      <w:r>
-        <w:rPr>
-          <w:rFonts w:ascii="Times New Roman" w:hAnsi="Times New Roman"/>
-          <w:i w:val="0"/>
-          <w:sz w:val="24"/>
-        </w:rPr>
-        <w:t>Los valores que orientan las actividades de la organización destacan:</w:t>
-      </w:r>
-    </w:p>
-    <w:p>
-      <w:pPr>
-        <w:spacing w:line="360" w:lineRule="auto"/>
-        <w:ind w:firstLine="709"/>
-        <w:jc w:val="both"/>
-      </w:pPr>
-      <w:r>
-        <w:rPr>
-          <w:rFonts w:ascii="Times New Roman" w:hAnsi="Times New Roman"/>
-          <w:sz w:val="24"/>
-        </w:rPr>
-        <w:t xml:space="preserve">1. </w:t>
-      </w:r>
-      <w:r>
-        <w:rPr>
-          <w:rFonts w:ascii="Times New Roman" w:hAnsi="Times New Roman"/>
-          <w:b/>
-          <w:sz w:val="24"/>
-        </w:rPr>
-        <w:t xml:space="preserve">Confiabilidad: </w:t>
-      </w:r>
-      <w:r>
-        <w:rPr>
-          <w:rFonts w:ascii="Times New Roman" w:hAnsi="Times New Roman"/>
-          <w:sz w:val="24"/>
-        </w:rPr>
-        <w:t>Compromiso de entregar soluciones tecnológicas robustas que cumplan con los más altos estándares técnicos y de ingeniería para garantizar operaciones continuas y seguras.</w:t>
-      </w:r>
-    </w:p>
-    <w:p>
-      <w:pPr>
-        <w:spacing w:line="360" w:lineRule="auto"/>
-        <w:ind w:firstLine="709"/>
-        <w:jc w:val="both"/>
-      </w:pPr>
-      <w:r>
-        <w:rPr>
-          <w:rFonts w:ascii="Times New Roman" w:hAnsi="Times New Roman"/>
-          <w:sz w:val="24"/>
-        </w:rPr>
-        <w:t xml:space="preserve">2. </w:t>
-      </w:r>
-      <w:r>
-        <w:rPr>
-          <w:rFonts w:ascii="Times New Roman" w:hAnsi="Times New Roman"/>
-          <w:b/>
-          <w:sz w:val="24"/>
-        </w:rPr>
-        <w:t xml:space="preserve">Innovación y Competitividad: </w:t>
-      </w:r>
-      <w:r>
-        <w:rPr>
-          <w:rFonts w:ascii="Times New Roman" w:hAnsi="Times New Roman"/>
-          <w:sz w:val="24"/>
-        </w:rPr>
-        <w:t>Búsqueda constante de actualización y adopción de tecnologías de última generación para sobresalir y liderar el mercado de soluciones inalámbricas y ópticas.</w:t>
-      </w:r>
-    </w:p>
-    <w:p>
-      <w:pPr>
-        <w:spacing w:line="360" w:lineRule="auto"/>
-        <w:ind w:firstLine="709"/>
-        <w:jc w:val="both"/>
-      </w:pPr>
-      <w:r>
-        <w:rPr>
-          <w:rFonts w:ascii="Times New Roman" w:hAnsi="Times New Roman"/>
-          <w:sz w:val="24"/>
-        </w:rPr>
-        <w:t xml:space="preserve">3. </w:t>
-      </w:r>
-      <w:r>
-        <w:rPr>
-          <w:rFonts w:ascii="Times New Roman" w:hAnsi="Times New Roman"/>
-          <w:b/>
-          <w:sz w:val="24"/>
-        </w:rPr>
-        <w:t xml:space="preserve">Seguridad Laboral e Higiene Ocupacional: </w:t>
-      </w:r>
-      <w:r>
-        <w:rPr>
-          <w:rFonts w:ascii="Times New Roman" w:hAnsi="Times New Roman"/>
-          <w:sz w:val="24"/>
-        </w:rPr>
-        <w:t>Aplicación rigurosa de normas de protección e integridad física del personal en cada obra, instalación en campo o infraestructura crítica atendida.</w:t>
-      </w:r>
-    </w:p>
-    <w:p>
-      <w:pPr>
-        <w:spacing w:line="360" w:lineRule="auto"/>
-        <w:ind w:firstLine="709"/>
-        <w:jc w:val="both"/>
-      </w:pPr>
-      <w:r>
-        <w:rPr>
-          <w:rFonts w:ascii="Times New Roman" w:hAnsi="Times New Roman"/>
-          <w:sz w:val="24"/>
-        </w:rPr>
-        <w:t xml:space="preserve">4. </w:t>
-      </w:r>
-      <w:r>
-        <w:rPr>
-          <w:rFonts w:ascii="Times New Roman" w:hAnsi="Times New Roman"/>
-          <w:b/>
-          <w:sz w:val="24"/>
-        </w:rPr>
-        <w:t xml:space="preserve">Excelencia Técnica: </w:t>
-      </w:r>
-      <w:r>
-        <w:rPr>
-          <w:rFonts w:ascii="Times New Roman" w:hAnsi="Times New Roman"/>
-          <w:sz w:val="24"/>
-        </w:rPr>
-        <w:t>Orientación hacia la precisión en los procesos de diseño, empalme por fusión, certificación de redes y asesoría en laboratorio.</w:t>
-      </w:r>
-    </w:p>
-    <w:p>
-      <w:bookmarkStart w:id="bm_cap1_obj" w:name="bm_cap1_obj"/>
-      <w:pPr>
-        <w:spacing w:before="480" w:after="480" w:line="360" w:lineRule="auto"/>
-        <w:jc w:val="left"/>
-      </w:pPr>
-      <w:r>
-        <w:rPr>
-          <w:rFonts w:ascii="Times New Roman" w:hAnsi="Times New Roman"/>
-          <w:b/>
-          <w:sz w:val="24"/>
-        </w:rPr>
-        <w:t>Objetivos Organizacionales</w:t>
-      </w:r>
-      <w:bookmarkEnd w:id="bm_cap1_obj"/>
-    </w:p>
-    <w:p>
-      <w:pPr>
-        <w:spacing w:before="480" w:after="480" w:line="360" w:lineRule="auto"/>
-        <w:jc w:val="left"/>
-      </w:pPr>
-      <w:r>
-        <w:rPr>
-          <w:rFonts w:ascii="Times New Roman" w:hAnsi="Times New Roman"/>
-          <w:b/>
-          <w:sz w:val="24"/>
-        </w:rPr>
-        <w:t>Objetivo General</w:t>
-      </w:r>
-    </w:p>
-    <w:p>
-      <w:pPr>
-        <w:spacing w:line="360" w:lineRule="auto" w:after="0" w:before="0"/>
-        <w:ind w:firstLine="709"/>
-        <w:jc w:val="both"/>
-      </w:pPr>
-      <w:r>
-        <w:rPr>
-          <w:rFonts w:ascii="Times New Roman" w:hAnsi="Times New Roman"/>
-          <w:i w:val="0"/>
-          <w:sz w:val="24"/>
-        </w:rPr>
-        <w:t>Ejecutar todo género de actividad o prestación de servicios relacionados directa o indirectamente con el ramo de las comunicaciones, computación y la electrónica en general.</w:t>
-      </w:r>
-    </w:p>
-    <w:p>
-      <w:pPr>
-        <w:spacing w:before="480" w:after="480" w:line="360" w:lineRule="auto"/>
-        <w:jc w:val="left"/>
-      </w:pPr>
-      <w:r>
-        <w:rPr>
-          <w:rFonts w:ascii="Times New Roman" w:hAnsi="Times New Roman"/>
-          <w:b/>
-          <w:sz w:val="24"/>
-        </w:rPr>
-        <w:t>Objetivos Específicos</w:t>
-      </w:r>
-    </w:p>
-    <w:p>
-      <w:pPr>
-        <w:spacing w:line="360" w:lineRule="auto"/>
-        <w:ind w:firstLine="709"/>
-        <w:jc w:val="both"/>
-      </w:pPr>
-      <w:r>
-        <w:rPr>
-          <w:rFonts w:ascii="Times New Roman" w:hAnsi="Times New Roman"/>
-          <w:sz w:val="24"/>
-        </w:rPr>
-        <w:t xml:space="preserve">1. </w:t>
-      </w:r>
-      <w:r>
-        <w:rPr>
-          <w:rFonts w:ascii="Times New Roman" w:hAnsi="Times New Roman"/>
-          <w:sz w:val="24"/>
-        </w:rPr>
-        <w:t>Prestar servicios de importación, manufacturación, asesoría, ventas, instalaciones, arrendamientos, supervisión y mantenimiento en el área de telecomunicaciones.</w:t>
-      </w:r>
-    </w:p>
-    <w:p>
-      <w:pPr>
-        <w:spacing w:line="360" w:lineRule="auto"/>
-        <w:ind w:firstLine="709"/>
-        <w:jc w:val="both"/>
-      </w:pPr>
-      <w:r>
-        <w:rPr>
-          <w:rFonts w:ascii="Times New Roman" w:hAnsi="Times New Roman"/>
-          <w:sz w:val="24"/>
-        </w:rPr>
-        <w:t xml:space="preserve">2. </w:t>
-      </w:r>
-      <w:r>
-        <w:rPr>
-          <w:rFonts w:ascii="Times New Roman" w:hAnsi="Times New Roman"/>
-          <w:sz w:val="24"/>
-        </w:rPr>
-        <w:t>Representar total o parcialmente cualquier producto comercial relacionado con sus operaciones mercantiles.</w:t>
       </w:r>
     </w:p>
     <w:p>

</xml_diff>

<commit_message>
Ajustar formato normativo y proporción de anexos
</commit_message>
<xml_diff>
--- a/amaal/reportes/Informe_Pasantia_IUTECP.docx
+++ b/amaal/reportes/Informe_Pasantia_IUTECP.docx
@@ -159,10 +159,12 @@
           <w:pgMar w:top="1701" w:right="1701" w:bottom="1701" w:left="2268" w:header="720" w:footer="720" w:gutter="0"/>
           <w:cols w:space="720"/>
           <w:docGrid w:linePitch="360"/>
+          <w:pgNumType w:fmt="lowerRoman" w:start="1"/>
         </w:sectPr>
       </w:pPr>
     </w:p>
     <w:p>
+      <w:bookmarkStart w:id="bm_contraportada" w:name="bm_contraportada"/>
       <w:pPr>
         <w:spacing w:line="240" w:lineRule="auto" w:before="0" w:after="0"/>
         <w:jc w:val="center"/>
@@ -211,6 +213,7 @@
         </w:rPr>
         <w:t>EL TIGRE, ESTADO ANZOÁTEGUI</w:t>
       </w:r>
+      <w:bookmarkEnd w:id="bm_contraportada"/>
     </w:p>
     <w:p>
       <w:pPr>
@@ -397,8 +400,8 @@
           <w:pgSz w:w="12240" w:h="15840"/>
           <w:pgMar w:top="1701" w:right="1701" w:bottom="1701" w:left="2268" w:header="720" w:footer="720" w:gutter="0"/>
           <w:cols w:space="720"/>
-          <w:titlePg/>
           <w:docGrid w:linePitch="360"/>
+          <w:pgNumType w:fmt="lowerRoman"/>
         </w:sectPr>
       </w:pPr>
     </w:p>
@@ -593,8 +596,8 @@
           <w:pgSz w:w="12240" w:h="15840"/>
           <w:pgMar w:top="1701" w:right="1701" w:bottom="1701" w:left="2268" w:header="720" w:footer="720" w:gutter="0"/>
           <w:cols w:space="720"/>
-          <w:titlePg/>
           <w:docGrid w:linePitch="360"/>
+          <w:pgNumType w:fmt="lowerRoman"/>
         </w:sectPr>
       </w:pPr>
     </w:p>
@@ -762,12 +765,13 @@
           <w:pgSz w:w="12240" w:h="15840"/>
           <w:pgMar w:top="1701" w:right="1701" w:bottom="1701" w:left="2268" w:header="720" w:footer="720" w:gutter="0"/>
           <w:cols w:space="720"/>
-          <w:titlePg/>
           <w:docGrid w:linePitch="360"/>
+          <w:pgNumType w:fmt="lowerRoman"/>
         </w:sectPr>
       </w:pPr>
     </w:p>
     <w:p>
+      <w:bookmarkStart w:id="bm_indice" w:name="bm_indice"/>
       <w:pPr>
         <w:spacing w:before="1140" w:after="480"/>
         <w:jc w:val="center"/>
@@ -780,6 +784,7 @@
         </w:rPr>
         <w:t>ÍNDICE DE CONTENIDO</w:t>
       </w:r>
+      <w:bookmarkEnd w:id="bm_indice"/>
     </w:p>
     <w:p>
       <w:pPr>
@@ -788,8 +793,8 @@
           <w:pgSz w:w="12240" w:h="15840"/>
           <w:pgMar w:top="1701" w:right="1701" w:bottom="1701" w:left="2268" w:header="720" w:footer="720" w:gutter="0"/>
           <w:cols w:space="720"/>
-          <w:titlePg/>
           <w:docGrid w:linePitch="360"/>
+          <w:pgNumType w:fmt="lowerRoman"/>
         </w:sectPr>
       </w:pPr>
     </w:p>
@@ -821,6 +826,36 @@
           <w:b w:val="0"/>
           <w:sz w:val="24"/>
         </w:rPr>
+        <w:t>CONTRAPORTADA</w:t>
+        <w:tab/>
+      </w:r>
+      <w:r>
+        <w:rPr>
+          <w:rFonts w:ascii="Times New Roman" w:hAnsi="Times New Roman"/>
+          <w:b w:val="0"/>
+          <w:sz w:val="24"/>
+        </w:rPr>
+        <w:fldChar w:fldCharType="begin"/>
+        <w:instrText xml:space="preserve"> PAGEREF bm_contraportada \h </w:instrText>
+        <w:fldChar w:fldCharType="separate"/>
+        <w:t>?</w:t>
+        <w:fldChar w:fldCharType="end"/>
+      </w:r>
+    </w:p>
+    <w:p>
+      <w:pPr>
+        <w:tabs>
+          <w:tab w:pos="8271" w:val="right" w:leader="dot"/>
+        </w:tabs>
+        <w:spacing w:line="360" w:lineRule="auto" w:before="0" w:after="80"/>
+        <w:ind w:left="0"/>
+      </w:pPr>
+      <w:r>
+        <w:rPr>
+          <w:rFonts w:ascii="Times New Roman" w:hAnsi="Times New Roman"/>
+          <w:b w:val="0"/>
+          <w:sz w:val="24"/>
+        </w:rPr>
         <w:t>APROBACIÓN DEL TUTOR INDUSTRIAL</w:t>
         <w:tab/>
       </w:r>
@@ -1323,6 +1358,36 @@
         </w:rPr>
         <w:fldChar w:fldCharType="begin"/>
         <w:instrText xml:space="preserve"> PAGEREF bm_cap1_estruct \h </w:instrText>
+        <w:fldChar w:fldCharType="separate"/>
+        <w:t>?</w:t>
+        <w:fldChar w:fldCharType="end"/>
+      </w:r>
+    </w:p>
+    <w:p>
+      <w:pPr>
+        <w:tabs>
+          <w:tab w:pos="8271" w:val="right" w:leader="dot"/>
+        </w:tabs>
+        <w:spacing w:line="360" w:lineRule="auto" w:before="0" w:after="80"/>
+        <w:ind w:left="283"/>
+      </w:pPr>
+      <w:r>
+        <w:rPr>
+          <w:rFonts w:ascii="Times New Roman" w:hAnsi="Times New Roman"/>
+          <w:b w:val="0"/>
+          <w:sz w:val="24"/>
+        </w:rPr>
+        <w:t>Descripción del departamento donde realizó la pasantía</w:t>
+        <w:tab/>
+      </w:r>
+      <w:r>
+        <w:rPr>
+          <w:rFonts w:ascii="Times New Roman" w:hAnsi="Times New Roman"/>
+          <w:b w:val="0"/>
+          <w:sz w:val="24"/>
+        </w:rPr>
+        <w:fldChar w:fldCharType="begin"/>
+        <w:instrText xml:space="preserve"> PAGEREF bm_cap1_departamento \h </w:instrText>
         <w:fldChar w:fldCharType="separate"/>
         <w:t>?</w:t>
         <w:fldChar w:fldCharType="end"/>
@@ -1786,8 +1851,8 @@
           <w:pgSz w:w="12240" w:h="15840"/>
           <w:pgMar w:top="1701" w:right="1701" w:bottom="1701" w:left="2268" w:header="720" w:footer="720" w:gutter="0"/>
           <w:cols w:space="720"/>
-          <w:titlePg/>
           <w:docGrid w:linePitch="360"/>
+          <w:pgNumType w:fmt="lowerRoman"/>
         </w:sectPr>
       </w:pPr>
     </w:p>
@@ -1814,8 +1879,8 @@
           <w:pgSz w:w="12240" w:h="15840"/>
           <w:pgMar w:top="1701" w:right="1701" w:bottom="1701" w:left="2268" w:header="720" w:footer="720" w:gutter="0"/>
           <w:cols w:space="720"/>
-          <w:titlePg/>
           <w:docGrid w:linePitch="360"/>
+          <w:pgNumType w:fmt="lowerRoman"/>
         </w:sectPr>
       </w:pPr>
     </w:p>
@@ -1918,8 +1983,8 @@
           <w:pgSz w:w="12240" w:h="15840"/>
           <w:pgMar w:top="1701" w:right="1701" w:bottom="1701" w:left="2268" w:header="720" w:footer="720" w:gutter="0"/>
           <w:cols w:space="720"/>
-          <w:titlePg/>
           <w:docGrid w:linePitch="360"/>
+          <w:pgNumType w:fmt="lowerRoman"/>
         </w:sectPr>
       </w:pPr>
     </w:p>
@@ -1946,8 +2011,8 @@
           <w:pgSz w:w="12240" w:h="15840"/>
           <w:pgMar w:top="1701" w:right="1701" w:bottom="1701" w:left="2268" w:header="720" w:footer="720" w:gutter="0"/>
           <w:cols w:space="720"/>
-          <w:titlePg/>
           <w:docGrid w:linePitch="360"/>
+          <w:pgNumType w:fmt="lowerRoman"/>
         </w:sectPr>
       </w:pPr>
     </w:p>
@@ -2114,8 +2179,8 @@
           <w:pgSz w:w="12240" w:h="15840"/>
           <w:pgMar w:top="1701" w:right="1701" w:bottom="1701" w:left="2268" w:header="720" w:footer="720" w:gutter="0"/>
           <w:cols w:space="720"/>
-          <w:titlePg/>
           <w:docGrid w:linePitch="360"/>
+          <w:pgNumType w:fmt="lowerRoman"/>
         </w:sectPr>
       </w:pPr>
     </w:p>
@@ -2142,8 +2207,8 @@
           <w:pgSz w:w="12240" w:h="15840"/>
           <w:pgMar w:top="1701" w:right="1701" w:bottom="1701" w:left="2268" w:header="720" w:footer="720" w:gutter="0"/>
           <w:cols w:space="720"/>
-          <w:titlePg/>
           <w:docGrid w:linePitch="360"/>
+          <w:pgNumType w:fmt="lowerRoman"/>
         </w:sectPr>
       </w:pPr>
     </w:p>
@@ -2214,14 +2279,14 @@
           <w:pgSz w:w="12240" w:h="15840"/>
           <w:pgMar w:top="1701" w:right="1701" w:bottom="1701" w:left="2268" w:header="720" w:footer="720" w:gutter="0"/>
           <w:cols w:space="720"/>
-          <w:titlePg/>
           <w:docGrid w:linePitch="360"/>
+          <w:pgNumType w:fmt="lowerRoman"/>
         </w:sectPr>
       </w:pPr>
     </w:p>
     <w:p>
       <w:pPr>
-        <w:spacing w:after="0"/>
+        <w:spacing w:line="240" w:lineRule="auto" w:after="0"/>
         <w:jc w:val="center"/>
       </w:pPr>
       <w:r>
@@ -2235,7 +2300,7 @@
     </w:p>
     <w:p>
       <w:pPr>
-        <w:spacing w:after="0"/>
+        <w:spacing w:line="240" w:lineRule="auto" w:after="0"/>
         <w:jc w:val="center"/>
       </w:pPr>
       <w:r>
@@ -2249,7 +2314,7 @@
     </w:p>
     <w:p>
       <w:pPr>
-        <w:spacing w:after="0"/>
+        <w:spacing w:line="240" w:lineRule="auto" w:after="0"/>
         <w:jc w:val="center"/>
       </w:pPr>
       <w:r>
@@ -2263,7 +2328,7 @@
     </w:p>
     <w:p>
       <w:pPr>
-        <w:spacing w:after="0"/>
+        <w:spacing w:line="240" w:lineRule="auto" w:after="0"/>
         <w:jc w:val="center"/>
       </w:pPr>
       <w:r>
@@ -2277,7 +2342,7 @@
     </w:p>
     <w:p>
       <w:pPr>
-        <w:spacing w:after="0"/>
+        <w:spacing w:line="240" w:lineRule="auto" w:after="0"/>
         <w:jc w:val="center"/>
       </w:pPr>
       <w:r>
@@ -2291,12 +2356,12 @@
     </w:p>
     <w:p>
       <w:pPr>
-        <w:spacing w:after="360"/>
+        <w:spacing w:line="240" w:lineRule="auto" w:after="120"/>
       </w:pPr>
     </w:p>
     <w:p>
       <w:pPr>
-        <w:spacing w:after="480"/>
+        <w:spacing w:line="240" w:lineRule="auto" w:after="120"/>
         <w:jc w:val="center"/>
       </w:pPr>
       <w:r>
@@ -2310,7 +2375,7 @@
     </w:p>
     <w:p>
       <w:pPr>
-        <w:spacing w:after="480"/>
+        <w:spacing w:line="240" w:lineRule="auto" w:after="120"/>
         <w:ind w:left="0"/>
         <w:jc w:val="right"/>
       </w:pPr>
@@ -2350,7 +2415,7 @@
     <w:p>
       <w:bookmarkStart w:id="bm_resumen" w:name="bm_resumen"/>
       <w:pPr>
-        <w:spacing w:before="480" w:after="480"/>
+        <w:spacing w:line="240" w:lineRule="auto" w:before="120" w:after="120"/>
         <w:jc w:val="center"/>
       </w:pPr>
       <w:r>
@@ -2370,21 +2435,20 @@
           <w:pgSz w:w="12240" w:h="15840"/>
           <w:pgMar w:top="1701" w:right="1701" w:bottom="1701" w:left="2268" w:header="720" w:footer="720" w:gutter="0"/>
           <w:cols w:space="720"/>
-          <w:titlePg/>
           <w:docGrid w:linePitch="360"/>
+          <w:pgNumType w:fmt="lowerRoman"/>
         </w:sectPr>
       </w:pPr>
     </w:p>
     <w:p>
       <w:pPr>
-        <w:spacing w:line="360" w:lineRule="auto" w:after="0" w:before="0"/>
+        <w:spacing w:line="240" w:lineRule="auto" w:before="0" w:after="0"/>
         <w:ind w:firstLine="709"/>
         <w:jc w:val="both"/>
       </w:pPr>
       <w:r>
         <w:rPr>
           <w:rFonts w:ascii="Times New Roman" w:hAnsi="Times New Roman"/>
-          <w:i w:val="0"/>
           <w:sz w:val="24"/>
         </w:rPr>
         <w:t>El presente informe recoge las actividades desarrolladas durante diez (10) semanas de pasantías profesionales en Ingeniería de Telecomunicaciones, C.A. (IDETEL), con una primera etapa de rotación por Atención al Cliente y una segunda etapa de apoyo en el área de Administración. Durante la práctica se observó el recorrido de solicitudes de afiliación e incidencias, el registro de pagos, la facturación, el seguimiento de casos y la elaboración de reportes administrativos. La situación problemática se relaciona con la ausencia de un procedimiento formalizado y unificado para controlar las solicitudes desde su recepción hasta el cierre, lo que dificulta conocer responsables, tiempos y estatus de cada caso. El objetivo general fue evaluar el control administrativo aplicado a la gestión de solicitudes de servicios de telecomunicaciones para identificar debilidades y formular mejoras. Se realizaron observaciones directas, revisión de registros, entrevistas estructuradas al personal y un análisis causa-efecto de las fallas detectadas. Posteriormente se diseñó un flujo estandarizado, formatos de control y criterios de seguimiento mediante indicadores básicos. Se concluye que la principal necesidad consiste en formalizar el recorrido de las solicitudes y centralizar la información necesaria para su seguimiento. Se recomienda implementar progresivamente el procedimiento propuesto, asignar responsables por etapa y revisar periódicamente los tiempos de respuesta para detectar desviaciones y oportunidades de mejora.</w:t>
@@ -2393,15 +2457,22 @@
     <w:p/>
     <w:p>
       <w:pPr>
+        <w:spacing w:line="240" w:lineRule="auto" w:before="0" w:after="0"/>
         <w:ind w:firstLine="709"/>
       </w:pPr>
       <w:r>
         <w:rPr>
+          <w:rFonts w:ascii="Times New Roman" w:hAnsi="Times New Roman"/>
           <w:b/>
+          <w:sz w:val="24"/>
         </w:rPr>
         <w:t xml:space="preserve">Palabras claves: </w:t>
       </w:r>
       <w:r>
+        <w:rPr>
+          <w:rFonts w:ascii="Times New Roman" w:hAnsi="Times New Roman"/>
+          <w:sz w:val="24"/>
+        </w:rPr>
         <w:t>control administrativo, solicitudes de servicio, trazabilidad, telecomunicaciones, pasantías</w:t>
       </w:r>
     </w:p>
@@ -2413,8 +2484,8 @@
           <w:pgSz w:w="12240" w:h="15840"/>
           <w:pgMar w:top="1701" w:right="1701" w:bottom="1701" w:left="2268" w:header="720" w:footer="720" w:gutter="0"/>
           <w:cols w:space="720"/>
-          <w:titlePg/>
           <w:docGrid w:linePitch="360"/>
+          <w:pgNumType w:fmt="lowerRoman"/>
         </w:sectPr>
       </w:pPr>
     </w:p>
@@ -2438,11 +2509,13 @@
       <w:pPr>
         <w:sectPr>
           <w:footerReference w:type="default" r:id="rId30"/>
+          <w:footerReference w:type="first" r:id="rId31"/>
           <w:pgSz w:w="12240" w:h="15840"/>
           <w:pgMar w:top="1701" w:right="1701" w:bottom="1701" w:left="2268" w:header="720" w:footer="720" w:gutter="0"/>
           <w:cols w:space="720"/>
           <w:titlePg/>
           <w:docGrid w:linePitch="360"/>
+          <w:pgNumType w:fmt="decimal" w:start="1"/>
         </w:sectPr>
       </w:pPr>
     </w:p>
@@ -2509,13 +2582,15 @@
     <w:p>
       <w:pPr>
         <w:sectPr>
-          <w:footerReference w:type="default" r:id="rId31"/>
+          <w:footerReference w:type="default" r:id="rId32"/>
+          <w:footerReference w:type="first" r:id="rId33"/>
           <w:type w:val="continuous"/>
           <w:pgSz w:w="12240" w:h="15840"/>
           <w:pgMar w:top="1701" w:right="1701" w:bottom="1701" w:left="2268" w:header="720" w:footer="720" w:gutter="0"/>
           <w:cols w:space="720"/>
           <w:titlePg/>
           <w:docGrid w:linePitch="360"/>
+          <w:pgNumType w:fmt="decimal"/>
         </w:sectPr>
       </w:pPr>
     </w:p>
@@ -2552,12 +2627,14 @@
     <w:p>
       <w:pPr>
         <w:sectPr>
-          <w:footerReference w:type="default" r:id="rId32"/>
+          <w:footerReference w:type="default" r:id="rId34"/>
+          <w:footerReference w:type="first" r:id="rId35"/>
           <w:pgSz w:w="12240" w:h="15840"/>
           <w:pgMar w:top="1701" w:right="1701" w:bottom="1701" w:left="2268" w:header="720" w:footer="720" w:gutter="0"/>
           <w:cols w:space="720"/>
           <w:titlePg/>
           <w:docGrid w:linePitch="360"/>
+          <w:pgNumType w:fmt="decimal"/>
         </w:sectPr>
       </w:pPr>
     </w:p>
@@ -3363,15 +3440,48 @@
       <w:bookmarkEnd w:id="bm_grafico4"/>
     </w:p>
     <w:p>
+      <w:bookmarkStart w:id="bm_cap1_departamento" w:name="bm_cap1_departamento"/>
+      <w:pPr>
+        <w:spacing w:before="480" w:after="480" w:line="360" w:lineRule="auto"/>
+        <w:jc w:val="left"/>
+      </w:pPr>
+      <w:r>
+        <w:rPr>
+          <w:rFonts w:ascii="Times New Roman" w:hAnsi="Times New Roman"/>
+          <w:b/>
+          <w:sz w:val="24"/>
+        </w:rPr>
+        <w:t>Descripción del departamento donde realizó la pasantía</w:t>
+      </w:r>
+      <w:bookmarkEnd w:id="bm_cap1_departamento"/>
+    </w:p>
+    <w:p>
+      <w:pPr>
+        <w:spacing w:line="360" w:lineRule="auto" w:after="0" w:before="0"/>
+        <w:ind w:firstLine="709"/>
+        <w:jc w:val="both"/>
+      </w:pPr>
+      <w:r>
+        <w:rPr>
+          <w:rFonts w:ascii="Times New Roman" w:hAnsi="Times New Roman"/>
+          <w:i w:val="0"/>
+          <w:sz w:val="24"/>
+        </w:rPr>
+        <w:t>La pasantía se realizó en la Supervisión de Administración, donde se reconocen las funciones de Supervisión de Administración, Contabilidad y Tributos; Compras y Facturación; y Atención al Cliente. La práctica incluyó una rotación inicial por Atención al Cliente y una etapa posterior de apoyo en Administración, con actividades de registro de pagos, facturación, seguimiento de solicitudes y elaboración de reportes administrativos.</w:t>
+      </w:r>
+    </w:p>
+    <w:p>
       <w:pPr>
         <w:sectPr>
-          <w:footerReference w:type="default" r:id="rId33"/>
+          <w:footerReference w:type="default" r:id="rId36"/>
+          <w:footerReference w:type="first" r:id="rId37"/>
           <w:type w:val="continuous"/>
           <w:pgSz w:w="12240" w:h="15840"/>
           <w:pgMar w:top="1701" w:right="1701" w:bottom="1701" w:left="2268" w:header="720" w:footer="720" w:gutter="0"/>
           <w:cols w:space="720"/>
           <w:titlePg/>
           <w:docGrid w:linePitch="360"/>
+          <w:pgNumType w:fmt="decimal"/>
         </w:sectPr>
       </w:pPr>
     </w:p>
@@ -3408,12 +3518,14 @@
     <w:p>
       <w:pPr>
         <w:sectPr>
-          <w:footerReference w:type="default" r:id="rId34"/>
+          <w:footerReference w:type="default" r:id="rId38"/>
+          <w:footerReference w:type="first" r:id="rId39"/>
           <w:pgSz w:w="12240" w:h="15840"/>
           <w:pgMar w:top="1701" w:right="1701" w:bottom="1701" w:left="2268" w:header="720" w:footer="720" w:gutter="0"/>
           <w:cols w:space="720"/>
           <w:titlePg/>
           <w:docGrid w:linePitch="360"/>
+          <w:pgNumType w:fmt="decimal"/>
         </w:sectPr>
       </w:pPr>
     </w:p>
@@ -3435,20 +3547,6 @@
     </w:p>
     <w:p>
       <w:pPr>
-        <w:spacing w:before="480" w:after="480" w:line="360" w:lineRule="auto"/>
-        <w:jc w:val="left"/>
-      </w:pPr>
-      <w:r>
-        <w:rPr>
-          <w:rFonts w:ascii="Times New Roman" w:hAnsi="Times New Roman"/>
-          <w:b/>
-          <w:sz w:val="24"/>
-        </w:rPr>
-        <w:t>Nivel macro</w:t>
-      </w:r>
-    </w:p>
-    <w:p>
-      <w:pPr>
         <w:spacing w:line="360" w:lineRule="auto" w:after="0" w:before="0"/>
         <w:ind w:firstLine="709"/>
         <w:jc w:val="both"/>
@@ -3464,20 +3562,6 @@
     </w:p>
     <w:p>
       <w:pPr>
-        <w:spacing w:before="480" w:after="480" w:line="360" w:lineRule="auto"/>
-        <w:jc w:val="left"/>
-      </w:pPr>
-      <w:r>
-        <w:rPr>
-          <w:rFonts w:ascii="Times New Roman" w:hAnsi="Times New Roman"/>
-          <w:b/>
-          <w:sz w:val="24"/>
-        </w:rPr>
-        <w:t>Nivel meso</w:t>
-      </w:r>
-    </w:p>
-    <w:p>
-      <w:pPr>
         <w:spacing w:line="360" w:lineRule="auto" w:after="0" w:before="0"/>
         <w:ind w:firstLine="709"/>
         <w:jc w:val="both"/>
@@ -3489,20 +3573,6 @@
           <w:sz w:val="24"/>
         </w:rPr>
         <w:t>En el sector de telecomunicaciones, las solicitudes pueden involucrar atención al cliente, administración, comercialización, soporte y personal técnico. Por ello, la continuidad del servicio depende no solo de la ejecución técnica, sino también de que la información administrativa se transfiera de manera ordenada entre las áreas involucradas, especialmente en afiliaciones, pagos, incidencias y cierres de casos.</w:t>
-      </w:r>
-    </w:p>
-    <w:p>
-      <w:pPr>
-        <w:spacing w:before="480" w:after="480" w:line="360" w:lineRule="auto"/>
-        <w:jc w:val="left"/>
-      </w:pPr>
-      <w:r>
-        <w:rPr>
-          <w:rFonts w:ascii="Times New Roman" w:hAnsi="Times New Roman"/>
-          <w:b/>
-          <w:sz w:val="24"/>
-        </w:rPr>
-        <w:t>Nivel micro</w:t>
       </w:r>
     </w:p>
     <w:p>
@@ -4393,22 +4463,22 @@
         <w:tblLayout w:type="fixed"/>
       </w:tblPr>
       <w:tblGrid>
-        <w:gridCol w:w="3033"/>
-        <w:gridCol w:w="523"/>
-        <w:gridCol w:w="523"/>
-        <w:gridCol w:w="523"/>
-        <w:gridCol w:w="523"/>
-        <w:gridCol w:w="523"/>
-        <w:gridCol w:w="523"/>
-        <w:gridCol w:w="523"/>
-        <w:gridCol w:w="523"/>
-        <w:gridCol w:w="523"/>
-        <w:gridCol w:w="523"/>
+        <w:gridCol w:w="2683"/>
+        <w:gridCol w:w="556"/>
+        <w:gridCol w:w="556"/>
+        <w:gridCol w:w="556"/>
+        <w:gridCol w:w="556"/>
+        <w:gridCol w:w="556"/>
+        <w:gridCol w:w="556"/>
+        <w:gridCol w:w="556"/>
+        <w:gridCol w:w="556"/>
+        <w:gridCol w:w="567"/>
+        <w:gridCol w:w="567"/>
       </w:tblGrid>
       <w:tr>
         <w:tc>
           <w:tcPr>
-            <w:tcW w:w="3033" w:type="dxa"/>
+            <w:tcW w:w="2683" w:type="dxa"/>
             <w:shd w:val="clear" w:color="auto" w:fill="4472C4"/>
           </w:tcPr>
           <w:p>
@@ -4429,7 +4499,7 @@
         </w:tc>
         <w:tc>
           <w:tcPr>
-            <w:tcW w:w="2092" w:type="dxa"/>
+            <w:tcW w:w="2224" w:type="dxa"/>
             <w:gridSpan w:val="4"/>
             <w:shd w:val="clear" w:color="auto" w:fill="4472C4"/>
           </w:tcPr>
@@ -4451,7 +4521,7 @@
         </w:tc>
         <w:tc>
           <w:tcPr>
-            <w:tcW w:w="2092" w:type="dxa"/>
+            <w:tcW w:w="2224" w:type="dxa"/>
             <w:gridSpan w:val="4"/>
             <w:shd w:val="clear" w:color="auto" w:fill="4472C4"/>
           </w:tcPr>
@@ -4473,7 +4543,7 @@
         </w:tc>
         <w:tc>
           <w:tcPr>
-            <w:tcW w:w="1046" w:type="dxa"/>
+            <w:tcW w:w="1134" w:type="dxa"/>
             <w:gridSpan w:val="2"/>
             <w:shd w:val="clear" w:color="auto" w:fill="4472C4"/>
           </w:tcPr>
@@ -4497,7 +4567,7 @@
       <w:tr>
         <w:tc>
           <w:tcPr>
-            <w:tcW w:w="3033" w:type="dxa"/>
+            <w:tcW w:w="2683" w:type="dxa"/>
             <w:shd w:val="clear" w:color="auto" w:fill="4472C4"/>
           </w:tcPr>
           <w:p>
@@ -4518,7 +4588,7 @@
         </w:tc>
         <w:tc>
           <w:tcPr>
-            <w:tcW w:w="523" w:type="dxa"/>
+            <w:tcW w:w="556" w:type="dxa"/>
             <w:shd w:val="clear" w:color="auto" w:fill="4472C4"/>
           </w:tcPr>
           <w:p>
@@ -4531,7 +4601,7 @@
                 <w:rFonts w:ascii="Times New Roman" w:hAnsi="Times New Roman"/>
                 <w:b/>
                 <w:color w:val="FFFFFF"/>
-                <w:sz w:val="18"/>
+                <w:sz w:val="20"/>
               </w:rPr>
               <w:t>1</w:t>
             </w:r>
@@ -4539,7 +4609,7 @@
         </w:tc>
         <w:tc>
           <w:tcPr>
-            <w:tcW w:w="523" w:type="dxa"/>
+            <w:tcW w:w="556" w:type="dxa"/>
             <w:shd w:val="clear" w:color="auto" w:fill="4472C4"/>
           </w:tcPr>
           <w:p>
@@ -4552,7 +4622,7 @@
                 <w:rFonts w:ascii="Times New Roman" w:hAnsi="Times New Roman"/>
                 <w:b/>
                 <w:color w:val="FFFFFF"/>
-                <w:sz w:val="18"/>
+                <w:sz w:val="20"/>
               </w:rPr>
               <w:t>2</w:t>
             </w:r>
@@ -4560,7 +4630,7 @@
         </w:tc>
         <w:tc>
           <w:tcPr>
-            <w:tcW w:w="523" w:type="dxa"/>
+            <w:tcW w:w="556" w:type="dxa"/>
             <w:shd w:val="clear" w:color="auto" w:fill="4472C4"/>
           </w:tcPr>
           <w:p>
@@ -4573,7 +4643,7 @@
                 <w:rFonts w:ascii="Times New Roman" w:hAnsi="Times New Roman"/>
                 <w:b/>
                 <w:color w:val="FFFFFF"/>
-                <w:sz w:val="18"/>
+                <w:sz w:val="20"/>
               </w:rPr>
               <w:t>3</w:t>
             </w:r>
@@ -4581,7 +4651,7 @@
         </w:tc>
         <w:tc>
           <w:tcPr>
-            <w:tcW w:w="523" w:type="dxa"/>
+            <w:tcW w:w="556" w:type="dxa"/>
             <w:shd w:val="clear" w:color="auto" w:fill="4472C4"/>
           </w:tcPr>
           <w:p>
@@ -4594,7 +4664,7 @@
                 <w:rFonts w:ascii="Times New Roman" w:hAnsi="Times New Roman"/>
                 <w:b/>
                 <w:color w:val="FFFFFF"/>
-                <w:sz w:val="18"/>
+                <w:sz w:val="20"/>
               </w:rPr>
               <w:t>4</w:t>
             </w:r>
@@ -4602,7 +4672,7 @@
         </w:tc>
         <w:tc>
           <w:tcPr>
-            <w:tcW w:w="523" w:type="dxa"/>
+            <w:tcW w:w="556" w:type="dxa"/>
             <w:shd w:val="clear" w:color="auto" w:fill="4472C4"/>
           </w:tcPr>
           <w:p>
@@ -4615,7 +4685,7 @@
                 <w:rFonts w:ascii="Times New Roman" w:hAnsi="Times New Roman"/>
                 <w:b/>
                 <w:color w:val="FFFFFF"/>
-                <w:sz w:val="18"/>
+                <w:sz w:val="20"/>
               </w:rPr>
               <w:t>1</w:t>
             </w:r>
@@ -4623,7 +4693,7 @@
         </w:tc>
         <w:tc>
           <w:tcPr>
-            <w:tcW w:w="523" w:type="dxa"/>
+            <w:tcW w:w="556" w:type="dxa"/>
             <w:shd w:val="clear" w:color="auto" w:fill="4472C4"/>
           </w:tcPr>
           <w:p>
@@ -4636,7 +4706,7 @@
                 <w:rFonts w:ascii="Times New Roman" w:hAnsi="Times New Roman"/>
                 <w:b/>
                 <w:color w:val="FFFFFF"/>
-                <w:sz w:val="18"/>
+                <w:sz w:val="20"/>
               </w:rPr>
               <w:t>2</w:t>
             </w:r>
@@ -4644,7 +4714,7 @@
         </w:tc>
         <w:tc>
           <w:tcPr>
-            <w:tcW w:w="523" w:type="dxa"/>
+            <w:tcW w:w="556" w:type="dxa"/>
             <w:shd w:val="clear" w:color="auto" w:fill="4472C4"/>
           </w:tcPr>
           <w:p>
@@ -4657,7 +4727,7 @@
                 <w:rFonts w:ascii="Times New Roman" w:hAnsi="Times New Roman"/>
                 <w:b/>
                 <w:color w:val="FFFFFF"/>
-                <w:sz w:val="18"/>
+                <w:sz w:val="20"/>
               </w:rPr>
               <w:t>3</w:t>
             </w:r>
@@ -4665,7 +4735,7 @@
         </w:tc>
         <w:tc>
           <w:tcPr>
-            <w:tcW w:w="523" w:type="dxa"/>
+            <w:tcW w:w="556" w:type="dxa"/>
             <w:shd w:val="clear" w:color="auto" w:fill="4472C4"/>
           </w:tcPr>
           <w:p>
@@ -4678,7 +4748,7 @@
                 <w:rFonts w:ascii="Times New Roman" w:hAnsi="Times New Roman"/>
                 <w:b/>
                 <w:color w:val="FFFFFF"/>
-                <w:sz w:val="18"/>
+                <w:sz w:val="20"/>
               </w:rPr>
               <w:t>4</w:t>
             </w:r>
@@ -4686,7 +4756,7 @@
         </w:tc>
         <w:tc>
           <w:tcPr>
-            <w:tcW w:w="523" w:type="dxa"/>
+            <w:tcW w:w="567" w:type="dxa"/>
             <w:shd w:val="clear" w:color="auto" w:fill="4472C4"/>
           </w:tcPr>
           <w:p>
@@ -4699,7 +4769,7 @@
                 <w:rFonts w:ascii="Times New Roman" w:hAnsi="Times New Roman"/>
                 <w:b/>
                 <w:color w:val="FFFFFF"/>
-                <w:sz w:val="18"/>
+                <w:sz w:val="20"/>
               </w:rPr>
               <w:t>1</w:t>
             </w:r>
@@ -4707,7 +4777,7 @@
         </w:tc>
         <w:tc>
           <w:tcPr>
-            <w:tcW w:w="523" w:type="dxa"/>
+            <w:tcW w:w="567" w:type="dxa"/>
             <w:shd w:val="clear" w:color="auto" w:fill="4472C4"/>
           </w:tcPr>
           <w:p>
@@ -4720,7 +4790,7 @@
                 <w:rFonts w:ascii="Times New Roman" w:hAnsi="Times New Roman"/>
                 <w:b/>
                 <w:color w:val="FFFFFF"/>
-                <w:sz w:val="18"/>
+                <w:sz w:val="20"/>
               </w:rPr>
               <w:t>2</w:t>
             </w:r>
@@ -4730,7 +4800,7 @@
       <w:tr>
         <w:tc>
           <w:tcPr>
-            <w:tcW w:w="3033" w:type="dxa"/>
+            <w:tcW w:w="2683" w:type="dxa"/>
             <w:shd w:val="clear" w:color="auto" w:fill="D9E1F2"/>
           </w:tcPr>
           <w:p>
@@ -4751,7 +4821,7 @@
         </w:tc>
         <w:tc>
           <w:tcPr>
-            <w:tcW w:w="523" w:type="dxa"/>
+            <w:tcW w:w="556" w:type="dxa"/>
             <w:shd w:val="clear" w:color="auto" w:fill="70AD47"/>
           </w:tcPr>
           <w:p>
@@ -4764,7 +4834,7 @@
                 <w:rFonts w:ascii="Times New Roman" w:hAnsi="Times New Roman"/>
                 <w:b w:val="0"/>
                 <w:color w:val="FFFFFF"/>
-                <w:sz w:val="18"/>
+                <w:sz w:val="20"/>
               </w:rPr>
               <w:t>✓</w:t>
             </w:r>
@@ -4772,7 +4842,7 @@
         </w:tc>
         <w:tc>
           <w:tcPr>
-            <w:tcW w:w="523" w:type="dxa"/>
+            <w:tcW w:w="556" w:type="dxa"/>
             <w:shd w:val="clear" w:color="auto" w:fill="D9E1F2"/>
           </w:tcPr>
           <w:p>
@@ -4785,14 +4855,14 @@
                 <w:rFonts w:ascii="Times New Roman" w:hAnsi="Times New Roman"/>
                 <w:b w:val="0"/>
                 <w:color w:val="000000"/>
-                <w:sz w:val="18"/>
+                <w:sz w:val="20"/>
               </w:rPr>
             </w:r>
           </w:p>
         </w:tc>
         <w:tc>
           <w:tcPr>
-            <w:tcW w:w="523" w:type="dxa"/>
+            <w:tcW w:w="556" w:type="dxa"/>
             <w:shd w:val="clear" w:color="auto" w:fill="D9E1F2"/>
           </w:tcPr>
           <w:p>
@@ -4805,14 +4875,14 @@
                 <w:rFonts w:ascii="Times New Roman" w:hAnsi="Times New Roman"/>
                 <w:b w:val="0"/>
                 <w:color w:val="000000"/>
-                <w:sz w:val="18"/>
+                <w:sz w:val="20"/>
               </w:rPr>
             </w:r>
           </w:p>
         </w:tc>
         <w:tc>
           <w:tcPr>
-            <w:tcW w:w="523" w:type="dxa"/>
+            <w:tcW w:w="556" w:type="dxa"/>
             <w:shd w:val="clear" w:color="auto" w:fill="D9E1F2"/>
           </w:tcPr>
           <w:p>
@@ -4825,14 +4895,14 @@
                 <w:rFonts w:ascii="Times New Roman" w:hAnsi="Times New Roman"/>
                 <w:b w:val="0"/>
                 <w:color w:val="000000"/>
-                <w:sz w:val="18"/>
+                <w:sz w:val="20"/>
               </w:rPr>
             </w:r>
           </w:p>
         </w:tc>
         <w:tc>
           <w:tcPr>
-            <w:tcW w:w="523" w:type="dxa"/>
+            <w:tcW w:w="556" w:type="dxa"/>
             <w:shd w:val="clear" w:color="auto" w:fill="D9E1F2"/>
           </w:tcPr>
           <w:p>
@@ -4845,14 +4915,14 @@
                 <w:rFonts w:ascii="Times New Roman" w:hAnsi="Times New Roman"/>
                 <w:b w:val="0"/>
                 <w:color w:val="000000"/>
-                <w:sz w:val="18"/>
+                <w:sz w:val="20"/>
               </w:rPr>
             </w:r>
           </w:p>
         </w:tc>
         <w:tc>
           <w:tcPr>
-            <w:tcW w:w="523" w:type="dxa"/>
+            <w:tcW w:w="556" w:type="dxa"/>
             <w:shd w:val="clear" w:color="auto" w:fill="D9E1F2"/>
           </w:tcPr>
           <w:p>
@@ -4865,14 +4935,14 @@
                 <w:rFonts w:ascii="Times New Roman" w:hAnsi="Times New Roman"/>
                 <w:b w:val="0"/>
                 <w:color w:val="000000"/>
-                <w:sz w:val="18"/>
+                <w:sz w:val="20"/>
               </w:rPr>
             </w:r>
           </w:p>
         </w:tc>
         <w:tc>
           <w:tcPr>
-            <w:tcW w:w="523" w:type="dxa"/>
+            <w:tcW w:w="556" w:type="dxa"/>
             <w:shd w:val="clear" w:color="auto" w:fill="D9E1F2"/>
           </w:tcPr>
           <w:p>
@@ -4885,14 +4955,14 @@
                 <w:rFonts w:ascii="Times New Roman" w:hAnsi="Times New Roman"/>
                 <w:b w:val="0"/>
                 <w:color w:val="000000"/>
-                <w:sz w:val="18"/>
+                <w:sz w:val="20"/>
               </w:rPr>
             </w:r>
           </w:p>
         </w:tc>
         <w:tc>
           <w:tcPr>
-            <w:tcW w:w="523" w:type="dxa"/>
+            <w:tcW w:w="556" w:type="dxa"/>
             <w:shd w:val="clear" w:color="auto" w:fill="D9E1F2"/>
           </w:tcPr>
           <w:p>
@@ -4905,14 +4975,14 @@
                 <w:rFonts w:ascii="Times New Roman" w:hAnsi="Times New Roman"/>
                 <w:b w:val="0"/>
                 <w:color w:val="000000"/>
-                <w:sz w:val="18"/>
+                <w:sz w:val="20"/>
               </w:rPr>
             </w:r>
           </w:p>
         </w:tc>
         <w:tc>
           <w:tcPr>
-            <w:tcW w:w="523" w:type="dxa"/>
+            <w:tcW w:w="567" w:type="dxa"/>
             <w:shd w:val="clear" w:color="auto" w:fill="D9E1F2"/>
           </w:tcPr>
           <w:p>
@@ -4925,14 +4995,14 @@
                 <w:rFonts w:ascii="Times New Roman" w:hAnsi="Times New Roman"/>
                 <w:b w:val="0"/>
                 <w:color w:val="000000"/>
-                <w:sz w:val="18"/>
+                <w:sz w:val="20"/>
               </w:rPr>
             </w:r>
           </w:p>
         </w:tc>
         <w:tc>
           <w:tcPr>
-            <w:tcW w:w="523" w:type="dxa"/>
+            <w:tcW w:w="567" w:type="dxa"/>
             <w:shd w:val="clear" w:color="auto" w:fill="D9E1F2"/>
           </w:tcPr>
           <w:p>
@@ -4945,7 +5015,7 @@
                 <w:rFonts w:ascii="Times New Roman" w:hAnsi="Times New Roman"/>
                 <w:b w:val="0"/>
                 <w:color w:val="000000"/>
-                <w:sz w:val="18"/>
+                <w:sz w:val="20"/>
               </w:rPr>
             </w:r>
           </w:p>
@@ -4954,7 +5024,7 @@
       <w:tr>
         <w:tc>
           <w:tcPr>
-            <w:tcW w:w="3033" w:type="dxa"/>
+            <w:tcW w:w="2683" w:type="dxa"/>
             <w:shd w:val="clear" w:color="auto" w:fill="FFFFFF"/>
           </w:tcPr>
           <w:p>
@@ -4975,7 +5045,7 @@
         </w:tc>
         <w:tc>
           <w:tcPr>
-            <w:tcW w:w="523" w:type="dxa"/>
+            <w:tcW w:w="556" w:type="dxa"/>
             <w:shd w:val="clear" w:color="auto" w:fill="70AD47"/>
           </w:tcPr>
           <w:p>
@@ -4988,7 +5058,7 @@
                 <w:rFonts w:ascii="Times New Roman" w:hAnsi="Times New Roman"/>
                 <w:b w:val="0"/>
                 <w:color w:val="FFFFFF"/>
-                <w:sz w:val="18"/>
+                <w:sz w:val="20"/>
               </w:rPr>
               <w:t>✓</w:t>
             </w:r>
@@ -4996,7 +5066,7 @@
         </w:tc>
         <w:tc>
           <w:tcPr>
-            <w:tcW w:w="523" w:type="dxa"/>
+            <w:tcW w:w="556" w:type="dxa"/>
             <w:shd w:val="clear" w:color="auto" w:fill="70AD47"/>
           </w:tcPr>
           <w:p>
@@ -5009,7 +5079,7 @@
                 <w:rFonts w:ascii="Times New Roman" w:hAnsi="Times New Roman"/>
                 <w:b w:val="0"/>
                 <w:color w:val="FFFFFF"/>
-                <w:sz w:val="18"/>
+                <w:sz w:val="20"/>
               </w:rPr>
               <w:t>✓</w:t>
             </w:r>
@@ -5017,7 +5087,7 @@
         </w:tc>
         <w:tc>
           <w:tcPr>
-            <w:tcW w:w="523" w:type="dxa"/>
+            <w:tcW w:w="556" w:type="dxa"/>
             <w:shd w:val="clear" w:color="auto" w:fill="70AD47"/>
           </w:tcPr>
           <w:p>
@@ -5030,7 +5100,7 @@
                 <w:rFonts w:ascii="Times New Roman" w:hAnsi="Times New Roman"/>
                 <w:b w:val="0"/>
                 <w:color w:val="FFFFFF"/>
-                <w:sz w:val="18"/>
+                <w:sz w:val="20"/>
               </w:rPr>
               <w:t>✓</w:t>
             </w:r>
@@ -5038,7 +5108,7 @@
         </w:tc>
         <w:tc>
           <w:tcPr>
-            <w:tcW w:w="523" w:type="dxa"/>
+            <w:tcW w:w="556" w:type="dxa"/>
             <w:shd w:val="clear" w:color="auto" w:fill="FFFFFF"/>
           </w:tcPr>
           <w:p>
@@ -5051,14 +5121,14 @@
                 <w:rFonts w:ascii="Times New Roman" w:hAnsi="Times New Roman"/>
                 <w:b w:val="0"/>
                 <w:color w:val="000000"/>
-                <w:sz w:val="18"/>
+                <w:sz w:val="20"/>
               </w:rPr>
             </w:r>
           </w:p>
         </w:tc>
         <w:tc>
           <w:tcPr>
-            <w:tcW w:w="523" w:type="dxa"/>
+            <w:tcW w:w="556" w:type="dxa"/>
             <w:shd w:val="clear" w:color="auto" w:fill="FFFFFF"/>
           </w:tcPr>
           <w:p>
@@ -5071,14 +5141,14 @@
                 <w:rFonts w:ascii="Times New Roman" w:hAnsi="Times New Roman"/>
                 <w:b w:val="0"/>
                 <w:color w:val="000000"/>
-                <w:sz w:val="18"/>
+                <w:sz w:val="20"/>
               </w:rPr>
             </w:r>
           </w:p>
         </w:tc>
         <w:tc>
           <w:tcPr>
-            <w:tcW w:w="523" w:type="dxa"/>
+            <w:tcW w:w="556" w:type="dxa"/>
             <w:shd w:val="clear" w:color="auto" w:fill="FFFFFF"/>
           </w:tcPr>
           <w:p>
@@ -5091,14 +5161,14 @@
                 <w:rFonts w:ascii="Times New Roman" w:hAnsi="Times New Roman"/>
                 <w:b w:val="0"/>
                 <w:color w:val="000000"/>
-                <w:sz w:val="18"/>
+                <w:sz w:val="20"/>
               </w:rPr>
             </w:r>
           </w:p>
         </w:tc>
         <w:tc>
           <w:tcPr>
-            <w:tcW w:w="523" w:type="dxa"/>
+            <w:tcW w:w="556" w:type="dxa"/>
             <w:shd w:val="clear" w:color="auto" w:fill="FFFFFF"/>
           </w:tcPr>
           <w:p>
@@ -5111,14 +5181,14 @@
                 <w:rFonts w:ascii="Times New Roman" w:hAnsi="Times New Roman"/>
                 <w:b w:val="0"/>
                 <w:color w:val="000000"/>
-                <w:sz w:val="18"/>
+                <w:sz w:val="20"/>
               </w:rPr>
             </w:r>
           </w:p>
         </w:tc>
         <w:tc>
           <w:tcPr>
-            <w:tcW w:w="523" w:type="dxa"/>
+            <w:tcW w:w="556" w:type="dxa"/>
             <w:shd w:val="clear" w:color="auto" w:fill="FFFFFF"/>
           </w:tcPr>
           <w:p>
@@ -5131,14 +5201,14 @@
                 <w:rFonts w:ascii="Times New Roman" w:hAnsi="Times New Roman"/>
                 <w:b w:val="0"/>
                 <w:color w:val="000000"/>
-                <w:sz w:val="18"/>
+                <w:sz w:val="20"/>
               </w:rPr>
             </w:r>
           </w:p>
         </w:tc>
         <w:tc>
           <w:tcPr>
-            <w:tcW w:w="523" w:type="dxa"/>
+            <w:tcW w:w="567" w:type="dxa"/>
             <w:shd w:val="clear" w:color="auto" w:fill="FFFFFF"/>
           </w:tcPr>
           <w:p>
@@ -5151,14 +5221,14 @@
                 <w:rFonts w:ascii="Times New Roman" w:hAnsi="Times New Roman"/>
                 <w:b w:val="0"/>
                 <w:color w:val="000000"/>
-                <w:sz w:val="18"/>
+                <w:sz w:val="20"/>
               </w:rPr>
             </w:r>
           </w:p>
         </w:tc>
         <w:tc>
           <w:tcPr>
-            <w:tcW w:w="523" w:type="dxa"/>
+            <w:tcW w:w="567" w:type="dxa"/>
             <w:shd w:val="clear" w:color="auto" w:fill="FFFFFF"/>
           </w:tcPr>
           <w:p>
@@ -5171,7 +5241,7 @@
                 <w:rFonts w:ascii="Times New Roman" w:hAnsi="Times New Roman"/>
                 <w:b w:val="0"/>
                 <w:color w:val="000000"/>
-                <w:sz w:val="18"/>
+                <w:sz w:val="20"/>
               </w:rPr>
             </w:r>
           </w:p>
@@ -5180,7 +5250,7 @@
       <w:tr>
         <w:tc>
           <w:tcPr>
-            <w:tcW w:w="3033" w:type="dxa"/>
+            <w:tcW w:w="2683" w:type="dxa"/>
             <w:shd w:val="clear" w:color="auto" w:fill="D9E1F2"/>
           </w:tcPr>
           <w:p>
@@ -5201,7 +5271,7 @@
         </w:tc>
         <w:tc>
           <w:tcPr>
-            <w:tcW w:w="523" w:type="dxa"/>
+            <w:tcW w:w="556" w:type="dxa"/>
             <w:shd w:val="clear" w:color="auto" w:fill="70AD47"/>
           </w:tcPr>
           <w:p>
@@ -5214,7 +5284,7 @@
                 <w:rFonts w:ascii="Times New Roman" w:hAnsi="Times New Roman"/>
                 <w:b w:val="0"/>
                 <w:color w:val="FFFFFF"/>
-                <w:sz w:val="18"/>
+                <w:sz w:val="20"/>
               </w:rPr>
               <w:t>✓</w:t>
             </w:r>
@@ -5222,7 +5292,7 @@
         </w:tc>
         <w:tc>
           <w:tcPr>
-            <w:tcW w:w="523" w:type="dxa"/>
+            <w:tcW w:w="556" w:type="dxa"/>
             <w:shd w:val="clear" w:color="auto" w:fill="70AD47"/>
           </w:tcPr>
           <w:p>
@@ -5235,7 +5305,7 @@
                 <w:rFonts w:ascii="Times New Roman" w:hAnsi="Times New Roman"/>
                 <w:b w:val="0"/>
                 <w:color w:val="FFFFFF"/>
-                <w:sz w:val="18"/>
+                <w:sz w:val="20"/>
               </w:rPr>
               <w:t>✓</w:t>
             </w:r>
@@ -5243,7 +5313,7 @@
         </w:tc>
         <w:tc>
           <w:tcPr>
-            <w:tcW w:w="523" w:type="dxa"/>
+            <w:tcW w:w="556" w:type="dxa"/>
             <w:shd w:val="clear" w:color="auto" w:fill="70AD47"/>
           </w:tcPr>
           <w:p>
@@ -5256,7 +5326,7 @@
                 <w:rFonts w:ascii="Times New Roman" w:hAnsi="Times New Roman"/>
                 <w:b w:val="0"/>
                 <w:color w:val="FFFFFF"/>
-                <w:sz w:val="18"/>
+                <w:sz w:val="20"/>
               </w:rPr>
               <w:t>✓</w:t>
             </w:r>
@@ -5264,7 +5334,7 @@
         </w:tc>
         <w:tc>
           <w:tcPr>
-            <w:tcW w:w="523" w:type="dxa"/>
+            <w:tcW w:w="556" w:type="dxa"/>
             <w:shd w:val="clear" w:color="auto" w:fill="D9E1F2"/>
           </w:tcPr>
           <w:p>
@@ -5277,14 +5347,14 @@
                 <w:rFonts w:ascii="Times New Roman" w:hAnsi="Times New Roman"/>
                 <w:b w:val="0"/>
                 <w:color w:val="000000"/>
-                <w:sz w:val="18"/>
+                <w:sz w:val="20"/>
               </w:rPr>
             </w:r>
           </w:p>
         </w:tc>
         <w:tc>
           <w:tcPr>
-            <w:tcW w:w="523" w:type="dxa"/>
+            <w:tcW w:w="556" w:type="dxa"/>
             <w:shd w:val="clear" w:color="auto" w:fill="D9E1F2"/>
           </w:tcPr>
           <w:p>
@@ -5297,14 +5367,14 @@
                 <w:rFonts w:ascii="Times New Roman" w:hAnsi="Times New Roman"/>
                 <w:b w:val="0"/>
                 <w:color w:val="000000"/>
-                <w:sz w:val="18"/>
+                <w:sz w:val="20"/>
               </w:rPr>
             </w:r>
           </w:p>
         </w:tc>
         <w:tc>
           <w:tcPr>
-            <w:tcW w:w="523" w:type="dxa"/>
+            <w:tcW w:w="556" w:type="dxa"/>
             <w:shd w:val="clear" w:color="auto" w:fill="D9E1F2"/>
           </w:tcPr>
           <w:p>
@@ -5317,14 +5387,14 @@
                 <w:rFonts w:ascii="Times New Roman" w:hAnsi="Times New Roman"/>
                 <w:b w:val="0"/>
                 <w:color w:val="000000"/>
-                <w:sz w:val="18"/>
+                <w:sz w:val="20"/>
               </w:rPr>
             </w:r>
           </w:p>
         </w:tc>
         <w:tc>
           <w:tcPr>
-            <w:tcW w:w="523" w:type="dxa"/>
+            <w:tcW w:w="556" w:type="dxa"/>
             <w:shd w:val="clear" w:color="auto" w:fill="D9E1F2"/>
           </w:tcPr>
           <w:p>
@@ -5337,14 +5407,14 @@
                 <w:rFonts w:ascii="Times New Roman" w:hAnsi="Times New Roman"/>
                 <w:b w:val="0"/>
                 <w:color w:val="000000"/>
-                <w:sz w:val="18"/>
+                <w:sz w:val="20"/>
               </w:rPr>
             </w:r>
           </w:p>
         </w:tc>
         <w:tc>
           <w:tcPr>
-            <w:tcW w:w="523" w:type="dxa"/>
+            <w:tcW w:w="556" w:type="dxa"/>
             <w:shd w:val="clear" w:color="auto" w:fill="D9E1F2"/>
           </w:tcPr>
           <w:p>
@@ -5357,14 +5427,14 @@
                 <w:rFonts w:ascii="Times New Roman" w:hAnsi="Times New Roman"/>
                 <w:b w:val="0"/>
                 <w:color w:val="000000"/>
-                <w:sz w:val="18"/>
+                <w:sz w:val="20"/>
               </w:rPr>
             </w:r>
           </w:p>
         </w:tc>
         <w:tc>
           <w:tcPr>
-            <w:tcW w:w="523" w:type="dxa"/>
+            <w:tcW w:w="567" w:type="dxa"/>
             <w:shd w:val="clear" w:color="auto" w:fill="D9E1F2"/>
           </w:tcPr>
           <w:p>
@@ -5377,14 +5447,14 @@
                 <w:rFonts w:ascii="Times New Roman" w:hAnsi="Times New Roman"/>
                 <w:b w:val="0"/>
                 <w:color w:val="000000"/>
-                <w:sz w:val="18"/>
+                <w:sz w:val="20"/>
               </w:rPr>
             </w:r>
           </w:p>
         </w:tc>
         <w:tc>
           <w:tcPr>
-            <w:tcW w:w="523" w:type="dxa"/>
+            <w:tcW w:w="567" w:type="dxa"/>
             <w:shd w:val="clear" w:color="auto" w:fill="D9E1F2"/>
           </w:tcPr>
           <w:p>
@@ -5397,7 +5467,7 @@
                 <w:rFonts w:ascii="Times New Roman" w:hAnsi="Times New Roman"/>
                 <w:b w:val="0"/>
                 <w:color w:val="000000"/>
-                <w:sz w:val="18"/>
+                <w:sz w:val="20"/>
               </w:rPr>
             </w:r>
           </w:p>
@@ -5406,7 +5476,7 @@
       <w:tr>
         <w:tc>
           <w:tcPr>
-            <w:tcW w:w="3033" w:type="dxa"/>
+            <w:tcW w:w="2683" w:type="dxa"/>
             <w:shd w:val="clear" w:color="auto" w:fill="FFFFFF"/>
           </w:tcPr>
           <w:p>
@@ -5427,7 +5497,7 @@
         </w:tc>
         <w:tc>
           <w:tcPr>
-            <w:tcW w:w="523" w:type="dxa"/>
+            <w:tcW w:w="556" w:type="dxa"/>
             <w:shd w:val="clear" w:color="auto" w:fill="FFFFFF"/>
           </w:tcPr>
           <w:p>
@@ -5440,14 +5510,14 @@
                 <w:rFonts w:ascii="Times New Roman" w:hAnsi="Times New Roman"/>
                 <w:b w:val="0"/>
                 <w:color w:val="000000"/>
-                <w:sz w:val="18"/>
+                <w:sz w:val="20"/>
               </w:rPr>
             </w:r>
           </w:p>
         </w:tc>
         <w:tc>
           <w:tcPr>
-            <w:tcW w:w="523" w:type="dxa"/>
+            <w:tcW w:w="556" w:type="dxa"/>
             <w:shd w:val="clear" w:color="auto" w:fill="FFFFFF"/>
           </w:tcPr>
           <w:p>
@@ -5460,14 +5530,14 @@
                 <w:rFonts w:ascii="Times New Roman" w:hAnsi="Times New Roman"/>
                 <w:b w:val="0"/>
                 <w:color w:val="000000"/>
-                <w:sz w:val="18"/>
+                <w:sz w:val="20"/>
               </w:rPr>
             </w:r>
           </w:p>
         </w:tc>
         <w:tc>
           <w:tcPr>
-            <w:tcW w:w="523" w:type="dxa"/>
+            <w:tcW w:w="556" w:type="dxa"/>
             <w:shd w:val="clear" w:color="auto" w:fill="70AD47"/>
           </w:tcPr>
           <w:p>
@@ -5480,7 +5550,7 @@
                 <w:rFonts w:ascii="Times New Roman" w:hAnsi="Times New Roman"/>
                 <w:b w:val="0"/>
                 <w:color w:val="FFFFFF"/>
-                <w:sz w:val="18"/>
+                <w:sz w:val="20"/>
               </w:rPr>
               <w:t>✓</w:t>
             </w:r>
@@ -5488,7 +5558,7 @@
         </w:tc>
         <w:tc>
           <w:tcPr>
-            <w:tcW w:w="523" w:type="dxa"/>
+            <w:tcW w:w="556" w:type="dxa"/>
             <w:shd w:val="clear" w:color="auto" w:fill="70AD47"/>
           </w:tcPr>
           <w:p>
@@ -5501,7 +5571,7 @@
                 <w:rFonts w:ascii="Times New Roman" w:hAnsi="Times New Roman"/>
                 <w:b w:val="0"/>
                 <w:color w:val="FFFFFF"/>
-                <w:sz w:val="18"/>
+                <w:sz w:val="20"/>
               </w:rPr>
               <w:t>✓</w:t>
             </w:r>
@@ -5509,7 +5579,7 @@
         </w:tc>
         <w:tc>
           <w:tcPr>
-            <w:tcW w:w="523" w:type="dxa"/>
+            <w:tcW w:w="556" w:type="dxa"/>
             <w:shd w:val="clear" w:color="auto" w:fill="FFFFFF"/>
           </w:tcPr>
           <w:p>
@@ -5522,14 +5592,14 @@
                 <w:rFonts w:ascii="Times New Roman" w:hAnsi="Times New Roman"/>
                 <w:b w:val="0"/>
                 <w:color w:val="000000"/>
-                <w:sz w:val="18"/>
+                <w:sz w:val="20"/>
               </w:rPr>
             </w:r>
           </w:p>
         </w:tc>
         <w:tc>
           <w:tcPr>
-            <w:tcW w:w="523" w:type="dxa"/>
+            <w:tcW w:w="556" w:type="dxa"/>
             <w:shd w:val="clear" w:color="auto" w:fill="FFFFFF"/>
           </w:tcPr>
           <w:p>
@@ -5542,14 +5612,14 @@
                 <w:rFonts w:ascii="Times New Roman" w:hAnsi="Times New Roman"/>
                 <w:b w:val="0"/>
                 <w:color w:val="000000"/>
-                <w:sz w:val="18"/>
+                <w:sz w:val="20"/>
               </w:rPr>
             </w:r>
           </w:p>
         </w:tc>
         <w:tc>
           <w:tcPr>
-            <w:tcW w:w="523" w:type="dxa"/>
+            <w:tcW w:w="556" w:type="dxa"/>
             <w:shd w:val="clear" w:color="auto" w:fill="FFFFFF"/>
           </w:tcPr>
           <w:p>
@@ -5562,14 +5632,14 @@
                 <w:rFonts w:ascii="Times New Roman" w:hAnsi="Times New Roman"/>
                 <w:b w:val="0"/>
                 <w:color w:val="000000"/>
-                <w:sz w:val="18"/>
+                <w:sz w:val="20"/>
               </w:rPr>
             </w:r>
           </w:p>
         </w:tc>
         <w:tc>
           <w:tcPr>
-            <w:tcW w:w="523" w:type="dxa"/>
+            <w:tcW w:w="556" w:type="dxa"/>
             <w:shd w:val="clear" w:color="auto" w:fill="FFFFFF"/>
           </w:tcPr>
           <w:p>
@@ -5582,14 +5652,14 @@
                 <w:rFonts w:ascii="Times New Roman" w:hAnsi="Times New Roman"/>
                 <w:b w:val="0"/>
                 <w:color w:val="000000"/>
-                <w:sz w:val="18"/>
+                <w:sz w:val="20"/>
               </w:rPr>
             </w:r>
           </w:p>
         </w:tc>
         <w:tc>
           <w:tcPr>
-            <w:tcW w:w="523" w:type="dxa"/>
+            <w:tcW w:w="567" w:type="dxa"/>
             <w:shd w:val="clear" w:color="auto" w:fill="FFFFFF"/>
           </w:tcPr>
           <w:p>
@@ -5602,14 +5672,14 @@
                 <w:rFonts w:ascii="Times New Roman" w:hAnsi="Times New Roman"/>
                 <w:b w:val="0"/>
                 <w:color w:val="000000"/>
-                <w:sz w:val="18"/>
+                <w:sz w:val="20"/>
               </w:rPr>
             </w:r>
           </w:p>
         </w:tc>
         <w:tc>
           <w:tcPr>
-            <w:tcW w:w="523" w:type="dxa"/>
+            <w:tcW w:w="567" w:type="dxa"/>
             <w:shd w:val="clear" w:color="auto" w:fill="FFFFFF"/>
           </w:tcPr>
           <w:p>
@@ -5622,7 +5692,7 @@
                 <w:rFonts w:ascii="Times New Roman" w:hAnsi="Times New Roman"/>
                 <w:b w:val="0"/>
                 <w:color w:val="000000"/>
-                <w:sz w:val="18"/>
+                <w:sz w:val="20"/>
               </w:rPr>
             </w:r>
           </w:p>
@@ -5631,7 +5701,7 @@
       <w:tr>
         <w:tc>
           <w:tcPr>
-            <w:tcW w:w="3033" w:type="dxa"/>
+            <w:tcW w:w="2683" w:type="dxa"/>
             <w:shd w:val="clear" w:color="auto" w:fill="D9E1F2"/>
           </w:tcPr>
           <w:p>
@@ -5652,7 +5722,7 @@
         </w:tc>
         <w:tc>
           <w:tcPr>
-            <w:tcW w:w="523" w:type="dxa"/>
+            <w:tcW w:w="556" w:type="dxa"/>
             <w:shd w:val="clear" w:color="auto" w:fill="D9E1F2"/>
           </w:tcPr>
           <w:p>
@@ -5665,14 +5735,14 @@
                 <w:rFonts w:ascii="Times New Roman" w:hAnsi="Times New Roman"/>
                 <w:b w:val="0"/>
                 <w:color w:val="000000"/>
-                <w:sz w:val="18"/>
+                <w:sz w:val="20"/>
               </w:rPr>
             </w:r>
           </w:p>
         </w:tc>
         <w:tc>
           <w:tcPr>
-            <w:tcW w:w="523" w:type="dxa"/>
+            <w:tcW w:w="556" w:type="dxa"/>
             <w:shd w:val="clear" w:color="auto" w:fill="D9E1F2"/>
           </w:tcPr>
           <w:p>
@@ -5685,14 +5755,14 @@
                 <w:rFonts w:ascii="Times New Roman" w:hAnsi="Times New Roman"/>
                 <w:b w:val="0"/>
                 <w:color w:val="000000"/>
-                <w:sz w:val="18"/>
+                <w:sz w:val="20"/>
               </w:rPr>
             </w:r>
           </w:p>
         </w:tc>
         <w:tc>
           <w:tcPr>
-            <w:tcW w:w="523" w:type="dxa"/>
+            <w:tcW w:w="556" w:type="dxa"/>
             <w:shd w:val="clear" w:color="auto" w:fill="D9E1F2"/>
           </w:tcPr>
           <w:p>
@@ -5705,14 +5775,14 @@
                 <w:rFonts w:ascii="Times New Roman" w:hAnsi="Times New Roman"/>
                 <w:b w:val="0"/>
                 <w:color w:val="000000"/>
-                <w:sz w:val="18"/>
+                <w:sz w:val="20"/>
               </w:rPr>
             </w:r>
           </w:p>
         </w:tc>
         <w:tc>
           <w:tcPr>
-            <w:tcW w:w="523" w:type="dxa"/>
+            <w:tcW w:w="556" w:type="dxa"/>
             <w:shd w:val="clear" w:color="auto" w:fill="70AD47"/>
           </w:tcPr>
           <w:p>
@@ -5725,7 +5795,7 @@
                 <w:rFonts w:ascii="Times New Roman" w:hAnsi="Times New Roman"/>
                 <w:b w:val="0"/>
                 <w:color w:val="FFFFFF"/>
-                <w:sz w:val="18"/>
+                <w:sz w:val="20"/>
               </w:rPr>
               <w:t>✓</w:t>
             </w:r>
@@ -5733,7 +5803,7 @@
         </w:tc>
         <w:tc>
           <w:tcPr>
-            <w:tcW w:w="523" w:type="dxa"/>
+            <w:tcW w:w="556" w:type="dxa"/>
             <w:shd w:val="clear" w:color="auto" w:fill="70AD47"/>
           </w:tcPr>
           <w:p>
@@ -5746,7 +5816,7 @@
                 <w:rFonts w:ascii="Times New Roman" w:hAnsi="Times New Roman"/>
                 <w:b w:val="0"/>
                 <w:color w:val="FFFFFF"/>
-                <w:sz w:val="18"/>
+                <w:sz w:val="20"/>
               </w:rPr>
               <w:t>✓</w:t>
             </w:r>
@@ -5754,7 +5824,7 @@
         </w:tc>
         <w:tc>
           <w:tcPr>
-            <w:tcW w:w="523" w:type="dxa"/>
+            <w:tcW w:w="556" w:type="dxa"/>
             <w:shd w:val="clear" w:color="auto" w:fill="D9E1F2"/>
           </w:tcPr>
           <w:p>
@@ -5767,14 +5837,14 @@
                 <w:rFonts w:ascii="Times New Roman" w:hAnsi="Times New Roman"/>
                 <w:b w:val="0"/>
                 <w:color w:val="000000"/>
-                <w:sz w:val="18"/>
+                <w:sz w:val="20"/>
               </w:rPr>
             </w:r>
           </w:p>
         </w:tc>
         <w:tc>
           <w:tcPr>
-            <w:tcW w:w="523" w:type="dxa"/>
+            <w:tcW w:w="556" w:type="dxa"/>
             <w:shd w:val="clear" w:color="auto" w:fill="D9E1F2"/>
           </w:tcPr>
           <w:p>
@@ -5787,14 +5857,14 @@
                 <w:rFonts w:ascii="Times New Roman" w:hAnsi="Times New Roman"/>
                 <w:b w:val="0"/>
                 <w:color w:val="000000"/>
-                <w:sz w:val="18"/>
+                <w:sz w:val="20"/>
               </w:rPr>
             </w:r>
           </w:p>
         </w:tc>
         <w:tc>
           <w:tcPr>
-            <w:tcW w:w="523" w:type="dxa"/>
+            <w:tcW w:w="556" w:type="dxa"/>
             <w:shd w:val="clear" w:color="auto" w:fill="D9E1F2"/>
           </w:tcPr>
           <w:p>
@@ -5807,14 +5877,14 @@
                 <w:rFonts w:ascii="Times New Roman" w:hAnsi="Times New Roman"/>
                 <w:b w:val="0"/>
                 <w:color w:val="000000"/>
-                <w:sz w:val="18"/>
+                <w:sz w:val="20"/>
               </w:rPr>
             </w:r>
           </w:p>
         </w:tc>
         <w:tc>
           <w:tcPr>
-            <w:tcW w:w="523" w:type="dxa"/>
+            <w:tcW w:w="567" w:type="dxa"/>
             <w:shd w:val="clear" w:color="auto" w:fill="D9E1F2"/>
           </w:tcPr>
           <w:p>
@@ -5827,14 +5897,14 @@
                 <w:rFonts w:ascii="Times New Roman" w:hAnsi="Times New Roman"/>
                 <w:b w:val="0"/>
                 <w:color w:val="000000"/>
-                <w:sz w:val="18"/>
+                <w:sz w:val="20"/>
               </w:rPr>
             </w:r>
           </w:p>
         </w:tc>
         <w:tc>
           <w:tcPr>
-            <w:tcW w:w="523" w:type="dxa"/>
+            <w:tcW w:w="567" w:type="dxa"/>
             <w:shd w:val="clear" w:color="auto" w:fill="D9E1F2"/>
           </w:tcPr>
           <w:p>
@@ -5847,7 +5917,7 @@
                 <w:rFonts w:ascii="Times New Roman" w:hAnsi="Times New Roman"/>
                 <w:b w:val="0"/>
                 <w:color w:val="000000"/>
-                <w:sz w:val="18"/>
+                <w:sz w:val="20"/>
               </w:rPr>
             </w:r>
           </w:p>
@@ -5856,7 +5926,7 @@
       <w:tr>
         <w:tc>
           <w:tcPr>
-            <w:tcW w:w="3033" w:type="dxa"/>
+            <w:tcW w:w="2683" w:type="dxa"/>
             <w:shd w:val="clear" w:color="auto" w:fill="FFFFFF"/>
           </w:tcPr>
           <w:p>
@@ -5877,7 +5947,7 @@
         </w:tc>
         <w:tc>
           <w:tcPr>
-            <w:tcW w:w="523" w:type="dxa"/>
+            <w:tcW w:w="556" w:type="dxa"/>
             <w:shd w:val="clear" w:color="auto" w:fill="FFFFFF"/>
           </w:tcPr>
           <w:p>
@@ -5890,14 +5960,14 @@
                 <w:rFonts w:ascii="Times New Roman" w:hAnsi="Times New Roman"/>
                 <w:b w:val="0"/>
                 <w:color w:val="000000"/>
-                <w:sz w:val="18"/>
+                <w:sz w:val="20"/>
               </w:rPr>
             </w:r>
           </w:p>
         </w:tc>
         <w:tc>
           <w:tcPr>
-            <w:tcW w:w="523" w:type="dxa"/>
+            <w:tcW w:w="556" w:type="dxa"/>
             <w:shd w:val="clear" w:color="auto" w:fill="FFFFFF"/>
           </w:tcPr>
           <w:p>
@@ -5910,14 +5980,14 @@
                 <w:rFonts w:ascii="Times New Roman" w:hAnsi="Times New Roman"/>
                 <w:b w:val="0"/>
                 <w:color w:val="000000"/>
-                <w:sz w:val="18"/>
+                <w:sz w:val="20"/>
               </w:rPr>
             </w:r>
           </w:p>
         </w:tc>
         <w:tc>
           <w:tcPr>
-            <w:tcW w:w="523" w:type="dxa"/>
+            <w:tcW w:w="556" w:type="dxa"/>
             <w:shd w:val="clear" w:color="auto" w:fill="FFFFFF"/>
           </w:tcPr>
           <w:p>
@@ -5930,14 +6000,14 @@
                 <w:rFonts w:ascii="Times New Roman" w:hAnsi="Times New Roman"/>
                 <w:b w:val="0"/>
                 <w:color w:val="000000"/>
-                <w:sz w:val="18"/>
+                <w:sz w:val="20"/>
               </w:rPr>
             </w:r>
           </w:p>
         </w:tc>
         <w:tc>
           <w:tcPr>
-            <w:tcW w:w="523" w:type="dxa"/>
+            <w:tcW w:w="556" w:type="dxa"/>
             <w:shd w:val="clear" w:color="auto" w:fill="FFFFFF"/>
           </w:tcPr>
           <w:p>
@@ -5950,14 +6020,14 @@
                 <w:rFonts w:ascii="Times New Roman" w:hAnsi="Times New Roman"/>
                 <w:b w:val="0"/>
                 <w:color w:val="000000"/>
-                <w:sz w:val="18"/>
+                <w:sz w:val="20"/>
               </w:rPr>
             </w:r>
           </w:p>
         </w:tc>
         <w:tc>
           <w:tcPr>
-            <w:tcW w:w="523" w:type="dxa"/>
+            <w:tcW w:w="556" w:type="dxa"/>
             <w:shd w:val="clear" w:color="auto" w:fill="70AD47"/>
           </w:tcPr>
           <w:p>
@@ -5970,7 +6040,7 @@
                 <w:rFonts w:ascii="Times New Roman" w:hAnsi="Times New Roman"/>
                 <w:b w:val="0"/>
                 <w:color w:val="FFFFFF"/>
-                <w:sz w:val="18"/>
+                <w:sz w:val="20"/>
               </w:rPr>
               <w:t>✓</w:t>
             </w:r>
@@ -5978,7 +6048,7 @@
         </w:tc>
         <w:tc>
           <w:tcPr>
-            <w:tcW w:w="523" w:type="dxa"/>
+            <w:tcW w:w="556" w:type="dxa"/>
             <w:shd w:val="clear" w:color="auto" w:fill="70AD47"/>
           </w:tcPr>
           <w:p>
@@ -5991,7 +6061,7 @@
                 <w:rFonts w:ascii="Times New Roman" w:hAnsi="Times New Roman"/>
                 <w:b w:val="0"/>
                 <w:color w:val="FFFFFF"/>
-                <w:sz w:val="18"/>
+                <w:sz w:val="20"/>
               </w:rPr>
               <w:t>✓</w:t>
             </w:r>
@@ -5999,7 +6069,7 @@
         </w:tc>
         <w:tc>
           <w:tcPr>
-            <w:tcW w:w="523" w:type="dxa"/>
+            <w:tcW w:w="556" w:type="dxa"/>
             <w:shd w:val="clear" w:color="auto" w:fill="FFFFFF"/>
           </w:tcPr>
           <w:p>
@@ -6012,14 +6082,14 @@
                 <w:rFonts w:ascii="Times New Roman" w:hAnsi="Times New Roman"/>
                 <w:b w:val="0"/>
                 <w:color w:val="000000"/>
-                <w:sz w:val="18"/>
+                <w:sz w:val="20"/>
               </w:rPr>
             </w:r>
           </w:p>
         </w:tc>
         <w:tc>
           <w:tcPr>
-            <w:tcW w:w="523" w:type="dxa"/>
+            <w:tcW w:w="556" w:type="dxa"/>
             <w:shd w:val="clear" w:color="auto" w:fill="FFFFFF"/>
           </w:tcPr>
           <w:p>
@@ -6032,14 +6102,14 @@
                 <w:rFonts w:ascii="Times New Roman" w:hAnsi="Times New Roman"/>
                 <w:b w:val="0"/>
                 <w:color w:val="000000"/>
-                <w:sz w:val="18"/>
+                <w:sz w:val="20"/>
               </w:rPr>
             </w:r>
           </w:p>
         </w:tc>
         <w:tc>
           <w:tcPr>
-            <w:tcW w:w="523" w:type="dxa"/>
+            <w:tcW w:w="567" w:type="dxa"/>
             <w:shd w:val="clear" w:color="auto" w:fill="FFFFFF"/>
           </w:tcPr>
           <w:p>
@@ -6052,14 +6122,14 @@
                 <w:rFonts w:ascii="Times New Roman" w:hAnsi="Times New Roman"/>
                 <w:b w:val="0"/>
                 <w:color w:val="000000"/>
-                <w:sz w:val="18"/>
+                <w:sz w:val="20"/>
               </w:rPr>
             </w:r>
           </w:p>
         </w:tc>
         <w:tc>
           <w:tcPr>
-            <w:tcW w:w="523" w:type="dxa"/>
+            <w:tcW w:w="567" w:type="dxa"/>
             <w:shd w:val="clear" w:color="auto" w:fill="FFFFFF"/>
           </w:tcPr>
           <w:p>
@@ -6072,7 +6142,7 @@
                 <w:rFonts w:ascii="Times New Roman" w:hAnsi="Times New Roman"/>
                 <w:b w:val="0"/>
                 <w:color w:val="000000"/>
-                <w:sz w:val="18"/>
+                <w:sz w:val="20"/>
               </w:rPr>
             </w:r>
           </w:p>
@@ -6081,7 +6151,7 @@
       <w:tr>
         <w:tc>
           <w:tcPr>
-            <w:tcW w:w="3033" w:type="dxa"/>
+            <w:tcW w:w="2683" w:type="dxa"/>
             <w:shd w:val="clear" w:color="auto" w:fill="D9E1F2"/>
           </w:tcPr>
           <w:p>
@@ -6102,7 +6172,7 @@
         </w:tc>
         <w:tc>
           <w:tcPr>
-            <w:tcW w:w="523" w:type="dxa"/>
+            <w:tcW w:w="556" w:type="dxa"/>
             <w:shd w:val="clear" w:color="auto" w:fill="D9E1F2"/>
           </w:tcPr>
           <w:p>
@@ -6115,14 +6185,14 @@
                 <w:rFonts w:ascii="Times New Roman" w:hAnsi="Times New Roman"/>
                 <w:b w:val="0"/>
                 <w:color w:val="000000"/>
-                <w:sz w:val="18"/>
+                <w:sz w:val="20"/>
               </w:rPr>
             </w:r>
           </w:p>
         </w:tc>
         <w:tc>
           <w:tcPr>
-            <w:tcW w:w="523" w:type="dxa"/>
+            <w:tcW w:w="556" w:type="dxa"/>
             <w:shd w:val="clear" w:color="auto" w:fill="D9E1F2"/>
           </w:tcPr>
           <w:p>
@@ -6135,14 +6205,14 @@
                 <w:rFonts w:ascii="Times New Roman" w:hAnsi="Times New Roman"/>
                 <w:b w:val="0"/>
                 <w:color w:val="000000"/>
-                <w:sz w:val="18"/>
+                <w:sz w:val="20"/>
               </w:rPr>
             </w:r>
           </w:p>
         </w:tc>
         <w:tc>
           <w:tcPr>
-            <w:tcW w:w="523" w:type="dxa"/>
+            <w:tcW w:w="556" w:type="dxa"/>
             <w:shd w:val="clear" w:color="auto" w:fill="D9E1F2"/>
           </w:tcPr>
           <w:p>
@@ -6155,14 +6225,14 @@
                 <w:rFonts w:ascii="Times New Roman" w:hAnsi="Times New Roman"/>
                 <w:b w:val="0"/>
                 <w:color w:val="000000"/>
-                <w:sz w:val="18"/>
+                <w:sz w:val="20"/>
               </w:rPr>
             </w:r>
           </w:p>
         </w:tc>
         <w:tc>
           <w:tcPr>
-            <w:tcW w:w="523" w:type="dxa"/>
+            <w:tcW w:w="556" w:type="dxa"/>
             <w:shd w:val="clear" w:color="auto" w:fill="D9E1F2"/>
           </w:tcPr>
           <w:p>
@@ -6175,14 +6245,14 @@
                 <w:rFonts w:ascii="Times New Roman" w:hAnsi="Times New Roman"/>
                 <w:b w:val="0"/>
                 <w:color w:val="000000"/>
-                <w:sz w:val="18"/>
+                <w:sz w:val="20"/>
               </w:rPr>
             </w:r>
           </w:p>
         </w:tc>
         <w:tc>
           <w:tcPr>
-            <w:tcW w:w="523" w:type="dxa"/>
+            <w:tcW w:w="556" w:type="dxa"/>
             <w:shd w:val="clear" w:color="auto" w:fill="D9E1F2"/>
           </w:tcPr>
           <w:p>
@@ -6195,14 +6265,14 @@
                 <w:rFonts w:ascii="Times New Roman" w:hAnsi="Times New Roman"/>
                 <w:b w:val="0"/>
                 <w:color w:val="000000"/>
-                <w:sz w:val="18"/>
+                <w:sz w:val="20"/>
               </w:rPr>
             </w:r>
           </w:p>
         </w:tc>
         <w:tc>
           <w:tcPr>
-            <w:tcW w:w="523" w:type="dxa"/>
+            <w:tcW w:w="556" w:type="dxa"/>
             <w:shd w:val="clear" w:color="auto" w:fill="70AD47"/>
           </w:tcPr>
           <w:p>
@@ -6215,7 +6285,7 @@
                 <w:rFonts w:ascii="Times New Roman" w:hAnsi="Times New Roman"/>
                 <w:b w:val="0"/>
                 <w:color w:val="FFFFFF"/>
-                <w:sz w:val="18"/>
+                <w:sz w:val="20"/>
               </w:rPr>
               <w:t>✓</w:t>
             </w:r>
@@ -6223,7 +6293,7 @@
         </w:tc>
         <w:tc>
           <w:tcPr>
-            <w:tcW w:w="523" w:type="dxa"/>
+            <w:tcW w:w="556" w:type="dxa"/>
             <w:shd w:val="clear" w:color="auto" w:fill="D9E1F2"/>
           </w:tcPr>
           <w:p>
@@ -6236,14 +6306,14 @@
                 <w:rFonts w:ascii="Times New Roman" w:hAnsi="Times New Roman"/>
                 <w:b w:val="0"/>
                 <w:color w:val="000000"/>
-                <w:sz w:val="18"/>
+                <w:sz w:val="20"/>
               </w:rPr>
             </w:r>
           </w:p>
         </w:tc>
         <w:tc>
           <w:tcPr>
-            <w:tcW w:w="523" w:type="dxa"/>
+            <w:tcW w:w="556" w:type="dxa"/>
             <w:shd w:val="clear" w:color="auto" w:fill="D9E1F2"/>
           </w:tcPr>
           <w:p>
@@ -6256,14 +6326,14 @@
                 <w:rFonts w:ascii="Times New Roman" w:hAnsi="Times New Roman"/>
                 <w:b w:val="0"/>
                 <w:color w:val="000000"/>
-                <w:sz w:val="18"/>
+                <w:sz w:val="20"/>
               </w:rPr>
             </w:r>
           </w:p>
         </w:tc>
         <w:tc>
           <w:tcPr>
-            <w:tcW w:w="523" w:type="dxa"/>
+            <w:tcW w:w="567" w:type="dxa"/>
             <w:shd w:val="clear" w:color="auto" w:fill="D9E1F2"/>
           </w:tcPr>
           <w:p>
@@ -6276,14 +6346,14 @@
                 <w:rFonts w:ascii="Times New Roman" w:hAnsi="Times New Roman"/>
                 <w:b w:val="0"/>
                 <w:color w:val="000000"/>
-                <w:sz w:val="18"/>
+                <w:sz w:val="20"/>
               </w:rPr>
             </w:r>
           </w:p>
         </w:tc>
         <w:tc>
           <w:tcPr>
-            <w:tcW w:w="523" w:type="dxa"/>
+            <w:tcW w:w="567" w:type="dxa"/>
             <w:shd w:val="clear" w:color="auto" w:fill="D9E1F2"/>
           </w:tcPr>
           <w:p>
@@ -6296,7 +6366,7 @@
                 <w:rFonts w:ascii="Times New Roman" w:hAnsi="Times New Roman"/>
                 <w:b w:val="0"/>
                 <w:color w:val="000000"/>
-                <w:sz w:val="18"/>
+                <w:sz w:val="20"/>
               </w:rPr>
             </w:r>
           </w:p>
@@ -6305,7 +6375,7 @@
       <w:tr>
         <w:tc>
           <w:tcPr>
-            <w:tcW w:w="3033" w:type="dxa"/>
+            <w:tcW w:w="2683" w:type="dxa"/>
             <w:shd w:val="clear" w:color="auto" w:fill="FFFFFF"/>
           </w:tcPr>
           <w:p>
@@ -6326,7 +6396,7 @@
         </w:tc>
         <w:tc>
           <w:tcPr>
-            <w:tcW w:w="523" w:type="dxa"/>
+            <w:tcW w:w="556" w:type="dxa"/>
             <w:shd w:val="clear" w:color="auto" w:fill="FFFFFF"/>
           </w:tcPr>
           <w:p>
@@ -6339,14 +6409,14 @@
                 <w:rFonts w:ascii="Times New Roman" w:hAnsi="Times New Roman"/>
                 <w:b w:val="0"/>
                 <w:color w:val="000000"/>
-                <w:sz w:val="18"/>
+                <w:sz w:val="20"/>
               </w:rPr>
             </w:r>
           </w:p>
         </w:tc>
         <w:tc>
           <w:tcPr>
-            <w:tcW w:w="523" w:type="dxa"/>
+            <w:tcW w:w="556" w:type="dxa"/>
             <w:shd w:val="clear" w:color="auto" w:fill="FFFFFF"/>
           </w:tcPr>
           <w:p>
@@ -6359,14 +6429,14 @@
                 <w:rFonts w:ascii="Times New Roman" w:hAnsi="Times New Roman"/>
                 <w:b w:val="0"/>
                 <w:color w:val="000000"/>
-                <w:sz w:val="18"/>
+                <w:sz w:val="20"/>
               </w:rPr>
             </w:r>
           </w:p>
         </w:tc>
         <w:tc>
           <w:tcPr>
-            <w:tcW w:w="523" w:type="dxa"/>
+            <w:tcW w:w="556" w:type="dxa"/>
             <w:shd w:val="clear" w:color="auto" w:fill="FFFFFF"/>
           </w:tcPr>
           <w:p>
@@ -6379,14 +6449,14 @@
                 <w:rFonts w:ascii="Times New Roman" w:hAnsi="Times New Roman"/>
                 <w:b w:val="0"/>
                 <w:color w:val="000000"/>
-                <w:sz w:val="18"/>
+                <w:sz w:val="20"/>
               </w:rPr>
             </w:r>
           </w:p>
         </w:tc>
         <w:tc>
           <w:tcPr>
-            <w:tcW w:w="523" w:type="dxa"/>
+            <w:tcW w:w="556" w:type="dxa"/>
             <w:shd w:val="clear" w:color="auto" w:fill="FFFFFF"/>
           </w:tcPr>
           <w:p>
@@ -6399,14 +6469,14 @@
                 <w:rFonts w:ascii="Times New Roman" w:hAnsi="Times New Roman"/>
                 <w:b w:val="0"/>
                 <w:color w:val="000000"/>
-                <w:sz w:val="18"/>
+                <w:sz w:val="20"/>
               </w:rPr>
             </w:r>
           </w:p>
         </w:tc>
         <w:tc>
           <w:tcPr>
-            <w:tcW w:w="523" w:type="dxa"/>
+            <w:tcW w:w="556" w:type="dxa"/>
             <w:shd w:val="clear" w:color="auto" w:fill="FFFFFF"/>
           </w:tcPr>
           <w:p>
@@ -6419,14 +6489,14 @@
                 <w:rFonts w:ascii="Times New Roman" w:hAnsi="Times New Roman"/>
                 <w:b w:val="0"/>
                 <w:color w:val="000000"/>
-                <w:sz w:val="18"/>
+                <w:sz w:val="20"/>
               </w:rPr>
             </w:r>
           </w:p>
         </w:tc>
         <w:tc>
           <w:tcPr>
-            <w:tcW w:w="523" w:type="dxa"/>
+            <w:tcW w:w="556" w:type="dxa"/>
             <w:shd w:val="clear" w:color="auto" w:fill="FFFFFF"/>
           </w:tcPr>
           <w:p>
@@ -6439,14 +6509,14 @@
                 <w:rFonts w:ascii="Times New Roman" w:hAnsi="Times New Roman"/>
                 <w:b w:val="0"/>
                 <w:color w:val="000000"/>
-                <w:sz w:val="18"/>
+                <w:sz w:val="20"/>
               </w:rPr>
             </w:r>
           </w:p>
         </w:tc>
         <w:tc>
           <w:tcPr>
-            <w:tcW w:w="523" w:type="dxa"/>
+            <w:tcW w:w="556" w:type="dxa"/>
             <w:shd w:val="clear" w:color="auto" w:fill="70AD47"/>
           </w:tcPr>
           <w:p>
@@ -6459,7 +6529,7 @@
                 <w:rFonts w:ascii="Times New Roman" w:hAnsi="Times New Roman"/>
                 <w:b w:val="0"/>
                 <w:color w:val="FFFFFF"/>
-                <w:sz w:val="18"/>
+                <w:sz w:val="20"/>
               </w:rPr>
               <w:t>✓</w:t>
             </w:r>
@@ -6467,7 +6537,7 @@
         </w:tc>
         <w:tc>
           <w:tcPr>
-            <w:tcW w:w="523" w:type="dxa"/>
+            <w:tcW w:w="556" w:type="dxa"/>
             <w:shd w:val="clear" w:color="auto" w:fill="70AD47"/>
           </w:tcPr>
           <w:p>
@@ -6480,7 +6550,7 @@
                 <w:rFonts w:ascii="Times New Roman" w:hAnsi="Times New Roman"/>
                 <w:b w:val="0"/>
                 <w:color w:val="FFFFFF"/>
-                <w:sz w:val="18"/>
+                <w:sz w:val="20"/>
               </w:rPr>
               <w:t>✓</w:t>
             </w:r>
@@ -6488,7 +6558,7 @@
         </w:tc>
         <w:tc>
           <w:tcPr>
-            <w:tcW w:w="523" w:type="dxa"/>
+            <w:tcW w:w="567" w:type="dxa"/>
             <w:shd w:val="clear" w:color="auto" w:fill="FFFFFF"/>
           </w:tcPr>
           <w:p>
@@ -6501,14 +6571,14 @@
                 <w:rFonts w:ascii="Times New Roman" w:hAnsi="Times New Roman"/>
                 <w:b w:val="0"/>
                 <w:color w:val="000000"/>
-                <w:sz w:val="18"/>
+                <w:sz w:val="20"/>
               </w:rPr>
             </w:r>
           </w:p>
         </w:tc>
         <w:tc>
           <w:tcPr>
-            <w:tcW w:w="523" w:type="dxa"/>
+            <w:tcW w:w="567" w:type="dxa"/>
             <w:shd w:val="clear" w:color="auto" w:fill="FFFFFF"/>
           </w:tcPr>
           <w:p>
@@ -6521,7 +6591,7 @@
                 <w:rFonts w:ascii="Times New Roman" w:hAnsi="Times New Roman"/>
                 <w:b w:val="0"/>
                 <w:color w:val="000000"/>
-                <w:sz w:val="18"/>
+                <w:sz w:val="20"/>
               </w:rPr>
             </w:r>
           </w:p>
@@ -6530,7 +6600,7 @@
       <w:tr>
         <w:tc>
           <w:tcPr>
-            <w:tcW w:w="3033" w:type="dxa"/>
+            <w:tcW w:w="2683" w:type="dxa"/>
             <w:shd w:val="clear" w:color="auto" w:fill="D9E1F2"/>
           </w:tcPr>
           <w:p>
@@ -6551,7 +6621,7 @@
         </w:tc>
         <w:tc>
           <w:tcPr>
-            <w:tcW w:w="523" w:type="dxa"/>
+            <w:tcW w:w="556" w:type="dxa"/>
             <w:shd w:val="clear" w:color="auto" w:fill="D9E1F2"/>
           </w:tcPr>
           <w:p>
@@ -6564,14 +6634,14 @@
                 <w:rFonts w:ascii="Times New Roman" w:hAnsi="Times New Roman"/>
                 <w:b w:val="0"/>
                 <w:color w:val="000000"/>
-                <w:sz w:val="18"/>
+                <w:sz w:val="20"/>
               </w:rPr>
             </w:r>
           </w:p>
         </w:tc>
         <w:tc>
           <w:tcPr>
-            <w:tcW w:w="523" w:type="dxa"/>
+            <w:tcW w:w="556" w:type="dxa"/>
             <w:shd w:val="clear" w:color="auto" w:fill="D9E1F2"/>
           </w:tcPr>
           <w:p>
@@ -6584,14 +6654,14 @@
                 <w:rFonts w:ascii="Times New Roman" w:hAnsi="Times New Roman"/>
                 <w:b w:val="0"/>
                 <w:color w:val="000000"/>
-                <w:sz w:val="18"/>
+                <w:sz w:val="20"/>
               </w:rPr>
             </w:r>
           </w:p>
         </w:tc>
         <w:tc>
           <w:tcPr>
-            <w:tcW w:w="523" w:type="dxa"/>
+            <w:tcW w:w="556" w:type="dxa"/>
             <w:shd w:val="clear" w:color="auto" w:fill="D9E1F2"/>
           </w:tcPr>
           <w:p>
@@ -6604,14 +6674,14 @@
                 <w:rFonts w:ascii="Times New Roman" w:hAnsi="Times New Roman"/>
                 <w:b w:val="0"/>
                 <w:color w:val="000000"/>
-                <w:sz w:val="18"/>
+                <w:sz w:val="20"/>
               </w:rPr>
             </w:r>
           </w:p>
         </w:tc>
         <w:tc>
           <w:tcPr>
-            <w:tcW w:w="523" w:type="dxa"/>
+            <w:tcW w:w="556" w:type="dxa"/>
             <w:shd w:val="clear" w:color="auto" w:fill="D9E1F2"/>
           </w:tcPr>
           <w:p>
@@ -6624,14 +6694,14 @@
                 <w:rFonts w:ascii="Times New Roman" w:hAnsi="Times New Roman"/>
                 <w:b w:val="0"/>
                 <w:color w:val="000000"/>
-                <w:sz w:val="18"/>
+                <w:sz w:val="20"/>
               </w:rPr>
             </w:r>
           </w:p>
         </w:tc>
         <w:tc>
           <w:tcPr>
-            <w:tcW w:w="523" w:type="dxa"/>
+            <w:tcW w:w="556" w:type="dxa"/>
             <w:shd w:val="clear" w:color="auto" w:fill="D9E1F2"/>
           </w:tcPr>
           <w:p>
@@ -6644,14 +6714,14 @@
                 <w:rFonts w:ascii="Times New Roman" w:hAnsi="Times New Roman"/>
                 <w:b w:val="0"/>
                 <w:color w:val="000000"/>
-                <w:sz w:val="18"/>
+                <w:sz w:val="20"/>
               </w:rPr>
             </w:r>
           </w:p>
         </w:tc>
         <w:tc>
           <w:tcPr>
-            <w:tcW w:w="523" w:type="dxa"/>
+            <w:tcW w:w="556" w:type="dxa"/>
             <w:shd w:val="clear" w:color="auto" w:fill="D9E1F2"/>
           </w:tcPr>
           <w:p>
@@ -6664,14 +6734,14 @@
                 <w:rFonts w:ascii="Times New Roman" w:hAnsi="Times New Roman"/>
                 <w:b w:val="0"/>
                 <w:color w:val="000000"/>
-                <w:sz w:val="18"/>
+                <w:sz w:val="20"/>
               </w:rPr>
             </w:r>
           </w:p>
         </w:tc>
         <w:tc>
           <w:tcPr>
-            <w:tcW w:w="523" w:type="dxa"/>
+            <w:tcW w:w="556" w:type="dxa"/>
             <w:shd w:val="clear" w:color="auto" w:fill="D9E1F2"/>
           </w:tcPr>
           <w:p>
@@ -6684,14 +6754,14 @@
                 <w:rFonts w:ascii="Times New Roman" w:hAnsi="Times New Roman"/>
                 <w:b w:val="0"/>
                 <w:color w:val="000000"/>
-                <w:sz w:val="18"/>
+                <w:sz w:val="20"/>
               </w:rPr>
             </w:r>
           </w:p>
         </w:tc>
         <w:tc>
           <w:tcPr>
-            <w:tcW w:w="523" w:type="dxa"/>
+            <w:tcW w:w="556" w:type="dxa"/>
             <w:shd w:val="clear" w:color="auto" w:fill="D9E1F2"/>
           </w:tcPr>
           <w:p>
@@ -6704,14 +6774,14 @@
                 <w:rFonts w:ascii="Times New Roman" w:hAnsi="Times New Roman"/>
                 <w:b w:val="0"/>
                 <w:color w:val="000000"/>
-                <w:sz w:val="18"/>
+                <w:sz w:val="20"/>
               </w:rPr>
             </w:r>
           </w:p>
         </w:tc>
         <w:tc>
           <w:tcPr>
-            <w:tcW w:w="523" w:type="dxa"/>
+            <w:tcW w:w="567" w:type="dxa"/>
             <w:shd w:val="clear" w:color="auto" w:fill="70AD47"/>
           </w:tcPr>
           <w:p>
@@ -6724,7 +6794,7 @@
                 <w:rFonts w:ascii="Times New Roman" w:hAnsi="Times New Roman"/>
                 <w:b w:val="0"/>
                 <w:color w:val="FFFFFF"/>
-                <w:sz w:val="18"/>
+                <w:sz w:val="20"/>
               </w:rPr>
               <w:t>✓</w:t>
             </w:r>
@@ -6732,7 +6802,7 @@
         </w:tc>
         <w:tc>
           <w:tcPr>
-            <w:tcW w:w="523" w:type="dxa"/>
+            <w:tcW w:w="567" w:type="dxa"/>
             <w:shd w:val="clear" w:color="auto" w:fill="D9E1F2"/>
           </w:tcPr>
           <w:p>
@@ -6745,7 +6815,7 @@
                 <w:rFonts w:ascii="Times New Roman" w:hAnsi="Times New Roman"/>
                 <w:b w:val="0"/>
                 <w:color w:val="000000"/>
-                <w:sz w:val="18"/>
+                <w:sz w:val="20"/>
               </w:rPr>
             </w:r>
           </w:p>
@@ -6754,7 +6824,7 @@
       <w:tr>
         <w:tc>
           <w:tcPr>
-            <w:tcW w:w="3033" w:type="dxa"/>
+            <w:tcW w:w="2683" w:type="dxa"/>
             <w:shd w:val="clear" w:color="auto" w:fill="FFFFFF"/>
           </w:tcPr>
           <w:p>
@@ -6775,7 +6845,7 @@
         </w:tc>
         <w:tc>
           <w:tcPr>
-            <w:tcW w:w="523" w:type="dxa"/>
+            <w:tcW w:w="556" w:type="dxa"/>
             <w:shd w:val="clear" w:color="auto" w:fill="FFFFFF"/>
           </w:tcPr>
           <w:p>
@@ -6788,14 +6858,14 @@
                 <w:rFonts w:ascii="Times New Roman" w:hAnsi="Times New Roman"/>
                 <w:b w:val="0"/>
                 <w:color w:val="000000"/>
-                <w:sz w:val="18"/>
+                <w:sz w:val="20"/>
               </w:rPr>
             </w:r>
           </w:p>
         </w:tc>
         <w:tc>
           <w:tcPr>
-            <w:tcW w:w="523" w:type="dxa"/>
+            <w:tcW w:w="556" w:type="dxa"/>
             <w:shd w:val="clear" w:color="auto" w:fill="FFFFFF"/>
           </w:tcPr>
           <w:p>
@@ -6808,14 +6878,14 @@
                 <w:rFonts w:ascii="Times New Roman" w:hAnsi="Times New Roman"/>
                 <w:b w:val="0"/>
                 <w:color w:val="000000"/>
-                <w:sz w:val="18"/>
+                <w:sz w:val="20"/>
               </w:rPr>
             </w:r>
           </w:p>
         </w:tc>
         <w:tc>
           <w:tcPr>
-            <w:tcW w:w="523" w:type="dxa"/>
+            <w:tcW w:w="556" w:type="dxa"/>
             <w:shd w:val="clear" w:color="auto" w:fill="FFFFFF"/>
           </w:tcPr>
           <w:p>
@@ -6828,14 +6898,14 @@
                 <w:rFonts w:ascii="Times New Roman" w:hAnsi="Times New Roman"/>
                 <w:b w:val="0"/>
                 <w:color w:val="000000"/>
-                <w:sz w:val="18"/>
+                <w:sz w:val="20"/>
               </w:rPr>
             </w:r>
           </w:p>
         </w:tc>
         <w:tc>
           <w:tcPr>
-            <w:tcW w:w="523" w:type="dxa"/>
+            <w:tcW w:w="556" w:type="dxa"/>
             <w:shd w:val="clear" w:color="auto" w:fill="FFFFFF"/>
           </w:tcPr>
           <w:p>
@@ -6848,14 +6918,14 @@
                 <w:rFonts w:ascii="Times New Roman" w:hAnsi="Times New Roman"/>
                 <w:b w:val="0"/>
                 <w:color w:val="000000"/>
-                <w:sz w:val="18"/>
+                <w:sz w:val="20"/>
               </w:rPr>
             </w:r>
           </w:p>
         </w:tc>
         <w:tc>
           <w:tcPr>
-            <w:tcW w:w="523" w:type="dxa"/>
+            <w:tcW w:w="556" w:type="dxa"/>
             <w:shd w:val="clear" w:color="auto" w:fill="FFFFFF"/>
           </w:tcPr>
           <w:p>
@@ -6868,14 +6938,14 @@
                 <w:rFonts w:ascii="Times New Roman" w:hAnsi="Times New Roman"/>
                 <w:b w:val="0"/>
                 <w:color w:val="000000"/>
-                <w:sz w:val="18"/>
+                <w:sz w:val="20"/>
               </w:rPr>
             </w:r>
           </w:p>
         </w:tc>
         <w:tc>
           <w:tcPr>
-            <w:tcW w:w="523" w:type="dxa"/>
+            <w:tcW w:w="556" w:type="dxa"/>
             <w:shd w:val="clear" w:color="auto" w:fill="FFFFFF"/>
           </w:tcPr>
           <w:p>
@@ -6888,14 +6958,14 @@
                 <w:rFonts w:ascii="Times New Roman" w:hAnsi="Times New Roman"/>
                 <w:b w:val="0"/>
                 <w:color w:val="000000"/>
-                <w:sz w:val="18"/>
+                <w:sz w:val="20"/>
               </w:rPr>
             </w:r>
           </w:p>
         </w:tc>
         <w:tc>
           <w:tcPr>
-            <w:tcW w:w="523" w:type="dxa"/>
+            <w:tcW w:w="556" w:type="dxa"/>
             <w:shd w:val="clear" w:color="auto" w:fill="FFFFFF"/>
           </w:tcPr>
           <w:p>
@@ -6908,14 +6978,14 @@
                 <w:rFonts w:ascii="Times New Roman" w:hAnsi="Times New Roman"/>
                 <w:b w:val="0"/>
                 <w:color w:val="000000"/>
-                <w:sz w:val="18"/>
+                <w:sz w:val="20"/>
               </w:rPr>
             </w:r>
           </w:p>
         </w:tc>
         <w:tc>
           <w:tcPr>
-            <w:tcW w:w="523" w:type="dxa"/>
+            <w:tcW w:w="556" w:type="dxa"/>
             <w:shd w:val="clear" w:color="auto" w:fill="FFFFFF"/>
           </w:tcPr>
           <w:p>
@@ -6928,14 +6998,14 @@
                 <w:rFonts w:ascii="Times New Roman" w:hAnsi="Times New Roman"/>
                 <w:b w:val="0"/>
                 <w:color w:val="000000"/>
-                <w:sz w:val="18"/>
+                <w:sz w:val="20"/>
               </w:rPr>
             </w:r>
           </w:p>
         </w:tc>
         <w:tc>
           <w:tcPr>
-            <w:tcW w:w="523" w:type="dxa"/>
+            <w:tcW w:w="567" w:type="dxa"/>
             <w:shd w:val="clear" w:color="auto" w:fill="FFFFFF"/>
           </w:tcPr>
           <w:p>
@@ -6948,14 +7018,14 @@
                 <w:rFonts w:ascii="Times New Roman" w:hAnsi="Times New Roman"/>
                 <w:b w:val="0"/>
                 <w:color w:val="000000"/>
-                <w:sz w:val="18"/>
+                <w:sz w:val="20"/>
               </w:rPr>
             </w:r>
           </w:p>
         </w:tc>
         <w:tc>
           <w:tcPr>
-            <w:tcW w:w="523" w:type="dxa"/>
+            <w:tcW w:w="567" w:type="dxa"/>
             <w:shd w:val="clear" w:color="auto" w:fill="70AD47"/>
           </w:tcPr>
           <w:p>
@@ -6968,7 +7038,7 @@
                 <w:rFonts w:ascii="Times New Roman" w:hAnsi="Times New Roman"/>
                 <w:b w:val="0"/>
                 <w:color w:val="FFFFFF"/>
-                <w:sz w:val="18"/>
+                <w:sz w:val="20"/>
               </w:rPr>
               <w:t>✓</w:t>
             </w:r>
@@ -6978,7 +7048,7 @@
       <w:tr>
         <w:tc>
           <w:tcPr>
-            <w:tcW w:w="3033" w:type="dxa"/>
+            <w:tcW w:w="2683" w:type="dxa"/>
             <w:shd w:val="clear" w:color="auto" w:fill="D9E1F2"/>
           </w:tcPr>
           <w:p>
@@ -6999,7 +7069,7 @@
         </w:tc>
         <w:tc>
           <w:tcPr>
-            <w:tcW w:w="523" w:type="dxa"/>
+            <w:tcW w:w="556" w:type="dxa"/>
             <w:shd w:val="clear" w:color="auto" w:fill="D9E1F2"/>
           </w:tcPr>
           <w:p>
@@ -7012,14 +7082,14 @@
                 <w:rFonts w:ascii="Times New Roman" w:hAnsi="Times New Roman"/>
                 <w:b w:val="0"/>
                 <w:color w:val="000000"/>
-                <w:sz w:val="18"/>
+                <w:sz w:val="20"/>
               </w:rPr>
             </w:r>
           </w:p>
         </w:tc>
         <w:tc>
           <w:tcPr>
-            <w:tcW w:w="523" w:type="dxa"/>
+            <w:tcW w:w="556" w:type="dxa"/>
             <w:shd w:val="clear" w:color="auto" w:fill="D9E1F2"/>
           </w:tcPr>
           <w:p>
@@ -7032,14 +7102,14 @@
                 <w:rFonts w:ascii="Times New Roman" w:hAnsi="Times New Roman"/>
                 <w:b w:val="0"/>
                 <w:color w:val="000000"/>
-                <w:sz w:val="18"/>
+                <w:sz w:val="20"/>
               </w:rPr>
             </w:r>
           </w:p>
         </w:tc>
         <w:tc>
           <w:tcPr>
-            <w:tcW w:w="523" w:type="dxa"/>
+            <w:tcW w:w="556" w:type="dxa"/>
             <w:shd w:val="clear" w:color="auto" w:fill="D9E1F2"/>
           </w:tcPr>
           <w:p>
@@ -7052,14 +7122,14 @@
                 <w:rFonts w:ascii="Times New Roman" w:hAnsi="Times New Roman"/>
                 <w:b w:val="0"/>
                 <w:color w:val="000000"/>
-                <w:sz w:val="18"/>
+                <w:sz w:val="20"/>
               </w:rPr>
             </w:r>
           </w:p>
         </w:tc>
         <w:tc>
           <w:tcPr>
-            <w:tcW w:w="523" w:type="dxa"/>
+            <w:tcW w:w="556" w:type="dxa"/>
             <w:shd w:val="clear" w:color="auto" w:fill="70AD47"/>
           </w:tcPr>
           <w:p>
@@ -7072,7 +7142,7 @@
                 <w:rFonts w:ascii="Times New Roman" w:hAnsi="Times New Roman"/>
                 <w:b w:val="0"/>
                 <w:color w:val="FFFFFF"/>
-                <w:sz w:val="18"/>
+                <w:sz w:val="20"/>
               </w:rPr>
               <w:t>✓</w:t>
             </w:r>
@@ -7080,7 +7150,7 @@
         </w:tc>
         <w:tc>
           <w:tcPr>
-            <w:tcW w:w="523" w:type="dxa"/>
+            <w:tcW w:w="556" w:type="dxa"/>
             <w:shd w:val="clear" w:color="auto" w:fill="70AD47"/>
           </w:tcPr>
           <w:p>
@@ -7093,7 +7163,7 @@
                 <w:rFonts w:ascii="Times New Roman" w:hAnsi="Times New Roman"/>
                 <w:b w:val="0"/>
                 <w:color w:val="FFFFFF"/>
-                <w:sz w:val="18"/>
+                <w:sz w:val="20"/>
               </w:rPr>
               <w:t>✓</w:t>
             </w:r>
@@ -7101,7 +7171,7 @@
         </w:tc>
         <w:tc>
           <w:tcPr>
-            <w:tcW w:w="523" w:type="dxa"/>
+            <w:tcW w:w="556" w:type="dxa"/>
             <w:shd w:val="clear" w:color="auto" w:fill="70AD47"/>
           </w:tcPr>
           <w:p>
@@ -7114,7 +7184,7 @@
                 <w:rFonts w:ascii="Times New Roman" w:hAnsi="Times New Roman"/>
                 <w:b w:val="0"/>
                 <w:color w:val="FFFFFF"/>
-                <w:sz w:val="18"/>
+                <w:sz w:val="20"/>
               </w:rPr>
               <w:t>✓</w:t>
             </w:r>
@@ -7122,7 +7192,7 @@
         </w:tc>
         <w:tc>
           <w:tcPr>
-            <w:tcW w:w="523" w:type="dxa"/>
+            <w:tcW w:w="556" w:type="dxa"/>
             <w:shd w:val="clear" w:color="auto" w:fill="70AD47"/>
           </w:tcPr>
           <w:p>
@@ -7135,7 +7205,7 @@
                 <w:rFonts w:ascii="Times New Roman" w:hAnsi="Times New Roman"/>
                 <w:b w:val="0"/>
                 <w:color w:val="FFFFFF"/>
-                <w:sz w:val="18"/>
+                <w:sz w:val="20"/>
               </w:rPr>
               <w:t>✓</w:t>
             </w:r>
@@ -7143,7 +7213,7 @@
         </w:tc>
         <w:tc>
           <w:tcPr>
-            <w:tcW w:w="523" w:type="dxa"/>
+            <w:tcW w:w="556" w:type="dxa"/>
             <w:shd w:val="clear" w:color="auto" w:fill="70AD47"/>
           </w:tcPr>
           <w:p>
@@ -7156,7 +7226,7 @@
                 <w:rFonts w:ascii="Times New Roman" w:hAnsi="Times New Roman"/>
                 <w:b w:val="0"/>
                 <w:color w:val="FFFFFF"/>
-                <w:sz w:val="18"/>
+                <w:sz w:val="20"/>
               </w:rPr>
               <w:t>✓</w:t>
             </w:r>
@@ -7164,7 +7234,7 @@
         </w:tc>
         <w:tc>
           <w:tcPr>
-            <w:tcW w:w="523" w:type="dxa"/>
+            <w:tcW w:w="567" w:type="dxa"/>
             <w:shd w:val="clear" w:color="auto" w:fill="70AD47"/>
           </w:tcPr>
           <w:p>
@@ -7177,7 +7247,7 @@
                 <w:rFonts w:ascii="Times New Roman" w:hAnsi="Times New Roman"/>
                 <w:b w:val="0"/>
                 <w:color w:val="FFFFFF"/>
-                <w:sz w:val="18"/>
+                <w:sz w:val="20"/>
               </w:rPr>
               <w:t>✓</w:t>
             </w:r>
@@ -7185,7 +7255,7 @@
         </w:tc>
         <w:tc>
           <w:tcPr>
-            <w:tcW w:w="523" w:type="dxa"/>
+            <w:tcW w:w="567" w:type="dxa"/>
             <w:shd w:val="clear" w:color="auto" w:fill="70AD47"/>
           </w:tcPr>
           <w:p>
@@ -7198,7 +7268,7 @@
                 <w:rFonts w:ascii="Times New Roman" w:hAnsi="Times New Roman"/>
                 <w:b w:val="0"/>
                 <w:color w:val="FFFFFF"/>
-                <w:sz w:val="18"/>
+                <w:sz w:val="20"/>
               </w:rPr>
               <w:t>✓</w:t>
             </w:r>
@@ -7206,17 +7276,18 @@
         </w:tc>
       </w:tr>
     </w:tbl>
-    <w:p/>
     <w:p>
       <w:pPr>
         <w:sectPr>
-          <w:footerReference w:type="default" r:id="rId35"/>
+          <w:footerReference w:type="default" r:id="rId40"/>
+          <w:footerReference w:type="first" r:id="rId41"/>
           <w:type w:val="continuous"/>
           <w:pgSz w:w="12240" w:h="15840"/>
           <w:pgMar w:top="1701" w:right="1701" w:bottom="1701" w:left="2268" w:header="720" w:footer="720" w:gutter="0"/>
           <w:cols w:space="720"/>
           <w:titlePg/>
           <w:docGrid w:linePitch="360"/>
+          <w:pgNumType w:fmt="decimal"/>
         </w:sectPr>
       </w:pPr>
     </w:p>
@@ -7253,12 +7324,14 @@
     <w:p>
       <w:pPr>
         <w:sectPr>
-          <w:footerReference w:type="default" r:id="rId36"/>
+          <w:footerReference w:type="default" r:id="rId42"/>
+          <w:footerReference w:type="first" r:id="rId43"/>
           <w:pgSz w:w="12240" w:h="15840"/>
           <w:pgMar w:top="1701" w:right="1701" w:bottom="1701" w:left="2268" w:header="720" w:footer="720" w:gutter="0"/>
           <w:cols w:space="720"/>
           <w:titlePg/>
           <w:docGrid w:linePitch="360"/>
+          <w:pgNumType w:fmt="decimal"/>
         </w:sectPr>
       </w:pPr>
     </w:p>
@@ -7642,13 +7715,15 @@
     <w:p>
       <w:pPr>
         <w:sectPr>
-          <w:footerReference w:type="default" r:id="rId37"/>
+          <w:footerReference w:type="default" r:id="rId44"/>
+          <w:footerReference w:type="first" r:id="rId45"/>
           <w:type w:val="continuous"/>
           <w:pgSz w:w="12240" w:h="15840"/>
           <w:pgMar w:top="1701" w:right="1701" w:bottom="1701" w:left="2268" w:header="720" w:footer="720" w:gutter="0"/>
           <w:cols w:space="720"/>
           <w:titlePg/>
           <w:docGrid w:linePitch="360"/>
+          <w:pgNumType w:fmt="decimal"/>
         </w:sectPr>
       </w:pPr>
     </w:p>
@@ -7685,12 +7760,14 @@
     <w:p>
       <w:pPr>
         <w:sectPr>
-          <w:footerReference w:type="default" r:id="rId38"/>
+          <w:footerReference w:type="default" r:id="rId46"/>
+          <w:footerReference w:type="first" r:id="rId47"/>
           <w:pgSz w:w="12240" w:h="15840"/>
           <w:pgMar w:top="1701" w:right="1701" w:bottom="1701" w:left="2268" w:header="720" w:footer="720" w:gutter="0"/>
           <w:cols w:space="720"/>
           <w:titlePg/>
           <w:docGrid w:linePitch="360"/>
+          <w:pgNumType w:fmt="decimal"/>
         </w:sectPr>
       </w:pPr>
     </w:p>
@@ -8448,13 +8525,15 @@
     <w:p>
       <w:pPr>
         <w:sectPr>
-          <w:footerReference w:type="default" r:id="rId39"/>
+          <w:footerReference w:type="default" r:id="rId48"/>
+          <w:footerReference w:type="first" r:id="rId49"/>
           <w:type w:val="continuous"/>
           <w:pgSz w:w="12240" w:h="15840"/>
           <w:pgMar w:top="1701" w:right="1701" w:bottom="1701" w:left="2268" w:header="720" w:footer="720" w:gutter="0"/>
           <w:cols w:space="720"/>
           <w:titlePg/>
           <w:docGrid w:linePitch="360"/>
+          <w:pgNumType w:fmt="decimal"/>
         </w:sectPr>
       </w:pPr>
     </w:p>
@@ -8491,12 +8570,14 @@
     <w:p>
       <w:pPr>
         <w:sectPr>
-          <w:footerReference w:type="default" r:id="rId40"/>
+          <w:footerReference w:type="default" r:id="rId50"/>
+          <w:footerReference w:type="first" r:id="rId51"/>
           <w:pgSz w:w="12240" w:h="15840"/>
           <w:pgMar w:top="1701" w:right="1701" w:bottom="1701" w:left="2268" w:header="720" w:footer="720" w:gutter="0"/>
           <w:cols w:space="720"/>
           <w:titlePg/>
           <w:docGrid w:linePitch="360"/>
+          <w:pgNumType w:fmt="decimal"/>
         </w:sectPr>
       </w:pPr>
     </w:p>
@@ -8703,13 +8784,15 @@
     <w:p>
       <w:pPr>
         <w:sectPr>
-          <w:footerReference w:type="default" r:id="rId41"/>
+          <w:footerReference w:type="default" r:id="rId52"/>
+          <w:footerReference w:type="first" r:id="rId53"/>
           <w:type w:val="continuous"/>
           <w:pgSz w:w="12240" w:h="15840"/>
           <w:pgMar w:top="1701" w:right="1701" w:bottom="1701" w:left="2268" w:header="720" w:footer="720" w:gutter="0"/>
           <w:cols w:space="720"/>
           <w:titlePg/>
           <w:docGrid w:linePitch="360"/>
+          <w:pgNumType w:fmt="decimal"/>
         </w:sectPr>
       </w:pPr>
     </w:p>
@@ -8732,12 +8815,14 @@
     <w:p>
       <w:pPr>
         <w:sectPr>
-          <w:footerReference w:type="default" r:id="rId42"/>
+          <w:footerReference w:type="default" r:id="rId54"/>
+          <w:footerReference w:type="first" r:id="rId55"/>
           <w:pgSz w:w="12240" w:h="15840"/>
           <w:pgMar w:top="1701" w:right="1701" w:bottom="1701" w:left="2268" w:header="720" w:footer="720" w:gutter="0"/>
           <w:cols w:space="720"/>
           <w:titlePg/>
           <w:docGrid w:linePitch="360"/>
+          <w:pgNumType w:fmt="decimal"/>
         </w:sectPr>
       </w:pPr>
     </w:p>
@@ -8861,13 +8946,15 @@
     <w:p>
       <w:pPr>
         <w:sectPr>
-          <w:footerReference w:type="default" r:id="rId43"/>
+          <w:footerReference w:type="default" r:id="rId56"/>
+          <w:footerReference w:type="first" r:id="rId57"/>
           <w:type w:val="continuous"/>
           <w:pgSz w:w="12240" w:h="15840"/>
           <w:pgMar w:top="1701" w:right="1701" w:bottom="1701" w:left="2268" w:header="720" w:footer="720" w:gutter="0"/>
           <w:cols w:space="720"/>
           <w:titlePg/>
           <w:docGrid w:linePitch="360"/>
+          <w:pgNumType w:fmt="decimal"/>
         </w:sectPr>
       </w:pPr>
     </w:p>
@@ -8890,12 +8977,12 @@
     <w:p>
       <w:pPr>
         <w:sectPr>
-          <w:footerReference w:type="default" r:id="rId44"/>
+          <w:footerReference w:type="default" r:id="rId58"/>
           <w:pgSz w:w="12240" w:h="15840"/>
           <w:pgMar w:top="1701" w:right="1701" w:bottom="1701" w:left="2268" w:header="720" w:footer="720" w:gutter="0"/>
           <w:cols w:space="720"/>
-          <w:titlePg/>
           <w:docGrid w:linePitch="360"/>
+          <w:pgNumType w:fmt="decimal"/>
         </w:sectPr>
       </w:pPr>
     </w:p>
@@ -8936,7 +9023,7 @@
       <w:r>
         <w:drawing>
           <wp:inline xmlns:a="http://schemas.openxmlformats.org/drawingml/2006/main" xmlns:pic="http://schemas.openxmlformats.org/drawingml/2006/picture">
-            <wp:extent cx="3960000" cy="4860000"/>
+            <wp:extent cx="1065395" cy="4860000"/>
             <wp:docPr id="7" name="Picture 7"/>
             <wp:cNvGraphicFramePr>
               <a:graphicFrameLocks noChangeAspect="1"/>
@@ -8957,7 +9044,7 @@
                   <pic:spPr>
                     <a:xfrm>
                       <a:off x="0" y="0"/>
-                      <a:ext cx="3960000" cy="4860000"/>
+                      <a:ext cx="1065395" cy="4860000"/>
                     </a:xfrm>
                     <a:prstGeom prst="rect"/>
                   </pic:spPr>
@@ -8969,12 +9056,12 @@
       </w:r>
     </w:p>
     <w:sectPr>
-      <w:footerReference w:type="default" r:id="rId45"/>
+      <w:footerReference w:type="default" r:id="rId59"/>
       <w:pgSz w:w="12240" w:h="15840"/>
       <w:pgMar w:top="1701" w:right="1701" w:bottom="1701" w:left="2268" w:header="720" w:footer="720" w:gutter="0"/>
       <w:cols w:space="720"/>
-      <w:titlePg/>
       <w:docGrid w:linePitch="360"/>
+      <w:pgNumType w:fmt="decimal"/>
     </w:sectPr>
   </w:body>
 </w:document>
@@ -8982,11 +9069,7 @@
 
 <file path=word/footer1.xml><?xml version="1.0" encoding="utf-8"?>
 <w:ftr xmlns:m="http://schemas.openxmlformats.org/officeDocument/2006/math" xmlns:mc="http://schemas.openxmlformats.org/markup-compatibility/2006" xmlns:mo="http://schemas.microsoft.com/office/mac/office/2008/main" xmlns:mv="urn:schemas-microsoft-com:mac:vml" xmlns:o="urn:schemas-microsoft-com:office:office" xmlns:r="http://schemas.openxmlformats.org/officeDocument/2006/relationships" xmlns:v="urn:schemas-microsoft-com:vml" xmlns:w10="urn:schemas-microsoft-com:office:word" xmlns:w14="http://schemas.microsoft.com/office/word/2010/wordml" xmlns:w="http://schemas.openxmlformats.org/wordprocessingml/2006/main" xmlns:wne="http://schemas.microsoft.com/office/word/2006/wordml" xmlns:wp14="http://schemas.microsoft.com/office/word/2010/wordprocessingDrawing" xmlns:wp="http://schemas.openxmlformats.org/drawingml/2006/wordprocessingDrawing" xmlns:wpc="http://schemas.microsoft.com/office/word/2010/wordprocessingCanvas" xmlns:wpg="http://schemas.microsoft.com/office/word/2010/wordprocessingGroup" xmlns:wpi="http://schemas.microsoft.com/office/word/2010/wordprocessingInk" xmlns:wps="http://schemas.microsoft.com/office/word/2010/wordprocessingShape" mc:Ignorable="w14 wp14">
-  <w:p>
-    <w:pPr>
-      <w:pStyle w:val="Footer"/>
-    </w:pPr>
-  </w:p>
+  <w:p/>
 </w:ftr>
 </file>
 
@@ -8994,7 +9077,6 @@
 <w:ftr xmlns:m="http://schemas.openxmlformats.org/officeDocument/2006/math" xmlns:mc="http://schemas.openxmlformats.org/markup-compatibility/2006" xmlns:mo="http://schemas.microsoft.com/office/mac/office/2008/main" xmlns:mv="urn:schemas-microsoft-com:mac:vml" xmlns:o="urn:schemas-microsoft-com:office:office" xmlns:r="http://schemas.openxmlformats.org/officeDocument/2006/relationships" xmlns:v="urn:schemas-microsoft-com:vml" xmlns:w10="urn:schemas-microsoft-com:office:word" xmlns:w14="http://schemas.microsoft.com/office/word/2010/wordml" xmlns:w="http://schemas.openxmlformats.org/wordprocessingml/2006/main" xmlns:wne="http://schemas.microsoft.com/office/word/2006/wordml" xmlns:wp14="http://schemas.microsoft.com/office/word/2010/wordprocessingDrawing" xmlns:wp="http://schemas.openxmlformats.org/drawingml/2006/wordprocessingDrawing" xmlns:wpc="http://schemas.microsoft.com/office/word/2010/wordprocessingCanvas" xmlns:wpg="http://schemas.microsoft.com/office/word/2010/wordprocessingGroup" xmlns:wpi="http://schemas.microsoft.com/office/word/2010/wordprocessingInk" xmlns:wps="http://schemas.microsoft.com/office/word/2010/wordprocessingShape" mc:Ignorable="w14 wp14">
   <w:p>
     <w:pPr>
-      <w:pStyle w:val="Footer"/>
       <w:jc w:val="center"/>
     </w:pPr>
     <w:r>
@@ -9003,7 +9085,7 @@
         <w:sz w:val="24"/>
       </w:rPr>
       <w:fldChar w:fldCharType="begin"/>
-      <w:instrText xml:space="preserve"> PAGE \* roman </w:instrText>
+      <w:instrText xml:space="preserve"> PAGE </w:instrText>
       <w:fldChar w:fldCharType="separate"/>
       <w:fldChar w:fldCharType="end"/>
     </w:r>
@@ -9015,7 +9097,6 @@
 <w:ftr xmlns:m="http://schemas.openxmlformats.org/officeDocument/2006/math" xmlns:mc="http://schemas.openxmlformats.org/markup-compatibility/2006" xmlns:mo="http://schemas.microsoft.com/office/mac/office/2008/main" xmlns:mv="urn:schemas-microsoft-com:mac:vml" xmlns:o="urn:schemas-microsoft-com:office:office" xmlns:r="http://schemas.openxmlformats.org/officeDocument/2006/relationships" xmlns:v="urn:schemas-microsoft-com:vml" xmlns:w10="urn:schemas-microsoft-com:office:word" xmlns:w14="http://schemas.microsoft.com/office/word/2010/wordml" xmlns:w="http://schemas.openxmlformats.org/wordprocessingml/2006/main" xmlns:wne="http://schemas.microsoft.com/office/word/2006/wordml" xmlns:wp14="http://schemas.microsoft.com/office/word/2010/wordprocessingDrawing" xmlns:wp="http://schemas.openxmlformats.org/drawingml/2006/wordprocessingDrawing" xmlns:wpc="http://schemas.microsoft.com/office/word/2010/wordprocessingCanvas" xmlns:wpg="http://schemas.microsoft.com/office/word/2010/wordprocessingGroup" xmlns:wpi="http://schemas.microsoft.com/office/word/2010/wordprocessingInk" xmlns:wps="http://schemas.microsoft.com/office/word/2010/wordprocessingShape" mc:Ignorable="w14 wp14">
   <w:p>
     <w:pPr>
-      <w:pStyle w:val="Footer"/>
       <w:jc w:val="center"/>
     </w:pPr>
     <w:r>
@@ -9024,7 +9105,7 @@
         <w:sz w:val="24"/>
       </w:rPr>
       <w:fldChar w:fldCharType="begin"/>
-      <w:instrText xml:space="preserve"> PAGE \* roman </w:instrText>
+      <w:instrText xml:space="preserve"> PAGE </w:instrText>
       <w:fldChar w:fldCharType="separate"/>
       <w:fldChar w:fldCharType="end"/>
     </w:r>
@@ -9036,7 +9117,6 @@
 <w:ftr xmlns:m="http://schemas.openxmlformats.org/officeDocument/2006/math" xmlns:mc="http://schemas.openxmlformats.org/markup-compatibility/2006" xmlns:mo="http://schemas.microsoft.com/office/mac/office/2008/main" xmlns:mv="urn:schemas-microsoft-com:mac:vml" xmlns:o="urn:schemas-microsoft-com:office:office" xmlns:r="http://schemas.openxmlformats.org/officeDocument/2006/relationships" xmlns:v="urn:schemas-microsoft-com:vml" xmlns:w10="urn:schemas-microsoft-com:office:word" xmlns:w14="http://schemas.microsoft.com/office/word/2010/wordml" xmlns:w="http://schemas.openxmlformats.org/wordprocessingml/2006/main" xmlns:wne="http://schemas.microsoft.com/office/word/2006/wordml" xmlns:wp14="http://schemas.microsoft.com/office/word/2010/wordprocessingDrawing" xmlns:wp="http://schemas.openxmlformats.org/drawingml/2006/wordprocessingDrawing" xmlns:wpc="http://schemas.microsoft.com/office/word/2010/wordprocessingCanvas" xmlns:wpg="http://schemas.microsoft.com/office/word/2010/wordprocessingGroup" xmlns:wpi="http://schemas.microsoft.com/office/word/2010/wordprocessingInk" xmlns:wps="http://schemas.microsoft.com/office/word/2010/wordprocessingShape" mc:Ignorable="w14 wp14">
   <w:p>
     <w:pPr>
-      <w:pStyle w:val="Footer"/>
       <w:jc w:val="center"/>
     </w:pPr>
     <w:r>
@@ -9045,7 +9125,7 @@
         <w:sz w:val="24"/>
       </w:rPr>
       <w:fldChar w:fldCharType="begin"/>
-      <w:instrText xml:space="preserve"> PAGE \* roman </w:instrText>
+      <w:instrText xml:space="preserve"> PAGE </w:instrText>
       <w:fldChar w:fldCharType="separate"/>
       <w:fldChar w:fldCharType="end"/>
     </w:r>
@@ -9057,7 +9137,6 @@
 <w:ftr xmlns:m="http://schemas.openxmlformats.org/officeDocument/2006/math" xmlns:mc="http://schemas.openxmlformats.org/markup-compatibility/2006" xmlns:mo="http://schemas.microsoft.com/office/mac/office/2008/main" xmlns:mv="urn:schemas-microsoft-com:mac:vml" xmlns:o="urn:schemas-microsoft-com:office:office" xmlns:r="http://schemas.openxmlformats.org/officeDocument/2006/relationships" xmlns:v="urn:schemas-microsoft-com:vml" xmlns:w10="urn:schemas-microsoft-com:office:word" xmlns:w14="http://schemas.microsoft.com/office/word/2010/wordml" xmlns:w="http://schemas.openxmlformats.org/wordprocessingml/2006/main" xmlns:wne="http://schemas.microsoft.com/office/word/2006/wordml" xmlns:wp14="http://schemas.microsoft.com/office/word/2010/wordprocessingDrawing" xmlns:wp="http://schemas.openxmlformats.org/drawingml/2006/wordprocessingDrawing" xmlns:wpc="http://schemas.microsoft.com/office/word/2010/wordprocessingCanvas" xmlns:wpg="http://schemas.microsoft.com/office/word/2010/wordprocessingGroup" xmlns:wpi="http://schemas.microsoft.com/office/word/2010/wordprocessingInk" xmlns:wps="http://schemas.microsoft.com/office/word/2010/wordprocessingShape" mc:Ignorable="w14 wp14">
   <w:p>
     <w:pPr>
-      <w:pStyle w:val="Footer"/>
       <w:jc w:val="center"/>
     </w:pPr>
     <w:r>
@@ -9066,7 +9145,7 @@
         <w:sz w:val="24"/>
       </w:rPr>
       <w:fldChar w:fldCharType="begin"/>
-      <w:instrText xml:space="preserve"> PAGE \* roman </w:instrText>
+      <w:instrText xml:space="preserve"> PAGE </w:instrText>
       <w:fldChar w:fldCharType="separate"/>
       <w:fldChar w:fldCharType="end"/>
     </w:r>
@@ -9078,7 +9157,6 @@
 <w:ftr xmlns:m="http://schemas.openxmlformats.org/officeDocument/2006/math" xmlns:mc="http://schemas.openxmlformats.org/markup-compatibility/2006" xmlns:mo="http://schemas.microsoft.com/office/mac/office/2008/main" xmlns:mv="urn:schemas-microsoft-com:mac:vml" xmlns:o="urn:schemas-microsoft-com:office:office" xmlns:r="http://schemas.openxmlformats.org/officeDocument/2006/relationships" xmlns:v="urn:schemas-microsoft-com:vml" xmlns:w10="urn:schemas-microsoft-com:office:word" xmlns:w14="http://schemas.microsoft.com/office/word/2010/wordml" xmlns:w="http://schemas.openxmlformats.org/wordprocessingml/2006/main" xmlns:wne="http://schemas.microsoft.com/office/word/2006/wordml" xmlns:wp14="http://schemas.microsoft.com/office/word/2010/wordprocessingDrawing" xmlns:wp="http://schemas.openxmlformats.org/drawingml/2006/wordprocessingDrawing" xmlns:wpc="http://schemas.microsoft.com/office/word/2010/wordprocessingCanvas" xmlns:wpg="http://schemas.microsoft.com/office/word/2010/wordprocessingGroup" xmlns:wpi="http://schemas.microsoft.com/office/word/2010/wordprocessingInk" xmlns:wps="http://schemas.microsoft.com/office/word/2010/wordprocessingShape" mc:Ignorable="w14 wp14">
   <w:p>
     <w:pPr>
-      <w:pStyle w:val="Footer"/>
       <w:jc w:val="center"/>
     </w:pPr>
     <w:r>
@@ -9087,7 +9165,7 @@
         <w:sz w:val="24"/>
       </w:rPr>
       <w:fldChar w:fldCharType="begin"/>
-      <w:instrText xml:space="preserve"> PAGE \* roman </w:instrText>
+      <w:instrText xml:space="preserve"> PAGE </w:instrText>
       <w:fldChar w:fldCharType="separate"/>
       <w:fldChar w:fldCharType="end"/>
     </w:r>
@@ -9099,7 +9177,6 @@
 <w:ftr xmlns:m="http://schemas.openxmlformats.org/officeDocument/2006/math" xmlns:mc="http://schemas.openxmlformats.org/markup-compatibility/2006" xmlns:mo="http://schemas.microsoft.com/office/mac/office/2008/main" xmlns:mv="urn:schemas-microsoft-com:mac:vml" xmlns:o="urn:schemas-microsoft-com:office:office" xmlns:r="http://schemas.openxmlformats.org/officeDocument/2006/relationships" xmlns:v="urn:schemas-microsoft-com:vml" xmlns:w10="urn:schemas-microsoft-com:office:word" xmlns:w14="http://schemas.microsoft.com/office/word/2010/wordml" xmlns:w="http://schemas.openxmlformats.org/wordprocessingml/2006/main" xmlns:wne="http://schemas.microsoft.com/office/word/2006/wordml" xmlns:wp14="http://schemas.microsoft.com/office/word/2010/wordprocessingDrawing" xmlns:wp="http://schemas.openxmlformats.org/drawingml/2006/wordprocessingDrawing" xmlns:wpc="http://schemas.microsoft.com/office/word/2010/wordprocessingCanvas" xmlns:wpg="http://schemas.microsoft.com/office/word/2010/wordprocessingGroup" xmlns:wpi="http://schemas.microsoft.com/office/word/2010/wordprocessingInk" xmlns:wps="http://schemas.microsoft.com/office/word/2010/wordprocessingShape" mc:Ignorable="w14 wp14">
   <w:p>
     <w:pPr>
-      <w:pStyle w:val="Footer"/>
       <w:jc w:val="center"/>
     </w:pPr>
     <w:r>
@@ -9108,7 +9185,7 @@
         <w:sz w:val="24"/>
       </w:rPr>
       <w:fldChar w:fldCharType="begin"/>
-      <w:instrText xml:space="preserve"> PAGE \* roman </w:instrText>
+      <w:instrText xml:space="preserve"> PAGE </w:instrText>
       <w:fldChar w:fldCharType="separate"/>
       <w:fldChar w:fldCharType="end"/>
     </w:r>
@@ -9118,22 +9195,7 @@
 
 <file path=word/footer16.xml><?xml version="1.0" encoding="utf-8"?>
 <w:ftr xmlns:m="http://schemas.openxmlformats.org/officeDocument/2006/math" xmlns:mc="http://schemas.openxmlformats.org/markup-compatibility/2006" xmlns:mo="http://schemas.microsoft.com/office/mac/office/2008/main" xmlns:mv="urn:schemas-microsoft-com:mac:vml" xmlns:o="urn:schemas-microsoft-com:office:office" xmlns:r="http://schemas.openxmlformats.org/officeDocument/2006/relationships" xmlns:v="urn:schemas-microsoft-com:vml" xmlns:w10="urn:schemas-microsoft-com:office:word" xmlns:w14="http://schemas.microsoft.com/office/word/2010/wordml" xmlns:w="http://schemas.openxmlformats.org/wordprocessingml/2006/main" xmlns:wne="http://schemas.microsoft.com/office/word/2006/wordml" xmlns:wp14="http://schemas.microsoft.com/office/word/2010/wordprocessingDrawing" xmlns:wp="http://schemas.openxmlformats.org/drawingml/2006/wordprocessingDrawing" xmlns:wpc="http://schemas.microsoft.com/office/word/2010/wordprocessingCanvas" xmlns:wpg="http://schemas.microsoft.com/office/word/2010/wordprocessingGroup" xmlns:wpi="http://schemas.microsoft.com/office/word/2010/wordprocessingInk" xmlns:wps="http://schemas.microsoft.com/office/word/2010/wordprocessingShape" mc:Ignorable="w14 wp14">
-  <w:p>
-    <w:pPr>
-      <w:pStyle w:val="Footer"/>
-      <w:jc w:val="center"/>
-    </w:pPr>
-    <w:r>
-      <w:rPr>
-        <w:rFonts w:ascii="Times New Roman" w:hAnsi="Times New Roman"/>
-        <w:sz w:val="24"/>
-      </w:rPr>
-      <w:fldChar w:fldCharType="begin"/>
-      <w:instrText xml:space="preserve"> PAGE \* roman </w:instrText>
-      <w:fldChar w:fldCharType="separate"/>
-      <w:fldChar w:fldCharType="end"/>
-    </w:r>
-  </w:p>
+  <w:p/>
 </w:ftr>
 </file>
 
@@ -9141,7 +9203,6 @@
 <w:ftr xmlns:m="http://schemas.openxmlformats.org/officeDocument/2006/math" xmlns:mc="http://schemas.openxmlformats.org/markup-compatibility/2006" xmlns:mo="http://schemas.microsoft.com/office/mac/office/2008/main" xmlns:mv="urn:schemas-microsoft-com:mac:vml" xmlns:o="urn:schemas-microsoft-com:office:office" xmlns:r="http://schemas.openxmlformats.org/officeDocument/2006/relationships" xmlns:v="urn:schemas-microsoft-com:vml" xmlns:w10="urn:schemas-microsoft-com:office:word" xmlns:w14="http://schemas.microsoft.com/office/word/2010/wordml" xmlns:w="http://schemas.openxmlformats.org/wordprocessingml/2006/main" xmlns:wne="http://schemas.microsoft.com/office/word/2006/wordml" xmlns:wp14="http://schemas.microsoft.com/office/word/2010/wordprocessingDrawing" xmlns:wp="http://schemas.openxmlformats.org/drawingml/2006/wordprocessingDrawing" xmlns:wpc="http://schemas.microsoft.com/office/word/2010/wordprocessingCanvas" xmlns:wpg="http://schemas.microsoft.com/office/word/2010/wordprocessingGroup" xmlns:wpi="http://schemas.microsoft.com/office/word/2010/wordprocessingInk" xmlns:wps="http://schemas.microsoft.com/office/word/2010/wordprocessingShape" mc:Ignorable="w14 wp14">
   <w:p>
     <w:pPr>
-      <w:pStyle w:val="Footer"/>
       <w:jc w:val="center"/>
     </w:pPr>
     <w:r>
@@ -9160,22 +9221,7 @@
 
 <file path=word/footer18.xml><?xml version="1.0" encoding="utf-8"?>
 <w:ftr xmlns:m="http://schemas.openxmlformats.org/officeDocument/2006/math" xmlns:mc="http://schemas.openxmlformats.org/markup-compatibility/2006" xmlns:mo="http://schemas.microsoft.com/office/mac/office/2008/main" xmlns:mv="urn:schemas-microsoft-com:mac:vml" xmlns:o="urn:schemas-microsoft-com:office:office" xmlns:r="http://schemas.openxmlformats.org/officeDocument/2006/relationships" xmlns:v="urn:schemas-microsoft-com:vml" xmlns:w10="urn:schemas-microsoft-com:office:word" xmlns:w14="http://schemas.microsoft.com/office/word/2010/wordml" xmlns:w="http://schemas.openxmlformats.org/wordprocessingml/2006/main" xmlns:wne="http://schemas.microsoft.com/office/word/2006/wordml" xmlns:wp14="http://schemas.microsoft.com/office/word/2010/wordprocessingDrawing" xmlns:wp="http://schemas.openxmlformats.org/drawingml/2006/wordprocessingDrawing" xmlns:wpc="http://schemas.microsoft.com/office/word/2010/wordprocessingCanvas" xmlns:wpg="http://schemas.microsoft.com/office/word/2010/wordprocessingGroup" xmlns:wpi="http://schemas.microsoft.com/office/word/2010/wordprocessingInk" xmlns:wps="http://schemas.microsoft.com/office/word/2010/wordprocessingShape" mc:Ignorable="w14 wp14">
-  <w:p>
-    <w:pPr>
-      <w:pStyle w:val="Footer"/>
-      <w:jc w:val="center"/>
-    </w:pPr>
-    <w:r>
-      <w:rPr>
-        <w:rFonts w:ascii="Times New Roman" w:hAnsi="Times New Roman"/>
-        <w:sz w:val="24"/>
-      </w:rPr>
-      <w:fldChar w:fldCharType="begin"/>
-      <w:instrText xml:space="preserve"> PAGE </w:instrText>
-      <w:fldChar w:fldCharType="separate"/>
-      <w:fldChar w:fldCharType="end"/>
-    </w:r>
-  </w:p>
+  <w:p/>
 </w:ftr>
 </file>
 
@@ -9183,7 +9229,6 @@
 <w:ftr xmlns:m="http://schemas.openxmlformats.org/officeDocument/2006/math" xmlns:mc="http://schemas.openxmlformats.org/markup-compatibility/2006" xmlns:mo="http://schemas.microsoft.com/office/mac/office/2008/main" xmlns:mv="urn:schemas-microsoft-com:mac:vml" xmlns:o="urn:schemas-microsoft-com:office:office" xmlns:r="http://schemas.openxmlformats.org/officeDocument/2006/relationships" xmlns:v="urn:schemas-microsoft-com:vml" xmlns:w10="urn:schemas-microsoft-com:office:word" xmlns:w14="http://schemas.microsoft.com/office/word/2010/wordml" xmlns:w="http://schemas.openxmlformats.org/wordprocessingml/2006/main" xmlns:wne="http://schemas.microsoft.com/office/word/2006/wordml" xmlns:wp14="http://schemas.microsoft.com/office/word/2010/wordprocessingDrawing" xmlns:wp="http://schemas.openxmlformats.org/drawingml/2006/wordprocessingDrawing" xmlns:wpc="http://schemas.microsoft.com/office/word/2010/wordprocessingCanvas" xmlns:wpg="http://schemas.microsoft.com/office/word/2010/wordprocessingGroup" xmlns:wpi="http://schemas.microsoft.com/office/word/2010/wordprocessingInk" xmlns:wps="http://schemas.microsoft.com/office/word/2010/wordprocessingShape" mc:Ignorable="w14 wp14">
   <w:p>
     <w:pPr>
-      <w:pStyle w:val="Footer"/>
       <w:jc w:val="center"/>
     </w:pPr>
     <w:r>
@@ -9202,32 +9247,13 @@
 
 <file path=word/footer2.xml><?xml version="1.0" encoding="utf-8"?>
 <w:ftr xmlns:m="http://schemas.openxmlformats.org/officeDocument/2006/math" xmlns:mc="http://schemas.openxmlformats.org/markup-compatibility/2006" xmlns:mo="http://schemas.microsoft.com/office/mac/office/2008/main" xmlns:mv="urn:schemas-microsoft-com:mac:vml" xmlns:o="urn:schemas-microsoft-com:office:office" xmlns:r="http://schemas.openxmlformats.org/officeDocument/2006/relationships" xmlns:v="urn:schemas-microsoft-com:vml" xmlns:w10="urn:schemas-microsoft-com:office:word" xmlns:w14="http://schemas.microsoft.com/office/word/2010/wordml" xmlns:w="http://schemas.openxmlformats.org/wordprocessingml/2006/main" xmlns:wne="http://schemas.microsoft.com/office/word/2006/wordml" xmlns:wp14="http://schemas.microsoft.com/office/word/2010/wordprocessingDrawing" xmlns:wp="http://schemas.openxmlformats.org/drawingml/2006/wordprocessingDrawing" xmlns:wpc="http://schemas.microsoft.com/office/word/2010/wordprocessingCanvas" xmlns:wpg="http://schemas.microsoft.com/office/word/2010/wordprocessingGroup" xmlns:wpi="http://schemas.microsoft.com/office/word/2010/wordprocessingInk" xmlns:wps="http://schemas.microsoft.com/office/word/2010/wordprocessingShape" mc:Ignorable="w14 wp14">
-  <w:p>
-    <w:pPr>
-      <w:pStyle w:val="Footer"/>
-    </w:pPr>
-  </w:p>
+  <w:p/>
 </w:ftr>
 </file>
 
 <file path=word/footer20.xml><?xml version="1.0" encoding="utf-8"?>
 <w:ftr xmlns:m="http://schemas.openxmlformats.org/officeDocument/2006/math" xmlns:mc="http://schemas.openxmlformats.org/markup-compatibility/2006" xmlns:mo="http://schemas.microsoft.com/office/mac/office/2008/main" xmlns:mv="urn:schemas-microsoft-com:mac:vml" xmlns:o="urn:schemas-microsoft-com:office:office" xmlns:r="http://schemas.openxmlformats.org/officeDocument/2006/relationships" xmlns:v="urn:schemas-microsoft-com:vml" xmlns:w10="urn:schemas-microsoft-com:office:word" xmlns:w14="http://schemas.microsoft.com/office/word/2010/wordml" xmlns:w="http://schemas.openxmlformats.org/wordprocessingml/2006/main" xmlns:wne="http://schemas.microsoft.com/office/word/2006/wordml" xmlns:wp14="http://schemas.microsoft.com/office/word/2010/wordprocessingDrawing" xmlns:wp="http://schemas.openxmlformats.org/drawingml/2006/wordprocessingDrawing" xmlns:wpc="http://schemas.microsoft.com/office/word/2010/wordprocessingCanvas" xmlns:wpg="http://schemas.microsoft.com/office/word/2010/wordprocessingGroup" xmlns:wpi="http://schemas.microsoft.com/office/word/2010/wordprocessingInk" xmlns:wps="http://schemas.microsoft.com/office/word/2010/wordprocessingShape" mc:Ignorable="w14 wp14">
-  <w:p>
-    <w:pPr>
-      <w:pStyle w:val="Footer"/>
-      <w:jc w:val="center"/>
-    </w:pPr>
-    <w:r>
-      <w:rPr>
-        <w:rFonts w:ascii="Times New Roman" w:hAnsi="Times New Roman"/>
-        <w:sz w:val="24"/>
-      </w:rPr>
-      <w:fldChar w:fldCharType="begin"/>
-      <w:instrText xml:space="preserve"> PAGE </w:instrText>
-      <w:fldChar w:fldCharType="separate"/>
-      <w:fldChar w:fldCharType="end"/>
-    </w:r>
-  </w:p>
+  <w:p/>
 </w:ftr>
 </file>
 
@@ -9235,7 +9261,6 @@
 <w:ftr xmlns:m="http://schemas.openxmlformats.org/officeDocument/2006/math" xmlns:mc="http://schemas.openxmlformats.org/markup-compatibility/2006" xmlns:mo="http://schemas.microsoft.com/office/mac/office/2008/main" xmlns:mv="urn:schemas-microsoft-com:mac:vml" xmlns:o="urn:schemas-microsoft-com:office:office" xmlns:r="http://schemas.openxmlformats.org/officeDocument/2006/relationships" xmlns:v="urn:schemas-microsoft-com:vml" xmlns:w10="urn:schemas-microsoft-com:office:word" xmlns:w14="http://schemas.microsoft.com/office/word/2010/wordml" xmlns:w="http://schemas.openxmlformats.org/wordprocessingml/2006/main" xmlns:wne="http://schemas.microsoft.com/office/word/2006/wordml" xmlns:wp14="http://schemas.microsoft.com/office/word/2010/wordprocessingDrawing" xmlns:wp="http://schemas.openxmlformats.org/drawingml/2006/wordprocessingDrawing" xmlns:wpc="http://schemas.microsoft.com/office/word/2010/wordprocessingCanvas" xmlns:wpg="http://schemas.microsoft.com/office/word/2010/wordprocessingGroup" xmlns:wpi="http://schemas.microsoft.com/office/word/2010/wordprocessingInk" xmlns:wps="http://schemas.microsoft.com/office/word/2010/wordprocessingShape" mc:Ignorable="w14 wp14">
   <w:p>
     <w:pPr>
-      <w:pStyle w:val="Footer"/>
       <w:jc w:val="center"/>
     </w:pPr>
     <w:r>
@@ -9254,22 +9279,7 @@
 
 <file path=word/footer22.xml><?xml version="1.0" encoding="utf-8"?>
 <w:ftr xmlns:m="http://schemas.openxmlformats.org/officeDocument/2006/math" xmlns:mc="http://schemas.openxmlformats.org/markup-compatibility/2006" xmlns:mo="http://schemas.microsoft.com/office/mac/office/2008/main" xmlns:mv="urn:schemas-microsoft-com:mac:vml" xmlns:o="urn:schemas-microsoft-com:office:office" xmlns:r="http://schemas.openxmlformats.org/officeDocument/2006/relationships" xmlns:v="urn:schemas-microsoft-com:vml" xmlns:w10="urn:schemas-microsoft-com:office:word" xmlns:w14="http://schemas.microsoft.com/office/word/2010/wordml" xmlns:w="http://schemas.openxmlformats.org/wordprocessingml/2006/main" xmlns:wne="http://schemas.microsoft.com/office/word/2006/wordml" xmlns:wp14="http://schemas.microsoft.com/office/word/2010/wordprocessingDrawing" xmlns:wp="http://schemas.openxmlformats.org/drawingml/2006/wordprocessingDrawing" xmlns:wpc="http://schemas.microsoft.com/office/word/2010/wordprocessingCanvas" xmlns:wpg="http://schemas.microsoft.com/office/word/2010/wordprocessingGroup" xmlns:wpi="http://schemas.microsoft.com/office/word/2010/wordprocessingInk" xmlns:wps="http://schemas.microsoft.com/office/word/2010/wordprocessingShape" mc:Ignorable="w14 wp14">
-  <w:p>
-    <w:pPr>
-      <w:pStyle w:val="Footer"/>
-      <w:jc w:val="center"/>
-    </w:pPr>
-    <w:r>
-      <w:rPr>
-        <w:rFonts w:ascii="Times New Roman" w:hAnsi="Times New Roman"/>
-        <w:sz w:val="24"/>
-      </w:rPr>
-      <w:fldChar w:fldCharType="begin"/>
-      <w:instrText xml:space="preserve"> PAGE </w:instrText>
-      <w:fldChar w:fldCharType="separate"/>
-      <w:fldChar w:fldCharType="end"/>
-    </w:r>
-  </w:p>
+  <w:p/>
 </w:ftr>
 </file>
 
@@ -9277,7 +9287,6 @@
 <w:ftr xmlns:m="http://schemas.openxmlformats.org/officeDocument/2006/math" xmlns:mc="http://schemas.openxmlformats.org/markup-compatibility/2006" xmlns:mo="http://schemas.microsoft.com/office/mac/office/2008/main" xmlns:mv="urn:schemas-microsoft-com:mac:vml" xmlns:o="urn:schemas-microsoft-com:office:office" xmlns:r="http://schemas.openxmlformats.org/officeDocument/2006/relationships" xmlns:v="urn:schemas-microsoft-com:vml" xmlns:w10="urn:schemas-microsoft-com:office:word" xmlns:w14="http://schemas.microsoft.com/office/word/2010/wordml" xmlns:w="http://schemas.openxmlformats.org/wordprocessingml/2006/main" xmlns:wne="http://schemas.microsoft.com/office/word/2006/wordml" xmlns:wp14="http://schemas.microsoft.com/office/word/2010/wordprocessingDrawing" xmlns:wp="http://schemas.openxmlformats.org/drawingml/2006/wordprocessingDrawing" xmlns:wpc="http://schemas.microsoft.com/office/word/2010/wordprocessingCanvas" xmlns:wpg="http://schemas.microsoft.com/office/word/2010/wordprocessingGroup" xmlns:wpi="http://schemas.microsoft.com/office/word/2010/wordprocessingInk" xmlns:wps="http://schemas.microsoft.com/office/word/2010/wordprocessingShape" mc:Ignorable="w14 wp14">
   <w:p>
     <w:pPr>
-      <w:pStyle w:val="Footer"/>
       <w:jc w:val="center"/>
     </w:pPr>
     <w:r>
@@ -9296,22 +9305,7 @@
 
 <file path=word/footer24.xml><?xml version="1.0" encoding="utf-8"?>
 <w:ftr xmlns:m="http://schemas.openxmlformats.org/officeDocument/2006/math" xmlns:mc="http://schemas.openxmlformats.org/markup-compatibility/2006" xmlns:mo="http://schemas.microsoft.com/office/mac/office/2008/main" xmlns:mv="urn:schemas-microsoft-com:mac:vml" xmlns:o="urn:schemas-microsoft-com:office:office" xmlns:r="http://schemas.openxmlformats.org/officeDocument/2006/relationships" xmlns:v="urn:schemas-microsoft-com:vml" xmlns:w10="urn:schemas-microsoft-com:office:word" xmlns:w14="http://schemas.microsoft.com/office/word/2010/wordml" xmlns:w="http://schemas.openxmlformats.org/wordprocessingml/2006/main" xmlns:wne="http://schemas.microsoft.com/office/word/2006/wordml" xmlns:wp14="http://schemas.microsoft.com/office/word/2010/wordprocessingDrawing" xmlns:wp="http://schemas.openxmlformats.org/drawingml/2006/wordprocessingDrawing" xmlns:wpc="http://schemas.microsoft.com/office/word/2010/wordprocessingCanvas" xmlns:wpg="http://schemas.microsoft.com/office/word/2010/wordprocessingGroup" xmlns:wpi="http://schemas.microsoft.com/office/word/2010/wordprocessingInk" xmlns:wps="http://schemas.microsoft.com/office/word/2010/wordprocessingShape" mc:Ignorable="w14 wp14">
-  <w:p>
-    <w:pPr>
-      <w:pStyle w:val="Footer"/>
-      <w:jc w:val="center"/>
-    </w:pPr>
-    <w:r>
-      <w:rPr>
-        <w:rFonts w:ascii="Times New Roman" w:hAnsi="Times New Roman"/>
-        <w:sz w:val="24"/>
-      </w:rPr>
-      <w:fldChar w:fldCharType="begin"/>
-      <w:instrText xml:space="preserve"> PAGE </w:instrText>
-      <w:fldChar w:fldCharType="separate"/>
-      <w:fldChar w:fldCharType="end"/>
-    </w:r>
-  </w:p>
+  <w:p/>
 </w:ftr>
 </file>
 
@@ -9319,7 +9313,6 @@
 <w:ftr xmlns:m="http://schemas.openxmlformats.org/officeDocument/2006/math" xmlns:mc="http://schemas.openxmlformats.org/markup-compatibility/2006" xmlns:mo="http://schemas.microsoft.com/office/mac/office/2008/main" xmlns:mv="urn:schemas-microsoft-com:mac:vml" xmlns:o="urn:schemas-microsoft-com:office:office" xmlns:r="http://schemas.openxmlformats.org/officeDocument/2006/relationships" xmlns:v="urn:schemas-microsoft-com:vml" xmlns:w10="urn:schemas-microsoft-com:office:word" xmlns:w14="http://schemas.microsoft.com/office/word/2010/wordml" xmlns:w="http://schemas.openxmlformats.org/wordprocessingml/2006/main" xmlns:wne="http://schemas.microsoft.com/office/word/2006/wordml" xmlns:wp14="http://schemas.microsoft.com/office/word/2010/wordprocessingDrawing" xmlns:wp="http://schemas.openxmlformats.org/drawingml/2006/wordprocessingDrawing" xmlns:wpc="http://schemas.microsoft.com/office/word/2010/wordprocessingCanvas" xmlns:wpg="http://schemas.microsoft.com/office/word/2010/wordprocessingGroup" xmlns:wpi="http://schemas.microsoft.com/office/word/2010/wordprocessingInk" xmlns:wps="http://schemas.microsoft.com/office/word/2010/wordprocessingShape" mc:Ignorable="w14 wp14">
   <w:p>
     <w:pPr>
-      <w:pStyle w:val="Footer"/>
       <w:jc w:val="center"/>
     </w:pPr>
     <w:r>
@@ -9338,22 +9331,7 @@
 
 <file path=word/footer26.xml><?xml version="1.0" encoding="utf-8"?>
 <w:ftr xmlns:m="http://schemas.openxmlformats.org/officeDocument/2006/math" xmlns:mc="http://schemas.openxmlformats.org/markup-compatibility/2006" xmlns:mo="http://schemas.microsoft.com/office/mac/office/2008/main" xmlns:mv="urn:schemas-microsoft-com:mac:vml" xmlns:o="urn:schemas-microsoft-com:office:office" xmlns:r="http://schemas.openxmlformats.org/officeDocument/2006/relationships" xmlns:v="urn:schemas-microsoft-com:vml" xmlns:w10="urn:schemas-microsoft-com:office:word" xmlns:w14="http://schemas.microsoft.com/office/word/2010/wordml" xmlns:w="http://schemas.openxmlformats.org/wordprocessingml/2006/main" xmlns:wne="http://schemas.microsoft.com/office/word/2006/wordml" xmlns:wp14="http://schemas.microsoft.com/office/word/2010/wordprocessingDrawing" xmlns:wp="http://schemas.openxmlformats.org/drawingml/2006/wordprocessingDrawing" xmlns:wpc="http://schemas.microsoft.com/office/word/2010/wordprocessingCanvas" xmlns:wpg="http://schemas.microsoft.com/office/word/2010/wordprocessingGroup" xmlns:wpi="http://schemas.microsoft.com/office/word/2010/wordprocessingInk" xmlns:wps="http://schemas.microsoft.com/office/word/2010/wordprocessingShape" mc:Ignorable="w14 wp14">
-  <w:p>
-    <w:pPr>
-      <w:pStyle w:val="Footer"/>
-      <w:jc w:val="center"/>
-    </w:pPr>
-    <w:r>
-      <w:rPr>
-        <w:rFonts w:ascii="Times New Roman" w:hAnsi="Times New Roman"/>
-        <w:sz w:val="24"/>
-      </w:rPr>
-      <w:fldChar w:fldCharType="begin"/>
-      <w:instrText xml:space="preserve"> PAGE </w:instrText>
-      <w:fldChar w:fldCharType="separate"/>
-      <w:fldChar w:fldCharType="end"/>
-    </w:r>
-  </w:p>
+  <w:p/>
 </w:ftr>
 </file>
 
@@ -9361,7 +9339,6 @@
 <w:ftr xmlns:m="http://schemas.openxmlformats.org/officeDocument/2006/math" xmlns:mc="http://schemas.openxmlformats.org/markup-compatibility/2006" xmlns:mo="http://schemas.microsoft.com/office/mac/office/2008/main" xmlns:mv="urn:schemas-microsoft-com:mac:vml" xmlns:o="urn:schemas-microsoft-com:office:office" xmlns:r="http://schemas.openxmlformats.org/officeDocument/2006/relationships" xmlns:v="urn:schemas-microsoft-com:vml" xmlns:w10="urn:schemas-microsoft-com:office:word" xmlns:w14="http://schemas.microsoft.com/office/word/2010/wordml" xmlns:w="http://schemas.openxmlformats.org/wordprocessingml/2006/main" xmlns:wne="http://schemas.microsoft.com/office/word/2006/wordml" xmlns:wp14="http://schemas.microsoft.com/office/word/2010/wordprocessingDrawing" xmlns:wp="http://schemas.openxmlformats.org/drawingml/2006/wordprocessingDrawing" xmlns:wpc="http://schemas.microsoft.com/office/word/2010/wordprocessingCanvas" xmlns:wpg="http://schemas.microsoft.com/office/word/2010/wordprocessingGroup" xmlns:wpi="http://schemas.microsoft.com/office/word/2010/wordprocessingInk" xmlns:wps="http://schemas.microsoft.com/office/word/2010/wordprocessingShape" mc:Ignorable="w14 wp14">
   <w:p>
     <w:pPr>
-      <w:pStyle w:val="Footer"/>
       <w:jc w:val="center"/>
     </w:pPr>
     <w:r>
@@ -9380,22 +9357,7 @@
 
 <file path=word/footer28.xml><?xml version="1.0" encoding="utf-8"?>
 <w:ftr xmlns:m="http://schemas.openxmlformats.org/officeDocument/2006/math" xmlns:mc="http://schemas.openxmlformats.org/markup-compatibility/2006" xmlns:mo="http://schemas.microsoft.com/office/mac/office/2008/main" xmlns:mv="urn:schemas-microsoft-com:mac:vml" xmlns:o="urn:schemas-microsoft-com:office:office" xmlns:r="http://schemas.openxmlformats.org/officeDocument/2006/relationships" xmlns:v="urn:schemas-microsoft-com:vml" xmlns:w10="urn:schemas-microsoft-com:office:word" xmlns:w14="http://schemas.microsoft.com/office/word/2010/wordml" xmlns:w="http://schemas.openxmlformats.org/wordprocessingml/2006/main" xmlns:wne="http://schemas.microsoft.com/office/word/2006/wordml" xmlns:wp14="http://schemas.microsoft.com/office/word/2010/wordprocessingDrawing" xmlns:wp="http://schemas.openxmlformats.org/drawingml/2006/wordprocessingDrawing" xmlns:wpc="http://schemas.microsoft.com/office/word/2010/wordprocessingCanvas" xmlns:wpg="http://schemas.microsoft.com/office/word/2010/wordprocessingGroup" xmlns:wpi="http://schemas.microsoft.com/office/word/2010/wordprocessingInk" xmlns:wps="http://schemas.microsoft.com/office/word/2010/wordprocessingShape" mc:Ignorable="w14 wp14">
-  <w:p>
-    <w:pPr>
-      <w:pStyle w:val="Footer"/>
-      <w:jc w:val="center"/>
-    </w:pPr>
-    <w:r>
-      <w:rPr>
-        <w:rFonts w:ascii="Times New Roman" w:hAnsi="Times New Roman"/>
-        <w:sz w:val="24"/>
-      </w:rPr>
-      <w:fldChar w:fldCharType="begin"/>
-      <w:instrText xml:space="preserve"> PAGE </w:instrText>
-      <w:fldChar w:fldCharType="separate"/>
-      <w:fldChar w:fldCharType="end"/>
-    </w:r>
-  </w:p>
+  <w:p/>
 </w:ftr>
 </file>
 
@@ -9403,7 +9365,6 @@
 <w:ftr xmlns:m="http://schemas.openxmlformats.org/officeDocument/2006/math" xmlns:mc="http://schemas.openxmlformats.org/markup-compatibility/2006" xmlns:mo="http://schemas.microsoft.com/office/mac/office/2008/main" xmlns:mv="urn:schemas-microsoft-com:mac:vml" xmlns:o="urn:schemas-microsoft-com:office:office" xmlns:r="http://schemas.openxmlformats.org/officeDocument/2006/relationships" xmlns:v="urn:schemas-microsoft-com:vml" xmlns:w10="urn:schemas-microsoft-com:office:word" xmlns:w14="http://schemas.microsoft.com/office/word/2010/wordml" xmlns:w="http://schemas.openxmlformats.org/wordprocessingml/2006/main" xmlns:wne="http://schemas.microsoft.com/office/word/2006/wordml" xmlns:wp14="http://schemas.microsoft.com/office/word/2010/wordprocessingDrawing" xmlns:wp="http://schemas.openxmlformats.org/drawingml/2006/wordprocessingDrawing" xmlns:wpc="http://schemas.microsoft.com/office/word/2010/wordprocessingCanvas" xmlns:wpg="http://schemas.microsoft.com/office/word/2010/wordprocessingGroup" xmlns:wpi="http://schemas.microsoft.com/office/word/2010/wordprocessingInk" xmlns:wps="http://schemas.microsoft.com/office/word/2010/wordprocessingShape" mc:Ignorable="w14 wp14">
   <w:p>
     <w:pPr>
-      <w:pStyle w:val="Footer"/>
       <w:jc w:val="center"/>
     </w:pPr>
     <w:r>
@@ -9424,7 +9385,6 @@
 <w:ftr xmlns:m="http://schemas.openxmlformats.org/officeDocument/2006/math" xmlns:mc="http://schemas.openxmlformats.org/markup-compatibility/2006" xmlns:mo="http://schemas.microsoft.com/office/mac/office/2008/main" xmlns:mv="urn:schemas-microsoft-com:mac:vml" xmlns:o="urn:schemas-microsoft-com:office:office" xmlns:r="http://schemas.openxmlformats.org/officeDocument/2006/relationships" xmlns:v="urn:schemas-microsoft-com:vml" xmlns:w10="urn:schemas-microsoft-com:office:word" xmlns:w14="http://schemas.microsoft.com/office/word/2010/wordml" xmlns:w="http://schemas.openxmlformats.org/wordprocessingml/2006/main" xmlns:wne="http://schemas.microsoft.com/office/word/2006/wordml" xmlns:wp14="http://schemas.microsoft.com/office/word/2010/wordprocessingDrawing" xmlns:wp="http://schemas.openxmlformats.org/drawingml/2006/wordprocessingDrawing" xmlns:wpc="http://schemas.microsoft.com/office/word/2010/wordprocessingCanvas" xmlns:wpg="http://schemas.microsoft.com/office/word/2010/wordprocessingGroup" xmlns:wpi="http://schemas.microsoft.com/office/word/2010/wordprocessingInk" xmlns:wps="http://schemas.microsoft.com/office/word/2010/wordprocessingShape" mc:Ignorable="w14 wp14">
   <w:p>
     <w:pPr>
-      <w:pStyle w:val="Footer"/>
       <w:jc w:val="center"/>
     </w:pPr>
     <w:r>
@@ -9433,7 +9393,7 @@
         <w:sz w:val="24"/>
       </w:rPr>
       <w:fldChar w:fldCharType="begin"/>
-      <w:instrText xml:space="preserve"> PAGE \* roman </w:instrText>
+      <w:instrText xml:space="preserve"> PAGE </w:instrText>
       <w:fldChar w:fldCharType="separate"/>
       <w:fldChar w:fldCharType="end"/>
     </w:r>
@@ -9443,9 +9403,118 @@
 
 <file path=word/footer30.xml><?xml version="1.0" encoding="utf-8"?>
 <w:ftr xmlns:m="http://schemas.openxmlformats.org/officeDocument/2006/math" xmlns:mc="http://schemas.openxmlformats.org/markup-compatibility/2006" xmlns:mo="http://schemas.microsoft.com/office/mac/office/2008/main" xmlns:mv="urn:schemas-microsoft-com:mac:vml" xmlns:o="urn:schemas-microsoft-com:office:office" xmlns:r="http://schemas.openxmlformats.org/officeDocument/2006/relationships" xmlns:v="urn:schemas-microsoft-com:vml" xmlns:w10="urn:schemas-microsoft-com:office:word" xmlns:w14="http://schemas.microsoft.com/office/word/2010/wordml" xmlns:w="http://schemas.openxmlformats.org/wordprocessingml/2006/main" xmlns:wne="http://schemas.microsoft.com/office/word/2006/wordml" xmlns:wp14="http://schemas.microsoft.com/office/word/2010/wordprocessingDrawing" xmlns:wp="http://schemas.openxmlformats.org/drawingml/2006/wordprocessingDrawing" xmlns:wpc="http://schemas.microsoft.com/office/word/2010/wordprocessingCanvas" xmlns:wpg="http://schemas.microsoft.com/office/word/2010/wordprocessingGroup" xmlns:wpi="http://schemas.microsoft.com/office/word/2010/wordprocessingInk" xmlns:wps="http://schemas.microsoft.com/office/word/2010/wordprocessingShape" mc:Ignorable="w14 wp14">
+  <w:p/>
+</w:ftr>
+</file>
+
+<file path=word/footer31.xml><?xml version="1.0" encoding="utf-8"?>
+<w:ftr xmlns:m="http://schemas.openxmlformats.org/officeDocument/2006/math" xmlns:mc="http://schemas.openxmlformats.org/markup-compatibility/2006" xmlns:mo="http://schemas.microsoft.com/office/mac/office/2008/main" xmlns:mv="urn:schemas-microsoft-com:mac:vml" xmlns:o="urn:schemas-microsoft-com:office:office" xmlns:r="http://schemas.openxmlformats.org/officeDocument/2006/relationships" xmlns:v="urn:schemas-microsoft-com:vml" xmlns:w10="urn:schemas-microsoft-com:office:word" xmlns:w14="http://schemas.microsoft.com/office/word/2010/wordml" xmlns:w="http://schemas.openxmlformats.org/wordprocessingml/2006/main" xmlns:wne="http://schemas.microsoft.com/office/word/2006/wordml" xmlns:wp14="http://schemas.microsoft.com/office/word/2010/wordprocessingDrawing" xmlns:wp="http://schemas.openxmlformats.org/drawingml/2006/wordprocessingDrawing" xmlns:wpc="http://schemas.microsoft.com/office/word/2010/wordprocessingCanvas" xmlns:wpg="http://schemas.microsoft.com/office/word/2010/wordprocessingGroup" xmlns:wpi="http://schemas.microsoft.com/office/word/2010/wordprocessingInk" xmlns:wps="http://schemas.microsoft.com/office/word/2010/wordprocessingShape" mc:Ignorable="w14 wp14">
   <w:p>
     <w:pPr>
-      <w:pStyle w:val="Footer"/>
+      <w:jc w:val="center"/>
+    </w:pPr>
+    <w:r>
+      <w:rPr>
+        <w:rFonts w:ascii="Times New Roman" w:hAnsi="Times New Roman"/>
+        <w:sz w:val="24"/>
+      </w:rPr>
+      <w:fldChar w:fldCharType="begin"/>
+      <w:instrText xml:space="preserve"> PAGE </w:instrText>
+      <w:fldChar w:fldCharType="separate"/>
+      <w:fldChar w:fldCharType="end"/>
+    </w:r>
+  </w:p>
+</w:ftr>
+</file>
+
+<file path=word/footer32.xml><?xml version="1.0" encoding="utf-8"?>
+<w:ftr xmlns:m="http://schemas.openxmlformats.org/officeDocument/2006/math" xmlns:mc="http://schemas.openxmlformats.org/markup-compatibility/2006" xmlns:mo="http://schemas.microsoft.com/office/mac/office/2008/main" xmlns:mv="urn:schemas-microsoft-com:mac:vml" xmlns:o="urn:schemas-microsoft-com:office:office" xmlns:r="http://schemas.openxmlformats.org/officeDocument/2006/relationships" xmlns:v="urn:schemas-microsoft-com:vml" xmlns:w10="urn:schemas-microsoft-com:office:word" xmlns:w14="http://schemas.microsoft.com/office/word/2010/wordml" xmlns:w="http://schemas.openxmlformats.org/wordprocessingml/2006/main" xmlns:wne="http://schemas.microsoft.com/office/word/2006/wordml" xmlns:wp14="http://schemas.microsoft.com/office/word/2010/wordprocessingDrawing" xmlns:wp="http://schemas.openxmlformats.org/drawingml/2006/wordprocessingDrawing" xmlns:wpc="http://schemas.microsoft.com/office/word/2010/wordprocessingCanvas" xmlns:wpg="http://schemas.microsoft.com/office/word/2010/wordprocessingGroup" xmlns:wpi="http://schemas.microsoft.com/office/word/2010/wordprocessingInk" xmlns:wps="http://schemas.microsoft.com/office/word/2010/wordprocessingShape" mc:Ignorable="w14 wp14">
+  <w:p/>
+</w:ftr>
+</file>
+
+<file path=word/footer33.xml><?xml version="1.0" encoding="utf-8"?>
+<w:ftr xmlns:m="http://schemas.openxmlformats.org/officeDocument/2006/math" xmlns:mc="http://schemas.openxmlformats.org/markup-compatibility/2006" xmlns:mo="http://schemas.microsoft.com/office/mac/office/2008/main" xmlns:mv="urn:schemas-microsoft-com:mac:vml" xmlns:o="urn:schemas-microsoft-com:office:office" xmlns:r="http://schemas.openxmlformats.org/officeDocument/2006/relationships" xmlns:v="urn:schemas-microsoft-com:vml" xmlns:w10="urn:schemas-microsoft-com:office:word" xmlns:w14="http://schemas.microsoft.com/office/word/2010/wordml" xmlns:w="http://schemas.openxmlformats.org/wordprocessingml/2006/main" xmlns:wne="http://schemas.microsoft.com/office/word/2006/wordml" xmlns:wp14="http://schemas.microsoft.com/office/word/2010/wordprocessingDrawing" xmlns:wp="http://schemas.openxmlformats.org/drawingml/2006/wordprocessingDrawing" xmlns:wpc="http://schemas.microsoft.com/office/word/2010/wordprocessingCanvas" xmlns:wpg="http://schemas.microsoft.com/office/word/2010/wordprocessingGroup" xmlns:wpi="http://schemas.microsoft.com/office/word/2010/wordprocessingInk" xmlns:wps="http://schemas.microsoft.com/office/word/2010/wordprocessingShape" mc:Ignorable="w14 wp14">
+  <w:p>
+    <w:pPr>
+      <w:jc w:val="center"/>
+    </w:pPr>
+    <w:r>
+      <w:rPr>
+        <w:rFonts w:ascii="Times New Roman" w:hAnsi="Times New Roman"/>
+        <w:sz w:val="24"/>
+      </w:rPr>
+      <w:fldChar w:fldCharType="begin"/>
+      <w:instrText xml:space="preserve"> PAGE </w:instrText>
+      <w:fldChar w:fldCharType="separate"/>
+      <w:fldChar w:fldCharType="end"/>
+    </w:r>
+  </w:p>
+</w:ftr>
+</file>
+
+<file path=word/footer34.xml><?xml version="1.0" encoding="utf-8"?>
+<w:ftr xmlns:m="http://schemas.openxmlformats.org/officeDocument/2006/math" xmlns:mc="http://schemas.openxmlformats.org/markup-compatibility/2006" xmlns:mo="http://schemas.microsoft.com/office/mac/office/2008/main" xmlns:mv="urn:schemas-microsoft-com:mac:vml" xmlns:o="urn:schemas-microsoft-com:office:office" xmlns:r="http://schemas.openxmlformats.org/officeDocument/2006/relationships" xmlns:v="urn:schemas-microsoft-com:vml" xmlns:w10="urn:schemas-microsoft-com:office:word" xmlns:w14="http://schemas.microsoft.com/office/word/2010/wordml" xmlns:w="http://schemas.openxmlformats.org/wordprocessingml/2006/main" xmlns:wne="http://schemas.microsoft.com/office/word/2006/wordml" xmlns:wp14="http://schemas.microsoft.com/office/word/2010/wordprocessingDrawing" xmlns:wp="http://schemas.openxmlformats.org/drawingml/2006/wordprocessingDrawing" xmlns:wpc="http://schemas.microsoft.com/office/word/2010/wordprocessingCanvas" xmlns:wpg="http://schemas.microsoft.com/office/word/2010/wordprocessingGroup" xmlns:wpi="http://schemas.microsoft.com/office/word/2010/wordprocessingInk" xmlns:wps="http://schemas.microsoft.com/office/word/2010/wordprocessingShape" mc:Ignorable="w14 wp14">
+  <w:p/>
+</w:ftr>
+</file>
+
+<file path=word/footer35.xml><?xml version="1.0" encoding="utf-8"?>
+<w:ftr xmlns:m="http://schemas.openxmlformats.org/officeDocument/2006/math" xmlns:mc="http://schemas.openxmlformats.org/markup-compatibility/2006" xmlns:mo="http://schemas.microsoft.com/office/mac/office/2008/main" xmlns:mv="urn:schemas-microsoft-com:mac:vml" xmlns:o="urn:schemas-microsoft-com:office:office" xmlns:r="http://schemas.openxmlformats.org/officeDocument/2006/relationships" xmlns:v="urn:schemas-microsoft-com:vml" xmlns:w10="urn:schemas-microsoft-com:office:word" xmlns:w14="http://schemas.microsoft.com/office/word/2010/wordml" xmlns:w="http://schemas.openxmlformats.org/wordprocessingml/2006/main" xmlns:wne="http://schemas.microsoft.com/office/word/2006/wordml" xmlns:wp14="http://schemas.microsoft.com/office/word/2010/wordprocessingDrawing" xmlns:wp="http://schemas.openxmlformats.org/drawingml/2006/wordprocessingDrawing" xmlns:wpc="http://schemas.microsoft.com/office/word/2010/wordprocessingCanvas" xmlns:wpg="http://schemas.microsoft.com/office/word/2010/wordprocessingGroup" xmlns:wpi="http://schemas.microsoft.com/office/word/2010/wordprocessingInk" xmlns:wps="http://schemas.microsoft.com/office/word/2010/wordprocessingShape" mc:Ignorable="w14 wp14">
+  <w:p>
+    <w:pPr>
+      <w:jc w:val="center"/>
+    </w:pPr>
+    <w:r>
+      <w:rPr>
+        <w:rFonts w:ascii="Times New Roman" w:hAnsi="Times New Roman"/>
+        <w:sz w:val="24"/>
+      </w:rPr>
+      <w:fldChar w:fldCharType="begin"/>
+      <w:instrText xml:space="preserve"> PAGE </w:instrText>
+      <w:fldChar w:fldCharType="separate"/>
+      <w:fldChar w:fldCharType="end"/>
+    </w:r>
+  </w:p>
+</w:ftr>
+</file>
+
+<file path=word/footer36.xml><?xml version="1.0" encoding="utf-8"?>
+<w:ftr xmlns:m="http://schemas.openxmlformats.org/officeDocument/2006/math" xmlns:mc="http://schemas.openxmlformats.org/markup-compatibility/2006" xmlns:mo="http://schemas.microsoft.com/office/mac/office/2008/main" xmlns:mv="urn:schemas-microsoft-com:mac:vml" xmlns:o="urn:schemas-microsoft-com:office:office" xmlns:r="http://schemas.openxmlformats.org/officeDocument/2006/relationships" xmlns:v="urn:schemas-microsoft-com:vml" xmlns:w10="urn:schemas-microsoft-com:office:word" xmlns:w14="http://schemas.microsoft.com/office/word/2010/wordml" xmlns:w="http://schemas.openxmlformats.org/wordprocessingml/2006/main" xmlns:wne="http://schemas.microsoft.com/office/word/2006/wordml" xmlns:wp14="http://schemas.microsoft.com/office/word/2010/wordprocessingDrawing" xmlns:wp="http://schemas.openxmlformats.org/drawingml/2006/wordprocessingDrawing" xmlns:wpc="http://schemas.microsoft.com/office/word/2010/wordprocessingCanvas" xmlns:wpg="http://schemas.microsoft.com/office/word/2010/wordprocessingGroup" xmlns:wpi="http://schemas.microsoft.com/office/word/2010/wordprocessingInk" xmlns:wps="http://schemas.microsoft.com/office/word/2010/wordprocessingShape" mc:Ignorable="w14 wp14">
+  <w:p/>
+</w:ftr>
+</file>
+
+<file path=word/footer37.xml><?xml version="1.0" encoding="utf-8"?>
+<w:ftr xmlns:m="http://schemas.openxmlformats.org/officeDocument/2006/math" xmlns:mc="http://schemas.openxmlformats.org/markup-compatibility/2006" xmlns:mo="http://schemas.microsoft.com/office/mac/office/2008/main" xmlns:mv="urn:schemas-microsoft-com:mac:vml" xmlns:o="urn:schemas-microsoft-com:office:office" xmlns:r="http://schemas.openxmlformats.org/officeDocument/2006/relationships" xmlns:v="urn:schemas-microsoft-com:vml" xmlns:w10="urn:schemas-microsoft-com:office:word" xmlns:w14="http://schemas.microsoft.com/office/word/2010/wordml" xmlns:w="http://schemas.openxmlformats.org/wordprocessingml/2006/main" xmlns:wne="http://schemas.microsoft.com/office/word/2006/wordml" xmlns:wp14="http://schemas.microsoft.com/office/word/2010/wordprocessingDrawing" xmlns:wp="http://schemas.openxmlformats.org/drawingml/2006/wordprocessingDrawing" xmlns:wpc="http://schemas.microsoft.com/office/word/2010/wordprocessingCanvas" xmlns:wpg="http://schemas.microsoft.com/office/word/2010/wordprocessingGroup" xmlns:wpi="http://schemas.microsoft.com/office/word/2010/wordprocessingInk" xmlns:wps="http://schemas.microsoft.com/office/word/2010/wordprocessingShape" mc:Ignorable="w14 wp14">
+  <w:p>
+    <w:pPr>
+      <w:jc w:val="center"/>
+    </w:pPr>
+    <w:r>
+      <w:rPr>
+        <w:rFonts w:ascii="Times New Roman" w:hAnsi="Times New Roman"/>
+        <w:sz w:val="24"/>
+      </w:rPr>
+      <w:fldChar w:fldCharType="begin"/>
+      <w:instrText xml:space="preserve"> PAGE </w:instrText>
+      <w:fldChar w:fldCharType="separate"/>
+      <w:fldChar w:fldCharType="end"/>
+    </w:r>
+  </w:p>
+</w:ftr>
+</file>
+
+<file path=word/footer38.xml><?xml version="1.0" encoding="utf-8"?>
+<w:ftr xmlns:m="http://schemas.openxmlformats.org/officeDocument/2006/math" xmlns:mc="http://schemas.openxmlformats.org/markup-compatibility/2006" xmlns:mo="http://schemas.microsoft.com/office/mac/office/2008/main" xmlns:mv="urn:schemas-microsoft-com:mac:vml" xmlns:o="urn:schemas-microsoft-com:office:office" xmlns:r="http://schemas.openxmlformats.org/officeDocument/2006/relationships" xmlns:v="urn:schemas-microsoft-com:vml" xmlns:w10="urn:schemas-microsoft-com:office:word" xmlns:w14="http://schemas.microsoft.com/office/word/2010/wordml" xmlns:w="http://schemas.openxmlformats.org/wordprocessingml/2006/main" xmlns:wne="http://schemas.microsoft.com/office/word/2006/wordml" xmlns:wp14="http://schemas.microsoft.com/office/word/2010/wordprocessingDrawing" xmlns:wp="http://schemas.openxmlformats.org/drawingml/2006/wordprocessingDrawing" xmlns:wpc="http://schemas.microsoft.com/office/word/2010/wordprocessingCanvas" xmlns:wpg="http://schemas.microsoft.com/office/word/2010/wordprocessingGroup" xmlns:wpi="http://schemas.microsoft.com/office/word/2010/wordprocessingInk" xmlns:wps="http://schemas.microsoft.com/office/word/2010/wordprocessingShape" mc:Ignorable="w14 wp14">
+  <w:p/>
+</w:ftr>
+</file>
+
+<file path=word/footer39.xml><?xml version="1.0" encoding="utf-8"?>
+<w:ftr xmlns:m="http://schemas.openxmlformats.org/officeDocument/2006/math" xmlns:mc="http://schemas.openxmlformats.org/markup-compatibility/2006" xmlns:mo="http://schemas.microsoft.com/office/mac/office/2008/main" xmlns:mv="urn:schemas-microsoft-com:mac:vml" xmlns:o="urn:schemas-microsoft-com:office:office" xmlns:r="http://schemas.openxmlformats.org/officeDocument/2006/relationships" xmlns:v="urn:schemas-microsoft-com:vml" xmlns:w10="urn:schemas-microsoft-com:office:word" xmlns:w14="http://schemas.microsoft.com/office/word/2010/wordml" xmlns:w="http://schemas.openxmlformats.org/wordprocessingml/2006/main" xmlns:wne="http://schemas.microsoft.com/office/word/2006/wordml" xmlns:wp14="http://schemas.microsoft.com/office/word/2010/wordprocessingDrawing" xmlns:wp="http://schemas.openxmlformats.org/drawingml/2006/wordprocessingDrawing" xmlns:wpc="http://schemas.microsoft.com/office/word/2010/wordprocessingCanvas" xmlns:wpg="http://schemas.microsoft.com/office/word/2010/wordprocessingGroup" xmlns:wpi="http://schemas.microsoft.com/office/word/2010/wordprocessingInk" xmlns:wps="http://schemas.microsoft.com/office/word/2010/wordprocessingShape" mc:Ignorable="w14 wp14">
+  <w:p>
+    <w:pPr>
       <w:jc w:val="center"/>
     </w:pPr>
     <w:r>
@@ -9466,7 +9535,6 @@
 <w:ftr xmlns:m="http://schemas.openxmlformats.org/officeDocument/2006/math" xmlns:mc="http://schemas.openxmlformats.org/markup-compatibility/2006" xmlns:mo="http://schemas.microsoft.com/office/mac/office/2008/main" xmlns:mv="urn:schemas-microsoft-com:mac:vml" xmlns:o="urn:schemas-microsoft-com:office:office" xmlns:r="http://schemas.openxmlformats.org/officeDocument/2006/relationships" xmlns:v="urn:schemas-microsoft-com:vml" xmlns:w10="urn:schemas-microsoft-com:office:word" xmlns:w14="http://schemas.microsoft.com/office/word/2010/wordml" xmlns:w="http://schemas.openxmlformats.org/wordprocessingml/2006/main" xmlns:wne="http://schemas.microsoft.com/office/word/2006/wordml" xmlns:wp14="http://schemas.microsoft.com/office/word/2010/wordprocessingDrawing" xmlns:wp="http://schemas.openxmlformats.org/drawingml/2006/wordprocessingDrawing" xmlns:wpc="http://schemas.microsoft.com/office/word/2010/wordprocessingCanvas" xmlns:wpg="http://schemas.microsoft.com/office/word/2010/wordprocessingGroup" xmlns:wpi="http://schemas.microsoft.com/office/word/2010/wordprocessingInk" xmlns:wps="http://schemas.microsoft.com/office/word/2010/wordprocessingShape" mc:Ignorable="w14 wp14">
   <w:p>
     <w:pPr>
-      <w:pStyle w:val="Footer"/>
       <w:jc w:val="center"/>
     </w:pPr>
     <w:r>
@@ -9475,7 +9543,79 @@
         <w:sz w:val="24"/>
       </w:rPr>
       <w:fldChar w:fldCharType="begin"/>
-      <w:instrText xml:space="preserve"> PAGE \* roman </w:instrText>
+      <w:instrText xml:space="preserve"> PAGE </w:instrText>
+      <w:fldChar w:fldCharType="separate"/>
+      <w:fldChar w:fldCharType="end"/>
+    </w:r>
+  </w:p>
+</w:ftr>
+</file>
+
+<file path=word/footer40.xml><?xml version="1.0" encoding="utf-8"?>
+<w:ftr xmlns:m="http://schemas.openxmlformats.org/officeDocument/2006/math" xmlns:mc="http://schemas.openxmlformats.org/markup-compatibility/2006" xmlns:mo="http://schemas.microsoft.com/office/mac/office/2008/main" xmlns:mv="urn:schemas-microsoft-com:mac:vml" xmlns:o="urn:schemas-microsoft-com:office:office" xmlns:r="http://schemas.openxmlformats.org/officeDocument/2006/relationships" xmlns:v="urn:schemas-microsoft-com:vml" xmlns:w10="urn:schemas-microsoft-com:office:word" xmlns:w14="http://schemas.microsoft.com/office/word/2010/wordml" xmlns:w="http://schemas.openxmlformats.org/wordprocessingml/2006/main" xmlns:wne="http://schemas.microsoft.com/office/word/2006/wordml" xmlns:wp14="http://schemas.microsoft.com/office/word/2010/wordprocessingDrawing" xmlns:wp="http://schemas.openxmlformats.org/drawingml/2006/wordprocessingDrawing" xmlns:wpc="http://schemas.microsoft.com/office/word/2010/wordprocessingCanvas" xmlns:wpg="http://schemas.microsoft.com/office/word/2010/wordprocessingGroup" xmlns:wpi="http://schemas.microsoft.com/office/word/2010/wordprocessingInk" xmlns:wps="http://schemas.microsoft.com/office/word/2010/wordprocessingShape" mc:Ignorable="w14 wp14">
+  <w:p/>
+</w:ftr>
+</file>
+
+<file path=word/footer41.xml><?xml version="1.0" encoding="utf-8"?>
+<w:ftr xmlns:m="http://schemas.openxmlformats.org/officeDocument/2006/math" xmlns:mc="http://schemas.openxmlformats.org/markup-compatibility/2006" xmlns:mo="http://schemas.microsoft.com/office/mac/office/2008/main" xmlns:mv="urn:schemas-microsoft-com:mac:vml" xmlns:o="urn:schemas-microsoft-com:office:office" xmlns:r="http://schemas.openxmlformats.org/officeDocument/2006/relationships" xmlns:v="urn:schemas-microsoft-com:vml" xmlns:w10="urn:schemas-microsoft-com:office:word" xmlns:w14="http://schemas.microsoft.com/office/word/2010/wordml" xmlns:w="http://schemas.openxmlformats.org/wordprocessingml/2006/main" xmlns:wne="http://schemas.microsoft.com/office/word/2006/wordml" xmlns:wp14="http://schemas.microsoft.com/office/word/2010/wordprocessingDrawing" xmlns:wp="http://schemas.openxmlformats.org/drawingml/2006/wordprocessingDrawing" xmlns:wpc="http://schemas.microsoft.com/office/word/2010/wordprocessingCanvas" xmlns:wpg="http://schemas.microsoft.com/office/word/2010/wordprocessingGroup" xmlns:wpi="http://schemas.microsoft.com/office/word/2010/wordprocessingInk" xmlns:wps="http://schemas.microsoft.com/office/word/2010/wordprocessingShape" mc:Ignorable="w14 wp14">
+  <w:p>
+    <w:pPr>
+      <w:jc w:val="center"/>
+    </w:pPr>
+    <w:r>
+      <w:rPr>
+        <w:rFonts w:ascii="Times New Roman" w:hAnsi="Times New Roman"/>
+        <w:sz w:val="24"/>
+      </w:rPr>
+      <w:fldChar w:fldCharType="begin"/>
+      <w:instrText xml:space="preserve"> PAGE </w:instrText>
+      <w:fldChar w:fldCharType="separate"/>
+      <w:fldChar w:fldCharType="end"/>
+    </w:r>
+  </w:p>
+</w:ftr>
+</file>
+
+<file path=word/footer42.xml><?xml version="1.0" encoding="utf-8"?>
+<w:ftr xmlns:m="http://schemas.openxmlformats.org/officeDocument/2006/math" xmlns:mc="http://schemas.openxmlformats.org/markup-compatibility/2006" xmlns:mo="http://schemas.microsoft.com/office/mac/office/2008/main" xmlns:mv="urn:schemas-microsoft-com:mac:vml" xmlns:o="urn:schemas-microsoft-com:office:office" xmlns:r="http://schemas.openxmlformats.org/officeDocument/2006/relationships" xmlns:v="urn:schemas-microsoft-com:vml" xmlns:w10="urn:schemas-microsoft-com:office:word" xmlns:w14="http://schemas.microsoft.com/office/word/2010/wordml" xmlns:w="http://schemas.openxmlformats.org/wordprocessingml/2006/main" xmlns:wne="http://schemas.microsoft.com/office/word/2006/wordml" xmlns:wp14="http://schemas.microsoft.com/office/word/2010/wordprocessingDrawing" xmlns:wp="http://schemas.openxmlformats.org/drawingml/2006/wordprocessingDrawing" xmlns:wpc="http://schemas.microsoft.com/office/word/2010/wordprocessingCanvas" xmlns:wpg="http://schemas.microsoft.com/office/word/2010/wordprocessingGroup" xmlns:wpi="http://schemas.microsoft.com/office/word/2010/wordprocessingInk" xmlns:wps="http://schemas.microsoft.com/office/word/2010/wordprocessingShape" mc:Ignorable="w14 wp14">
+  <w:p/>
+</w:ftr>
+</file>
+
+<file path=word/footer43.xml><?xml version="1.0" encoding="utf-8"?>
+<w:ftr xmlns:m="http://schemas.openxmlformats.org/officeDocument/2006/math" xmlns:mc="http://schemas.openxmlformats.org/markup-compatibility/2006" xmlns:mo="http://schemas.microsoft.com/office/mac/office/2008/main" xmlns:mv="urn:schemas-microsoft-com:mac:vml" xmlns:o="urn:schemas-microsoft-com:office:office" xmlns:r="http://schemas.openxmlformats.org/officeDocument/2006/relationships" xmlns:v="urn:schemas-microsoft-com:vml" xmlns:w10="urn:schemas-microsoft-com:office:word" xmlns:w14="http://schemas.microsoft.com/office/word/2010/wordml" xmlns:w="http://schemas.openxmlformats.org/wordprocessingml/2006/main" xmlns:wne="http://schemas.microsoft.com/office/word/2006/wordml" xmlns:wp14="http://schemas.microsoft.com/office/word/2010/wordprocessingDrawing" xmlns:wp="http://schemas.openxmlformats.org/drawingml/2006/wordprocessingDrawing" xmlns:wpc="http://schemas.microsoft.com/office/word/2010/wordprocessingCanvas" xmlns:wpg="http://schemas.microsoft.com/office/word/2010/wordprocessingGroup" xmlns:wpi="http://schemas.microsoft.com/office/word/2010/wordprocessingInk" xmlns:wps="http://schemas.microsoft.com/office/word/2010/wordprocessingShape" mc:Ignorable="w14 wp14">
+  <w:p>
+    <w:pPr>
+      <w:jc w:val="center"/>
+    </w:pPr>
+    <w:r>
+      <w:rPr>
+        <w:rFonts w:ascii="Times New Roman" w:hAnsi="Times New Roman"/>
+        <w:sz w:val="24"/>
+      </w:rPr>
+      <w:fldChar w:fldCharType="begin"/>
+      <w:instrText xml:space="preserve"> PAGE </w:instrText>
+      <w:fldChar w:fldCharType="separate"/>
+      <w:fldChar w:fldCharType="end"/>
+    </w:r>
+  </w:p>
+</w:ftr>
+</file>
+
+<file path=word/footer44.xml><?xml version="1.0" encoding="utf-8"?>
+<w:ftr xmlns:m="http://schemas.openxmlformats.org/officeDocument/2006/math" xmlns:mc="http://schemas.openxmlformats.org/markup-compatibility/2006" xmlns:mo="http://schemas.microsoft.com/office/mac/office/2008/main" xmlns:mv="urn:schemas-microsoft-com:mac:vml" xmlns:o="urn:schemas-microsoft-com:office:office" xmlns:r="http://schemas.openxmlformats.org/officeDocument/2006/relationships" xmlns:v="urn:schemas-microsoft-com:vml" xmlns:w10="urn:schemas-microsoft-com:office:word" xmlns:w14="http://schemas.microsoft.com/office/word/2010/wordml" xmlns:w="http://schemas.openxmlformats.org/wordprocessingml/2006/main" xmlns:wne="http://schemas.microsoft.com/office/word/2006/wordml" xmlns:wp14="http://schemas.microsoft.com/office/word/2010/wordprocessingDrawing" xmlns:wp="http://schemas.openxmlformats.org/drawingml/2006/wordprocessingDrawing" xmlns:wpc="http://schemas.microsoft.com/office/word/2010/wordprocessingCanvas" xmlns:wpg="http://schemas.microsoft.com/office/word/2010/wordprocessingGroup" xmlns:wpi="http://schemas.microsoft.com/office/word/2010/wordprocessingInk" xmlns:wps="http://schemas.microsoft.com/office/word/2010/wordprocessingShape" mc:Ignorable="w14 wp14">
+  <w:p>
+    <w:pPr>
+      <w:jc w:val="center"/>
+    </w:pPr>
+    <w:r>
+      <w:rPr>
+        <w:rFonts w:ascii="Times New Roman" w:hAnsi="Times New Roman"/>
+        <w:sz w:val="24"/>
+      </w:rPr>
+      <w:fldChar w:fldCharType="begin"/>
+      <w:instrText xml:space="preserve"> PAGE </w:instrText>
       <w:fldChar w:fldCharType="separate"/>
       <w:fldChar w:fldCharType="end"/>
     </w:r>
@@ -9487,8 +9627,18 @@
 <w:ftr xmlns:m="http://schemas.openxmlformats.org/officeDocument/2006/math" xmlns:mc="http://schemas.openxmlformats.org/markup-compatibility/2006" xmlns:mo="http://schemas.microsoft.com/office/mac/office/2008/main" xmlns:mv="urn:schemas-microsoft-com:mac:vml" xmlns:o="urn:schemas-microsoft-com:office:office" xmlns:r="http://schemas.openxmlformats.org/officeDocument/2006/relationships" xmlns:v="urn:schemas-microsoft-com:vml" xmlns:w10="urn:schemas-microsoft-com:office:word" xmlns:w14="http://schemas.microsoft.com/office/word/2010/wordml" xmlns:w="http://schemas.openxmlformats.org/wordprocessingml/2006/main" xmlns:wne="http://schemas.microsoft.com/office/word/2006/wordml" xmlns:wp14="http://schemas.microsoft.com/office/word/2010/wordprocessingDrawing" xmlns:wp="http://schemas.openxmlformats.org/drawingml/2006/wordprocessingDrawing" xmlns:wpc="http://schemas.microsoft.com/office/word/2010/wordprocessingCanvas" xmlns:wpg="http://schemas.microsoft.com/office/word/2010/wordprocessingGroup" xmlns:wpi="http://schemas.microsoft.com/office/word/2010/wordprocessingInk" xmlns:wps="http://schemas.microsoft.com/office/word/2010/wordprocessingShape" mc:Ignorable="w14 wp14">
   <w:p>
     <w:pPr>
-      <w:pStyle w:val="Footer"/>
+      <w:jc w:val="center"/>
     </w:pPr>
+    <w:r>
+      <w:rPr>
+        <w:rFonts w:ascii="Times New Roman" w:hAnsi="Times New Roman"/>
+        <w:sz w:val="24"/>
+      </w:rPr>
+      <w:fldChar w:fldCharType="begin"/>
+      <w:instrText xml:space="preserve"> PAGE </w:instrText>
+      <w:fldChar w:fldCharType="separate"/>
+      <w:fldChar w:fldCharType="end"/>
+    </w:r>
   </w:p>
 </w:ftr>
 </file>
@@ -9497,8 +9647,18 @@
 <w:ftr xmlns:m="http://schemas.openxmlformats.org/officeDocument/2006/math" xmlns:mc="http://schemas.openxmlformats.org/markup-compatibility/2006" xmlns:mo="http://schemas.microsoft.com/office/mac/office/2008/main" xmlns:mv="urn:schemas-microsoft-com:mac:vml" xmlns:o="urn:schemas-microsoft-com:office:office" xmlns:r="http://schemas.openxmlformats.org/officeDocument/2006/relationships" xmlns:v="urn:schemas-microsoft-com:vml" xmlns:w10="urn:schemas-microsoft-com:office:word" xmlns:w14="http://schemas.microsoft.com/office/word/2010/wordml" xmlns:w="http://schemas.openxmlformats.org/wordprocessingml/2006/main" xmlns:wne="http://schemas.microsoft.com/office/word/2006/wordml" xmlns:wp14="http://schemas.microsoft.com/office/word/2010/wordprocessingDrawing" xmlns:wp="http://schemas.openxmlformats.org/drawingml/2006/wordprocessingDrawing" xmlns:wpc="http://schemas.microsoft.com/office/word/2010/wordprocessingCanvas" xmlns:wpg="http://schemas.microsoft.com/office/word/2010/wordprocessingGroup" xmlns:wpi="http://schemas.microsoft.com/office/word/2010/wordprocessingInk" xmlns:wps="http://schemas.microsoft.com/office/word/2010/wordprocessingShape" mc:Ignorable="w14 wp14">
   <w:p>
     <w:pPr>
-      <w:pStyle w:val="Footer"/>
+      <w:jc w:val="center"/>
     </w:pPr>
+    <w:r>
+      <w:rPr>
+        <w:rFonts w:ascii="Times New Roman" w:hAnsi="Times New Roman"/>
+        <w:sz w:val="24"/>
+      </w:rPr>
+      <w:fldChar w:fldCharType="begin"/>
+      <w:instrText xml:space="preserve"> PAGE </w:instrText>
+      <w:fldChar w:fldCharType="separate"/>
+      <w:fldChar w:fldCharType="end"/>
+    </w:r>
   </w:p>
 </w:ftr>
 </file>
@@ -9507,7 +9667,6 @@
 <w:ftr xmlns:m="http://schemas.openxmlformats.org/officeDocument/2006/math" xmlns:mc="http://schemas.openxmlformats.org/markup-compatibility/2006" xmlns:mo="http://schemas.microsoft.com/office/mac/office/2008/main" xmlns:mv="urn:schemas-microsoft-com:mac:vml" xmlns:o="urn:schemas-microsoft-com:office:office" xmlns:r="http://schemas.openxmlformats.org/officeDocument/2006/relationships" xmlns:v="urn:schemas-microsoft-com:vml" xmlns:w10="urn:schemas-microsoft-com:office:word" xmlns:w14="http://schemas.microsoft.com/office/word/2010/wordml" xmlns:w="http://schemas.openxmlformats.org/wordprocessingml/2006/main" xmlns:wne="http://schemas.microsoft.com/office/word/2006/wordml" xmlns:wp14="http://schemas.microsoft.com/office/word/2010/wordprocessingDrawing" xmlns:wp="http://schemas.openxmlformats.org/drawingml/2006/wordprocessingDrawing" xmlns:wpc="http://schemas.microsoft.com/office/word/2010/wordprocessingCanvas" xmlns:wpg="http://schemas.microsoft.com/office/word/2010/wordprocessingGroup" xmlns:wpi="http://schemas.microsoft.com/office/word/2010/wordprocessingInk" xmlns:wps="http://schemas.microsoft.com/office/word/2010/wordprocessingShape" mc:Ignorable="w14 wp14">
   <w:p>
     <w:pPr>
-      <w:pStyle w:val="Footer"/>
       <w:jc w:val="center"/>
     </w:pPr>
     <w:r>
@@ -9516,7 +9675,7 @@
         <w:sz w:val="24"/>
       </w:rPr>
       <w:fldChar w:fldCharType="begin"/>
-      <w:instrText xml:space="preserve"> PAGE \* roman </w:instrText>
+      <w:instrText xml:space="preserve"> PAGE </w:instrText>
       <w:fldChar w:fldCharType="separate"/>
       <w:fldChar w:fldCharType="end"/>
     </w:r>
@@ -9528,7 +9687,6 @@
 <w:ftr xmlns:m="http://schemas.openxmlformats.org/officeDocument/2006/math" xmlns:mc="http://schemas.openxmlformats.org/markup-compatibility/2006" xmlns:mo="http://schemas.microsoft.com/office/mac/office/2008/main" xmlns:mv="urn:schemas-microsoft-com:mac:vml" xmlns:o="urn:schemas-microsoft-com:office:office" xmlns:r="http://schemas.openxmlformats.org/officeDocument/2006/relationships" xmlns:v="urn:schemas-microsoft-com:vml" xmlns:w10="urn:schemas-microsoft-com:office:word" xmlns:w14="http://schemas.microsoft.com/office/word/2010/wordml" xmlns:w="http://schemas.openxmlformats.org/wordprocessingml/2006/main" xmlns:wne="http://schemas.microsoft.com/office/word/2006/wordml" xmlns:wp14="http://schemas.microsoft.com/office/word/2010/wordprocessingDrawing" xmlns:wp="http://schemas.openxmlformats.org/drawingml/2006/wordprocessingDrawing" xmlns:wpc="http://schemas.microsoft.com/office/word/2010/wordprocessingCanvas" xmlns:wpg="http://schemas.microsoft.com/office/word/2010/wordprocessingGroup" xmlns:wpi="http://schemas.microsoft.com/office/word/2010/wordprocessingInk" xmlns:wps="http://schemas.microsoft.com/office/word/2010/wordprocessingShape" mc:Ignorable="w14 wp14">
   <w:p>
     <w:pPr>
-      <w:pStyle w:val="Footer"/>
       <w:jc w:val="center"/>
     </w:pPr>
     <w:r>
@@ -9537,7 +9695,7 @@
         <w:sz w:val="24"/>
       </w:rPr>
       <w:fldChar w:fldCharType="begin"/>
-      <w:instrText xml:space="preserve"> PAGE \* roman </w:instrText>
+      <w:instrText xml:space="preserve"> PAGE </w:instrText>
       <w:fldChar w:fldCharType="separate"/>
       <w:fldChar w:fldCharType="end"/>
     </w:r>
@@ -9549,7 +9707,6 @@
 <w:ftr xmlns:m="http://schemas.openxmlformats.org/officeDocument/2006/math" xmlns:mc="http://schemas.openxmlformats.org/markup-compatibility/2006" xmlns:mo="http://schemas.microsoft.com/office/mac/office/2008/main" xmlns:mv="urn:schemas-microsoft-com:mac:vml" xmlns:o="urn:schemas-microsoft-com:office:office" xmlns:r="http://schemas.openxmlformats.org/officeDocument/2006/relationships" xmlns:v="urn:schemas-microsoft-com:vml" xmlns:w10="urn:schemas-microsoft-com:office:word" xmlns:w14="http://schemas.microsoft.com/office/word/2010/wordml" xmlns:w="http://schemas.openxmlformats.org/wordprocessingml/2006/main" xmlns:wne="http://schemas.microsoft.com/office/word/2006/wordml" xmlns:wp14="http://schemas.microsoft.com/office/word/2010/wordprocessingDrawing" xmlns:wp="http://schemas.openxmlformats.org/drawingml/2006/wordprocessingDrawing" xmlns:wpc="http://schemas.microsoft.com/office/word/2010/wordprocessingCanvas" xmlns:wpg="http://schemas.microsoft.com/office/word/2010/wordprocessingGroup" xmlns:wpi="http://schemas.microsoft.com/office/word/2010/wordprocessingInk" xmlns:wps="http://schemas.microsoft.com/office/word/2010/wordprocessingShape" mc:Ignorable="w14 wp14">
   <w:p>
     <w:pPr>
-      <w:pStyle w:val="Footer"/>
       <w:jc w:val="center"/>
     </w:pPr>
     <w:r>
@@ -9558,7 +9715,7 @@
         <w:sz w:val="24"/>
       </w:rPr>
       <w:fldChar w:fldCharType="begin"/>
-      <w:instrText xml:space="preserve"> PAGE \* roman </w:instrText>
+      <w:instrText xml:space="preserve"> PAGE </w:instrText>
       <w:fldChar w:fldCharType="separate"/>
       <w:fldChar w:fldCharType="end"/>
     </w:r>

</xml_diff>

<commit_message>
Corregir numeración romana del índice
</commit_message>
<xml_diff>
--- a/amaal/reportes/Informe_Pasantia_IUTECP.docx
+++ b/amaal/reportes/Informe_Pasantia_IUTECP.docx
@@ -947,11 +947,7 @@
           <w:b w:val="0"/>
           <w:sz w:val="24"/>
         </w:rPr>
-        <w:fldChar w:fldCharType="begin"/>
-        <w:instrText xml:space="preserve"> PAGEREF bm_contraportada \h </w:instrText>
-        <w:fldChar w:fldCharType="separate"/>
-        <w:t>?</w:t>
-        <w:fldChar w:fldCharType="end"/>
+        <w:t>ii</w:t>
       </w:r>
     </w:p>
     <w:p>
@@ -977,11 +973,7 @@
           <w:b w:val="0"/>
           <w:sz w:val="24"/>
         </w:rPr>
-        <w:fldChar w:fldCharType="begin"/>
-        <w:instrText xml:space="preserve"> PAGEREF bm_aprob_ind \h </w:instrText>
-        <w:fldChar w:fldCharType="separate"/>
-        <w:t>?</w:t>
-        <w:fldChar w:fldCharType="end"/>
+        <w:t>iii</w:t>
       </w:r>
     </w:p>
     <w:p>
@@ -1007,11 +999,7 @@
           <w:b w:val="0"/>
           <w:sz w:val="24"/>
         </w:rPr>
-        <w:fldChar w:fldCharType="begin"/>
-        <w:instrText xml:space="preserve"> PAGEREF bm_aprob_acad \h </w:instrText>
-        <w:fldChar w:fldCharType="separate"/>
-        <w:t>?</w:t>
-        <w:fldChar w:fldCharType="end"/>
+        <w:t>iv</w:t>
       </w:r>
     </w:p>
     <w:p>
@@ -1037,11 +1025,7 @@
           <w:b w:val="0"/>
           <w:sz w:val="24"/>
         </w:rPr>
-        <w:fldChar w:fldCharType="begin"/>
-        <w:instrText xml:space="preserve"> PAGEREF bm_agradecimientos \h </w:instrText>
-        <w:fldChar w:fldCharType="separate"/>
-        <w:t>?</w:t>
-        <w:fldChar w:fldCharType="end"/>
+        <w:t>v</w:t>
       </w:r>
     </w:p>
     <w:p>
@@ -1067,11 +1051,7 @@
           <w:b w:val="0"/>
           <w:sz w:val="24"/>
         </w:rPr>
-        <w:fldChar w:fldCharType="begin"/>
-        <w:instrText xml:space="preserve"> PAGEREF bm_dedicatoria \h </w:instrText>
-        <w:fldChar w:fldCharType="separate"/>
-        <w:t>?</w:t>
-        <w:fldChar w:fldCharType="end"/>
+        <w:t>vi</w:t>
       </w:r>
     </w:p>
     <w:p>
@@ -1097,11 +1077,7 @@
           <w:b w:val="0"/>
           <w:sz w:val="24"/>
         </w:rPr>
-        <w:fldChar w:fldCharType="begin"/>
-        <w:instrText xml:space="preserve"> PAGEREF bm_lista_cuadros \h </w:instrText>
-        <w:fldChar w:fldCharType="separate"/>
-        <w:t>?</w:t>
-        <w:fldChar w:fldCharType="end"/>
+        <w:t>ix</w:t>
       </w:r>
     </w:p>
     <w:p>
@@ -1127,11 +1103,7 @@
           <w:b w:val="0"/>
           <w:sz w:val="24"/>
         </w:rPr>
-        <w:fldChar w:fldCharType="begin"/>
-        <w:instrText xml:space="preserve"> PAGEREF bm_lista_graficos \h </w:instrText>
-        <w:fldChar w:fldCharType="separate"/>
-        <w:t>?</w:t>
-        <w:fldChar w:fldCharType="end"/>
+        <w:t>x</w:t>
       </w:r>
     </w:p>
     <w:p>
@@ -1157,11 +1129,7 @@
           <w:b w:val="0"/>
           <w:sz w:val="24"/>
         </w:rPr>
-        <w:fldChar w:fldCharType="begin"/>
-        <w:instrText xml:space="preserve"> PAGEREF bm_lista_anexos \h </w:instrText>
-        <w:fldChar w:fldCharType="separate"/>
-        <w:t>?</w:t>
-        <w:fldChar w:fldCharType="end"/>
+        <w:t>xi</w:t>
       </w:r>
     </w:p>
     <w:p>
@@ -1187,11 +1155,7 @@
           <w:b w:val="0"/>
           <w:sz w:val="24"/>
         </w:rPr>
-        <w:fldChar w:fldCharType="begin"/>
-        <w:instrText xml:space="preserve"> PAGEREF bm_resumen \h </w:instrText>
-        <w:fldChar w:fldCharType="separate"/>
-        <w:t>?</w:t>
-        <w:fldChar w:fldCharType="end"/>
+        <w:t>xii</w:t>
       </w:r>
     </w:p>
     <w:p>

</xml_diff>

<commit_message>
Agregar firmas y fechas de aprobacion
</commit_message>
<xml_diff>
--- a/amaal/reportes/Informe_Pasantia_IUTECP.docx
+++ b/amaal/reportes/Informe_Pasantia_IUTECP.docx
@@ -154,7 +154,7 @@
     <w:p>
       <w:pPr>
         <w:sectPr>
-          <w:footerReference w:type="default" r:id="rId31"/>
+          <w:footerReference w:type="default" r:id="rId32"/>
           <w:pgSz w:w="12240" w:h="15840"/>
           <w:pgMar w:top="1701" w:right="1701" w:bottom="1701" w:left="2268" w:header="720" w:footer="720" w:gutter="0"/>
           <w:cols w:space="720"/>
@@ -396,7 +396,7 @@
     <w:p>
       <w:pPr>
         <w:sectPr>
-          <w:footerReference w:type="default" r:id="rId32"/>
+          <w:footerReference w:type="default" r:id="rId33"/>
           <w:pgSz w:w="12240" w:h="15840"/>
           <w:pgMar w:top="1701" w:right="1701" w:bottom="1701" w:left="2268" w:header="720" w:footer="720" w:gutter="0"/>
           <w:cols w:space="720"/>
@@ -518,7 +518,7 @@
           <w:rFonts w:ascii="Times New Roman" w:hAnsi="Times New Roman"/>
           <w:sz w:val="24"/>
         </w:rPr>
-        <w:t>En la Ciudad de El Tigre, a los ___ días del mes de _______ de 2026</w:t>
+        <w:t>En la Ciudad de El Tigre, a los 14 días del mes de agosto de 2026</w:t>
       </w:r>
     </w:p>
     <w:p/>
@@ -592,175 +592,6 @@
     <w:p>
       <w:pPr>
         <w:sectPr>
-          <w:footerReference w:type="default" r:id="rId33"/>
-          <w:pgSz w:w="12240" w:h="15840"/>
-          <w:pgMar w:top="1701" w:right="1701" w:bottom="1701" w:left="2268" w:header="720" w:footer="720" w:gutter="0"/>
-          <w:cols w:space="720"/>
-          <w:docGrid w:linePitch="360"/>
-          <w:pgNumType w:fmt="lowerRoman"/>
-        </w:sectPr>
-      </w:pPr>
-    </w:p>
-    <w:p>
-      <w:pPr>
-        <w:spacing w:line="276" w:lineRule="auto" w:before="0" w:after="0"/>
-        <w:jc w:val="center"/>
-      </w:pPr>
-      <w:r>
-        <w:rPr>
-          <w:rFonts w:ascii="Times New Roman" w:hAnsi="Times New Roman"/>
-          <w:b/>
-          <w:sz w:val="24"/>
-        </w:rPr>
-        <w:t>REPÚBLICA BOLIVARIANA DE VENEZUELA</w:t>
-      </w:r>
-    </w:p>
-    <w:p>
-      <w:pPr>
-        <w:spacing w:line="276" w:lineRule="auto" w:before="0" w:after="0"/>
-        <w:jc w:val="center"/>
-      </w:pPr>
-      <w:r>
-        <w:rPr>
-          <w:rFonts w:ascii="Times New Roman" w:hAnsi="Times New Roman"/>
-          <w:b/>
-          <w:sz w:val="24"/>
-        </w:rPr>
-        <w:t>MINISTERIO DEL PODER POPULAR PARA LA EDUCACIÓN UNIVERSITARIA</w:t>
-      </w:r>
-    </w:p>
-    <w:p>
-      <w:pPr>
-        <w:spacing w:line="276" w:lineRule="auto" w:before="0" w:after="0"/>
-        <w:jc w:val="center"/>
-      </w:pPr>
-      <w:r>
-        <w:rPr>
-          <w:rFonts w:ascii="Times New Roman" w:hAnsi="Times New Roman"/>
-          <w:b/>
-          <w:sz w:val="24"/>
-        </w:rPr>
-        <w:t>INSTITUTO UNIVERSITARIO DE TECNOLOGÍA</w:t>
-      </w:r>
-    </w:p>
-    <w:p>
-      <w:pPr>
-        <w:spacing w:line="276" w:lineRule="auto" w:before="0" w:after="0"/>
-        <w:jc w:val="center"/>
-      </w:pPr>
-      <w:r>
-        <w:rPr>
-          <w:rFonts w:ascii="Times New Roman" w:hAnsi="Times New Roman"/>
-          <w:b/>
-          <w:sz w:val="24"/>
-        </w:rPr>
-        <w:t>"ELÍAS CALIXTO POMPA"</w:t>
-      </w:r>
-    </w:p>
-    <w:p>
-      <w:pPr>
-        <w:spacing w:line="276" w:lineRule="auto" w:before="0" w:after="0"/>
-        <w:jc w:val="center"/>
-      </w:pPr>
-      <w:r>
-        <w:rPr>
-          <w:rFonts w:ascii="Times New Roman" w:hAnsi="Times New Roman"/>
-          <w:b/>
-          <w:sz w:val="24"/>
-        </w:rPr>
-        <w:t>EL TIGRE, ESTADO ANZOÁTEGUI</w:t>
-      </w:r>
-    </w:p>
-    <w:p/>
-    <w:p>
-      <w:bookmarkStart w:id="bm_aprob_acad" w:name="bm_aprob_acad"/>
-      <w:pPr>
-        <w:spacing w:before="480" w:after="480"/>
-        <w:jc w:val="center"/>
-      </w:pPr>
-      <w:r>
-        <w:rPr>
-          <w:rFonts w:ascii="Times New Roman" w:hAnsi="Times New Roman"/>
-          <w:b/>
-          <w:sz w:val="24"/>
-        </w:rPr>
-        <w:t>APROBACIÓN DEL TUTOR ACADÉMICO</w:t>
-      </w:r>
-      <w:bookmarkEnd w:id="bm_aprob_acad"/>
-    </w:p>
-    <w:p>
-      <w:pPr>
-        <w:spacing w:line="360" w:lineRule="auto"/>
-        <w:ind w:firstLine="0"/>
-        <w:jc w:val="both"/>
-      </w:pPr>
-      <w:r>
-        <w:rPr>
-          <w:rFonts w:ascii="Times New Roman" w:hAnsi="Times New Roman"/>
-          <w:sz w:val="24"/>
-        </w:rPr>
-        <w:t>En mi carácter de tutor académico del informe de pasantías presentado por: Alrifaai Alrifaaie, Amaal, de Cédula de Identidad V-31.985.792; para optar al grado de Técnico Superior Universitario en la especialidad de: Administración, cuyo título es; “EVALUACIÓN DEL CONTROL ADMINISTRATIVO APLICADO A LA GESTIÓN DE SOLICITUDES DE SERVICIOS DE TELECOMUNICACIONES EN LA EMPRESA INGENIERÍA DE TELECOMUNICACIONES, C.A.”, manifiesto que cumple con los requisitos exigidos por el Instituto Universitario de Tecnología “Elías Calixto Pompa” (IUTECP); y que, por lo tanto, considero que reúne los méritos suficientes para ser evaluado por el jurado que se decida designar a tal fin.</w:t>
-      </w:r>
-    </w:p>
-    <w:p/>
-    <w:p/>
-    <w:p>
-      <w:pPr>
-        <w:spacing w:line="360" w:lineRule="auto"/>
-        <w:jc w:val="left"/>
-      </w:pPr>
-      <w:r>
-        <w:rPr>
-          <w:rFonts w:ascii="Times New Roman" w:hAnsi="Times New Roman"/>
-          <w:sz w:val="24"/>
-        </w:rPr>
-        <w:t>En la Ciudad de El Tigre, a los ___ días del mes de _______ de 2026</w:t>
-      </w:r>
-    </w:p>
-    <w:p/>
-    <w:p>
-      <w:pPr>
-        <w:jc w:val="center"/>
-      </w:pPr>
-      <w:r>
-        <w:rPr>
-          <w:rFonts w:ascii="Times New Roman" w:hAnsi="Times New Roman"/>
-          <w:sz w:val="24"/>
-        </w:rPr>
-        <w:t>___________________________________</w:t>
-      </w:r>
-    </w:p>
-    <w:p/>
-    <w:p>
-      <w:pPr>
-        <w:spacing w:line="360" w:lineRule="auto"/>
-        <w:jc w:val="center"/>
-      </w:pPr>
-      <w:r>
-        <w:rPr>
-          <w:rFonts w:ascii="Times New Roman" w:hAnsi="Times New Roman"/>
-          <w:b/>
-          <w:sz w:val="24"/>
-        </w:rPr>
-        <w:t>Dra. Álvarez, Carmen</w:t>
-      </w:r>
-    </w:p>
-    <w:p>
-      <w:pPr>
-        <w:spacing w:before="0"/>
-        <w:jc w:val="center"/>
-      </w:pPr>
-      <w:r>
-        <w:rPr>
-          <w:rFonts w:ascii="Times New Roman" w:hAnsi="Times New Roman"/>
-          <w:sz w:val="24"/>
-        </w:rPr>
-        <w:t>C.I.: 14.452.956</w:t>
-      </w:r>
-    </w:p>
-    <w:p>
-      <w:pPr>
-        <w:sectPr>
           <w:footerReference w:type="default" r:id="rId34"/>
           <w:pgSz w:w="12240" w:h="15840"/>
           <w:pgMar w:top="1701" w:right="1701" w:bottom="1701" w:left="2268" w:header="720" w:footer="720" w:gutter="0"/>
@@ -771,9 +602,8 @@
       </w:pPr>
     </w:p>
     <w:p>
-      <w:bookmarkStart w:id="bm_agradecimientos" w:name="bm_agradecimientos"/>
-      <w:pPr>
-        <w:spacing w:before="1140" w:after="480"/>
+      <w:pPr>
+        <w:spacing w:line="276" w:lineRule="auto" w:before="0" w:after="0"/>
         <w:jc w:val="center"/>
       </w:pPr>
       <w:r>
@@ -782,9 +612,178 @@
           <w:b/>
           <w:sz w:val="24"/>
         </w:rPr>
-        <w:t>AGRADECIMIENTOS</w:t>
-      </w:r>
-      <w:bookmarkEnd w:id="bm_agradecimientos"/>
+        <w:t>REPÚBLICA BOLIVARIANA DE VENEZUELA</w:t>
+      </w:r>
+    </w:p>
+    <w:p>
+      <w:pPr>
+        <w:spacing w:line="276" w:lineRule="auto" w:before="0" w:after="0"/>
+        <w:jc w:val="center"/>
+      </w:pPr>
+      <w:r>
+        <w:rPr>
+          <w:rFonts w:ascii="Times New Roman" w:hAnsi="Times New Roman"/>
+          <w:b/>
+          <w:sz w:val="24"/>
+        </w:rPr>
+        <w:t>MINISTERIO DEL PODER POPULAR PARA LA EDUCACIÓN UNIVERSITARIA</w:t>
+      </w:r>
+    </w:p>
+    <w:p>
+      <w:pPr>
+        <w:spacing w:line="276" w:lineRule="auto" w:before="0" w:after="0"/>
+        <w:jc w:val="center"/>
+      </w:pPr>
+      <w:r>
+        <w:rPr>
+          <w:rFonts w:ascii="Times New Roman" w:hAnsi="Times New Roman"/>
+          <w:b/>
+          <w:sz w:val="24"/>
+        </w:rPr>
+        <w:t>INSTITUTO UNIVERSITARIO DE TECNOLOGÍA</w:t>
+      </w:r>
+    </w:p>
+    <w:p>
+      <w:pPr>
+        <w:spacing w:line="276" w:lineRule="auto" w:before="0" w:after="0"/>
+        <w:jc w:val="center"/>
+      </w:pPr>
+      <w:r>
+        <w:rPr>
+          <w:rFonts w:ascii="Times New Roman" w:hAnsi="Times New Roman"/>
+          <w:b/>
+          <w:sz w:val="24"/>
+        </w:rPr>
+        <w:t>"ELÍAS CALIXTO POMPA"</w:t>
+      </w:r>
+    </w:p>
+    <w:p>
+      <w:pPr>
+        <w:spacing w:line="276" w:lineRule="auto" w:before="0" w:after="0"/>
+        <w:jc w:val="center"/>
+      </w:pPr>
+      <w:r>
+        <w:rPr>
+          <w:rFonts w:ascii="Times New Roman" w:hAnsi="Times New Roman"/>
+          <w:b/>
+          <w:sz w:val="24"/>
+        </w:rPr>
+        <w:t>EL TIGRE, ESTADO ANZOÁTEGUI</w:t>
+      </w:r>
+    </w:p>
+    <w:p/>
+    <w:p>
+      <w:bookmarkStart w:id="bm_aprob_acad" w:name="bm_aprob_acad"/>
+      <w:pPr>
+        <w:spacing w:before="480" w:after="480"/>
+        <w:jc w:val="center"/>
+      </w:pPr>
+      <w:r>
+        <w:rPr>
+          <w:rFonts w:ascii="Times New Roman" w:hAnsi="Times New Roman"/>
+          <w:b/>
+          <w:sz w:val="24"/>
+        </w:rPr>
+        <w:t>APROBACIÓN DEL TUTOR ACADÉMICO</w:t>
+      </w:r>
+      <w:bookmarkEnd w:id="bm_aprob_acad"/>
+    </w:p>
+    <w:p>
+      <w:pPr>
+        <w:spacing w:line="360" w:lineRule="auto"/>
+        <w:ind w:firstLine="0"/>
+        <w:jc w:val="both"/>
+      </w:pPr>
+      <w:r>
+        <w:rPr>
+          <w:rFonts w:ascii="Times New Roman" w:hAnsi="Times New Roman"/>
+          <w:sz w:val="24"/>
+        </w:rPr>
+        <w:t>En mi carácter de tutor académico del informe de pasantías presentado por: Alrifaai Alrifaaie, Amaal, de Cédula de Identidad V-31.985.792; para optar al grado de Técnico Superior Universitario en la especialidad de: Administración, cuyo título es; “EVALUACIÓN DEL CONTROL ADMINISTRATIVO APLICADO A LA GESTIÓN DE SOLICITUDES DE SERVICIOS DE TELECOMUNICACIONES EN LA EMPRESA INGENIERÍA DE TELECOMUNICACIONES, C.A.”, manifiesto que cumple con los requisitos exigidos por el Instituto Universitario de Tecnología “Elías Calixto Pompa” (IUTECP); y que, por lo tanto, considero que reúne los méritos suficientes para ser evaluado por el jurado que se decida designar a tal fin.</w:t>
+      </w:r>
+    </w:p>
+    <w:p/>
+    <w:p/>
+    <w:p>
+      <w:pPr>
+        <w:spacing w:line="360" w:lineRule="auto"/>
+        <w:jc w:val="left"/>
+      </w:pPr>
+      <w:r>
+        <w:rPr>
+          <w:rFonts w:ascii="Times New Roman" w:hAnsi="Times New Roman"/>
+          <w:sz w:val="24"/>
+        </w:rPr>
+        <w:t>En la Ciudad de El Tigre, a los ___ días del mes de _______ de 2026</w:t>
+      </w:r>
+    </w:p>
+    <w:p/>
+    <w:p>
+      <w:pPr>
+        <w:jc w:val="center"/>
+      </w:pPr>
+      <w:r>
+        <w:drawing>
+          <wp:inline xmlns:a="http://schemas.openxmlformats.org/drawingml/2006/main" xmlns:pic="http://schemas.openxmlformats.org/drawingml/2006/picture">
+            <wp:extent cx="1440000" cy="1077989"/>
+            <wp:docPr id="3" name="Picture 3"/>
+            <wp:cNvGraphicFramePr>
+              <a:graphicFrameLocks noChangeAspect="1"/>
+            </wp:cNvGraphicFramePr>
+            <a:graphic>
+              <a:graphicData uri="http://schemas.openxmlformats.org/drawingml/2006/picture">
+                <pic:pic>
+                  <pic:nvPicPr>
+                    <pic:cNvPr id="0" name="firma_tutor_academico.png"/>
+                    <pic:cNvPicPr/>
+                  </pic:nvPicPr>
+                  <pic:blipFill>
+                    <a:blip r:embed="rId11"/>
+                    <a:stretch>
+                      <a:fillRect/>
+                    </a:stretch>
+                  </pic:blipFill>
+                  <pic:spPr>
+                    <a:xfrm>
+                      <a:off x="0" y="0"/>
+                      <a:ext cx="1440000" cy="1077989"/>
+                    </a:xfrm>
+                    <a:prstGeom prst="rect"/>
+                  </pic:spPr>
+                </pic:pic>
+              </a:graphicData>
+            </a:graphic>
+          </wp:inline>
+        </w:drawing>
+      </w:r>
+    </w:p>
+    <w:p/>
+    <w:p>
+      <w:pPr>
+        <w:spacing w:line="360" w:lineRule="auto"/>
+        <w:jc w:val="center"/>
+      </w:pPr>
+      <w:r>
+        <w:rPr>
+          <w:rFonts w:ascii="Times New Roman" w:hAnsi="Times New Roman"/>
+          <w:b/>
+          <w:sz w:val="24"/>
+        </w:rPr>
+        <w:t>Dra. Álvarez, Carmen</w:t>
+      </w:r>
+    </w:p>
+    <w:p>
+      <w:pPr>
+        <w:spacing w:before="0"/>
+        <w:jc w:val="center"/>
+      </w:pPr>
+      <w:r>
+        <w:rPr>
+          <w:rFonts w:ascii="Times New Roman" w:hAnsi="Times New Roman"/>
+          <w:sz w:val="24"/>
+        </w:rPr>
+        <w:t>C.I.: 14.452.956</w:t>
+      </w:r>
     </w:p>
     <w:p>
       <w:pPr>
@@ -799,6 +798,34 @@
       </w:pPr>
     </w:p>
     <w:p>
+      <w:bookmarkStart w:id="bm_agradecimientos" w:name="bm_agradecimientos"/>
+      <w:pPr>
+        <w:spacing w:before="1140" w:after="480"/>
+        <w:jc w:val="center"/>
+      </w:pPr>
+      <w:r>
+        <w:rPr>
+          <w:rFonts w:ascii="Times New Roman" w:hAnsi="Times New Roman"/>
+          <w:b/>
+          <w:sz w:val="24"/>
+        </w:rPr>
+        <w:t>AGRADECIMIENTOS</w:t>
+      </w:r>
+      <w:bookmarkEnd w:id="bm_agradecimientos"/>
+    </w:p>
+    <w:p>
+      <w:pPr>
+        <w:sectPr>
+          <w:footerReference w:type="default" r:id="rId36"/>
+          <w:pgSz w:w="12240" w:h="15840"/>
+          <w:pgMar w:top="1701" w:right="1701" w:bottom="1701" w:left="2268" w:header="720" w:footer="720" w:gutter="0"/>
+          <w:cols w:space="720"/>
+          <w:docGrid w:linePitch="360"/>
+          <w:pgNumType w:fmt="lowerRoman"/>
+        </w:sectPr>
+      </w:pPr>
+    </w:p>
+    <w:p>
       <w:pPr>
         <w:spacing w:line="360" w:lineRule="auto" w:after="0" w:before="0"/>
         <w:ind w:firstLine="709"/>
@@ -816,7 +843,7 @@
     <w:p>
       <w:pPr>
         <w:sectPr>
-          <w:footerReference w:type="default" r:id="rId36"/>
+          <w:footerReference w:type="default" r:id="rId37"/>
           <w:type w:val="continuous"/>
           <w:pgSz w:w="12240" w:h="15840"/>
           <w:pgMar w:top="1701" w:right="1701" w:bottom="1701" w:left="2268" w:header="720" w:footer="720" w:gutter="0"/>
@@ -845,7 +872,7 @@
     <w:p>
       <w:pPr>
         <w:sectPr>
-          <w:footerReference w:type="default" r:id="rId37"/>
+          <w:footerReference w:type="default" r:id="rId38"/>
           <w:pgSz w:w="12240" w:h="15840"/>
           <w:pgMar w:top="1701" w:right="1701" w:bottom="1701" w:left="2268" w:header="720" w:footer="720" w:gutter="0"/>
           <w:cols w:space="720"/>
@@ -872,7 +899,7 @@
     <w:p>
       <w:pPr>
         <w:sectPr>
-          <w:footerReference w:type="default" r:id="rId38"/>
+          <w:footerReference w:type="default" r:id="rId39"/>
           <w:type w:val="continuous"/>
           <w:pgSz w:w="12240" w:h="15840"/>
           <w:pgMar w:top="1701" w:right="1701" w:bottom="1701" w:left="2268" w:header="720" w:footer="720" w:gutter="0"/>
@@ -901,7 +928,7 @@
     <w:p>
       <w:pPr>
         <w:sectPr>
-          <w:footerReference w:type="default" r:id="rId39"/>
+          <w:footerReference w:type="default" r:id="rId40"/>
           <w:pgSz w:w="12240" w:h="15840"/>
           <w:pgMar w:top="1701" w:right="1701" w:bottom="1701" w:left="2268" w:header="720" w:footer="720" w:gutter="0"/>
           <w:cols w:space="720"/>
@@ -1982,7 +2009,7 @@
     <w:p>
       <w:pPr>
         <w:sectPr>
-          <w:footerReference w:type="default" r:id="rId40"/>
+          <w:footerReference w:type="default" r:id="rId41"/>
           <w:type w:val="continuous"/>
           <w:pgSz w:w="12240" w:h="15840"/>
           <w:pgMar w:top="1701" w:right="1701" w:bottom="1701" w:left="2268" w:header="720" w:footer="720" w:gutter="0"/>
@@ -2011,7 +2038,7 @@
     <w:p>
       <w:pPr>
         <w:sectPr>
-          <w:footerReference w:type="default" r:id="rId41"/>
+          <w:footerReference w:type="default" r:id="rId42"/>
           <w:pgSz w:w="12240" w:h="15840"/>
           <w:pgMar w:top="1701" w:right="1701" w:bottom="1701" w:left="2268" w:header="720" w:footer="720" w:gutter="0"/>
           <w:cols w:space="720"/>
@@ -2114,7 +2141,7 @@
     <w:p>
       <w:pPr>
         <w:sectPr>
-          <w:footerReference w:type="default" r:id="rId42"/>
+          <w:footerReference w:type="default" r:id="rId43"/>
           <w:type w:val="continuous"/>
           <w:pgSz w:w="12240" w:h="15840"/>
           <w:pgMar w:top="1701" w:right="1701" w:bottom="1701" w:left="2268" w:header="720" w:footer="720" w:gutter="0"/>
@@ -2143,7 +2170,7 @@
     <w:p>
       <w:pPr>
         <w:sectPr>
-          <w:footerReference w:type="default" r:id="rId43"/>
+          <w:footerReference w:type="default" r:id="rId44"/>
           <w:pgSz w:w="12240" w:h="15840"/>
           <w:pgMar w:top="1701" w:right="1701" w:bottom="1701" w:left="2268" w:header="720" w:footer="720" w:gutter="0"/>
           <w:cols w:space="720"/>
@@ -2310,7 +2337,7 @@
     <w:p>
       <w:pPr>
         <w:sectPr>
-          <w:footerReference w:type="default" r:id="rId44"/>
+          <w:footerReference w:type="default" r:id="rId45"/>
           <w:type w:val="continuous"/>
           <w:pgSz w:w="12240" w:h="15840"/>
           <w:pgMar w:top="1701" w:right="1701" w:bottom="1701" w:left="2268" w:header="720" w:footer="720" w:gutter="0"/>
@@ -2339,7 +2366,7 @@
     <w:p>
       <w:pPr>
         <w:sectPr>
-          <w:footerReference w:type="default" r:id="rId45"/>
+          <w:footerReference w:type="default" r:id="rId46"/>
           <w:pgSz w:w="12240" w:h="15840"/>
           <w:pgMar w:top="1701" w:right="1701" w:bottom="1701" w:left="2268" w:header="720" w:footer="720" w:gutter="0"/>
           <w:cols w:space="720"/>
@@ -2666,7 +2693,7 @@
     <w:p>
       <w:pPr>
         <w:sectPr>
-          <w:footerReference w:type="default" r:id="rId46"/>
+          <w:footerReference w:type="default" r:id="rId47"/>
           <w:type w:val="continuous"/>
           <w:pgSz w:w="12240" w:h="15840"/>
           <w:pgMar w:top="1701" w:right="1701" w:bottom="1701" w:left="2268" w:header="720" w:footer="720" w:gutter="0"/>
@@ -2823,7 +2850,7 @@
     <w:p>
       <w:pPr>
         <w:sectPr>
-          <w:footerReference w:type="default" r:id="rId47"/>
+          <w:footerReference w:type="default" r:id="rId48"/>
           <w:pgSz w:w="12240" w:h="15840"/>
           <w:pgMar w:top="1701" w:right="1701" w:bottom="1701" w:left="2268" w:header="720" w:footer="720" w:gutter="0"/>
           <w:cols w:space="720"/>
@@ -2871,7 +2898,7 @@
     <w:p>
       <w:pPr>
         <w:sectPr>
-          <w:footerReference w:type="default" r:id="rId48"/>
+          <w:footerReference w:type="default" r:id="rId49"/>
           <w:type w:val="continuous"/>
           <w:pgSz w:w="12240" w:h="15840"/>
           <w:pgMar w:top="1701" w:right="1701" w:bottom="1701" w:left="2268" w:header="720" w:footer="720" w:gutter="0"/>
@@ -2900,8 +2927,8 @@
     <w:p>
       <w:pPr>
         <w:sectPr>
-          <w:footerReference w:type="default" r:id="rId49"/>
-          <w:footerReference w:type="first" r:id="rId50"/>
+          <w:footerReference w:type="default" r:id="rId50"/>
+          <w:footerReference w:type="first" r:id="rId51"/>
           <w:pgSz w:w="12240" w:h="15840"/>
           <w:pgMar w:top="1701" w:right="1701" w:bottom="1701" w:left="2268" w:header="720" w:footer="720" w:gutter="0"/>
           <w:cols w:space="720"/>
@@ -2974,8 +3001,8 @@
     <w:p>
       <w:pPr>
         <w:sectPr>
-          <w:footerReference w:type="default" r:id="rId51"/>
-          <w:footerReference w:type="first" r:id="rId52"/>
+          <w:footerReference w:type="default" r:id="rId52"/>
+          <w:footerReference w:type="first" r:id="rId53"/>
           <w:type w:val="continuous"/>
           <w:pgSz w:w="12240" w:h="15840"/>
           <w:pgMar w:top="1701" w:right="1701" w:bottom="1701" w:left="2268" w:header="720" w:footer="720" w:gutter="0"/>
@@ -3019,8 +3046,8 @@
     <w:p>
       <w:pPr>
         <w:sectPr>
-          <w:footerReference w:type="default" r:id="rId53"/>
-          <w:footerReference w:type="first" r:id="rId54"/>
+          <w:footerReference w:type="default" r:id="rId54"/>
+          <w:footerReference w:type="first" r:id="rId55"/>
           <w:pgSz w:w="12240" w:h="15840"/>
           <w:pgMar w:top="1701" w:right="1701" w:bottom="1701" w:left="2268" w:header="720" w:footer="720" w:gutter="0"/>
           <w:cols w:space="720"/>
@@ -3455,7 +3482,7 @@
         <w:drawing>
           <wp:inline xmlns:a="http://schemas.openxmlformats.org/drawingml/2006/main" xmlns:pic="http://schemas.openxmlformats.org/drawingml/2006/picture">
             <wp:extent cx="1512000" cy="1512000"/>
-            <wp:docPr id="3" name="Picture 3"/>
+            <wp:docPr id="4" name="Picture 4"/>
             <wp:cNvGraphicFramePr>
               <a:graphicFrameLocks noChangeAspect="1"/>
             </wp:cNvGraphicFramePr>
@@ -3467,7 +3494,7 @@
                     <pic:cNvPicPr/>
                   </pic:nvPicPr>
                   <pic:blipFill>
-                    <a:blip r:embed="rId11"/>
+                    <a:blip r:embed="rId12"/>
                     <a:stretch>
                       <a:fillRect/>
                     </a:stretch>
@@ -3571,7 +3598,7 @@
         <w:drawing>
           <wp:inline xmlns:a="http://schemas.openxmlformats.org/drawingml/2006/main" xmlns:pic="http://schemas.openxmlformats.org/drawingml/2006/picture">
             <wp:extent cx="1800000" cy="1125000"/>
-            <wp:docPr id="4" name="Picture 4"/>
+            <wp:docPr id="5" name="Picture 5"/>
             <wp:cNvGraphicFramePr>
               <a:graphicFrameLocks noChangeAspect="1"/>
             </wp:cNvGraphicFramePr>
@@ -3583,7 +3610,7 @@
                     <pic:cNvPicPr/>
                   </pic:nvPicPr>
                   <pic:blipFill>
-                    <a:blip r:embed="rId12"/>
+                    <a:blip r:embed="rId13"/>
                     <a:stretch>
                       <a:fillRect/>
                     </a:stretch>
@@ -3712,7 +3739,7 @@
         <w:drawing>
           <wp:inline xmlns:a="http://schemas.openxmlformats.org/drawingml/2006/main" xmlns:pic="http://schemas.openxmlformats.org/drawingml/2006/picture">
             <wp:extent cx="4320000" cy="1847904"/>
-            <wp:docPr id="5" name="Picture 5"/>
+            <wp:docPr id="6" name="Picture 6"/>
             <wp:cNvGraphicFramePr>
               <a:graphicFrameLocks noChangeAspect="1"/>
             </wp:cNvGraphicFramePr>
@@ -3724,7 +3751,7 @@
                     <pic:cNvPicPr/>
                   </pic:nvPicPr>
                   <pic:blipFill>
-                    <a:blip r:embed="rId13"/>
+                    <a:blip r:embed="rId14"/>
                     <a:stretch>
                       <a:fillRect/>
                     </a:stretch>
@@ -3776,7 +3803,7 @@
         <w:drawing>
           <wp:inline xmlns:a="http://schemas.openxmlformats.org/drawingml/2006/main" xmlns:pic="http://schemas.openxmlformats.org/drawingml/2006/picture">
             <wp:extent cx="4320000" cy="2680292"/>
-            <wp:docPr id="6" name="Picture 6"/>
+            <wp:docPr id="7" name="Picture 7"/>
             <wp:cNvGraphicFramePr>
               <a:graphicFrameLocks noChangeAspect="1"/>
             </wp:cNvGraphicFramePr>
@@ -3788,7 +3815,7 @@
                     <pic:cNvPicPr/>
                   </pic:nvPicPr>
                   <pic:blipFill>
-                    <a:blip r:embed="rId14"/>
+                    <a:blip r:embed="rId15"/>
                     <a:stretch>
                       <a:fillRect/>
                     </a:stretch>
@@ -3865,8 +3892,8 @@
     <w:p>
       <w:pPr>
         <w:sectPr>
-          <w:footerReference w:type="default" r:id="rId55"/>
-          <w:footerReference w:type="first" r:id="rId56"/>
+          <w:footerReference w:type="default" r:id="rId56"/>
+          <w:footerReference w:type="first" r:id="rId57"/>
           <w:type w:val="continuous"/>
           <w:pgSz w:w="12240" w:h="15840"/>
           <w:pgMar w:top="1701" w:right="1701" w:bottom="1701" w:left="2268" w:header="720" w:footer="720" w:gutter="0"/>
@@ -3910,8 +3937,8 @@
     <w:p>
       <w:pPr>
         <w:sectPr>
-          <w:footerReference w:type="default" r:id="rId57"/>
-          <w:footerReference w:type="first" r:id="rId58"/>
+          <w:footerReference w:type="default" r:id="rId58"/>
+          <w:footerReference w:type="first" r:id="rId59"/>
           <w:pgSz w:w="12240" w:h="15840"/>
           <w:pgMar w:top="1701" w:right="1701" w:bottom="1701" w:left="2268" w:header="720" w:footer="720" w:gutter="0"/>
           <w:cols w:space="720"/>
@@ -7585,8 +7612,8 @@
     <w:p>
       <w:pPr>
         <w:sectPr>
-          <w:footerReference w:type="default" r:id="rId59"/>
-          <w:footerReference w:type="first" r:id="rId60"/>
+          <w:footerReference w:type="default" r:id="rId60"/>
+          <w:footerReference w:type="first" r:id="rId61"/>
           <w:type w:val="continuous"/>
           <w:pgSz w:w="12240" w:h="15840"/>
           <w:pgMar w:top="1701" w:right="1701" w:bottom="1701" w:left="2268" w:header="720" w:footer="720" w:gutter="0"/>
@@ -7630,8 +7657,8 @@
     <w:p>
       <w:pPr>
         <w:sectPr>
-          <w:footerReference w:type="default" r:id="rId61"/>
-          <w:footerReference w:type="first" r:id="rId62"/>
+          <w:footerReference w:type="default" r:id="rId62"/>
+          <w:footerReference w:type="first" r:id="rId63"/>
           <w:pgSz w:w="12240" w:h="15840"/>
           <w:pgMar w:top="1701" w:right="1701" w:bottom="1701" w:left="2268" w:header="720" w:footer="720" w:gutter="0"/>
           <w:cols w:space="720"/>
@@ -8092,8 +8119,8 @@
     <w:p>
       <w:pPr>
         <w:sectPr>
-          <w:footerReference w:type="default" r:id="rId63"/>
-          <w:footerReference w:type="first" r:id="rId64"/>
+          <w:footerReference w:type="default" r:id="rId64"/>
+          <w:footerReference w:type="first" r:id="rId65"/>
           <w:type w:val="continuous"/>
           <w:pgSz w:w="12240" w:h="15840"/>
           <w:pgMar w:top="1701" w:right="1701" w:bottom="1701" w:left="2268" w:header="720" w:footer="720" w:gutter="0"/>
@@ -8137,8 +8164,8 @@
     <w:p>
       <w:pPr>
         <w:sectPr>
-          <w:footerReference w:type="default" r:id="rId65"/>
-          <w:footerReference w:type="first" r:id="rId66"/>
+          <w:footerReference w:type="default" r:id="rId66"/>
+          <w:footerReference w:type="first" r:id="rId67"/>
           <w:pgSz w:w="12240" w:h="15840"/>
           <w:pgMar w:top="1701" w:right="1701" w:bottom="1701" w:left="2268" w:header="720" w:footer="720" w:gutter="0"/>
           <w:cols w:space="720"/>
@@ -8902,8 +8929,8 @@
     <w:p>
       <w:pPr>
         <w:sectPr>
-          <w:footerReference w:type="default" r:id="rId67"/>
-          <w:footerReference w:type="first" r:id="rId68"/>
+          <w:footerReference w:type="default" r:id="rId68"/>
+          <w:footerReference w:type="first" r:id="rId69"/>
           <w:type w:val="continuous"/>
           <w:pgSz w:w="12240" w:h="15840"/>
           <w:pgMar w:top="1701" w:right="1701" w:bottom="1701" w:left="2268" w:header="720" w:footer="720" w:gutter="0"/>
@@ -8947,8 +8974,8 @@
     <w:p>
       <w:pPr>
         <w:sectPr>
-          <w:footerReference w:type="default" r:id="rId69"/>
-          <w:footerReference w:type="first" r:id="rId70"/>
+          <w:footerReference w:type="default" r:id="rId70"/>
+          <w:footerReference w:type="first" r:id="rId71"/>
           <w:pgSz w:w="12240" w:h="15840"/>
           <w:pgMar w:top="1701" w:right="1701" w:bottom="1701" w:left="2268" w:header="720" w:footer="720" w:gutter="0"/>
           <w:cols w:space="720"/>
@@ -9140,8 +9167,8 @@
     <w:p>
       <w:pPr>
         <w:sectPr>
-          <w:footerReference w:type="default" r:id="rId71"/>
-          <w:footerReference w:type="first" r:id="rId72"/>
+          <w:footerReference w:type="default" r:id="rId72"/>
+          <w:footerReference w:type="first" r:id="rId73"/>
           <w:type w:val="continuous"/>
           <w:pgSz w:w="12240" w:h="15840"/>
           <w:pgMar w:top="1701" w:right="1701" w:bottom="1701" w:left="2268" w:header="720" w:footer="720" w:gutter="0"/>
@@ -9171,8 +9198,8 @@
     <w:p>
       <w:pPr>
         <w:sectPr>
-          <w:footerReference w:type="default" r:id="rId73"/>
-          <w:footerReference w:type="first" r:id="rId74"/>
+          <w:footerReference w:type="default" r:id="rId74"/>
+          <w:footerReference w:type="first" r:id="rId75"/>
           <w:pgSz w:w="12240" w:h="15840"/>
           <w:pgMar w:top="1701" w:right="1701" w:bottom="1701" w:left="2268" w:header="720" w:footer="720" w:gutter="0"/>
           <w:cols w:space="720"/>
@@ -9302,8 +9329,8 @@
     <w:p>
       <w:pPr>
         <w:sectPr>
-          <w:footerReference w:type="default" r:id="rId75"/>
-          <w:footerReference w:type="first" r:id="rId76"/>
+          <w:footerReference w:type="default" r:id="rId76"/>
+          <w:footerReference w:type="first" r:id="rId77"/>
           <w:type w:val="continuous"/>
           <w:pgSz w:w="12240" w:h="15840"/>
           <w:pgMar w:top="1701" w:right="1701" w:bottom="1701" w:left="2268" w:header="720" w:footer="720" w:gutter="0"/>
@@ -9333,7 +9360,7 @@
     <w:p>
       <w:pPr>
         <w:sectPr>
-          <w:footerReference w:type="default" r:id="rId77"/>
+          <w:footerReference w:type="default" r:id="rId78"/>
           <w:pgSz w:w="12240" w:h="15840"/>
           <w:pgMar w:top="1701" w:right="1701" w:bottom="1701" w:left="2268" w:header="720" w:footer="720" w:gutter="0"/>
           <w:cols w:space="720"/>
@@ -9380,7 +9407,7 @@
         <w:drawing>
           <wp:inline xmlns:a="http://schemas.openxmlformats.org/drawingml/2006/main" xmlns:pic="http://schemas.openxmlformats.org/drawingml/2006/picture">
             <wp:extent cx="1065395" cy="4860000"/>
-            <wp:docPr id="7" name="Picture 7"/>
+            <wp:docPr id="8" name="Picture 8"/>
             <wp:cNvGraphicFramePr>
               <a:graphicFrameLocks noChangeAspect="1"/>
             </wp:cNvGraphicFramePr>
@@ -9392,7 +9419,7 @@
                     <pic:cNvPicPr/>
                   </pic:nvPicPr>
                   <pic:blipFill>
-                    <a:blip r:embed="rId15"/>
+                    <a:blip r:embed="rId16"/>
                     <a:stretch>
                       <a:fillRect/>
                     </a:stretch>
@@ -9414,7 +9441,7 @@
     <w:p>
       <w:pPr>
         <w:sectPr>
-          <w:footerReference w:type="default" r:id="rId78"/>
+          <w:footerReference w:type="default" r:id="rId79"/>
           <w:pgSz w:w="12240" w:h="15840"/>
           <w:pgMar w:top="1701" w:right="1701" w:bottom="1701" w:left="2268" w:header="720" w:footer="720" w:gutter="0"/>
           <w:cols w:space="720"/>
@@ -9461,7 +9488,7 @@
         <w:drawing>
           <wp:inline xmlns:a="http://schemas.openxmlformats.org/drawingml/2006/main" xmlns:pic="http://schemas.openxmlformats.org/drawingml/2006/picture">
             <wp:extent cx="4679999" cy="1208317"/>
-            <wp:docPr id="8" name="Picture 8"/>
+            <wp:docPr id="9" name="Picture 9"/>
             <wp:cNvGraphicFramePr>
               <a:graphicFrameLocks noChangeAspect="1"/>
             </wp:cNvGraphicFramePr>
@@ -9473,7 +9500,7 @@
                     <pic:cNvPicPr/>
                   </pic:nvPicPr>
                   <pic:blipFill>
-                    <a:blip r:embed="rId16"/>
+                    <a:blip r:embed="rId17"/>
                     <a:stretch>
                       <a:fillRect/>
                     </a:stretch>
@@ -9510,7 +9537,7 @@
     <w:p>
       <w:pPr>
         <w:sectPr>
-          <w:footerReference w:type="default" r:id="rId79"/>
+          <w:footerReference w:type="default" r:id="rId80"/>
           <w:pgSz w:w="12240" w:h="15840"/>
           <w:pgMar w:top="1701" w:right="1701" w:bottom="1701" w:left="2268" w:header="720" w:footer="720" w:gutter="0"/>
           <w:cols w:space="720"/>
@@ -9557,7 +9584,7 @@
         <w:drawing>
           <wp:inline xmlns:a="http://schemas.openxmlformats.org/drawingml/2006/main" xmlns:pic="http://schemas.openxmlformats.org/drawingml/2006/picture">
             <wp:extent cx="2550866" cy="5400000"/>
-            <wp:docPr id="9" name="Picture 9"/>
+            <wp:docPr id="10" name="Picture 10"/>
             <wp:cNvGraphicFramePr>
               <a:graphicFrameLocks noChangeAspect="1"/>
             </wp:cNvGraphicFramePr>
@@ -9569,7 +9596,7 @@
                     <pic:cNvPicPr/>
                   </pic:nvPicPr>
                   <pic:blipFill>
-                    <a:blip r:embed="rId17"/>
+                    <a:blip r:embed="rId18"/>
                     <a:stretch>
                       <a:fillRect/>
                     </a:stretch>
@@ -9606,7 +9633,7 @@
     <w:p>
       <w:pPr>
         <w:sectPr>
-          <w:footerReference w:type="default" r:id="rId80"/>
+          <w:footerReference w:type="default" r:id="rId81"/>
           <w:pgSz w:w="12240" w:h="15840"/>
           <w:pgMar w:top="1701" w:right="1701" w:bottom="1701" w:left="2268" w:header="720" w:footer="720" w:gutter="0"/>
           <w:cols w:space="720"/>
@@ -9653,7 +9680,7 @@
         <w:drawing>
           <wp:inline xmlns:a="http://schemas.openxmlformats.org/drawingml/2006/main" xmlns:pic="http://schemas.openxmlformats.org/drawingml/2006/picture">
             <wp:extent cx="5040000" cy="2942538"/>
-            <wp:docPr id="10" name="Picture 10"/>
+            <wp:docPr id="11" name="Picture 11"/>
             <wp:cNvGraphicFramePr>
               <a:graphicFrameLocks noChangeAspect="1"/>
             </wp:cNvGraphicFramePr>
@@ -9665,7 +9692,7 @@
                     <pic:cNvPicPr/>
                   </pic:nvPicPr>
                   <pic:blipFill>
-                    <a:blip r:embed="rId18"/>
+                    <a:blip r:embed="rId19"/>
                     <a:stretch>
                       <a:fillRect/>
                     </a:stretch>
@@ -9702,7 +9729,7 @@
     <w:p>
       <w:pPr>
         <w:sectPr>
-          <w:footerReference w:type="default" r:id="rId81"/>
+          <w:footerReference w:type="default" r:id="rId82"/>
           <w:pgSz w:w="12240" w:h="15840"/>
           <w:pgMar w:top="1701" w:right="1701" w:bottom="1701" w:left="2268" w:header="720" w:footer="720" w:gutter="0"/>
           <w:cols w:space="720"/>
@@ -9749,7 +9776,7 @@
         <w:drawing>
           <wp:inline xmlns:a="http://schemas.openxmlformats.org/drawingml/2006/main" xmlns:pic="http://schemas.openxmlformats.org/drawingml/2006/picture">
             <wp:extent cx="4680000" cy="2220000"/>
-            <wp:docPr id="11" name="Picture 11"/>
+            <wp:docPr id="12" name="Picture 12"/>
             <wp:cNvGraphicFramePr>
               <a:graphicFrameLocks noChangeAspect="1"/>
             </wp:cNvGraphicFramePr>
@@ -9761,7 +9788,7 @@
                     <pic:cNvPicPr/>
                   </pic:nvPicPr>
                   <pic:blipFill>
-                    <a:blip r:embed="rId19"/>
+                    <a:blip r:embed="rId20"/>
                     <a:stretch>
                       <a:fillRect/>
                     </a:stretch>
@@ -9798,7 +9825,7 @@
     <w:p>
       <w:pPr>
         <w:sectPr>
-          <w:footerReference w:type="default" r:id="rId82"/>
+          <w:footerReference w:type="default" r:id="rId83"/>
           <w:pgSz w:w="12240" w:h="15840"/>
           <w:pgMar w:top="1701" w:right="1701" w:bottom="1701" w:left="2268" w:header="720" w:footer="720" w:gutter="0"/>
           <w:cols w:space="720"/>
@@ -9845,7 +9872,7 @@
         <w:drawing>
           <wp:inline xmlns:a="http://schemas.openxmlformats.org/drawingml/2006/main" xmlns:pic="http://schemas.openxmlformats.org/drawingml/2006/picture">
             <wp:extent cx="3652060" cy="4680000"/>
-            <wp:docPr id="12" name="Picture 12"/>
+            <wp:docPr id="13" name="Picture 13"/>
             <wp:cNvGraphicFramePr>
               <a:graphicFrameLocks noChangeAspect="1"/>
             </wp:cNvGraphicFramePr>
@@ -9857,7 +9884,7 @@
                     <pic:cNvPicPr/>
                   </pic:nvPicPr>
                   <pic:blipFill>
-                    <a:blip r:embed="rId20"/>
+                    <a:blip r:embed="rId21"/>
                     <a:stretch>
                       <a:fillRect/>
                     </a:stretch>
@@ -9894,7 +9921,7 @@
     <w:p>
       <w:pPr>
         <w:sectPr>
-          <w:footerReference w:type="default" r:id="rId83"/>
+          <w:footerReference w:type="default" r:id="rId84"/>
           <w:pgSz w:w="12240" w:h="15840"/>
           <w:pgMar w:top="1701" w:right="1701" w:bottom="1701" w:left="2268" w:header="720" w:footer="720" w:gutter="0"/>
           <w:cols w:space="720"/>
@@ -9941,7 +9968,7 @@
         <w:drawing>
           <wp:inline xmlns:a="http://schemas.openxmlformats.org/drawingml/2006/main" xmlns:pic="http://schemas.openxmlformats.org/drawingml/2006/picture">
             <wp:extent cx="4680000" cy="4680000"/>
-            <wp:docPr id="13" name="Picture 13"/>
+            <wp:docPr id="14" name="Picture 14"/>
             <wp:cNvGraphicFramePr>
               <a:graphicFrameLocks noChangeAspect="1"/>
             </wp:cNvGraphicFramePr>
@@ -9953,7 +9980,7 @@
                     <pic:cNvPicPr/>
                   </pic:nvPicPr>
                   <pic:blipFill>
-                    <a:blip r:embed="rId21"/>
+                    <a:blip r:embed="rId22"/>
                     <a:stretch>
                       <a:fillRect/>
                     </a:stretch>
@@ -9990,7 +10017,7 @@
     <w:p>
       <w:pPr>
         <w:sectPr>
-          <w:footerReference w:type="default" r:id="rId84"/>
+          <w:footerReference w:type="default" r:id="rId85"/>
           <w:pgSz w:w="12240" w:h="15840"/>
           <w:pgMar w:top="1701" w:right="1701" w:bottom="1701" w:left="2268" w:header="720" w:footer="720" w:gutter="0"/>
           <w:cols w:space="720"/>
@@ -10037,7 +10064,7 @@
         <w:drawing>
           <wp:inline xmlns:a="http://schemas.openxmlformats.org/drawingml/2006/main" xmlns:pic="http://schemas.openxmlformats.org/drawingml/2006/picture">
             <wp:extent cx="4680000" cy="4264486"/>
-            <wp:docPr id="14" name="Picture 14"/>
+            <wp:docPr id="15" name="Picture 15"/>
             <wp:cNvGraphicFramePr>
               <a:graphicFrameLocks noChangeAspect="1"/>
             </wp:cNvGraphicFramePr>
@@ -10049,7 +10076,7 @@
                     <pic:cNvPicPr/>
                   </pic:nvPicPr>
                   <pic:blipFill>
-                    <a:blip r:embed="rId22"/>
+                    <a:blip r:embed="rId23"/>
                     <a:stretch>
                       <a:fillRect/>
                     </a:stretch>
@@ -10086,7 +10113,7 @@
     <w:p>
       <w:pPr>
         <w:sectPr>
-          <w:footerReference w:type="default" r:id="rId85"/>
+          <w:footerReference w:type="default" r:id="rId86"/>
           <w:pgSz w:w="12240" w:h="15840"/>
           <w:pgMar w:top="1701" w:right="1701" w:bottom="1701" w:left="2268" w:header="720" w:footer="720" w:gutter="0"/>
           <w:cols w:space="720"/>
@@ -10123,78 +10150,6 @@
           <w:sz w:val="24"/>
         </w:rPr>
         <w:t>[Memoria fotográfica de las actividades realizadas]</w:t>
-      </w:r>
-    </w:p>
-    <w:p>
-      <w:pPr>
-        <w:jc w:val="center"/>
-      </w:pPr>
-      <w:r>
-        <w:drawing>
-          <wp:inline xmlns:a="http://schemas.openxmlformats.org/drawingml/2006/main" xmlns:pic="http://schemas.openxmlformats.org/drawingml/2006/picture">
-            <wp:extent cx="4860000" cy="3645000"/>
-            <wp:docPr id="15" name="Picture 15"/>
-            <wp:cNvGraphicFramePr>
-              <a:graphicFrameLocks noChangeAspect="1"/>
-            </wp:cNvGraphicFramePr>
-            <a:graphic>
-              <a:graphicData uri="http://schemas.openxmlformats.org/drawingml/2006/picture">
-                <pic:pic>
-                  <pic:nvPicPr>
-                    <pic:cNvPr id="0" name="IMG-20260818-WA0007.jpg"/>
-                    <pic:cNvPicPr/>
-                  </pic:nvPicPr>
-                  <pic:blipFill>
-                    <a:blip r:embed="rId23"/>
-                    <a:stretch>
-                      <a:fillRect/>
-                    </a:stretch>
-                  </pic:blipFill>
-                  <pic:spPr>
-                    <a:xfrm>
-                      <a:off x="0" y="0"/>
-                      <a:ext cx="4860000" cy="3645000"/>
-                    </a:xfrm>
-                    <a:prstGeom prst="rect"/>
-                  </pic:spPr>
-                </pic:pic>
-              </a:graphicData>
-            </a:graphic>
-          </wp:inline>
-        </w:drawing>
-      </w:r>
-    </w:p>
-    <w:p>
-      <w:pPr>
-        <w:spacing w:before="120" w:after="240"/>
-        <w:jc w:val="center"/>
-      </w:pPr>
-      <w:r>
-        <w:rPr>
-          <w:rFonts w:ascii="Times New Roman" w:hAnsi="Times New Roman"/>
-          <w:b/>
-          <w:sz w:val="20"/>
-        </w:rPr>
-        <w:t>Fotografía 1. Registro de actividades administrativas frente al equipo de trabajo.</w:t>
-      </w:r>
-    </w:p>
-    <w:p>
-      <w:r>
-        <w:br w:type="page"/>
-      </w:r>
-    </w:p>
-    <w:p>
-      <w:pPr>
-        <w:spacing w:after="480"/>
-        <w:jc w:val="center"/>
-      </w:pPr>
-      <w:r>
-        <w:rPr>
-          <w:rFonts w:ascii="Times New Roman" w:hAnsi="Times New Roman"/>
-          <w:b/>
-          <w:sz w:val="24"/>
-        </w:rPr>
-        <w:t>ANEXO I (CONT.)</w:t>
       </w:r>
     </w:p>
     <w:p>
@@ -10213,7 +10168,7 @@
               <a:graphicData uri="http://schemas.openxmlformats.org/drawingml/2006/picture">
                 <pic:pic>
                   <pic:nvPicPr>
-                    <pic:cNvPr id="0" name="IMG-20260818-WA0008.jpg"/>
+                    <pic:cNvPr id="0" name="IMG-20260818-WA0007.jpg"/>
                     <pic:cNvPicPr/>
                   </pic:nvPicPr>
                   <pic:blipFill>
@@ -10247,6 +10202,78 @@
           <w:b/>
           <w:sz w:val="20"/>
         </w:rPr>
+        <w:t>Fotografía 1. Registro de actividades administrativas frente al equipo de trabajo.</w:t>
+      </w:r>
+    </w:p>
+    <w:p>
+      <w:r>
+        <w:br w:type="page"/>
+      </w:r>
+    </w:p>
+    <w:p>
+      <w:pPr>
+        <w:spacing w:after="480"/>
+        <w:jc w:val="center"/>
+      </w:pPr>
+      <w:r>
+        <w:rPr>
+          <w:rFonts w:ascii="Times New Roman" w:hAnsi="Times New Roman"/>
+          <w:b/>
+          <w:sz w:val="24"/>
+        </w:rPr>
+        <w:t>ANEXO I (CONT.)</w:t>
+      </w:r>
+    </w:p>
+    <w:p>
+      <w:pPr>
+        <w:jc w:val="center"/>
+      </w:pPr>
+      <w:r>
+        <w:drawing>
+          <wp:inline xmlns:a="http://schemas.openxmlformats.org/drawingml/2006/main" xmlns:pic="http://schemas.openxmlformats.org/drawingml/2006/picture">
+            <wp:extent cx="4860000" cy="3645000"/>
+            <wp:docPr id="17" name="Picture 17"/>
+            <wp:cNvGraphicFramePr>
+              <a:graphicFrameLocks noChangeAspect="1"/>
+            </wp:cNvGraphicFramePr>
+            <a:graphic>
+              <a:graphicData uri="http://schemas.openxmlformats.org/drawingml/2006/picture">
+                <pic:pic>
+                  <pic:nvPicPr>
+                    <pic:cNvPr id="0" name="IMG-20260818-WA0008.jpg"/>
+                    <pic:cNvPicPr/>
+                  </pic:nvPicPr>
+                  <pic:blipFill>
+                    <a:blip r:embed="rId25"/>
+                    <a:stretch>
+                      <a:fillRect/>
+                    </a:stretch>
+                  </pic:blipFill>
+                  <pic:spPr>
+                    <a:xfrm>
+                      <a:off x="0" y="0"/>
+                      <a:ext cx="4860000" cy="3645000"/>
+                    </a:xfrm>
+                    <a:prstGeom prst="rect"/>
+                  </pic:spPr>
+                </pic:pic>
+              </a:graphicData>
+            </a:graphic>
+          </wp:inline>
+        </w:drawing>
+      </w:r>
+    </w:p>
+    <w:p>
+      <w:pPr>
+        <w:spacing w:before="120" w:after="240"/>
+        <w:jc w:val="center"/>
+      </w:pPr>
+      <w:r>
+        <w:rPr>
+          <w:rFonts w:ascii="Times New Roman" w:hAnsi="Times New Roman"/>
+          <w:b/>
+          <w:sz w:val="20"/>
+        </w:rPr>
         <w:t>Fotografía 2. Vista general del espacio de trabajo del área administrativa.</w:t>
       </w:r>
     </w:p>
@@ -10277,7 +10304,7 @@
         <w:drawing>
           <wp:inline xmlns:a="http://schemas.openxmlformats.org/drawingml/2006/main" xmlns:pic="http://schemas.openxmlformats.org/drawingml/2006/picture">
             <wp:extent cx="3780000" cy="5040000"/>
-            <wp:docPr id="17" name="Picture 17"/>
+            <wp:docPr id="18" name="Picture 18"/>
             <wp:cNvGraphicFramePr>
               <a:graphicFrameLocks noChangeAspect="1"/>
             </wp:cNvGraphicFramePr>
@@ -10289,7 +10316,7 @@
                     <pic:cNvPicPr/>
                   </pic:nvPicPr>
                   <pic:blipFill>
-                    <a:blip r:embed="rId25"/>
+                    <a:blip r:embed="rId26"/>
                     <a:stretch>
                       <a:fillRect/>
                     </a:stretch>
@@ -10349,7 +10376,7 @@
         <w:drawing>
           <wp:inline xmlns:a="http://schemas.openxmlformats.org/drawingml/2006/main" xmlns:pic="http://schemas.openxmlformats.org/drawingml/2006/picture">
             <wp:extent cx="4860000" cy="3645000"/>
-            <wp:docPr id="18" name="Picture 18"/>
+            <wp:docPr id="19" name="Picture 19"/>
             <wp:cNvGraphicFramePr>
               <a:graphicFrameLocks noChangeAspect="1"/>
             </wp:cNvGraphicFramePr>
@@ -10361,7 +10388,7 @@
                     <pic:cNvPicPr/>
                   </pic:nvPicPr>
                   <pic:blipFill>
-                    <a:blip r:embed="rId26"/>
+                    <a:blip r:embed="rId27"/>
                     <a:stretch>
                       <a:fillRect/>
                     </a:stretch>
@@ -10421,7 +10448,7 @@
         <w:drawing>
           <wp:inline xmlns:a="http://schemas.openxmlformats.org/drawingml/2006/main" xmlns:pic="http://schemas.openxmlformats.org/drawingml/2006/picture">
             <wp:extent cx="3780000" cy="5040000"/>
-            <wp:docPr id="19" name="Picture 19"/>
+            <wp:docPr id="20" name="Picture 20"/>
             <wp:cNvGraphicFramePr>
               <a:graphicFrameLocks noChangeAspect="1"/>
             </wp:cNvGraphicFramePr>
@@ -10430,78 +10457,6 @@
                 <pic:pic>
                   <pic:nvPicPr>
                     <pic:cNvPr id="0" name="IMG-20260818-WA0011.jpg"/>
-                    <pic:cNvPicPr/>
-                  </pic:nvPicPr>
-                  <pic:blipFill>
-                    <a:blip r:embed="rId27"/>
-                    <a:stretch>
-                      <a:fillRect/>
-                    </a:stretch>
-                  </pic:blipFill>
-                  <pic:spPr>
-                    <a:xfrm>
-                      <a:off x="0" y="0"/>
-                      <a:ext cx="3780000" cy="5040000"/>
-                    </a:xfrm>
-                    <a:prstGeom prst="rect"/>
-                  </pic:spPr>
-                </pic:pic>
-              </a:graphicData>
-            </a:graphic>
-          </wp:inline>
-        </w:drawing>
-      </w:r>
-    </w:p>
-    <w:p>
-      <w:pPr>
-        <w:spacing w:before="120" w:after="240"/>
-        <w:jc w:val="center"/>
-      </w:pPr>
-      <w:r>
-        <w:rPr>
-          <w:rFonts w:ascii="Times New Roman" w:hAnsi="Times New Roman"/>
-          <w:b/>
-          <w:sz w:val="20"/>
-        </w:rPr>
-        <w:t>Fotografía 5. Revisión de registros y documentos desde el puesto de trabajo.</w:t>
-      </w:r>
-    </w:p>
-    <w:p>
-      <w:r>
-        <w:br w:type="page"/>
-      </w:r>
-    </w:p>
-    <w:p>
-      <w:pPr>
-        <w:spacing w:after="480"/>
-        <w:jc w:val="center"/>
-      </w:pPr>
-      <w:r>
-        <w:rPr>
-          <w:rFonts w:ascii="Times New Roman" w:hAnsi="Times New Roman"/>
-          <w:b/>
-          <w:sz w:val="24"/>
-        </w:rPr>
-        <w:t>ANEXO I (CONT.)</w:t>
-      </w:r>
-    </w:p>
-    <w:p>
-      <w:pPr>
-        <w:jc w:val="center"/>
-      </w:pPr>
-      <w:r>
-        <w:drawing>
-          <wp:inline xmlns:a="http://schemas.openxmlformats.org/drawingml/2006/main" xmlns:pic="http://schemas.openxmlformats.org/drawingml/2006/picture">
-            <wp:extent cx="3780000" cy="5040000"/>
-            <wp:docPr id="20" name="Picture 20"/>
-            <wp:cNvGraphicFramePr>
-              <a:graphicFrameLocks noChangeAspect="1"/>
-            </wp:cNvGraphicFramePr>
-            <a:graphic>
-              <a:graphicData uri="http://schemas.openxmlformats.org/drawingml/2006/picture">
-                <pic:pic>
-                  <pic:nvPicPr>
-                    <pic:cNvPr id="0" name="IMG-20260818-WA0012.jpg"/>
                     <pic:cNvPicPr/>
                   </pic:nvPicPr>
                   <pic:blipFill>
@@ -10535,7 +10490,7 @@
           <w:b/>
           <w:sz w:val="20"/>
         </w:rPr>
-        <w:t>Fotografía 6. Revisión de información de pagos y soportes documentales.</w:t>
+        <w:t>Fotografía 5. Revisión de registros y documentos desde el puesto de trabajo.</w:t>
       </w:r>
     </w:p>
     <w:p>
@@ -10573,7 +10528,7 @@
               <a:graphicData uri="http://schemas.openxmlformats.org/drawingml/2006/picture">
                 <pic:pic>
                   <pic:nvPicPr>
-                    <pic:cNvPr id="0" name="IMG-20260818-WA0015.jpg"/>
+                    <pic:cNvPr id="0" name="IMG-20260818-WA0012.jpg"/>
                     <pic:cNvPicPr/>
                   </pic:nvPicPr>
                   <pic:blipFill>
@@ -10607,7 +10562,7 @@
           <w:b/>
           <w:sz w:val="20"/>
         </w:rPr>
-        <w:t>Fotografía 7. Puesto de trabajo del área administrativa.</w:t>
+        <w:t>Fotografía 6. Revisión de información de pagos y soportes documentales.</w:t>
       </w:r>
     </w:p>
     <w:p>
@@ -10645,7 +10600,7 @@
               <a:graphicData uri="http://schemas.openxmlformats.org/drawingml/2006/picture">
                 <pic:pic>
                   <pic:nvPicPr>
-                    <pic:cNvPr id="0" name="IMG-20260818-WA0016.jpg"/>
+                    <pic:cNvPr id="0" name="IMG-20260818-WA0015.jpg"/>
                     <pic:cNvPicPr/>
                   </pic:nvPicPr>
                   <pic:blipFill>
@@ -10679,6 +10634,78 @@
           <w:b/>
           <w:sz w:val="20"/>
         </w:rPr>
+        <w:t>Fotografía 7. Puesto de trabajo del área administrativa.</w:t>
+      </w:r>
+    </w:p>
+    <w:p>
+      <w:r>
+        <w:br w:type="page"/>
+      </w:r>
+    </w:p>
+    <w:p>
+      <w:pPr>
+        <w:spacing w:after="480"/>
+        <w:jc w:val="center"/>
+      </w:pPr>
+      <w:r>
+        <w:rPr>
+          <w:rFonts w:ascii="Times New Roman" w:hAnsi="Times New Roman"/>
+          <w:b/>
+          <w:sz w:val="24"/>
+        </w:rPr>
+        <w:t>ANEXO I (CONT.)</w:t>
+      </w:r>
+    </w:p>
+    <w:p>
+      <w:pPr>
+        <w:jc w:val="center"/>
+      </w:pPr>
+      <w:r>
+        <w:drawing>
+          <wp:inline xmlns:a="http://schemas.openxmlformats.org/drawingml/2006/main" xmlns:pic="http://schemas.openxmlformats.org/drawingml/2006/picture">
+            <wp:extent cx="3780000" cy="5040000"/>
+            <wp:docPr id="23" name="Picture 23"/>
+            <wp:cNvGraphicFramePr>
+              <a:graphicFrameLocks noChangeAspect="1"/>
+            </wp:cNvGraphicFramePr>
+            <a:graphic>
+              <a:graphicData uri="http://schemas.openxmlformats.org/drawingml/2006/picture">
+                <pic:pic>
+                  <pic:nvPicPr>
+                    <pic:cNvPr id="0" name="IMG-20260818-WA0016.jpg"/>
+                    <pic:cNvPicPr/>
+                  </pic:nvPicPr>
+                  <pic:blipFill>
+                    <a:blip r:embed="rId31"/>
+                    <a:stretch>
+                      <a:fillRect/>
+                    </a:stretch>
+                  </pic:blipFill>
+                  <pic:spPr>
+                    <a:xfrm>
+                      <a:off x="0" y="0"/>
+                      <a:ext cx="3780000" cy="5040000"/>
+                    </a:xfrm>
+                    <a:prstGeom prst="rect"/>
+                  </pic:spPr>
+                </pic:pic>
+              </a:graphicData>
+            </a:graphic>
+          </wp:inline>
+        </w:drawing>
+      </w:r>
+    </w:p>
+    <w:p>
+      <w:pPr>
+        <w:spacing w:before="120" w:after="240"/>
+        <w:jc w:val="center"/>
+      </w:pPr>
+      <w:r>
+        <w:rPr>
+          <w:rFonts w:ascii="Times New Roman" w:hAnsi="Times New Roman"/>
+          <w:b/>
+          <w:sz w:val="20"/>
+        </w:rPr>
         <w:t>Fotografía 8. Puesto de trabajo y equipo utilizado durante la pasantía.</w:t>
       </w:r>
     </w:p>
@@ -10698,7 +10725,7 @@
       </w:r>
     </w:p>
     <w:sectPr>
-      <w:footerReference w:type="default" r:id="rId86"/>
+      <w:footerReference w:type="default" r:id="rId87"/>
       <w:pgSz w:w="12240" w:h="15840"/>
       <w:pgMar w:top="1701" w:right="1701" w:bottom="1701" w:left="2268" w:header="720" w:footer="720" w:gutter="0"/>
       <w:cols w:space="720"/>

</xml_diff>

<commit_message>
Habilitar informe combinado de Juliano
</commit_message>
<xml_diff>
--- a/amaal/reportes/Informe_Pasantia_IUTECP.docx
+++ b/amaal/reportes/Informe_Pasantia_IUTECP.docx
@@ -154,7 +154,7 @@
     <w:p>
       <w:pPr>
         <w:sectPr>
-          <w:footerReference w:type="default" r:id="rId32"/>
+          <w:footerReference w:type="default" r:id="rId31"/>
           <w:pgSz w:w="12240" w:h="15840"/>
           <w:pgMar w:top="1701" w:right="1701" w:bottom="1701" w:left="2268" w:header="720" w:footer="720" w:gutter="0"/>
           <w:cols w:space="720"/>
@@ -327,7 +327,7 @@
                 <w:b/>
                 <w:sz w:val="24"/>
               </w:rPr>
-              <w:t>Dra. Álvarez, Carmen</w:t>
+              <w:t>Dra. Carmen J. Álvarez</w:t>
               <w:br/>
             </w:r>
             <w:r>
@@ -396,7 +396,7 @@
     <w:p>
       <w:pPr>
         <w:sectPr>
-          <w:footerReference w:type="default" r:id="rId33"/>
+          <w:footerReference w:type="default" r:id="rId32"/>
           <w:pgSz w:w="12240" w:h="15840"/>
           <w:pgMar w:top="1701" w:right="1701" w:bottom="1701" w:left="2268" w:header="720" w:footer="720" w:gutter="0"/>
           <w:cols w:space="720"/>
@@ -641,7 +641,7 @@
     <w:p>
       <w:pPr>
         <w:sectPr>
-          <w:footerReference w:type="default" r:id="rId34"/>
+          <w:footerReference w:type="default" r:id="rId33"/>
           <w:pgSz w:w="12240" w:h="15840"/>
           <w:pgMar w:top="1701" w:right="1701" w:bottom="1701" w:left="2268" w:header="720" w:footer="720" w:gutter="0"/>
           <w:cols w:space="720"/>
@@ -867,7 +867,7 @@
           <w:b/>
           <w:sz w:val="24"/>
         </w:rPr>
-        <w:t>Dra. Álvarez, Carmen</w:t>
+        <w:t>Dra. Carmen J. Álvarez</w:t>
       </w:r>
     </w:p>
     <w:p>
@@ -881,6 +881,52 @@
           <w:sz w:val="24"/>
         </w:rPr>
         <w:t>C.I.: 14.452.956</w:t>
+      </w:r>
+    </w:p>
+    <w:p>
+      <w:pPr>
+        <w:sectPr>
+          <w:footerReference w:type="default" r:id="rId34"/>
+          <w:pgSz w:w="12240" w:h="15840"/>
+          <w:pgMar w:top="1701" w:right="1701" w:bottom="1701" w:left="2268" w:header="720" w:footer="720" w:gutter="0"/>
+          <w:cols w:space="720"/>
+          <w:docGrid w:linePitch="360"/>
+          <w:pgNumType w:fmt="lowerRoman"/>
+        </w:sectPr>
+      </w:pPr>
+    </w:p>
+    <w:p>
+      <w:bookmarkStart w:id="3" w:name="bm_agradecimientos"/>
+      <w:pPr>
+        <w:pStyle w:val="IUTECPPreliminar"/>
+        <w:keepNext/>
+        <w:keepLines/>
+        <w:spacing w:before="1140" w:after="480"/>
+        <w:jc w:val="center"/>
+      </w:pPr>
+      <w:r>
+        <w:rPr>
+          <w:rFonts w:ascii="Times New Roman" w:hAnsi="Times New Roman"/>
+          <w:b/>
+          <w:sz w:val="24"/>
+        </w:rPr>
+        <w:t>AGRADECIMIENTOS</w:t>
+      </w:r>
+      <w:bookmarkEnd w:id="3"/>
+    </w:p>
+    <w:p>
+      <w:pPr>
+        <w:spacing w:line="360" w:lineRule="auto" w:after="0" w:before="0"/>
+        <w:ind w:firstLine="709"/>
+        <w:jc w:val="both"/>
+      </w:pPr>
+      <w:r>
+        <w:rPr>
+          <w:rFonts w:ascii="Times New Roman" w:hAnsi="Times New Roman"/>
+          <w:i w:val="0"/>
+          <w:sz w:val="24"/>
+        </w:rPr>
+        <w:t>Al Instituto Universitario de Tecnología “Elías Calixto Pompa” (IUTECP), por la formación recibida; a Ingeniería de Telecomunicaciones, C.A. (IDETEL), por permitirme desarrollar las pasantías y conocer de manera directa sus procesos de atención y administración; a mis tutores, por sus orientaciones y observaciones durante la elaboración del informe; y al personal de la empresa, por su disposición, acompañamiento y colaboración durante las actividades realizadas.</w:t>
       </w:r>
     </w:p>
     <w:p>
@@ -896,7 +942,7 @@
       </w:pPr>
     </w:p>
     <w:p>
-      <w:bookmarkStart w:id="3" w:name="bm_agradecimientos"/>
+      <w:bookmarkStart w:id="4" w:name="bm_dedicatoria"/>
       <w:pPr>
         <w:pStyle w:val="IUTECPPreliminar"/>
         <w:keepNext/>
@@ -910,9 +956,9 @@
           <w:b/>
           <w:sz w:val="24"/>
         </w:rPr>
-        <w:t>AGRADECIMIENTOS</w:t>
-      </w:r>
-      <w:bookmarkEnd w:id="3"/>
+        <w:t>DEDICATORIA</w:t>
+      </w:r>
+      <w:bookmarkEnd w:id="4"/>
     </w:p>
     <w:p>
       <w:pPr>
@@ -926,7 +972,7 @@
           <w:i w:val="0"/>
           <w:sz w:val="24"/>
         </w:rPr>
-        <w:t>Al Instituto Universitario de Tecnología “Elías Calixto Pompa” (IUTECP), por la formación recibida; a Ingeniería de Telecomunicaciones, C.A. (IDETEL), por permitirme desarrollar las pasantías y conocer de manera directa sus procesos de atención y administración; a mis tutores, por sus orientaciones y observaciones durante la elaboración del informe; y al personal de la empresa, por su disposición, acompañamiento y colaboración durante las actividades realizadas.</w:t>
+        <w:t>A mi familia, por su apoyo constante, comprensión y motivación durante mi formación académica y en el desarrollo de esta etapa profesional.</w:t>
       </w:r>
     </w:p>
     <w:p>
@@ -942,7 +988,7 @@
       </w:pPr>
     </w:p>
     <w:p>
-      <w:bookmarkStart w:id="4" w:name="bm_dedicatoria"/>
+      <w:bookmarkStart w:id="5" w:name="bm_indice"/>
       <w:pPr>
         <w:pStyle w:val="IUTECPPreliminar"/>
         <w:keepNext/>
@@ -956,23 +1002,1115 @@
           <w:b/>
           <w:sz w:val="24"/>
         </w:rPr>
-        <w:t>DEDICATORIA</w:t>
-      </w:r>
-      <w:bookmarkEnd w:id="4"/>
+        <w:t>ÍNDICE DE CONTENIDO</w:t>
+      </w:r>
+      <w:bookmarkEnd w:id="5"/>
     </w:p>
     <w:p>
       <w:pPr>
-        <w:spacing w:line="360" w:lineRule="auto" w:after="0" w:before="0"/>
-        <w:ind w:firstLine="709"/>
-        <w:jc w:val="both"/>
-      </w:pPr>
-      <w:r>
-        <w:rPr>
-          <w:rFonts w:ascii="Times New Roman" w:hAnsi="Times New Roman"/>
-          <w:i w:val="0"/>
-          <w:sz w:val="24"/>
-        </w:rPr>
-        <w:t>A mi familia, por su apoyo constante, comprensión y motivación durante mi formación académica y en el desarrollo de esta etapa profesional.</w:t>
+        <w:spacing w:after="240"/>
+        <w:jc w:val="right"/>
+      </w:pPr>
+      <w:r>
+        <w:rPr>
+          <w:rFonts w:ascii="Times New Roman" w:hAnsi="Times New Roman"/>
+          <w:b/>
+          <w:sz w:val="24"/>
+        </w:rPr>
+        <w:t>pp.</w:t>
+      </w:r>
+    </w:p>
+    <w:p>
+      <w:pPr>
+        <w:keepLines/>
+        <w:tabs>
+          <w:tab w:pos="8271" w:val="right" w:leader="dot"/>
+        </w:tabs>
+        <w:spacing w:line="360" w:lineRule="auto" w:before="0" w:after="80"/>
+        <w:ind w:left="0"/>
+      </w:pPr>
+      <w:r>
+        <w:rPr>
+          <w:rFonts w:ascii="Times New Roman" w:hAnsi="Times New Roman"/>
+          <w:b w:val="0"/>
+          <w:sz w:val="24"/>
+        </w:rPr>
+        <w:t>CONTRAPORTADA</w:t>
+        <w:tab/>
+      </w:r>
+      <w:r>
+        <w:rPr>
+          <w:rFonts w:ascii="Times New Roman" w:hAnsi="Times New Roman"/>
+          <w:b w:val="0"/>
+          <w:sz w:val="24"/>
+        </w:rPr>
+        <w:t>ii</w:t>
+      </w:r>
+    </w:p>
+    <w:p>
+      <w:pPr>
+        <w:keepLines/>
+        <w:tabs>
+          <w:tab w:pos="8271" w:val="right" w:leader="dot"/>
+        </w:tabs>
+        <w:spacing w:line="360" w:lineRule="auto" w:before="0" w:after="80"/>
+        <w:ind w:left="0"/>
+      </w:pPr>
+      <w:r>
+        <w:rPr>
+          <w:rFonts w:ascii="Times New Roman" w:hAnsi="Times New Roman"/>
+          <w:b w:val="0"/>
+          <w:sz w:val="24"/>
+        </w:rPr>
+        <w:t>APROBACIÓN DEL TUTOR INDUSTRIAL</w:t>
+        <w:tab/>
+      </w:r>
+      <w:r>
+        <w:rPr>
+          <w:rFonts w:ascii="Times New Roman" w:hAnsi="Times New Roman"/>
+          <w:b w:val="0"/>
+          <w:sz w:val="24"/>
+        </w:rPr>
+        <w:t>iii</w:t>
+      </w:r>
+    </w:p>
+    <w:p>
+      <w:pPr>
+        <w:keepLines/>
+        <w:tabs>
+          <w:tab w:pos="8271" w:val="right" w:leader="dot"/>
+        </w:tabs>
+        <w:spacing w:line="360" w:lineRule="auto" w:before="0" w:after="80"/>
+        <w:ind w:left="0"/>
+      </w:pPr>
+      <w:r>
+        <w:rPr>
+          <w:rFonts w:ascii="Times New Roman" w:hAnsi="Times New Roman"/>
+          <w:b w:val="0"/>
+          <w:sz w:val="24"/>
+        </w:rPr>
+        <w:t>APROBACIÓN DEL TUTOR ACADÉMICO</w:t>
+        <w:tab/>
+      </w:r>
+      <w:r>
+        <w:rPr>
+          <w:rFonts w:ascii="Times New Roman" w:hAnsi="Times New Roman"/>
+          <w:b w:val="0"/>
+          <w:sz w:val="24"/>
+        </w:rPr>
+        <w:t>iv</w:t>
+      </w:r>
+    </w:p>
+    <w:p>
+      <w:pPr>
+        <w:keepLines/>
+        <w:tabs>
+          <w:tab w:pos="8271" w:val="right" w:leader="dot"/>
+        </w:tabs>
+        <w:spacing w:line="360" w:lineRule="auto" w:before="0" w:after="80"/>
+        <w:ind w:left="0"/>
+      </w:pPr>
+      <w:r>
+        <w:rPr>
+          <w:rFonts w:ascii="Times New Roman" w:hAnsi="Times New Roman"/>
+          <w:b w:val="0"/>
+          <w:sz w:val="24"/>
+        </w:rPr>
+        <w:t>AGRADECIMIENTOS</w:t>
+        <w:tab/>
+      </w:r>
+      <w:r>
+        <w:rPr>
+          <w:rFonts w:ascii="Times New Roman" w:hAnsi="Times New Roman"/>
+          <w:b w:val="0"/>
+          <w:sz w:val="24"/>
+        </w:rPr>
+        <w:t>v</w:t>
+      </w:r>
+    </w:p>
+    <w:p>
+      <w:pPr>
+        <w:keepLines/>
+        <w:tabs>
+          <w:tab w:pos="8271" w:val="right" w:leader="dot"/>
+        </w:tabs>
+        <w:spacing w:line="360" w:lineRule="auto" w:before="0" w:after="80"/>
+        <w:ind w:left="0"/>
+      </w:pPr>
+      <w:r>
+        <w:rPr>
+          <w:rFonts w:ascii="Times New Roman" w:hAnsi="Times New Roman"/>
+          <w:b w:val="0"/>
+          <w:sz w:val="24"/>
+        </w:rPr>
+        <w:t>DEDICATORIA</w:t>
+        <w:tab/>
+      </w:r>
+      <w:r>
+        <w:rPr>
+          <w:rFonts w:ascii="Times New Roman" w:hAnsi="Times New Roman"/>
+          <w:b w:val="0"/>
+          <w:sz w:val="24"/>
+        </w:rPr>
+        <w:t>vi</w:t>
+      </w:r>
+    </w:p>
+    <w:p>
+      <w:pPr>
+        <w:keepLines/>
+        <w:tabs>
+          <w:tab w:pos="8271" w:val="right" w:leader="dot"/>
+        </w:tabs>
+        <w:spacing w:line="360" w:lineRule="auto" w:before="0" w:after="80"/>
+        <w:ind w:left="0"/>
+      </w:pPr>
+      <w:r>
+        <w:rPr>
+          <w:rFonts w:ascii="Times New Roman" w:hAnsi="Times New Roman"/>
+          <w:b w:val="0"/>
+          <w:sz w:val="24"/>
+        </w:rPr>
+        <w:t>LISTA DE CUADROS</w:t>
+        <w:tab/>
+      </w:r>
+      <w:r>
+        <w:rPr>
+          <w:rFonts w:ascii="Times New Roman" w:hAnsi="Times New Roman"/>
+          <w:b w:val="0"/>
+          <w:sz w:val="24"/>
+        </w:rPr>
+        <w:t>ix</w:t>
+      </w:r>
+    </w:p>
+    <w:p>
+      <w:pPr>
+        <w:keepLines/>
+        <w:tabs>
+          <w:tab w:pos="8271" w:val="right" w:leader="dot"/>
+        </w:tabs>
+        <w:spacing w:line="360" w:lineRule="auto" w:before="0" w:after="80"/>
+        <w:ind w:left="0"/>
+      </w:pPr>
+      <w:r>
+        <w:rPr>
+          <w:rFonts w:ascii="Times New Roman" w:hAnsi="Times New Roman"/>
+          <w:b w:val="0"/>
+          <w:sz w:val="24"/>
+        </w:rPr>
+        <w:t>LISTA DE GRÁFICOS</w:t>
+        <w:tab/>
+      </w:r>
+      <w:r>
+        <w:rPr>
+          <w:rFonts w:ascii="Times New Roman" w:hAnsi="Times New Roman"/>
+          <w:b w:val="0"/>
+          <w:sz w:val="24"/>
+        </w:rPr>
+        <w:t>x</w:t>
+      </w:r>
+    </w:p>
+    <w:p>
+      <w:pPr>
+        <w:keepLines/>
+        <w:tabs>
+          <w:tab w:pos="8271" w:val="right" w:leader="dot"/>
+        </w:tabs>
+        <w:spacing w:line="360" w:lineRule="auto" w:before="0" w:after="80"/>
+        <w:ind w:left="0"/>
+      </w:pPr>
+      <w:r>
+        <w:rPr>
+          <w:rFonts w:ascii="Times New Roman" w:hAnsi="Times New Roman"/>
+          <w:b w:val="0"/>
+          <w:sz w:val="24"/>
+        </w:rPr>
+        <w:t>LISTA DE ANEXOS</w:t>
+        <w:tab/>
+      </w:r>
+      <w:r>
+        <w:rPr>
+          <w:rFonts w:ascii="Times New Roman" w:hAnsi="Times New Roman"/>
+          <w:b w:val="0"/>
+          <w:sz w:val="24"/>
+        </w:rPr>
+        <w:t>xi</w:t>
+      </w:r>
+    </w:p>
+    <w:p>
+      <w:pPr>
+        <w:keepLines/>
+        <w:tabs>
+          <w:tab w:pos="8271" w:val="right" w:leader="dot"/>
+        </w:tabs>
+        <w:spacing w:line="360" w:lineRule="auto" w:before="0" w:after="80"/>
+        <w:ind w:left="0"/>
+      </w:pPr>
+      <w:r>
+        <w:rPr>
+          <w:rFonts w:ascii="Times New Roman" w:hAnsi="Times New Roman"/>
+          <w:b w:val="0"/>
+          <w:sz w:val="24"/>
+        </w:rPr>
+        <w:t>RESUMEN</w:t>
+        <w:tab/>
+      </w:r>
+      <w:r>
+        <w:rPr>
+          <w:rFonts w:ascii="Times New Roman" w:hAnsi="Times New Roman"/>
+          <w:b w:val="0"/>
+          <w:sz w:val="24"/>
+        </w:rPr>
+        <w:t>xii</w:t>
+      </w:r>
+    </w:p>
+    <w:p>
+      <w:pPr>
+        <w:keepLines/>
+        <w:tabs>
+          <w:tab w:pos="8271" w:val="right" w:leader="dot"/>
+        </w:tabs>
+        <w:spacing w:line="360" w:lineRule="auto" w:before="0" w:after="80"/>
+        <w:ind w:left="0"/>
+      </w:pPr>
+      <w:r>
+        <w:rPr>
+          <w:rFonts w:ascii="Times New Roman" w:hAnsi="Times New Roman"/>
+          <w:b w:val="0"/>
+          <w:sz w:val="24"/>
+        </w:rPr>
+        <w:t>INTRODUCCIÓN</w:t>
+        <w:tab/>
+      </w:r>
+      <w:r>
+        <w:rPr>
+          <w:rFonts w:ascii="Times New Roman" w:hAnsi="Times New Roman"/>
+          <w:b w:val="0"/>
+          <w:sz w:val="24"/>
+        </w:rPr>
+        <w:fldChar w:fldCharType="begin"/>
+        <w:instrText xml:space="preserve"> PAGEREF bm_introduccion \h </w:instrText>
+        <w:fldChar w:fldCharType="separate"/>
+        <w:t>?</w:t>
+        <w:fldChar w:fldCharType="end"/>
+      </w:r>
+    </w:p>
+    <w:p>
+      <w:pPr>
+        <w:keepNext/>
+        <w:keepLines/>
+        <w:spacing w:before="240" w:after="120"/>
+      </w:pPr>
+      <w:r>
+        <w:rPr>
+          <w:b/>
+        </w:rPr>
+        <w:t>CAPÍTULOS</w:t>
+      </w:r>
+    </w:p>
+    <w:p>
+      <w:pPr>
+        <w:keepLines/>
+        <w:tabs>
+          <w:tab w:pos="8271" w:val="right" w:leader="dot"/>
+        </w:tabs>
+        <w:spacing w:line="360" w:lineRule="auto" w:before="0" w:after="80"/>
+        <w:ind w:left="0"/>
+      </w:pPr>
+      <w:r>
+        <w:rPr>
+          <w:rFonts w:ascii="Times New Roman" w:hAnsi="Times New Roman"/>
+          <w:b/>
+          <w:sz w:val="24"/>
+        </w:rPr>
+        <w:t>CAPÍTULO I: REALIDAD ORGANIZACIONAL</w:t>
+        <w:tab/>
+      </w:r>
+      <w:r>
+        <w:rPr>
+          <w:rFonts w:ascii="Times New Roman" w:hAnsi="Times New Roman"/>
+          <w:b/>
+          <w:sz w:val="24"/>
+        </w:rPr>
+        <w:fldChar w:fldCharType="begin"/>
+        <w:instrText xml:space="preserve"> PAGEREF bm_cap1 \h </w:instrText>
+        <w:fldChar w:fldCharType="separate"/>
+        <w:t>?</w:t>
+        <w:fldChar w:fldCharType="end"/>
+      </w:r>
+    </w:p>
+    <w:p>
+      <w:pPr>
+        <w:keepLines/>
+        <w:tabs>
+          <w:tab w:pos="8271" w:val="right" w:leader="dot"/>
+        </w:tabs>
+        <w:spacing w:line="360" w:lineRule="auto" w:before="0" w:after="80"/>
+        <w:ind w:left="283"/>
+      </w:pPr>
+      <w:r>
+        <w:rPr>
+          <w:rFonts w:ascii="Times New Roman" w:hAnsi="Times New Roman"/>
+          <w:b w:val="0"/>
+          <w:sz w:val="24"/>
+        </w:rPr>
+        <w:t>Identificación de la empresa</w:t>
+        <w:tab/>
+      </w:r>
+      <w:r>
+        <w:rPr>
+          <w:rFonts w:ascii="Times New Roman" w:hAnsi="Times New Roman"/>
+          <w:b w:val="0"/>
+          <w:sz w:val="24"/>
+        </w:rPr>
+        <w:fldChar w:fldCharType="begin"/>
+        <w:instrText xml:space="preserve"> PAGEREF bm_cap1_ident \h </w:instrText>
+        <w:fldChar w:fldCharType="separate"/>
+        <w:t>?</w:t>
+        <w:fldChar w:fldCharType="end"/>
+      </w:r>
+    </w:p>
+    <w:p>
+      <w:pPr>
+        <w:keepLines/>
+        <w:tabs>
+          <w:tab w:pos="8271" w:val="right" w:leader="dot"/>
+        </w:tabs>
+        <w:spacing w:line="360" w:lineRule="auto" w:before="0" w:after="80"/>
+        <w:ind w:left="283"/>
+      </w:pPr>
+      <w:r>
+        <w:rPr>
+          <w:rFonts w:ascii="Times New Roman" w:hAnsi="Times New Roman"/>
+          <w:b w:val="0"/>
+          <w:sz w:val="24"/>
+        </w:rPr>
+        <w:t>Reseña histórica</w:t>
+        <w:tab/>
+      </w:r>
+      <w:r>
+        <w:rPr>
+          <w:rFonts w:ascii="Times New Roman" w:hAnsi="Times New Roman"/>
+          <w:b w:val="0"/>
+          <w:sz w:val="24"/>
+        </w:rPr>
+        <w:fldChar w:fldCharType="begin"/>
+        <w:instrText xml:space="preserve"> PAGEREF bm_cap1_resena \h </w:instrText>
+        <w:fldChar w:fldCharType="separate"/>
+        <w:t>?</w:t>
+        <w:fldChar w:fldCharType="end"/>
+      </w:r>
+    </w:p>
+    <w:p>
+      <w:pPr>
+        <w:keepLines/>
+        <w:tabs>
+          <w:tab w:pos="8271" w:val="right" w:leader="dot"/>
+        </w:tabs>
+        <w:spacing w:line="360" w:lineRule="auto" w:before="0" w:after="80"/>
+        <w:ind w:left="283"/>
+      </w:pPr>
+      <w:r>
+        <w:rPr>
+          <w:rFonts w:ascii="Times New Roman" w:hAnsi="Times New Roman"/>
+          <w:b w:val="0"/>
+          <w:sz w:val="24"/>
+        </w:rPr>
+        <w:t>Misión</w:t>
+        <w:tab/>
+      </w:r>
+      <w:r>
+        <w:rPr>
+          <w:rFonts w:ascii="Times New Roman" w:hAnsi="Times New Roman"/>
+          <w:b w:val="0"/>
+          <w:sz w:val="24"/>
+        </w:rPr>
+        <w:fldChar w:fldCharType="begin"/>
+        <w:instrText xml:space="preserve"> PAGEREF bm_cap1_mision \h </w:instrText>
+        <w:fldChar w:fldCharType="separate"/>
+        <w:t>?</w:t>
+        <w:fldChar w:fldCharType="end"/>
+      </w:r>
+    </w:p>
+    <w:p>
+      <w:pPr>
+        <w:keepLines/>
+        <w:tabs>
+          <w:tab w:pos="8271" w:val="right" w:leader="dot"/>
+        </w:tabs>
+        <w:spacing w:line="360" w:lineRule="auto" w:before="0" w:after="80"/>
+        <w:ind w:left="283"/>
+      </w:pPr>
+      <w:r>
+        <w:rPr>
+          <w:rFonts w:ascii="Times New Roman" w:hAnsi="Times New Roman"/>
+          <w:b w:val="0"/>
+          <w:sz w:val="24"/>
+        </w:rPr>
+        <w:t>Visión</w:t>
+        <w:tab/>
+      </w:r>
+      <w:r>
+        <w:rPr>
+          <w:rFonts w:ascii="Times New Roman" w:hAnsi="Times New Roman"/>
+          <w:b w:val="0"/>
+          <w:sz w:val="24"/>
+        </w:rPr>
+        <w:fldChar w:fldCharType="begin"/>
+        <w:instrText xml:space="preserve"> PAGEREF bm_cap1_vision \h </w:instrText>
+        <w:fldChar w:fldCharType="separate"/>
+        <w:t>?</w:t>
+        <w:fldChar w:fldCharType="end"/>
+      </w:r>
+    </w:p>
+    <w:p>
+      <w:pPr>
+        <w:keepLines/>
+        <w:tabs>
+          <w:tab w:pos="8271" w:val="right" w:leader="dot"/>
+        </w:tabs>
+        <w:spacing w:line="360" w:lineRule="auto" w:before="0" w:after="80"/>
+        <w:ind w:left="283"/>
+      </w:pPr>
+      <w:r>
+        <w:rPr>
+          <w:rFonts w:ascii="Times New Roman" w:hAnsi="Times New Roman"/>
+          <w:b w:val="0"/>
+          <w:sz w:val="24"/>
+        </w:rPr>
+        <w:t>Valores</w:t>
+        <w:tab/>
+      </w:r>
+      <w:r>
+        <w:rPr>
+          <w:rFonts w:ascii="Times New Roman" w:hAnsi="Times New Roman"/>
+          <w:b w:val="0"/>
+          <w:sz w:val="24"/>
+        </w:rPr>
+        <w:fldChar w:fldCharType="begin"/>
+        <w:instrText xml:space="preserve"> PAGEREF bm_cap1_valores \h </w:instrText>
+        <w:fldChar w:fldCharType="separate"/>
+        <w:t>?</w:t>
+        <w:fldChar w:fldCharType="end"/>
+      </w:r>
+    </w:p>
+    <w:p>
+      <w:pPr>
+        <w:keepLines/>
+        <w:tabs>
+          <w:tab w:pos="8271" w:val="right" w:leader="dot"/>
+        </w:tabs>
+        <w:spacing w:line="360" w:lineRule="auto" w:before="0" w:after="80"/>
+        <w:ind w:left="283"/>
+      </w:pPr>
+      <w:r>
+        <w:rPr>
+          <w:rFonts w:ascii="Times New Roman" w:hAnsi="Times New Roman"/>
+          <w:b w:val="0"/>
+          <w:sz w:val="24"/>
+        </w:rPr>
+        <w:t>Objetivos Organizacionales</w:t>
+        <w:tab/>
+      </w:r>
+      <w:r>
+        <w:rPr>
+          <w:rFonts w:ascii="Times New Roman" w:hAnsi="Times New Roman"/>
+          <w:b w:val="0"/>
+          <w:sz w:val="24"/>
+        </w:rPr>
+        <w:fldChar w:fldCharType="begin"/>
+        <w:instrText xml:space="preserve"> PAGEREF bm_cap1_obj \h </w:instrText>
+        <w:fldChar w:fldCharType="separate"/>
+        <w:t>?</w:t>
+        <w:fldChar w:fldCharType="end"/>
+      </w:r>
+    </w:p>
+    <w:p>
+      <w:pPr>
+        <w:keepLines/>
+        <w:tabs>
+          <w:tab w:pos="8271" w:val="right" w:leader="dot"/>
+        </w:tabs>
+        <w:spacing w:line="360" w:lineRule="auto" w:before="0" w:after="80"/>
+        <w:ind w:left="283"/>
+      </w:pPr>
+      <w:r>
+        <w:rPr>
+          <w:rFonts w:ascii="Times New Roman" w:hAnsi="Times New Roman"/>
+          <w:b w:val="0"/>
+          <w:sz w:val="24"/>
+        </w:rPr>
+        <w:t>Ubicación geográfica</w:t>
+        <w:tab/>
+      </w:r>
+      <w:r>
+        <w:rPr>
+          <w:rFonts w:ascii="Times New Roman" w:hAnsi="Times New Roman"/>
+          <w:b w:val="0"/>
+          <w:sz w:val="24"/>
+        </w:rPr>
+        <w:fldChar w:fldCharType="begin"/>
+        <w:instrText xml:space="preserve"> PAGEREF bm_cap1_ubic \h </w:instrText>
+        <w:fldChar w:fldCharType="separate"/>
+        <w:t>?</w:t>
+        <w:fldChar w:fldCharType="end"/>
+      </w:r>
+    </w:p>
+    <w:p>
+      <w:pPr>
+        <w:keepLines/>
+        <w:tabs>
+          <w:tab w:pos="8271" w:val="right" w:leader="dot"/>
+        </w:tabs>
+        <w:spacing w:line="360" w:lineRule="auto" w:before="0" w:after="80"/>
+        <w:ind w:left="283"/>
+      </w:pPr>
+      <w:r>
+        <w:rPr>
+          <w:rFonts w:ascii="Times New Roman" w:hAnsi="Times New Roman"/>
+          <w:b w:val="0"/>
+          <w:sz w:val="24"/>
+        </w:rPr>
+        <w:t>Población de los trabajadores de la empresa</w:t>
+        <w:tab/>
+      </w:r>
+      <w:r>
+        <w:rPr>
+          <w:rFonts w:ascii="Times New Roman" w:hAnsi="Times New Roman"/>
+          <w:b w:val="0"/>
+          <w:sz w:val="24"/>
+        </w:rPr>
+        <w:fldChar w:fldCharType="begin"/>
+        <w:instrText xml:space="preserve"> PAGEREF bm_cap1_pobla \h </w:instrText>
+        <w:fldChar w:fldCharType="separate"/>
+        <w:t>?</w:t>
+        <w:fldChar w:fldCharType="end"/>
+      </w:r>
+    </w:p>
+    <w:p>
+      <w:pPr>
+        <w:keepLines/>
+        <w:tabs>
+          <w:tab w:pos="8271" w:val="right" w:leader="dot"/>
+        </w:tabs>
+        <w:spacing w:line="360" w:lineRule="auto" w:before="0" w:after="80"/>
+        <w:ind w:left="283"/>
+      </w:pPr>
+      <w:r>
+        <w:rPr>
+          <w:rFonts w:ascii="Times New Roman" w:hAnsi="Times New Roman"/>
+          <w:b w:val="0"/>
+          <w:sz w:val="24"/>
+        </w:rPr>
+        <w:t>Estructura organizativa de la empresa (Organigrama)</w:t>
+        <w:tab/>
+      </w:r>
+      <w:r>
+        <w:rPr>
+          <w:rFonts w:ascii="Times New Roman" w:hAnsi="Times New Roman"/>
+          <w:b w:val="0"/>
+          <w:sz w:val="24"/>
+        </w:rPr>
+        <w:fldChar w:fldCharType="begin"/>
+        <w:instrText xml:space="preserve"> PAGEREF bm_cap1_estruct \h </w:instrText>
+        <w:fldChar w:fldCharType="separate"/>
+        <w:t>?</w:t>
+        <w:fldChar w:fldCharType="end"/>
+      </w:r>
+    </w:p>
+    <w:p>
+      <w:pPr>
+        <w:keepLines/>
+        <w:tabs>
+          <w:tab w:pos="8271" w:val="right" w:leader="dot"/>
+        </w:tabs>
+        <w:spacing w:line="360" w:lineRule="auto" w:before="0" w:after="80"/>
+        <w:ind w:left="283"/>
+      </w:pPr>
+      <w:r>
+        <w:rPr>
+          <w:rFonts w:ascii="Times New Roman" w:hAnsi="Times New Roman"/>
+          <w:b w:val="0"/>
+          <w:sz w:val="24"/>
+        </w:rPr>
+        <w:t>Descripción del departamento donde realizó la pasantía</w:t>
+        <w:tab/>
+      </w:r>
+      <w:r>
+        <w:rPr>
+          <w:rFonts w:ascii="Times New Roman" w:hAnsi="Times New Roman"/>
+          <w:b w:val="0"/>
+          <w:sz w:val="24"/>
+        </w:rPr>
+        <w:fldChar w:fldCharType="begin"/>
+        <w:instrText xml:space="preserve"> PAGEREF bm_cap1_departamento \h </w:instrText>
+        <w:fldChar w:fldCharType="separate"/>
+        <w:t>?</w:t>
+        <w:fldChar w:fldCharType="end"/>
+      </w:r>
+    </w:p>
+    <w:p>
+      <w:pPr>
+        <w:keepLines/>
+        <w:tabs>
+          <w:tab w:pos="8271" w:val="right" w:leader="dot"/>
+        </w:tabs>
+        <w:spacing w:line="360" w:lineRule="auto" w:before="0" w:after="80"/>
+        <w:ind w:left="0"/>
+      </w:pPr>
+      <w:r>
+        <w:rPr>
+          <w:rFonts w:ascii="Times New Roman" w:hAnsi="Times New Roman"/>
+          <w:b/>
+          <w:sz w:val="24"/>
+        </w:rPr>
+        <w:t>CAPÍTULO II: DIAGNÓSTICO SITUACIONAL</w:t>
+        <w:tab/>
+      </w:r>
+      <w:r>
+        <w:rPr>
+          <w:rFonts w:ascii="Times New Roman" w:hAnsi="Times New Roman"/>
+          <w:b/>
+          <w:sz w:val="24"/>
+        </w:rPr>
+        <w:fldChar w:fldCharType="begin"/>
+        <w:instrText xml:space="preserve"> PAGEREF bm_cap2 \h </w:instrText>
+        <w:fldChar w:fldCharType="separate"/>
+        <w:t>?</w:t>
+        <w:fldChar w:fldCharType="end"/>
+      </w:r>
+    </w:p>
+    <w:p>
+      <w:pPr>
+        <w:keepLines/>
+        <w:tabs>
+          <w:tab w:pos="8271" w:val="right" w:leader="dot"/>
+        </w:tabs>
+        <w:spacing w:line="360" w:lineRule="auto" w:before="0" w:after="80"/>
+        <w:ind w:left="283"/>
+      </w:pPr>
+      <w:r>
+        <w:rPr>
+          <w:rFonts w:ascii="Times New Roman" w:hAnsi="Times New Roman"/>
+          <w:b w:val="0"/>
+          <w:sz w:val="24"/>
+        </w:rPr>
+        <w:t>Identificación de la situación problemática</w:t>
+        <w:tab/>
+      </w:r>
+      <w:r>
+        <w:rPr>
+          <w:rFonts w:ascii="Times New Roman" w:hAnsi="Times New Roman"/>
+          <w:b w:val="0"/>
+          <w:sz w:val="24"/>
+        </w:rPr>
+        <w:fldChar w:fldCharType="begin"/>
+        <w:instrText xml:space="preserve"> PAGEREF bm_cap2_sit \h </w:instrText>
+        <w:fldChar w:fldCharType="separate"/>
+        <w:t>?</w:t>
+        <w:fldChar w:fldCharType="end"/>
+      </w:r>
+    </w:p>
+    <w:p>
+      <w:pPr>
+        <w:keepLines/>
+        <w:tabs>
+          <w:tab w:pos="8271" w:val="right" w:leader="dot"/>
+        </w:tabs>
+        <w:spacing w:line="360" w:lineRule="auto" w:before="0" w:after="80"/>
+        <w:ind w:left="283"/>
+      </w:pPr>
+      <w:r>
+        <w:rPr>
+          <w:rFonts w:ascii="Times New Roman" w:hAnsi="Times New Roman"/>
+          <w:b w:val="0"/>
+          <w:sz w:val="24"/>
+        </w:rPr>
+        <w:t>Objetivo General</w:t>
+        <w:tab/>
+      </w:r>
+      <w:r>
+        <w:rPr>
+          <w:rFonts w:ascii="Times New Roman" w:hAnsi="Times New Roman"/>
+          <w:b w:val="0"/>
+          <w:sz w:val="24"/>
+        </w:rPr>
+        <w:fldChar w:fldCharType="begin"/>
+        <w:instrText xml:space="preserve"> PAGEREF bm_cap2_objg \h </w:instrText>
+        <w:fldChar w:fldCharType="separate"/>
+        <w:t>?</w:t>
+        <w:fldChar w:fldCharType="end"/>
+      </w:r>
+    </w:p>
+    <w:p>
+      <w:pPr>
+        <w:keepLines/>
+        <w:tabs>
+          <w:tab w:pos="8271" w:val="right" w:leader="dot"/>
+        </w:tabs>
+        <w:spacing w:line="360" w:lineRule="auto" w:before="0" w:after="80"/>
+        <w:ind w:left="283"/>
+      </w:pPr>
+      <w:r>
+        <w:rPr>
+          <w:rFonts w:ascii="Times New Roman" w:hAnsi="Times New Roman"/>
+          <w:b w:val="0"/>
+          <w:sz w:val="24"/>
+        </w:rPr>
+        <w:t>Objetivos Específicos</w:t>
+        <w:tab/>
+      </w:r>
+      <w:r>
+        <w:rPr>
+          <w:rFonts w:ascii="Times New Roman" w:hAnsi="Times New Roman"/>
+          <w:b w:val="0"/>
+          <w:sz w:val="24"/>
+        </w:rPr>
+        <w:fldChar w:fldCharType="begin"/>
+        <w:instrText xml:space="preserve"> PAGEREF bm_cap2_obje \h </w:instrText>
+        <w:fldChar w:fldCharType="separate"/>
+        <w:t>?</w:t>
+        <w:fldChar w:fldCharType="end"/>
+      </w:r>
+    </w:p>
+    <w:p>
+      <w:pPr>
+        <w:keepLines/>
+        <w:tabs>
+          <w:tab w:pos="8271" w:val="right" w:leader="dot"/>
+        </w:tabs>
+        <w:spacing w:line="360" w:lineRule="auto" w:before="0" w:after="80"/>
+        <w:ind w:left="283"/>
+      </w:pPr>
+      <w:r>
+        <w:rPr>
+          <w:rFonts w:ascii="Times New Roman" w:hAnsi="Times New Roman"/>
+          <w:b w:val="0"/>
+          <w:sz w:val="24"/>
+        </w:rPr>
+        <w:t>Planificación integral de objetivos</w:t>
+        <w:tab/>
+      </w:r>
+      <w:r>
+        <w:rPr>
+          <w:rFonts w:ascii="Times New Roman" w:hAnsi="Times New Roman"/>
+          <w:b w:val="0"/>
+          <w:sz w:val="24"/>
+        </w:rPr>
+        <w:fldChar w:fldCharType="begin"/>
+        <w:instrText xml:space="preserve"> PAGEREF bm_cap2_planif \h </w:instrText>
+        <w:fldChar w:fldCharType="separate"/>
+        <w:t>?</w:t>
+        <w:fldChar w:fldCharType="end"/>
+      </w:r>
+    </w:p>
+    <w:p>
+      <w:pPr>
+        <w:keepLines/>
+        <w:tabs>
+          <w:tab w:pos="8271" w:val="right" w:leader="dot"/>
+        </w:tabs>
+        <w:spacing w:line="360" w:lineRule="auto" w:before="0" w:after="80"/>
+        <w:ind w:left="283"/>
+      </w:pPr>
+      <w:r>
+        <w:rPr>
+          <w:rFonts w:ascii="Times New Roman" w:hAnsi="Times New Roman"/>
+          <w:b w:val="0"/>
+          <w:sz w:val="24"/>
+        </w:rPr>
+        <w:t>CRONOGRAMA DE ACTIVIDADES (DIAGRAMA DE GANTT)</w:t>
+        <w:tab/>
+      </w:r>
+      <w:r>
+        <w:rPr>
+          <w:rFonts w:ascii="Times New Roman" w:hAnsi="Times New Roman"/>
+          <w:b w:val="0"/>
+          <w:sz w:val="24"/>
+        </w:rPr>
+        <w:fldChar w:fldCharType="begin"/>
+        <w:instrText xml:space="preserve"> PAGEREF bm_cap2_crono \h </w:instrText>
+        <w:fldChar w:fldCharType="separate"/>
+        <w:t>?</w:t>
+        <w:fldChar w:fldCharType="end"/>
+      </w:r>
+    </w:p>
+    <w:p>
+      <w:pPr>
+        <w:keepLines/>
+        <w:tabs>
+          <w:tab w:pos="8271" w:val="right" w:leader="dot"/>
+        </w:tabs>
+        <w:spacing w:line="360" w:lineRule="auto" w:before="0" w:after="80"/>
+        <w:ind w:left="0"/>
+      </w:pPr>
+      <w:r>
+        <w:rPr>
+          <w:rFonts w:ascii="Times New Roman" w:hAnsi="Times New Roman"/>
+          <w:b/>
+          <w:sz w:val="24"/>
+        </w:rPr>
+        <w:t>CAPÍTULO III: MARCO TEÓRICO</w:t>
+        <w:tab/>
+      </w:r>
+      <w:r>
+        <w:rPr>
+          <w:rFonts w:ascii="Times New Roman" w:hAnsi="Times New Roman"/>
+          <w:b/>
+          <w:sz w:val="24"/>
+        </w:rPr>
+        <w:fldChar w:fldCharType="begin"/>
+        <w:instrText xml:space="preserve"> PAGEREF bm_cap3 \h </w:instrText>
+        <w:fldChar w:fldCharType="separate"/>
+        <w:t>?</w:t>
+        <w:fldChar w:fldCharType="end"/>
+      </w:r>
+    </w:p>
+    <w:p>
+      <w:pPr>
+        <w:keepLines/>
+        <w:tabs>
+          <w:tab w:pos="8271" w:val="right" w:leader="dot"/>
+        </w:tabs>
+        <w:spacing w:line="360" w:lineRule="auto" w:before="0" w:after="80"/>
+        <w:ind w:left="283"/>
+      </w:pPr>
+      <w:r>
+        <w:rPr>
+          <w:rFonts w:ascii="Times New Roman" w:hAnsi="Times New Roman"/>
+          <w:b w:val="0"/>
+          <w:sz w:val="24"/>
+        </w:rPr>
+        <w:t>Bases teóricas referenciales</w:t>
+        <w:tab/>
+      </w:r>
+      <w:r>
+        <w:rPr>
+          <w:rFonts w:ascii="Times New Roman" w:hAnsi="Times New Roman"/>
+          <w:b w:val="0"/>
+          <w:sz w:val="24"/>
+        </w:rPr>
+        <w:fldChar w:fldCharType="begin"/>
+        <w:instrText xml:space="preserve"> PAGEREF bm_cap3_bases \h </w:instrText>
+        <w:fldChar w:fldCharType="separate"/>
+        <w:t>?</w:t>
+        <w:fldChar w:fldCharType="end"/>
+      </w:r>
+    </w:p>
+    <w:p>
+      <w:pPr>
+        <w:keepLines/>
+        <w:tabs>
+          <w:tab w:pos="8271" w:val="right" w:leader="dot"/>
+        </w:tabs>
+        <w:spacing w:line="360" w:lineRule="auto" w:before="0" w:after="80"/>
+        <w:ind w:left="0"/>
+      </w:pPr>
+      <w:r>
+        <w:rPr>
+          <w:rFonts w:ascii="Times New Roman" w:hAnsi="Times New Roman"/>
+          <w:b/>
+          <w:sz w:val="24"/>
+        </w:rPr>
+        <w:t>CAPÍTULO IV: ACTIVIDADES REALIZADAS</w:t>
+        <w:tab/>
+      </w:r>
+      <w:r>
+        <w:rPr>
+          <w:rFonts w:ascii="Times New Roman" w:hAnsi="Times New Roman"/>
+          <w:b/>
+          <w:sz w:val="24"/>
+        </w:rPr>
+        <w:fldChar w:fldCharType="begin"/>
+        <w:instrText xml:space="preserve"> PAGEREF bm_cap4 \h </w:instrText>
+        <w:fldChar w:fldCharType="separate"/>
+        <w:t>?</w:t>
+        <w:fldChar w:fldCharType="end"/>
+      </w:r>
+    </w:p>
+    <w:p>
+      <w:pPr>
+        <w:keepLines/>
+        <w:tabs>
+          <w:tab w:pos="8271" w:val="right" w:leader="dot"/>
+        </w:tabs>
+        <w:spacing w:line="360" w:lineRule="auto" w:before="0" w:after="80"/>
+        <w:ind w:left="283"/>
+      </w:pPr>
+      <w:r>
+        <w:rPr>
+          <w:rFonts w:ascii="Times New Roman" w:hAnsi="Times New Roman"/>
+          <w:b w:val="0"/>
+          <w:sz w:val="24"/>
+        </w:rPr>
+        <w:t>Descripción de actividades ejecutadas por semana</w:t>
+        <w:tab/>
+      </w:r>
+      <w:r>
+        <w:rPr>
+          <w:rFonts w:ascii="Times New Roman" w:hAnsi="Times New Roman"/>
+          <w:b w:val="0"/>
+          <w:sz w:val="24"/>
+        </w:rPr>
+        <w:fldChar w:fldCharType="begin"/>
+        <w:instrText xml:space="preserve"> PAGEREF bm_cap4_desc \h </w:instrText>
+        <w:fldChar w:fldCharType="separate"/>
+        <w:t>?</w:t>
+        <w:fldChar w:fldCharType="end"/>
+      </w:r>
+    </w:p>
+    <w:p>
+      <w:pPr>
+        <w:keepLines/>
+        <w:tabs>
+          <w:tab w:pos="8271" w:val="right" w:leader="dot"/>
+        </w:tabs>
+        <w:spacing w:line="360" w:lineRule="auto" w:before="0" w:after="80"/>
+        <w:ind w:left="0"/>
+      </w:pPr>
+      <w:r>
+        <w:rPr>
+          <w:rFonts w:ascii="Times New Roman" w:hAnsi="Times New Roman"/>
+          <w:b/>
+          <w:sz w:val="24"/>
+        </w:rPr>
+        <w:t>CAPÍTULO V: CONCLUSIONES Y RECOMENDACIONES</w:t>
+        <w:tab/>
+      </w:r>
+      <w:r>
+        <w:rPr>
+          <w:rFonts w:ascii="Times New Roman" w:hAnsi="Times New Roman"/>
+          <w:b/>
+          <w:sz w:val="24"/>
+        </w:rPr>
+        <w:fldChar w:fldCharType="begin"/>
+        <w:instrText xml:space="preserve"> PAGEREF bm_cap5 \h </w:instrText>
+        <w:fldChar w:fldCharType="separate"/>
+        <w:t>?</w:t>
+        <w:fldChar w:fldCharType="end"/>
+      </w:r>
+    </w:p>
+    <w:p>
+      <w:pPr>
+        <w:keepLines/>
+        <w:tabs>
+          <w:tab w:pos="8271" w:val="right" w:leader="dot"/>
+        </w:tabs>
+        <w:spacing w:line="360" w:lineRule="auto" w:before="0" w:after="80"/>
+        <w:ind w:left="283"/>
+      </w:pPr>
+      <w:r>
+        <w:rPr>
+          <w:rFonts w:ascii="Times New Roman" w:hAnsi="Times New Roman"/>
+          <w:b w:val="0"/>
+          <w:sz w:val="24"/>
+        </w:rPr>
+        <w:t>Conclusiones</w:t>
+        <w:tab/>
+      </w:r>
+      <w:r>
+        <w:rPr>
+          <w:rFonts w:ascii="Times New Roman" w:hAnsi="Times New Roman"/>
+          <w:b w:val="0"/>
+          <w:sz w:val="24"/>
+        </w:rPr>
+        <w:fldChar w:fldCharType="begin"/>
+        <w:instrText xml:space="preserve"> PAGEREF bm_cap5_concl \h </w:instrText>
+        <w:fldChar w:fldCharType="separate"/>
+        <w:t>?</w:t>
+        <w:fldChar w:fldCharType="end"/>
+      </w:r>
+    </w:p>
+    <w:p>
+      <w:pPr>
+        <w:keepLines/>
+        <w:tabs>
+          <w:tab w:pos="8271" w:val="right" w:leader="dot"/>
+        </w:tabs>
+        <w:spacing w:line="360" w:lineRule="auto" w:before="0" w:after="80"/>
+        <w:ind w:left="283"/>
+      </w:pPr>
+      <w:r>
+        <w:rPr>
+          <w:rFonts w:ascii="Times New Roman" w:hAnsi="Times New Roman"/>
+          <w:b w:val="0"/>
+          <w:sz w:val="24"/>
+        </w:rPr>
+        <w:t>Recomendaciones</w:t>
+        <w:tab/>
+      </w:r>
+      <w:r>
+        <w:rPr>
+          <w:rFonts w:ascii="Times New Roman" w:hAnsi="Times New Roman"/>
+          <w:b w:val="0"/>
+          <w:sz w:val="24"/>
+        </w:rPr>
+        <w:fldChar w:fldCharType="begin"/>
+        <w:instrText xml:space="preserve"> PAGEREF bm_cap5_recom \h </w:instrText>
+        <w:fldChar w:fldCharType="separate"/>
+        <w:t>?</w:t>
+        <w:fldChar w:fldCharType="end"/>
+      </w:r>
+    </w:p>
+    <w:p>
+      <w:pPr>
+        <w:keepLines/>
+        <w:tabs>
+          <w:tab w:pos="8271" w:val="right" w:leader="dot"/>
+        </w:tabs>
+        <w:spacing w:line="360" w:lineRule="auto" w:before="0" w:after="80"/>
+        <w:ind w:left="0"/>
+      </w:pPr>
+      <w:r>
+        <w:rPr>
+          <w:rFonts w:ascii="Times New Roman" w:hAnsi="Times New Roman"/>
+          <w:b/>
+          <w:sz w:val="24"/>
+        </w:rPr>
+        <w:t>REFERENCIAS</w:t>
+        <w:tab/>
+      </w:r>
+      <w:r>
+        <w:rPr>
+          <w:rFonts w:ascii="Times New Roman" w:hAnsi="Times New Roman"/>
+          <w:b/>
+          <w:sz w:val="24"/>
+        </w:rPr>
+        <w:fldChar w:fldCharType="begin"/>
+        <w:instrText xml:space="preserve"> PAGEREF bm_referencias \h </w:instrText>
+        <w:fldChar w:fldCharType="separate"/>
+        <w:t>?</w:t>
+        <w:fldChar w:fldCharType="end"/>
+      </w:r>
+    </w:p>
+    <w:p>
+      <w:pPr>
+        <w:keepLines/>
+        <w:tabs>
+          <w:tab w:pos="8271" w:val="right" w:leader="dot"/>
+        </w:tabs>
+        <w:spacing w:line="360" w:lineRule="auto" w:before="0" w:after="80"/>
+        <w:ind w:left="0"/>
+      </w:pPr>
+      <w:r>
+        <w:rPr>
+          <w:rFonts w:ascii="Times New Roman" w:hAnsi="Times New Roman"/>
+          <w:b/>
+          <w:sz w:val="24"/>
+        </w:rPr>
+        <w:t>ANEXOS</w:t>
+        <w:tab/>
+      </w:r>
+      <w:r>
+        <w:rPr>
+          <w:rFonts w:ascii="Times New Roman" w:hAnsi="Times New Roman"/>
+          <w:b/>
+          <w:sz w:val="24"/>
+        </w:rPr>
+        <w:fldChar w:fldCharType="begin"/>
+        <w:instrText xml:space="preserve"> PAGEREF bm_anexos \h </w:instrText>
+        <w:fldChar w:fldCharType="separate"/>
+        <w:t>?</w:t>
+        <w:fldChar w:fldCharType="end"/>
       </w:r>
     </w:p>
     <w:p>
@@ -988,7 +2126,7 @@
       </w:pPr>
     </w:p>
     <w:p>
-      <w:bookmarkStart w:id="5" w:name="bm_indice"/>
+      <w:bookmarkStart w:id="6" w:name="bm_lista_cuadros"/>
       <w:pPr>
         <w:pStyle w:val="IUTECPPreliminar"/>
         <w:keepNext/>
@@ -1002,15 +2140,30 @@
           <w:b/>
           <w:sz w:val="24"/>
         </w:rPr>
-        <w:t>ÍNDICE DE CONTENIDO</w:t>
-      </w:r>
-      <w:bookmarkEnd w:id="5"/>
+        <w:t>LISTA DE CUADROS</w:t>
+      </w:r>
+      <w:bookmarkEnd w:id="6"/>
     </w:p>
     <w:p>
       <w:pPr>
-        <w:spacing w:after="240"/>
-        <w:jc w:val="right"/>
-      </w:pPr>
+        <w:keepNext/>
+        <w:keepLines/>
+        <w:tabs>
+          <w:tab w:pos="8271" w:val="right"/>
+        </w:tabs>
+        <w:spacing w:before="240" w:after="240"/>
+      </w:pPr>
+      <w:r>
+        <w:rPr>
+          <w:rFonts w:ascii="Times New Roman" w:hAnsi="Times New Roman"/>
+          <w:b/>
+          <w:sz w:val="24"/>
+        </w:rPr>
+        <w:t>CUADRO</w:t>
+      </w:r>
+      <w:r>
+        <w:tab/>
+      </w:r>
       <w:r>
         <w:rPr>
           <w:rFonts w:ascii="Times New Roman" w:hAnsi="Times New Roman"/>
@@ -1024,1090 +2177,96 @@
       <w:pPr>
         <w:keepLines/>
         <w:tabs>
+          <w:tab w:pos="1020" w:val="left"/>
           <w:tab w:pos="8271" w:val="right" w:leader="dot"/>
         </w:tabs>
         <w:spacing w:line="360" w:lineRule="auto" w:before="0" w:after="80"/>
-        <w:ind w:left="0"/>
-      </w:pPr>
+        <w:ind w:left="1020" w:hanging="1020"/>
+      </w:pPr>
+      <w:r>
+        <w:rPr>
+          <w:rFonts w:ascii="Times New Roman" w:hAnsi="Times New Roman"/>
+          <w:sz w:val="24"/>
+        </w:rPr>
+        <w:t>1</w:t>
+        <w:tab/>
+        <w:t>Población de los trabajadores de la empresa</w:t>
+        <w:tab/>
+      </w:r>
       <w:r>
         <w:rPr>
           <w:rFonts w:ascii="Times New Roman" w:hAnsi="Times New Roman"/>
           <w:b w:val="0"/>
           <w:sz w:val="24"/>
         </w:rPr>
-        <w:t>CONTRAPORTADA</w:t>
-        <w:tab/>
-      </w:r>
-      <w:r>
-        <w:rPr>
-          <w:rFonts w:ascii="Times New Roman" w:hAnsi="Times New Roman"/>
-          <w:b w:val="0"/>
-          <w:sz w:val="24"/>
-        </w:rPr>
-        <w:t>ii</w:t>
+        <w:fldChar w:fldCharType="begin"/>
+        <w:instrText xml:space="preserve"> PAGEREF bm_cuadro1 \h </w:instrText>
+        <w:fldChar w:fldCharType="separate"/>
+        <w:t>?</w:t>
+        <w:fldChar w:fldCharType="end"/>
       </w:r>
     </w:p>
     <w:p>
       <w:pPr>
         <w:keepLines/>
         <w:tabs>
+          <w:tab w:pos="1020" w:val="left"/>
           <w:tab w:pos="8271" w:val="right" w:leader="dot"/>
         </w:tabs>
         <w:spacing w:line="360" w:lineRule="auto" w:before="0" w:after="80"/>
-        <w:ind w:left="0"/>
-      </w:pPr>
+        <w:ind w:left="1020" w:hanging="1020"/>
+      </w:pPr>
+      <w:r>
+        <w:rPr>
+          <w:rFonts w:ascii="Times New Roman" w:hAnsi="Times New Roman"/>
+          <w:sz w:val="24"/>
+        </w:rPr>
+        <w:t>2</w:t>
+        <w:tab/>
+        <w:t>Planificación integral de objetivos específicos</w:t>
+        <w:tab/>
+      </w:r>
       <w:r>
         <w:rPr>
           <w:rFonts w:ascii="Times New Roman" w:hAnsi="Times New Roman"/>
           <w:b w:val="0"/>
           <w:sz w:val="24"/>
         </w:rPr>
-        <w:t>APROBACIÓN DEL TUTOR INDUSTRIAL</w:t>
-        <w:tab/>
-      </w:r>
-      <w:r>
-        <w:rPr>
-          <w:rFonts w:ascii="Times New Roman" w:hAnsi="Times New Roman"/>
-          <w:b w:val="0"/>
-          <w:sz w:val="24"/>
-        </w:rPr>
-        <w:t>iii</w:t>
+        <w:fldChar w:fldCharType="begin"/>
+        <w:instrText xml:space="preserve"> PAGEREF bm_cuadro2 \h </w:instrText>
+        <w:fldChar w:fldCharType="separate"/>
+        <w:t>?</w:t>
+        <w:fldChar w:fldCharType="end"/>
       </w:r>
     </w:p>
     <w:p>
       <w:pPr>
         <w:keepLines/>
         <w:tabs>
+          <w:tab w:pos="1020" w:val="left"/>
           <w:tab w:pos="8271" w:val="right" w:leader="dot"/>
         </w:tabs>
         <w:spacing w:line="360" w:lineRule="auto" w:before="0" w:after="80"/>
-        <w:ind w:left="0"/>
-      </w:pPr>
+        <w:ind w:left="1020" w:hanging="1020"/>
+      </w:pPr>
+      <w:r>
+        <w:rPr>
+          <w:rFonts w:ascii="Times New Roman" w:hAnsi="Times New Roman"/>
+          <w:sz w:val="24"/>
+        </w:rPr>
+        <w:t>3</w:t>
+        <w:tab/>
+        <w:t>Cronograma de actividades de la pasantía</w:t>
+        <w:tab/>
+      </w:r>
       <w:r>
         <w:rPr>
           <w:rFonts w:ascii="Times New Roman" w:hAnsi="Times New Roman"/>
           <w:b w:val="0"/>
           <w:sz w:val="24"/>
         </w:rPr>
-        <w:t>APROBACIÓN DEL TUTOR ACADÉMICO</w:t>
-        <w:tab/>
-      </w:r>
-      <w:r>
-        <w:rPr>
-          <w:rFonts w:ascii="Times New Roman" w:hAnsi="Times New Roman"/>
-          <w:b w:val="0"/>
-          <w:sz w:val="24"/>
-        </w:rPr>
-        <w:t>iv</w:t>
-      </w:r>
-    </w:p>
-    <w:p>
-      <w:pPr>
-        <w:keepLines/>
-        <w:tabs>
-          <w:tab w:pos="8271" w:val="right" w:leader="dot"/>
-        </w:tabs>
-        <w:spacing w:line="360" w:lineRule="auto" w:before="0" w:after="80"/>
-        <w:ind w:left="0"/>
-      </w:pPr>
-      <w:r>
-        <w:rPr>
-          <w:rFonts w:ascii="Times New Roman" w:hAnsi="Times New Roman"/>
-          <w:b w:val="0"/>
-          <w:sz w:val="24"/>
-        </w:rPr>
-        <w:t>AGRADECIMIENTOS</w:t>
-        <w:tab/>
-      </w:r>
-      <w:r>
-        <w:rPr>
-          <w:rFonts w:ascii="Times New Roman" w:hAnsi="Times New Roman"/>
-          <w:b w:val="0"/>
-          <w:sz w:val="24"/>
-        </w:rPr>
-        <w:t>v</w:t>
-      </w:r>
-    </w:p>
-    <w:p>
-      <w:pPr>
-        <w:keepLines/>
-        <w:tabs>
-          <w:tab w:pos="8271" w:val="right" w:leader="dot"/>
-        </w:tabs>
-        <w:spacing w:line="360" w:lineRule="auto" w:before="0" w:after="80"/>
-        <w:ind w:left="0"/>
-      </w:pPr>
-      <w:r>
-        <w:rPr>
-          <w:rFonts w:ascii="Times New Roman" w:hAnsi="Times New Roman"/>
-          <w:b w:val="0"/>
-          <w:sz w:val="24"/>
-        </w:rPr>
-        <w:t>DEDICATORIA</w:t>
-        <w:tab/>
-      </w:r>
-      <w:r>
-        <w:rPr>
-          <w:rFonts w:ascii="Times New Roman" w:hAnsi="Times New Roman"/>
-          <w:b w:val="0"/>
-          <w:sz w:val="24"/>
-        </w:rPr>
-        <w:t>vi</w:t>
-      </w:r>
-    </w:p>
-    <w:p>
-      <w:pPr>
-        <w:keepLines/>
-        <w:tabs>
-          <w:tab w:pos="8271" w:val="right" w:leader="dot"/>
-        </w:tabs>
-        <w:spacing w:line="360" w:lineRule="auto" w:before="0" w:after="80"/>
-        <w:ind w:left="0"/>
-      </w:pPr>
-      <w:r>
-        <w:rPr>
-          <w:rFonts w:ascii="Times New Roman" w:hAnsi="Times New Roman"/>
-          <w:b w:val="0"/>
-          <w:sz w:val="24"/>
-        </w:rPr>
-        <w:t>LISTA DE CUADROS</w:t>
-        <w:tab/>
-      </w:r>
-      <w:r>
-        <w:rPr>
-          <w:rFonts w:ascii="Times New Roman" w:hAnsi="Times New Roman"/>
-          <w:b w:val="0"/>
-          <w:sz w:val="24"/>
-        </w:rPr>
-        <w:t>ix</w:t>
-      </w:r>
-    </w:p>
-    <w:p>
-      <w:pPr>
-        <w:keepLines/>
-        <w:tabs>
-          <w:tab w:pos="8271" w:val="right" w:leader="dot"/>
-        </w:tabs>
-        <w:spacing w:line="360" w:lineRule="auto" w:before="0" w:after="80"/>
-        <w:ind w:left="0"/>
-      </w:pPr>
-      <w:r>
-        <w:rPr>
-          <w:rFonts w:ascii="Times New Roman" w:hAnsi="Times New Roman"/>
-          <w:b w:val="0"/>
-          <w:sz w:val="24"/>
-        </w:rPr>
-        <w:t>LISTA DE GRÁFICOS</w:t>
-        <w:tab/>
-      </w:r>
-      <w:r>
-        <w:rPr>
-          <w:rFonts w:ascii="Times New Roman" w:hAnsi="Times New Roman"/>
-          <w:b w:val="0"/>
-          <w:sz w:val="24"/>
-        </w:rPr>
-        <w:t>x</w:t>
-      </w:r>
-    </w:p>
-    <w:p>
-      <w:pPr>
-        <w:keepLines/>
-        <w:tabs>
-          <w:tab w:pos="8271" w:val="right" w:leader="dot"/>
-        </w:tabs>
-        <w:spacing w:line="360" w:lineRule="auto" w:before="0" w:after="80"/>
-        <w:ind w:left="0"/>
-      </w:pPr>
-      <w:r>
-        <w:rPr>
-          <w:rFonts w:ascii="Times New Roman" w:hAnsi="Times New Roman"/>
-          <w:b w:val="0"/>
-          <w:sz w:val="24"/>
-        </w:rPr>
-        <w:t>LISTA DE ANEXOS</w:t>
-        <w:tab/>
-      </w:r>
-      <w:r>
-        <w:rPr>
-          <w:rFonts w:ascii="Times New Roman" w:hAnsi="Times New Roman"/>
-          <w:b w:val="0"/>
-          <w:sz w:val="24"/>
-        </w:rPr>
-        <w:t>xi</w:t>
-      </w:r>
-    </w:p>
-    <w:p>
-      <w:pPr>
-        <w:keepLines/>
-        <w:tabs>
-          <w:tab w:pos="8271" w:val="right" w:leader="dot"/>
-        </w:tabs>
-        <w:spacing w:line="360" w:lineRule="auto" w:before="0" w:after="80"/>
-        <w:ind w:left="0"/>
-      </w:pPr>
-      <w:r>
-        <w:rPr>
-          <w:rFonts w:ascii="Times New Roman" w:hAnsi="Times New Roman"/>
-          <w:b w:val="0"/>
-          <w:sz w:val="24"/>
-        </w:rPr>
-        <w:t>RESUMEN</w:t>
-        <w:tab/>
-      </w:r>
-      <w:r>
-        <w:rPr>
-          <w:rFonts w:ascii="Times New Roman" w:hAnsi="Times New Roman"/>
-          <w:b w:val="0"/>
-          <w:sz w:val="24"/>
-        </w:rPr>
-        <w:t>xii</w:t>
-      </w:r>
-    </w:p>
-    <w:p>
-      <w:pPr>
-        <w:keepLines/>
-        <w:tabs>
-          <w:tab w:pos="8271" w:val="right" w:leader="dot"/>
-        </w:tabs>
-        <w:spacing w:line="360" w:lineRule="auto" w:before="0" w:after="80"/>
-        <w:ind w:left="0"/>
-      </w:pPr>
-      <w:r>
-        <w:rPr>
-          <w:rFonts w:ascii="Times New Roman" w:hAnsi="Times New Roman"/>
-          <w:b w:val="0"/>
-          <w:sz w:val="24"/>
-        </w:rPr>
-        <w:t>INTRODUCCIÓN</w:t>
-        <w:tab/>
-      </w:r>
-      <w:r>
-        <w:rPr>
-          <w:rFonts w:ascii="Times New Roman" w:hAnsi="Times New Roman"/>
-          <w:b w:val="0"/>
-          <w:sz w:val="24"/>
-        </w:rPr>
         <w:fldChar w:fldCharType="begin"/>
-        <w:instrText xml:space="preserve"> PAGEREF bm_introduccion \h </w:instrText>
-        <w:fldChar w:fldCharType="separate"/>
-        <w:t>?</w:t>
-        <w:fldChar w:fldCharType="end"/>
-      </w:r>
-    </w:p>
-    <w:p>
-      <w:pPr>
-        <w:keepNext/>
-        <w:keepLines/>
-        <w:spacing w:before="240" w:after="120"/>
-      </w:pPr>
-      <w:r>
-        <w:rPr>
-          <w:b/>
-        </w:rPr>
-        <w:t>CAPÍTULOS</w:t>
-      </w:r>
-    </w:p>
-    <w:p>
-      <w:pPr>
-        <w:keepLines/>
-        <w:tabs>
-          <w:tab w:pos="8271" w:val="right" w:leader="dot"/>
-        </w:tabs>
-        <w:spacing w:line="360" w:lineRule="auto" w:before="0" w:after="80"/>
-        <w:ind w:left="0"/>
-      </w:pPr>
-      <w:r>
-        <w:rPr>
-          <w:rFonts w:ascii="Times New Roman" w:hAnsi="Times New Roman"/>
-          <w:b/>
-          <w:sz w:val="24"/>
-        </w:rPr>
-        <w:t>CAPÍTULO I: REALIDAD ORGANIZACIONAL</w:t>
-        <w:tab/>
-      </w:r>
-      <w:r>
-        <w:rPr>
-          <w:rFonts w:ascii="Times New Roman" w:hAnsi="Times New Roman"/>
-          <w:b/>
-          <w:sz w:val="24"/>
-        </w:rPr>
-        <w:fldChar w:fldCharType="begin"/>
-        <w:instrText xml:space="preserve"> PAGEREF bm_cap1 \h </w:instrText>
-        <w:fldChar w:fldCharType="separate"/>
-        <w:t>?</w:t>
-        <w:fldChar w:fldCharType="end"/>
-      </w:r>
-    </w:p>
-    <w:p>
-      <w:pPr>
-        <w:keepLines/>
-        <w:tabs>
-          <w:tab w:pos="8271" w:val="right" w:leader="dot"/>
-        </w:tabs>
-        <w:spacing w:line="360" w:lineRule="auto" w:before="0" w:after="80"/>
-        <w:ind w:left="283"/>
-      </w:pPr>
-      <w:r>
-        <w:rPr>
-          <w:rFonts w:ascii="Times New Roman" w:hAnsi="Times New Roman"/>
-          <w:b w:val="0"/>
-          <w:sz w:val="24"/>
-        </w:rPr>
-        <w:t>Identificación de la empresa</w:t>
-        <w:tab/>
-      </w:r>
-      <w:r>
-        <w:rPr>
-          <w:rFonts w:ascii="Times New Roman" w:hAnsi="Times New Roman"/>
-          <w:b w:val="0"/>
-          <w:sz w:val="24"/>
-        </w:rPr>
-        <w:fldChar w:fldCharType="begin"/>
-        <w:instrText xml:space="preserve"> PAGEREF bm_cap1_ident \h </w:instrText>
-        <w:fldChar w:fldCharType="separate"/>
-        <w:t>?</w:t>
-        <w:fldChar w:fldCharType="end"/>
-      </w:r>
-    </w:p>
-    <w:p>
-      <w:pPr>
-        <w:keepLines/>
-        <w:tabs>
-          <w:tab w:pos="8271" w:val="right" w:leader="dot"/>
-        </w:tabs>
-        <w:spacing w:line="360" w:lineRule="auto" w:before="0" w:after="80"/>
-        <w:ind w:left="283"/>
-      </w:pPr>
-      <w:r>
-        <w:rPr>
-          <w:rFonts w:ascii="Times New Roman" w:hAnsi="Times New Roman"/>
-          <w:b w:val="0"/>
-          <w:sz w:val="24"/>
-        </w:rPr>
-        <w:t>Reseña histórica</w:t>
-        <w:tab/>
-      </w:r>
-      <w:r>
-        <w:rPr>
-          <w:rFonts w:ascii="Times New Roman" w:hAnsi="Times New Roman"/>
-          <w:b w:val="0"/>
-          <w:sz w:val="24"/>
-        </w:rPr>
-        <w:fldChar w:fldCharType="begin"/>
-        <w:instrText xml:space="preserve"> PAGEREF bm_cap1_resena \h </w:instrText>
-        <w:fldChar w:fldCharType="separate"/>
-        <w:t>?</w:t>
-        <w:fldChar w:fldCharType="end"/>
-      </w:r>
-    </w:p>
-    <w:p>
-      <w:pPr>
-        <w:keepLines/>
-        <w:tabs>
-          <w:tab w:pos="8271" w:val="right" w:leader="dot"/>
-        </w:tabs>
-        <w:spacing w:line="360" w:lineRule="auto" w:before="0" w:after="80"/>
-        <w:ind w:left="283"/>
-      </w:pPr>
-      <w:r>
-        <w:rPr>
-          <w:rFonts w:ascii="Times New Roman" w:hAnsi="Times New Roman"/>
-          <w:b w:val="0"/>
-          <w:sz w:val="24"/>
-        </w:rPr>
-        <w:t>Misión</w:t>
-        <w:tab/>
-      </w:r>
-      <w:r>
-        <w:rPr>
-          <w:rFonts w:ascii="Times New Roman" w:hAnsi="Times New Roman"/>
-          <w:b w:val="0"/>
-          <w:sz w:val="24"/>
-        </w:rPr>
-        <w:fldChar w:fldCharType="begin"/>
-        <w:instrText xml:space="preserve"> PAGEREF bm_cap1_mision \h </w:instrText>
-        <w:fldChar w:fldCharType="separate"/>
-        <w:t>?</w:t>
-        <w:fldChar w:fldCharType="end"/>
-      </w:r>
-    </w:p>
-    <w:p>
-      <w:pPr>
-        <w:keepLines/>
-        <w:tabs>
-          <w:tab w:pos="8271" w:val="right" w:leader="dot"/>
-        </w:tabs>
-        <w:spacing w:line="360" w:lineRule="auto" w:before="0" w:after="80"/>
-        <w:ind w:left="283"/>
-      </w:pPr>
-      <w:r>
-        <w:rPr>
-          <w:rFonts w:ascii="Times New Roman" w:hAnsi="Times New Roman"/>
-          <w:b w:val="0"/>
-          <w:sz w:val="24"/>
-        </w:rPr>
-        <w:t>Visión</w:t>
-        <w:tab/>
-      </w:r>
-      <w:r>
-        <w:rPr>
-          <w:rFonts w:ascii="Times New Roman" w:hAnsi="Times New Roman"/>
-          <w:b w:val="0"/>
-          <w:sz w:val="24"/>
-        </w:rPr>
-        <w:fldChar w:fldCharType="begin"/>
-        <w:instrText xml:space="preserve"> PAGEREF bm_cap1_vision \h </w:instrText>
-        <w:fldChar w:fldCharType="separate"/>
-        <w:t>?</w:t>
-        <w:fldChar w:fldCharType="end"/>
-      </w:r>
-    </w:p>
-    <w:p>
-      <w:pPr>
-        <w:keepLines/>
-        <w:tabs>
-          <w:tab w:pos="8271" w:val="right" w:leader="dot"/>
-        </w:tabs>
-        <w:spacing w:line="360" w:lineRule="auto" w:before="0" w:after="80"/>
-        <w:ind w:left="283"/>
-      </w:pPr>
-      <w:r>
-        <w:rPr>
-          <w:rFonts w:ascii="Times New Roman" w:hAnsi="Times New Roman"/>
-          <w:b w:val="0"/>
-          <w:sz w:val="24"/>
-        </w:rPr>
-        <w:t>Valores</w:t>
-        <w:tab/>
-      </w:r>
-      <w:r>
-        <w:rPr>
-          <w:rFonts w:ascii="Times New Roman" w:hAnsi="Times New Roman"/>
-          <w:b w:val="0"/>
-          <w:sz w:val="24"/>
-        </w:rPr>
-        <w:fldChar w:fldCharType="begin"/>
-        <w:instrText xml:space="preserve"> PAGEREF bm_cap1_valores \h </w:instrText>
-        <w:fldChar w:fldCharType="separate"/>
-        <w:t>?</w:t>
-        <w:fldChar w:fldCharType="end"/>
-      </w:r>
-    </w:p>
-    <w:p>
-      <w:pPr>
-        <w:keepLines/>
-        <w:tabs>
-          <w:tab w:pos="8271" w:val="right" w:leader="dot"/>
-        </w:tabs>
-        <w:spacing w:line="360" w:lineRule="auto" w:before="0" w:after="80"/>
-        <w:ind w:left="283"/>
-      </w:pPr>
-      <w:r>
-        <w:rPr>
-          <w:rFonts w:ascii="Times New Roman" w:hAnsi="Times New Roman"/>
-          <w:b w:val="0"/>
-          <w:sz w:val="24"/>
-        </w:rPr>
-        <w:t>Objetivos Organizacionales</w:t>
-        <w:tab/>
-      </w:r>
-      <w:r>
-        <w:rPr>
-          <w:rFonts w:ascii="Times New Roman" w:hAnsi="Times New Roman"/>
-          <w:b w:val="0"/>
-          <w:sz w:val="24"/>
-        </w:rPr>
-        <w:fldChar w:fldCharType="begin"/>
-        <w:instrText xml:space="preserve"> PAGEREF bm_cap1_obj \h </w:instrText>
-        <w:fldChar w:fldCharType="separate"/>
-        <w:t>?</w:t>
-        <w:fldChar w:fldCharType="end"/>
-      </w:r>
-    </w:p>
-    <w:p>
-      <w:pPr>
-        <w:keepLines/>
-        <w:tabs>
-          <w:tab w:pos="8271" w:val="right" w:leader="dot"/>
-        </w:tabs>
-        <w:spacing w:line="360" w:lineRule="auto" w:before="0" w:after="80"/>
-        <w:ind w:left="283"/>
-      </w:pPr>
-      <w:r>
-        <w:rPr>
-          <w:rFonts w:ascii="Times New Roman" w:hAnsi="Times New Roman"/>
-          <w:b w:val="0"/>
-          <w:sz w:val="24"/>
-        </w:rPr>
-        <w:t>Ubicación geográfica</w:t>
-        <w:tab/>
-      </w:r>
-      <w:r>
-        <w:rPr>
-          <w:rFonts w:ascii="Times New Roman" w:hAnsi="Times New Roman"/>
-          <w:b w:val="0"/>
-          <w:sz w:val="24"/>
-        </w:rPr>
-        <w:fldChar w:fldCharType="begin"/>
-        <w:instrText xml:space="preserve"> PAGEREF bm_cap1_ubic \h </w:instrText>
-        <w:fldChar w:fldCharType="separate"/>
-        <w:t>?</w:t>
-        <w:fldChar w:fldCharType="end"/>
-      </w:r>
-    </w:p>
-    <w:p>
-      <w:pPr>
-        <w:keepLines/>
-        <w:tabs>
-          <w:tab w:pos="8271" w:val="right" w:leader="dot"/>
-        </w:tabs>
-        <w:spacing w:line="360" w:lineRule="auto" w:before="0" w:after="80"/>
-        <w:ind w:left="283"/>
-      </w:pPr>
-      <w:r>
-        <w:rPr>
-          <w:rFonts w:ascii="Times New Roman" w:hAnsi="Times New Roman"/>
-          <w:b w:val="0"/>
-          <w:sz w:val="24"/>
-        </w:rPr>
-        <w:t>Población de los trabajadores de la empresa</w:t>
-        <w:tab/>
-      </w:r>
-      <w:r>
-        <w:rPr>
-          <w:rFonts w:ascii="Times New Roman" w:hAnsi="Times New Roman"/>
-          <w:b w:val="0"/>
-          <w:sz w:val="24"/>
-        </w:rPr>
-        <w:fldChar w:fldCharType="begin"/>
-        <w:instrText xml:space="preserve"> PAGEREF bm_cap1_pobla \h </w:instrText>
-        <w:fldChar w:fldCharType="separate"/>
-        <w:t>?</w:t>
-        <w:fldChar w:fldCharType="end"/>
-      </w:r>
-    </w:p>
-    <w:p>
-      <w:pPr>
-        <w:keepLines/>
-        <w:tabs>
-          <w:tab w:pos="8271" w:val="right" w:leader="dot"/>
-        </w:tabs>
-        <w:spacing w:line="360" w:lineRule="auto" w:before="0" w:after="80"/>
-        <w:ind w:left="283"/>
-      </w:pPr>
-      <w:r>
-        <w:rPr>
-          <w:rFonts w:ascii="Times New Roman" w:hAnsi="Times New Roman"/>
-          <w:b w:val="0"/>
-          <w:sz w:val="24"/>
-        </w:rPr>
-        <w:t>Estructura organizativa de la empresa (Organigrama)</w:t>
-        <w:tab/>
-      </w:r>
-      <w:r>
-        <w:rPr>
-          <w:rFonts w:ascii="Times New Roman" w:hAnsi="Times New Roman"/>
-          <w:b w:val="0"/>
-          <w:sz w:val="24"/>
-        </w:rPr>
-        <w:fldChar w:fldCharType="begin"/>
-        <w:instrText xml:space="preserve"> PAGEREF bm_cap1_estruct \h </w:instrText>
-        <w:fldChar w:fldCharType="separate"/>
-        <w:t>?</w:t>
-        <w:fldChar w:fldCharType="end"/>
-      </w:r>
-    </w:p>
-    <w:p>
-      <w:pPr>
-        <w:keepLines/>
-        <w:tabs>
-          <w:tab w:pos="8271" w:val="right" w:leader="dot"/>
-        </w:tabs>
-        <w:spacing w:line="360" w:lineRule="auto" w:before="0" w:after="80"/>
-        <w:ind w:left="283"/>
-      </w:pPr>
-      <w:r>
-        <w:rPr>
-          <w:rFonts w:ascii="Times New Roman" w:hAnsi="Times New Roman"/>
-          <w:b w:val="0"/>
-          <w:sz w:val="24"/>
-        </w:rPr>
-        <w:t>Descripción del departamento donde realizó la pasantía</w:t>
-        <w:tab/>
-      </w:r>
-      <w:r>
-        <w:rPr>
-          <w:rFonts w:ascii="Times New Roman" w:hAnsi="Times New Roman"/>
-          <w:b w:val="0"/>
-          <w:sz w:val="24"/>
-        </w:rPr>
-        <w:fldChar w:fldCharType="begin"/>
-        <w:instrText xml:space="preserve"> PAGEREF bm_cap1_departamento \h </w:instrText>
-        <w:fldChar w:fldCharType="separate"/>
-        <w:t>?</w:t>
-        <w:fldChar w:fldCharType="end"/>
-      </w:r>
-    </w:p>
-    <w:p>
-      <w:pPr>
-        <w:keepLines/>
-        <w:tabs>
-          <w:tab w:pos="8271" w:val="right" w:leader="dot"/>
-        </w:tabs>
-        <w:spacing w:line="360" w:lineRule="auto" w:before="0" w:after="80"/>
-        <w:ind w:left="0"/>
-      </w:pPr>
-      <w:r>
-        <w:rPr>
-          <w:rFonts w:ascii="Times New Roman" w:hAnsi="Times New Roman"/>
-          <w:b/>
-          <w:sz w:val="24"/>
-        </w:rPr>
-        <w:t>CAPÍTULO II: DIAGNÓSTICO SITUACIONAL</w:t>
-        <w:tab/>
-      </w:r>
-      <w:r>
-        <w:rPr>
-          <w:rFonts w:ascii="Times New Roman" w:hAnsi="Times New Roman"/>
-          <w:b/>
-          <w:sz w:val="24"/>
-        </w:rPr>
-        <w:fldChar w:fldCharType="begin"/>
-        <w:instrText xml:space="preserve"> PAGEREF bm_cap2 \h </w:instrText>
-        <w:fldChar w:fldCharType="separate"/>
-        <w:t>?</w:t>
-        <w:fldChar w:fldCharType="end"/>
-      </w:r>
-    </w:p>
-    <w:p>
-      <w:pPr>
-        <w:keepLines/>
-        <w:tabs>
-          <w:tab w:pos="8271" w:val="right" w:leader="dot"/>
-        </w:tabs>
-        <w:spacing w:line="360" w:lineRule="auto" w:before="0" w:after="80"/>
-        <w:ind w:left="283"/>
-      </w:pPr>
-      <w:r>
-        <w:rPr>
-          <w:rFonts w:ascii="Times New Roman" w:hAnsi="Times New Roman"/>
-          <w:b w:val="0"/>
-          <w:sz w:val="24"/>
-        </w:rPr>
-        <w:t>Identificación de la situación problemática</w:t>
-        <w:tab/>
-      </w:r>
-      <w:r>
-        <w:rPr>
-          <w:rFonts w:ascii="Times New Roman" w:hAnsi="Times New Roman"/>
-          <w:b w:val="0"/>
-          <w:sz w:val="24"/>
-        </w:rPr>
-        <w:fldChar w:fldCharType="begin"/>
-        <w:instrText xml:space="preserve"> PAGEREF bm_cap2_sit \h </w:instrText>
-        <w:fldChar w:fldCharType="separate"/>
-        <w:t>?</w:t>
-        <w:fldChar w:fldCharType="end"/>
-      </w:r>
-    </w:p>
-    <w:p>
-      <w:pPr>
-        <w:keepLines/>
-        <w:tabs>
-          <w:tab w:pos="8271" w:val="right" w:leader="dot"/>
-        </w:tabs>
-        <w:spacing w:line="360" w:lineRule="auto" w:before="0" w:after="80"/>
-        <w:ind w:left="283"/>
-      </w:pPr>
-      <w:r>
-        <w:rPr>
-          <w:rFonts w:ascii="Times New Roman" w:hAnsi="Times New Roman"/>
-          <w:b w:val="0"/>
-          <w:sz w:val="24"/>
-        </w:rPr>
-        <w:t>Objetivo General</w:t>
-        <w:tab/>
-      </w:r>
-      <w:r>
-        <w:rPr>
-          <w:rFonts w:ascii="Times New Roman" w:hAnsi="Times New Roman"/>
-          <w:b w:val="0"/>
-          <w:sz w:val="24"/>
-        </w:rPr>
-        <w:fldChar w:fldCharType="begin"/>
-        <w:instrText xml:space="preserve"> PAGEREF bm_cap2_objg \h </w:instrText>
-        <w:fldChar w:fldCharType="separate"/>
-        <w:t>?</w:t>
-        <w:fldChar w:fldCharType="end"/>
-      </w:r>
-    </w:p>
-    <w:p>
-      <w:pPr>
-        <w:keepLines/>
-        <w:tabs>
-          <w:tab w:pos="8271" w:val="right" w:leader="dot"/>
-        </w:tabs>
-        <w:spacing w:line="360" w:lineRule="auto" w:before="0" w:after="80"/>
-        <w:ind w:left="283"/>
-      </w:pPr>
-      <w:r>
-        <w:rPr>
-          <w:rFonts w:ascii="Times New Roman" w:hAnsi="Times New Roman"/>
-          <w:b w:val="0"/>
-          <w:sz w:val="24"/>
-        </w:rPr>
-        <w:t>Objetivos Específicos</w:t>
-        <w:tab/>
-      </w:r>
-      <w:r>
-        <w:rPr>
-          <w:rFonts w:ascii="Times New Roman" w:hAnsi="Times New Roman"/>
-          <w:b w:val="0"/>
-          <w:sz w:val="24"/>
-        </w:rPr>
-        <w:fldChar w:fldCharType="begin"/>
-        <w:instrText xml:space="preserve"> PAGEREF bm_cap2_obje \h </w:instrText>
-        <w:fldChar w:fldCharType="separate"/>
-        <w:t>?</w:t>
-        <w:fldChar w:fldCharType="end"/>
-      </w:r>
-    </w:p>
-    <w:p>
-      <w:pPr>
-        <w:keepLines/>
-        <w:tabs>
-          <w:tab w:pos="8271" w:val="right" w:leader="dot"/>
-        </w:tabs>
-        <w:spacing w:line="360" w:lineRule="auto" w:before="0" w:after="80"/>
-        <w:ind w:left="283"/>
-      </w:pPr>
-      <w:r>
-        <w:rPr>
-          <w:rFonts w:ascii="Times New Roman" w:hAnsi="Times New Roman"/>
-          <w:b w:val="0"/>
-          <w:sz w:val="24"/>
-        </w:rPr>
-        <w:t>Planificación integral de objetivos</w:t>
-        <w:tab/>
-      </w:r>
-      <w:r>
-        <w:rPr>
-          <w:rFonts w:ascii="Times New Roman" w:hAnsi="Times New Roman"/>
-          <w:b w:val="0"/>
-          <w:sz w:val="24"/>
-        </w:rPr>
-        <w:fldChar w:fldCharType="begin"/>
-        <w:instrText xml:space="preserve"> PAGEREF bm_cap2_planif \h </w:instrText>
-        <w:fldChar w:fldCharType="separate"/>
-        <w:t>?</w:t>
-        <w:fldChar w:fldCharType="end"/>
-      </w:r>
-    </w:p>
-    <w:p>
-      <w:pPr>
-        <w:keepLines/>
-        <w:tabs>
-          <w:tab w:pos="8271" w:val="right" w:leader="dot"/>
-        </w:tabs>
-        <w:spacing w:line="360" w:lineRule="auto" w:before="0" w:after="80"/>
-        <w:ind w:left="283"/>
-      </w:pPr>
-      <w:r>
-        <w:rPr>
-          <w:rFonts w:ascii="Times New Roman" w:hAnsi="Times New Roman"/>
-          <w:b w:val="0"/>
-          <w:sz w:val="24"/>
-        </w:rPr>
-        <w:t>CRONOGRAMA DE ACTIVIDADES (DIAGRAMA DE GANTT)</w:t>
-        <w:tab/>
-      </w:r>
-      <w:r>
-        <w:rPr>
-          <w:rFonts w:ascii="Times New Roman" w:hAnsi="Times New Roman"/>
-          <w:b w:val="0"/>
-          <w:sz w:val="24"/>
-        </w:rPr>
-        <w:fldChar w:fldCharType="begin"/>
-        <w:instrText xml:space="preserve"> PAGEREF bm_cap2_crono \h </w:instrText>
-        <w:fldChar w:fldCharType="separate"/>
-        <w:t>?</w:t>
-        <w:fldChar w:fldCharType="end"/>
-      </w:r>
-    </w:p>
-    <w:p>
-      <w:pPr>
-        <w:keepLines/>
-        <w:tabs>
-          <w:tab w:pos="8271" w:val="right" w:leader="dot"/>
-        </w:tabs>
-        <w:spacing w:line="360" w:lineRule="auto" w:before="0" w:after="80"/>
-        <w:ind w:left="0"/>
-      </w:pPr>
-      <w:r>
-        <w:rPr>
-          <w:rFonts w:ascii="Times New Roman" w:hAnsi="Times New Roman"/>
-          <w:b/>
-          <w:sz w:val="24"/>
-        </w:rPr>
-        <w:t>CAPÍTULO III: MARCO TEÓRICO</w:t>
-        <w:tab/>
-      </w:r>
-      <w:r>
-        <w:rPr>
-          <w:rFonts w:ascii="Times New Roman" w:hAnsi="Times New Roman"/>
-          <w:b/>
-          <w:sz w:val="24"/>
-        </w:rPr>
-        <w:fldChar w:fldCharType="begin"/>
-        <w:instrText xml:space="preserve"> PAGEREF bm_cap3 \h </w:instrText>
-        <w:fldChar w:fldCharType="separate"/>
-        <w:t>?</w:t>
-        <w:fldChar w:fldCharType="end"/>
-      </w:r>
-    </w:p>
-    <w:p>
-      <w:pPr>
-        <w:keepLines/>
-        <w:tabs>
-          <w:tab w:pos="8271" w:val="right" w:leader="dot"/>
-        </w:tabs>
-        <w:spacing w:line="360" w:lineRule="auto" w:before="0" w:after="80"/>
-        <w:ind w:left="283"/>
-      </w:pPr>
-      <w:r>
-        <w:rPr>
-          <w:rFonts w:ascii="Times New Roman" w:hAnsi="Times New Roman"/>
-          <w:b w:val="0"/>
-          <w:sz w:val="24"/>
-        </w:rPr>
-        <w:t>Bases teóricas referenciales</w:t>
-        <w:tab/>
-      </w:r>
-      <w:r>
-        <w:rPr>
-          <w:rFonts w:ascii="Times New Roman" w:hAnsi="Times New Roman"/>
-          <w:b w:val="0"/>
-          <w:sz w:val="24"/>
-        </w:rPr>
-        <w:fldChar w:fldCharType="begin"/>
-        <w:instrText xml:space="preserve"> PAGEREF bm_cap3_bases \h </w:instrText>
-        <w:fldChar w:fldCharType="separate"/>
-        <w:t>?</w:t>
-        <w:fldChar w:fldCharType="end"/>
-      </w:r>
-    </w:p>
-    <w:p>
-      <w:pPr>
-        <w:keepLines/>
-        <w:tabs>
-          <w:tab w:pos="8271" w:val="right" w:leader="dot"/>
-        </w:tabs>
-        <w:spacing w:line="360" w:lineRule="auto" w:before="0" w:after="80"/>
-        <w:ind w:left="0"/>
-      </w:pPr>
-      <w:r>
-        <w:rPr>
-          <w:rFonts w:ascii="Times New Roman" w:hAnsi="Times New Roman"/>
-          <w:b/>
-          <w:sz w:val="24"/>
-        </w:rPr>
-        <w:t>CAPÍTULO IV: ACTIVIDADES REALIZADAS</w:t>
-        <w:tab/>
-      </w:r>
-      <w:r>
-        <w:rPr>
-          <w:rFonts w:ascii="Times New Roman" w:hAnsi="Times New Roman"/>
-          <w:b/>
-          <w:sz w:val="24"/>
-        </w:rPr>
-        <w:fldChar w:fldCharType="begin"/>
-        <w:instrText xml:space="preserve"> PAGEREF bm_cap4 \h </w:instrText>
-        <w:fldChar w:fldCharType="separate"/>
-        <w:t>?</w:t>
-        <w:fldChar w:fldCharType="end"/>
-      </w:r>
-    </w:p>
-    <w:p>
-      <w:pPr>
-        <w:keepLines/>
-        <w:tabs>
-          <w:tab w:pos="8271" w:val="right" w:leader="dot"/>
-        </w:tabs>
-        <w:spacing w:line="360" w:lineRule="auto" w:before="0" w:after="80"/>
-        <w:ind w:left="283"/>
-      </w:pPr>
-      <w:r>
-        <w:rPr>
-          <w:rFonts w:ascii="Times New Roman" w:hAnsi="Times New Roman"/>
-          <w:b w:val="0"/>
-          <w:sz w:val="24"/>
-        </w:rPr>
-        <w:t>Descripción de actividades ejecutadas por semana</w:t>
-        <w:tab/>
-      </w:r>
-      <w:r>
-        <w:rPr>
-          <w:rFonts w:ascii="Times New Roman" w:hAnsi="Times New Roman"/>
-          <w:b w:val="0"/>
-          <w:sz w:val="24"/>
-        </w:rPr>
-        <w:fldChar w:fldCharType="begin"/>
-        <w:instrText xml:space="preserve"> PAGEREF bm_cap4_desc \h </w:instrText>
-        <w:fldChar w:fldCharType="separate"/>
-        <w:t>?</w:t>
-        <w:fldChar w:fldCharType="end"/>
-      </w:r>
-    </w:p>
-    <w:p>
-      <w:pPr>
-        <w:keepLines/>
-        <w:tabs>
-          <w:tab w:pos="8271" w:val="right" w:leader="dot"/>
-        </w:tabs>
-        <w:spacing w:line="360" w:lineRule="auto" w:before="0" w:after="80"/>
-        <w:ind w:left="0"/>
-      </w:pPr>
-      <w:r>
-        <w:rPr>
-          <w:rFonts w:ascii="Times New Roman" w:hAnsi="Times New Roman"/>
-          <w:b/>
-          <w:sz w:val="24"/>
-        </w:rPr>
-        <w:t>CAPÍTULO V: CONCLUSIONES Y RECOMENDACIONES</w:t>
-        <w:tab/>
-      </w:r>
-      <w:r>
-        <w:rPr>
-          <w:rFonts w:ascii="Times New Roman" w:hAnsi="Times New Roman"/>
-          <w:b/>
-          <w:sz w:val="24"/>
-        </w:rPr>
-        <w:fldChar w:fldCharType="begin"/>
-        <w:instrText xml:space="preserve"> PAGEREF bm_cap5 \h </w:instrText>
-        <w:fldChar w:fldCharType="separate"/>
-        <w:t>?</w:t>
-        <w:fldChar w:fldCharType="end"/>
-      </w:r>
-    </w:p>
-    <w:p>
-      <w:pPr>
-        <w:keepLines/>
-        <w:tabs>
-          <w:tab w:pos="8271" w:val="right" w:leader="dot"/>
-        </w:tabs>
-        <w:spacing w:line="360" w:lineRule="auto" w:before="0" w:after="80"/>
-        <w:ind w:left="283"/>
-      </w:pPr>
-      <w:r>
-        <w:rPr>
-          <w:rFonts w:ascii="Times New Roman" w:hAnsi="Times New Roman"/>
-          <w:b w:val="0"/>
-          <w:sz w:val="24"/>
-        </w:rPr>
-        <w:t>Conclusiones</w:t>
-        <w:tab/>
-      </w:r>
-      <w:r>
-        <w:rPr>
-          <w:rFonts w:ascii="Times New Roman" w:hAnsi="Times New Roman"/>
-          <w:b w:val="0"/>
-          <w:sz w:val="24"/>
-        </w:rPr>
-        <w:fldChar w:fldCharType="begin"/>
-        <w:instrText xml:space="preserve"> PAGEREF bm_cap5_concl \h </w:instrText>
-        <w:fldChar w:fldCharType="separate"/>
-        <w:t>?</w:t>
-        <w:fldChar w:fldCharType="end"/>
-      </w:r>
-    </w:p>
-    <w:p>
-      <w:pPr>
-        <w:keepLines/>
-        <w:tabs>
-          <w:tab w:pos="8271" w:val="right" w:leader="dot"/>
-        </w:tabs>
-        <w:spacing w:line="360" w:lineRule="auto" w:before="0" w:after="80"/>
-        <w:ind w:left="283"/>
-      </w:pPr>
-      <w:r>
-        <w:rPr>
-          <w:rFonts w:ascii="Times New Roman" w:hAnsi="Times New Roman"/>
-          <w:b w:val="0"/>
-          <w:sz w:val="24"/>
-        </w:rPr>
-        <w:t>Recomendaciones</w:t>
-        <w:tab/>
-      </w:r>
-      <w:r>
-        <w:rPr>
-          <w:rFonts w:ascii="Times New Roman" w:hAnsi="Times New Roman"/>
-          <w:b w:val="0"/>
-          <w:sz w:val="24"/>
-        </w:rPr>
-        <w:fldChar w:fldCharType="begin"/>
-        <w:instrText xml:space="preserve"> PAGEREF bm_cap5_recom \h </w:instrText>
-        <w:fldChar w:fldCharType="separate"/>
-        <w:t>?</w:t>
-        <w:fldChar w:fldCharType="end"/>
-      </w:r>
-    </w:p>
-    <w:p>
-      <w:pPr>
-        <w:keepLines/>
-        <w:tabs>
-          <w:tab w:pos="8271" w:val="right" w:leader="dot"/>
-        </w:tabs>
-        <w:spacing w:line="360" w:lineRule="auto" w:before="0" w:after="80"/>
-        <w:ind w:left="0"/>
-      </w:pPr>
-      <w:r>
-        <w:rPr>
-          <w:rFonts w:ascii="Times New Roman" w:hAnsi="Times New Roman"/>
-          <w:b/>
-          <w:sz w:val="24"/>
-        </w:rPr>
-        <w:t>REFERENCIAS</w:t>
-        <w:tab/>
-      </w:r>
-      <w:r>
-        <w:rPr>
-          <w:rFonts w:ascii="Times New Roman" w:hAnsi="Times New Roman"/>
-          <w:b/>
-          <w:sz w:val="24"/>
-        </w:rPr>
-        <w:fldChar w:fldCharType="begin"/>
-        <w:instrText xml:space="preserve"> PAGEREF bm_referencias \h </w:instrText>
-        <w:fldChar w:fldCharType="separate"/>
-        <w:t>?</w:t>
-        <w:fldChar w:fldCharType="end"/>
-      </w:r>
-    </w:p>
-    <w:p>
-      <w:pPr>
-        <w:keepLines/>
-        <w:tabs>
-          <w:tab w:pos="8271" w:val="right" w:leader="dot"/>
-        </w:tabs>
-        <w:spacing w:line="360" w:lineRule="auto" w:before="0" w:after="80"/>
-        <w:ind w:left="0"/>
-      </w:pPr>
-      <w:r>
-        <w:rPr>
-          <w:rFonts w:ascii="Times New Roman" w:hAnsi="Times New Roman"/>
-          <w:b/>
-          <w:sz w:val="24"/>
-        </w:rPr>
-        <w:t>ANEXOS</w:t>
-        <w:tab/>
-      </w:r>
-      <w:r>
-        <w:rPr>
-          <w:rFonts w:ascii="Times New Roman" w:hAnsi="Times New Roman"/>
-          <w:b/>
-          <w:sz w:val="24"/>
-        </w:rPr>
-        <w:fldChar w:fldCharType="begin"/>
-        <w:instrText xml:space="preserve"> PAGEREF bm_anexos \h </w:instrText>
+        <w:instrText xml:space="preserve"> PAGEREF bm_cuadro3 \h </w:instrText>
         <w:fldChar w:fldCharType="separate"/>
         <w:t>?</w:t>
         <w:fldChar w:fldCharType="end"/>
@@ -2126,7 +2285,7 @@
       </w:pPr>
     </w:p>
     <w:p>
-      <w:bookmarkStart w:id="6" w:name="bm_lista_cuadros"/>
+      <w:bookmarkStart w:id="7" w:name="bm_lista_graficos"/>
       <w:pPr>
         <w:pStyle w:val="IUTECPPreliminar"/>
         <w:keepNext/>
@@ -2140,9 +2299,9 @@
           <w:b/>
           <w:sz w:val="24"/>
         </w:rPr>
-        <w:t>LISTA DE CUADROS</w:t>
-      </w:r>
-      <w:bookmarkEnd w:id="6"/>
+        <w:t>LISTA DE GRÁFICOS</w:t>
+      </w:r>
+      <w:bookmarkEnd w:id="7"/>
     </w:p>
     <w:p>
       <w:pPr>
@@ -2159,7 +2318,7 @@
           <w:b/>
           <w:sz w:val="24"/>
         </w:rPr>
-        <w:t>CUADRO</w:t>
+        <w:t>GRÁFICO</w:t>
       </w:r>
       <w:r>
         <w:tab/>
@@ -2190,7 +2349,7 @@
         </w:rPr>
         <w:t>1</w:t>
         <w:tab/>
-        <w:t>Población de los trabajadores de la empresa</w:t>
+        <w:t>Logotipo de Ingeniería de Telecomunicaciones, C.A.</w:t>
         <w:tab/>
       </w:r>
       <w:r>
@@ -2200,7 +2359,7 @@
           <w:sz w:val="24"/>
         </w:rPr>
         <w:fldChar w:fldCharType="begin"/>
-        <w:instrText xml:space="preserve"> PAGEREF bm_cuadro1 \h </w:instrText>
+        <w:instrText xml:space="preserve"> PAGEREF bm_grafico1 \h </w:instrText>
         <w:fldChar w:fldCharType="separate"/>
         <w:t>?</w:t>
         <w:fldChar w:fldCharType="end"/>
@@ -2223,7 +2382,7 @@
         </w:rPr>
         <w:t>2</w:t>
         <w:tab/>
-        <w:t>Planificación integral de objetivos específicos</w:t>
+        <w:t>Representación cartográfica y ubicación espacial de Ingeniería de Telecomunicaciones, C.A.</w:t>
         <w:tab/>
       </w:r>
       <w:r>
@@ -2233,7 +2392,7 @@
           <w:sz w:val="24"/>
         </w:rPr>
         <w:fldChar w:fldCharType="begin"/>
-        <w:instrText xml:space="preserve"> PAGEREF bm_cuadro2 \h </w:instrText>
+        <w:instrText xml:space="preserve"> PAGEREF bm_grafico2 \h </w:instrText>
         <w:fldChar w:fldCharType="separate"/>
         <w:t>?</w:t>
         <w:fldChar w:fldCharType="end"/>
@@ -2256,7 +2415,7 @@
         </w:rPr>
         <w:t>3</w:t>
         <w:tab/>
-        <w:t>Cronograma de actividades de la pasantía</w:t>
+        <w:t>Organigrama estructural y niveles jerárquicos de Ingeniería de Telecomunicaciones, C.A.</w:t>
         <w:tab/>
       </w:r>
       <w:r>
@@ -2266,7 +2425,40 @@
           <w:sz w:val="24"/>
         </w:rPr>
         <w:fldChar w:fldCharType="begin"/>
-        <w:instrText xml:space="preserve"> PAGEREF bm_cuadro3 \h </w:instrText>
+        <w:instrText xml:space="preserve"> PAGEREF bm_grafico3 \h </w:instrText>
+        <w:fldChar w:fldCharType="separate"/>
+        <w:t>?</w:t>
+        <w:fldChar w:fldCharType="end"/>
+      </w:r>
+    </w:p>
+    <w:p>
+      <w:pPr>
+        <w:keepLines/>
+        <w:tabs>
+          <w:tab w:pos="1020" w:val="left"/>
+          <w:tab w:pos="8271" w:val="right" w:leader="dot"/>
+        </w:tabs>
+        <w:spacing w:line="360" w:lineRule="auto" w:before="0" w:after="80"/>
+        <w:ind w:left="1020" w:hanging="1020"/>
+      </w:pPr>
+      <w:r>
+        <w:rPr>
+          <w:rFonts w:ascii="Times New Roman" w:hAnsi="Times New Roman"/>
+          <w:sz w:val="24"/>
+        </w:rPr>
+        <w:t>4</w:t>
+        <w:tab/>
+        <w:t>Organigrama del Departamento de Administración.</w:t>
+        <w:tab/>
+      </w:r>
+      <w:r>
+        <w:rPr>
+          <w:rFonts w:ascii="Times New Roman" w:hAnsi="Times New Roman"/>
+          <w:b w:val="0"/>
+          <w:sz w:val="24"/>
+        </w:rPr>
+        <w:fldChar w:fldCharType="begin"/>
+        <w:instrText xml:space="preserve"> PAGEREF bm_grafico4 \h </w:instrText>
         <w:fldChar w:fldCharType="separate"/>
         <w:t>?</w:t>
         <w:fldChar w:fldCharType="end"/>
@@ -2285,7 +2477,7 @@
       </w:pPr>
     </w:p>
     <w:p>
-      <w:bookmarkStart w:id="7" w:name="bm_lista_graficos"/>
+      <w:bookmarkStart w:id="8" w:name="bm_lista_anexos"/>
       <w:pPr>
         <w:pStyle w:val="IUTECPPreliminar"/>
         <w:keepNext/>
@@ -2299,9 +2491,9 @@
           <w:b/>
           <w:sz w:val="24"/>
         </w:rPr>
-        <w:t>LISTA DE GRÁFICOS</w:t>
-      </w:r>
-      <w:bookmarkEnd w:id="7"/>
+        <w:t>LISTA DE ANEXOS</w:t>
+      </w:r>
+      <w:bookmarkEnd w:id="8"/>
     </w:p>
     <w:p>
       <w:pPr>
@@ -2318,7 +2510,7 @@
           <w:b/>
           <w:sz w:val="24"/>
         </w:rPr>
-        <w:t>GRÁFICO</w:t>
+        <w:t>ANEXOS</w:t>
       </w:r>
       <w:r>
         <w:tab/>
@@ -2347,9 +2539,9 @@
           <w:rFonts w:ascii="Times New Roman" w:hAnsi="Times New Roman"/>
           <w:sz w:val="24"/>
         </w:rPr>
-        <w:t>1</w:t>
+        <w:t>A</w:t>
         <w:tab/>
-        <w:t>Logotipo de Ingeniería de Telecomunicaciones, C.A.</w:t>
+        <w:t>Flujograma del proceso propuesto de gestión de solicitudes de servicios</w:t>
         <w:tab/>
       </w:r>
       <w:r>
@@ -2359,7 +2551,7 @@
           <w:sz w:val="24"/>
         </w:rPr>
         <w:fldChar w:fldCharType="begin"/>
-        <w:instrText xml:space="preserve"> PAGEREF bm_grafico1 \h </w:instrText>
+        <w:instrText xml:space="preserve"> PAGEREF bm_anexoA \h </w:instrText>
         <w:fldChar w:fldCharType="separate"/>
         <w:t>?</w:t>
         <w:fldChar w:fldCharType="end"/>
@@ -2380,9 +2572,9 @@
           <w:rFonts w:ascii="Times New Roman" w:hAnsi="Times New Roman"/>
           <w:sz w:val="24"/>
         </w:rPr>
-        <w:t>2</w:t>
+        <w:t>B</w:t>
         <w:tab/>
-        <w:t>Representación cartográfica y ubicación espacial de Ingeniería de Telecomunicaciones, C.A.</w:t>
+        <w:t>Diagrama de Ishikawa definitivo del control y trazabilidad de las solicitudes de servicio</w:t>
         <w:tab/>
       </w:r>
       <w:r>
@@ -2392,7 +2584,7 @@
           <w:sz w:val="24"/>
         </w:rPr>
         <w:fldChar w:fldCharType="begin"/>
-        <w:instrText xml:space="preserve"> PAGEREF bm_grafico2 \h </w:instrText>
+        <w:instrText xml:space="preserve"> PAGEREF bm_anexoB \h </w:instrText>
         <w:fldChar w:fldCharType="separate"/>
         <w:t>?</w:t>
         <w:fldChar w:fldCharType="end"/>
@@ -2413,9 +2605,9 @@
           <w:rFonts w:ascii="Times New Roman" w:hAnsi="Times New Roman"/>
           <w:sz w:val="24"/>
         </w:rPr>
-        <w:t>3</w:t>
+        <w:t>C</w:t>
         <w:tab/>
-        <w:t>Organigrama estructural y niveles jerárquicos de Ingeniería de Telecomunicaciones, C.A.</w:t>
+        <w:t>Flujograma AS-IS de afiliaciones e incidencias</w:t>
         <w:tab/>
       </w:r>
       <w:r>
@@ -2425,7 +2617,7 @@
           <w:sz w:val="24"/>
         </w:rPr>
         <w:fldChar w:fldCharType="begin"/>
-        <w:instrText xml:space="preserve"> PAGEREF bm_grafico3 \h </w:instrText>
+        <w:instrText xml:space="preserve"> PAGEREF bm_anexoC \h </w:instrText>
         <w:fldChar w:fldCharType="separate"/>
         <w:t>?</w:t>
         <w:fldChar w:fldCharType="end"/>
@@ -2446,9 +2638,9 @@
           <w:rFonts w:ascii="Times New Roman" w:hAnsi="Times New Roman"/>
           <w:sz w:val="24"/>
         </w:rPr>
-        <w:t>4</w:t>
+        <w:t>D</w:t>
         <w:tab/>
-        <w:t>Organigrama del Departamento de Administración.</w:t>
+        <w:t>Swimlane interdepartamental de gestión de solicitudes</w:t>
         <w:tab/>
       </w:r>
       <w:r>
@@ -2458,7 +2650,139 @@
           <w:sz w:val="24"/>
         </w:rPr>
         <w:fldChar w:fldCharType="begin"/>
-        <w:instrText xml:space="preserve"> PAGEREF bm_grafico4 \h </w:instrText>
+        <w:instrText xml:space="preserve"> PAGEREF bm_anexoD \h </w:instrText>
+        <w:fldChar w:fldCharType="separate"/>
+        <w:t>?</w:t>
+        <w:fldChar w:fldCharType="end"/>
+      </w:r>
+    </w:p>
+    <w:p>
+      <w:pPr>
+        <w:keepLines/>
+        <w:tabs>
+          <w:tab w:pos="1020" w:val="left"/>
+          <w:tab w:pos="8271" w:val="right" w:leader="dot"/>
+        </w:tabs>
+        <w:spacing w:line="360" w:lineRule="auto" w:before="0" w:after="80"/>
+        <w:ind w:left="1020" w:hanging="1020"/>
+      </w:pPr>
+      <w:r>
+        <w:rPr>
+          <w:rFonts w:ascii="Times New Roman" w:hAnsi="Times New Roman"/>
+          <w:sz w:val="24"/>
+        </w:rPr>
+        <w:t>E</w:t>
+        <w:tab/>
+        <w:t>Estados de una solicitud de servicio</w:t>
+        <w:tab/>
+      </w:r>
+      <w:r>
+        <w:rPr>
+          <w:rFonts w:ascii="Times New Roman" w:hAnsi="Times New Roman"/>
+          <w:b w:val="0"/>
+          <w:sz w:val="24"/>
+        </w:rPr>
+        <w:fldChar w:fldCharType="begin"/>
+        <w:instrText xml:space="preserve"> PAGEREF bm_anexoE \h </w:instrText>
+        <w:fldChar w:fldCharType="separate"/>
+        <w:t>?</w:t>
+        <w:fldChar w:fldCharType="end"/>
+      </w:r>
+    </w:p>
+    <w:p>
+      <w:pPr>
+        <w:keepLines/>
+        <w:tabs>
+          <w:tab w:pos="1020" w:val="left"/>
+          <w:tab w:pos="8271" w:val="right" w:leader="dot"/>
+        </w:tabs>
+        <w:spacing w:line="360" w:lineRule="auto" w:before="0" w:after="80"/>
+        <w:ind w:left="1020" w:hanging="1020"/>
+      </w:pPr>
+      <w:r>
+        <w:rPr>
+          <w:rFonts w:ascii="Times New Roman" w:hAnsi="Times New Roman"/>
+          <w:sz w:val="24"/>
+        </w:rPr>
+        <w:t>F</w:t>
+        <w:tab/>
+        <w:t>Comunicación interdepartamental</w:t>
+        <w:tab/>
+      </w:r>
+      <w:r>
+        <w:rPr>
+          <w:rFonts w:ascii="Times New Roman" w:hAnsi="Times New Roman"/>
+          <w:b w:val="0"/>
+          <w:sz w:val="24"/>
+        </w:rPr>
+        <w:fldChar w:fldCharType="begin"/>
+        <w:instrText xml:space="preserve"> PAGEREF bm_anexoF \h </w:instrText>
+        <w:fldChar w:fldCharType="separate"/>
+        <w:t>?</w:t>
+        <w:fldChar w:fldCharType="end"/>
+      </w:r>
+    </w:p>
+    <w:p>
+      <w:pPr>
+        <w:keepLines/>
+        <w:tabs>
+          <w:tab w:pos="1020" w:val="left"/>
+          <w:tab w:pos="8271" w:val="right" w:leader="dot"/>
+        </w:tabs>
+        <w:spacing w:line="360" w:lineRule="auto" w:before="0" w:after="80"/>
+        <w:ind w:left="1020" w:hanging="1020"/>
+      </w:pPr>
+      <w:r>
+        <w:rPr>
+          <w:rFonts w:ascii="Times New Roman" w:hAnsi="Times New Roman"/>
+          <w:sz w:val="24"/>
+        </w:rPr>
+        <w:t>G</w:t>
+        <w:tab/>
+        <w:t>Comparación AS-IS y TO-BE del control de solicitudes</w:t>
+        <w:tab/>
+      </w:r>
+      <w:r>
+        <w:rPr>
+          <w:rFonts w:ascii="Times New Roman" w:hAnsi="Times New Roman"/>
+          <w:b w:val="0"/>
+          <w:sz w:val="24"/>
+        </w:rPr>
+        <w:fldChar w:fldCharType="begin"/>
+        <w:instrText xml:space="preserve"> PAGEREF bm_anexoG \h </w:instrText>
+        <w:fldChar w:fldCharType="separate"/>
+        <w:t>?</w:t>
+        <w:fldChar w:fldCharType="end"/>
+      </w:r>
+    </w:p>
+    <w:p>
+      <w:pPr>
+        <w:keepLines/>
+        <w:tabs>
+          <w:tab w:pos="1020" w:val="left"/>
+          <w:tab w:pos="8271" w:val="right" w:leader="dot"/>
+        </w:tabs>
+        <w:spacing w:line="360" w:lineRule="auto" w:before="0" w:after="80"/>
+        <w:ind w:left="1020" w:hanging="1020"/>
+      </w:pPr>
+      <w:r>
+        <w:rPr>
+          <w:rFonts w:ascii="Times New Roman" w:hAnsi="Times New Roman"/>
+          <w:sz w:val="24"/>
+        </w:rPr>
+        <w:t>H</w:t>
+        <w:tab/>
+        <w:t>Memoria fotográfica de las actividades realizadas</w:t>
+        <w:tab/>
+      </w:r>
+      <w:r>
+        <w:rPr>
+          <w:rFonts w:ascii="Times New Roman" w:hAnsi="Times New Roman"/>
+          <w:b w:val="0"/>
+          <w:sz w:val="24"/>
+        </w:rPr>
+        <w:fldChar w:fldCharType="begin"/>
+        <w:instrText xml:space="preserve"> PAGEREF bm_anexoH \h </w:instrText>
         <w:fldChar w:fldCharType="separate"/>
         <w:t>?</w:t>
         <w:fldChar w:fldCharType="end"/>
@@ -2477,12 +2801,8 @@
       </w:pPr>
     </w:p>
     <w:p>
-      <w:bookmarkStart w:id="8" w:name="bm_lista_anexos"/>
-      <w:pPr>
-        <w:pStyle w:val="IUTECPPreliminar"/>
-        <w:keepNext/>
-        <w:keepLines/>
-        <w:spacing w:before="1140" w:after="480"/>
+      <w:pPr>
+        <w:spacing w:line="240" w:lineRule="auto" w:after="0"/>
         <w:jc w:val="center"/>
       </w:pPr>
       <w:r>
@@ -2491,18 +2811,13 @@
           <w:b/>
           <w:sz w:val="24"/>
         </w:rPr>
-        <w:t>LISTA DE ANEXOS</w:t>
-      </w:r>
-      <w:bookmarkEnd w:id="8"/>
+        <w:t>REPÚBLICA BOLIVARIANA DE VENEZUELA</w:t>
+      </w:r>
     </w:p>
     <w:p>
       <w:pPr>
-        <w:keepNext/>
-        <w:keepLines/>
-        <w:tabs>
-          <w:tab w:pos="8271" w:val="right"/>
-        </w:tabs>
-        <w:spacing w:before="240" w:after="240"/>
+        <w:spacing w:line="240" w:lineRule="auto" w:after="0"/>
+        <w:jc w:val="center"/>
       </w:pPr>
       <w:r>
         <w:rPr>
@@ -2510,315 +2825,146 @@
           <w:b/>
           <w:sz w:val="24"/>
         </w:rPr>
-        <w:t>ANEXOS</w:t>
-      </w:r>
-      <w:r>
-        <w:tab/>
-      </w:r>
-      <w:r>
-        <w:rPr>
-          <w:rFonts w:ascii="Times New Roman" w:hAnsi="Times New Roman"/>
-          <w:b/>
-          <w:sz w:val="24"/>
-        </w:rPr>
-        <w:t>pp.</w:t>
+        <w:t>MINISTERIO DEL PODER POPULAR PARA LA EDUCACIÓN UNIVERSITARIA</w:t>
       </w:r>
     </w:p>
     <w:p>
       <w:pPr>
-        <w:keepLines/>
-        <w:tabs>
-          <w:tab w:pos="1020" w:val="left"/>
-          <w:tab w:pos="8271" w:val="right" w:leader="dot"/>
-        </w:tabs>
-        <w:spacing w:line="360" w:lineRule="auto" w:before="0" w:after="80"/>
-        <w:ind w:left="1020" w:hanging="1020"/>
-      </w:pPr>
-      <w:r>
-        <w:rPr>
-          <w:rFonts w:ascii="Times New Roman" w:hAnsi="Times New Roman"/>
-          <w:sz w:val="24"/>
-        </w:rPr>
-        <w:t>A</w:t>
-        <w:tab/>
-        <w:t>Flujograma del proceso propuesto de gestión de solicitudes de servicios</w:t>
-        <w:tab/>
-      </w:r>
-      <w:r>
-        <w:rPr>
-          <w:rFonts w:ascii="Times New Roman" w:hAnsi="Times New Roman"/>
-          <w:b w:val="0"/>
-          <w:sz w:val="24"/>
-        </w:rPr>
-        <w:fldChar w:fldCharType="begin"/>
-        <w:instrText xml:space="preserve"> PAGEREF bm_anexoA \h </w:instrText>
-        <w:fldChar w:fldCharType="separate"/>
-        <w:t>?</w:t>
-        <w:fldChar w:fldCharType="end"/>
+        <w:spacing w:line="240" w:lineRule="auto" w:after="0"/>
+        <w:jc w:val="center"/>
+      </w:pPr>
+      <w:r>
+        <w:rPr>
+          <w:rFonts w:ascii="Times New Roman" w:hAnsi="Times New Roman"/>
+          <w:b/>
+          <w:sz w:val="24"/>
+        </w:rPr>
+        <w:t>INSTITUTO UNIVERSITARIO DE TECNOLOGÍA</w:t>
       </w:r>
     </w:p>
     <w:p>
       <w:pPr>
-        <w:keepLines/>
-        <w:tabs>
-          <w:tab w:pos="1020" w:val="left"/>
-          <w:tab w:pos="8271" w:val="right" w:leader="dot"/>
-        </w:tabs>
-        <w:spacing w:line="360" w:lineRule="auto" w:before="0" w:after="80"/>
-        <w:ind w:left="1020" w:hanging="1020"/>
-      </w:pPr>
-      <w:r>
-        <w:rPr>
-          <w:rFonts w:ascii="Times New Roman" w:hAnsi="Times New Roman"/>
-          <w:sz w:val="24"/>
-        </w:rPr>
-        <w:t>B</w:t>
-        <w:tab/>
-        <w:t>Diagrama de Ishikawa del control de solicitudes</w:t>
-        <w:tab/>
-      </w:r>
-      <w:r>
-        <w:rPr>
-          <w:rFonts w:ascii="Times New Roman" w:hAnsi="Times New Roman"/>
-          <w:b w:val="0"/>
-          <w:sz w:val="24"/>
-        </w:rPr>
-        <w:fldChar w:fldCharType="begin"/>
-        <w:instrText xml:space="preserve"> PAGEREF bm_anexoB \h </w:instrText>
-        <w:fldChar w:fldCharType="separate"/>
-        <w:t>?</w:t>
-        <w:fldChar w:fldCharType="end"/>
+        <w:spacing w:line="240" w:lineRule="auto" w:after="0"/>
+        <w:jc w:val="center"/>
+      </w:pPr>
+      <w:r>
+        <w:rPr>
+          <w:rFonts w:ascii="Times New Roman" w:hAnsi="Times New Roman"/>
+          <w:b/>
+          <w:sz w:val="24"/>
+        </w:rPr>
+        <w:t>"ELÍAS CALIXTO POMPA"</w:t>
       </w:r>
     </w:p>
     <w:p>
       <w:pPr>
-        <w:keepLines/>
-        <w:tabs>
-          <w:tab w:pos="1020" w:val="left"/>
-          <w:tab w:pos="8271" w:val="right" w:leader="dot"/>
-        </w:tabs>
-        <w:spacing w:line="360" w:lineRule="auto" w:before="0" w:after="80"/>
-        <w:ind w:left="1020" w:hanging="1020"/>
-      </w:pPr>
-      <w:r>
-        <w:rPr>
-          <w:rFonts w:ascii="Times New Roman" w:hAnsi="Times New Roman"/>
-          <w:sz w:val="24"/>
-        </w:rPr>
-        <w:t>C</w:t>
-        <w:tab/>
-        <w:t>Flujograma AS-IS de afiliaciones e incidencias</w:t>
-        <w:tab/>
-      </w:r>
-      <w:r>
-        <w:rPr>
-          <w:rFonts w:ascii="Times New Roman" w:hAnsi="Times New Roman"/>
-          <w:b w:val="0"/>
-          <w:sz w:val="24"/>
-        </w:rPr>
-        <w:fldChar w:fldCharType="begin"/>
-        <w:instrText xml:space="preserve"> PAGEREF bm_anexoC \h </w:instrText>
-        <w:fldChar w:fldCharType="separate"/>
-        <w:t>?</w:t>
-        <w:fldChar w:fldCharType="end"/>
+        <w:spacing w:line="240" w:lineRule="auto" w:after="0"/>
+        <w:jc w:val="center"/>
+      </w:pPr>
+      <w:r>
+        <w:rPr>
+          <w:rFonts w:ascii="Times New Roman" w:hAnsi="Times New Roman"/>
+          <w:b/>
+          <w:sz w:val="24"/>
+        </w:rPr>
+        <w:t>EL TIGRE, ESTADO ANZOÁTEGUI</w:t>
       </w:r>
     </w:p>
     <w:p>
       <w:pPr>
-        <w:keepLines/>
-        <w:tabs>
-          <w:tab w:pos="1020" w:val="left"/>
-          <w:tab w:pos="8271" w:val="right" w:leader="dot"/>
-        </w:tabs>
-        <w:spacing w:line="360" w:lineRule="auto" w:before="0" w:after="80"/>
-        <w:ind w:left="1020" w:hanging="1020"/>
-      </w:pPr>
-      <w:r>
-        <w:rPr>
-          <w:rFonts w:ascii="Times New Roman" w:hAnsi="Times New Roman"/>
-          <w:sz w:val="24"/>
-        </w:rPr>
-        <w:t>D</w:t>
-        <w:tab/>
-        <w:t>Swimlane interdepartamental de gestión de solicitudes</w:t>
-        <w:tab/>
-      </w:r>
-      <w:r>
-        <w:rPr>
-          <w:rFonts w:ascii="Times New Roman" w:hAnsi="Times New Roman"/>
-          <w:b w:val="0"/>
-          <w:sz w:val="24"/>
-        </w:rPr>
-        <w:fldChar w:fldCharType="begin"/>
-        <w:instrText xml:space="preserve"> PAGEREF bm_anexoD \h </w:instrText>
-        <w:fldChar w:fldCharType="separate"/>
-        <w:t>?</w:t>
-        <w:fldChar w:fldCharType="end"/>
+        <w:spacing w:line="240" w:lineRule="auto" w:after="120"/>
+        <w:jc w:val="center"/>
+      </w:pPr>
+      <w:r>
+        <w:rPr>
+          <w:rFonts w:ascii="Times New Roman" w:hAnsi="Times New Roman"/>
+          <w:b/>
+          <w:sz w:val="24"/>
+        </w:rPr>
+        <w:t>EVALUACIÓN DEL CONTROL ADMINISTRATIVO APLICADO A LA GESTIÓN DE SOLICITUDES DE SERVICIOS DE TELECOMUNICACIONES EN LA EMPRESA INGENIERÍA DE TELECOMUNICACIONES, C.A.</w:t>
       </w:r>
     </w:p>
     <w:p>
       <w:pPr>
-        <w:keepLines/>
-        <w:tabs>
-          <w:tab w:pos="1020" w:val="left"/>
-          <w:tab w:pos="8271" w:val="right" w:leader="dot"/>
-        </w:tabs>
-        <w:spacing w:line="360" w:lineRule="auto" w:before="0" w:after="80"/>
-        <w:ind w:left="1020" w:hanging="1020"/>
-      </w:pPr>
-      <w:r>
-        <w:rPr>
-          <w:rFonts w:ascii="Times New Roman" w:hAnsi="Times New Roman"/>
-          <w:sz w:val="24"/>
-        </w:rPr>
-        <w:t>E</w:t>
-        <w:tab/>
-        <w:t>Estados de una solicitud de servicio</w:t>
-        <w:tab/>
-      </w:r>
-      <w:r>
-        <w:rPr>
-          <w:rFonts w:ascii="Times New Roman" w:hAnsi="Times New Roman"/>
-          <w:b w:val="0"/>
-          <w:sz w:val="24"/>
-        </w:rPr>
-        <w:fldChar w:fldCharType="begin"/>
-        <w:instrText xml:space="preserve"> PAGEREF bm_anexoE \h </w:instrText>
-        <w:fldChar w:fldCharType="separate"/>
-        <w:t>?</w:t>
-        <w:fldChar w:fldCharType="end"/>
+        <w:spacing w:line="240" w:lineRule="auto" w:after="120"/>
+        <w:ind w:left="0"/>
+        <w:jc w:val="right"/>
+      </w:pPr>
+      <w:r>
+        <w:rPr>
+          <w:rFonts w:ascii="Times New Roman" w:hAnsi="Times New Roman"/>
+          <w:b/>
+          <w:sz w:val="24"/>
+        </w:rPr>
+        <w:t>Autor: Alrifaai Alrifaaie, Amaal</w:t>
+        <w:br/>
+      </w:r>
+      <w:r>
+        <w:rPr>
+          <w:rFonts w:ascii="Times New Roman" w:hAnsi="Times New Roman"/>
+          <w:sz w:val="24"/>
+        </w:rPr>
+        <w:t>C.I.: 31.985.792</w:t>
+        <w:br/>
+      </w:r>
+      <w:r>
+        <w:rPr>
+          <w:rFonts w:ascii="Times New Roman" w:hAnsi="Times New Roman"/>
+          <w:sz w:val="24"/>
+        </w:rPr>
+        <w:t>agosto de 2026</w:t>
       </w:r>
     </w:p>
     <w:p>
-      <w:pPr>
-        <w:keepLines/>
-        <w:tabs>
-          <w:tab w:pos="1020" w:val="left"/>
-          <w:tab w:pos="8271" w:val="right" w:leader="dot"/>
-        </w:tabs>
-        <w:spacing w:line="360" w:lineRule="auto" w:before="0" w:after="80"/>
-        <w:ind w:left="1020" w:hanging="1020"/>
-      </w:pPr>
-      <w:r>
-        <w:rPr>
-          <w:rFonts w:ascii="Times New Roman" w:hAnsi="Times New Roman"/>
-          <w:sz w:val="24"/>
-        </w:rPr>
-        <w:t>F</w:t>
-        <w:tab/>
-        <w:t>Comunicación interdepartamental</w:t>
-        <w:tab/>
-      </w:r>
-      <w:r>
-        <w:rPr>
-          <w:rFonts w:ascii="Times New Roman" w:hAnsi="Times New Roman"/>
-          <w:b w:val="0"/>
-          <w:sz w:val="24"/>
-        </w:rPr>
-        <w:fldChar w:fldCharType="begin"/>
-        <w:instrText xml:space="preserve"> PAGEREF bm_anexoF \h </w:instrText>
-        <w:fldChar w:fldCharType="separate"/>
-        <w:t>?</w:t>
-        <w:fldChar w:fldCharType="end"/>
-      </w:r>
+      <w:bookmarkStart w:id="9" w:name="bm_resumen"/>
+      <w:pPr>
+        <w:spacing w:line="240" w:lineRule="auto" w:before="120" w:after="120"/>
+        <w:jc w:val="center"/>
+      </w:pPr>
+      <w:r>
+        <w:rPr>
+          <w:rFonts w:ascii="Times New Roman" w:hAnsi="Times New Roman"/>
+          <w:b/>
+          <w:sz w:val="24"/>
+        </w:rPr>
+        <w:t>RESUMEN</w:t>
+      </w:r>
+      <w:bookmarkEnd w:id="9"/>
     </w:p>
     <w:p>
       <w:pPr>
-        <w:keepLines/>
-        <w:tabs>
-          <w:tab w:pos="1020" w:val="left"/>
-          <w:tab w:pos="8271" w:val="right" w:leader="dot"/>
-        </w:tabs>
-        <w:spacing w:line="360" w:lineRule="auto" w:before="0" w:after="80"/>
-        <w:ind w:left="1020" w:hanging="1020"/>
-      </w:pPr>
-      <w:r>
-        <w:rPr>
-          <w:rFonts w:ascii="Times New Roman" w:hAnsi="Times New Roman"/>
-          <w:sz w:val="24"/>
-        </w:rPr>
-        <w:t>G</w:t>
-        <w:tab/>
-        <w:t>Comparación AS-IS y TO-BE del control de solicitudes</w:t>
-        <w:tab/>
-      </w:r>
-      <w:r>
-        <w:rPr>
-          <w:rFonts w:ascii="Times New Roman" w:hAnsi="Times New Roman"/>
-          <w:b w:val="0"/>
-          <w:sz w:val="24"/>
-        </w:rPr>
-        <w:fldChar w:fldCharType="begin"/>
-        <w:instrText xml:space="preserve"> PAGEREF bm_anexoG \h </w:instrText>
-        <w:fldChar w:fldCharType="separate"/>
-        <w:t>?</w:t>
-        <w:fldChar w:fldCharType="end"/>
+        <w:spacing w:line="240" w:lineRule="auto" w:before="0" w:after="0"/>
+        <w:ind w:firstLine="709"/>
+        <w:jc w:val="both"/>
+      </w:pPr>
+      <w:r>
+        <w:rPr>
+          <w:rFonts w:ascii="Times New Roman" w:hAnsi="Times New Roman"/>
+          <w:sz w:val="24"/>
+        </w:rPr>
+        <w:t>El presente informe recoge las actividades desarrolladas durante diez (10) semanas de pasantías profesionales en Ingeniería de Telecomunicaciones, C.A. (IDETEL), con una primera etapa de rotación por Atención al Cliente y una segunda etapa de apoyo en el área de Administración. Durante la práctica se observó el recorrido de solicitudes de afiliación e incidencias, el registro de pagos, la facturación, el seguimiento de casos y la elaboración de reportes administrativos. La situación problemática se relaciona con la ausencia de un procedimiento formalizado y unificado para controlar las solicitudes desde su recepción hasta el cierre, lo que dificulta conocer de manera oportuna los responsables, tiempos de respuesta y estatus de cada caso. El objetivo general fue evaluar el control administrativo aplicado a la gestión de solicitudes de servicios de telecomunicaciones, con el propósito de identificar sus debilidades y formular mejoras procedimentales. Para ello se realizaron observaciones directas, revisión de registros, entrevistas estructuradas al personal y un diagrama de causa-efecto para organizar los factores vinculados con las fallas detectadas. A partir de los hallazgos se formularon mejoras orientadas a establecer un flujo estandarizado, definir responsables por etapa, utilizar formatos uniformes y aplicar indicadores básicos para el seguimiento de las solicitudes. Como resultado, se determinó que la formalización del recorrido y la centralización de la información pueden facilitar la trazabilidad y reducir los reprocesos administrativos. Se concluye que el fortalecimiento del control depende principalmente de establecer criterios comunes de registro, actualización y cierre de los casos. Se recomienda implementar progresivamente el procedimiento propuesto, comunicarlo al personal involucrado y revisar periódicamente los tiempos de respuesta y solicitudes pendientes para detectar desviaciones y oportunidades de mejora.</w:t>
       </w:r>
     </w:p>
+    <w:p/>
     <w:p>
       <w:pPr>
-        <w:keepLines/>
-        <w:tabs>
-          <w:tab w:pos="1020" w:val="left"/>
-          <w:tab w:pos="8271" w:val="right" w:leader="dot"/>
-        </w:tabs>
-        <w:spacing w:line="360" w:lineRule="auto" w:before="0" w:after="80"/>
-        <w:ind w:left="1020" w:hanging="1020"/>
-      </w:pPr>
-      <w:r>
-        <w:rPr>
-          <w:rFonts w:ascii="Times New Roman" w:hAnsi="Times New Roman"/>
-          <w:sz w:val="24"/>
-        </w:rPr>
-        <w:t>H</w:t>
-        <w:tab/>
-        <w:t>Diagrama de Ishikawa del control y trazabilidad de las solicitudes de servicio</w:t>
-        <w:tab/>
-      </w:r>
-      <w:r>
-        <w:rPr>
-          <w:rFonts w:ascii="Times New Roman" w:hAnsi="Times New Roman"/>
-          <w:b w:val="0"/>
-          <w:sz w:val="24"/>
-        </w:rPr>
-        <w:fldChar w:fldCharType="begin"/>
-        <w:instrText xml:space="preserve"> PAGEREF bm_anexoH \h </w:instrText>
-        <w:fldChar w:fldCharType="separate"/>
-        <w:t>?</w:t>
-        <w:fldChar w:fldCharType="end"/>
-      </w:r>
-    </w:p>
-    <w:p>
-      <w:pPr>
-        <w:keepLines/>
-        <w:tabs>
-          <w:tab w:pos="1020" w:val="left"/>
-          <w:tab w:pos="8271" w:val="right" w:leader="dot"/>
-        </w:tabs>
-        <w:spacing w:line="360" w:lineRule="auto" w:before="0" w:after="80"/>
-        <w:ind w:left="1020" w:hanging="1020"/>
-      </w:pPr>
-      <w:r>
-        <w:rPr>
-          <w:rFonts w:ascii="Times New Roman" w:hAnsi="Times New Roman"/>
-          <w:sz w:val="24"/>
-        </w:rPr>
-        <w:t>I</w:t>
-        <w:tab/>
-        <w:t>Memoria fotográfica de las actividades realizadas</w:t>
-        <w:tab/>
-      </w:r>
-      <w:r>
-        <w:rPr>
-          <w:rFonts w:ascii="Times New Roman" w:hAnsi="Times New Roman"/>
-          <w:b w:val="0"/>
-          <w:sz w:val="24"/>
-        </w:rPr>
-        <w:fldChar w:fldCharType="begin"/>
-        <w:instrText xml:space="preserve"> PAGEREF bm_anexoI \h </w:instrText>
-        <w:fldChar w:fldCharType="separate"/>
-        <w:t>?</w:t>
-        <w:fldChar w:fldCharType="end"/>
+        <w:spacing w:line="240" w:lineRule="auto" w:before="0" w:after="0"/>
+        <w:ind w:firstLine="709"/>
+      </w:pPr>
+      <w:r>
+        <w:rPr>
+          <w:rFonts w:ascii="Times New Roman" w:hAnsi="Times New Roman"/>
+          <w:b/>
+          <w:sz w:val="24"/>
+        </w:rPr>
+        <w:t xml:space="preserve">Palabras claves: </w:t>
+      </w:r>
+      <w:r>
+        <w:rPr>
+          <w:rFonts w:ascii="Times New Roman" w:hAnsi="Times New Roman"/>
+          <w:sz w:val="24"/>
+        </w:rPr>
+        <w:t>control administrativo, solicitudes de servicio, trazabilidad, telecomunicaciones, pasantías</w:t>
       </w:r>
     </w:p>
     <w:p>
@@ -2834,185 +2980,6 @@
       </w:pPr>
     </w:p>
     <w:p>
-      <w:pPr>
-        <w:spacing w:line="240" w:lineRule="auto" w:after="0"/>
-        <w:jc w:val="center"/>
-      </w:pPr>
-      <w:r>
-        <w:rPr>
-          <w:rFonts w:ascii="Times New Roman" w:hAnsi="Times New Roman"/>
-          <w:b/>
-          <w:sz w:val="24"/>
-        </w:rPr>
-        <w:t>REPÚBLICA BOLIVARIANA DE VENEZUELA</w:t>
-      </w:r>
-    </w:p>
-    <w:p>
-      <w:pPr>
-        <w:spacing w:line="240" w:lineRule="auto" w:after="0"/>
-        <w:jc w:val="center"/>
-      </w:pPr>
-      <w:r>
-        <w:rPr>
-          <w:rFonts w:ascii="Times New Roman" w:hAnsi="Times New Roman"/>
-          <w:b/>
-          <w:sz w:val="24"/>
-        </w:rPr>
-        <w:t>MINISTERIO DEL PODER POPULAR PARA LA EDUCACIÓN UNIVERSITARIA</w:t>
-      </w:r>
-    </w:p>
-    <w:p>
-      <w:pPr>
-        <w:spacing w:line="240" w:lineRule="auto" w:after="0"/>
-        <w:jc w:val="center"/>
-      </w:pPr>
-      <w:r>
-        <w:rPr>
-          <w:rFonts w:ascii="Times New Roman" w:hAnsi="Times New Roman"/>
-          <w:b/>
-          <w:sz w:val="24"/>
-        </w:rPr>
-        <w:t>INSTITUTO UNIVERSITARIO DE TECNOLOGÍA</w:t>
-      </w:r>
-    </w:p>
-    <w:p>
-      <w:pPr>
-        <w:spacing w:line="240" w:lineRule="auto" w:after="0"/>
-        <w:jc w:val="center"/>
-      </w:pPr>
-      <w:r>
-        <w:rPr>
-          <w:rFonts w:ascii="Times New Roman" w:hAnsi="Times New Roman"/>
-          <w:b/>
-          <w:sz w:val="24"/>
-        </w:rPr>
-        <w:t>"ELÍAS CALIXTO POMPA"</w:t>
-      </w:r>
-    </w:p>
-    <w:p>
-      <w:pPr>
-        <w:spacing w:line="240" w:lineRule="auto" w:after="0"/>
-        <w:jc w:val="center"/>
-      </w:pPr>
-      <w:r>
-        <w:rPr>
-          <w:rFonts w:ascii="Times New Roman" w:hAnsi="Times New Roman"/>
-          <w:b/>
-          <w:sz w:val="24"/>
-        </w:rPr>
-        <w:t>EL TIGRE, ESTADO ANZOÁTEGUI</w:t>
-      </w:r>
-    </w:p>
-    <w:p>
-      <w:pPr>
-        <w:spacing w:line="240" w:lineRule="auto" w:after="120"/>
-        <w:jc w:val="center"/>
-      </w:pPr>
-      <w:r>
-        <w:rPr>
-          <w:rFonts w:ascii="Times New Roman" w:hAnsi="Times New Roman"/>
-          <w:b/>
-          <w:sz w:val="24"/>
-        </w:rPr>
-        <w:t>EVALUACIÓN DEL CONTROL ADMINISTRATIVO APLICADO A LA GESTIÓN DE SOLICITUDES DE SERVICIOS DE TELECOMUNICACIONES EN LA EMPRESA INGENIERÍA DE TELECOMUNICACIONES, C.A.</w:t>
-      </w:r>
-    </w:p>
-    <w:p>
-      <w:pPr>
-        <w:spacing w:line="240" w:lineRule="auto" w:after="120"/>
-        <w:ind w:left="0"/>
-        <w:jc w:val="right"/>
-      </w:pPr>
-      <w:r>
-        <w:rPr>
-          <w:rFonts w:ascii="Times New Roman" w:hAnsi="Times New Roman"/>
-          <w:b/>
-          <w:sz w:val="24"/>
-        </w:rPr>
-        <w:t>Autor: Alrifaai Alrifaaie, Amaal</w:t>
-        <w:br/>
-      </w:r>
-      <w:r>
-        <w:rPr>
-          <w:rFonts w:ascii="Times New Roman" w:hAnsi="Times New Roman"/>
-          <w:sz w:val="24"/>
-        </w:rPr>
-        <w:t>C.I.: 31.985.792</w:t>
-        <w:br/>
-      </w:r>
-      <w:r>
-        <w:rPr>
-          <w:rFonts w:ascii="Times New Roman" w:hAnsi="Times New Roman"/>
-          <w:sz w:val="24"/>
-        </w:rPr>
-        <w:t>agosto de 2026</w:t>
-      </w:r>
-    </w:p>
-    <w:p>
-      <w:bookmarkStart w:id="9" w:name="bm_resumen"/>
-      <w:pPr>
-        <w:spacing w:line="240" w:lineRule="auto" w:before="120" w:after="120"/>
-        <w:jc w:val="center"/>
-      </w:pPr>
-      <w:r>
-        <w:rPr>
-          <w:rFonts w:ascii="Times New Roman" w:hAnsi="Times New Roman"/>
-          <w:b/>
-          <w:sz w:val="24"/>
-        </w:rPr>
-        <w:t>RESUMEN</w:t>
-      </w:r>
-      <w:bookmarkEnd w:id="9"/>
-    </w:p>
-    <w:p>
-      <w:pPr>
-        <w:spacing w:line="240" w:lineRule="auto" w:before="0" w:after="0"/>
-        <w:ind w:firstLine="709"/>
-        <w:jc w:val="both"/>
-      </w:pPr>
-      <w:r>
-        <w:rPr>
-          <w:rFonts w:ascii="Times New Roman" w:hAnsi="Times New Roman"/>
-          <w:sz w:val="24"/>
-        </w:rPr>
-        <w:t>El presente informe recoge las actividades desarrolladas durante diez (10) semanas de pasantías profesionales en Ingeniería de Telecomunicaciones, C.A. (IDETEL), con una primera etapa de rotación por Atención al Cliente y una segunda etapa de apoyo en el área de Administración. Durante la práctica se observó el recorrido de solicitudes de afiliación e incidencias, el registro de pagos, la facturación, el seguimiento de casos y la elaboración de reportes administrativos. La situación problemática se relaciona con la ausencia de un procedimiento formalizado y unificado para controlar las solicitudes desde su recepción hasta el cierre, lo que dificulta conocer de manera oportuna los responsables, tiempos de respuesta y estatus de cada caso. El objetivo general fue evaluar el control administrativo aplicado a la gestión de solicitudes de servicios de telecomunicaciones, con el propósito de identificar sus debilidades y formular mejoras procedimentales. Para ello se realizaron observaciones directas, revisión de registros, entrevistas estructuradas al personal y un diagrama de causa-efecto para organizar los factores vinculados con las fallas detectadas. A partir de los hallazgos se formularon mejoras orientadas a establecer un flujo estandarizado, definir responsables por etapa, utilizar formatos uniformes y aplicar indicadores básicos para el seguimiento de las solicitudes. Como resultado, se determinó que la formalización del recorrido y la centralización de la información pueden facilitar la trazabilidad y reducir los reprocesos administrativos. Se concluye que el fortalecimiento del control depende principalmente de establecer criterios comunes de registro, actualización y cierre de los casos. Se recomienda implementar progresivamente el procedimiento propuesto, comunicarlo al personal involucrado y revisar periódicamente los tiempos de respuesta y solicitudes pendientes para detectar desviaciones y oportunidades de mejora.</w:t>
-      </w:r>
-    </w:p>
-    <w:p/>
-    <w:p>
-      <w:pPr>
-        <w:spacing w:line="240" w:lineRule="auto" w:before="0" w:after="0"/>
-        <w:ind w:firstLine="709"/>
-      </w:pPr>
-      <w:r>
-        <w:rPr>
-          <w:rFonts w:ascii="Times New Roman" w:hAnsi="Times New Roman"/>
-          <w:b/>
-          <w:sz w:val="24"/>
-        </w:rPr>
-        <w:t xml:space="preserve">Palabras claves: </w:t>
-      </w:r>
-      <w:r>
-        <w:rPr>
-          <w:rFonts w:ascii="Times New Roman" w:hAnsi="Times New Roman"/>
-          <w:sz w:val="24"/>
-        </w:rPr>
-        <w:t>control administrativo, solicitudes de servicio, trazabilidad, telecomunicaciones, pasantías</w:t>
-      </w:r>
-    </w:p>
-    <w:p>
-      <w:pPr>
-        <w:sectPr>
-          <w:footerReference w:type="default" r:id="rId42"/>
-          <w:pgSz w:w="12240" w:h="15840"/>
-          <w:pgMar w:top="1701" w:right="1701" w:bottom="1701" w:left="2268" w:header="720" w:footer="720" w:gutter="0"/>
-          <w:cols w:space="720"/>
-          <w:docGrid w:linePitch="360"/>
-          <w:pgNumType w:fmt="lowerRoman"/>
-        </w:sectPr>
-      </w:pPr>
-    </w:p>
-    <w:p>
       <w:bookmarkStart w:id="10" w:name="bm_introduccion"/>
       <w:pPr>
         <w:pStyle w:val="IUTECPPreliminar"/>
@@ -3094,8 +3061,8 @@
     <w:p>
       <w:pPr>
         <w:sectPr>
-          <w:footerReference w:type="default" r:id="rId43"/>
-          <w:footerReference w:type="first" r:id="rId44"/>
+          <w:footerReference w:type="default" r:id="rId42"/>
+          <w:footerReference w:type="first" r:id="rId43"/>
           <w:pgSz w:w="12240" w:h="15840"/>
           <w:pgMar w:top="1701" w:right="1701" w:bottom="1701" w:left="2268" w:header="720" w:footer="720" w:gutter="0"/>
           <w:cols w:space="720"/>
@@ -4460,8 +4427,8 @@
     <w:p>
       <w:pPr>
         <w:sectPr>
-          <w:footerReference w:type="default" r:id="rId45"/>
-          <w:footerReference w:type="first" r:id="rId46"/>
+          <w:footerReference w:type="default" r:id="rId44"/>
+          <w:footerReference w:type="first" r:id="rId45"/>
           <w:pgSz w:w="12240" w:h="15840"/>
           <w:pgMar w:top="1701" w:right="1701" w:bottom="1701" w:left="2268" w:header="720" w:footer="720" w:gutter="0"/>
           <w:cols w:space="720"/>
@@ -4661,7 +4628,22 @@
           <w:i w:val="0"/>
           <w:sz w:val="24"/>
         </w:rPr>
-        <w:t>Para organizar las causas de la situación se empleó un diagrama de Ishikawa, complementado con observación directa, revisión de registros y entrevistas estructuradas al personal. La técnica permitió relacionar factores de procedimiento, comunicación, registro y seguimiento con las demoras e inconsistencias identificadas.</w:t>
+        <w:t>El recorrido actual de afiliaciones e incidencias se representa en el flujograma AS-IS incorporado como Anexo C, el cual permite visualizar la transición de la información entre las áreas involucradas.</w:t>
+      </w:r>
+    </w:p>
+    <w:p>
+      <w:pPr>
+        <w:spacing w:line="360" w:lineRule="auto" w:after="0" w:before="0"/>
+        <w:ind w:firstLine="709"/>
+        <w:jc w:val="both"/>
+      </w:pPr>
+      <w:r>
+        <w:rPr>
+          <w:rFonts w:ascii="Times New Roman" w:hAnsi="Times New Roman"/>
+          <w:i w:val="0"/>
+          <w:sz w:val="24"/>
+        </w:rPr>
+        <w:t>Para organizar las causas de la situación se empleó un diagrama de Ishikawa, complementado con observación directa, revisión de registros y entrevistas estructuradas al personal. La técnica permitió relacionar factores de procedimiento, comunicación, registro y seguimiento con las demoras e inconsistencias identificadas (véase Anexo B).</w:t>
       </w:r>
     </w:p>
     <w:p>
@@ -4880,24 +4862,25 @@
         <w:tblLayout w:type="fixed"/>
       </w:tblPr>
       <w:tblGrid>
-        <w:gridCol w:w="1644"/>
-        <w:gridCol w:w="1644"/>
-        <w:gridCol w:w="1644"/>
-        <w:gridCol w:w="1644"/>
-        <w:gridCol w:w="1695"/>
+        <w:gridCol w:w="1729"/>
+        <w:gridCol w:w="1530"/>
+        <w:gridCol w:w="1786"/>
+        <w:gridCol w:w="1530"/>
+        <w:gridCol w:w="1701"/>
       </w:tblGrid>
       <w:tr>
         <w:trPr>
           <w:tblHeader/>
+          <w:cantSplit/>
         </w:trPr>
         <w:tc>
           <w:tcPr>
-            <w:tcW w:w="1644" w:type="dxa"/>
+            <w:tcW w:w="1729" w:type="dxa"/>
             <w:shd w:val="clear" w:color="auto" w:fill="4472C4"/>
           </w:tcPr>
           <w:p>
             <w:pPr>
-              <w:spacing w:before="60" w:after="60" w:line="240" w:lineRule="auto"/>
+              <w:spacing w:before="20" w:after="20" w:line="240" w:lineRule="auto"/>
               <w:jc w:val="center"/>
             </w:pPr>
             <w:r>
@@ -4905,7 +4888,7 @@
                 <w:rFonts w:ascii="Times New Roman" w:hAnsi="Times New Roman"/>
                 <w:b/>
                 <w:color w:val="FFFFFF"/>
-                <w:sz w:val="20"/>
+                <w:sz w:val="18"/>
               </w:rPr>
               <w:t>Objetivo</w:t>
             </w:r>
@@ -4913,12 +4896,12 @@
         </w:tc>
         <w:tc>
           <w:tcPr>
-            <w:tcW w:w="1644" w:type="dxa"/>
+            <w:tcW w:w="1530" w:type="dxa"/>
             <w:shd w:val="clear" w:color="auto" w:fill="4472C4"/>
           </w:tcPr>
           <w:p>
             <w:pPr>
-              <w:spacing w:before="60" w:after="60" w:line="240" w:lineRule="auto"/>
+              <w:spacing w:before="20" w:after="20" w:line="240" w:lineRule="auto"/>
               <w:jc w:val="center"/>
             </w:pPr>
             <w:r>
@@ -4926,7 +4909,7 @@
                 <w:rFonts w:ascii="Times New Roman" w:hAnsi="Times New Roman"/>
                 <w:b/>
                 <w:color w:val="FFFFFF"/>
-                <w:sz w:val="20"/>
+                <w:sz w:val="18"/>
               </w:rPr>
               <w:t>Variable</w:t>
             </w:r>
@@ -4934,12 +4917,12 @@
         </w:tc>
         <w:tc>
           <w:tcPr>
-            <w:tcW w:w="1644" w:type="dxa"/>
+            <w:tcW w:w="1786" w:type="dxa"/>
             <w:shd w:val="clear" w:color="auto" w:fill="4472C4"/>
           </w:tcPr>
           <w:p>
             <w:pPr>
-              <w:spacing w:before="60" w:after="60" w:line="240" w:lineRule="auto"/>
+              <w:spacing w:before="20" w:after="20" w:line="240" w:lineRule="auto"/>
               <w:jc w:val="center"/>
             </w:pPr>
             <w:r>
@@ -4947,7 +4930,7 @@
                 <w:rFonts w:ascii="Times New Roman" w:hAnsi="Times New Roman"/>
                 <w:b/>
                 <w:color w:val="FFFFFF"/>
-                <w:sz w:val="20"/>
+                <w:sz w:val="18"/>
               </w:rPr>
               <w:t>Actividades</w:t>
             </w:r>
@@ -4955,12 +4938,12 @@
         </w:tc>
         <w:tc>
           <w:tcPr>
-            <w:tcW w:w="1644" w:type="dxa"/>
+            <w:tcW w:w="1530" w:type="dxa"/>
             <w:shd w:val="clear" w:color="auto" w:fill="4472C4"/>
           </w:tcPr>
           <w:p>
             <w:pPr>
-              <w:spacing w:before="60" w:after="60" w:line="240" w:lineRule="auto"/>
+              <w:spacing w:before="20" w:after="20" w:line="240" w:lineRule="auto"/>
               <w:jc w:val="center"/>
             </w:pPr>
             <w:r>
@@ -4968,7 +4951,7 @@
                 <w:rFonts w:ascii="Times New Roman" w:hAnsi="Times New Roman"/>
                 <w:b/>
                 <w:color w:val="FFFFFF"/>
-                <w:sz w:val="20"/>
+                <w:sz w:val="18"/>
               </w:rPr>
               <w:t>Técnica</w:t>
             </w:r>
@@ -4976,12 +4959,12 @@
         </w:tc>
         <w:tc>
           <w:tcPr>
-            <w:tcW w:w="1695" w:type="dxa"/>
+            <w:tcW w:w="1701" w:type="dxa"/>
             <w:shd w:val="clear" w:color="auto" w:fill="4472C4"/>
           </w:tcPr>
           <w:p>
             <w:pPr>
-              <w:spacing w:before="60" w:after="60" w:line="240" w:lineRule="auto"/>
+              <w:spacing w:before="20" w:after="20" w:line="240" w:lineRule="auto"/>
               <w:jc w:val="center"/>
             </w:pPr>
             <w:r>
@@ -4989,7 +4972,7 @@
                 <w:rFonts w:ascii="Times New Roman" w:hAnsi="Times New Roman"/>
                 <w:b/>
                 <w:color w:val="FFFFFF"/>
-                <w:sz w:val="20"/>
+                <w:sz w:val="18"/>
               </w:rPr>
               <w:t>Instrumento</w:t>
             </w:r>
@@ -4997,22 +4980,25 @@
         </w:tc>
       </w:tr>
       <w:tr>
+        <w:trPr>
+          <w:cantSplit/>
+        </w:trPr>
         <w:tc>
           <w:tcPr>
-            <w:tcW w:w="1644" w:type="dxa"/>
+            <w:tcW w:w="1729" w:type="dxa"/>
             <w:shd w:val="clear" w:color="auto" w:fill="FFFFFF"/>
           </w:tcPr>
           <w:p>
             <w:pPr>
-              <w:spacing w:before="60" w:after="60" w:line="240" w:lineRule="auto"/>
-              <w:jc w:val="both"/>
+              <w:spacing w:before="20" w:after="20" w:line="240" w:lineRule="auto"/>
+              <w:jc w:val="left"/>
             </w:pPr>
             <w:r>
               <w:rPr>
                 <w:rFonts w:ascii="Times New Roman" w:hAnsi="Times New Roman"/>
                 <w:b w:val="0"/>
                 <w:color w:val="000000"/>
-                <w:sz w:val="20"/>
+                <w:sz w:val="17"/>
               </w:rPr>
               <w:t>Diagnosticar el proceso administrativo actual de recepción, registro, seguimiento y cierre de solicitudes de afiliación e incidencias en Ingeniería de Telecomunicaciones, C.A., considerando la transición de la información entre Atención al Cliente, Administración y las áreas relacionadas.</w:t>
             </w:r>
@@ -5020,20 +5006,20 @@
         </w:tc>
         <w:tc>
           <w:tcPr>
-            <w:tcW w:w="1644" w:type="dxa"/>
+            <w:tcW w:w="1530" w:type="dxa"/>
             <w:shd w:val="clear" w:color="auto" w:fill="FFFFFF"/>
           </w:tcPr>
           <w:p>
             <w:pPr>
-              <w:spacing w:before="60" w:after="60" w:line="240" w:lineRule="auto"/>
-              <w:jc w:val="both"/>
+              <w:spacing w:before="20" w:after="20" w:line="240" w:lineRule="auto"/>
+              <w:jc w:val="left"/>
             </w:pPr>
             <w:r>
               <w:rPr>
                 <w:rFonts w:ascii="Times New Roman" w:hAnsi="Times New Roman"/>
                 <w:b w:val="0"/>
                 <w:color w:val="000000"/>
-                <w:sz w:val="20"/>
+                <w:sz w:val="17"/>
               </w:rPr>
               <w:t>Proceso administrativo de gestión de solicitudes de servicio.</w:t>
             </w:r>
@@ -5041,20 +5027,20 @@
         </w:tc>
         <w:tc>
           <w:tcPr>
-            <w:tcW w:w="1644" w:type="dxa"/>
+            <w:tcW w:w="1786" w:type="dxa"/>
             <w:shd w:val="clear" w:color="auto" w:fill="FFFFFF"/>
           </w:tcPr>
           <w:p>
             <w:pPr>
-              <w:spacing w:before="60" w:after="60" w:line="240" w:lineRule="auto"/>
-              <w:jc w:val="both"/>
+              <w:spacing w:before="20" w:after="20" w:line="240" w:lineRule="auto"/>
+              <w:jc w:val="left"/>
             </w:pPr>
             <w:r>
               <w:rPr>
                 <w:rFonts w:ascii="Times New Roman" w:hAnsi="Times New Roman"/>
                 <w:b w:val="0"/>
                 <w:color w:val="000000"/>
-                <w:sz w:val="20"/>
+                <w:sz w:val="17"/>
               </w:rPr>
               <w:t>Observar el recorrido de afiliaciones e incidencias desde Atención al Cliente hasta su seguimiento administrativo, describir las etapas y revisar la documentación utilizada.</w:t>
             </w:r>
@@ -5062,20 +5048,20 @@
         </w:tc>
         <w:tc>
           <w:tcPr>
-            <w:tcW w:w="1644" w:type="dxa"/>
+            <w:tcW w:w="1530" w:type="dxa"/>
             <w:shd w:val="clear" w:color="auto" w:fill="FFFFFF"/>
           </w:tcPr>
           <w:p>
             <w:pPr>
-              <w:spacing w:before="60" w:after="60" w:line="240" w:lineRule="auto"/>
-              <w:jc w:val="both"/>
+              <w:spacing w:before="20" w:after="20" w:line="240" w:lineRule="auto"/>
+              <w:jc w:val="left"/>
             </w:pPr>
             <w:r>
               <w:rPr>
                 <w:rFonts w:ascii="Times New Roman" w:hAnsi="Times New Roman"/>
                 <w:b w:val="0"/>
                 <w:color w:val="000000"/>
-                <w:sz w:val="20"/>
+                <w:sz w:val="17"/>
               </w:rPr>
               <w:t>Observación directa y análisis documental.</w:t>
             </w:r>
@@ -5083,20 +5069,20 @@
         </w:tc>
         <w:tc>
           <w:tcPr>
-            <w:tcW w:w="1695" w:type="dxa"/>
+            <w:tcW w:w="1701" w:type="dxa"/>
             <w:shd w:val="clear" w:color="auto" w:fill="FFFFFF"/>
           </w:tcPr>
           <w:p>
             <w:pPr>
-              <w:spacing w:before="60" w:after="60" w:line="240" w:lineRule="auto"/>
-              <w:jc w:val="both"/>
+              <w:spacing w:before="20" w:after="20" w:line="240" w:lineRule="auto"/>
+              <w:jc w:val="left"/>
             </w:pPr>
             <w:r>
               <w:rPr>
                 <w:rFonts w:ascii="Times New Roman" w:hAnsi="Times New Roman"/>
                 <w:b w:val="0"/>
                 <w:color w:val="000000"/>
-                <w:sz w:val="20"/>
+                <w:sz w:val="17"/>
               </w:rPr>
               <w:t>Guía de observación, registros de solicitudes, comprobantes y documentos internos.</w:t>
             </w:r>
@@ -5104,22 +5090,25 @@
         </w:tc>
       </w:tr>
       <w:tr>
+        <w:trPr>
+          <w:cantSplit/>
+        </w:trPr>
         <w:tc>
           <w:tcPr>
-            <w:tcW w:w="1644" w:type="dxa"/>
+            <w:tcW w:w="1729" w:type="dxa"/>
             <w:shd w:val="clear" w:color="auto" w:fill="D9E1F2"/>
           </w:tcPr>
           <w:p>
             <w:pPr>
-              <w:spacing w:before="60" w:after="60" w:line="240" w:lineRule="auto"/>
-              <w:jc w:val="both"/>
+              <w:spacing w:before="20" w:after="20" w:line="240" w:lineRule="auto"/>
+              <w:jc w:val="left"/>
             </w:pPr>
             <w:r>
               <w:rPr>
                 <w:rFonts w:ascii="Times New Roman" w:hAnsi="Times New Roman"/>
                 <w:b w:val="0"/>
                 <w:color w:val="000000"/>
-                <w:sz w:val="20"/>
+                <w:sz w:val="17"/>
               </w:rPr>
               <w:t>Identificar las deficiencias y causas presentes en los mecanismos de control de las solicitudes de servicio, considerando su incidencia en los tiempos de respuesta, la trazabilidad de los casos y la atención al suscriptor.</w:t>
             </w:r>
@@ -5127,20 +5116,20 @@
         </w:tc>
         <w:tc>
           <w:tcPr>
-            <w:tcW w:w="1644" w:type="dxa"/>
+            <w:tcW w:w="1530" w:type="dxa"/>
             <w:shd w:val="clear" w:color="auto" w:fill="D9E1F2"/>
           </w:tcPr>
           <w:p>
             <w:pPr>
-              <w:spacing w:before="60" w:after="60" w:line="240" w:lineRule="auto"/>
-              <w:jc w:val="both"/>
+              <w:spacing w:before="20" w:after="20" w:line="240" w:lineRule="auto"/>
+              <w:jc w:val="left"/>
             </w:pPr>
             <w:r>
               <w:rPr>
                 <w:rFonts w:ascii="Times New Roman" w:hAnsi="Times New Roman"/>
                 <w:b w:val="0"/>
                 <w:color w:val="000000"/>
-                <w:sz w:val="20"/>
+                <w:sz w:val="17"/>
               </w:rPr>
               <w:t>Deficiencias y causas que afectan el control administrativo de solicitudes.</w:t>
             </w:r>
@@ -5148,20 +5137,20 @@
         </w:tc>
         <w:tc>
           <w:tcPr>
-            <w:tcW w:w="1644" w:type="dxa"/>
+            <w:tcW w:w="1786" w:type="dxa"/>
             <w:shd w:val="clear" w:color="auto" w:fill="D9E1F2"/>
           </w:tcPr>
           <w:p>
             <w:pPr>
-              <w:spacing w:before="60" w:after="60" w:line="240" w:lineRule="auto"/>
-              <w:jc w:val="both"/>
+              <w:spacing w:before="20" w:after="20" w:line="240" w:lineRule="auto"/>
+              <w:jc w:val="left"/>
             </w:pPr>
             <w:r>
               <w:rPr>
                 <w:rFonts w:ascii="Times New Roman" w:hAnsi="Times New Roman"/>
                 <w:b w:val="0"/>
                 <w:color w:val="000000"/>
-                <w:sz w:val="20"/>
+                <w:sz w:val="17"/>
               </w:rPr>
               <w:t>Aplicar entrevistas estructuradas al personal, revisar casos históricos, comparar tiempos de respuesta y elaborar un diagrama de Ishikawa con las causas identificadas.</w:t>
             </w:r>
@@ -5169,20 +5158,20 @@
         </w:tc>
         <w:tc>
           <w:tcPr>
-            <w:tcW w:w="1644" w:type="dxa"/>
+            <w:tcW w:w="1530" w:type="dxa"/>
             <w:shd w:val="clear" w:color="auto" w:fill="D9E1F2"/>
           </w:tcPr>
           <w:p>
             <w:pPr>
-              <w:spacing w:before="60" w:after="60" w:line="240" w:lineRule="auto"/>
-              <w:jc w:val="both"/>
+              <w:spacing w:before="20" w:after="20" w:line="240" w:lineRule="auto"/>
+              <w:jc w:val="left"/>
             </w:pPr>
             <w:r>
               <w:rPr>
                 <w:rFonts w:ascii="Times New Roman" w:hAnsi="Times New Roman"/>
                 <w:b w:val="0"/>
                 <w:color w:val="000000"/>
-                <w:sz w:val="20"/>
+                <w:sz w:val="17"/>
               </w:rPr>
               <w:t>Entrevista estructurada, análisis documental, comparación de tiempos y diagrama causa-efecto.</w:t>
             </w:r>
@@ -5190,20 +5179,20 @@
         </w:tc>
         <w:tc>
           <w:tcPr>
-            <w:tcW w:w="1695" w:type="dxa"/>
+            <w:tcW w:w="1701" w:type="dxa"/>
             <w:shd w:val="clear" w:color="auto" w:fill="D9E1F2"/>
           </w:tcPr>
           <w:p>
             <w:pPr>
-              <w:spacing w:before="60" w:after="60" w:line="240" w:lineRule="auto"/>
-              <w:jc w:val="both"/>
+              <w:spacing w:before="20" w:after="20" w:line="240" w:lineRule="auto"/>
+              <w:jc w:val="left"/>
             </w:pPr>
             <w:r>
               <w:rPr>
                 <w:rFonts w:ascii="Times New Roman" w:hAnsi="Times New Roman"/>
                 <w:b w:val="0"/>
                 <w:color w:val="000000"/>
-                <w:sz w:val="20"/>
+                <w:sz w:val="17"/>
               </w:rPr>
               <w:t>Guía de entrevista, registros históricos, reportes internos, hoja de cálculo y matriz de causas.</w:t>
             </w:r>
@@ -5211,22 +5200,25 @@
         </w:tc>
       </w:tr>
       <w:tr>
+        <w:trPr>
+          <w:cantSplit/>
+        </w:trPr>
         <w:tc>
           <w:tcPr>
-            <w:tcW w:w="1644" w:type="dxa"/>
+            <w:tcW w:w="1729" w:type="dxa"/>
             <w:shd w:val="clear" w:color="auto" w:fill="FFFFFF"/>
           </w:tcPr>
           <w:p>
             <w:pPr>
-              <w:spacing w:before="60" w:after="60" w:line="240" w:lineRule="auto"/>
-              <w:jc w:val="both"/>
+              <w:spacing w:before="20" w:after="20" w:line="240" w:lineRule="auto"/>
+              <w:jc w:val="left"/>
             </w:pPr>
             <w:r>
               <w:rPr>
                 <w:rFonts w:ascii="Times New Roman" w:hAnsi="Times New Roman"/>
                 <w:b w:val="0"/>
                 <w:color w:val="000000"/>
-                <w:sz w:val="20"/>
+                <w:sz w:val="17"/>
               </w:rPr>
               <w:t>Formular mejoras al control administrativo de las solicitudes mediante un flujo estandarizado, formatos de registro, responsables por etapa e indicadores básicos de seguimiento.</w:t>
             </w:r>
@@ -5234,20 +5226,20 @@
         </w:tc>
         <w:tc>
           <w:tcPr>
-            <w:tcW w:w="1644" w:type="dxa"/>
+            <w:tcW w:w="1530" w:type="dxa"/>
             <w:shd w:val="clear" w:color="auto" w:fill="FFFFFF"/>
           </w:tcPr>
           <w:p>
             <w:pPr>
-              <w:spacing w:before="60" w:after="60" w:line="240" w:lineRule="auto"/>
-              <w:jc w:val="both"/>
+              <w:spacing w:before="20" w:after="20" w:line="240" w:lineRule="auto"/>
+              <w:jc w:val="left"/>
             </w:pPr>
             <w:r>
               <w:rPr>
                 <w:rFonts w:ascii="Times New Roman" w:hAnsi="Times New Roman"/>
                 <w:b w:val="0"/>
                 <w:color w:val="000000"/>
-                <w:sz w:val="20"/>
+                <w:sz w:val="17"/>
               </w:rPr>
               <w:t>Mejoras al control administrativo de solicitudes.</w:t>
             </w:r>
@@ -5255,20 +5247,20 @@
         </w:tc>
         <w:tc>
           <w:tcPr>
-            <w:tcW w:w="1644" w:type="dxa"/>
+            <w:tcW w:w="1786" w:type="dxa"/>
             <w:shd w:val="clear" w:color="auto" w:fill="FFFFFF"/>
           </w:tcPr>
           <w:p>
             <w:pPr>
-              <w:spacing w:before="60" w:after="60" w:line="240" w:lineRule="auto"/>
-              <w:jc w:val="both"/>
+              <w:spacing w:before="20" w:after="20" w:line="240" w:lineRule="auto"/>
+              <w:jc w:val="left"/>
             </w:pPr>
             <w:r>
               <w:rPr>
                 <w:rFonts w:ascii="Times New Roman" w:hAnsi="Times New Roman"/>
                 <w:b w:val="0"/>
                 <w:color w:val="000000"/>
-                <w:sz w:val="20"/>
+                <w:sz w:val="17"/>
               </w:rPr>
               <w:t>Diseñar el flujo estandarizado, formatos de registro, responsables por etapa e indicadores básicos de seguimiento; validar la propuesta con el tutor industrial.</w:t>
             </w:r>
@@ -5276,20 +5268,20 @@
         </w:tc>
         <w:tc>
           <w:tcPr>
-            <w:tcW w:w="1644" w:type="dxa"/>
+            <w:tcW w:w="1530" w:type="dxa"/>
             <w:shd w:val="clear" w:color="auto" w:fill="FFFFFF"/>
           </w:tcPr>
           <w:p>
             <w:pPr>
-              <w:spacing w:before="60" w:after="60" w:line="240" w:lineRule="auto"/>
-              <w:jc w:val="both"/>
+              <w:spacing w:before="20" w:after="20" w:line="240" w:lineRule="auto"/>
+              <w:jc w:val="left"/>
             </w:pPr>
             <w:r>
               <w:rPr>
                 <w:rFonts w:ascii="Times New Roman" w:hAnsi="Times New Roman"/>
                 <w:b w:val="0"/>
                 <w:color w:val="000000"/>
-                <w:sz w:val="20"/>
+                <w:sz w:val="17"/>
               </w:rPr>
               <w:t>Diseño procedimental y validación técnica.</w:t>
             </w:r>
@@ -5297,20 +5289,20 @@
         </w:tc>
         <w:tc>
           <w:tcPr>
-            <w:tcW w:w="1695" w:type="dxa"/>
+            <w:tcW w:w="1701" w:type="dxa"/>
             <w:shd w:val="clear" w:color="auto" w:fill="FFFFFF"/>
           </w:tcPr>
           <w:p>
             <w:pPr>
-              <w:spacing w:before="60" w:after="60" w:line="240" w:lineRule="auto"/>
-              <w:jc w:val="both"/>
+              <w:spacing w:before="20" w:after="20" w:line="240" w:lineRule="auto"/>
+              <w:jc w:val="left"/>
             </w:pPr>
             <w:r>
               <w:rPr>
                 <w:rFonts w:ascii="Times New Roman" w:hAnsi="Times New Roman"/>
                 <w:b w:val="0"/>
                 <w:color w:val="000000"/>
-                <w:sz w:val="20"/>
+                <w:sz w:val="17"/>
               </w:rPr>
               <w:t>Procesador de textos, herramientas de diagramación, hoja de cálculo y formato de validación.</w:t>
             </w:r>
@@ -8253,8 +8245,8 @@
     <w:p>
       <w:pPr>
         <w:sectPr>
-          <w:footerReference w:type="default" r:id="rId47"/>
-          <w:footerReference w:type="first" r:id="rId48"/>
+          <w:footerReference w:type="default" r:id="rId46"/>
+          <w:footerReference w:type="first" r:id="rId47"/>
           <w:pgSz w:w="12240" w:h="15840"/>
           <w:pgMar w:top="1701" w:right="1701" w:bottom="1701" w:left="2268" w:header="720" w:footer="720" w:gutter="0"/>
           <w:cols w:space="720"/>
@@ -8769,8 +8761,8 @@
     <w:p>
       <w:pPr>
         <w:sectPr>
-          <w:footerReference w:type="default" r:id="rId49"/>
-          <w:footerReference w:type="first" r:id="rId50"/>
+          <w:footerReference w:type="default" r:id="rId48"/>
+          <w:footerReference w:type="first" r:id="rId49"/>
           <w:pgSz w:w="12240" w:h="15840"/>
           <w:pgMar w:top="1701" w:right="1701" w:bottom="1701" w:left="2268" w:header="720" w:footer="720" w:gutter="0"/>
           <w:cols w:space="720"/>
@@ -8844,7 +8836,7 @@
           <w:i w:val="0"/>
           <w:sz w:val="24"/>
         </w:rPr>
-        <w:t>Durante las diez (10) semanas de pasantías se desarrollaron actividades operativas y de análisis mediante una rotación inicial por Atención al Cliente y una segunda etapa de apoyo en Administración. Algunas actividades y espacios observados se documentan en la memoria fotográfica incorporada como Anexo I:</w:t>
+        <w:t>Durante las diez (10) semanas de pasantías se desarrollaron actividades operativas y de análisis mediante una rotación inicial por Atención al Cliente y una segunda etapa de apoyo en Administración. Algunas actividades y espacios observados se documentan en la memoria fotográfica incorporada como Anexo H:</w:t>
       </w:r>
     </w:p>
     <w:p>
@@ -9219,7 +9211,7 @@
           <w:rFonts w:ascii="Times New Roman" w:hAnsi="Times New Roman"/>
           <w:sz w:val="24"/>
         </w:rPr>
-        <w:t>Organización de los hallazgos del diagnóstico y elaboración del diagrama de Ishikawa para representar las causas relacionadas con procedimiento, comunicación, registro y seguimiento; inicio de la revisión de bases teóricas.</w:t>
+        <w:t>Organización de los hallazgos del diagnóstico y elaboración del diagrama de Ishikawa para representar las causas relacionadas con procedimiento, comunicación, registro y seguimiento (véase Anexo B); inicio de la revisión de bases teóricas.</w:t>
       </w:r>
     </w:p>
     <w:p>
@@ -9369,7 +9361,7 @@
           <w:rFonts w:ascii="Times New Roman" w:hAnsi="Times New Roman"/>
           <w:sz w:val="24"/>
         </w:rPr>
-        <w:t>Diseño del nuevo flujo estandarizado para la gestión de solicitudes, estableciendo etapas, responsables, tiempos de referencia y puntos de control desde la recepción hasta el cierre.</w:t>
+        <w:t>Diseño del nuevo flujo estandarizado para la gestión de solicitudes, estableciendo etapas, responsables, tiempos de referencia y puntos de control desde la recepción hasta el cierre; la propuesta y su distribución interdepartamental se presentan en los Anexos A y D.</w:t>
       </w:r>
     </w:p>
     <w:p>
@@ -9519,7 +9511,7 @@
           <w:rFonts w:ascii="Times New Roman" w:hAnsi="Times New Roman"/>
           <w:sz w:val="24"/>
         </w:rPr>
-        <w:t>Redacción y validación de la propuesta de mejora con el tutor industrial, incorporación de observaciones y preparación del flujograma definitivo del proceso propuesto.</w:t>
+        <w:t>Redacción y validación de la propuesta de mejora con el tutor industrial, incorporación de observaciones y preparación del flujograma definitivo del proceso propuesto (véase Anexo A).</w:t>
       </w:r>
     </w:p>
     <w:p>
@@ -9600,8 +9592,8 @@
     <w:p>
       <w:pPr>
         <w:sectPr>
-          <w:footerReference w:type="default" r:id="rId51"/>
-          <w:footerReference w:type="first" r:id="rId52"/>
+          <w:footerReference w:type="default" r:id="rId50"/>
+          <w:footerReference w:type="first" r:id="rId51"/>
           <w:pgSz w:w="12240" w:h="15840"/>
           <w:pgMar w:top="1701" w:right="1701" w:bottom="1701" w:left="2268" w:header="720" w:footer="720" w:gutter="0"/>
           <w:cols w:space="720"/>
@@ -9727,6 +9719,27 @@
       </w:r>
     </w:p>
     <w:p>
+      <w:pPr>
+        <w:spacing w:line="360" w:lineRule="auto"/>
+        <w:ind w:firstLine="709"/>
+        <w:jc w:val="both"/>
+      </w:pPr>
+      <w:r>
+        <w:rPr>
+          <w:rFonts w:ascii="Times New Roman" w:hAnsi="Times New Roman"/>
+          <w:sz w:val="24"/>
+        </w:rPr>
+        <w:t xml:space="preserve">4. </w:t>
+      </w:r>
+      <w:r>
+        <w:rPr>
+          <w:rFonts w:ascii="Times New Roman" w:hAnsi="Times New Roman"/>
+          <w:sz w:val="24"/>
+        </w:rPr>
+        <w:t>La experiencia de pasantía permitió aplicar conocimientos y competencias de Administración vinculados con control, organización de procesos, gestión documental, seguimiento y atención al usuario, fortaleciendo la relación entre la formación académica y las situaciones reales observadas en la empresa.</w:t>
+      </w:r>
+    </w:p>
+    <w:p>
       <w:bookmarkStart w:id="41" w:name="bm_cap5_recom"/>
       <w:pPr>
         <w:pStyle w:val="IUTECPTítulo2"/>
@@ -9916,8 +9929,8 @@
     <w:p>
       <w:pPr>
         <w:sectPr>
-          <w:footerReference w:type="default" r:id="rId53"/>
-          <w:footerReference w:type="first" r:id="rId54"/>
+          <w:footerReference w:type="default" r:id="rId52"/>
+          <w:footerReference w:type="first" r:id="rId53"/>
           <w:pgSz w:w="12240" w:h="15840"/>
           <w:pgMar w:top="1701" w:right="1701" w:bottom="1701" w:left="2268" w:header="720" w:footer="720" w:gutter="0"/>
           <w:cols w:space="720"/>
@@ -10202,8 +10215,8 @@
     <w:p>
       <w:pPr>
         <w:sectPr>
-          <w:footerReference w:type="default" r:id="rId55"/>
-          <w:footerReference w:type="first" r:id="rId56"/>
+          <w:footerReference w:type="default" r:id="rId54"/>
+          <w:footerReference w:type="first" r:id="rId55"/>
           <w:pgSz w:w="12240" w:h="15840"/>
           <w:pgMar w:top="1701" w:right="1701" w:bottom="1701" w:left="2268" w:header="720" w:footer="720" w:gutter="0"/>
           <w:cols w:space="720"/>
@@ -10232,7 +10245,7 @@
     <w:p>
       <w:pPr>
         <w:sectPr>
-          <w:footerReference w:type="default" r:id="rId57"/>
+          <w:footerReference w:type="default" r:id="rId56"/>
           <w:pgSz w:w="12240" w:h="15840"/>
           <w:pgMar w:top="1701" w:right="1701" w:bottom="1701" w:left="2268" w:header="720" w:footer="720" w:gutter="0"/>
           <w:cols w:space="720"/>
@@ -10341,7 +10354,7 @@
     <w:p>
       <w:pPr>
         <w:sectPr>
-          <w:footerReference w:type="default" r:id="rId58"/>
+          <w:footerReference w:type="default" r:id="rId57"/>
           <w:pgSz w:w="12240" w:h="15840"/>
           <w:pgMar w:top="1701" w:right="1701" w:bottom="1701" w:left="2268" w:header="720" w:footer="720" w:gutter="0"/>
           <w:cols w:space="720"/>
@@ -10381,7 +10394,7 @@
           <w:b/>
           <w:sz w:val="20"/>
         </w:rPr>
-        <w:t>[Diagrama de Ishikawa del control de solicitudes]</w:t>
+        <w:t>[Diagrama de Ishikawa definitivo del control y trazabilidad de las solicitudes de servicio]</w:t>
       </w:r>
     </w:p>
     <w:p>
@@ -10393,7 +10406,7 @@
       <w:r>
         <w:drawing>
           <wp:inline xmlns:a="http://schemas.openxmlformats.org/drawingml/2006/main" xmlns:pic="http://schemas.openxmlformats.org/drawingml/2006/picture">
-            <wp:extent cx="4679999" cy="1208317"/>
+            <wp:extent cx="4680000" cy="4264486"/>
             <wp:docPr id="9" name="Picture 9"/>
             <wp:cNvGraphicFramePr>
               <a:graphicFrameLocks noChangeAspect="1"/>
@@ -10402,7 +10415,7 @@
               <a:graphicData uri="http://schemas.openxmlformats.org/drawingml/2006/picture">
                 <pic:pic>
                   <pic:nvPicPr>
-                    <pic:cNvPr id="0" name="01_ishikawa_control_solicitudes.png"/>
+                    <pic:cNvPr id="0" name="ishikawa_amaal_solicitudes.png"/>
                     <pic:cNvPicPr/>
                   </pic:nvPicPr>
                   <pic:blipFill>
@@ -10414,7 +10427,7 @@
                   <pic:spPr>
                     <a:xfrm>
                       <a:off x="0" y="0"/>
-                      <a:ext cx="4679999" cy="1208317"/>
+                      <a:ext cx="4680000" cy="4264486"/>
                     </a:xfrm>
                     <a:prstGeom prst="rect"/>
                   </pic:spPr>
@@ -10450,7 +10463,7 @@
     <w:p>
       <w:pPr>
         <w:sectPr>
-          <w:footerReference w:type="default" r:id="rId59"/>
+          <w:footerReference w:type="default" r:id="rId58"/>
           <w:pgSz w:w="12240" w:h="15840"/>
           <w:pgMar w:top="1701" w:right="1701" w:bottom="1701" w:left="2268" w:header="720" w:footer="720" w:gutter="0"/>
           <w:cols w:space="720"/>
@@ -10559,7 +10572,7 @@
     <w:p>
       <w:pPr>
         <w:sectPr>
-          <w:footerReference w:type="default" r:id="rId60"/>
+          <w:footerReference w:type="default" r:id="rId59"/>
           <w:pgSz w:w="12240" w:h="15840"/>
           <w:pgMar w:top="1701" w:right="1701" w:bottom="1701" w:left="2268" w:header="720" w:footer="720" w:gutter="0"/>
           <w:cols w:space="720"/>
@@ -10668,7 +10681,7 @@
     <w:p>
       <w:pPr>
         <w:sectPr>
-          <w:footerReference w:type="default" r:id="rId61"/>
+          <w:footerReference w:type="default" r:id="rId60"/>
           <w:pgSz w:w="12240" w:h="15840"/>
           <w:pgMar w:top="1701" w:right="1701" w:bottom="1701" w:left="2268" w:header="720" w:footer="720" w:gutter="0"/>
           <w:cols w:space="720"/>
@@ -10777,7 +10790,7 @@
     <w:p>
       <w:pPr>
         <w:sectPr>
-          <w:footerReference w:type="default" r:id="rId62"/>
+          <w:footerReference w:type="default" r:id="rId61"/>
           <w:pgSz w:w="12240" w:h="15840"/>
           <w:pgMar w:top="1701" w:right="1701" w:bottom="1701" w:left="2268" w:header="720" w:footer="720" w:gutter="0"/>
           <w:cols w:space="720"/>
@@ -10886,7 +10899,7 @@
     <w:p>
       <w:pPr>
         <w:sectPr>
-          <w:footerReference w:type="default" r:id="rId63"/>
+          <w:footerReference w:type="default" r:id="rId62"/>
           <w:pgSz w:w="12240" w:h="15840"/>
           <w:pgMar w:top="1701" w:right="1701" w:bottom="1701" w:left="2268" w:header="720" w:footer="720" w:gutter="0"/>
           <w:cols w:space="720"/>
@@ -10995,7 +11008,7 @@
     <w:p>
       <w:pPr>
         <w:sectPr>
-          <w:footerReference w:type="default" r:id="rId64"/>
+          <w:footerReference w:type="default" r:id="rId63"/>
           <w:pgSz w:w="12240" w:h="15840"/>
           <w:pgMar w:top="1701" w:right="1701" w:bottom="1701" w:left="2268" w:header="720" w:footer="720" w:gutter="0"/>
           <w:cols w:space="720"/>
@@ -11035,7 +11048,7 @@
           <w:b/>
           <w:sz w:val="20"/>
         </w:rPr>
-        <w:t>[Diagrama de Ishikawa del control y trazabilidad de las solicitudes de servicio]</w:t>
+        <w:t>[Memoria fotográfica de las actividades realizadas]</w:t>
       </w:r>
     </w:p>
     <w:p>
@@ -11047,7 +11060,7 @@
       <w:r>
         <w:drawing>
           <wp:inline xmlns:a="http://schemas.openxmlformats.org/drawingml/2006/main" xmlns:pic="http://schemas.openxmlformats.org/drawingml/2006/picture">
-            <wp:extent cx="4680000" cy="4264486"/>
+            <wp:extent cx="4860000" cy="3645000"/>
             <wp:docPr id="15" name="Picture 15"/>
             <wp:cNvGraphicFramePr>
               <a:graphicFrameLocks noChangeAspect="1"/>
@@ -11056,7 +11069,7 @@
               <a:graphicData uri="http://schemas.openxmlformats.org/drawingml/2006/picture">
                 <pic:pic>
                   <pic:nvPicPr>
-                    <pic:cNvPr id="0" name="ishikawa_amaal_solicitudes.png"/>
+                    <pic:cNvPr id="0" name="IMG-20260818-WA0007.jpg"/>
                     <pic:cNvPicPr/>
                   </pic:nvPicPr>
                   <pic:blipFill>
@@ -11068,7 +11081,7 @@
                   <pic:spPr>
                     <a:xfrm>
                       <a:off x="0" y="0"/>
-                      <a:ext cx="4680000" cy="4264486"/>
+                      <a:ext cx="4860000" cy="3645000"/>
                     </a:xfrm>
                     <a:prstGeom prst="rect"/>
                   </pic:spPr>
@@ -11081,76 +11094,23 @@
     </w:p>
     <w:p>
       <w:pPr>
-        <w:spacing w:line="240" w:lineRule="auto" w:before="0" w:after="240"/>
-        <w:ind w:firstLine="0"/>
+        <w:spacing w:before="120" w:after="240"/>
         <w:jc w:val="center"/>
       </w:pPr>
       <w:r>
         <w:rPr>
           <w:rFonts w:ascii="Times New Roman" w:hAnsi="Times New Roman"/>
-          <w:i/>
+          <w:b/>
           <w:sz w:val="20"/>
         </w:rPr>
-        <w:t xml:space="preserve">Fuente: </w:t>
-      </w:r>
-      <w:r>
-        <w:rPr>
-          <w:rFonts w:ascii="Times New Roman" w:hAnsi="Times New Roman"/>
-          <w:sz w:val="20"/>
-        </w:rPr>
-        <w:t>Elaboración propia (2026).</w:t>
+        <w:t>Fotografía 1. Registro de actividades administrativas frente al equipo de trabajo.</w:t>
       </w:r>
     </w:p>
     <w:p>
       <w:pPr>
-        <w:sectPr>
-          <w:footerReference w:type="default" r:id="rId65"/>
-          <w:pgSz w:w="12240" w:h="15840"/>
-          <w:pgMar w:top="1701" w:right="1701" w:bottom="1701" w:left="2268" w:header="720" w:footer="720" w:gutter="0"/>
-          <w:cols w:space="720"/>
-          <w:docGrid w:linePitch="360"/>
-          <w:pgNumType w:fmt="decimal"/>
-        </w:sectPr>
-      </w:pPr>
-    </w:p>
-    <w:p>
-      <w:bookmarkStart w:id="52" w:name="bm_anexoI"/>
-      <w:pPr>
         <w:keepNext/>
         <w:keepLines/>
-        <w:spacing w:before="0" w:after="480"/>
-        <w:jc w:val="center"/>
-      </w:pPr>
-      <w:bookmarkEnd w:id="52"/>
-      <w:r>
-        <w:rPr>
-          <w:rFonts w:ascii="Times New Roman" w:hAnsi="Times New Roman"/>
-          <w:b/>
-          <w:sz w:val="20"/>
-        </w:rPr>
-        <w:t>ANEXO I</w:t>
-      </w:r>
-    </w:p>
-    <w:p>
-      <w:pPr>
-        <w:keepNext/>
-        <w:keepLines/>
-        <w:spacing w:before="240" w:after="480"/>
-        <w:jc w:val="center"/>
-      </w:pPr>
-      <w:r>
-        <w:rPr>
-          <w:rFonts w:ascii="Times New Roman" w:hAnsi="Times New Roman"/>
-          <w:b/>
-          <w:sz w:val="20"/>
-        </w:rPr>
-        <w:t>[Memoria fotográfica de las actividades realizadas]</w:t>
-      </w:r>
-    </w:p>
-    <w:p>
-      <w:pPr>
-        <w:keepNext/>
-        <w:keepLines/>
+        <w:pageBreakBefore/>
         <w:jc w:val="center"/>
       </w:pPr>
       <w:r>
@@ -11165,7 +11125,7 @@
               <a:graphicData uri="http://schemas.openxmlformats.org/drawingml/2006/picture">
                 <pic:pic>
                   <pic:nvPicPr>
-                    <pic:cNvPr id="0" name="IMG-20260818-WA0007.jpg"/>
+                    <pic:cNvPr id="0" name="IMG-20260818-WA0008.jpg"/>
                     <pic:cNvPicPr/>
                   </pic:nvPicPr>
                   <pic:blipFill>
@@ -11199,7 +11159,7 @@
           <w:b/>
           <w:sz w:val="20"/>
         </w:rPr>
-        <w:t>Fotografía 1. Registro de actividades administrativas frente al equipo de trabajo.</w:t>
+        <w:t>Fotografía 2. Vista general del espacio de trabajo del área administrativa.</w:t>
       </w:r>
     </w:p>
     <w:p>
@@ -11212,7 +11172,7 @@
       <w:r>
         <w:drawing>
           <wp:inline xmlns:a="http://schemas.openxmlformats.org/drawingml/2006/main" xmlns:pic="http://schemas.openxmlformats.org/drawingml/2006/picture">
-            <wp:extent cx="4860000" cy="3645000"/>
+            <wp:extent cx="3780000" cy="5040000"/>
             <wp:docPr id="17" name="Picture 17"/>
             <wp:cNvGraphicFramePr>
               <a:graphicFrameLocks noChangeAspect="1"/>
@@ -11221,11 +11181,67 @@
               <a:graphicData uri="http://schemas.openxmlformats.org/drawingml/2006/picture">
                 <pic:pic>
                   <pic:nvPicPr>
-                    <pic:cNvPr id="0" name="IMG-20260818-WA0008.jpg"/>
+                    <pic:cNvPr id="0" name="IMG-20260818-WA0009.jpg"/>
                     <pic:cNvPicPr/>
                   </pic:nvPicPr>
                   <pic:blipFill>
                     <a:blip r:embed="rId25"/>
+                    <a:stretch>
+                      <a:fillRect/>
+                    </a:stretch>
+                  </pic:blipFill>
+                  <pic:spPr>
+                    <a:xfrm>
+                      <a:off x="0" y="0"/>
+                      <a:ext cx="3780000" cy="5040000"/>
+                    </a:xfrm>
+                    <a:prstGeom prst="rect"/>
+                  </pic:spPr>
+                </pic:pic>
+              </a:graphicData>
+            </a:graphic>
+          </wp:inline>
+        </w:drawing>
+      </w:r>
+    </w:p>
+    <w:p>
+      <w:pPr>
+        <w:spacing w:before="120" w:after="240"/>
+        <w:jc w:val="center"/>
+      </w:pPr>
+      <w:r>
+        <w:rPr>
+          <w:rFonts w:ascii="Times New Roman" w:hAnsi="Times New Roman"/>
+          <w:b/>
+          <w:sz w:val="20"/>
+        </w:rPr>
+        <w:t>Fotografía 3. Verificación de información en los registros administrativos del área.</w:t>
+      </w:r>
+    </w:p>
+    <w:p>
+      <w:pPr>
+        <w:keepNext/>
+        <w:keepLines/>
+        <w:pageBreakBefore/>
+        <w:jc w:val="center"/>
+      </w:pPr>
+      <w:r>
+        <w:drawing>
+          <wp:inline xmlns:a="http://schemas.openxmlformats.org/drawingml/2006/main" xmlns:pic="http://schemas.openxmlformats.org/drawingml/2006/picture">
+            <wp:extent cx="4860000" cy="3645000"/>
+            <wp:docPr id="18" name="Picture 18"/>
+            <wp:cNvGraphicFramePr>
+              <a:graphicFrameLocks noChangeAspect="1"/>
+            </wp:cNvGraphicFramePr>
+            <a:graphic>
+              <a:graphicData uri="http://schemas.openxmlformats.org/drawingml/2006/picture">
+                <pic:pic>
+                  <pic:nvPicPr>
+                    <pic:cNvPr id="0" name="IMG-20260818-WA0010.jpg"/>
+                    <pic:cNvPicPr/>
+                  </pic:nvPicPr>
+                  <pic:blipFill>
+                    <a:blip r:embed="rId26"/>
                     <a:stretch>
                       <a:fillRect/>
                     </a:stretch>
@@ -11255,7 +11271,7 @@
           <w:b/>
           <w:sz w:val="20"/>
         </w:rPr>
-        <w:t>Fotografía 2. Vista general del espacio de trabajo del área administrativa.</w:t>
+        <w:t>Fotografía 4. Puesto de trabajo utilizado para la gestión de información administrativa.</w:t>
       </w:r>
     </w:p>
     <w:p>
@@ -11269,7 +11285,7 @@
         <w:drawing>
           <wp:inline xmlns:a="http://schemas.openxmlformats.org/drawingml/2006/main" xmlns:pic="http://schemas.openxmlformats.org/drawingml/2006/picture">
             <wp:extent cx="3780000" cy="5040000"/>
-            <wp:docPr id="18" name="Picture 18"/>
+            <wp:docPr id="19" name="Picture 19"/>
             <wp:cNvGraphicFramePr>
               <a:graphicFrameLocks noChangeAspect="1"/>
             </wp:cNvGraphicFramePr>
@@ -11277,11 +11293,11 @@
               <a:graphicData uri="http://schemas.openxmlformats.org/drawingml/2006/picture">
                 <pic:pic>
                   <pic:nvPicPr>
-                    <pic:cNvPr id="0" name="IMG-20260818-WA0009.jpg"/>
+                    <pic:cNvPr id="0" name="IMG-20260818-WA0011.jpg"/>
                     <pic:cNvPicPr/>
                   </pic:nvPicPr>
                   <pic:blipFill>
-                    <a:blip r:embed="rId26"/>
+                    <a:blip r:embed="rId27"/>
                     <a:stretch>
                       <a:fillRect/>
                     </a:stretch>
@@ -11311,63 +11327,7 @@
           <w:b/>
           <w:sz w:val="20"/>
         </w:rPr>
-        <w:t>Fotografía 3. Verificación de información en los registros administrativos del área.</w:t>
-      </w:r>
-    </w:p>
-    <w:p>
-      <w:pPr>
-        <w:keepNext/>
-        <w:keepLines/>
-        <w:pageBreakBefore/>
-        <w:jc w:val="center"/>
-      </w:pPr>
-      <w:r>
-        <w:drawing>
-          <wp:inline xmlns:a="http://schemas.openxmlformats.org/drawingml/2006/main" xmlns:pic="http://schemas.openxmlformats.org/drawingml/2006/picture">
-            <wp:extent cx="4860000" cy="3645000"/>
-            <wp:docPr id="19" name="Picture 19"/>
-            <wp:cNvGraphicFramePr>
-              <a:graphicFrameLocks noChangeAspect="1"/>
-            </wp:cNvGraphicFramePr>
-            <a:graphic>
-              <a:graphicData uri="http://schemas.openxmlformats.org/drawingml/2006/picture">
-                <pic:pic>
-                  <pic:nvPicPr>
-                    <pic:cNvPr id="0" name="IMG-20260818-WA0010.jpg"/>
-                    <pic:cNvPicPr/>
-                  </pic:nvPicPr>
-                  <pic:blipFill>
-                    <a:blip r:embed="rId27"/>
-                    <a:stretch>
-                      <a:fillRect/>
-                    </a:stretch>
-                  </pic:blipFill>
-                  <pic:spPr>
-                    <a:xfrm>
-                      <a:off x="0" y="0"/>
-                      <a:ext cx="4860000" cy="3645000"/>
-                    </a:xfrm>
-                    <a:prstGeom prst="rect"/>
-                  </pic:spPr>
-                </pic:pic>
-              </a:graphicData>
-            </a:graphic>
-          </wp:inline>
-        </w:drawing>
-      </w:r>
-    </w:p>
-    <w:p>
-      <w:pPr>
-        <w:spacing w:before="120" w:after="240"/>
-        <w:jc w:val="center"/>
-      </w:pPr>
-      <w:r>
-        <w:rPr>
-          <w:rFonts w:ascii="Times New Roman" w:hAnsi="Times New Roman"/>
-          <w:b/>
-          <w:sz w:val="20"/>
-        </w:rPr>
-        <w:t>Fotografía 4. Puesto de trabajo utilizado para la gestión de información administrativa.</w:t>
+        <w:t>Fotografía 5. Revisión de registros y documentos desde el puesto de trabajo.</w:t>
       </w:r>
     </w:p>
     <w:p>
@@ -11389,7 +11349,7 @@
               <a:graphicData uri="http://schemas.openxmlformats.org/drawingml/2006/picture">
                 <pic:pic>
                   <pic:nvPicPr>
-                    <pic:cNvPr id="0" name="IMG-20260818-WA0011.jpg"/>
+                    <pic:cNvPr id="0" name="IMG-20260818-WA0012.jpg"/>
                     <pic:cNvPicPr/>
                   </pic:nvPicPr>
                   <pic:blipFill>
@@ -11423,7 +11383,7 @@
           <w:b/>
           <w:sz w:val="20"/>
         </w:rPr>
-        <w:t>Fotografía 5. Revisión de registros y documentos desde el puesto de trabajo.</w:t>
+        <w:t>Fotografía 6. Revisión de información de pagos y soportes documentales.</w:t>
       </w:r>
     </w:p>
     <w:p>
@@ -11445,7 +11405,7 @@
               <a:graphicData uri="http://schemas.openxmlformats.org/drawingml/2006/picture">
                 <pic:pic>
                   <pic:nvPicPr>
-                    <pic:cNvPr id="0" name="IMG-20260818-WA0012.jpg"/>
+                    <pic:cNvPr id="0" name="IMG-20260818-WA0015.jpg"/>
                     <pic:cNvPicPr/>
                   </pic:nvPicPr>
                   <pic:blipFill>
@@ -11479,7 +11439,7 @@
           <w:b/>
           <w:sz w:val="20"/>
         </w:rPr>
-        <w:t>Fotografía 6. Revisión de información de pagos y soportes documentales.</w:t>
+        <w:t>Fotografía 7. Puesto de trabajo del área administrativa.</w:t>
       </w:r>
     </w:p>
     <w:p>
@@ -11501,7 +11461,7 @@
               <a:graphicData uri="http://schemas.openxmlformats.org/drawingml/2006/picture">
                 <pic:pic>
                   <pic:nvPicPr>
-                    <pic:cNvPr id="0" name="IMG-20260818-WA0015.jpg"/>
+                    <pic:cNvPr id="0" name="IMG-20260818-WA0016.jpg"/>
                     <pic:cNvPicPr/>
                   </pic:nvPicPr>
                   <pic:blipFill>
@@ -11535,62 +11495,6 @@
           <w:b/>
           <w:sz w:val="20"/>
         </w:rPr>
-        <w:t>Fotografía 7. Puesto de trabajo del área administrativa.</w:t>
-      </w:r>
-    </w:p>
-    <w:p>
-      <w:pPr>
-        <w:keepNext/>
-        <w:keepLines/>
-        <w:pageBreakBefore/>
-        <w:jc w:val="center"/>
-      </w:pPr>
-      <w:r>
-        <w:drawing>
-          <wp:inline xmlns:a="http://schemas.openxmlformats.org/drawingml/2006/main" xmlns:pic="http://schemas.openxmlformats.org/drawingml/2006/picture">
-            <wp:extent cx="3780000" cy="5040000"/>
-            <wp:docPr id="23" name="Picture 23"/>
-            <wp:cNvGraphicFramePr>
-              <a:graphicFrameLocks noChangeAspect="1"/>
-            </wp:cNvGraphicFramePr>
-            <a:graphic>
-              <a:graphicData uri="http://schemas.openxmlformats.org/drawingml/2006/picture">
-                <pic:pic>
-                  <pic:nvPicPr>
-                    <pic:cNvPr id="0" name="IMG-20260818-WA0016.jpg"/>
-                    <pic:cNvPicPr/>
-                  </pic:nvPicPr>
-                  <pic:blipFill>
-                    <a:blip r:embed="rId31"/>
-                    <a:stretch>
-                      <a:fillRect/>
-                    </a:stretch>
-                  </pic:blipFill>
-                  <pic:spPr>
-                    <a:xfrm>
-                      <a:off x="0" y="0"/>
-                      <a:ext cx="3780000" cy="5040000"/>
-                    </a:xfrm>
-                    <a:prstGeom prst="rect"/>
-                  </pic:spPr>
-                </pic:pic>
-              </a:graphicData>
-            </a:graphic>
-          </wp:inline>
-        </w:drawing>
-      </w:r>
-    </w:p>
-    <w:p>
-      <w:pPr>
-        <w:spacing w:before="120" w:after="240"/>
-        <w:jc w:val="center"/>
-      </w:pPr>
-      <w:r>
-        <w:rPr>
-          <w:rFonts w:ascii="Times New Roman" w:hAnsi="Times New Roman"/>
-          <w:b/>
-          <w:sz w:val="20"/>
-        </w:rPr>
         <w:t>Fotografía 8. Puesto de trabajo y equipo utilizado durante la pasantía.</w:t>
       </w:r>
     </w:p>
@@ -11617,7 +11521,7 @@
       </w:r>
     </w:p>
     <w:sectPr>
-      <w:footerReference w:type="default" r:id="rId66"/>
+      <w:footerReference w:type="default" r:id="rId64"/>
       <w:pgSz w:w="12240" w:h="15840"/>
       <w:pgMar w:top="1701" w:right="1701" w:bottom="1701" w:left="2268" w:header="720" w:footer="720" w:gutter="0"/>
       <w:cols w:space="720"/>
@@ -12057,26 +11961,6 @@
 </file>
 
 <file path=word/footer34.xml><?xml version="1.0" encoding="utf-8"?>
-<w:ftr xmlns:m="http://schemas.openxmlformats.org/officeDocument/2006/math" xmlns:mc="http://schemas.openxmlformats.org/markup-compatibility/2006" xmlns:mo="http://schemas.microsoft.com/office/mac/office/2008/main" xmlns:mv="urn:schemas-microsoft-com:mac:vml" xmlns:o="urn:schemas-microsoft-com:office:office" xmlns:r="http://schemas.openxmlformats.org/officeDocument/2006/relationships" xmlns:v="urn:schemas-microsoft-com:vml" xmlns:w10="urn:schemas-microsoft-com:office:word" xmlns:w14="http://schemas.microsoft.com/office/word/2010/wordml" xmlns:w="http://schemas.openxmlformats.org/wordprocessingml/2006/main" xmlns:wne="http://schemas.microsoft.com/office/word/2006/wordml" xmlns:wp14="http://schemas.microsoft.com/office/word/2010/wordprocessingDrawing" xmlns:wp="http://schemas.openxmlformats.org/drawingml/2006/wordprocessingDrawing" xmlns:wpc="http://schemas.microsoft.com/office/word/2010/wordprocessingCanvas" xmlns:wpg="http://schemas.microsoft.com/office/word/2010/wordprocessingGroup" xmlns:wpi="http://schemas.microsoft.com/office/word/2010/wordprocessingInk" xmlns:wps="http://schemas.microsoft.com/office/word/2010/wordprocessingShape" mc:Ignorable="w14 wp14">
-  <w:p>
-    <w:pPr>
-      <w:jc w:val="center"/>
-    </w:pPr>
-    <w:r>
-      <w:rPr>
-        <w:rFonts w:ascii="Times New Roman" w:hAnsi="Times New Roman"/>
-        <w:sz w:val="24"/>
-      </w:rPr>
-      <w:fldChar w:fldCharType="begin"/>
-      <w:instrText xml:space="preserve"> PAGE </w:instrText>
-      <w:fldChar w:fldCharType="separate"/>
-      <w:fldChar w:fldCharType="end"/>
-    </w:r>
-  </w:p>
-</w:ftr>
-</file>
-
-<file path=word/footer35.xml><?xml version="1.0" encoding="utf-8"?>
 <w:ftr xmlns:m="http://schemas.openxmlformats.org/officeDocument/2006/math" xmlns:mc="http://schemas.openxmlformats.org/markup-compatibility/2006" xmlns:mo="http://schemas.microsoft.com/office/mac/office/2008/main" xmlns:mv="urn:schemas-microsoft-com:mac:vml" xmlns:o="urn:schemas-microsoft-com:office:office" xmlns:r="http://schemas.openxmlformats.org/officeDocument/2006/relationships" xmlns:v="urn:schemas-microsoft-com:vml" xmlns:w10="urn:schemas-microsoft-com:office:word" xmlns:w14="http://schemas.microsoft.com/office/word/2010/wordml" xmlns:w="http://schemas.openxmlformats.org/wordprocessingml/2006/main" xmlns:wne="http://schemas.microsoft.com/office/word/2006/wordml" xmlns:wp14="http://schemas.microsoft.com/office/word/2010/wordprocessingDrawing" xmlns:wp="http://schemas.openxmlformats.org/drawingml/2006/wordprocessingDrawing" xmlns:wpc="http://schemas.microsoft.com/office/word/2010/wordprocessingCanvas" xmlns:wpg="http://schemas.microsoft.com/office/word/2010/wordprocessingGroup" xmlns:wpi="http://schemas.microsoft.com/office/word/2010/wordprocessingInk" xmlns:wps="http://schemas.microsoft.com/office/word/2010/wordprocessingShape" mc:Ignorable="w14 wp14">
   <w:p>
     <w:pPr>

</xml_diff>